<commit_message>
adding proposal text p4
</commit_message>
<xml_diff>
--- a/document/proposal.docx
+++ b/document/proposal.docx
@@ -90,7 +90,7 @@
         <w:pStyle w:val="FirstParagraph"/>
       </w:pPr>
       <w:r>
-        <w:t xml:space="preserve">Despite the popularity of ML/AI algorithms in finance, they have mainly been used for either one or a small number of random factors. Nevertheless, joint analytics of high dimensionality (e.g., &gt;1000 random factors) present serious challenges. This task is hard to address with classical statistical methods, and the available toolset is quite limited, i.e., mainly based on Gaussian copulas. There is hope that modern advances in ML/AI algorithms could help expand this toolset and provide alternative approaches for modeling high-dimensional joint dependency.</w:t>
+        <w:t xml:space="preserve">Despite the popularity of ML/AI algorithms in finance, they have mainly been used for either one or a small number of random factors. Nevertheless, joint analytics of high dimensionality (e.g., &gt;100 random factors) present serious challenges. This task is hard to address with classical statistical methods, and the available toolset is quite limited, i.e., mainly based on Gaussian copulas. There is hope that modern advances in ML/AI algorithms could help expand this toolset and provide alternative approaches for modeling high-dimensional joint dependency.</w:t>
       </w:r>
     </w:p>
     <w:p>
@@ -116,7 +116,7 @@
         <w:pStyle w:val="FirstParagraph"/>
       </w:pPr>
       <w:r>
-        <w:t xml:space="preserve">The main aim of this work would be to develop a machine learning algorithm for calibrating a high-dimensional copula with tail dependence different from Gaussian, while still reflecting the observed history with regards to selected measures (i.e., matching correlation matrix, matching pairwise tail dependence at the specific percentile, etc.). The latter is expected to require the creation of a custom loss function to achieve minimization with regards to those measures. On the simulation part, a range of different approaches can be considered, starting from semi-analytical methods to Variational Autoencoders (VAEs) and Generative Adversarial Networks (GANs).</w:t>
+        <w:t xml:space="preserve">The main aim of this work would be to develop an algorithm for calibrating a high-dimensional copula with tail dependence different from Gaussian, while still reflecting the observed history with regards to selected measures (i.e., matching correlation matrix, matching Value-at-Risk measures or pairwise tail dependence at the specific percentile, etc.). On the simulation part, a range of different approaches can be considered, starting from semi-analytical methods to Variational Autoencoders (VAEs) and Generative Adversarial Networks (GANs).</w:t>
       </w:r>
     </w:p>
     <w:p>
@@ -124,7 +124,7 @@
         <w:pStyle w:val="BodyText"/>
       </w:pPr>
       <w:r>
-        <w:t xml:space="preserve">Develop a software application designed for extracting and caching market data, with subsequent incorporation of calculations of portfolio Value-at-Risk (VaR) and Expected Shortfall (ES) measures. To achieve this, implement Monte Carlo simulations using various copulas within the application, in addition to providing support for pure historical calculation methods.</w:t>
+        <w:t xml:space="preserve">To illustrate and test the results project will also require to develop a software application designed for extracting and caching market data, with subsequent incorporation of calculations of portfolio Value-at-Risk (VaR) and/or Expected Shortfall (ES) measures. To achieve this, implement Monte Carlo simulations using various copulas within the application, in addition to providing support for pure the historical calculation methods.</w:t>
       </w:r>
     </w:p>
     <w:p>
@@ -132,79 +132,11 @@
         <w:pStyle w:val="BodyText"/>
       </w:pPr>
       <w:r>
-        <w:t xml:space="preserve">Upon completion of the initial software development, conduct an experimental analysis to evaluate the impact of copula assumptions on the selected VaR and ES measures across distinct portfolios. Following this, establish a calibration procedure aimed at fitting appropriate copulas to real-world market data. Lastly, devise a testing exercise to verify whether the calibrated copulas align with the prescribed conditions.</w:t>
-      </w:r>
-    </w:p>
-    <w:p>
-      <w:pPr>
-        <w:pStyle w:val="BodyText"/>
-      </w:pPr>
-      <w:r>
-        <w:t xml:space="preserve">In summary:</w:t>
-      </w:r>
-    </w:p>
-    <w:p>
-      <w:pPr>
-        <w:pStyle w:val="Compact"/>
-        <w:numPr>
-          <w:ilvl w:val="0"/>
-          <w:numId w:val="1001"/>
-        </w:numPr>
-      </w:pPr>
-      <w:r>
-        <w:t xml:space="preserve">Create software for market data extraction and caching.</w:t>
-      </w:r>
-    </w:p>
-    <w:p>
-      <w:pPr>
-        <w:pStyle w:val="Compact"/>
-        <w:numPr>
-          <w:ilvl w:val="0"/>
-          <w:numId w:val="1001"/>
-        </w:numPr>
-      </w:pPr>
-      <w:r>
-        <w:t xml:space="preserve">Implement VaR/ES calculations using Monte Carlo simulations (with various copulas) and historical methods.</w:t>
-      </w:r>
-    </w:p>
-    <w:p>
-      <w:pPr>
-        <w:pStyle w:val="Compact"/>
-        <w:numPr>
-          <w:ilvl w:val="0"/>
-          <w:numId w:val="1001"/>
-        </w:numPr>
-      </w:pPr>
-      <w:r>
-        <w:t xml:space="preserve">Perform an initial experiment to gauge copula impact on selected measures across different portfolios.</w:t>
-      </w:r>
-    </w:p>
-    <w:p>
-      <w:pPr>
-        <w:pStyle w:val="Compact"/>
-        <w:numPr>
-          <w:ilvl w:val="0"/>
-          <w:numId w:val="1001"/>
-        </w:numPr>
-      </w:pPr>
-      <w:r>
-        <w:t xml:space="preserve">Define a machine calibration procedure tailored towards fitting suitable copulas to real-world market data.</w:t>
-      </w:r>
-    </w:p>
-    <w:p>
-      <w:pPr>
-        <w:pStyle w:val="Compact"/>
-        <w:numPr>
-          <w:ilvl w:val="0"/>
-          <w:numId w:val="1001"/>
-        </w:numPr>
-      </w:pPr>
-      <w:r>
-        <w:t xml:space="preserve">Design a testing exercise to ensure the calibrated copulas adhere to the specified conditions.</w:t>
+        <w:t xml:space="preserve">Upon completion of the initial software development, conduct an experimental analysis to evaluate the impact of copula assumptions on the selected VaR / ES measures across distinct portfolios. Following this, establish a calibration procedure aimed at fitting appropriate copulas to real-world market data. Lastly, devise a testing exercise to verify whether the calibrated copulas align with the prescribed conditions.</w:t>
       </w:r>
     </w:p>
     <w:bookmarkEnd w:id="10"/>
-    <w:bookmarkStart w:id="31" w:name="X32b9430d5d15411fac62685483839fe9d87a9a8"/>
+    <w:bookmarkStart w:id="20" w:name="X32b9430d5d15411fac62685483839fe9d87a9a8"/>
     <w:p>
       <w:pPr>
         <w:pStyle w:val="Heading1"/>
@@ -213,7 +145,7 @@
         <w:t xml:space="preserve">Description of the problem and relevant work</w:t>
       </w:r>
     </w:p>
-    <w:bookmarkStart w:id="29" w:name="key-concepts"/>
+    <w:bookmarkStart w:id="18" w:name="key-concepts"/>
     <w:p>
       <w:pPr>
         <w:pStyle w:val="Heading2"/>
@@ -228,7 +160,7 @@
         <w:pStyle w:val="Heading3"/>
       </w:pPr>
       <w:r>
-        <w:t xml:space="preserve">Value-at-risk (VaR) and expected shortfall (ES)</w:t>
+        <w:t xml:space="preserve">Value-at-Risk (VaR) and expected shortfall (ES)</w:t>
       </w:r>
     </w:p>
     <w:p>
@@ -241,7 +173,7 @@
       <w:r>
         <w:t xml:space="preserve"> </w:t>
       </w:r>
-      <w:hyperlink w:anchor="literature">
+      <w:hyperlink w:anchor="references">
         <w:r>
           <w:rPr>
             <w:rStyle w:val="Hyperlink"/>
@@ -554,7 +486,7 @@
       <w:r>
         <w:t xml:space="preserve"> </w:t>
       </w:r>
-      <w:hyperlink w:anchor="literature">
+      <w:hyperlink w:anchor="references">
         <w:r>
           <w:rPr>
             <w:rStyle w:val="Hyperlink"/>
@@ -571,12 +503,12 @@
         <w:pStyle w:val="BodyText"/>
       </w:pPr>
       <w:r>
-        <w:t xml:space="preserve">There are several main contesting industry spread approaches for VaR (see</w:t>
+        <w:t xml:space="preserve">There are several main contesting industry spread approaches (see</w:t>
       </w:r>
       <w:r>
         <w:t xml:space="preserve"> </w:t>
       </w:r>
-      <w:hyperlink w:anchor="literature">
+      <w:hyperlink w:anchor="references">
         <w:r>
           <w:rPr>
             <w:rStyle w:val="Hyperlink"/>
@@ -590,23 +522,49 @@
       <w:r>
         <w:t xml:space="preserve">for additional details):</w:t>
       </w:r>
-      <w:r>
-        <w:br/>
-      </w:r>
-      <w:r>
-        <w:t xml:space="preserve">* Historical Value-at-Risk (HVaR),</w:t>
-      </w:r>
-      <w:r>
-        <w:t xml:space="preserve"> </w:t>
-      </w:r>
-      <w:r>
-        <w:t xml:space="preserve">* Monte Carlo Value-at-Risk (MC VaR),</w:t>
-      </w:r>
-      <w:r>
-        <w:t xml:space="preserve"> </w:t>
-      </w:r>
-      <w:r>
-        <w:t xml:space="preserve">* and their hybrids.</w:t>
+    </w:p>
+    <w:p>
+      <w:pPr>
+        <w:pStyle w:val="Compact"/>
+        <w:numPr>
+          <w:ilvl w:val="0"/>
+          <w:numId w:val="1001"/>
+        </w:numPr>
+      </w:pPr>
+      <w:r>
+        <w:t xml:space="preserve">Historical Value-at-Risk (HVaR),</w:t>
+      </w:r>
+    </w:p>
+    <w:p>
+      <w:pPr>
+        <w:pStyle w:val="Compact"/>
+        <w:numPr>
+          <w:ilvl w:val="0"/>
+          <w:numId w:val="1001"/>
+        </w:numPr>
+      </w:pPr>
+      <w:r>
+        <w:t xml:space="preserve">Monte Carlo Value-at-Risk (MC VaR),</w:t>
+      </w:r>
+    </w:p>
+    <w:p>
+      <w:pPr>
+        <w:pStyle w:val="Compact"/>
+        <w:numPr>
+          <w:ilvl w:val="0"/>
+          <w:numId w:val="1001"/>
+        </w:numPr>
+      </w:pPr>
+      <w:r>
+        <w:t xml:space="preserve">and their hybrids.</w:t>
+      </w:r>
+    </w:p>
+    <w:p>
+      <w:pPr>
+        <w:pStyle w:val="FirstParagraph"/>
+      </w:pPr>
+      <w:r>
+        <w:t xml:space="preserve">When assessing Historical Value-at-Risk (HVaR), several inherent limitations are apparent, particularly when applied to high-percentile risk measures i.e. its inability to estimate extreme percentiles beyond the 99% threshold, as the method relies solely on observed historical data, which often lacks sufficient extreme observations to produce stable tail estimates (e.g. 1 year of data means approx. 250 observations, so the worst one would correspond to 99.6 % and hence being quite unstable). While HVaR does allow for filtration techniques to refine marginal distributions, this flexibility does not extend to the dependence structure, meaning it cannot effectively separate the modelling of marginals from the copula that links them. As a result, the approach struggles to capture complex joint behaviors in a structured way. Another related critical drawback is the high numerical error associated with HVaR, stemming from the finite and often sparse nature of historical data, especially in the tails. On the other hand, the relative strength of the method is its low model error, since it does not impose strong parametric assumptions but instead directly uses empirical distributions. This makes it robust in scenarios where the true data-generating process is unknown, though at the cost of precision in extreme quantiles.</w:t>
       </w:r>
     </w:p>
     <w:p>
@@ -614,7 +572,7 @@
         <w:pStyle w:val="BodyText"/>
       </w:pPr>
       <w:r>
-        <w:t xml:space="preserve">When assessing Historical Value-at-Risk (HVaR), several inherent limitations are apparent, particularly when applied to high-percentile risk measures i.e. its inability to estimate extreme percentiles beyond the 99% threshold, as the method relies solely on observed historical data, which often lacks sufficient extreme observations to produce stable tail estimates (e.g. 1 year of data means approx. 250 so the worst observation would correspond to 99.6 % and hence being quite unstable). While HVaR does allow for filtration techniques to refine marginal distributions, this flexibility does not extend to the dependence structure—meaning it cannot effectively separate the modelling of marginals from the copula that links them. As a result, the approach struggles to capture complex joint behaviors in a structured way. Another related critical drawback is the high numerical error associated with HVaR, stemming from the finite and often sparse nature of historical data, especially in the tails. On the other hand, the relative strength of the method is its low model error, since it does not impose strong parametric assumptions but instead directly uses empirical distributions. This makes it robust in scenarios where the true data-generating process is unknown, though at the cost of precision in extreme quantiles.</w:t>
+        <w:t xml:space="preserve">In contrast, Monte Carlo Value-at-Risk (MC VaR), whether based on parametric assumptions or Extreme Value Theory (EVT), offers distinct advantages for high-percentile risk estimation. Unlike HVaR, these methods are well-suited for quantiles far beyond 99%, as they generate synthetic data to populate the tails more densely. A key structural benefit is their ability to decouple marginal distributions from the copula, allowing for independent calibration of each component. This separation enhances flexibility in modelling dependence structure while maintaining control over individual risk factors.</w:t>
       </w:r>
     </w:p>
     <w:p>
@@ -622,19 +580,11 @@
         <w:pStyle w:val="BodyText"/>
       </w:pPr>
       <w:r>
-        <w:t xml:space="preserve">In contrast, Monte Carlo Value-at-Risk (MC VaR), whether based on parametric assumptions or Extreme Value Theory (EVT), offers distinct advantages for high-percentile risk estimation. Unlike HVaR, these methods are well-suited for quantiles far beyond 99%, as they generate synthetic data to populate the tails more densely. A key structural benefit is their ability to decouple marginal distributions from the copula, allowing for independent calibration of each component. This separation enhances flexibility in modelling dependence structures while maintaining control over individual risk factors.</w:t>
-      </w:r>
-    </w:p>
-    <w:p>
-      <w:pPr>
-        <w:pStyle w:val="BodyText"/>
-      </w:pPr>
-      <w:r>
-        <w:t xml:space="preserve">From a computational perspective, MC VaR methods exhibit low numerical error, as the simulated datasets can be made arbitrarily large to smooth out estimation noise. However, this precision comes at the expense of higher model error, particularly when parametric assumptions are misspecified or when EVT extrapolations deviate from true tail behavior. While these methods provide greater control and extensibility in extreme risk modelling, their reliability hinges on the accuracy of the underlying assumptions—whether in the choice of distributions, copula functions, or tail decay parameters.</w:t>
+        <w:t xml:space="preserve">From a computational perspective, MC VaR methods exhibit low numerical error, as the simulated datasets can be made arbitrarily large to smooth out estimation noise. However, this precision comes at the expense of higher model error, particularly when parametric assumptions are misspecified or when EVT extrapolations deviate from true tail behavior. While these methods provide greater control and extensibility in extreme risk modelling, their reliability hinges on the accuracy of the underlying assumptions, whether in the choice of distributions copula functions, or tail decay parameters.</w:t>
       </w:r>
     </w:p>
     <w:bookmarkEnd w:id="11"/>
-    <w:bookmarkStart w:id="28" w:name="copulas."/>
+    <w:bookmarkStart w:id="13" w:name="copulas."/>
     <w:p>
       <w:pPr>
         <w:pStyle w:val="Heading3"/>
@@ -1441,7 +1391,802 @@
         <w:pStyle w:val="FirstParagraph"/>
       </w:pPr>
       <w:r>
-        <w:t xml:space="preserve">Gaussian copula.</w:t>
+        <w:t xml:space="preserve">For more details on copula and their applications in finance please see</w:t>
+      </w:r>
+      <w:r>
+        <w:t xml:space="preserve"> </w:t>
+      </w:r>
+      <w:hyperlink w:anchor="references">
+        <w:r>
+          <w:rPr>
+            <w:rStyle w:val="Hyperlink"/>
+          </w:rPr>
+          <w:t xml:space="preserve">[2]</w:t>
+        </w:r>
+      </w:hyperlink>
+      <w:r>
+        <w:t xml:space="preserve">. However it is important to introduce several properties of the copulas which will be significant for the current project:</w:t>
+      </w:r>
+    </w:p>
+    <w:p>
+      <w:pPr>
+        <w:numPr>
+          <w:ilvl w:val="0"/>
+          <w:numId w:val="1002"/>
+        </w:numPr>
+      </w:pPr>
+      <w:r>
+        <w:t xml:space="preserve">A convex combination of copulas is also a copula. It is often called a mixture copula and can be expressed as a weighted sum of copulas</w:t>
+      </w:r>
+      <w:r>
+        <w:t xml:space="preserve"> </w:t>
+      </w:r>
+      <m:oMath>
+        <m:sSub>
+          <m:e>
+            <m:r>
+              <m:t>C</m:t>
+            </m:r>
+          </m:e>
+          <m:sub>
+            <m:r>
+              <m:t>i</m:t>
+            </m:r>
+          </m:sub>
+        </m:sSub>
+      </m:oMath>
+      <w:r>
+        <w:t xml:space="preserve">, defined as</w:t>
+      </w:r>
+      <w:r>
+        <w:t xml:space="preserve"> </w:t>
+      </w:r>
+      <m:oMath>
+        <m:sSub>
+          <m:e>
+            <m:r>
+              <m:t>C</m:t>
+            </m:r>
+          </m:e>
+          <m:sub>
+            <m:r>
+              <m:t>m</m:t>
+            </m:r>
+            <m:r>
+              <m:t>i</m:t>
+            </m:r>
+            <m:r>
+              <m:t>x</m:t>
+            </m:r>
+          </m:sub>
+        </m:sSub>
+        <m:r>
+          <m:rPr>
+            <m:sty m:val="p"/>
+          </m:rPr>
+          <m:t>=</m:t>
+        </m:r>
+        <m:sSubSup>
+          <m:e>
+            <m:r>
+              <m:rPr>
+                <m:sty m:val="p"/>
+              </m:rPr>
+              <m:t>Σ</m:t>
+            </m:r>
+          </m:e>
+          <m:sub>
+            <m:r>
+              <m:t>i</m:t>
+            </m:r>
+            <m:r>
+              <m:rPr>
+                <m:sty m:val="p"/>
+              </m:rPr>
+              <m:t>=</m:t>
+            </m:r>
+            <m:r>
+              <m:t>1</m:t>
+            </m:r>
+          </m:sub>
+          <m:sup>
+            <m:r>
+              <m:t>n</m:t>
+            </m:r>
+          </m:sup>
+        </m:sSubSup>
+        <m:sSub>
+          <m:e>
+            <m:r>
+              <m:t>w</m:t>
+            </m:r>
+          </m:e>
+          <m:sub>
+            <m:r>
+              <m:t>i</m:t>
+            </m:r>
+          </m:sub>
+        </m:sSub>
+        <m:sSub>
+          <m:e>
+            <m:r>
+              <m:t>C</m:t>
+            </m:r>
+          </m:e>
+          <m:sub>
+            <m:r>
+              <m:t>i</m:t>
+            </m:r>
+          </m:sub>
+        </m:sSub>
+        <m:r>
+          <m:rPr>
+            <m:sty m:val="p"/>
+          </m:rPr>
+          <m:t>(</m:t>
+        </m:r>
+        <m:r>
+          <m:t>u</m:t>
+        </m:r>
+        <m:r>
+          <m:rPr>
+            <m:sty m:val="p"/>
+          </m:rPr>
+          <m:t>,</m:t>
+        </m:r>
+        <m:r>
+          <m:t>v</m:t>
+        </m:r>
+        <m:r>
+          <m:rPr>
+            <m:sty m:val="p"/>
+          </m:rPr>
+          <m:t>)</m:t>
+        </m:r>
+      </m:oMath>
+      <w:r>
+        <w:t xml:space="preserve">, where all</w:t>
+      </w:r>
+      <w:r>
+        <w:t xml:space="preserve"> </w:t>
+      </w:r>
+      <m:oMath>
+        <m:sSub>
+          <m:e>
+            <m:r>
+              <m:t>w</m:t>
+            </m:r>
+          </m:e>
+          <m:sub>
+            <m:r>
+              <m:t>i</m:t>
+            </m:r>
+          </m:sub>
+        </m:sSub>
+        <m:r>
+          <m:rPr>
+            <m:sty m:val="p"/>
+          </m:rPr>
+          <m:t>&gt;</m:t>
+        </m:r>
+        <m:r>
+          <m:t>0</m:t>
+        </m:r>
+      </m:oMath>
+      <w:r>
+        <w:t xml:space="preserve"> </w:t>
+      </w:r>
+      <w:r>
+        <w:t xml:space="preserve">and sum to one</w:t>
+      </w:r>
+      <w:r>
+        <w:t xml:space="preserve"> </w:t>
+      </w:r>
+      <m:oMath>
+        <m:sSubSup>
+          <m:e>
+            <m:r>
+              <m:rPr>
+                <m:sty m:val="p"/>
+              </m:rPr>
+              <m:t>Σ</m:t>
+            </m:r>
+          </m:e>
+          <m:sub>
+            <m:r>
+              <m:t>i</m:t>
+            </m:r>
+            <m:r>
+              <m:rPr>
+                <m:sty m:val="p"/>
+              </m:rPr>
+              <m:t>=</m:t>
+            </m:r>
+            <m:r>
+              <m:t>1</m:t>
+            </m:r>
+          </m:sub>
+          <m:sup>
+            <m:r>
+              <m:t>n</m:t>
+            </m:r>
+          </m:sup>
+        </m:sSubSup>
+        <m:sSub>
+          <m:e>
+            <m:r>
+              <m:t>w</m:t>
+            </m:r>
+          </m:e>
+          <m:sub>
+            <m:r>
+              <m:t>i</m:t>
+            </m:r>
+          </m:sub>
+        </m:sSub>
+        <m:r>
+          <m:rPr>
+            <m:sty m:val="p"/>
+          </m:rPr>
+          <m:t>=</m:t>
+        </m:r>
+        <m:r>
+          <m:t>1</m:t>
+        </m:r>
+      </m:oMath>
+      <w:r>
+        <w:t xml:space="preserve">.</w:t>
+      </w:r>
+    </w:p>
+    <w:p>
+      <w:pPr>
+        <w:numPr>
+          <w:ilvl w:val="0"/>
+          <w:numId w:val="1002"/>
+        </w:numPr>
+      </w:pPr>
+      <w:r>
+        <w:t xml:space="preserve">Exists a set of functions (W-transforms) applied to copula and also returning copula but with modified properties. For additional details on these transformations and their properties please see</w:t>
+      </w:r>
+      <w:r>
+        <w:t xml:space="preserve"> </w:t>
+      </w:r>
+      <w:hyperlink w:anchor="references">
+        <w:r>
+          <w:rPr>
+            <w:rStyle w:val="Hyperlink"/>
+          </w:rPr>
+          <w:t xml:space="preserve">[9]</w:t>
+        </w:r>
+      </w:hyperlink>
+      <w:r>
+        <w:t xml:space="preserve">.</w:t>
+      </w:r>
+    </w:p>
+    <w:bookmarkEnd w:id="13"/>
+    <w:bookmarkStart w:id="17" w:name="copulas-in-value-at-risk"/>
+    <w:p>
+      <w:pPr>
+        <w:pStyle w:val="Heading3"/>
+      </w:pPr>
+      <w:r>
+        <w:t xml:space="preserve">Copulas in Value-at-Risk</w:t>
+      </w:r>
+    </w:p>
+    <w:p>
+      <w:pPr>
+        <w:pStyle w:val="FirstParagraph"/>
+      </w:pPr>
+      <w:r>
+        <w:t xml:space="preserve">The selection of a copula has a profound influence on the assessment of tail‑risk measures such as Value‑at‑Risk (VaR) / Expected Shortfall (ES). This influence becomes increasingly pronounced as we move to more extreme quantiles (e.g. 99 % and 99.9 % VaR). The principal limitation of the Gaussian copula lies in its asymptotic independence: as one approach the far ends of the distribution, the probability that two (or more) variables exceed a high threshold simultaneously tends to zero at the same rate as if the variables were independent. Consequently, the Gaussian copula systematically under‑estimates the likelihood of joint extreme events and, therefore, under‑states tail‑risk metrics.</w:t>
+      </w:r>
+    </w:p>
+    <w:p>
+      <w:pPr>
+        <w:pStyle w:val="BodyText"/>
+      </w:pPr>
+      <w:r>
+        <w:t xml:space="preserve">Tail dependence provides a concise way to expose this shortcoming, some introduction to the use of tail dependence can be found in</w:t>
+      </w:r>
+      <w:r>
+        <w:t xml:space="preserve"> </w:t>
+      </w:r>
+      <w:hyperlink w:anchor="references">
+        <w:r>
+          <w:rPr>
+            <w:rStyle w:val="Hyperlink"/>
+          </w:rPr>
+          <w:t xml:space="preserve">[6]</w:t>
+        </w:r>
+      </w:hyperlink>
+      <w:r>
+        <w:t xml:space="preserve">. Formulas below define lower and upper tail dependence respectively:</w:t>
+      </w:r>
+    </w:p>
+    <w:p>
+      <w:pPr>
+        <w:pStyle w:val="BodyText"/>
+      </w:pPr>
+      <m:oMathPara>
+        <m:oMathParaPr>
+          <m:jc m:val="center"/>
+        </m:oMathParaPr>
+        <m:oMath>
+          <m:sSubSup>
+            <m:e>
+              <m:r>
+                <m:t>τ</m:t>
+              </m:r>
+            </m:e>
+            <m:sub>
+              <m:r>
+                <m:t>i</m:t>
+              </m:r>
+              <m:r>
+                <m:t>j</m:t>
+              </m:r>
+            </m:sub>
+            <m:sup>
+              <m:r>
+                <m:t>L</m:t>
+              </m:r>
+            </m:sup>
+          </m:sSubSup>
+          <m:r>
+            <m:rPr>
+              <m:sty m:val="p"/>
+            </m:rPr>
+            <m:t>=</m:t>
+          </m:r>
+          <m:limLow>
+            <m:e>
+              <m:r>
+                <m:rPr>
+                  <m:sty m:val="p"/>
+                </m:rPr>
+                <m:t>lim</m:t>
+              </m:r>
+            </m:e>
+            <m:lim>
+              <m:r>
+                <m:t>q</m:t>
+              </m:r>
+              <m:r>
+                <m:rPr>
+                  <m:sty m:val="p"/>
+                </m:rPr>
+                <m:t>→</m:t>
+              </m:r>
+              <m:sSup>
+                <m:e>
+                  <m:r>
+                    <m:t>0</m:t>
+                  </m:r>
+                </m:e>
+                <m:sup>
+                  <m:r>
+                    <m:rPr>
+                      <m:sty m:val="p"/>
+                    </m:rPr>
+                    <m:t>+</m:t>
+                  </m:r>
+                </m:sup>
+              </m:sSup>
+            </m:lim>
+          </m:limLow>
+          <m:r>
+            <m:t>P</m:t>
+          </m:r>
+          <m:r>
+            <m:rPr>
+              <m:sty m:val="p"/>
+            </m:rPr>
+            <m:t>[</m:t>
+          </m:r>
+          <m:sSub>
+            <m:e>
+              <m:r>
+                <m:t>X</m:t>
+              </m:r>
+            </m:e>
+            <m:sub>
+              <m:r>
+                <m:t>i</m:t>
+              </m:r>
+            </m:sub>
+          </m:sSub>
+          <m:r>
+            <m:rPr>
+              <m:sty m:val="p"/>
+            </m:rPr>
+            <m:t>≤</m:t>
+          </m:r>
+          <m:sSubSup>
+            <m:e>
+              <m:r>
+                <m:t>G</m:t>
+              </m:r>
+            </m:e>
+            <m:sub>
+              <m:r>
+                <m:t>i</m:t>
+              </m:r>
+            </m:sub>
+            <m:sup>
+              <m:r>
+                <m:rPr>
+                  <m:sty m:val="p"/>
+                </m:rPr>
+                <m:t>−</m:t>
+              </m:r>
+              <m:r>
+                <m:t>1</m:t>
+              </m:r>
+            </m:sup>
+          </m:sSubSup>
+          <m:r>
+            <m:rPr>
+              <m:sty m:val="p"/>
+            </m:rPr>
+            <m:t>(</m:t>
+          </m:r>
+          <m:r>
+            <m:t>q</m:t>
+          </m:r>
+          <m:r>
+            <m:rPr>
+              <m:sty m:val="p"/>
+            </m:rPr>
+            <m:t>)</m:t>
+          </m:r>
+          <m:r>
+            <m:rPr>
+              <m:sty m:val="p"/>
+            </m:rPr>
+            <m:t>∣</m:t>
+          </m:r>
+          <m:sSub>
+            <m:e>
+              <m:r>
+                <m:t>X</m:t>
+              </m:r>
+            </m:e>
+            <m:sub>
+              <m:r>
+                <m:t>j</m:t>
+              </m:r>
+            </m:sub>
+          </m:sSub>
+          <m:r>
+            <m:rPr>
+              <m:sty m:val="p"/>
+            </m:rPr>
+            <m:t>≤</m:t>
+          </m:r>
+          <m:sSubSup>
+            <m:e>
+              <m:r>
+                <m:t>G</m:t>
+              </m:r>
+            </m:e>
+            <m:sub>
+              <m:r>
+                <m:t>j</m:t>
+              </m:r>
+            </m:sub>
+            <m:sup>
+              <m:r>
+                <m:rPr>
+                  <m:sty m:val="p"/>
+                </m:rPr>
+                <m:t>−</m:t>
+              </m:r>
+              <m:r>
+                <m:t>1</m:t>
+              </m:r>
+            </m:sup>
+          </m:sSubSup>
+          <m:r>
+            <m:rPr>
+              <m:sty m:val="p"/>
+            </m:rPr>
+            <m:t>(</m:t>
+          </m:r>
+          <m:r>
+            <m:t>q</m:t>
+          </m:r>
+          <m:r>
+            <m:rPr>
+              <m:sty m:val="p"/>
+            </m:rPr>
+            <m:t>)</m:t>
+          </m:r>
+          <m:r>
+            <m:rPr>
+              <m:sty m:val="p"/>
+            </m:rPr>
+            <m:t>]</m:t>
+          </m:r>
+          <m:r>
+            <m:rPr>
+              <m:sty m:val="p"/>
+            </m:rPr>
+            <m:t>/</m:t>
+          </m:r>
+          <m:r>
+            <m:rPr>
+              <m:sty m:val="p"/>
+            </m:rPr>
+            <m:t>(</m:t>
+          </m:r>
+          <m:r>
+            <m:t>1</m:t>
+          </m:r>
+          <m:r>
+            <m:rPr>
+              <m:sty m:val="p"/>
+            </m:rPr>
+            <m:t>−</m:t>
+          </m:r>
+          <m:r>
+            <m:t>q</m:t>
+          </m:r>
+          <m:r>
+            <m:rPr>
+              <m:sty m:val="p"/>
+            </m:rPr>
+            <m:t>)</m:t>
+          </m:r>
+        </m:oMath>
+      </m:oMathPara>
+    </w:p>
+    <w:p>
+      <w:pPr>
+        <w:pStyle w:val="FirstParagraph"/>
+      </w:pPr>
+      <m:oMathPara>
+        <m:oMathParaPr>
+          <m:jc m:val="center"/>
+        </m:oMathParaPr>
+        <m:oMath>
+          <m:sSubSup>
+            <m:e>
+              <m:r>
+                <m:t>τ</m:t>
+              </m:r>
+            </m:e>
+            <m:sub>
+              <m:r>
+                <m:t>i</m:t>
+              </m:r>
+              <m:r>
+                <m:t>j</m:t>
+              </m:r>
+            </m:sub>
+            <m:sup>
+              <m:r>
+                <m:t>U</m:t>
+              </m:r>
+            </m:sup>
+          </m:sSubSup>
+          <m:r>
+            <m:rPr>
+              <m:sty m:val="p"/>
+            </m:rPr>
+            <m:t>=</m:t>
+          </m:r>
+          <m:limLow>
+            <m:e>
+              <m:r>
+                <m:rPr>
+                  <m:sty m:val="p"/>
+                </m:rPr>
+                <m:t>lim</m:t>
+              </m:r>
+            </m:e>
+            <m:lim>
+              <m:r>
+                <m:t>q</m:t>
+              </m:r>
+              <m:r>
+                <m:rPr>
+                  <m:sty m:val="p"/>
+                </m:rPr>
+                <m:t>→</m:t>
+              </m:r>
+              <m:sSup>
+                <m:e>
+                  <m:r>
+                    <m:t>1</m:t>
+                  </m:r>
+                </m:e>
+                <m:sup>
+                  <m:r>
+                    <m:rPr>
+                      <m:sty m:val="p"/>
+                    </m:rPr>
+                    <m:t>−</m:t>
+                  </m:r>
+                </m:sup>
+              </m:sSup>
+            </m:lim>
+          </m:limLow>
+          <m:r>
+            <m:t>P</m:t>
+          </m:r>
+          <m:r>
+            <m:rPr>
+              <m:sty m:val="p"/>
+            </m:rPr>
+            <m:t>[</m:t>
+          </m:r>
+          <m:sSub>
+            <m:e>
+              <m:r>
+                <m:t>X</m:t>
+              </m:r>
+            </m:e>
+            <m:sub>
+              <m:r>
+                <m:t>i</m:t>
+              </m:r>
+            </m:sub>
+          </m:sSub>
+          <m:r>
+            <m:rPr>
+              <m:sty m:val="p"/>
+            </m:rPr>
+            <m:t>&gt;</m:t>
+          </m:r>
+          <m:sSubSup>
+            <m:e>
+              <m:r>
+                <m:t>G</m:t>
+              </m:r>
+            </m:e>
+            <m:sub>
+              <m:r>
+                <m:t>i</m:t>
+              </m:r>
+            </m:sub>
+            <m:sup>
+              <m:r>
+                <m:rPr>
+                  <m:sty m:val="p"/>
+                </m:rPr>
+                <m:t>−</m:t>
+              </m:r>
+              <m:r>
+                <m:t>1</m:t>
+              </m:r>
+            </m:sup>
+          </m:sSubSup>
+          <m:r>
+            <m:rPr>
+              <m:sty m:val="p"/>
+            </m:rPr>
+            <m:t>(</m:t>
+          </m:r>
+          <m:r>
+            <m:t>q</m:t>
+          </m:r>
+          <m:r>
+            <m:rPr>
+              <m:sty m:val="p"/>
+            </m:rPr>
+            <m:t>)</m:t>
+          </m:r>
+          <m:r>
+            <m:rPr>
+              <m:sty m:val="p"/>
+            </m:rPr>
+            <m:t>∣</m:t>
+          </m:r>
+          <m:sSub>
+            <m:e>
+              <m:r>
+                <m:t>X</m:t>
+              </m:r>
+            </m:e>
+            <m:sub>
+              <m:r>
+                <m:t>j</m:t>
+              </m:r>
+            </m:sub>
+          </m:sSub>
+          <m:r>
+            <m:rPr>
+              <m:sty m:val="p"/>
+            </m:rPr>
+            <m:t>&gt;</m:t>
+          </m:r>
+          <m:sSubSup>
+            <m:e>
+              <m:r>
+                <m:t>G</m:t>
+              </m:r>
+            </m:e>
+            <m:sub>
+              <m:r>
+                <m:t>j</m:t>
+              </m:r>
+            </m:sub>
+            <m:sup>
+              <m:r>
+                <m:rPr>
+                  <m:sty m:val="p"/>
+                </m:rPr>
+                <m:t>−</m:t>
+              </m:r>
+              <m:r>
+                <m:t>1</m:t>
+              </m:r>
+            </m:sup>
+          </m:sSubSup>
+          <m:r>
+            <m:rPr>
+              <m:sty m:val="p"/>
+            </m:rPr>
+            <m:t>(</m:t>
+          </m:r>
+          <m:r>
+            <m:t>q</m:t>
+          </m:r>
+          <m:r>
+            <m:rPr>
+              <m:sty m:val="p"/>
+            </m:rPr>
+            <m:t>)</m:t>
+          </m:r>
+          <m:r>
+            <m:rPr>
+              <m:sty m:val="p"/>
+            </m:rPr>
+            <m:t>]</m:t>
+          </m:r>
+          <m:r>
+            <m:rPr>
+              <m:sty m:val="p"/>
+            </m:rPr>
+            <m:t>/</m:t>
+          </m:r>
+          <m:r>
+            <m:t>q</m:t>
+          </m:r>
+        </m:oMath>
+      </m:oMathPara>
+    </w:p>
+    <w:p>
+      <w:pPr>
+        <w:pStyle w:val="FirstParagraph"/>
+      </w:pPr>
+      <w:r>
+        <w:t xml:space="preserve">By computing these tail‑dependence coefficients, one can directly compare how different copulas treat extreme co‑movements. The contrast is stark: while a Gaussian copula predicts virtually no joint tail events, for example Cauchy (Student-T with zero degrees of freedom) assigns a non‑negligible probability to simultaneous extreme losses. See</w:t>
+      </w:r>
+      <w:r>
+        <w:t xml:space="preserve"> </w:t>
+      </w:r>
+      <w:hyperlink w:anchor="copula-examples">
+        <w:r>
+          <w:rPr>
+            <w:rStyle w:val="Hyperlink"/>
+          </w:rPr>
+          <w:t xml:space="preserve">Appendix A</w:t>
+        </w:r>
+      </w:hyperlink>
+      <w:r>
+        <w:t xml:space="preserve"> </w:t>
+      </w:r>
+      <w:r>
+        <w:t xml:space="preserve">for the visual comparison between two copulas both reflecting equivalent correlation values. This disparity translates into markedly different VaR and ES estimates, especially at the highest percentiles. Consequently, when modelling portfolio risk that is sensitive to rare but severe events, choosing a copula with appropriate tail dependence is essential. Otherwise, VaR and ES risk measures may be substantially understated.</w:t>
+      </w:r>
+    </w:p>
+    <w:p>
+      <w:pPr>
+        <w:pStyle w:val="BodyText"/>
+      </w:pPr>
+      <w:r>
+        <w:t xml:space="preserve">Figures below compare historically observed tail dependence (the orange line) with the one of Gaussian and Cauchy copulas i.e. Student-T with zero degrees of freedom (the blue and green lines respectively). The vertical axis measures tail dependence, while the horizontal axis displays the chosen percentile. As the graphs reveal, the discrepancy between the observed and Gaussian tail dependence expands significantly.</w:t>
       </w:r>
     </w:p>
     <w:p>
@@ -1451,20 +2196,574 @@
       <w:r>
         <w:drawing>
           <wp:inline>
-            <wp:extent cx="5334000" cy="4000499"/>
+            <wp:extent cx="5334000" cy="2156297"/>
             <wp:effectExtent b="0" l="0" r="0" t="0"/>
-            <wp:docPr descr="Figure 1: Uniform scenarios Gaussian_copula, numerical simulation" title="" id="14" name="Picture"/>
+            <wp:docPr descr="Figure 5: Tail dependence for different types of copulas and different number of random variables" title="" id="15" name="Picture"/>
             <a:graphic>
               <a:graphicData uri="http://schemas.openxmlformats.org/drawingml/2006/picture">
                 <pic:pic>
                   <pic:nvPicPr>
-                    <pic:cNvPr descr="figures\Uniform_scenarios_Gaussian_copula_(numerical_simulation).png" id="15" name="Picture"/>
+                    <pic:cNvPr descr="figures\Tail_dependance.png" id="16" name="Picture"/>
                     <pic:cNvPicPr>
                       <a:picLocks noChangeArrowheads="1" noChangeAspect="1"/>
                     </pic:cNvPicPr>
                   </pic:nvPicPr>
                   <pic:blipFill>
-                    <a:blip r:embed="rId13"/>
+                    <a:blip r:embed="rId14"/>
+                    <a:stretch>
+                      <a:fillRect/>
+                    </a:stretch>
+                  </pic:blipFill>
+                  <pic:spPr bwMode="auto">
+                    <a:xfrm>
+                      <a:off x="0" y="0"/>
+                      <a:ext cx="5334000" cy="2156297"/>
+                    </a:xfrm>
+                    <a:prstGeom prst="rect">
+                      <a:avLst/>
+                    </a:prstGeom>
+                    <a:noFill/>
+                    <a:ln w="9525">
+                      <a:noFill/>
+                      <a:headEnd/>
+                      <a:tailEnd/>
+                    </a:ln>
+                  </pic:spPr>
+                </pic:pic>
+              </a:graphicData>
+            </a:graphic>
+          </wp:inline>
+        </w:drawing>
+      </w:r>
+    </w:p>
+    <w:p>
+      <w:pPr>
+        <w:pStyle w:val="ImageCaption"/>
+      </w:pPr>
+      <w:r>
+        <w:t xml:space="preserve">Figure 5: Tail dependence for different types of copulas and different number of random variables</w:t>
+      </w:r>
+    </w:p>
+    <w:p>
+      <w:pPr>
+        <w:pStyle w:val="BodyText"/>
+      </w:pPr>
+      <w:r>
+        <w:t xml:space="preserve">The Cauchy copula (equivalently a Student‑t copula with zero degrees of freedom) is a statistical technique for capturing dependence structures, especially when modelling tail‑risk or extreme events. Its principal advantage lies in preserving the overall correlation matrix of the underlying variables while simultaneously enabling the generation of scenarios that exhibit much heavier tails (joint‑movement) and de-correlation. In practice, this means that the copula retains the familiar linear dependence captured by pearson‑type correlations, yet it can produce joint realizations that reflect the heightened co‑movement observed during rare, high‑impact shocks.</w:t>
+      </w:r>
+    </w:p>
+    <w:p>
+      <w:pPr>
+        <w:pStyle w:val="BodyText"/>
+      </w:pPr>
+      <w:r>
+        <w:t xml:space="preserve">De‑correlation scenarios describe circumstances in which variables that normally exhibit a strong positive (or negative) relationship suddenly lose that linkage when stress or extreme events materializes. In other words, the usual together‑ness of the data breaks down. A classic illustration comes from equity markets: two stocks that historically track each other e.g. because they belong to the same industry, may abruptly move in opposite directions during a stress event. For example, Apple vs. Microsoft - Apple taking over Microsoft business after Microsoft collapses.</w:t>
+      </w:r>
+    </w:p>
+    <w:p>
+      <w:pPr>
+        <w:pStyle w:val="BodyText"/>
+      </w:pPr>
+      <w:r>
+        <w:t xml:space="preserve">On the other hand, joint‑movement scenarios involve a set of variables that, despite exhibiting only modest or even negligible correlation under normal conditions, all swing in the same direction because they are all exposed to a shared extreme driver. Think of a severe natural disaster that simultaneously spikes commodity prices or a sovereign default that forces both sovereign bond yields and the domestic currency to deteriorate together. In these cases the common shock creates a temporary, high‑intensity dependence that standard correlation estimates fail to capture.</w:t>
+      </w:r>
+    </w:p>
+    <w:p>
+      <w:pPr>
+        <w:pStyle w:val="BodyText"/>
+      </w:pPr>
+      <w:r>
+        <w:t xml:space="preserve">Both types of scenarios are crucial for robust risk assessment. De‑correlation highlights the risk of assets that are supposed to hedge each other stop doing so, while joint‑movement emphasizes the danger of hidden tail‑dependence that can generate simultaneous losses across seemingly unrelated positions. Modelling frameworks that can generate both behaviors, provide a more realistic picture of potential extreme outcomes than approaches that rely solely on historic linear correlations.</w:t>
+      </w:r>
+    </w:p>
+    <w:bookmarkEnd w:id="17"/>
+    <w:bookmarkEnd w:id="18"/>
+    <w:bookmarkStart w:id="19" w:name="literature-review"/>
+    <w:p>
+      <w:pPr>
+        <w:pStyle w:val="Heading2"/>
+      </w:pPr>
+      <w:r>
+        <w:t xml:space="preserve">Literature review</w:t>
+      </w:r>
+    </w:p>
+    <w:p>
+      <w:pPr>
+        <w:pStyle w:val="FirstParagraph"/>
+      </w:pPr>
+      <w:r>
+        <w:t xml:space="preserve">[TODO: present articles!!!]</w:t>
+      </w:r>
+    </w:p>
+    <w:bookmarkEnd w:id="19"/>
+    <w:bookmarkEnd w:id="20"/>
+    <w:bookmarkStart w:id="21" w:name="methodology-and-methods"/>
+    <w:p>
+      <w:pPr>
+        <w:pStyle w:val="Heading1"/>
+      </w:pPr>
+      <w:r>
+        <w:t xml:space="preserve">Methodology and methods</w:t>
+      </w:r>
+    </w:p>
+    <w:p>
+      <w:pPr>
+        <w:pStyle w:val="FirstParagraph"/>
+      </w:pPr>
+      <w:r>
+        <w:t xml:space="preserve">This analysis prioritizes the generation of extreme market scenarios designed specifically for Market Risk and capital estimation purposes. Unlike studies where the intricacies of underlying asset path dynamics (such as time-dependent volatility or complex stochastic processes) are critical, this work deliberately abstracts from such details. As such there is no need to include dynamically changing portfolios (i.e. dynamic trading strategies), limiting portfolio dimension optimization to static.</w:t>
+      </w:r>
+    </w:p>
+    <w:p>
+      <w:pPr>
+        <w:pStyle w:val="BodyText"/>
+      </w:pPr>
+      <w:r>
+        <w:t xml:space="preserve">A defining challenge in Market Risk is the need to evaluate the collective behavior of thousands of risk factors simultaneously, a requirement that far exceeds the scope of prior research, where simulations often focused on merely dozens of variables. This study bridges that gap by demonstrating scalability to hundreds or even thousands of risk factors, aligning with the real-world demands of large-scale risk aggregation.</w:t>
+      </w:r>
+    </w:p>
+    <w:p>
+      <w:pPr>
+        <w:pStyle w:val="BodyText"/>
+      </w:pPr>
+      <w:r>
+        <w:t xml:space="preserve">Beyond scalability, another key advantage lies in the interpretability of results. While alternative approaches, such as Tail-GAN-based simulations, often produce outputs that are difficult to dissect or explain, the methodology employed here offers an inherent structure for understanding extreme scenarios. The framework decomposes market dynamics into a weighted combination of copulas, each with a clear and intuitive economic or statistical meaning. This not only enhances transparency but also provides with a more actionable foundation for stress testing and capital planning. The ability to attribute risk contributions to specific copula components is a significant improvement in practical applicability and model governance.</w:t>
+      </w:r>
+    </w:p>
+    <w:p>
+      <w:pPr>
+        <w:pStyle w:val="BodyText"/>
+      </w:pPr>
+      <w:r>
+        <w:rPr>
+          <w:i/>
+          <w:iCs/>
+        </w:rPr>
+        <w:t xml:space="preserve">provide a diagram that illustrate your approach/data pipeline</w:t>
+      </w:r>
+      <w:r>
+        <w:t xml:space="preserve"> </w:t>
+      </w:r>
+      <w:r>
+        <w:rPr>
+          <w:i/>
+          <w:iCs/>
+        </w:rPr>
+        <w:t xml:space="preserve">for each objective you can provide methodology, methods and tools that you will use, and organise this part accordingly</w:t>
+      </w:r>
+      <w:r>
+        <w:t xml:space="preserve"> </w:t>
+      </w:r>
+      <w:r>
+        <w:rPr>
+          <w:i/>
+          <w:iCs/>
+        </w:rPr>
+        <w:t xml:space="preserve">difference between an evaluation with respect to how your software performs, versus a critical evaluation where you reflect on your aims and objectives</w:t>
+      </w:r>
+      <w:r>
+        <w:t xml:space="preserve"> </w:t>
+      </w:r>
+      <w:r>
+        <w:rPr>
+          <w:i/>
+          <w:iCs/>
+        </w:rPr>
+        <w:t xml:space="preserve">how do you plan to implement it? E.g. if you are using machine learning, you will require a model (explain the structure of the neural network)</w:t>
+      </w:r>
+    </w:p>
+    <w:p>
+      <w:pPr>
+        <w:pStyle w:val="BodyText"/>
+      </w:pPr>
+      <w:r>
+        <w:t xml:space="preserve">The software end-product</w:t>
+      </w:r>
+      <w:r>
+        <w:t xml:space="preserve"> </w:t>
+      </w:r>
+      <w:r>
+        <w:t xml:space="preserve">My aim with this software is a proof of concept rather than an end-user application.</w:t>
+      </w:r>
+    </w:p>
+    <w:bookmarkEnd w:id="21"/>
+    <w:bookmarkStart w:id="22" w:name="project-development-plan"/>
+    <w:p>
+      <w:pPr>
+        <w:pStyle w:val="Heading1"/>
+      </w:pPr>
+      <w:r>
+        <w:t xml:space="preserve">Project development plan</w:t>
+      </w:r>
+    </w:p>
+    <w:p>
+      <w:pPr>
+        <w:pStyle w:val="FirstParagraph"/>
+      </w:pPr>
+      <w:r>
+        <w:t xml:space="preserve">The work is expected to start in the begging of May 2026. Development and research phase is expected to be finalized within 3 months leaving additional time for the report preparation.</w:t>
+      </w:r>
+    </w:p>
+    <w:p>
+      <w:pPr>
+        <w:pStyle w:val="Compact"/>
+        <w:numPr>
+          <w:ilvl w:val="0"/>
+          <w:numId w:val="1003"/>
+        </w:numPr>
+      </w:pPr>
+      <w:r>
+        <w:rPr>
+          <w:b/>
+          <w:bCs/>
+        </w:rPr>
+        <w:t xml:space="preserve">Step 1 [week 1-2]:</w:t>
+      </w:r>
+      <w:r>
+        <w:t xml:space="preserve"> </w:t>
+      </w:r>
+      <w:r>
+        <w:t xml:space="preserve">Develop functionality able to discover required market data and casche it from Yahoo API according the required population, length and granularity.</w:t>
+      </w:r>
+    </w:p>
+    <w:p>
+      <w:pPr>
+        <w:pStyle w:val="Compact"/>
+        <w:numPr>
+          <w:ilvl w:val="0"/>
+          <w:numId w:val="1003"/>
+        </w:numPr>
+      </w:pPr>
+      <w:r>
+        <w:rPr>
+          <w:b/>
+          <w:bCs/>
+        </w:rPr>
+        <w:t xml:space="preserve">Step 2 [week 3-4]:</w:t>
+      </w:r>
+      <w:r>
+        <w:t xml:space="preserve"> </w:t>
+      </w:r>
+      <w:r>
+        <w:t xml:space="preserve">Develop functionality able to calculate different Value-at-Risk metrics based on specified methodology i.e. Historical VaR, Monte-Carlo VaR. The latter should be structured in a way that copula class is provided as an input, allowing calculations with different copula hypothesis.</w:t>
+      </w:r>
+    </w:p>
+    <w:p>
+      <w:pPr>
+        <w:pStyle w:val="Compact"/>
+        <w:numPr>
+          <w:ilvl w:val="0"/>
+          <w:numId w:val="1003"/>
+        </w:numPr>
+      </w:pPr>
+      <w:r>
+        <w:rPr>
+          <w:b/>
+          <w:bCs/>
+        </w:rPr>
+        <w:t xml:space="preserve">Step 3 [week 5-6]:</w:t>
+      </w:r>
+      <w:r>
+        <w:t xml:space="preserve"> </w:t>
+      </w:r>
+      <w:r>
+        <w:t xml:space="preserve">Perform initial experiments to gauge copula impact on selected measures across different portfolios. This should help to develop better understanding required for the future interpretation of the results and testing. Assessing Gaussian, Cauchy, their transformations and weighted combinations.</w:t>
+      </w:r>
+    </w:p>
+    <w:p>
+      <w:pPr>
+        <w:pStyle w:val="Compact"/>
+        <w:numPr>
+          <w:ilvl w:val="0"/>
+          <w:numId w:val="1003"/>
+        </w:numPr>
+      </w:pPr>
+      <w:r>
+        <w:rPr>
+          <w:b/>
+          <w:bCs/>
+        </w:rPr>
+        <w:t xml:space="preserve">Step 4 [week 7-8]:</w:t>
+      </w:r>
+      <w:r>
+        <w:t xml:space="preserve"> </w:t>
+      </w:r>
+      <w:r>
+        <w:t xml:space="preserve">Build optimization functionality select parameters for the copula matching current measures for the list of selected portfolios. Once the best matching parameters are available attempt on learning them from the observations directly with deep neral net (MLP).</w:t>
+      </w:r>
+      <w:r>
+        <w:br/>
+      </w:r>
+    </w:p>
+    <w:p>
+      <w:pPr>
+        <w:pStyle w:val="Compact"/>
+        <w:numPr>
+          <w:ilvl w:val="0"/>
+          <w:numId w:val="1003"/>
+        </w:numPr>
+      </w:pPr>
+      <w:r>
+        <w:rPr>
+          <w:b/>
+          <w:bCs/>
+        </w:rPr>
+        <w:t xml:space="preserve">Step 5 [week 9-10]:</w:t>
+      </w:r>
+      <w:r>
+        <w:t xml:space="preserve"> </w:t>
+      </w:r>
+      <w:r>
+        <w:t xml:space="preserve">Design a testing exercise to ensure the calibrated copulas adhere to the specified conditions. Test whether MLP neral net was able to learn specific copula parameters directly from the data.</w:t>
+      </w:r>
+    </w:p>
+    <w:p>
+      <w:pPr>
+        <w:pStyle w:val="Compact"/>
+        <w:numPr>
+          <w:ilvl w:val="0"/>
+          <w:numId w:val="1003"/>
+        </w:numPr>
+      </w:pPr>
+      <w:r>
+        <w:rPr>
+          <w:b/>
+          <w:bCs/>
+        </w:rPr>
+        <w:t xml:space="preserve">Step 6 [week 11 +]:</w:t>
+      </w:r>
+      <w:r>
+        <w:t xml:space="preserve"> </w:t>
+      </w:r>
+      <w:r>
+        <w:t xml:space="preserve">Assess obtained results, summarize observations and developed software within the report.</w:t>
+      </w:r>
+    </w:p>
+    <w:bookmarkEnd w:id="22"/>
+    <w:bookmarkStart w:id="28" w:name="references"/>
+    <w:p>
+      <w:pPr>
+        <w:pStyle w:val="Heading1"/>
+      </w:pPr>
+      <w:r>
+        <w:t xml:space="preserve">References</w:t>
+      </w:r>
+    </w:p>
+    <w:p>
+      <w:pPr>
+        <w:numPr>
+          <w:ilvl w:val="0"/>
+          <w:numId w:val="1004"/>
+        </w:numPr>
+      </w:pPr>
+      <w:r>
+        <w:t xml:space="preserve">Jorion P., 2006. Value as Risk: The New Benchmark for Managing Financial Risk. New York: The McGraw-Hill.</w:t>
+      </w:r>
+    </w:p>
+    <w:p>
+      <w:pPr>
+        <w:numPr>
+          <w:ilvl w:val="0"/>
+          <w:numId w:val="1004"/>
+        </w:numPr>
+      </w:pPr>
+      <w:r>
+        <w:t xml:space="preserve">Cherubini U. et al, 2004. Copula methods in finance. England: Wiley finance.</w:t>
+      </w:r>
+    </w:p>
+    <w:p>
+      <w:pPr>
+        <w:numPr>
+          <w:ilvl w:val="0"/>
+          <w:numId w:val="1004"/>
+        </w:numPr>
+      </w:pPr>
+      <w:r>
+        <w:t xml:space="preserve">Chollet F., 2021. Deep learning with Python. New York: Manning Publications Co. </w:t>
+      </w:r>
+    </w:p>
+    <w:p>
+      <w:pPr>
+        <w:numPr>
+          <w:ilvl w:val="0"/>
+          <w:numId w:val="1004"/>
+        </w:numPr>
+      </w:pPr>
+      <w:r>
+        <w:t xml:space="preserve">Acerbi C., Szekely B., 2014. Back-testing expected shortfall. Risk, 27(11):76–81.</w:t>
+      </w:r>
+    </w:p>
+    <w:p>
+      <w:pPr>
+        <w:numPr>
+          <w:ilvl w:val="0"/>
+          <w:numId w:val="1004"/>
+        </w:numPr>
+      </w:pPr>
+      <w:r>
+        <w:t xml:space="preserve">Cont R. et al, 2022. Tail-GAN: Nonparametric scenario generation for tail risk estimation.</w:t>
+      </w:r>
+      <w:r>
+        <w:t xml:space="preserve"> </w:t>
+      </w:r>
+      <w:hyperlink r:id="rId23">
+        <w:r>
+          <w:rPr>
+            <w:rStyle w:val="Hyperlink"/>
+          </w:rPr>
+          <w:t xml:space="preserve">(link)</w:t>
+        </w:r>
+      </w:hyperlink>
+    </w:p>
+    <w:p>
+      <w:pPr>
+        <w:numPr>
+          <w:ilvl w:val="0"/>
+          <w:numId w:val="1004"/>
+        </w:numPr>
+      </w:pPr>
+      <w:r>
+        <w:t xml:space="preserve">Oh D., Patton A., 2015. Modelling dependance in High dimensions with factor copulas.</w:t>
+      </w:r>
+      <w:r>
+        <w:t xml:space="preserve"> </w:t>
+      </w:r>
+      <w:hyperlink r:id="rId24">
+        <w:r>
+          <w:rPr>
+            <w:rStyle w:val="Hyperlink"/>
+          </w:rPr>
+          <w:t xml:space="preserve">(link)</w:t>
+        </w:r>
+      </w:hyperlink>
+    </w:p>
+    <w:p>
+      <w:pPr>
+        <w:numPr>
+          <w:ilvl w:val="0"/>
+          <w:numId w:val="1004"/>
+        </w:numPr>
+      </w:pPr>
+      <w:r>
+        <w:t xml:space="preserve">Buhler H., Horvath B., 2021. A data-driven market simulator for small data environments.</w:t>
+      </w:r>
+      <w:r>
+        <w:t xml:space="preserve"> </w:t>
+      </w:r>
+      <w:hyperlink r:id="rId25">
+        <w:r>
+          <w:rPr>
+            <w:rStyle w:val="Hyperlink"/>
+          </w:rPr>
+          <w:t xml:space="preserve">(link)</w:t>
+        </w:r>
+      </w:hyperlink>
+    </w:p>
+    <w:p>
+      <w:pPr>
+        <w:numPr>
+          <w:ilvl w:val="0"/>
+          <w:numId w:val="1004"/>
+        </w:numPr>
+      </w:pPr>
+      <w:r>
+        <w:t xml:space="preserve">Horvath B. et al, 2025. Generative Models in Finance: Market Generators, a Paradigm Shift in Financial Modeling.</w:t>
+      </w:r>
+      <w:hyperlink r:id="rId26">
+        <w:r>
+          <w:rPr>
+            <w:rStyle w:val="Hyperlink"/>
+          </w:rPr>
+          <w:t xml:space="preserve">(link)</w:t>
+        </w:r>
+      </w:hyperlink>
+    </w:p>
+    <w:p>
+      <w:pPr>
+        <w:numPr>
+          <w:ilvl w:val="0"/>
+          <w:numId w:val="1004"/>
+        </w:numPr>
+      </w:pPr>
+      <w:r>
+        <w:t xml:space="preserve">Hofert M. and Pang Z., 2025. W-transforms: Uniformity-preserving transformations and induced dependence structures.</w:t>
+      </w:r>
+      <w:hyperlink r:id="rId27">
+        <w:r>
+          <w:rPr>
+            <w:rStyle w:val="Hyperlink"/>
+          </w:rPr>
+          <w:t xml:space="preserve">(link)</w:t>
+        </w:r>
+      </w:hyperlink>
+    </w:p>
+    <w:bookmarkEnd w:id="28"/>
+    <w:bookmarkStart w:id="43" w:name="appendixes"/>
+    <w:p>
+      <w:pPr>
+        <w:pStyle w:val="Heading1"/>
+      </w:pPr>
+      <w:r>
+        <w:t xml:space="preserve">Appendixes</w:t>
+      </w:r>
+    </w:p>
+    <w:p>
+      <w:pPr>
+        <w:pStyle w:val="FirstParagraph"/>
+      </w:pPr>
+      <w:r>
+        <w:t xml:space="preserve">See corresponding equation</w:t>
+      </w:r>
+      <w:r>
+        <w:t xml:space="preserve"> </w:t>
+      </w:r>
+      <w:hyperlink w:anchor="eq1">
+        <w:r>
+          <w:rPr>
+            <w:rStyle w:val="Hyperlink"/>
+          </w:rPr>
+          <w:t xml:space="preserve">(Eq.1)</w:t>
+        </w:r>
+      </w:hyperlink>
+    </w:p>
+    <w:bookmarkStart w:id="41" w:name="appendix-a-copula-examples"/>
+    <w:p>
+      <w:pPr>
+        <w:pStyle w:val="Heading2"/>
+      </w:pPr>
+      <w:r>
+        <w:t xml:space="preserve">Appendix A: Copula examples</w:t>
+      </w:r>
+    </w:p>
+    <w:p>
+      <w:pPr>
+        <w:pStyle w:val="FirstParagraph"/>
+      </w:pPr>
+      <w:r>
+        <w:t xml:space="preserve">Gaussian copula.</w:t>
+      </w:r>
+    </w:p>
+    <w:p>
+      <w:pPr>
+        <w:pStyle w:val="CaptionedFigure"/>
+      </w:pPr>
+      <w:r>
+        <w:drawing>
+          <wp:inline>
+            <wp:extent cx="5334000" cy="4000499"/>
+            <wp:effectExtent b="0" l="0" r="0" t="0"/>
+            <wp:docPr descr="Figure 1: Uniform scenarios Gaussian_copula, numerical simulation" title="" id="30" name="Picture"/>
+            <a:graphic>
+              <a:graphicData uri="http://schemas.openxmlformats.org/drawingml/2006/picture">
+                <pic:pic>
+                  <pic:nvPicPr>
+                    <pic:cNvPr descr="figures\Uniform_scenarios_Gaussian_copula_(numerical_simulation).png" id="31" name="Picture"/>
+                    <pic:cNvPicPr>
+                      <a:picLocks noChangeArrowheads="1" noChangeAspect="1"/>
+                    </pic:cNvPicPr>
+                  </pic:nvPicPr>
+                  <pic:blipFill>
+                    <a:blip r:embed="rId29"/>
                     <a:stretch>
                       <a:fillRect/>
                     </a:stretch>
@@ -1508,18 +2807,18 @@
           <wp:inline>
             <wp:extent cx="5334000" cy="4000499"/>
             <wp:effectExtent b="0" l="0" r="0" t="0"/>
-            <wp:docPr descr="Figure 2: Contour plot Gaussian copula, numerical simulation" title="" id="17" name="Picture"/>
+            <wp:docPr descr="Figure 2: Contour plot Gaussian copula, numerical simulation" title="" id="33" name="Picture"/>
             <a:graphic>
               <a:graphicData uri="http://schemas.openxmlformats.org/drawingml/2006/picture">
                 <pic:pic>
                   <pic:nvPicPr>
-                    <pic:cNvPr descr="figures\Contour_plot_Gaussian_copula_(numerical_simulation).png" id="18" name="Picture"/>
+                    <pic:cNvPr descr="figures\Contour_plot_Gaussian_copula_(numerical_simulation).png" id="34" name="Picture"/>
                     <pic:cNvPicPr>
                       <a:picLocks noChangeArrowheads="1" noChangeAspect="1"/>
                     </pic:cNvPicPr>
                   </pic:nvPicPr>
                   <pic:blipFill>
-                    <a:blip r:embed="rId16"/>
+                    <a:blip r:embed="rId32"/>
                     <a:stretch>
                       <a:fillRect/>
                     </a:stretch>
@@ -1571,18 +2870,18 @@
           <wp:inline>
             <wp:extent cx="5334000" cy="4000499"/>
             <wp:effectExtent b="0" l="0" r="0" t="0"/>
-            <wp:docPr descr="Figure 3: Uniform scenarios Cauchy copula, numerical simulation" title="" id="20" name="Picture"/>
+            <wp:docPr descr="Figure 3: Uniform scenarios Cauchy copula, numerical simulation" title="" id="36" name="Picture"/>
             <a:graphic>
               <a:graphicData uri="http://schemas.openxmlformats.org/drawingml/2006/picture">
                 <pic:pic>
                   <pic:nvPicPr>
-                    <pic:cNvPr descr="figures\Uniform_scenarios_Cauchy_copula_(numerical_simulation).png" id="21" name="Picture"/>
+                    <pic:cNvPr descr="figures\Uniform_scenarios_Cauchy_copula_(numerical_simulation).png" id="37" name="Picture"/>
                     <pic:cNvPicPr>
                       <a:picLocks noChangeArrowheads="1" noChangeAspect="1"/>
                     </pic:cNvPicPr>
                   </pic:nvPicPr>
                   <pic:blipFill>
-                    <a:blip r:embed="rId19"/>
+                    <a:blip r:embed="rId35"/>
                     <a:stretch>
                       <a:fillRect/>
                     </a:stretch>
@@ -1626,18 +2925,18 @@
           <wp:inline>
             <wp:extent cx="5334000" cy="4000499"/>
             <wp:effectExtent b="0" l="0" r="0" t="0"/>
-            <wp:docPr descr="Figure 4: Contour plot Cauchy copula, numerical simulation" title="" id="23" name="Picture"/>
+            <wp:docPr descr="Figure 4: Contour plot Cauchy copula, numerical simulation" title="" id="39" name="Picture"/>
             <a:graphic>
               <a:graphicData uri="http://schemas.openxmlformats.org/drawingml/2006/picture">
                 <pic:pic>
                   <pic:nvPicPr>
-                    <pic:cNvPr descr="figures\Contour_plot_Cauchy_copula_(numerical_simulation).png" id="24" name="Picture"/>
+                    <pic:cNvPr descr="figures\Contour_plot_Cauchy_copula_(numerical_simulation).png" id="40" name="Picture"/>
                     <pic:cNvPicPr>
                       <a:picLocks noChangeArrowheads="1" noChangeAspect="1"/>
                     </pic:cNvPicPr>
                   </pic:nvPicPr>
                   <pic:blipFill>
-                    <a:blip r:embed="rId22"/>
+                    <a:blip r:embed="rId38"/>
                     <a:stretch>
                       <a:fillRect/>
                     </a:stretch>
@@ -1672,932 +2971,14 @@
         <w:t xml:space="preserve">Figure 4: Contour plot Cauchy copula, numerical simulation</w:t>
       </w:r>
     </w:p>
-    <w:p>
-      <w:pPr>
-        <w:pStyle w:val="BodyText"/>
-      </w:pPr>
-      <w:r>
-        <w:t xml:space="preserve">The selection of a copula has a profound influence on the assessment of tail‑risk measures such as Value‑at‑Risk (VaR) and Expected Shortfall (ES). This influence becomes increasingly pronounced as we move to more extreme quantiles (e.g. 99 % and 99.9 % VaR). The principal limitation of the Gaussian copula lies in its asymptotic independence: as one approach the far ends of the distribution, the probability that two (or more) variables exceed a high threshold simultaneously tends to zero at the same rate as if the variables were independent. Consequently, the Gaussian copula systematically under‑estimates the likelihood of joint extreme events and, therefore, under‑states tail‑risk metrics.</w:t>
-      </w:r>
-    </w:p>
-    <w:p>
-      <w:pPr>
-        <w:pStyle w:val="BodyText"/>
-      </w:pPr>
-      <w:r>
-        <w:t xml:space="preserve">Tail dependence provides a concise way to expose this shortcoming, some introduction to the use of tail dependence can be found in</w:t>
-      </w:r>
-      <w:r>
-        <w:t xml:space="preserve"> </w:t>
-      </w:r>
-      <w:hyperlink w:anchor="literature">
-        <w:r>
-          <w:rPr>
-            <w:rStyle w:val="Hyperlink"/>
-          </w:rPr>
-          <w:t xml:space="preserve">[6]</w:t>
-        </w:r>
-      </w:hyperlink>
-      <w:r>
-        <w:t xml:space="preserve">. Formulas below define lower and upper tail dependence respectively:</w:t>
-      </w:r>
-    </w:p>
-    <w:p>
-      <w:pPr>
-        <w:pStyle w:val="BodyText"/>
-      </w:pPr>
-      <m:oMathPara>
-        <m:oMathParaPr>
-          <m:jc m:val="center"/>
-        </m:oMathParaPr>
-        <m:oMath>
-          <m:sSubSup>
-            <m:e>
-              <m:r>
-                <m:t>τ</m:t>
-              </m:r>
-            </m:e>
-            <m:sub>
-              <m:r>
-                <m:t>i</m:t>
-              </m:r>
-              <m:r>
-                <m:t>j</m:t>
-              </m:r>
-            </m:sub>
-            <m:sup>
-              <m:r>
-                <m:t>L</m:t>
-              </m:r>
-            </m:sup>
-          </m:sSubSup>
-          <m:r>
-            <m:rPr>
-              <m:sty m:val="p"/>
-            </m:rPr>
-            <m:t>=</m:t>
-          </m:r>
-          <m:limLow>
-            <m:e>
-              <m:r>
-                <m:rPr>
-                  <m:sty m:val="p"/>
-                </m:rPr>
-                <m:t>lim</m:t>
-              </m:r>
-            </m:e>
-            <m:lim>
-              <m:r>
-                <m:t>q</m:t>
-              </m:r>
-              <m:r>
-                <m:rPr>
-                  <m:sty m:val="p"/>
-                </m:rPr>
-                <m:t>→</m:t>
-              </m:r>
-              <m:sSup>
-                <m:e>
-                  <m:r>
-                    <m:t>0</m:t>
-                  </m:r>
-                </m:e>
-                <m:sup>
-                  <m:r>
-                    <m:rPr>
-                      <m:sty m:val="p"/>
-                    </m:rPr>
-                    <m:t>+</m:t>
-                  </m:r>
-                </m:sup>
-              </m:sSup>
-            </m:lim>
-          </m:limLow>
-          <m:r>
-            <m:t>P</m:t>
-          </m:r>
-          <m:r>
-            <m:rPr>
-              <m:sty m:val="p"/>
-            </m:rPr>
-            <m:t>[</m:t>
-          </m:r>
-          <m:sSub>
-            <m:e>
-              <m:r>
-                <m:t>X</m:t>
-              </m:r>
-            </m:e>
-            <m:sub>
-              <m:r>
-                <m:t>i</m:t>
-              </m:r>
-            </m:sub>
-          </m:sSub>
-          <m:r>
-            <m:rPr>
-              <m:sty m:val="p"/>
-            </m:rPr>
-            <m:t>≤</m:t>
-          </m:r>
-          <m:sSubSup>
-            <m:e>
-              <m:r>
-                <m:t>G</m:t>
-              </m:r>
-            </m:e>
-            <m:sub>
-              <m:r>
-                <m:t>i</m:t>
-              </m:r>
-            </m:sub>
-            <m:sup>
-              <m:r>
-                <m:rPr>
-                  <m:sty m:val="p"/>
-                </m:rPr>
-                <m:t>−</m:t>
-              </m:r>
-              <m:r>
-                <m:t>1</m:t>
-              </m:r>
-            </m:sup>
-          </m:sSubSup>
-          <m:r>
-            <m:rPr>
-              <m:sty m:val="p"/>
-            </m:rPr>
-            <m:t>(</m:t>
-          </m:r>
-          <m:r>
-            <m:t>q</m:t>
-          </m:r>
-          <m:r>
-            <m:rPr>
-              <m:sty m:val="p"/>
-            </m:rPr>
-            <m:t>)</m:t>
-          </m:r>
-          <m:r>
-            <m:rPr>
-              <m:sty m:val="p"/>
-            </m:rPr>
-            <m:t>∣</m:t>
-          </m:r>
-          <m:sSub>
-            <m:e>
-              <m:r>
-                <m:t>X</m:t>
-              </m:r>
-            </m:e>
-            <m:sub>
-              <m:r>
-                <m:t>j</m:t>
-              </m:r>
-            </m:sub>
-          </m:sSub>
-          <m:r>
-            <m:rPr>
-              <m:sty m:val="p"/>
-            </m:rPr>
-            <m:t>≤</m:t>
-          </m:r>
-          <m:sSubSup>
-            <m:e>
-              <m:r>
-                <m:t>G</m:t>
-              </m:r>
-            </m:e>
-            <m:sub>
-              <m:r>
-                <m:t>j</m:t>
-              </m:r>
-            </m:sub>
-            <m:sup>
-              <m:r>
-                <m:rPr>
-                  <m:sty m:val="p"/>
-                </m:rPr>
-                <m:t>−</m:t>
-              </m:r>
-              <m:r>
-                <m:t>1</m:t>
-              </m:r>
-            </m:sup>
-          </m:sSubSup>
-          <m:r>
-            <m:rPr>
-              <m:sty m:val="p"/>
-            </m:rPr>
-            <m:t>(</m:t>
-          </m:r>
-          <m:r>
-            <m:t>q</m:t>
-          </m:r>
-          <m:r>
-            <m:rPr>
-              <m:sty m:val="p"/>
-            </m:rPr>
-            <m:t>)</m:t>
-          </m:r>
-          <m:r>
-            <m:rPr>
-              <m:sty m:val="p"/>
-            </m:rPr>
-            <m:t>]</m:t>
-          </m:r>
-          <m:r>
-            <m:rPr>
-              <m:sty m:val="p"/>
-            </m:rPr>
-            <m:t>/</m:t>
-          </m:r>
-          <m:r>
-            <m:rPr>
-              <m:sty m:val="p"/>
-            </m:rPr>
-            <m:t>(</m:t>
-          </m:r>
-          <m:r>
-            <m:t>1</m:t>
-          </m:r>
-          <m:r>
-            <m:rPr>
-              <m:sty m:val="p"/>
-            </m:rPr>
-            <m:t>−</m:t>
-          </m:r>
-          <m:r>
-            <m:t>q</m:t>
-          </m:r>
-          <m:r>
-            <m:rPr>
-              <m:sty m:val="p"/>
-            </m:rPr>
-            <m:t>)</m:t>
-          </m:r>
-        </m:oMath>
-      </m:oMathPara>
-    </w:p>
-    <w:p>
-      <w:pPr>
-        <w:pStyle w:val="FirstParagraph"/>
-      </w:pPr>
-      <m:oMathPara>
-        <m:oMathParaPr>
-          <m:jc m:val="center"/>
-        </m:oMathParaPr>
-        <m:oMath>
-          <m:sSubSup>
-            <m:e>
-              <m:r>
-                <m:t>τ</m:t>
-              </m:r>
-            </m:e>
-            <m:sub>
-              <m:r>
-                <m:t>i</m:t>
-              </m:r>
-              <m:r>
-                <m:t>j</m:t>
-              </m:r>
-            </m:sub>
-            <m:sup>
-              <m:r>
-                <m:t>U</m:t>
-              </m:r>
-            </m:sup>
-          </m:sSubSup>
-          <m:r>
-            <m:rPr>
-              <m:sty m:val="p"/>
-            </m:rPr>
-            <m:t>=</m:t>
-          </m:r>
-          <m:limLow>
-            <m:e>
-              <m:r>
-                <m:rPr>
-                  <m:sty m:val="p"/>
-                </m:rPr>
-                <m:t>lim</m:t>
-              </m:r>
-            </m:e>
-            <m:lim>
-              <m:r>
-                <m:t>q</m:t>
-              </m:r>
-              <m:r>
-                <m:rPr>
-                  <m:sty m:val="p"/>
-                </m:rPr>
-                <m:t>→</m:t>
-              </m:r>
-              <m:sSup>
-                <m:e>
-                  <m:r>
-                    <m:t>1</m:t>
-                  </m:r>
-                </m:e>
-                <m:sup>
-                  <m:r>
-                    <m:rPr>
-                      <m:sty m:val="p"/>
-                    </m:rPr>
-                    <m:t>−</m:t>
-                  </m:r>
-                </m:sup>
-              </m:sSup>
-            </m:lim>
-          </m:limLow>
-          <m:r>
-            <m:t>P</m:t>
-          </m:r>
-          <m:r>
-            <m:rPr>
-              <m:sty m:val="p"/>
-            </m:rPr>
-            <m:t>[</m:t>
-          </m:r>
-          <m:sSub>
-            <m:e>
-              <m:r>
-                <m:t>X</m:t>
-              </m:r>
-            </m:e>
-            <m:sub>
-              <m:r>
-                <m:t>i</m:t>
-              </m:r>
-            </m:sub>
-          </m:sSub>
-          <m:r>
-            <m:rPr>
-              <m:sty m:val="p"/>
-            </m:rPr>
-            <m:t>&gt;</m:t>
-          </m:r>
-          <m:sSubSup>
-            <m:e>
-              <m:r>
-                <m:t>G</m:t>
-              </m:r>
-            </m:e>
-            <m:sub>
-              <m:r>
-                <m:t>i</m:t>
-              </m:r>
-            </m:sub>
-            <m:sup>
-              <m:r>
-                <m:rPr>
-                  <m:sty m:val="p"/>
-                </m:rPr>
-                <m:t>−</m:t>
-              </m:r>
-              <m:r>
-                <m:t>1</m:t>
-              </m:r>
-            </m:sup>
-          </m:sSubSup>
-          <m:r>
-            <m:rPr>
-              <m:sty m:val="p"/>
-            </m:rPr>
-            <m:t>(</m:t>
-          </m:r>
-          <m:r>
-            <m:t>q</m:t>
-          </m:r>
-          <m:r>
-            <m:rPr>
-              <m:sty m:val="p"/>
-            </m:rPr>
-            <m:t>)</m:t>
-          </m:r>
-          <m:r>
-            <m:rPr>
-              <m:sty m:val="p"/>
-            </m:rPr>
-            <m:t>∣</m:t>
-          </m:r>
-          <m:sSub>
-            <m:e>
-              <m:r>
-                <m:t>X</m:t>
-              </m:r>
-            </m:e>
-            <m:sub>
-              <m:r>
-                <m:t>j</m:t>
-              </m:r>
-            </m:sub>
-          </m:sSub>
-          <m:r>
-            <m:rPr>
-              <m:sty m:val="p"/>
-            </m:rPr>
-            <m:t>&gt;</m:t>
-          </m:r>
-          <m:sSubSup>
-            <m:e>
-              <m:r>
-                <m:t>G</m:t>
-              </m:r>
-            </m:e>
-            <m:sub>
-              <m:r>
-                <m:t>j</m:t>
-              </m:r>
-            </m:sub>
-            <m:sup>
-              <m:r>
-                <m:rPr>
-                  <m:sty m:val="p"/>
-                </m:rPr>
-                <m:t>−</m:t>
-              </m:r>
-              <m:r>
-                <m:t>1</m:t>
-              </m:r>
-            </m:sup>
-          </m:sSubSup>
-          <m:r>
-            <m:rPr>
-              <m:sty m:val="p"/>
-            </m:rPr>
-            <m:t>(</m:t>
-          </m:r>
-          <m:r>
-            <m:t>q</m:t>
-          </m:r>
-          <m:r>
-            <m:rPr>
-              <m:sty m:val="p"/>
-            </m:rPr>
-            <m:t>)</m:t>
-          </m:r>
-          <m:r>
-            <m:rPr>
-              <m:sty m:val="p"/>
-            </m:rPr>
-            <m:t>]</m:t>
-          </m:r>
-          <m:r>
-            <m:rPr>
-              <m:sty m:val="p"/>
-            </m:rPr>
-            <m:t>/</m:t>
-          </m:r>
-          <m:r>
-            <m:t>q</m:t>
-          </m:r>
-        </m:oMath>
-      </m:oMathPara>
-    </w:p>
-    <w:p>
-      <w:pPr>
-        <w:pStyle w:val="FirstParagraph"/>
-      </w:pPr>
-      <w:r>
-        <w:t xml:space="preserve">with an analogous expression for the lower tail. By computing these tail‑dependence coefficients, one can directly compare how different copulas treat extreme co‑movements. The contrast is stark: while a Gaussian copula predicts virtually no joint tail events, a Student‑t assigns a non‑negligible probability to simultaneous extreme losses. This disparity translates into markedly different VaR and ES estimates, especially at the highest percentiles. Consequently, when modelling portfolio risk that is sensitive to rare but severe events, choosing a copula with appropriate tail dependence is essential; otherwise, risk measures such as VaR and ES may be substantially understated.</w:t>
-      </w:r>
-    </w:p>
-    <w:p>
-      <w:pPr>
-        <w:pStyle w:val="BodyText"/>
-      </w:pPr>
-      <w:r>
-        <w:t xml:space="preserve">Figures below compare historically observed tail dependence (the orange line) with the one of Gaussian and Cauchy copulas i.e. Student-T with zero degrees of freedom (the blue and green lines respectively). The vertical axis measures tail dependence, while the horizontal axis displays the chosen percentile. As the graphs reveal, the discrepancy between the observed and Gaussian tail dependence expands significantly.</w:t>
-      </w:r>
-    </w:p>
-    <w:p>
-      <w:pPr>
-        <w:pStyle w:val="CaptionedFigure"/>
-      </w:pPr>
-      <w:r>
-        <w:drawing>
-          <wp:inline>
-            <wp:extent cx="5334000" cy="2156297"/>
-            <wp:effectExtent b="0" l="0" r="0" t="0"/>
-            <wp:docPr descr="Figure 5: Tail dependence for different types of copulas and different number of random variables" title="" id="26" name="Picture"/>
-            <a:graphic>
-              <a:graphicData uri="http://schemas.openxmlformats.org/drawingml/2006/picture">
-                <pic:pic>
-                  <pic:nvPicPr>
-                    <pic:cNvPr descr="figures\Tail_dependance.png" id="27" name="Picture"/>
-                    <pic:cNvPicPr>
-                      <a:picLocks noChangeArrowheads="1" noChangeAspect="1"/>
-                    </pic:cNvPicPr>
-                  </pic:nvPicPr>
-                  <pic:blipFill>
-                    <a:blip r:embed="rId25"/>
-                    <a:stretch>
-                      <a:fillRect/>
-                    </a:stretch>
-                  </pic:blipFill>
-                  <pic:spPr bwMode="auto">
-                    <a:xfrm>
-                      <a:off x="0" y="0"/>
-                      <a:ext cx="5334000" cy="2156297"/>
-                    </a:xfrm>
-                    <a:prstGeom prst="rect">
-                      <a:avLst/>
-                    </a:prstGeom>
-                    <a:noFill/>
-                    <a:ln w="9525">
-                      <a:noFill/>
-                      <a:headEnd/>
-                      <a:tailEnd/>
-                    </a:ln>
-                  </pic:spPr>
-                </pic:pic>
-              </a:graphicData>
-            </a:graphic>
-          </wp:inline>
-        </w:drawing>
-      </w:r>
-    </w:p>
-    <w:p>
-      <w:pPr>
-        <w:pStyle w:val="ImageCaption"/>
-      </w:pPr>
-      <w:r>
-        <w:t xml:space="preserve">Figure 5: Tail dependence for different types of copulas and different number of random variables</w:t>
-      </w:r>
-    </w:p>
-    <w:p>
-      <w:pPr>
-        <w:pStyle w:val="BodyText"/>
-      </w:pPr>
-      <w:r>
-        <w:t xml:space="preserve">The Cauchy copula (equivalently a Student‑t copula with zero degrees of freedom) is a statistical technique for capturing dependence structures, especially when modelling tail‑risk or extreme events. Its principal advantage lies in preserving the overall correlation matrix of the underlying variables while simultaneously enabling the generation of scenarios that exhibit much heavier tails (Joint‑movement) and de-correlation. In practice, this means that the copula retains the familiar linear dependence captured by Pearson‑type correlations, yet it can produce joint realizations that reflect the heightened co‑movement observed during rare, high‑impact shocks.</w:t>
-      </w:r>
-    </w:p>
-    <w:p>
-      <w:pPr>
-        <w:pStyle w:val="BodyText"/>
-      </w:pPr>
-      <w:r>
-        <w:t xml:space="preserve">De‑correlation scenarios describe circumstances in which variables that normally exhibit a strong positive (or negative) relationship suddenly lose that linkage when stress or extreme events materializes. In other words, the usual together‑ness of the data breaks down. A classic illustration comes from equity markets: two stocks that historically track each other e.g. because they belong to the same industry, may abruptly move in opposite directions during a stress event. For example, Apple vs. Microsoft - Apple taking over Microsoft business after Microsoft collapses.</w:t>
-      </w:r>
-    </w:p>
-    <w:p>
-      <w:pPr>
-        <w:pStyle w:val="BodyText"/>
-      </w:pPr>
-      <w:r>
-        <w:t xml:space="preserve">On the other hand, joint‑movement scenarios involve a set of variables that, despite exhibiting only modest or even negligible correlation under normal conditions, all swing in the same direction because they are all exposed to a shared extreme driver. Think of a severe natural disaster that simultaneously spikes commodity prices or a sovereign default that forces both sovereign bond yields and the domestic currency to deteriorate together. In these cases the common shock creates a temporary, high‑intensity dependence that standard correlation estimates fail to capture.</w:t>
-      </w:r>
-    </w:p>
-    <w:p>
-      <w:pPr>
-        <w:pStyle w:val="BodyText"/>
-      </w:pPr>
-      <w:r>
-        <w:t xml:space="preserve">Both types of scenarios are crucial for robust risk assessment. De‑correlation highlights the risk of assets that are supposed to hedge each other stop doing so, while joint‑movement emphasizes the danger of hidden tail‑dependence that can generate simultaneous losses across seemingly unrelated positions. Modelling frameworks that can generate both behaviors, provide a more realistic picture of potential extreme outcomes than approaches that rely solely on historic linear correlations.</w:t>
-      </w:r>
-    </w:p>
-    <w:p>
-      <w:pPr>
-        <w:pStyle w:val="BodyText"/>
-      </w:pPr>
-      <w:r>
-        <w:t xml:space="preserve">For a deeper discussion of the Cauchy copula’s properties and its application in risk‑management contexts, see</w:t>
-      </w:r>
-      <w:r>
-        <w:t xml:space="preserve"> </w:t>
-      </w:r>
-      <w:hyperlink w:anchor="literature">
-        <w:r>
-          <w:rPr>
-            <w:rStyle w:val="Hyperlink"/>
-          </w:rPr>
-          <w:t xml:space="preserve">[9]</w:t>
-        </w:r>
-      </w:hyperlink>
-      <w:r>
-        <w:t xml:space="preserve">.</w:t>
-      </w:r>
-    </w:p>
-    <w:p>
-      <w:pPr>
-        <w:pStyle w:val="BodyText"/>
-      </w:pPr>
-      <w:r>
-        <w:t xml:space="preserve">[TODO: add skew and sum copula properties - reference Durante!]</w:t>
-      </w:r>
-    </w:p>
-    <w:bookmarkEnd w:id="28"/>
-    <w:bookmarkEnd w:id="29"/>
-    <w:bookmarkStart w:id="30" w:name="literature-review"/>
+    <w:bookmarkEnd w:id="41"/>
+    <w:bookmarkStart w:id="42" w:name="appendix-b-list-of-used-ai-tools"/>
     <w:p>
       <w:pPr>
         <w:pStyle w:val="Heading2"/>
       </w:pPr>
       <w:r>
-        <w:t xml:space="preserve">Literature review</w:t>
-      </w:r>
-    </w:p>
-    <w:p>
-      <w:pPr>
-        <w:pStyle w:val="FirstParagraph"/>
-      </w:pPr>
-      <w:r>
-        <w:t xml:space="preserve">[TODO: present articles!!!]</w:t>
-      </w:r>
-    </w:p>
-    <w:p>
-      <w:pPr>
-        <w:pStyle w:val="BodyText"/>
-      </w:pPr>
-      <w:r>
-        <w:t xml:space="preserve">This analysis prioritizes the generation of extreme market scenarios designed specifically for Market Risk and capital estimation purposes. Unlike studies where the intricacies of underlying asset path dynamics (such as time-dependent volatility or complex stochastic processes) are critical, this work deliberately abstracts from such details. As such there is no need to include dynamically changing portfolios (i.e. dynamic trading strategies), limiting portfolio dimension optimization to static.</w:t>
-      </w:r>
-    </w:p>
-    <w:p>
-      <w:pPr>
-        <w:pStyle w:val="BodyText"/>
-      </w:pPr>
-      <w:r>
-        <w:t xml:space="preserve">A defining challenge in Market Risk is the need to evaluate the collective behavior of thousands of risk factors simultaneously, a requirement that far exceeds the scope of prior research, where simulations often focused on merely dozens of variables. This study bridges that gap by demonstrating scalability to hundreds or even thousands of risk factors, aligning with the real-world demands of large-scale risk aggregation.</w:t>
-      </w:r>
-    </w:p>
-    <w:p>
-      <w:pPr>
-        <w:pStyle w:val="BodyText"/>
-      </w:pPr>
-      <w:r>
-        <w:t xml:space="preserve">Beyond scalability, another key advantage lies in the interpretability of results. While alternative approaches, such as Tail-GAN-based simulations, often produce outputs that are difficult to dissect or explain, the methodology employed here offers an inherent structure for understanding extreme scenarios. The framework decomposes market dynamics into a weighted combination of copulas, each with a clear and intuitive economic or statistical meaning. This not only enhances transparency but also provides with a more actionable foundation for stress testing and capital planning. The ability to attribute risk contributions to specific copula components is a significant improvement in practical applicability and model governance.</w:t>
-      </w:r>
-    </w:p>
-    <w:bookmarkEnd w:id="30"/>
-    <w:bookmarkEnd w:id="31"/>
-    <w:bookmarkStart w:id="32" w:name="methodology-and-methods"/>
-    <w:p>
-      <w:pPr>
-        <w:pStyle w:val="Heading1"/>
-      </w:pPr>
-      <w:r>
-        <w:t xml:space="preserve">Methodology and methods</w:t>
-      </w:r>
-    </w:p>
-    <w:p>
-      <w:pPr>
-        <w:pStyle w:val="FirstParagraph"/>
-      </w:pPr>
-      <w:r>
-        <w:rPr>
-          <w:i/>
-          <w:iCs/>
-        </w:rPr>
-        <w:t xml:space="preserve">provide a diagram that illustrate your approach/data pipeline</w:t>
-      </w:r>
-      <w:r>
-        <w:t xml:space="preserve"> </w:t>
-      </w:r>
-      <w:r>
-        <w:rPr>
-          <w:i/>
-          <w:iCs/>
-        </w:rPr>
-        <w:t xml:space="preserve">for each objective you can provide methodology, methods and tools that you will use, and organise this part accordingly</w:t>
-      </w:r>
-      <w:r>
-        <w:t xml:space="preserve"> </w:t>
-      </w:r>
-      <w:r>
-        <w:rPr>
-          <w:i/>
-          <w:iCs/>
-        </w:rPr>
-        <w:t xml:space="preserve">difference between an evaluation with respect to how your software performs, versus a critical evaluation where you reflect on your aims and objectives</w:t>
-      </w:r>
-      <w:r>
-        <w:t xml:space="preserve"> </w:t>
-      </w:r>
-      <w:r>
-        <w:rPr>
-          <w:i/>
-          <w:iCs/>
-        </w:rPr>
-        <w:t xml:space="preserve">how do you plan to implement it? E.g. if you are using machine learning, you will require a model (explain the structure of the neural network)</w:t>
-      </w:r>
-    </w:p>
-    <w:bookmarkEnd w:id="32"/>
-    <w:bookmarkStart w:id="33" w:name="project-development-plan"/>
-    <w:p>
-      <w:pPr>
-        <w:pStyle w:val="Heading1"/>
-      </w:pPr>
-      <w:r>
-        <w:t xml:space="preserve">Project development plan</w:t>
-      </w:r>
-    </w:p>
-    <w:p>
-      <w:pPr>
-        <w:pStyle w:val="FirstParagraph"/>
-      </w:pPr>
-      <w:r>
-        <w:rPr>
-          <w:i/>
-          <w:iCs/>
-        </w:rPr>
-        <w:t xml:space="preserve">you have to convince the marker and the supervisor that you are able to manage your time and juggle two separate concerns: software artefacts (software app, ML models) and final report. Develop a realistic workplan for the project.</w:t>
-      </w:r>
-    </w:p>
-    <w:bookmarkEnd w:id="33"/>
-    <w:bookmarkStart w:id="38" w:name="literature"/>
-    <w:p>
-      <w:pPr>
-        <w:pStyle w:val="Heading1"/>
-      </w:pPr>
-      <w:r>
-        <w:t xml:space="preserve">Literature</w:t>
-      </w:r>
-    </w:p>
-    <w:p>
-      <w:pPr>
-        <w:numPr>
-          <w:ilvl w:val="0"/>
-          <w:numId w:val="1002"/>
-        </w:numPr>
-      </w:pPr>
-      <w:r>
-        <w:t xml:space="preserve">Jorion P., 2006. Value as Risk: The New Benchmark for Managing Financial Risk. New York: The McGraw-Hill.</w:t>
-      </w:r>
-    </w:p>
-    <w:p>
-      <w:pPr>
-        <w:numPr>
-          <w:ilvl w:val="0"/>
-          <w:numId w:val="1002"/>
-        </w:numPr>
-      </w:pPr>
-      <w:r>
-        <w:t xml:space="preserve">Cherubini U. et al, 2004. Copula methods in finance. England: Wiley finance.</w:t>
-      </w:r>
-    </w:p>
-    <w:p>
-      <w:pPr>
-        <w:numPr>
-          <w:ilvl w:val="0"/>
-          <w:numId w:val="1002"/>
-        </w:numPr>
-      </w:pPr>
-      <w:r>
-        <w:t xml:space="preserve">Chollet F., 2021. Deep learning with Python. New York: Manning Publications Co. </w:t>
-      </w:r>
-    </w:p>
-    <w:p>
-      <w:pPr>
-        <w:numPr>
-          <w:ilvl w:val="0"/>
-          <w:numId w:val="1002"/>
-        </w:numPr>
-      </w:pPr>
-      <w:r>
-        <w:t xml:space="preserve">Acerbi C., Szekely B., 2014. Back-testing expected shortfall. Risk, 27(11):76–81.</w:t>
-      </w:r>
-    </w:p>
-    <w:p>
-      <w:pPr>
-        <w:numPr>
-          <w:ilvl w:val="0"/>
-          <w:numId w:val="1002"/>
-        </w:numPr>
-      </w:pPr>
-      <w:r>
-        <w:t xml:space="preserve">Cont R. et al, 2022. Tail-GAN: Nonparametric scenario generation for tail risk estimation.</w:t>
-      </w:r>
-      <w:r>
-        <w:t xml:space="preserve"> </w:t>
-      </w:r>
-      <w:hyperlink r:id="rId34">
-        <w:r>
-          <w:rPr>
-            <w:rStyle w:val="Hyperlink"/>
-          </w:rPr>
-          <w:t xml:space="preserve">(link)</w:t>
-        </w:r>
-      </w:hyperlink>
-    </w:p>
-    <w:p>
-      <w:pPr>
-        <w:numPr>
-          <w:ilvl w:val="0"/>
-          <w:numId w:val="1002"/>
-        </w:numPr>
-      </w:pPr>
-      <w:r>
-        <w:t xml:space="preserve">Oh D., Patton A., 2015. Modelling dependance in High dimensions with factor copulas.</w:t>
-      </w:r>
-      <w:r>
-        <w:t xml:space="preserve"> </w:t>
-      </w:r>
-      <w:hyperlink r:id="rId35">
-        <w:r>
-          <w:rPr>
-            <w:rStyle w:val="Hyperlink"/>
-          </w:rPr>
-          <w:t xml:space="preserve">(link)</w:t>
-        </w:r>
-      </w:hyperlink>
-    </w:p>
-    <w:p>
-      <w:pPr>
-        <w:numPr>
-          <w:ilvl w:val="0"/>
-          <w:numId w:val="1002"/>
-        </w:numPr>
-      </w:pPr>
-      <w:r>
-        <w:t xml:space="preserve">Buhler H., Horvath B., 2021. A data-driven market simulator for small data environments.</w:t>
-      </w:r>
-      <w:r>
-        <w:t xml:space="preserve"> </w:t>
-      </w:r>
-      <w:hyperlink r:id="rId36">
-        <w:r>
-          <w:rPr>
-            <w:rStyle w:val="Hyperlink"/>
-          </w:rPr>
-          <w:t xml:space="preserve">(link)</w:t>
-        </w:r>
-      </w:hyperlink>
-    </w:p>
-    <w:p>
-      <w:pPr>
-        <w:numPr>
-          <w:ilvl w:val="0"/>
-          <w:numId w:val="1002"/>
-        </w:numPr>
-      </w:pPr>
-      <w:r>
-        <w:t xml:space="preserve">Horvath B. et al, 2025. Generative Models in Finance: Market Generators, a Paradigm Shift in Financial Modeling.</w:t>
-      </w:r>
-      <w:hyperlink r:id="rId37">
-        <w:r>
-          <w:rPr>
-            <w:rStyle w:val="Hyperlink"/>
-          </w:rPr>
-          <w:t xml:space="preserve">(link)</w:t>
-        </w:r>
-      </w:hyperlink>
-    </w:p>
-    <w:p>
-      <w:pPr>
-        <w:numPr>
-          <w:ilvl w:val="0"/>
-          <w:numId w:val="1002"/>
-        </w:numPr>
-      </w:pPr>
-      <w:r>
-        <w:t xml:space="preserve">Chorniy V. and Arkhypov S., 2025. Extreme VaR, ES and reverse stress testing a catastrophe:</w:t>
-      </w:r>
-      <w:r>
-        <w:t xml:space="preserve"> </w:t>
-      </w:r>
-      <w:r>
-        <w:t xml:space="preserve">projecting gains and losses above 99% for market and counterparty credit risk. Risk Minds International, London.</w:t>
-      </w:r>
-    </w:p>
-    <w:bookmarkEnd w:id="38"/>
-    <w:bookmarkStart w:id="40" w:name="appendixes"/>
-    <w:p>
-      <w:pPr>
-        <w:pStyle w:val="Heading1"/>
-      </w:pPr>
-      <w:r>
-        <w:t xml:space="preserve">Appendixes</w:t>
-      </w:r>
-    </w:p>
-    <w:p>
-      <w:pPr>
-        <w:pStyle w:val="FirstParagraph"/>
-      </w:pPr>
-      <w:r>
-        <w:t xml:space="preserve">See corresponding equation</w:t>
-      </w:r>
-      <w:r>
-        <w:t xml:space="preserve"> </w:t>
-      </w:r>
-      <w:hyperlink w:anchor="eq1">
-        <w:r>
-          <w:rPr>
-            <w:rStyle w:val="Hyperlink"/>
-          </w:rPr>
-          <w:t xml:space="preserve">(Eq.1)</w:t>
-        </w:r>
-      </w:hyperlink>
-    </w:p>
-    <w:bookmarkStart w:id="39" w:name="appendix-a-list-of-used-ai-tools"/>
-    <w:p>
-      <w:pPr>
-        <w:pStyle w:val="Heading2"/>
-      </w:pPr>
-      <w:r>
-        <w:t xml:space="preserve">Appendix A: List of used AI tools</w:t>
+        <w:t xml:space="preserve">Appendix B: List of used AI tools</w:t>
       </w:r>
     </w:p>
     <w:p>
@@ -2605,7 +2986,7 @@
         <w:pStyle w:val="Compact"/>
         <w:numPr>
           <w:ilvl w:val="0"/>
-          <w:numId w:val="1003"/>
+          <w:numId w:val="1005"/>
         </w:numPr>
       </w:pPr>
       <w:r>
@@ -2617,7 +2998,7 @@
         <w:pStyle w:val="Compact"/>
         <w:numPr>
           <w:ilvl w:val="0"/>
-          <w:numId w:val="1003"/>
+          <w:numId w:val="1005"/>
         </w:numPr>
       </w:pPr>
       <w:r>
@@ -2634,8 +3015,8 @@
         <w:t xml:space="preserve">“You’re an academic assistant with an expertise in software engineering to proofread and rewrite as a single connected text. Keep academic tone.”</w:t>
       </w:r>
     </w:p>
-    <w:bookmarkEnd w:id="39"/>
-    <w:bookmarkEnd w:id="40"/>
+    <w:bookmarkEnd w:id="42"/>
+    <w:bookmarkEnd w:id="43"/>
     <w:sectPr>
       <w:footnotePr>
         <w:numRestart w:val="eachSect"/>
@@ -2746,6 +3127,109 @@
       </w:pPr>
     </w:lvl>
   </w:abstractNum>
+  <w:abstractNum w:abstractNumId="991">
+    <w:nsid w:val="0000A991"/>
+    <w:multiLevelType w:val="multilevel"/>
+    <w:lvl w:ilvl="0">
+      <w:numFmt w:val="bullet"/>
+      <w:lvlText w:val=""/>
+      <w:lvlJc w:val="left"/>
+      <w:pPr>
+        <w:ind w:left="720" w:hanging="360"/>
+      </w:pPr>
+      <w:rPr>
+        <w:rFonts w:ascii="Symbol" w:hAnsi="Symbol" w:cs="Symbol" w:hint="default"/>
+      </w:rPr>
+    </w:lvl>
+    <w:lvl w:ilvl="1">
+      <w:numFmt w:val="bullet"/>
+      <w:lvlText w:val="o"/>
+      <w:lvlJc w:val="left"/>
+      <w:pPr>
+        <w:ind w:left="1440" w:hanging="360"/>
+      </w:pPr>
+      <w:rPr>
+        <w:rFonts w:ascii="Courier New" w:hAnsi="Courier New" w:cs="Courier New" w:hint="default"/>
+      </w:rPr>
+    </w:lvl>
+    <w:lvl w:ilvl="2">
+      <w:numFmt w:val="bullet"/>
+      <w:lvlText w:val=""/>
+      <w:lvlJc w:val="left"/>
+      <w:pPr>
+        <w:ind w:left="2160" w:hanging="360"/>
+      </w:pPr>
+      <w:rPr>
+        <w:rFonts w:ascii="Wingdings" w:hAnsi="Wingdings" w:cs="Wingdings" w:hint="default"/>
+      </w:rPr>
+    </w:lvl>
+    <w:lvl w:ilvl="3">
+      <w:numFmt w:val="bullet"/>
+      <w:lvlText w:val=""/>
+      <w:lvlJc w:val="left"/>
+      <w:pPr>
+        <w:ind w:left="2880" w:hanging="360"/>
+      </w:pPr>
+      <w:rPr>
+        <w:rFonts w:ascii="Symbol" w:hAnsi="Symbol" w:cs="Symbol" w:hint="default"/>
+      </w:rPr>
+    </w:lvl>
+    <w:lvl w:ilvl="4">
+      <w:numFmt w:val="bullet"/>
+      <w:lvlText w:val="o"/>
+      <w:lvlJc w:val="left"/>
+      <w:pPr>
+        <w:ind w:left="3600" w:hanging="360"/>
+      </w:pPr>
+      <w:rPr>
+        <w:rFonts w:ascii="Courier New" w:hAnsi="Courier New" w:cs="Courier New" w:hint="default"/>
+      </w:rPr>
+    </w:lvl>
+    <w:lvl w:ilvl="5">
+      <w:numFmt w:val="bullet"/>
+      <w:lvlText w:val=""/>
+      <w:lvlJc w:val="left"/>
+      <w:pPr>
+        <w:ind w:left="4320" w:hanging="360"/>
+      </w:pPr>
+      <w:rPr>
+        <w:rFonts w:ascii="Wingdings" w:hAnsi="Wingdings" w:cs="Wingdings" w:hint="default"/>
+      </w:rPr>
+    </w:lvl>
+    <w:lvl w:ilvl="6">
+      <w:numFmt w:val="bullet"/>
+      <w:lvlText w:val=""/>
+      <w:lvlJc w:val="left"/>
+      <w:pPr>
+        <w:ind w:left="5040" w:hanging="360"/>
+      </w:pPr>
+      <w:rPr>
+        <w:rFonts w:ascii="Symbol" w:hAnsi="Symbol" w:cs="Symbol" w:hint="default"/>
+      </w:rPr>
+    </w:lvl>
+    <w:lvl w:ilvl="7">
+      <w:numFmt w:val="bullet"/>
+      <w:lvlText w:val="o"/>
+      <w:lvlJc w:val="left"/>
+      <w:pPr>
+        <w:ind w:left="5760" w:hanging="360"/>
+      </w:pPr>
+      <w:rPr>
+        <w:rFonts w:ascii="Courier New" w:hAnsi="Courier New" w:cs="Courier New" w:hint="default"/>
+      </w:rPr>
+    </w:lvl>
+    <w:lvl w:ilvl="8">
+      <w:numFmt w:val="bullet"/>
+      <w:lvlText w:val=""/>
+      <w:lvlJc w:val="left"/>
+      <w:pPr>
+        <w:ind w:left="6480" w:hanging="360"/>
+      </w:pPr>
+      <w:rPr>
+        <w:rFonts w:ascii="Wingdings" w:hAnsi="Wingdings" w:cs="Wingdings" w:hint="default"/>
+      </w:rPr>
+    </w:lvl>
+  </w:abstractNum>
   <w:abstractNum w:abstractNumId="99411">
     <w:nsid w:val="00A99411"/>
     <w:multiLevelType w:val="multilevel"/>
@@ -2831,113 +3315,19 @@
       </w:pPr>
     </w:lvl>
   </w:abstractNum>
-  <w:abstractNum w:abstractNumId="991">
-    <w:nsid w:val="0000A991"/>
-    <w:multiLevelType w:val="multilevel"/>
-    <w:lvl w:ilvl="0">
-      <w:numFmt w:val="bullet"/>
-      <w:lvlText w:val=""/>
-      <w:lvlJc w:val="left"/>
-      <w:pPr>
-        <w:ind w:left="720" w:hanging="360"/>
-      </w:pPr>
-      <w:rPr>
-        <w:rFonts w:ascii="Symbol" w:hAnsi="Symbol" w:cs="Symbol" w:hint="default"/>
-      </w:rPr>
-    </w:lvl>
-    <w:lvl w:ilvl="1">
-      <w:numFmt w:val="bullet"/>
-      <w:lvlText w:val="o"/>
-      <w:lvlJc w:val="left"/>
-      <w:pPr>
-        <w:ind w:left="1440" w:hanging="360"/>
-      </w:pPr>
-      <w:rPr>
-        <w:rFonts w:ascii="Courier New" w:hAnsi="Courier New" w:cs="Courier New" w:hint="default"/>
-      </w:rPr>
-    </w:lvl>
-    <w:lvl w:ilvl="2">
-      <w:numFmt w:val="bullet"/>
-      <w:lvlText w:val=""/>
-      <w:lvlJc w:val="left"/>
-      <w:pPr>
-        <w:ind w:left="2160" w:hanging="360"/>
-      </w:pPr>
-      <w:rPr>
-        <w:rFonts w:ascii="Wingdings" w:hAnsi="Wingdings" w:cs="Wingdings" w:hint="default"/>
-      </w:rPr>
-    </w:lvl>
-    <w:lvl w:ilvl="3">
-      <w:numFmt w:val="bullet"/>
-      <w:lvlText w:val=""/>
-      <w:lvlJc w:val="left"/>
-      <w:pPr>
-        <w:ind w:left="2880" w:hanging="360"/>
-      </w:pPr>
-      <w:rPr>
-        <w:rFonts w:ascii="Symbol" w:hAnsi="Symbol" w:cs="Symbol" w:hint="default"/>
-      </w:rPr>
-    </w:lvl>
-    <w:lvl w:ilvl="4">
-      <w:numFmt w:val="bullet"/>
-      <w:lvlText w:val="o"/>
-      <w:lvlJc w:val="left"/>
-      <w:pPr>
-        <w:ind w:left="3600" w:hanging="360"/>
-      </w:pPr>
-      <w:rPr>
-        <w:rFonts w:ascii="Courier New" w:hAnsi="Courier New" w:cs="Courier New" w:hint="default"/>
-      </w:rPr>
-    </w:lvl>
-    <w:lvl w:ilvl="5">
-      <w:numFmt w:val="bullet"/>
-      <w:lvlText w:val=""/>
-      <w:lvlJc w:val="left"/>
-      <w:pPr>
-        <w:ind w:left="4320" w:hanging="360"/>
-      </w:pPr>
-      <w:rPr>
-        <w:rFonts w:ascii="Wingdings" w:hAnsi="Wingdings" w:cs="Wingdings" w:hint="default"/>
-      </w:rPr>
-    </w:lvl>
-    <w:lvl w:ilvl="6">
-      <w:numFmt w:val="bullet"/>
-      <w:lvlText w:val=""/>
-      <w:lvlJc w:val="left"/>
-      <w:pPr>
-        <w:ind w:left="5040" w:hanging="360"/>
-      </w:pPr>
-      <w:rPr>
-        <w:rFonts w:ascii="Symbol" w:hAnsi="Symbol" w:cs="Symbol" w:hint="default"/>
-      </w:rPr>
-    </w:lvl>
-    <w:lvl w:ilvl="7">
-      <w:numFmt w:val="bullet"/>
-      <w:lvlText w:val="o"/>
-      <w:lvlJc w:val="left"/>
-      <w:pPr>
-        <w:ind w:left="5760" w:hanging="360"/>
-      </w:pPr>
-      <w:rPr>
-        <w:rFonts w:ascii="Courier New" w:hAnsi="Courier New" w:cs="Courier New" w:hint="default"/>
-      </w:rPr>
-    </w:lvl>
-    <w:lvl w:ilvl="8">
-      <w:numFmt w:val="bullet"/>
-      <w:lvlText w:val=""/>
-      <w:lvlJc w:val="left"/>
-      <w:pPr>
-        <w:ind w:left="6480" w:hanging="360"/>
-      </w:pPr>
-      <w:rPr>
-        <w:rFonts w:ascii="Wingdings" w:hAnsi="Wingdings" w:cs="Wingdings" w:hint="default"/>
-      </w:rPr>
-    </w:lvl>
-  </w:abstractNum>
   <w:num w:numId="1000">
     <w:abstractNumId w:val="990"/>
   </w:num>
   <w:num w:numId="1001">
+    <w:abstractNumId w:val="991"/>
+  </w:num>
+  <w:num w:numId="1002">
+    <w:abstractNumId w:val="991"/>
+  </w:num>
+  <w:num w:numId="1003">
+    <w:abstractNumId w:val="991"/>
+  </w:num>
+  <w:num w:numId="1004">
     <w:abstractNumId w:val="99411"/>
     <w:lvlOverride w:ilvl="0">
       <w:startOverride w:val="1"/>
@@ -2967,37 +3357,7 @@
       <w:startOverride w:val="1"/>
     </w:lvlOverride>
   </w:num>
-  <w:num w:numId="1002">
-    <w:abstractNumId w:val="99411"/>
-    <w:lvlOverride w:ilvl="0">
-      <w:startOverride w:val="1"/>
-    </w:lvlOverride>
-    <w:lvlOverride w:ilvl="1">
-      <w:startOverride w:val="1"/>
-    </w:lvlOverride>
-    <w:lvlOverride w:ilvl="2">
-      <w:startOverride w:val="1"/>
-    </w:lvlOverride>
-    <w:lvlOverride w:ilvl="3">
-      <w:startOverride w:val="1"/>
-    </w:lvlOverride>
-    <w:lvlOverride w:ilvl="4">
-      <w:startOverride w:val="1"/>
-    </w:lvlOverride>
-    <w:lvlOverride w:ilvl="5">
-      <w:startOverride w:val="1"/>
-    </w:lvlOverride>
-    <w:lvlOverride w:ilvl="6">
-      <w:startOverride w:val="1"/>
-    </w:lvlOverride>
-    <w:lvlOverride w:ilvl="7">
-      <w:startOverride w:val="1"/>
-    </w:lvlOverride>
-    <w:lvlOverride w:ilvl="8">
-      <w:startOverride w:val="1"/>
-    </w:lvlOverride>
-  </w:num>
-  <w:num w:numId="1003">
+  <w:num w:numId="1005">
     <w:abstractNumId w:val="991"/>
   </w:num>
 </w:numbering>

</xml_diff>

<commit_message>
adding proposal text p5
</commit_message>
<xml_diff>
--- a/document/proposal.docx
+++ b/document/proposal.docx
@@ -76,7 +76,7 @@
         </w:p>
       </w:sdtContent>
     </w:sdt>
-    <w:bookmarkStart w:id="9" w:name="introduction"/>
+    <w:bookmarkStart w:id="21" w:name="introduction"/>
     <w:p>
       <w:pPr>
         <w:pStyle w:val="Heading1"/>
@@ -101,8 +101,8 @@
         <w:t xml:space="preserve">This academic proposal proceeds by outlining its primary goals and objectives. Subsequently, it explains the problem under investigation, along with pertinent work that provides essential concepts and a literature review. The subsequent sections detail the methodology and techniques employed to achieve the previously outlined objectives. The proposal concludes in a development plan for the project.</w:t>
       </w:r>
     </w:p>
-    <w:bookmarkEnd w:id="9"/>
-    <w:bookmarkStart w:id="10" w:name="aims-and-objectives"/>
+    <w:bookmarkEnd w:id="21"/>
+    <w:bookmarkStart w:id="22" w:name="aims-and-objectives"/>
     <w:p>
       <w:pPr>
         <w:pStyle w:val="Heading1"/>
@@ -135,8 +135,8 @@
         <w:t xml:space="preserve">Upon completion of the initial software development, conduct an experimental analysis to evaluate the impact of copula assumptions on the selected VaR / ES measures across distinct portfolios. Following this, establish a calibration procedure aimed at fitting appropriate copulas to real-world market data. Lastly, devise a testing exercise to verify whether the calibrated copulas align with the prescribed conditions.</w:t>
       </w:r>
     </w:p>
-    <w:bookmarkEnd w:id="10"/>
-    <w:bookmarkStart w:id="20" w:name="X32b9430d5d15411fac62685483839fe9d87a9a8"/>
+    <w:bookmarkEnd w:id="22"/>
+    <w:bookmarkStart w:id="32" w:name="X32b9430d5d15411fac62685483839fe9d87a9a8"/>
     <w:p>
       <w:pPr>
         <w:pStyle w:val="Heading1"/>
@@ -145,7 +145,7 @@
         <w:t xml:space="preserve">Description of the problem and relevant work</w:t>
       </w:r>
     </w:p>
-    <w:bookmarkStart w:id="18" w:name="key-concepts"/>
+    <w:bookmarkStart w:id="30" w:name="key-concepts"/>
     <w:p>
       <w:pPr>
         <w:pStyle w:val="Heading2"/>
@@ -154,7 +154,7 @@
         <w:t xml:space="preserve">Key concepts</w:t>
       </w:r>
     </w:p>
-    <w:bookmarkStart w:id="11" w:name="X2df427def89a3ef237a42aa6bbd525f6362f6e2"/>
+    <w:bookmarkStart w:id="23" w:name="X2df427def89a3ef237a42aa6bbd525f6362f6e2"/>
     <w:p>
       <w:pPr>
         <w:pStyle w:val="Heading3"/>
@@ -583,8 +583,8 @@
         <w:t xml:space="preserve">From a computational perspective, MC VaR methods exhibit low numerical error, as the simulated datasets can be made arbitrarily large to smooth out estimation noise. However, this precision comes at the expense of higher model error, particularly when parametric assumptions are misspecified or when EVT extrapolations deviate from true tail behavior. While these methods provide greater control and extensibility in extreme risk modelling, their reliability hinges on the accuracy of the underlying assumptions, whether in the choice of distributions copula functions, or tail decay parameters.</w:t>
       </w:r>
     </w:p>
-    <w:bookmarkEnd w:id="11"/>
-    <w:bookmarkStart w:id="13" w:name="copulas."/>
+    <w:bookmarkEnd w:id="23"/>
+    <w:bookmarkStart w:id="25" w:name="copulas."/>
     <w:p>
       <w:pPr>
         <w:pStyle w:val="Heading3"/>
@@ -1151,7 +1151,7 @@
       <w:pPr>
         <w:pStyle w:val="BodyText"/>
       </w:pPr>
-      <w:bookmarkStart w:id="12" w:name="eq1"/>
+      <w:bookmarkStart w:id="24" w:name="eq1"/>
       <m:oMathPara>
         <m:oMathParaPr>
           <m:jc m:val="center"/>
@@ -1384,7 +1384,7 @@
           </m:r>
         </m:oMath>
       </m:oMathPara>
-      <w:bookmarkEnd w:id="12"/>
+      <w:bookmarkEnd w:id="24"/>
     </w:p>
     <w:p>
       <w:pPr>
@@ -1663,8 +1663,8 @@
         <w:t xml:space="preserve">.</w:t>
       </w:r>
     </w:p>
-    <w:bookmarkEnd w:id="13"/>
-    <w:bookmarkStart w:id="17" w:name="copulas-in-value-at-risk"/>
+    <w:bookmarkEnd w:id="25"/>
+    <w:bookmarkStart w:id="29" w:name="copulas-in-value-at-risk"/>
     <w:p>
       <w:pPr>
         <w:pStyle w:val="Heading3"/>
@@ -2196,20 +2196,20 @@
       <w:r>
         <w:drawing>
           <wp:inline>
-            <wp:extent cx="5334000" cy="2156297"/>
+            <wp:extent cx="5727700" cy="2315453"/>
             <wp:effectExtent b="0" l="0" r="0" t="0"/>
-            <wp:docPr descr="Figure 5: Tail dependence for different types of copulas and different number of random variables" title="" id="15" name="Picture"/>
+            <wp:docPr descr="Figure 5: Tail dependence for different types of copulas and different number of random variables" title="" id="27" name="Picture"/>
             <a:graphic>
               <a:graphicData uri="http://schemas.openxmlformats.org/drawingml/2006/picture">
                 <pic:pic>
                   <pic:nvPicPr>
-                    <pic:cNvPr descr="figures\Tail_dependance.png" id="16" name="Picture"/>
+                    <pic:cNvPr descr="figures\Tail_dependance.png" id="28" name="Picture"/>
                     <pic:cNvPicPr>
                       <a:picLocks noChangeArrowheads="1" noChangeAspect="1"/>
                     </pic:cNvPicPr>
                   </pic:nvPicPr>
                   <pic:blipFill>
-                    <a:blip r:embed="rId14"/>
+                    <a:blip r:embed="rId26"/>
                     <a:stretch>
                       <a:fillRect/>
                     </a:stretch>
@@ -2217,7 +2217,7 @@
                   <pic:spPr bwMode="auto">
                     <a:xfrm>
                       <a:off x="0" y="0"/>
-                      <a:ext cx="5334000" cy="2156297"/>
+                      <a:ext cx="5727700" cy="2315453"/>
                     </a:xfrm>
                     <a:prstGeom prst="rect">
                       <a:avLst/>
@@ -2276,9 +2276,9 @@
         <w:t xml:space="preserve">Both types of scenarios are crucial for robust risk assessment. De‑correlation highlights the risk of assets that are supposed to hedge each other stop doing so, while joint‑movement emphasizes the danger of hidden tail‑dependence that can generate simultaneous losses across seemingly unrelated positions. Modelling frameworks that can generate both behaviors, provide a more realistic picture of potential extreme outcomes than approaches that rely solely on historic linear correlations.</w:t>
       </w:r>
     </w:p>
-    <w:bookmarkEnd w:id="17"/>
-    <w:bookmarkEnd w:id="18"/>
-    <w:bookmarkStart w:id="19" w:name="literature-review"/>
+    <w:bookmarkEnd w:id="29"/>
+    <w:bookmarkEnd w:id="30"/>
+    <w:bookmarkStart w:id="31" w:name="literature-review"/>
     <w:p>
       <w:pPr>
         <w:pStyle w:val="Heading2"/>
@@ -2295,9 +2295,9 @@
         <w:t xml:space="preserve">[TODO: present articles!!!]</w:t>
       </w:r>
     </w:p>
-    <w:bookmarkEnd w:id="19"/>
-    <w:bookmarkEnd w:id="20"/>
-    <w:bookmarkStart w:id="21" w:name="methodology-and-methods"/>
+    <w:bookmarkEnd w:id="31"/>
+    <w:bookmarkEnd w:id="32"/>
+    <w:bookmarkStart w:id="33" w:name="methodology-and-methods"/>
     <w:p>
       <w:pPr>
         <w:pStyle w:val="Heading1"/>
@@ -2386,8 +2386,8 @@
         <w:t xml:space="preserve">My aim with this software is a proof of concept rather than an end-user application.</w:t>
       </w:r>
     </w:p>
-    <w:bookmarkEnd w:id="21"/>
-    <w:bookmarkStart w:id="22" w:name="project-development-plan"/>
+    <w:bookmarkEnd w:id="33"/>
+    <w:bookmarkStart w:id="34" w:name="project-development-plan"/>
     <w:p>
       <w:pPr>
         <w:pStyle w:val="Heading1"/>
@@ -2539,8 +2539,8 @@
         <w:t xml:space="preserve">Assess obtained results, summarize observations and developed software within the report.</w:t>
       </w:r>
     </w:p>
-    <w:bookmarkEnd w:id="22"/>
-    <w:bookmarkStart w:id="28" w:name="references"/>
+    <w:bookmarkEnd w:id="34"/>
+    <w:bookmarkStart w:id="40" w:name="references"/>
     <w:p>
       <w:pPr>
         <w:pStyle w:val="Heading1"/>
@@ -2606,7 +2606,7 @@
       <w:r>
         <w:t xml:space="preserve"> </w:t>
       </w:r>
-      <w:hyperlink r:id="rId23">
+      <w:hyperlink r:id="rId35">
         <w:r>
           <w:rPr>
             <w:rStyle w:val="Hyperlink"/>
@@ -2628,7 +2628,7 @@
       <w:r>
         <w:t xml:space="preserve"> </w:t>
       </w:r>
-      <w:hyperlink r:id="rId24">
+      <w:hyperlink r:id="rId36">
         <w:r>
           <w:rPr>
             <w:rStyle w:val="Hyperlink"/>
@@ -2650,7 +2650,7 @@
       <w:r>
         <w:t xml:space="preserve"> </w:t>
       </w:r>
-      <w:hyperlink r:id="rId25">
+      <w:hyperlink r:id="rId37">
         <w:r>
           <w:rPr>
             <w:rStyle w:val="Hyperlink"/>
@@ -2669,7 +2669,7 @@
       <w:r>
         <w:t xml:space="preserve">Horvath B. et al, 2025. Generative Models in Finance: Market Generators, a Paradigm Shift in Financial Modeling.</w:t>
       </w:r>
-      <w:hyperlink r:id="rId26">
+      <w:hyperlink r:id="rId38">
         <w:r>
           <w:rPr>
             <w:rStyle w:val="Hyperlink"/>
@@ -2688,7 +2688,7 @@
       <w:r>
         <w:t xml:space="preserve">Hofert M. and Pang Z., 2025. W-transforms: Uniformity-preserving transformations and induced dependence structures.</w:t>
       </w:r>
-      <w:hyperlink r:id="rId27">
+      <w:hyperlink r:id="rId39">
         <w:r>
           <w:rPr>
             <w:rStyle w:val="Hyperlink"/>
@@ -2697,8 +2697,8 @@
         </w:r>
       </w:hyperlink>
     </w:p>
-    <w:bookmarkEnd w:id="28"/>
-    <w:bookmarkStart w:id="43" w:name="appendixes"/>
+    <w:bookmarkEnd w:id="40"/>
+    <w:bookmarkStart w:id="55" w:name="appendixes"/>
     <w:p>
       <w:pPr>
         <w:pStyle w:val="Heading1"/>
@@ -2726,7 +2726,7 @@
         </w:r>
       </w:hyperlink>
     </w:p>
-    <w:bookmarkStart w:id="41" w:name="appendix-a-copula-examples"/>
+    <w:bookmarkStart w:id="53" w:name="appendix-a-copula-examples"/>
     <w:p>
       <w:pPr>
         <w:pStyle w:val="Heading2"/>
@@ -2750,20 +2750,20 @@
       <w:r>
         <w:drawing>
           <wp:inline>
-            <wp:extent cx="5334000" cy="4000499"/>
+            <wp:extent cx="5727700" cy="4295774"/>
             <wp:effectExtent b="0" l="0" r="0" t="0"/>
-            <wp:docPr descr="Figure 1: Uniform scenarios Gaussian_copula, numerical simulation" title="" id="30" name="Picture"/>
+            <wp:docPr descr="Figure 1: Uniform scenarios Gaussian_copula, numerical simulation" title="" id="42" name="Picture"/>
             <a:graphic>
               <a:graphicData uri="http://schemas.openxmlformats.org/drawingml/2006/picture">
                 <pic:pic>
                   <pic:nvPicPr>
-                    <pic:cNvPr descr="figures\Uniform_scenarios_Gaussian_copula_(numerical_simulation).png" id="31" name="Picture"/>
+                    <pic:cNvPr descr="figures\Uniform_scenarios_Gaussian_copula_(numerical_simulation).png" id="43" name="Picture"/>
                     <pic:cNvPicPr>
                       <a:picLocks noChangeArrowheads="1" noChangeAspect="1"/>
                     </pic:cNvPicPr>
                   </pic:nvPicPr>
                   <pic:blipFill>
-                    <a:blip r:embed="rId29"/>
+                    <a:blip r:embed="rId41"/>
                     <a:stretch>
                       <a:fillRect/>
                     </a:stretch>
@@ -2771,7 +2771,7 @@
                   <pic:spPr bwMode="auto">
                     <a:xfrm>
                       <a:off x="0" y="0"/>
-                      <a:ext cx="5334000" cy="4000499"/>
+                      <a:ext cx="5727700" cy="4295774"/>
                     </a:xfrm>
                     <a:prstGeom prst="rect">
                       <a:avLst/>
@@ -2805,20 +2805,20 @@
       <w:r>
         <w:drawing>
           <wp:inline>
-            <wp:extent cx="5334000" cy="4000499"/>
+            <wp:extent cx="5727700" cy="4295774"/>
             <wp:effectExtent b="0" l="0" r="0" t="0"/>
-            <wp:docPr descr="Figure 2: Contour plot Gaussian copula, numerical simulation" title="" id="33" name="Picture"/>
+            <wp:docPr descr="Figure 2: Contour plot Gaussian copula, numerical simulation" title="" id="45" name="Picture"/>
             <a:graphic>
               <a:graphicData uri="http://schemas.openxmlformats.org/drawingml/2006/picture">
                 <pic:pic>
                   <pic:nvPicPr>
-                    <pic:cNvPr descr="figures\Contour_plot_Gaussian_copula_(numerical_simulation).png" id="34" name="Picture"/>
+                    <pic:cNvPr descr="figures\Contour_plot_Gaussian_copula_(numerical_simulation).png" id="46" name="Picture"/>
                     <pic:cNvPicPr>
                       <a:picLocks noChangeArrowheads="1" noChangeAspect="1"/>
                     </pic:cNvPicPr>
                   </pic:nvPicPr>
                   <pic:blipFill>
-                    <a:blip r:embed="rId32"/>
+                    <a:blip r:embed="rId44"/>
                     <a:stretch>
                       <a:fillRect/>
                     </a:stretch>
@@ -2826,7 +2826,7 @@
                   <pic:spPr bwMode="auto">
                     <a:xfrm>
                       <a:off x="0" y="0"/>
-                      <a:ext cx="5334000" cy="4000499"/>
+                      <a:ext cx="5727700" cy="4295774"/>
                     </a:xfrm>
                     <a:prstGeom prst="rect">
                       <a:avLst/>
@@ -2868,20 +2868,20 @@
       <w:r>
         <w:drawing>
           <wp:inline>
-            <wp:extent cx="5334000" cy="4000499"/>
+            <wp:extent cx="5727700" cy="4295774"/>
             <wp:effectExtent b="0" l="0" r="0" t="0"/>
-            <wp:docPr descr="Figure 3: Uniform scenarios Cauchy copula, numerical simulation" title="" id="36" name="Picture"/>
+            <wp:docPr descr="Figure 3: Uniform scenarios Cauchy copula, numerical simulation" title="" id="48" name="Picture"/>
             <a:graphic>
               <a:graphicData uri="http://schemas.openxmlformats.org/drawingml/2006/picture">
                 <pic:pic>
                   <pic:nvPicPr>
-                    <pic:cNvPr descr="figures\Uniform_scenarios_Cauchy_copula_(numerical_simulation).png" id="37" name="Picture"/>
+                    <pic:cNvPr descr="figures\Uniform_scenarios_Cauchy_copula_(numerical_simulation).png" id="49" name="Picture"/>
                     <pic:cNvPicPr>
                       <a:picLocks noChangeArrowheads="1" noChangeAspect="1"/>
                     </pic:cNvPicPr>
                   </pic:nvPicPr>
                   <pic:blipFill>
-                    <a:blip r:embed="rId35"/>
+                    <a:blip r:embed="rId47"/>
                     <a:stretch>
                       <a:fillRect/>
                     </a:stretch>
@@ -2889,7 +2889,7 @@
                   <pic:spPr bwMode="auto">
                     <a:xfrm>
                       <a:off x="0" y="0"/>
-                      <a:ext cx="5334000" cy="4000499"/>
+                      <a:ext cx="5727700" cy="4295774"/>
                     </a:xfrm>
                     <a:prstGeom prst="rect">
                       <a:avLst/>
@@ -2923,20 +2923,20 @@
       <w:r>
         <w:drawing>
           <wp:inline>
-            <wp:extent cx="5334000" cy="4000499"/>
+            <wp:extent cx="5727700" cy="4295774"/>
             <wp:effectExtent b="0" l="0" r="0" t="0"/>
-            <wp:docPr descr="Figure 4: Contour plot Cauchy copula, numerical simulation" title="" id="39" name="Picture"/>
+            <wp:docPr descr="Figure 4: Contour plot Cauchy copula, numerical simulation" title="" id="51" name="Picture"/>
             <a:graphic>
               <a:graphicData uri="http://schemas.openxmlformats.org/drawingml/2006/picture">
                 <pic:pic>
                   <pic:nvPicPr>
-                    <pic:cNvPr descr="figures\Contour_plot_Cauchy_copula_(numerical_simulation).png" id="40" name="Picture"/>
+                    <pic:cNvPr descr="figures\Contour_plot_Cauchy_copula_(numerical_simulation).png" id="52" name="Picture"/>
                     <pic:cNvPicPr>
                       <a:picLocks noChangeArrowheads="1" noChangeAspect="1"/>
                     </pic:cNvPicPr>
                   </pic:nvPicPr>
                   <pic:blipFill>
-                    <a:blip r:embed="rId38"/>
+                    <a:blip r:embed="rId50"/>
                     <a:stretch>
                       <a:fillRect/>
                     </a:stretch>
@@ -2944,7 +2944,7 @@
                   <pic:spPr bwMode="auto">
                     <a:xfrm>
                       <a:off x="0" y="0"/>
-                      <a:ext cx="5334000" cy="4000499"/>
+                      <a:ext cx="5727700" cy="4295774"/>
                     </a:xfrm>
                     <a:prstGeom prst="rect">
                       <a:avLst/>
@@ -2971,8 +2971,8 @@
         <w:t xml:space="preserve">Figure 4: Contour plot Cauchy copula, numerical simulation</w:t>
       </w:r>
     </w:p>
-    <w:bookmarkEnd w:id="41"/>
-    <w:bookmarkStart w:id="42" w:name="appendix-b-list-of-used-ai-tools"/>
+    <w:bookmarkEnd w:id="53"/>
+    <w:bookmarkStart w:id="54" w:name="appendix-b-list-of-used-ai-tools"/>
     <w:p>
       <w:pPr>
         <w:pStyle w:val="Heading2"/>
@@ -3015,12 +3015,18 @@
         <w:t xml:space="preserve">“You’re an academic assistant with an expertise in software engineering to proofread and rewrite as a single connected text. Keep academic tone.”</w:t>
       </w:r>
     </w:p>
-    <w:bookmarkEnd w:id="42"/>
-    <w:bookmarkEnd w:id="43"/>
+    <w:bookmarkEnd w:id="54"/>
+    <w:bookmarkEnd w:id="55"/>
     <w:sectPr>
-      <w:footnotePr>
-        <w:numRestart w:val="eachSect"/>
-      </w:footnotePr>
+      <w:headerReference r:id="rId10" w:type="default"/>
+      <w:footerReference r:id="rId11" w:type="even"/>
+      <w:footerReference r:id="rId12" w:type="default"/>
+      <w:pgSz w:h="16840" w:w="11900"/>
+      <w:pgMar w:bottom="1440" w:footer="720" w:gutter="0" w:header="720" w:left="1440" w:right="1440" w:top="1440"/>
+      <w:pgNumType w:start="0"/>
+      <w:cols w:space="720"/>
+      <w:titlePg/>
+      <w:docGrid w:linePitch="360"/>
     </w:sectPr>
   </w:body>
 </w:document>
@@ -3030,6 +3036,119 @@
 <w:comments xmlns:w="http://schemas.openxmlformats.org/wordprocessingml/2006/main" xmlns:m="http://schemas.openxmlformats.org/officeDocument/2006/math" xmlns:r="http://schemas.openxmlformats.org/officeDocument/2006/relationships" xmlns:o="urn:schemas-microsoft-com:office:office" xmlns:v="urn:schemas-microsoft-com:vml" xmlns:w10="urn:schemas-microsoft-com:office:word" xmlns:a="http://schemas.openxmlformats.org/drawingml/2006/main" xmlns:pic="http://schemas.openxmlformats.org/drawingml/2006/picture" xmlns:wp="http://schemas.openxmlformats.org/drawingml/2006/wordprocessingDrawing"/>
 </file>
 
+<file path=word/footer1.xml><?xml version="1.0" encoding="utf-8"?>
+<w:ftr xmlns:wpc="http://schemas.microsoft.com/office/word/2010/wordprocessingCanvas" xmlns:cx="http://schemas.microsoft.com/office/drawing/2014/chartex" xmlns:cx1="http://schemas.microsoft.com/office/drawing/2015/9/8/chartex" xmlns:cx2="http://schemas.microsoft.com/office/drawing/2015/10/21/chartex" xmlns:cx3="http://schemas.microsoft.com/office/drawing/2016/5/9/chartex" xmlns:cx4="http://schemas.microsoft.com/office/drawing/2016/5/10/chartex" xmlns:cx5="http://schemas.microsoft.com/office/drawing/2016/5/11/chartex" xmlns:cx6="http://schemas.microsoft.com/office/drawing/2016/5/12/chartex" xmlns:cx7="http://schemas.microsoft.com/office/drawing/2016/5/13/chartex" xmlns:cx8="http://schemas.microsoft.com/office/drawing/2016/5/14/chartex" xmlns:mc="http://schemas.openxmlformats.org/markup-compatibility/2006" xmlns:aink="http://schemas.microsoft.com/office/drawing/2016/ink" xmlns:am3d="http://schemas.microsoft.com/office/drawing/2017/model3d" xmlns:o="urn:schemas-microsoft-com:office:office" xmlns:oel="http://schemas.microsoft.com/office/2019/extlst" xmlns:r="http://schemas.openxmlformats.org/officeDocument/2006/relationships" xmlns:m="http://schemas.openxmlformats.org/officeDocument/2006/math" xmlns:v="urn:schemas-microsoft-com:vml" xmlns:wp14="http://schemas.microsoft.com/office/word/2010/wordprocessingDrawing" xmlns:wp="http://schemas.openxmlformats.org/drawingml/2006/wordprocessingDrawing" xmlns:w10="urn:schemas-microsoft-com:office:word" xmlns:w="http://schemas.openxmlformats.org/wordprocessingml/2006/main" xmlns:w14="http://schemas.microsoft.com/office/word/2010/wordml" xmlns:w15="http://schemas.microsoft.com/office/word/2012/wordml" xmlns:w16cex="http://schemas.microsoft.com/office/word/2018/wordml/cex" xmlns:w16cid="http://schemas.microsoft.com/office/word/2016/wordml/cid" xmlns:w16="http://schemas.microsoft.com/office/word/2018/wordml" xmlns:w16du="http://schemas.microsoft.com/office/word/2023/wordml/word16du" xmlns:w16sdtdh="http://schemas.microsoft.com/office/word/2020/wordml/sdtdatahash" xmlns:w16sdtfl="http://schemas.microsoft.com/office/word/2024/wordml/sdtformatlock" xmlns:w16se="http://schemas.microsoft.com/office/word/2015/wordml/symex" xmlns:wpg="http://schemas.microsoft.com/office/word/2010/wordprocessingGroup" xmlns:wpi="http://schemas.microsoft.com/office/word/2010/wordprocessingInk" xmlns:wne="http://schemas.microsoft.com/office/word/2006/wordml" xmlns:wps="http://schemas.microsoft.com/office/word/2010/wordprocessingShape" mc:Ignorable="w14 w15 w16se w16cid w16 w16cex w16sdtdh w16sdtfl w16du wp14">
+  <w:sdt>
+    <w:sdtPr>
+      <w:rPr>
+        <w:rStyle w:val="PageNumber"/>
+      </w:rPr>
+      <w:id w:val="811578987"/>
+      <w:docPartObj>
+        <w:docPartGallery w:val="Page Numbers (Bottom of Page)"/>
+        <w:docPartUnique/>
+      </w:docPartObj>
+    </w:sdtPr>
+    <w:sdtContent>
+      <w:p>
+        <w:pPr>
+          <w:pStyle w:val="Footer"/>
+          <w:framePr w:wrap="none" w:vAnchor="text" w:hAnchor="margin" w:xAlign="center" w:y="1"/>
+          <w:rPr>
+            <w:rStyle w:val="PageNumber"/>
+          </w:rPr>
+        </w:pPr>
+        <w:r>
+          <w:rPr>
+            <w:rStyle w:val="PageNumber"/>
+          </w:rPr>
+          <w:fldChar w:fldCharType="begin"/>
+        </w:r>
+        <w:r>
+          <w:rPr>
+            <w:rStyle w:val="PageNumber"/>
+          </w:rPr>
+          <w:instrText xml:space="preserve"> PAGE </w:instrText>
+        </w:r>
+        <w:r>
+          <w:rPr>
+            <w:rStyle w:val="PageNumber"/>
+          </w:rPr>
+          <w:fldChar w:fldCharType="end"/>
+        </w:r>
+      </w:p>
+    </w:sdtContent>
+  </w:sdt>
+  <w:p>
+    <w:pPr>
+      <w:pStyle w:val="Footer"/>
+    </w:pPr>
+  </w:p>
+</w:ftr>
+</file>
+
+<file path=word/footer2.xml><?xml version="1.0" encoding="utf-8"?>
+<w:ftr xmlns:wpc="http://schemas.microsoft.com/office/word/2010/wordprocessingCanvas" xmlns:cx="http://schemas.microsoft.com/office/drawing/2014/chartex" xmlns:cx1="http://schemas.microsoft.com/office/drawing/2015/9/8/chartex" xmlns:cx2="http://schemas.microsoft.com/office/drawing/2015/10/21/chartex" xmlns:cx3="http://schemas.microsoft.com/office/drawing/2016/5/9/chartex" xmlns:cx4="http://schemas.microsoft.com/office/drawing/2016/5/10/chartex" xmlns:cx5="http://schemas.microsoft.com/office/drawing/2016/5/11/chartex" xmlns:cx6="http://schemas.microsoft.com/office/drawing/2016/5/12/chartex" xmlns:cx7="http://schemas.microsoft.com/office/drawing/2016/5/13/chartex" xmlns:cx8="http://schemas.microsoft.com/office/drawing/2016/5/14/chartex" xmlns:mc="http://schemas.openxmlformats.org/markup-compatibility/2006" xmlns:aink="http://schemas.microsoft.com/office/drawing/2016/ink" xmlns:am3d="http://schemas.microsoft.com/office/drawing/2017/model3d" xmlns:o="urn:schemas-microsoft-com:office:office" xmlns:oel="http://schemas.microsoft.com/office/2019/extlst" xmlns:r="http://schemas.openxmlformats.org/officeDocument/2006/relationships" xmlns:m="http://schemas.openxmlformats.org/officeDocument/2006/math" xmlns:v="urn:schemas-microsoft-com:vml" xmlns:wp14="http://schemas.microsoft.com/office/word/2010/wordprocessingDrawing" xmlns:wp="http://schemas.openxmlformats.org/drawingml/2006/wordprocessingDrawing" xmlns:w10="urn:schemas-microsoft-com:office:word" xmlns:w="http://schemas.openxmlformats.org/wordprocessingml/2006/main" xmlns:w14="http://schemas.microsoft.com/office/word/2010/wordml" xmlns:w15="http://schemas.microsoft.com/office/word/2012/wordml" xmlns:w16cex="http://schemas.microsoft.com/office/word/2018/wordml/cex" xmlns:w16cid="http://schemas.microsoft.com/office/word/2016/wordml/cid" xmlns:w16="http://schemas.microsoft.com/office/word/2018/wordml" xmlns:w16du="http://schemas.microsoft.com/office/word/2023/wordml/word16du" xmlns:w16sdtdh="http://schemas.microsoft.com/office/word/2020/wordml/sdtdatahash" xmlns:w16sdtfl="http://schemas.microsoft.com/office/word/2024/wordml/sdtformatlock" xmlns:w16se="http://schemas.microsoft.com/office/word/2015/wordml/symex" xmlns:wpg="http://schemas.microsoft.com/office/word/2010/wordprocessingGroup" xmlns:wpi="http://schemas.microsoft.com/office/word/2010/wordprocessingInk" xmlns:wne="http://schemas.microsoft.com/office/word/2006/wordml" xmlns:wps="http://schemas.microsoft.com/office/word/2010/wordprocessingShape" mc:Ignorable="w14 w15 w16se w16cid w16 w16cex w16sdtdh w16sdtfl w16du wp14">
+  <w:p>
+    <w:pPr>
+      <w:pStyle w:val="Footer"/>
+      <w:tabs>
+        <w:tab w:val="clear" w:pos="4680"/>
+        <w:tab w:val="clear" w:pos="9360"/>
+      </w:tabs>
+      <w:jc w:val="center"/>
+      <w:rPr>
+        <w:caps/>
+        <w:noProof/>
+        <w:color w:val="4472C4" w:themeColor="accent1"/>
+      </w:rPr>
+    </w:pPr>
+    <w:r>
+      <w:rPr>
+        <w:caps/>
+        <w:color w:val="4472C4" w:themeColor="accent1"/>
+      </w:rPr>
+      <w:fldChar w:fldCharType="begin"/>
+    </w:r>
+    <w:r>
+      <w:rPr>
+        <w:caps/>
+        <w:color w:val="4472C4" w:themeColor="accent1"/>
+      </w:rPr>
+      <w:instrText xml:space="preserve"> PAGE   \* MERGEFORMAT </w:instrText>
+    </w:r>
+    <w:r>
+      <w:rPr>
+        <w:caps/>
+        <w:color w:val="4472C4" w:themeColor="accent1"/>
+      </w:rPr>
+      <w:fldChar w:fldCharType="separate"/>
+    </w:r>
+    <w:r>
+      <w:rPr>
+        <w:caps/>
+        <w:noProof/>
+        <w:color w:val="4472C4" w:themeColor="accent1"/>
+      </w:rPr>
+      <w:t>3</w:t>
+    </w:r>
+    <w:r>
+      <w:rPr>
+        <w:caps/>
+        <w:noProof/>
+        <w:color w:val="4472C4" w:themeColor="accent1"/>
+      </w:rPr>
+      <w:fldChar w:fldCharType="end"/>
+    </w:r>
+  </w:p>
+  <w:p>
+    <w:pPr>
+      <w:pStyle w:val="Footer"/>
+    </w:pPr>
+  </w:p>
+</w:ftr>
+</file>
+
 <file path=word/footnotes.xml><?xml version="1.0" encoding="utf-8"?>
 <w:footnotes xmlns:w="http://schemas.openxmlformats.org/wordprocessingml/2006/main" xmlns:m="http://schemas.openxmlformats.org/officeDocument/2006/math" xmlns:r="http://schemas.openxmlformats.org/officeDocument/2006/relationships" xmlns:o="urn:schemas-microsoft-com:office:office" xmlns:v="urn:schemas-microsoft-com:vml" xmlns:w10="urn:schemas-microsoft-com:office:word" xmlns:a="http://schemas.openxmlformats.org/drawingml/2006/main" xmlns:pic="http://schemas.openxmlformats.org/drawingml/2006/picture" xmlns:wp="http://schemas.openxmlformats.org/drawingml/2006/wordprocessingDrawing">
   <w:footnote w:type="continuationSeparator" w:id="0">
@@ -3049,8 +3168,1229 @@
 </w:footnotes>
 </file>
 
+<file path=word/header1.xml><?xml version="1.0" encoding="utf-8"?>
+<w:hdr xmlns:wpc="http://schemas.microsoft.com/office/word/2010/wordprocessingCanvas" xmlns:cx="http://schemas.microsoft.com/office/drawing/2014/chartex" xmlns:cx1="http://schemas.microsoft.com/office/drawing/2015/9/8/chartex" xmlns:cx2="http://schemas.microsoft.com/office/drawing/2015/10/21/chartex" xmlns:cx3="http://schemas.microsoft.com/office/drawing/2016/5/9/chartex" xmlns:cx4="http://schemas.microsoft.com/office/drawing/2016/5/10/chartex" xmlns:cx5="http://schemas.microsoft.com/office/drawing/2016/5/11/chartex" xmlns:cx6="http://schemas.microsoft.com/office/drawing/2016/5/12/chartex" xmlns:cx7="http://schemas.microsoft.com/office/drawing/2016/5/13/chartex" xmlns:cx8="http://schemas.microsoft.com/office/drawing/2016/5/14/chartex" xmlns:mc="http://schemas.openxmlformats.org/markup-compatibility/2006" xmlns:aink="http://schemas.microsoft.com/office/drawing/2016/ink" xmlns:am3d="http://schemas.microsoft.com/office/drawing/2017/model3d" xmlns:o="urn:schemas-microsoft-com:office:office" xmlns:oel="http://schemas.microsoft.com/office/2019/extlst" xmlns:r="http://schemas.openxmlformats.org/officeDocument/2006/relationships" xmlns:m="http://schemas.openxmlformats.org/officeDocument/2006/math" xmlns:v="urn:schemas-microsoft-com:vml" xmlns:wp14="http://schemas.microsoft.com/office/word/2010/wordprocessingDrawing" xmlns:wp="http://schemas.openxmlformats.org/drawingml/2006/wordprocessingDrawing" xmlns:w10="urn:schemas-microsoft-com:office:word" xmlns:w="http://schemas.openxmlformats.org/wordprocessingml/2006/main" xmlns:w14="http://schemas.microsoft.com/office/word/2010/wordml" xmlns:w15="http://schemas.microsoft.com/office/word/2012/wordml" xmlns:w16cex="http://schemas.microsoft.com/office/word/2018/wordml/cex" xmlns:w16cid="http://schemas.microsoft.com/office/word/2016/wordml/cid" xmlns:w16="http://schemas.microsoft.com/office/word/2018/wordml" xmlns:w16du="http://schemas.microsoft.com/office/word/2023/wordml/word16du" xmlns:w16sdtdh="http://schemas.microsoft.com/office/word/2020/wordml/sdtdatahash" xmlns:w16sdtfl="http://schemas.microsoft.com/office/word/2024/wordml/sdtformatlock" xmlns:w16se="http://schemas.microsoft.com/office/word/2015/wordml/symex" xmlns:wpg="http://schemas.microsoft.com/office/word/2010/wordprocessingGroup" xmlns:wpi="http://schemas.microsoft.com/office/word/2010/wordprocessingInk" xmlns:wne="http://schemas.microsoft.com/office/word/2006/wordml" xmlns:wps="http://schemas.microsoft.com/office/word/2010/wordprocessingShape" mc:Ignorable="w14 w15 w16se w16cid w16 w16cex w16sdtdh w16sdtfl w16du wp14">
+  <w:p>
+    <w:pPr>
+      <w:pStyle w:val="Header"/>
+    </w:pPr>
+    <w:r>
+      <w:t>NNDL</w:t>
+    </w:r>
+    <w:r>
+      <w:t>_coursework</w:t>
+    </w:r>
+    <w:r>
+      <w:t>-2</w:t>
+    </w:r>
+    <w:r>
+      <w:t>025</w:t>
+    </w:r>
+  </w:p>
+</w:hdr>
+</file>
+
 <file path=word/numbering.xml><?xml version="1.0" encoding="utf-8"?>
-<w:numbering xmlns:w="http://schemas.openxmlformats.org/wordprocessingml/2006/main">
+<w:numbering xmlns:aink="http://schemas.microsoft.com/office/drawing/2016/ink" xmlns:am3d="http://schemas.microsoft.com/office/drawing/2017/model3d" xmlns:cx="http://schemas.microsoft.com/office/drawing/2014/chartex" xmlns:cx1="http://schemas.microsoft.com/office/drawing/2015/9/8/chartex" xmlns:cx2="http://schemas.microsoft.com/office/drawing/2015/10/21/chartex" xmlns:cx3="http://schemas.microsoft.com/office/drawing/2016/5/9/chartex" xmlns:cx4="http://schemas.microsoft.com/office/drawing/2016/5/10/chartex" xmlns:cx5="http://schemas.microsoft.com/office/drawing/2016/5/11/chartex" xmlns:cx6="http://schemas.microsoft.com/office/drawing/2016/5/12/chartex" xmlns:cx7="http://schemas.microsoft.com/office/drawing/2016/5/13/chartex" xmlns:cx8="http://schemas.microsoft.com/office/drawing/2016/5/14/chartex" xmlns:m="http://schemas.openxmlformats.org/officeDocument/2006/math" xmlns:mc="http://schemas.openxmlformats.org/markup-compatibility/2006" xmlns:o="urn:schemas-microsoft-com:office:office" xmlns:oel="http://schemas.microsoft.com/office/2019/extlst" xmlns:r="http://schemas.openxmlformats.org/officeDocument/2006/relationships" xmlns:v="urn:schemas-microsoft-com:vml" xmlns:w="http://schemas.openxmlformats.org/wordprocessingml/2006/main" xmlns:w10="urn:schemas-microsoft-com:office:word" xmlns:w14="http://schemas.microsoft.com/office/word/2010/wordml" xmlns:w15="http://schemas.microsoft.com/office/word/2012/wordml" xmlns:w16="http://schemas.microsoft.com/office/word/2018/wordml" xmlns:w16cex="http://schemas.microsoft.com/office/word/2018/wordml/cex" xmlns:w16cid="http://schemas.microsoft.com/office/word/2016/wordml/cid" xmlns:w16du="http://schemas.microsoft.com/office/word/2023/wordml/word16du" xmlns:w16sdtdh="http://schemas.microsoft.com/office/word/2020/wordml/sdtdatahash" xmlns:w16sdtfl="http://schemas.microsoft.com/office/word/2024/wordml/sdtformatlock" xmlns:w16se="http://schemas.microsoft.com/office/word/2015/wordml/symex" xmlns:wne="http://schemas.microsoft.com/office/word/2006/wordml" xmlns:wp="http://schemas.openxmlformats.org/drawingml/2006/wordprocessingDrawing" xmlns:wp14="http://schemas.microsoft.com/office/word/2010/wordprocessingDrawing" xmlns:wpc="http://schemas.microsoft.com/office/word/2010/wordprocessingCanvas" xmlns:wpg="http://schemas.microsoft.com/office/word/2010/wordprocessingGroup" xmlns:wpi="http://schemas.microsoft.com/office/word/2010/wordprocessingInk" xmlns:wps="http://schemas.microsoft.com/office/word/2010/wordprocessingShape" mc:Ignorable="w14 w15 w16se w16cid w16 w16cex w16sdtdh w16sdtfl w16du wp14">
+  <w:abstractNum w15:restartNumberingAfterBreak="0" w:abstractNumId="0">
+    <w:nsid w:val="032C5DA3"/>
+    <w:multiLevelType w:val="hybridMultilevel"/>
+    <w:tmpl w:val="C2B41D0C"/>
+    <w:lvl w:ilvl="0" w:tplc="0809000F">
+      <w:start w:val="1"/>
+      <w:numFmt w:val="decimal"/>
+      <w:lvlText w:val="%1."/>
+      <w:lvlJc w:val="left"/>
+      <w:pPr>
+        <w:ind w:hanging="360" w:left="360"/>
+      </w:pPr>
+      <w:rPr>
+        <w:rFonts w:hint="default"/>
+      </w:rPr>
+    </w:lvl>
+    <w:lvl w:ilvl="1" w:tentative="1" w:tplc="08090019">
+      <w:start w:val="1"/>
+      <w:numFmt w:val="lowerLetter"/>
+      <w:lvlText w:val="%2."/>
+      <w:lvlJc w:val="left"/>
+      <w:pPr>
+        <w:ind w:hanging="360" w:left="1080"/>
+      </w:pPr>
+    </w:lvl>
+    <w:lvl w:ilvl="2" w:tentative="1" w:tplc="0809001B">
+      <w:start w:val="1"/>
+      <w:numFmt w:val="lowerRoman"/>
+      <w:lvlText w:val="%3."/>
+      <w:lvlJc w:val="right"/>
+      <w:pPr>
+        <w:ind w:hanging="180" w:left="1800"/>
+      </w:pPr>
+    </w:lvl>
+    <w:lvl w:ilvl="3" w:tentative="1" w:tplc="0809000F">
+      <w:start w:val="1"/>
+      <w:numFmt w:val="decimal"/>
+      <w:lvlText w:val="%4."/>
+      <w:lvlJc w:val="left"/>
+      <w:pPr>
+        <w:ind w:hanging="360" w:left="2520"/>
+      </w:pPr>
+    </w:lvl>
+    <w:lvl w:ilvl="4" w:tentative="1" w:tplc="08090019">
+      <w:start w:val="1"/>
+      <w:numFmt w:val="lowerLetter"/>
+      <w:lvlText w:val="%5."/>
+      <w:lvlJc w:val="left"/>
+      <w:pPr>
+        <w:ind w:hanging="360" w:left="3240"/>
+      </w:pPr>
+    </w:lvl>
+    <w:lvl w:ilvl="5" w:tentative="1" w:tplc="0809001B">
+      <w:start w:val="1"/>
+      <w:numFmt w:val="lowerRoman"/>
+      <w:lvlText w:val="%6."/>
+      <w:lvlJc w:val="right"/>
+      <w:pPr>
+        <w:ind w:hanging="180" w:left="3960"/>
+      </w:pPr>
+    </w:lvl>
+    <w:lvl w:ilvl="6" w:tentative="1" w:tplc="0809000F">
+      <w:start w:val="1"/>
+      <w:numFmt w:val="decimal"/>
+      <w:lvlText w:val="%7."/>
+      <w:lvlJc w:val="left"/>
+      <w:pPr>
+        <w:ind w:hanging="360" w:left="4680"/>
+      </w:pPr>
+    </w:lvl>
+    <w:lvl w:ilvl="7" w:tentative="1" w:tplc="08090019">
+      <w:start w:val="1"/>
+      <w:numFmt w:val="lowerLetter"/>
+      <w:lvlText w:val="%8."/>
+      <w:lvlJc w:val="left"/>
+      <w:pPr>
+        <w:ind w:hanging="360" w:left="5400"/>
+      </w:pPr>
+    </w:lvl>
+    <w:lvl w:ilvl="8" w:tentative="1" w:tplc="0809001B">
+      <w:start w:val="1"/>
+      <w:numFmt w:val="lowerRoman"/>
+      <w:lvlText w:val="%9."/>
+      <w:lvlJc w:val="right"/>
+      <w:pPr>
+        <w:ind w:hanging="180" w:left="6120"/>
+      </w:pPr>
+    </w:lvl>
+  </w:abstractNum>
+  <w:abstractNum w15:restartNumberingAfterBreak="0" w:abstractNumId="1">
+    <w:nsid w:val="0C955FE7"/>
+    <w:multiLevelType w:val="hybridMultilevel"/>
+    <w:tmpl w:val="A67456D4"/>
+    <w:lvl w:ilvl="0" w:tplc="0409000F">
+      <w:start w:val="1"/>
+      <w:numFmt w:val="decimal"/>
+      <w:lvlText w:val="%1."/>
+      <w:lvlJc w:val="left"/>
+      <w:pPr>
+        <w:ind w:hanging="360" w:left="720"/>
+      </w:pPr>
+      <w:rPr>
+        <w:rFonts w:hint="default"/>
+      </w:rPr>
+    </w:lvl>
+    <w:lvl w:ilvl="1" w:tplc="04090019">
+      <w:start w:val="1"/>
+      <w:numFmt w:val="lowerLetter"/>
+      <w:lvlText w:val="%2."/>
+      <w:lvlJc w:val="left"/>
+      <w:pPr>
+        <w:ind w:hanging="360" w:left="1440"/>
+      </w:pPr>
+    </w:lvl>
+    <w:lvl w:ilvl="2" w:tentative="1" w:tplc="0409001B">
+      <w:start w:val="1"/>
+      <w:numFmt w:val="lowerRoman"/>
+      <w:lvlText w:val="%3."/>
+      <w:lvlJc w:val="right"/>
+      <w:pPr>
+        <w:ind w:hanging="180" w:left="2160"/>
+      </w:pPr>
+    </w:lvl>
+    <w:lvl w:ilvl="3" w:tentative="1" w:tplc="0409000F">
+      <w:start w:val="1"/>
+      <w:numFmt w:val="decimal"/>
+      <w:lvlText w:val="%4."/>
+      <w:lvlJc w:val="left"/>
+      <w:pPr>
+        <w:ind w:hanging="360" w:left="2880"/>
+      </w:pPr>
+    </w:lvl>
+    <w:lvl w:ilvl="4" w:tentative="1" w:tplc="04090019">
+      <w:start w:val="1"/>
+      <w:numFmt w:val="lowerLetter"/>
+      <w:lvlText w:val="%5."/>
+      <w:lvlJc w:val="left"/>
+      <w:pPr>
+        <w:ind w:hanging="360" w:left="3600"/>
+      </w:pPr>
+    </w:lvl>
+    <w:lvl w:ilvl="5" w:tentative="1" w:tplc="0409001B">
+      <w:start w:val="1"/>
+      <w:numFmt w:val="lowerRoman"/>
+      <w:lvlText w:val="%6."/>
+      <w:lvlJc w:val="right"/>
+      <w:pPr>
+        <w:ind w:hanging="180" w:left="4320"/>
+      </w:pPr>
+    </w:lvl>
+    <w:lvl w:ilvl="6" w:tentative="1" w:tplc="0409000F">
+      <w:start w:val="1"/>
+      <w:numFmt w:val="decimal"/>
+      <w:lvlText w:val="%7."/>
+      <w:lvlJc w:val="left"/>
+      <w:pPr>
+        <w:ind w:hanging="360" w:left="5040"/>
+      </w:pPr>
+    </w:lvl>
+    <w:lvl w:ilvl="7" w:tentative="1" w:tplc="04090019">
+      <w:start w:val="1"/>
+      <w:numFmt w:val="lowerLetter"/>
+      <w:lvlText w:val="%8."/>
+      <w:lvlJc w:val="left"/>
+      <w:pPr>
+        <w:ind w:hanging="360" w:left="5760"/>
+      </w:pPr>
+    </w:lvl>
+    <w:lvl w:ilvl="8" w:tentative="1" w:tplc="0409001B">
+      <w:start w:val="1"/>
+      <w:numFmt w:val="lowerRoman"/>
+      <w:lvlText w:val="%9."/>
+      <w:lvlJc w:val="right"/>
+      <w:pPr>
+        <w:ind w:hanging="180" w:left="6480"/>
+      </w:pPr>
+    </w:lvl>
+  </w:abstractNum>
+  <w:abstractNum w15:restartNumberingAfterBreak="0" w:abstractNumId="2">
+    <w:nsid w:val="104C6F50"/>
+    <w:multiLevelType w:val="hybridMultilevel"/>
+    <w:tmpl w:val="7200089C"/>
+    <w:lvl w:ilvl="0" w:tplc="0409000F">
+      <w:start w:val="1"/>
+      <w:numFmt w:val="decimal"/>
+      <w:lvlText w:val="%1."/>
+      <w:lvlJc w:val="left"/>
+      <w:pPr>
+        <w:ind w:hanging="360" w:left="720"/>
+      </w:pPr>
+      <w:rPr>
+        <w:rFonts w:hint="default"/>
+      </w:rPr>
+    </w:lvl>
+    <w:lvl w:ilvl="1" w:tentative="1" w:tplc="04090019">
+      <w:start w:val="1"/>
+      <w:numFmt w:val="lowerLetter"/>
+      <w:lvlText w:val="%2."/>
+      <w:lvlJc w:val="left"/>
+      <w:pPr>
+        <w:ind w:hanging="360" w:left="1440"/>
+      </w:pPr>
+    </w:lvl>
+    <w:lvl w:ilvl="2" w:tentative="1" w:tplc="0409001B">
+      <w:start w:val="1"/>
+      <w:numFmt w:val="lowerRoman"/>
+      <w:lvlText w:val="%3."/>
+      <w:lvlJc w:val="right"/>
+      <w:pPr>
+        <w:ind w:hanging="180" w:left="2160"/>
+      </w:pPr>
+    </w:lvl>
+    <w:lvl w:ilvl="3" w:tentative="1" w:tplc="0409000F">
+      <w:start w:val="1"/>
+      <w:numFmt w:val="decimal"/>
+      <w:lvlText w:val="%4."/>
+      <w:lvlJc w:val="left"/>
+      <w:pPr>
+        <w:ind w:hanging="360" w:left="2880"/>
+      </w:pPr>
+    </w:lvl>
+    <w:lvl w:ilvl="4" w:tentative="1" w:tplc="04090019">
+      <w:start w:val="1"/>
+      <w:numFmt w:val="lowerLetter"/>
+      <w:lvlText w:val="%5."/>
+      <w:lvlJc w:val="left"/>
+      <w:pPr>
+        <w:ind w:hanging="360" w:left="3600"/>
+      </w:pPr>
+    </w:lvl>
+    <w:lvl w:ilvl="5" w:tentative="1" w:tplc="0409001B">
+      <w:start w:val="1"/>
+      <w:numFmt w:val="lowerRoman"/>
+      <w:lvlText w:val="%6."/>
+      <w:lvlJc w:val="right"/>
+      <w:pPr>
+        <w:ind w:hanging="180" w:left="4320"/>
+      </w:pPr>
+    </w:lvl>
+    <w:lvl w:ilvl="6" w:tentative="1" w:tplc="0409000F">
+      <w:start w:val="1"/>
+      <w:numFmt w:val="decimal"/>
+      <w:lvlText w:val="%7."/>
+      <w:lvlJc w:val="left"/>
+      <w:pPr>
+        <w:ind w:hanging="360" w:left="5040"/>
+      </w:pPr>
+    </w:lvl>
+    <w:lvl w:ilvl="7" w:tentative="1" w:tplc="04090019">
+      <w:start w:val="1"/>
+      <w:numFmt w:val="lowerLetter"/>
+      <w:lvlText w:val="%8."/>
+      <w:lvlJc w:val="left"/>
+      <w:pPr>
+        <w:ind w:hanging="360" w:left="5760"/>
+      </w:pPr>
+    </w:lvl>
+    <w:lvl w:ilvl="8" w:tentative="1" w:tplc="0409001B">
+      <w:start w:val="1"/>
+      <w:numFmt w:val="lowerRoman"/>
+      <w:lvlText w:val="%9."/>
+      <w:lvlJc w:val="right"/>
+      <w:pPr>
+        <w:ind w:hanging="180" w:left="6480"/>
+      </w:pPr>
+    </w:lvl>
+  </w:abstractNum>
+  <w:abstractNum w15:restartNumberingAfterBreak="0" w:abstractNumId="3">
+    <w:nsid w:val="23313CD5"/>
+    <w:multiLevelType w:val="hybridMultilevel"/>
+    <w:tmpl w:val="A67456D4"/>
+    <w:lvl w:ilvl="0" w:tplc="0409000F">
+      <w:start w:val="1"/>
+      <w:numFmt w:val="decimal"/>
+      <w:lvlText w:val="%1."/>
+      <w:lvlJc w:val="left"/>
+      <w:pPr>
+        <w:ind w:hanging="360" w:left="720"/>
+      </w:pPr>
+      <w:rPr>
+        <w:rFonts w:hint="default"/>
+      </w:rPr>
+    </w:lvl>
+    <w:lvl w:ilvl="1" w:tplc="04090019">
+      <w:start w:val="1"/>
+      <w:numFmt w:val="lowerLetter"/>
+      <w:lvlText w:val="%2."/>
+      <w:lvlJc w:val="left"/>
+      <w:pPr>
+        <w:ind w:hanging="360" w:left="1440"/>
+      </w:pPr>
+    </w:lvl>
+    <w:lvl w:ilvl="2" w:tentative="1" w:tplc="0409001B">
+      <w:start w:val="1"/>
+      <w:numFmt w:val="lowerRoman"/>
+      <w:lvlText w:val="%3."/>
+      <w:lvlJc w:val="right"/>
+      <w:pPr>
+        <w:ind w:hanging="180" w:left="2160"/>
+      </w:pPr>
+    </w:lvl>
+    <w:lvl w:ilvl="3" w:tentative="1" w:tplc="0409000F">
+      <w:start w:val="1"/>
+      <w:numFmt w:val="decimal"/>
+      <w:lvlText w:val="%4."/>
+      <w:lvlJc w:val="left"/>
+      <w:pPr>
+        <w:ind w:hanging="360" w:left="2880"/>
+      </w:pPr>
+    </w:lvl>
+    <w:lvl w:ilvl="4" w:tentative="1" w:tplc="04090019">
+      <w:start w:val="1"/>
+      <w:numFmt w:val="lowerLetter"/>
+      <w:lvlText w:val="%5."/>
+      <w:lvlJc w:val="left"/>
+      <w:pPr>
+        <w:ind w:hanging="360" w:left="3600"/>
+      </w:pPr>
+    </w:lvl>
+    <w:lvl w:ilvl="5" w:tentative="1" w:tplc="0409001B">
+      <w:start w:val="1"/>
+      <w:numFmt w:val="lowerRoman"/>
+      <w:lvlText w:val="%6."/>
+      <w:lvlJc w:val="right"/>
+      <w:pPr>
+        <w:ind w:hanging="180" w:left="4320"/>
+      </w:pPr>
+    </w:lvl>
+    <w:lvl w:ilvl="6" w:tentative="1" w:tplc="0409000F">
+      <w:start w:val="1"/>
+      <w:numFmt w:val="decimal"/>
+      <w:lvlText w:val="%7."/>
+      <w:lvlJc w:val="left"/>
+      <w:pPr>
+        <w:ind w:hanging="360" w:left="5040"/>
+      </w:pPr>
+    </w:lvl>
+    <w:lvl w:ilvl="7" w:tentative="1" w:tplc="04090019">
+      <w:start w:val="1"/>
+      <w:numFmt w:val="lowerLetter"/>
+      <w:lvlText w:val="%8."/>
+      <w:lvlJc w:val="left"/>
+      <w:pPr>
+        <w:ind w:hanging="360" w:left="5760"/>
+      </w:pPr>
+    </w:lvl>
+    <w:lvl w:ilvl="8" w:tentative="1" w:tplc="0409001B">
+      <w:start w:val="1"/>
+      <w:numFmt w:val="lowerRoman"/>
+      <w:lvlText w:val="%9."/>
+      <w:lvlJc w:val="right"/>
+      <w:pPr>
+        <w:ind w:hanging="180" w:left="6480"/>
+      </w:pPr>
+    </w:lvl>
+  </w:abstractNum>
+  <w:abstractNum w15:restartNumberingAfterBreak="0" w:abstractNumId="4">
+    <w:nsid w:val="271D4B96"/>
+    <w:multiLevelType w:val="hybridMultilevel"/>
+    <w:tmpl w:val="BE986C26"/>
+    <w:lvl w:ilvl="0" w:tplc="86EA300C">
+      <w:start w:val="1"/>
+      <w:numFmt w:val="upperRoman"/>
+      <w:lvlText w:val="(%1)"/>
+      <w:lvlJc w:val="left"/>
+      <w:pPr>
+        <w:ind w:hanging="720" w:left="1080"/>
+      </w:pPr>
+      <w:rPr>
+        <w:rFonts w:hint="default"/>
+      </w:rPr>
+    </w:lvl>
+    <w:lvl w:ilvl="1" w:tplc="04090019">
+      <w:start w:val="1"/>
+      <w:numFmt w:val="lowerLetter"/>
+      <w:lvlText w:val="%2."/>
+      <w:lvlJc w:val="left"/>
+      <w:pPr>
+        <w:ind w:hanging="360" w:left="1440"/>
+      </w:pPr>
+    </w:lvl>
+    <w:lvl w:ilvl="2" w:tentative="1" w:tplc="0409001B">
+      <w:start w:val="1"/>
+      <w:numFmt w:val="lowerRoman"/>
+      <w:lvlText w:val="%3."/>
+      <w:lvlJc w:val="right"/>
+      <w:pPr>
+        <w:ind w:hanging="180" w:left="2160"/>
+      </w:pPr>
+    </w:lvl>
+    <w:lvl w:ilvl="3" w:tentative="1" w:tplc="0409000F">
+      <w:start w:val="1"/>
+      <w:numFmt w:val="decimal"/>
+      <w:lvlText w:val="%4."/>
+      <w:lvlJc w:val="left"/>
+      <w:pPr>
+        <w:ind w:hanging="360" w:left="2880"/>
+      </w:pPr>
+    </w:lvl>
+    <w:lvl w:ilvl="4" w:tentative="1" w:tplc="04090019">
+      <w:start w:val="1"/>
+      <w:numFmt w:val="lowerLetter"/>
+      <w:lvlText w:val="%5."/>
+      <w:lvlJc w:val="left"/>
+      <w:pPr>
+        <w:ind w:hanging="360" w:left="3600"/>
+      </w:pPr>
+    </w:lvl>
+    <w:lvl w:ilvl="5" w:tentative="1" w:tplc="0409001B">
+      <w:start w:val="1"/>
+      <w:numFmt w:val="lowerRoman"/>
+      <w:lvlText w:val="%6."/>
+      <w:lvlJc w:val="right"/>
+      <w:pPr>
+        <w:ind w:hanging="180" w:left="4320"/>
+      </w:pPr>
+    </w:lvl>
+    <w:lvl w:ilvl="6" w:tentative="1" w:tplc="0409000F">
+      <w:start w:val="1"/>
+      <w:numFmt w:val="decimal"/>
+      <w:lvlText w:val="%7."/>
+      <w:lvlJc w:val="left"/>
+      <w:pPr>
+        <w:ind w:hanging="360" w:left="5040"/>
+      </w:pPr>
+    </w:lvl>
+    <w:lvl w:ilvl="7" w:tentative="1" w:tplc="04090019">
+      <w:start w:val="1"/>
+      <w:numFmt w:val="lowerLetter"/>
+      <w:lvlText w:val="%8."/>
+      <w:lvlJc w:val="left"/>
+      <w:pPr>
+        <w:ind w:hanging="360" w:left="5760"/>
+      </w:pPr>
+    </w:lvl>
+    <w:lvl w:ilvl="8" w:tentative="1" w:tplc="0409001B">
+      <w:start w:val="1"/>
+      <w:numFmt w:val="lowerRoman"/>
+      <w:lvlText w:val="%9."/>
+      <w:lvlJc w:val="right"/>
+      <w:pPr>
+        <w:ind w:hanging="180" w:left="6480"/>
+      </w:pPr>
+    </w:lvl>
+  </w:abstractNum>
+  <w:abstractNum w15:restartNumberingAfterBreak="0" w:abstractNumId="5">
+    <w:nsid w:val="302F43F6"/>
+    <w:multiLevelType w:val="hybridMultilevel"/>
+    <w:tmpl w:val="E1F4FFB6"/>
+    <w:lvl w:ilvl="0" w:tplc="0409000F">
+      <w:start w:val="1"/>
+      <w:numFmt w:val="decimal"/>
+      <w:lvlText w:val="%1."/>
+      <w:lvlJc w:val="left"/>
+      <w:pPr>
+        <w:ind w:hanging="360" w:left="720"/>
+      </w:pPr>
+      <w:rPr>
+        <w:rFonts w:hint="default"/>
+      </w:rPr>
+    </w:lvl>
+    <w:lvl w:ilvl="1" w:tplc="04090019">
+      <w:start w:val="1"/>
+      <w:numFmt w:val="lowerLetter"/>
+      <w:lvlText w:val="%2."/>
+      <w:lvlJc w:val="left"/>
+      <w:pPr>
+        <w:ind w:hanging="360" w:left="1440"/>
+      </w:pPr>
+    </w:lvl>
+    <w:lvl w:ilvl="2" w:tentative="1" w:tplc="0409001B">
+      <w:start w:val="1"/>
+      <w:numFmt w:val="lowerRoman"/>
+      <w:lvlText w:val="%3."/>
+      <w:lvlJc w:val="right"/>
+      <w:pPr>
+        <w:ind w:hanging="180" w:left="2160"/>
+      </w:pPr>
+    </w:lvl>
+    <w:lvl w:ilvl="3" w:tentative="1" w:tplc="0409000F">
+      <w:start w:val="1"/>
+      <w:numFmt w:val="decimal"/>
+      <w:lvlText w:val="%4."/>
+      <w:lvlJc w:val="left"/>
+      <w:pPr>
+        <w:ind w:hanging="360" w:left="2880"/>
+      </w:pPr>
+    </w:lvl>
+    <w:lvl w:ilvl="4" w:tentative="1" w:tplc="04090019">
+      <w:start w:val="1"/>
+      <w:numFmt w:val="lowerLetter"/>
+      <w:lvlText w:val="%5."/>
+      <w:lvlJc w:val="left"/>
+      <w:pPr>
+        <w:ind w:hanging="360" w:left="3600"/>
+      </w:pPr>
+    </w:lvl>
+    <w:lvl w:ilvl="5" w:tentative="1" w:tplc="0409001B">
+      <w:start w:val="1"/>
+      <w:numFmt w:val="lowerRoman"/>
+      <w:lvlText w:val="%6."/>
+      <w:lvlJc w:val="right"/>
+      <w:pPr>
+        <w:ind w:hanging="180" w:left="4320"/>
+      </w:pPr>
+    </w:lvl>
+    <w:lvl w:ilvl="6" w:tentative="1" w:tplc="0409000F">
+      <w:start w:val="1"/>
+      <w:numFmt w:val="decimal"/>
+      <w:lvlText w:val="%7."/>
+      <w:lvlJc w:val="left"/>
+      <w:pPr>
+        <w:ind w:hanging="360" w:left="5040"/>
+      </w:pPr>
+    </w:lvl>
+    <w:lvl w:ilvl="7" w:tentative="1" w:tplc="04090019">
+      <w:start w:val="1"/>
+      <w:numFmt w:val="lowerLetter"/>
+      <w:lvlText w:val="%8."/>
+      <w:lvlJc w:val="left"/>
+      <w:pPr>
+        <w:ind w:hanging="360" w:left="5760"/>
+      </w:pPr>
+    </w:lvl>
+    <w:lvl w:ilvl="8" w:tentative="1" w:tplc="0409001B">
+      <w:start w:val="1"/>
+      <w:numFmt w:val="lowerRoman"/>
+      <w:lvlText w:val="%9."/>
+      <w:lvlJc w:val="right"/>
+      <w:pPr>
+        <w:ind w:hanging="180" w:left="6480"/>
+      </w:pPr>
+    </w:lvl>
+  </w:abstractNum>
+  <w:abstractNum w15:restartNumberingAfterBreak="0" w:abstractNumId="6">
+    <w:nsid w:val="33200461"/>
+    <w:multiLevelType w:val="hybridMultilevel"/>
+    <w:tmpl w:val="7B12E0B0"/>
+    <w:lvl w:ilvl="0" w:tplc="04090013">
+      <w:start w:val="1"/>
+      <w:numFmt w:val="upperRoman"/>
+      <w:lvlText w:val="%1."/>
+      <w:lvlJc w:val="right"/>
+      <w:pPr>
+        <w:ind w:hanging="360" w:left="1080"/>
+      </w:pPr>
+    </w:lvl>
+    <w:lvl w:ilvl="1" w:tentative="1" w:tplc="04090019">
+      <w:start w:val="1"/>
+      <w:numFmt w:val="lowerLetter"/>
+      <w:lvlText w:val="%2."/>
+      <w:lvlJc w:val="left"/>
+      <w:pPr>
+        <w:ind w:hanging="360" w:left="1800"/>
+      </w:pPr>
+    </w:lvl>
+    <w:lvl w:ilvl="2" w:tentative="1" w:tplc="0409001B">
+      <w:start w:val="1"/>
+      <w:numFmt w:val="lowerRoman"/>
+      <w:lvlText w:val="%3."/>
+      <w:lvlJc w:val="right"/>
+      <w:pPr>
+        <w:ind w:hanging="180" w:left="2520"/>
+      </w:pPr>
+    </w:lvl>
+    <w:lvl w:ilvl="3" w:tentative="1" w:tplc="0409000F">
+      <w:start w:val="1"/>
+      <w:numFmt w:val="decimal"/>
+      <w:lvlText w:val="%4."/>
+      <w:lvlJc w:val="left"/>
+      <w:pPr>
+        <w:ind w:hanging="360" w:left="3240"/>
+      </w:pPr>
+    </w:lvl>
+    <w:lvl w:ilvl="4" w:tentative="1" w:tplc="04090019">
+      <w:start w:val="1"/>
+      <w:numFmt w:val="lowerLetter"/>
+      <w:lvlText w:val="%5."/>
+      <w:lvlJc w:val="left"/>
+      <w:pPr>
+        <w:ind w:hanging="360" w:left="3960"/>
+      </w:pPr>
+    </w:lvl>
+    <w:lvl w:ilvl="5" w:tentative="1" w:tplc="0409001B">
+      <w:start w:val="1"/>
+      <w:numFmt w:val="lowerRoman"/>
+      <w:lvlText w:val="%6."/>
+      <w:lvlJc w:val="right"/>
+      <w:pPr>
+        <w:ind w:hanging="180" w:left="4680"/>
+      </w:pPr>
+    </w:lvl>
+    <w:lvl w:ilvl="6" w:tentative="1" w:tplc="0409000F">
+      <w:start w:val="1"/>
+      <w:numFmt w:val="decimal"/>
+      <w:lvlText w:val="%7."/>
+      <w:lvlJc w:val="left"/>
+      <w:pPr>
+        <w:ind w:hanging="360" w:left="5400"/>
+      </w:pPr>
+    </w:lvl>
+    <w:lvl w:ilvl="7" w:tentative="1" w:tplc="04090019">
+      <w:start w:val="1"/>
+      <w:numFmt w:val="lowerLetter"/>
+      <w:lvlText w:val="%8."/>
+      <w:lvlJc w:val="left"/>
+      <w:pPr>
+        <w:ind w:hanging="360" w:left="6120"/>
+      </w:pPr>
+    </w:lvl>
+    <w:lvl w:ilvl="8" w:tentative="1" w:tplc="0409001B">
+      <w:start w:val="1"/>
+      <w:numFmt w:val="lowerRoman"/>
+      <w:lvlText w:val="%9."/>
+      <w:lvlJc w:val="right"/>
+      <w:pPr>
+        <w:ind w:hanging="180" w:left="6840"/>
+      </w:pPr>
+    </w:lvl>
+  </w:abstractNum>
+  <w:abstractNum w15:restartNumberingAfterBreak="0" w:abstractNumId="7">
+    <w:nsid w:val="3B810D58"/>
+    <w:multiLevelType w:val="hybridMultilevel"/>
+    <w:tmpl w:val="7D36E028"/>
+    <w:lvl w:ilvl="0" w:tplc="04090001">
+      <w:start w:val="1"/>
+      <w:numFmt w:val="bullet"/>
+      <w:lvlText w:val=""/>
+      <w:lvlJc w:val="left"/>
+      <w:pPr>
+        <w:ind w:hanging="360" w:left="720"/>
+      </w:pPr>
+      <w:rPr>
+        <w:rFonts w:ascii="Symbol" w:hAnsi="Symbol" w:hint="default"/>
+      </w:rPr>
+    </w:lvl>
+    <w:lvl w:ilvl="1" w:tentative="1" w:tplc="04090003">
+      <w:start w:val="1"/>
+      <w:numFmt w:val="bullet"/>
+      <w:lvlText w:val="o"/>
+      <w:lvlJc w:val="left"/>
+      <w:pPr>
+        <w:ind w:hanging="360" w:left="1440"/>
+      </w:pPr>
+      <w:rPr>
+        <w:rFonts w:ascii="Courier New" w:cs="Courier New" w:hAnsi="Courier New" w:hint="default"/>
+      </w:rPr>
+    </w:lvl>
+    <w:lvl w:ilvl="2" w:tentative="1" w:tplc="04090005">
+      <w:start w:val="1"/>
+      <w:numFmt w:val="bullet"/>
+      <w:lvlText w:val=""/>
+      <w:lvlJc w:val="left"/>
+      <w:pPr>
+        <w:ind w:hanging="360" w:left="2160"/>
+      </w:pPr>
+      <w:rPr>
+        <w:rFonts w:ascii="Wingdings" w:hAnsi="Wingdings" w:hint="default"/>
+      </w:rPr>
+    </w:lvl>
+    <w:lvl w:ilvl="3" w:tentative="1" w:tplc="04090001">
+      <w:start w:val="1"/>
+      <w:numFmt w:val="bullet"/>
+      <w:lvlText w:val=""/>
+      <w:lvlJc w:val="left"/>
+      <w:pPr>
+        <w:ind w:hanging="360" w:left="2880"/>
+      </w:pPr>
+      <w:rPr>
+        <w:rFonts w:ascii="Symbol" w:hAnsi="Symbol" w:hint="default"/>
+      </w:rPr>
+    </w:lvl>
+    <w:lvl w:ilvl="4" w:tentative="1" w:tplc="04090003">
+      <w:start w:val="1"/>
+      <w:numFmt w:val="bullet"/>
+      <w:lvlText w:val="o"/>
+      <w:lvlJc w:val="left"/>
+      <w:pPr>
+        <w:ind w:hanging="360" w:left="3600"/>
+      </w:pPr>
+      <w:rPr>
+        <w:rFonts w:ascii="Courier New" w:cs="Courier New" w:hAnsi="Courier New" w:hint="default"/>
+      </w:rPr>
+    </w:lvl>
+    <w:lvl w:ilvl="5" w:tentative="1" w:tplc="04090005">
+      <w:start w:val="1"/>
+      <w:numFmt w:val="bullet"/>
+      <w:lvlText w:val=""/>
+      <w:lvlJc w:val="left"/>
+      <w:pPr>
+        <w:ind w:hanging="360" w:left="4320"/>
+      </w:pPr>
+      <w:rPr>
+        <w:rFonts w:ascii="Wingdings" w:hAnsi="Wingdings" w:hint="default"/>
+      </w:rPr>
+    </w:lvl>
+    <w:lvl w:ilvl="6" w:tentative="1" w:tplc="04090001">
+      <w:start w:val="1"/>
+      <w:numFmt w:val="bullet"/>
+      <w:lvlText w:val=""/>
+      <w:lvlJc w:val="left"/>
+      <w:pPr>
+        <w:ind w:hanging="360" w:left="5040"/>
+      </w:pPr>
+      <w:rPr>
+        <w:rFonts w:ascii="Symbol" w:hAnsi="Symbol" w:hint="default"/>
+      </w:rPr>
+    </w:lvl>
+    <w:lvl w:ilvl="7" w:tentative="1" w:tplc="04090003">
+      <w:start w:val="1"/>
+      <w:numFmt w:val="bullet"/>
+      <w:lvlText w:val="o"/>
+      <w:lvlJc w:val="left"/>
+      <w:pPr>
+        <w:ind w:hanging="360" w:left="5760"/>
+      </w:pPr>
+      <w:rPr>
+        <w:rFonts w:ascii="Courier New" w:cs="Courier New" w:hAnsi="Courier New" w:hint="default"/>
+      </w:rPr>
+    </w:lvl>
+    <w:lvl w:ilvl="8" w:tentative="1" w:tplc="04090005">
+      <w:start w:val="1"/>
+      <w:numFmt w:val="bullet"/>
+      <w:lvlText w:val=""/>
+      <w:lvlJc w:val="left"/>
+      <w:pPr>
+        <w:ind w:hanging="360" w:left="6480"/>
+      </w:pPr>
+      <w:rPr>
+        <w:rFonts w:ascii="Wingdings" w:hAnsi="Wingdings" w:hint="default"/>
+      </w:rPr>
+    </w:lvl>
+  </w:abstractNum>
+  <w:abstractNum w15:restartNumberingAfterBreak="0" w:abstractNumId="8">
+    <w:nsid w:val="4F244F76"/>
+    <w:multiLevelType w:val="hybridMultilevel"/>
+    <w:tmpl w:val="4A7AC298"/>
+    <w:lvl w:ilvl="0" w:tplc="04090019">
+      <w:start w:val="1"/>
+      <w:numFmt w:val="lowerLetter"/>
+      <w:lvlText w:val="%1."/>
+      <w:lvlJc w:val="left"/>
+      <w:pPr>
+        <w:ind w:hanging="360" w:left="1440"/>
+      </w:pPr>
+    </w:lvl>
+    <w:lvl w:ilvl="1" w:tentative="1" w:tplc="04090019">
+      <w:start w:val="1"/>
+      <w:numFmt w:val="lowerLetter"/>
+      <w:lvlText w:val="%2."/>
+      <w:lvlJc w:val="left"/>
+      <w:pPr>
+        <w:ind w:hanging="360" w:left="2160"/>
+      </w:pPr>
+    </w:lvl>
+    <w:lvl w:ilvl="2" w:tentative="1" w:tplc="0409001B">
+      <w:start w:val="1"/>
+      <w:numFmt w:val="lowerRoman"/>
+      <w:lvlText w:val="%3."/>
+      <w:lvlJc w:val="right"/>
+      <w:pPr>
+        <w:ind w:hanging="180" w:left="2880"/>
+      </w:pPr>
+    </w:lvl>
+    <w:lvl w:ilvl="3" w:tentative="1" w:tplc="0409000F">
+      <w:start w:val="1"/>
+      <w:numFmt w:val="decimal"/>
+      <w:lvlText w:val="%4."/>
+      <w:lvlJc w:val="left"/>
+      <w:pPr>
+        <w:ind w:hanging="360" w:left="3600"/>
+      </w:pPr>
+    </w:lvl>
+    <w:lvl w:ilvl="4" w:tentative="1" w:tplc="04090019">
+      <w:start w:val="1"/>
+      <w:numFmt w:val="lowerLetter"/>
+      <w:lvlText w:val="%5."/>
+      <w:lvlJc w:val="left"/>
+      <w:pPr>
+        <w:ind w:hanging="360" w:left="4320"/>
+      </w:pPr>
+    </w:lvl>
+    <w:lvl w:ilvl="5" w:tentative="1" w:tplc="0409001B">
+      <w:start w:val="1"/>
+      <w:numFmt w:val="lowerRoman"/>
+      <w:lvlText w:val="%6."/>
+      <w:lvlJc w:val="right"/>
+      <w:pPr>
+        <w:ind w:hanging="180" w:left="5040"/>
+      </w:pPr>
+    </w:lvl>
+    <w:lvl w:ilvl="6" w:tentative="1" w:tplc="0409000F">
+      <w:start w:val="1"/>
+      <w:numFmt w:val="decimal"/>
+      <w:lvlText w:val="%7."/>
+      <w:lvlJc w:val="left"/>
+      <w:pPr>
+        <w:ind w:hanging="360" w:left="5760"/>
+      </w:pPr>
+    </w:lvl>
+    <w:lvl w:ilvl="7" w:tentative="1" w:tplc="04090019">
+      <w:start w:val="1"/>
+      <w:numFmt w:val="lowerLetter"/>
+      <w:lvlText w:val="%8."/>
+      <w:lvlJc w:val="left"/>
+      <w:pPr>
+        <w:ind w:hanging="360" w:left="6480"/>
+      </w:pPr>
+    </w:lvl>
+    <w:lvl w:ilvl="8" w:tentative="1" w:tplc="0409001B">
+      <w:start w:val="1"/>
+      <w:numFmt w:val="lowerRoman"/>
+      <w:lvlText w:val="%9."/>
+      <w:lvlJc w:val="right"/>
+      <w:pPr>
+        <w:ind w:hanging="180" w:left="7200"/>
+      </w:pPr>
+    </w:lvl>
+  </w:abstractNum>
+  <w:abstractNum w15:restartNumberingAfterBreak="0" w:abstractNumId="9">
+    <w:nsid w:val="58393BF6"/>
+    <w:multiLevelType w:val="hybridMultilevel"/>
+    <w:tmpl w:val="F510ECE8"/>
+    <w:lvl w:ilvl="0" w:tplc="49DE5100">
+      <w:start w:val="1"/>
+      <w:numFmt w:val="decimal"/>
+      <w:lvlText w:val="%1."/>
+      <w:lvlJc w:val="left"/>
+      <w:pPr>
+        <w:ind w:hanging="360" w:left="1080"/>
+      </w:pPr>
+      <w:rPr>
+        <w:rFonts w:hint="default"/>
+      </w:rPr>
+    </w:lvl>
+    <w:lvl w:ilvl="1" w:tentative="1" w:tplc="04090019">
+      <w:start w:val="1"/>
+      <w:numFmt w:val="lowerLetter"/>
+      <w:lvlText w:val="%2."/>
+      <w:lvlJc w:val="left"/>
+      <w:pPr>
+        <w:ind w:hanging="360" w:left="1800"/>
+      </w:pPr>
+    </w:lvl>
+    <w:lvl w:ilvl="2" w:tentative="1" w:tplc="0409001B">
+      <w:start w:val="1"/>
+      <w:numFmt w:val="lowerRoman"/>
+      <w:lvlText w:val="%3."/>
+      <w:lvlJc w:val="right"/>
+      <w:pPr>
+        <w:ind w:hanging="180" w:left="2520"/>
+      </w:pPr>
+    </w:lvl>
+    <w:lvl w:ilvl="3" w:tentative="1" w:tplc="0409000F">
+      <w:start w:val="1"/>
+      <w:numFmt w:val="decimal"/>
+      <w:lvlText w:val="%4."/>
+      <w:lvlJc w:val="left"/>
+      <w:pPr>
+        <w:ind w:hanging="360" w:left="3240"/>
+      </w:pPr>
+    </w:lvl>
+    <w:lvl w:ilvl="4" w:tentative="1" w:tplc="04090019">
+      <w:start w:val="1"/>
+      <w:numFmt w:val="lowerLetter"/>
+      <w:lvlText w:val="%5."/>
+      <w:lvlJc w:val="left"/>
+      <w:pPr>
+        <w:ind w:hanging="360" w:left="3960"/>
+      </w:pPr>
+    </w:lvl>
+    <w:lvl w:ilvl="5" w:tentative="1" w:tplc="0409001B">
+      <w:start w:val="1"/>
+      <w:numFmt w:val="lowerRoman"/>
+      <w:lvlText w:val="%6."/>
+      <w:lvlJc w:val="right"/>
+      <w:pPr>
+        <w:ind w:hanging="180" w:left="4680"/>
+      </w:pPr>
+    </w:lvl>
+    <w:lvl w:ilvl="6" w:tentative="1" w:tplc="0409000F">
+      <w:start w:val="1"/>
+      <w:numFmt w:val="decimal"/>
+      <w:lvlText w:val="%7."/>
+      <w:lvlJc w:val="left"/>
+      <w:pPr>
+        <w:ind w:hanging="360" w:left="5400"/>
+      </w:pPr>
+    </w:lvl>
+    <w:lvl w:ilvl="7" w:tentative="1" w:tplc="04090019">
+      <w:start w:val="1"/>
+      <w:numFmt w:val="lowerLetter"/>
+      <w:lvlText w:val="%8."/>
+      <w:lvlJc w:val="left"/>
+      <w:pPr>
+        <w:ind w:hanging="360" w:left="6120"/>
+      </w:pPr>
+    </w:lvl>
+    <w:lvl w:ilvl="8" w:tentative="1" w:tplc="0409001B">
+      <w:start w:val="1"/>
+      <w:numFmt w:val="lowerRoman"/>
+      <w:lvlText w:val="%9."/>
+      <w:lvlJc w:val="right"/>
+      <w:pPr>
+        <w:ind w:hanging="180" w:left="6840"/>
+      </w:pPr>
+    </w:lvl>
+  </w:abstractNum>
+  <w:abstractNum w15:restartNumberingAfterBreak="0" w:abstractNumId="10">
+    <w:nsid w:val="64D46AC9"/>
+    <w:multiLevelType w:val="hybridMultilevel"/>
+    <w:tmpl w:val="88F00458"/>
+    <w:lvl w:ilvl="0" w:tplc="76484648">
+      <w:start w:val="1"/>
+      <w:numFmt w:val="decimal"/>
+      <w:lvlText w:val="%1."/>
+      <w:lvlJc w:val="left"/>
+      <w:pPr>
+        <w:ind w:hanging="360" w:left="1080"/>
+      </w:pPr>
+      <w:rPr>
+        <w:rFonts w:hint="default"/>
+      </w:rPr>
+    </w:lvl>
+    <w:lvl w:ilvl="1" w:tentative="1" w:tplc="04090019">
+      <w:start w:val="1"/>
+      <w:numFmt w:val="lowerLetter"/>
+      <w:lvlText w:val="%2."/>
+      <w:lvlJc w:val="left"/>
+      <w:pPr>
+        <w:ind w:hanging="360" w:left="1800"/>
+      </w:pPr>
+    </w:lvl>
+    <w:lvl w:ilvl="2" w:tentative="1" w:tplc="0409001B">
+      <w:start w:val="1"/>
+      <w:numFmt w:val="lowerRoman"/>
+      <w:lvlText w:val="%3."/>
+      <w:lvlJc w:val="right"/>
+      <w:pPr>
+        <w:ind w:hanging="180" w:left="2520"/>
+      </w:pPr>
+    </w:lvl>
+    <w:lvl w:ilvl="3" w:tentative="1" w:tplc="0409000F">
+      <w:start w:val="1"/>
+      <w:numFmt w:val="decimal"/>
+      <w:lvlText w:val="%4."/>
+      <w:lvlJc w:val="left"/>
+      <w:pPr>
+        <w:ind w:hanging="360" w:left="3240"/>
+      </w:pPr>
+    </w:lvl>
+    <w:lvl w:ilvl="4" w:tentative="1" w:tplc="04090019">
+      <w:start w:val="1"/>
+      <w:numFmt w:val="lowerLetter"/>
+      <w:lvlText w:val="%5."/>
+      <w:lvlJc w:val="left"/>
+      <w:pPr>
+        <w:ind w:hanging="360" w:left="3960"/>
+      </w:pPr>
+    </w:lvl>
+    <w:lvl w:ilvl="5" w:tentative="1" w:tplc="0409001B">
+      <w:start w:val="1"/>
+      <w:numFmt w:val="lowerRoman"/>
+      <w:lvlText w:val="%6."/>
+      <w:lvlJc w:val="right"/>
+      <w:pPr>
+        <w:ind w:hanging="180" w:left="4680"/>
+      </w:pPr>
+    </w:lvl>
+    <w:lvl w:ilvl="6" w:tentative="1" w:tplc="0409000F">
+      <w:start w:val="1"/>
+      <w:numFmt w:val="decimal"/>
+      <w:lvlText w:val="%7."/>
+      <w:lvlJc w:val="left"/>
+      <w:pPr>
+        <w:ind w:hanging="360" w:left="5400"/>
+      </w:pPr>
+    </w:lvl>
+    <w:lvl w:ilvl="7" w:tentative="1" w:tplc="04090019">
+      <w:start w:val="1"/>
+      <w:numFmt w:val="lowerLetter"/>
+      <w:lvlText w:val="%8."/>
+      <w:lvlJc w:val="left"/>
+      <w:pPr>
+        <w:ind w:hanging="360" w:left="6120"/>
+      </w:pPr>
+    </w:lvl>
+    <w:lvl w:ilvl="8" w:tentative="1" w:tplc="0409001B">
+      <w:start w:val="1"/>
+      <w:numFmt w:val="lowerRoman"/>
+      <w:lvlText w:val="%9."/>
+      <w:lvlJc w:val="right"/>
+      <w:pPr>
+        <w:ind w:hanging="180" w:left="6840"/>
+      </w:pPr>
+    </w:lvl>
+  </w:abstractNum>
+  <w:abstractNum w15:restartNumberingAfterBreak="0" w:abstractNumId="11">
+    <w:nsid w:val="69C575B6"/>
+    <w:multiLevelType w:val="hybridMultilevel"/>
+    <w:tmpl w:val="E1A29E1A"/>
+    <w:lvl w:ilvl="0" w:tplc="0409000F">
+      <w:start w:val="3"/>
+      <w:numFmt w:val="decimal"/>
+      <w:lvlText w:val="%1."/>
+      <w:lvlJc w:val="left"/>
+      <w:pPr>
+        <w:ind w:hanging="360" w:left="720"/>
+      </w:pPr>
+      <w:rPr>
+        <w:rFonts w:hint="default"/>
+      </w:rPr>
+    </w:lvl>
+    <w:lvl w:ilvl="1" w:tplc="04090019">
+      <w:start w:val="1"/>
+      <w:numFmt w:val="lowerLetter"/>
+      <w:lvlText w:val="%2."/>
+      <w:lvlJc w:val="left"/>
+      <w:pPr>
+        <w:ind w:hanging="360" w:left="1070"/>
+      </w:pPr>
+    </w:lvl>
+    <w:lvl w:ilvl="2" w:tentative="1" w:tplc="0409001B">
+      <w:start w:val="1"/>
+      <w:numFmt w:val="lowerRoman"/>
+      <w:lvlText w:val="%3."/>
+      <w:lvlJc w:val="right"/>
+      <w:pPr>
+        <w:ind w:hanging="180" w:left="2160"/>
+      </w:pPr>
+    </w:lvl>
+    <w:lvl w:ilvl="3" w:tentative="1" w:tplc="0409000F">
+      <w:start w:val="1"/>
+      <w:numFmt w:val="decimal"/>
+      <w:lvlText w:val="%4."/>
+      <w:lvlJc w:val="left"/>
+      <w:pPr>
+        <w:ind w:hanging="360" w:left="2880"/>
+      </w:pPr>
+    </w:lvl>
+    <w:lvl w:ilvl="4" w:tentative="1" w:tplc="04090019">
+      <w:start w:val="1"/>
+      <w:numFmt w:val="lowerLetter"/>
+      <w:lvlText w:val="%5."/>
+      <w:lvlJc w:val="left"/>
+      <w:pPr>
+        <w:ind w:hanging="360" w:left="3600"/>
+      </w:pPr>
+    </w:lvl>
+    <w:lvl w:ilvl="5" w:tentative="1" w:tplc="0409001B">
+      <w:start w:val="1"/>
+      <w:numFmt w:val="lowerRoman"/>
+      <w:lvlText w:val="%6."/>
+      <w:lvlJc w:val="right"/>
+      <w:pPr>
+        <w:ind w:hanging="180" w:left="4320"/>
+      </w:pPr>
+    </w:lvl>
+    <w:lvl w:ilvl="6" w:tentative="1" w:tplc="0409000F">
+      <w:start w:val="1"/>
+      <w:numFmt w:val="decimal"/>
+      <w:lvlText w:val="%7."/>
+      <w:lvlJc w:val="left"/>
+      <w:pPr>
+        <w:ind w:hanging="360" w:left="5040"/>
+      </w:pPr>
+    </w:lvl>
+    <w:lvl w:ilvl="7" w:tentative="1" w:tplc="04090019">
+      <w:start w:val="1"/>
+      <w:numFmt w:val="lowerLetter"/>
+      <w:lvlText w:val="%8."/>
+      <w:lvlJc w:val="left"/>
+      <w:pPr>
+        <w:ind w:hanging="360" w:left="5760"/>
+      </w:pPr>
+    </w:lvl>
+    <w:lvl w:ilvl="8" w:tentative="1" w:tplc="0409001B">
+      <w:start w:val="1"/>
+      <w:numFmt w:val="lowerRoman"/>
+      <w:lvlText w:val="%9."/>
+      <w:lvlJc w:val="right"/>
+      <w:pPr>
+        <w:ind w:hanging="180" w:left="6480"/>
+      </w:pPr>
+    </w:lvl>
+  </w:abstractNum>
+  <w:abstractNum w15:restartNumberingAfterBreak="0" w:abstractNumId="12">
+    <w:nsid w:val="74E1364F"/>
+    <w:multiLevelType w:val="multilevel"/>
+    <w:tmpl w:val="75607B84"/>
+    <w:lvl w:ilvl="0">
+      <w:start w:val="3"/>
+      <w:numFmt w:val="decimal"/>
+      <w:lvlText w:val="%1"/>
+      <w:lvlJc w:val="left"/>
+      <w:pPr>
+        <w:ind w:hanging="360" w:left="360"/>
+      </w:pPr>
+      <w:rPr>
+        <w:rFonts w:hint="default"/>
+      </w:rPr>
+    </w:lvl>
+    <w:lvl w:ilvl="1">
+      <w:start w:val="1"/>
+      <w:numFmt w:val="decimal"/>
+      <w:lvlText w:val="%1.%2"/>
+      <w:lvlJc w:val="left"/>
+      <w:pPr>
+        <w:ind w:hanging="720" w:left="720"/>
+      </w:pPr>
+      <w:rPr>
+        <w:rFonts w:hint="default"/>
+      </w:rPr>
+    </w:lvl>
+    <w:lvl w:ilvl="2">
+      <w:start w:val="1"/>
+      <w:numFmt w:val="decimal"/>
+      <w:lvlText w:val="%1.%2.%3"/>
+      <w:lvlJc w:val="left"/>
+      <w:pPr>
+        <w:ind w:hanging="720" w:left="720"/>
+      </w:pPr>
+      <w:rPr>
+        <w:rFonts w:hint="default"/>
+      </w:rPr>
+    </w:lvl>
+    <w:lvl w:ilvl="3">
+      <w:start w:val="1"/>
+      <w:numFmt w:val="decimal"/>
+      <w:lvlText w:val="%1.%2.%3.%4"/>
+      <w:lvlJc w:val="left"/>
+      <w:pPr>
+        <w:ind w:hanging="1080" w:left="1080"/>
+      </w:pPr>
+      <w:rPr>
+        <w:rFonts w:hint="default"/>
+      </w:rPr>
+    </w:lvl>
+    <w:lvl w:ilvl="4">
+      <w:start w:val="1"/>
+      <w:numFmt w:val="decimal"/>
+      <w:lvlText w:val="%1.%2.%3.%4.%5"/>
+      <w:lvlJc w:val="left"/>
+      <w:pPr>
+        <w:ind w:hanging="1440" w:left="1440"/>
+      </w:pPr>
+      <w:rPr>
+        <w:rFonts w:hint="default"/>
+      </w:rPr>
+    </w:lvl>
+    <w:lvl w:ilvl="5">
+      <w:start w:val="1"/>
+      <w:numFmt w:val="decimal"/>
+      <w:lvlText w:val="%1.%2.%3.%4.%5.%6"/>
+      <w:lvlJc w:val="left"/>
+      <w:pPr>
+        <w:ind w:hanging="1440" w:left="1440"/>
+      </w:pPr>
+      <w:rPr>
+        <w:rFonts w:hint="default"/>
+      </w:rPr>
+    </w:lvl>
+    <w:lvl w:ilvl="6">
+      <w:start w:val="1"/>
+      <w:numFmt w:val="decimal"/>
+      <w:lvlText w:val="%1.%2.%3.%4.%5.%6.%7"/>
+      <w:lvlJc w:val="left"/>
+      <w:pPr>
+        <w:ind w:hanging="1800" w:left="1800"/>
+      </w:pPr>
+      <w:rPr>
+        <w:rFonts w:hint="default"/>
+      </w:rPr>
+    </w:lvl>
+    <w:lvl w:ilvl="7">
+      <w:start w:val="1"/>
+      <w:numFmt w:val="decimal"/>
+      <w:lvlText w:val="%1.%2.%3.%4.%5.%6.%7.%8"/>
+      <w:lvlJc w:val="left"/>
+      <w:pPr>
+        <w:ind w:hanging="2160" w:left="2160"/>
+      </w:pPr>
+      <w:rPr>
+        <w:rFonts w:hint="default"/>
+      </w:rPr>
+    </w:lvl>
+    <w:lvl w:ilvl="8">
+      <w:start w:val="1"/>
+      <w:numFmt w:val="decimal"/>
+      <w:lvlText w:val="%1.%2.%3.%4.%5.%6.%7.%8.%9"/>
+      <w:lvlJc w:val="left"/>
+      <w:pPr>
+        <w:ind w:hanging="2160" w:left="2160"/>
+      </w:pPr>
+      <w:rPr>
+        <w:rFonts w:hint="default"/>
+      </w:rPr>
+    </w:lvl>
+  </w:abstractNum>
   <w:abstractNum w:abstractNumId="990">
     <w:nsid w:val="0000A990"/>
     <w:multiLevelType w:val="multilevel"/>
@@ -3315,6 +4655,45 @@
       </w:pPr>
     </w:lvl>
   </w:abstractNum>
+  <w:num w16cid:durableId="396905614" w:numId="1">
+    <w:abstractNumId w:val="5"/>
+  </w:num>
+  <w:num w16cid:durableId="850878396" w:numId="2">
+    <w:abstractNumId w:val="6"/>
+  </w:num>
+  <w:num w16cid:durableId="1384525106" w:numId="3">
+    <w:abstractNumId w:val="10"/>
+  </w:num>
+  <w:num w16cid:durableId="1855612367" w:numId="4">
+    <w:abstractNumId w:val="8"/>
+  </w:num>
+  <w:num w16cid:durableId="1550679377" w:numId="5">
+    <w:abstractNumId w:val="1"/>
+  </w:num>
+  <w:num w16cid:durableId="1741292464" w:numId="6">
+    <w:abstractNumId w:val="3"/>
+  </w:num>
+  <w:num w16cid:durableId="1753505878" w:numId="7">
+    <w:abstractNumId w:val="12"/>
+  </w:num>
+  <w:num w16cid:durableId="237598308" w:numId="8">
+    <w:abstractNumId w:val="9"/>
+  </w:num>
+  <w:num w16cid:durableId="1265385061" w:numId="9">
+    <w:abstractNumId w:val="11"/>
+  </w:num>
+  <w:num w16cid:durableId="1860123542" w:numId="10">
+    <w:abstractNumId w:val="4"/>
+  </w:num>
+  <w:num w16cid:durableId="2088645435" w:numId="11">
+    <w:abstractNumId w:val="7"/>
+  </w:num>
+  <w:num w16cid:durableId="904797294" w:numId="12">
+    <w:abstractNumId w:val="2"/>
+  </w:num>
+  <w:num w16cid:durableId="1384599588" w:numId="13">
+    <w:abstractNumId w:val="0"/>
+  </w:num>
   <w:num w:numId="1000">
     <w:abstractNumId w:val="990"/>
   </w:num>
@@ -3364,544 +4743,476 @@
 </file>
 
 <file path=word/styles.xml><?xml version="1.0" encoding="utf-8"?>
-<w:styles xmlns:r="http://schemas.openxmlformats.org/officeDocument/2006/relationships" xmlns:w="http://schemas.openxmlformats.org/wordprocessingml/2006/main">
+<w:styles xmlns:mc="http://schemas.openxmlformats.org/markup-compatibility/2006" xmlns:r="http://schemas.openxmlformats.org/officeDocument/2006/relationships" xmlns:w="http://schemas.openxmlformats.org/wordprocessingml/2006/main" xmlns:w14="http://schemas.microsoft.com/office/word/2010/wordml" xmlns:w15="http://schemas.microsoft.com/office/word/2012/wordml" xmlns:w16="http://schemas.microsoft.com/office/word/2018/wordml" xmlns:w16cex="http://schemas.microsoft.com/office/word/2018/wordml/cex" xmlns:w16cid="http://schemas.microsoft.com/office/word/2016/wordml/cid" xmlns:w16du="http://schemas.microsoft.com/office/word/2023/wordml/word16du" xmlns:w16sdtdh="http://schemas.microsoft.com/office/word/2020/wordml/sdtdatahash" xmlns:w16sdtfl="http://schemas.microsoft.com/office/word/2024/wordml/sdtformatlock" xmlns:w16se="http://schemas.microsoft.com/office/word/2015/wordml/symex" mc:Ignorable="w14 w15 w16se w16cid w16 w16cex w16sdtdh w16sdtfl w16du">
   <w:docDefaults>
     <w:rPrDefault>
       <w:rPr>
-        <w:rFonts w:asciiTheme="minorHAnsi" w:cstheme="minorBidi" w:eastAsiaTheme="minorEastAsia" w:hAnsiTheme="minorHAnsi"/>
+        <w:rFonts w:asciiTheme="minorHAnsi" w:cstheme="minorBidi" w:eastAsiaTheme="minorHAnsi" w:hAnsiTheme="minorHAnsi"/>
         <w:sz w:val="24"/>
         <w:szCs w:val="24"/>
-        <w:lang w:bidi="ar-SA" w:eastAsia="zh-CN" w:val="en-US"/>
+        <w:lang w:bidi="ar-SA" w:eastAsia="en-US" w:val="en-GB"/>
       </w:rPr>
     </w:rPrDefault>
-    <w:pPrDefault>
-      <w:pPr>
-        <w:spacing w:after="200"/>
-      </w:pPr>
-    </w:pPrDefault>
+    <w:pPrDefault/>
   </w:docDefaults>
-  <w:latentStyles w:count="276" w:defLockedState="0" w:defQFormat="0" w:defSemiHidden="0" w:defUIPriority="0" w:defUnhideWhenUsed="0"/>
+  <w:latentStyles w:count="376" w:defLockedState="0" w:defQFormat="0" w:defSemiHidden="0" w:defUIPriority="99" w:defUnhideWhenUsed="0">
+    <w:lsdException w:name="Normal" w:qFormat="1" w:uiPriority="0"/>
+    <w:lsdException w:name="heading 1" w:qFormat="1" w:uiPriority="9"/>
+    <w:lsdException w:name="heading 2" w:qFormat="1" w:semiHidden="1" w:uiPriority="9" w:unhideWhenUsed="1"/>
+    <w:lsdException w:name="heading 3" w:qFormat="1" w:semiHidden="1" w:uiPriority="9" w:unhideWhenUsed="1"/>
+    <w:lsdException w:name="heading 4" w:qFormat="1" w:semiHidden="1" w:uiPriority="9" w:unhideWhenUsed="1"/>
+    <w:lsdException w:name="heading 5" w:qFormat="1" w:semiHidden="1" w:uiPriority="9" w:unhideWhenUsed="1"/>
+    <w:lsdException w:name="heading 6" w:qFormat="1" w:semiHidden="1" w:uiPriority="9" w:unhideWhenUsed="1"/>
+    <w:lsdException w:name="heading 7" w:qFormat="1" w:semiHidden="1" w:uiPriority="9" w:unhideWhenUsed="1"/>
+    <w:lsdException w:name="heading 8" w:qFormat="1" w:semiHidden="1" w:uiPriority="9" w:unhideWhenUsed="1"/>
+    <w:lsdException w:name="heading 9" w:qFormat="1" w:semiHidden="1" w:uiPriority="9" w:unhideWhenUsed="1"/>
+    <w:lsdException w:name="index 1" w:semiHidden="1" w:unhideWhenUsed="1"/>
+    <w:lsdException w:name="index 2" w:semiHidden="1" w:unhideWhenUsed="1"/>
+    <w:lsdException w:name="index 3" w:semiHidden="1" w:unhideWhenUsed="1"/>
+    <w:lsdException w:name="index 4" w:semiHidden="1" w:unhideWhenUsed="1"/>
+    <w:lsdException w:name="index 5" w:semiHidden="1" w:unhideWhenUsed="1"/>
+    <w:lsdException w:name="index 6" w:semiHidden="1" w:unhideWhenUsed="1"/>
+    <w:lsdException w:name="index 7" w:semiHidden="1" w:unhideWhenUsed="1"/>
+    <w:lsdException w:name="index 8" w:semiHidden="1" w:unhideWhenUsed="1"/>
+    <w:lsdException w:name="index 9" w:semiHidden="1" w:unhideWhenUsed="1"/>
+    <w:lsdException w:name="toc 1" w:semiHidden="1" w:uiPriority="39" w:unhideWhenUsed="1"/>
+    <w:lsdException w:name="toc 2" w:semiHidden="1" w:uiPriority="39" w:unhideWhenUsed="1"/>
+    <w:lsdException w:name="toc 3" w:semiHidden="1" w:uiPriority="39" w:unhideWhenUsed="1"/>
+    <w:lsdException w:name="toc 4" w:semiHidden="1" w:uiPriority="39" w:unhideWhenUsed="1"/>
+    <w:lsdException w:name="toc 5" w:semiHidden="1" w:uiPriority="39" w:unhideWhenUsed="1"/>
+    <w:lsdException w:name="toc 6" w:semiHidden="1" w:uiPriority="39" w:unhideWhenUsed="1"/>
+    <w:lsdException w:name="toc 7" w:semiHidden="1" w:uiPriority="39" w:unhideWhenUsed="1"/>
+    <w:lsdException w:name="toc 8" w:semiHidden="1" w:uiPriority="39" w:unhideWhenUsed="1"/>
+    <w:lsdException w:name="toc 9" w:semiHidden="1" w:uiPriority="39" w:unhideWhenUsed="1"/>
+    <w:lsdException w:name="Normal Indent" w:semiHidden="1" w:unhideWhenUsed="1"/>
+    <w:lsdException w:name="footnote text" w:semiHidden="1" w:unhideWhenUsed="1"/>
+    <w:lsdException w:name="annotation text" w:semiHidden="1" w:unhideWhenUsed="1"/>
+    <w:lsdException w:name="header" w:semiHidden="1" w:unhideWhenUsed="1"/>
+    <w:lsdException w:name="footer" w:semiHidden="1" w:unhideWhenUsed="1"/>
+    <w:lsdException w:name="index heading" w:semiHidden="1" w:unhideWhenUsed="1"/>
+    <w:lsdException w:name="caption" w:qFormat="1" w:semiHidden="1" w:uiPriority="35" w:unhideWhenUsed="1"/>
+    <w:lsdException w:name="table of figures" w:semiHidden="1" w:unhideWhenUsed="1"/>
+    <w:lsdException w:name="envelope address" w:semiHidden="1" w:unhideWhenUsed="1"/>
+    <w:lsdException w:name="envelope return" w:semiHidden="1" w:unhideWhenUsed="1"/>
+    <w:lsdException w:name="footnote reference" w:semiHidden="1" w:unhideWhenUsed="1"/>
+    <w:lsdException w:name="annotation reference" w:semiHidden="1" w:unhideWhenUsed="1"/>
+    <w:lsdException w:name="line number" w:semiHidden="1" w:unhideWhenUsed="1"/>
+    <w:lsdException w:name="page number" w:semiHidden="1" w:unhideWhenUsed="1"/>
+    <w:lsdException w:name="endnote reference" w:semiHidden="1" w:unhideWhenUsed="1"/>
+    <w:lsdException w:name="endnote text" w:semiHidden="1" w:unhideWhenUsed="1"/>
+    <w:lsdException w:name="table of authorities" w:semiHidden="1" w:unhideWhenUsed="1"/>
+    <w:lsdException w:name="macro" w:semiHidden="1" w:unhideWhenUsed="1"/>
+    <w:lsdException w:name="toa heading" w:semiHidden="1" w:unhideWhenUsed="1"/>
+    <w:lsdException w:name="List" w:semiHidden="1" w:unhideWhenUsed="1"/>
+    <w:lsdException w:name="List Bullet" w:semiHidden="1" w:unhideWhenUsed="1"/>
+    <w:lsdException w:name="List Number" w:semiHidden="1" w:unhideWhenUsed="1"/>
+    <w:lsdException w:name="List 2" w:semiHidden="1" w:unhideWhenUsed="1"/>
+    <w:lsdException w:name="List 3" w:semiHidden="1" w:unhideWhenUsed="1"/>
+    <w:lsdException w:name="List 4" w:semiHidden="1" w:unhideWhenUsed="1"/>
+    <w:lsdException w:name="List 5" w:semiHidden="1" w:unhideWhenUsed="1"/>
+    <w:lsdException w:name="List Bullet 2" w:semiHidden="1" w:unhideWhenUsed="1"/>
+    <w:lsdException w:name="List Bullet 3" w:semiHidden="1" w:unhideWhenUsed="1"/>
+    <w:lsdException w:name="List Bullet 4" w:semiHidden="1" w:unhideWhenUsed="1"/>
+    <w:lsdException w:name="List Bullet 5" w:semiHidden="1" w:unhideWhenUsed="1"/>
+    <w:lsdException w:name="List Number 2" w:semiHidden="1" w:unhideWhenUsed="1"/>
+    <w:lsdException w:name="List Number 3" w:semiHidden="1" w:unhideWhenUsed="1"/>
+    <w:lsdException w:name="List Number 4" w:semiHidden="1" w:unhideWhenUsed="1"/>
+    <w:lsdException w:name="List Number 5" w:semiHidden="1" w:unhideWhenUsed="1"/>
+    <w:lsdException w:name="Title" w:qFormat="1" w:uiPriority="10"/>
+    <w:lsdException w:name="Closing" w:semiHidden="1" w:unhideWhenUsed="1"/>
+    <w:lsdException w:name="Signature" w:semiHidden="1" w:unhideWhenUsed="1"/>
+    <w:lsdException w:name="Default Paragraph Font" w:semiHidden="1" w:uiPriority="1" w:unhideWhenUsed="1"/>
+    <w:lsdException w:name="Body Text" w:semiHidden="1" w:unhideWhenUsed="1"/>
+    <w:lsdException w:name="Body Text Indent" w:semiHidden="1" w:unhideWhenUsed="1"/>
+    <w:lsdException w:name="List Continue" w:semiHidden="1" w:unhideWhenUsed="1"/>
+    <w:lsdException w:name="List Continue 2" w:semiHidden="1" w:unhideWhenUsed="1"/>
+    <w:lsdException w:name="List Continue 3" w:semiHidden="1" w:unhideWhenUsed="1"/>
+    <w:lsdException w:name="List Continue 4" w:semiHidden="1" w:unhideWhenUsed="1"/>
+    <w:lsdException w:name="List Continue 5" w:semiHidden="1" w:unhideWhenUsed="1"/>
+    <w:lsdException w:name="Message Header" w:semiHidden="1" w:unhideWhenUsed="1"/>
+    <w:lsdException w:name="Subtitle" w:qFormat="1" w:uiPriority="11"/>
+    <w:lsdException w:name="Salutation" w:semiHidden="1" w:unhideWhenUsed="1"/>
+    <w:lsdException w:name="Date" w:semiHidden="1" w:unhideWhenUsed="1"/>
+    <w:lsdException w:name="Body Text First Indent" w:semiHidden="1" w:unhideWhenUsed="1"/>
+    <w:lsdException w:name="Body Text First Indent 2" w:semiHidden="1" w:unhideWhenUsed="1"/>
+    <w:lsdException w:name="Note Heading" w:semiHidden="1" w:unhideWhenUsed="1"/>
+    <w:lsdException w:name="Body Text 2" w:semiHidden="1" w:unhideWhenUsed="1"/>
+    <w:lsdException w:name="Body Text 3" w:semiHidden="1" w:unhideWhenUsed="1"/>
+    <w:lsdException w:name="Body Text Indent 2" w:semiHidden="1" w:unhideWhenUsed="1"/>
+    <w:lsdException w:name="Body Text Indent 3" w:semiHidden="1" w:unhideWhenUsed="1"/>
+    <w:lsdException w:name="Block Text" w:semiHidden="1" w:unhideWhenUsed="1"/>
+    <w:lsdException w:name="Hyperlink" w:semiHidden="1" w:unhideWhenUsed="1"/>
+    <w:lsdException w:name="FollowedHyperlink" w:semiHidden="1" w:unhideWhenUsed="1"/>
+    <w:lsdException w:name="Strong" w:qFormat="1" w:uiPriority="22"/>
+    <w:lsdException w:name="Emphasis" w:qFormat="1" w:uiPriority="20"/>
+    <w:lsdException w:name="Document Map" w:semiHidden="1" w:unhideWhenUsed="1"/>
+    <w:lsdException w:name="Plain Text" w:semiHidden="1" w:unhideWhenUsed="1"/>
+    <w:lsdException w:name="E-mail Signature" w:semiHidden="1" w:unhideWhenUsed="1"/>
+    <w:lsdException w:name="HTML Top of Form" w:semiHidden="1" w:unhideWhenUsed="1"/>
+    <w:lsdException w:name="HTML Bottom of Form" w:semiHidden="1" w:unhideWhenUsed="1"/>
+    <w:lsdException w:name="Normal (Web)" w:semiHidden="1" w:unhideWhenUsed="1"/>
+    <w:lsdException w:name="HTML Acronym" w:semiHidden="1" w:unhideWhenUsed="1"/>
+    <w:lsdException w:name="HTML Address" w:semiHidden="1" w:unhideWhenUsed="1"/>
+    <w:lsdException w:name="HTML Cite" w:semiHidden="1" w:unhideWhenUsed="1"/>
+    <w:lsdException w:name="HTML Code" w:semiHidden="1" w:unhideWhenUsed="1"/>
+    <w:lsdException w:name="HTML Definition" w:semiHidden="1" w:unhideWhenUsed="1"/>
+    <w:lsdException w:name="HTML Keyboard" w:semiHidden="1" w:unhideWhenUsed="1"/>
+    <w:lsdException w:name="HTML Preformatted" w:semiHidden="1" w:unhideWhenUsed="1"/>
+    <w:lsdException w:name="HTML Sample" w:semiHidden="1" w:unhideWhenUsed="1"/>
+    <w:lsdException w:name="HTML Typewriter" w:semiHidden="1" w:unhideWhenUsed="1"/>
+    <w:lsdException w:name="HTML Variable" w:semiHidden="1" w:unhideWhenUsed="1"/>
+    <w:lsdException w:name="Normal Table" w:semiHidden="1" w:unhideWhenUsed="1"/>
+    <w:lsdException w:name="annotation subject" w:semiHidden="1" w:unhideWhenUsed="1"/>
+    <w:lsdException w:name="No List" w:semiHidden="1" w:unhideWhenUsed="1"/>
+    <w:lsdException w:name="Outline List 1" w:semiHidden="1" w:unhideWhenUsed="1"/>
+    <w:lsdException w:name="Outline List 2" w:semiHidden="1" w:unhideWhenUsed="1"/>
+    <w:lsdException w:name="Outline List 3" w:semiHidden="1" w:unhideWhenUsed="1"/>
+    <w:lsdException w:name="Table Simple 1" w:semiHidden="1" w:unhideWhenUsed="1"/>
+    <w:lsdException w:name="Table Simple 2" w:semiHidden="1" w:unhideWhenUsed="1"/>
+    <w:lsdException w:name="Table Simple 3" w:semiHidden="1" w:unhideWhenUsed="1"/>
+    <w:lsdException w:name="Table Classic 1" w:semiHidden="1" w:unhideWhenUsed="1"/>
+    <w:lsdException w:name="Table Classic 2" w:semiHidden="1" w:unhideWhenUsed="1"/>
+    <w:lsdException w:name="Table Classic 3" w:semiHidden="1" w:unhideWhenUsed="1"/>
+    <w:lsdException w:name="Table Classic 4" w:semiHidden="1" w:unhideWhenUsed="1"/>
+    <w:lsdException w:name="Table Colorful 1" w:semiHidden="1" w:unhideWhenUsed="1"/>
+    <w:lsdException w:name="Table Colorful 2" w:semiHidden="1" w:unhideWhenUsed="1"/>
+    <w:lsdException w:name="Table Colorful 3" w:semiHidden="1" w:unhideWhenUsed="1"/>
+    <w:lsdException w:name="Table Columns 1" w:semiHidden="1" w:unhideWhenUsed="1"/>
+    <w:lsdException w:name="Table Columns 2" w:semiHidden="1" w:unhideWhenUsed="1"/>
+    <w:lsdException w:name="Table Columns 3" w:semiHidden="1" w:unhideWhenUsed="1"/>
+    <w:lsdException w:name="Table Columns 4" w:semiHidden="1" w:unhideWhenUsed="1"/>
+    <w:lsdException w:name="Table Columns 5" w:semiHidden="1" w:unhideWhenUsed="1"/>
+    <w:lsdException w:name="Table Grid 1" w:semiHidden="1" w:unhideWhenUsed="1"/>
+    <w:lsdException w:name="Table Grid 2" w:semiHidden="1" w:unhideWhenUsed="1"/>
+    <w:lsdException w:name="Table Grid 3" w:semiHidden="1" w:unhideWhenUsed="1"/>
+    <w:lsdException w:name="Table Grid 4" w:semiHidden="1" w:unhideWhenUsed="1"/>
+    <w:lsdException w:name="Table Grid 5" w:semiHidden="1" w:unhideWhenUsed="1"/>
+    <w:lsdException w:name="Table Grid 6" w:semiHidden="1" w:unhideWhenUsed="1"/>
+    <w:lsdException w:name="Table Grid 7" w:semiHidden="1" w:unhideWhenUsed="1"/>
+    <w:lsdException w:name="Table Grid 8" w:semiHidden="1" w:unhideWhenUsed="1"/>
+    <w:lsdException w:name="Table List 1" w:semiHidden="1" w:unhideWhenUsed="1"/>
+    <w:lsdException w:name="Table List 2" w:semiHidden="1" w:unhideWhenUsed="1"/>
+    <w:lsdException w:name="Table List 3" w:semiHidden="1" w:unhideWhenUsed="1"/>
+    <w:lsdException w:name="Table List 4" w:semiHidden="1" w:unhideWhenUsed="1"/>
+    <w:lsdException w:name="Table List 5" w:semiHidden="1" w:unhideWhenUsed="1"/>
+    <w:lsdException w:name="Table List 6" w:semiHidden="1" w:unhideWhenUsed="1"/>
+    <w:lsdException w:name="Table List 7" w:semiHidden="1" w:unhideWhenUsed="1"/>
+    <w:lsdException w:name="Table List 8" w:semiHidden="1" w:unhideWhenUsed="1"/>
+    <w:lsdException w:name="Table 3D effects 1" w:semiHidden="1" w:unhideWhenUsed="1"/>
+    <w:lsdException w:name="Table 3D effects 2" w:semiHidden="1" w:unhideWhenUsed="1"/>
+    <w:lsdException w:name="Table 3D effects 3" w:semiHidden="1" w:unhideWhenUsed="1"/>
+    <w:lsdException w:name="Table Contemporary" w:semiHidden="1" w:unhideWhenUsed="1"/>
+    <w:lsdException w:name="Table Elegant" w:semiHidden="1" w:unhideWhenUsed="1"/>
+    <w:lsdException w:name="Table Professional" w:semiHidden="1" w:unhideWhenUsed="1"/>
+    <w:lsdException w:name="Table Subtle 1" w:semiHidden="1" w:unhideWhenUsed="1"/>
+    <w:lsdException w:name="Table Subtle 2" w:semiHidden="1" w:unhideWhenUsed="1"/>
+    <w:lsdException w:name="Table Web 1" w:semiHidden="1" w:unhideWhenUsed="1"/>
+    <w:lsdException w:name="Table Web 2" w:semiHidden="1" w:unhideWhenUsed="1"/>
+    <w:lsdException w:name="Table Web 3" w:semiHidden="1" w:unhideWhenUsed="1"/>
+    <w:lsdException w:name="Balloon Text" w:semiHidden="1" w:unhideWhenUsed="1"/>
+    <w:lsdException w:name="Table Grid" w:uiPriority="39"/>
+    <w:lsdException w:name="Table Theme" w:semiHidden="1" w:unhideWhenUsed="1"/>
+    <w:lsdException w:name="Placeholder Text" w:semiHidden="1"/>
+    <w:lsdException w:name="No Spacing" w:qFormat="1" w:uiPriority="1"/>
+    <w:lsdException w:name="Light Shading" w:uiPriority="60"/>
+    <w:lsdException w:name="Light List" w:uiPriority="61"/>
+    <w:lsdException w:name="Light Grid" w:uiPriority="62"/>
+    <w:lsdException w:name="Medium Shading 1" w:uiPriority="63"/>
+    <w:lsdException w:name="Medium Shading 2" w:uiPriority="64"/>
+    <w:lsdException w:name="Medium List 1" w:uiPriority="65"/>
+    <w:lsdException w:name="Medium List 2" w:uiPriority="66"/>
+    <w:lsdException w:name="Medium Grid 1" w:uiPriority="67"/>
+    <w:lsdException w:name="Medium Grid 2" w:uiPriority="68"/>
+    <w:lsdException w:name="Medium Grid 3" w:uiPriority="69"/>
+    <w:lsdException w:name="Dark List" w:uiPriority="70"/>
+    <w:lsdException w:name="Colorful Shading" w:uiPriority="71"/>
+    <w:lsdException w:name="Colorful List" w:uiPriority="72"/>
+    <w:lsdException w:name="Colorful Grid" w:uiPriority="73"/>
+    <w:lsdException w:name="Light Shading Accent 1" w:uiPriority="60"/>
+    <w:lsdException w:name="Light List Accent 1" w:uiPriority="61"/>
+    <w:lsdException w:name="Light Grid Accent 1" w:uiPriority="62"/>
+    <w:lsdException w:name="Medium Shading 1 Accent 1" w:uiPriority="63"/>
+    <w:lsdException w:name="Medium Shading 2 Accent 1" w:uiPriority="64"/>
+    <w:lsdException w:name="Medium List 1 Accent 1" w:uiPriority="65"/>
+    <w:lsdException w:name="Revision" w:semiHidden="1"/>
+    <w:lsdException w:name="List Paragraph" w:qFormat="1" w:uiPriority="34"/>
+    <w:lsdException w:name="Quote" w:qFormat="1" w:uiPriority="29"/>
+    <w:lsdException w:name="Intense Quote" w:qFormat="1" w:uiPriority="30"/>
+    <w:lsdException w:name="Medium List 2 Accent 1" w:uiPriority="66"/>
+    <w:lsdException w:name="Medium Grid 1 Accent 1" w:uiPriority="67"/>
+    <w:lsdException w:name="Medium Grid 2 Accent 1" w:uiPriority="68"/>
+    <w:lsdException w:name="Medium Grid 3 Accent 1" w:uiPriority="69"/>
+    <w:lsdException w:name="Dark List Accent 1" w:uiPriority="70"/>
+    <w:lsdException w:name="Colorful Shading Accent 1" w:uiPriority="71"/>
+    <w:lsdException w:name="Colorful List Accent 1" w:uiPriority="72"/>
+    <w:lsdException w:name="Colorful Grid Accent 1" w:uiPriority="73"/>
+    <w:lsdException w:name="Light Shading Accent 2" w:uiPriority="60"/>
+    <w:lsdException w:name="Light List Accent 2" w:uiPriority="61"/>
+    <w:lsdException w:name="Light Grid Accent 2" w:uiPriority="62"/>
+    <w:lsdException w:name="Medium Shading 1 Accent 2" w:uiPriority="63"/>
+    <w:lsdException w:name="Medium Shading 2 Accent 2" w:uiPriority="64"/>
+    <w:lsdException w:name="Medium List 1 Accent 2" w:uiPriority="65"/>
+    <w:lsdException w:name="Medium List 2 Accent 2" w:uiPriority="66"/>
+    <w:lsdException w:name="Medium Grid 1 Accent 2" w:uiPriority="67"/>
+    <w:lsdException w:name="Medium Grid 2 Accent 2" w:uiPriority="68"/>
+    <w:lsdException w:name="Medium Grid 3 Accent 2" w:uiPriority="69"/>
+    <w:lsdException w:name="Dark List Accent 2" w:uiPriority="70"/>
+    <w:lsdException w:name="Colorful Shading Accent 2" w:uiPriority="71"/>
+    <w:lsdException w:name="Colorful List Accent 2" w:uiPriority="72"/>
+    <w:lsdException w:name="Colorful Grid Accent 2" w:uiPriority="73"/>
+    <w:lsdException w:name="Light Shading Accent 3" w:uiPriority="60"/>
+    <w:lsdException w:name="Light List Accent 3" w:uiPriority="61"/>
+    <w:lsdException w:name="Light Grid Accent 3" w:uiPriority="62"/>
+    <w:lsdException w:name="Medium Shading 1 Accent 3" w:uiPriority="63"/>
+    <w:lsdException w:name="Medium Shading 2 Accent 3" w:uiPriority="64"/>
+    <w:lsdException w:name="Medium List 1 Accent 3" w:uiPriority="65"/>
+    <w:lsdException w:name="Medium List 2 Accent 3" w:uiPriority="66"/>
+    <w:lsdException w:name="Medium Grid 1 Accent 3" w:uiPriority="67"/>
+    <w:lsdException w:name="Medium Grid 2 Accent 3" w:uiPriority="68"/>
+    <w:lsdException w:name="Medium Grid 3 Accent 3" w:uiPriority="69"/>
+    <w:lsdException w:name="Dark List Accent 3" w:uiPriority="70"/>
+    <w:lsdException w:name="Colorful Shading Accent 3" w:uiPriority="71"/>
+    <w:lsdException w:name="Colorful List Accent 3" w:uiPriority="72"/>
+    <w:lsdException w:name="Colorful Grid Accent 3" w:uiPriority="73"/>
+    <w:lsdException w:name="Light Shading Accent 4" w:uiPriority="60"/>
+    <w:lsdException w:name="Light List Accent 4" w:uiPriority="61"/>
+    <w:lsdException w:name="Light Grid Accent 4" w:uiPriority="62"/>
+    <w:lsdException w:name="Medium Shading 1 Accent 4" w:uiPriority="63"/>
+    <w:lsdException w:name="Medium Shading 2 Accent 4" w:uiPriority="64"/>
+    <w:lsdException w:name="Medium List 1 Accent 4" w:uiPriority="65"/>
+    <w:lsdException w:name="Medium List 2 Accent 4" w:uiPriority="66"/>
+    <w:lsdException w:name="Medium Grid 1 Accent 4" w:uiPriority="67"/>
+    <w:lsdException w:name="Medium Grid 2 Accent 4" w:uiPriority="68"/>
+    <w:lsdException w:name="Medium Grid 3 Accent 4" w:uiPriority="69"/>
+    <w:lsdException w:name="Dark List Accent 4" w:uiPriority="70"/>
+    <w:lsdException w:name="Colorful Shading Accent 4" w:uiPriority="71"/>
+    <w:lsdException w:name="Colorful List Accent 4" w:uiPriority="72"/>
+    <w:lsdException w:name="Colorful Grid Accent 4" w:uiPriority="73"/>
+    <w:lsdException w:name="Light Shading Accent 5" w:uiPriority="60"/>
+    <w:lsdException w:name="Light List Accent 5" w:uiPriority="61"/>
+    <w:lsdException w:name="Light Grid Accent 5" w:uiPriority="62"/>
+    <w:lsdException w:name="Medium Shading 1 Accent 5" w:uiPriority="63"/>
+    <w:lsdException w:name="Medium Shading 2 Accent 5" w:uiPriority="64"/>
+    <w:lsdException w:name="Medium List 1 Accent 5" w:uiPriority="65"/>
+    <w:lsdException w:name="Medium List 2 Accent 5" w:uiPriority="66"/>
+    <w:lsdException w:name="Medium Grid 1 Accent 5" w:uiPriority="67"/>
+    <w:lsdException w:name="Medium Grid 2 Accent 5" w:uiPriority="68"/>
+    <w:lsdException w:name="Medium Grid 3 Accent 5" w:uiPriority="69"/>
+    <w:lsdException w:name="Dark List Accent 5" w:uiPriority="70"/>
+    <w:lsdException w:name="Colorful Shading Accent 5" w:uiPriority="71"/>
+    <w:lsdException w:name="Colorful List Accent 5" w:uiPriority="72"/>
+    <w:lsdException w:name="Colorful Grid Accent 5" w:uiPriority="73"/>
+    <w:lsdException w:name="Light Shading Accent 6" w:uiPriority="60"/>
+    <w:lsdException w:name="Light List Accent 6" w:uiPriority="61"/>
+    <w:lsdException w:name="Light Grid Accent 6" w:uiPriority="62"/>
+    <w:lsdException w:name="Medium Shading 1 Accent 6" w:uiPriority="63"/>
+    <w:lsdException w:name="Medium Shading 2 Accent 6" w:uiPriority="64"/>
+    <w:lsdException w:name="Medium List 1 Accent 6" w:uiPriority="65"/>
+    <w:lsdException w:name="Medium List 2 Accent 6" w:uiPriority="66"/>
+    <w:lsdException w:name="Medium Grid 1 Accent 6" w:uiPriority="67"/>
+    <w:lsdException w:name="Medium Grid 2 Accent 6" w:uiPriority="68"/>
+    <w:lsdException w:name="Medium Grid 3 Accent 6" w:uiPriority="69"/>
+    <w:lsdException w:name="Dark List Accent 6" w:uiPriority="70"/>
+    <w:lsdException w:name="Colorful Shading Accent 6" w:uiPriority="71"/>
+    <w:lsdException w:name="Colorful List Accent 6" w:uiPriority="72"/>
+    <w:lsdException w:name="Colorful Grid Accent 6" w:uiPriority="73"/>
+    <w:lsdException w:name="Subtle Emphasis" w:qFormat="1" w:uiPriority="19"/>
+    <w:lsdException w:name="Intense Emphasis" w:qFormat="1" w:uiPriority="21"/>
+    <w:lsdException w:name="Subtle Reference" w:qFormat="1" w:uiPriority="31"/>
+    <w:lsdException w:name="Intense Reference" w:qFormat="1" w:uiPriority="32"/>
+    <w:lsdException w:name="Book Title" w:qFormat="1" w:uiPriority="33"/>
+    <w:lsdException w:name="Bibliography" w:semiHidden="1" w:uiPriority="37" w:unhideWhenUsed="1"/>
+    <w:lsdException w:name="TOC Heading" w:qFormat="1" w:semiHidden="1" w:uiPriority="39" w:unhideWhenUsed="1"/>
+    <w:lsdException w:name="Plain Table 1" w:uiPriority="41"/>
+    <w:lsdException w:name="Plain Table 2" w:uiPriority="42"/>
+    <w:lsdException w:name="Plain Table 3" w:uiPriority="43"/>
+    <w:lsdException w:name="Plain Table 4" w:uiPriority="44"/>
+    <w:lsdException w:name="Plain Table 5" w:uiPriority="45"/>
+    <w:lsdException w:name="Grid Table Light" w:uiPriority="40"/>
+    <w:lsdException w:name="Grid Table 1 Light" w:uiPriority="46"/>
+    <w:lsdException w:name="Grid Table 2" w:uiPriority="47"/>
+    <w:lsdException w:name="Grid Table 3" w:uiPriority="48"/>
+    <w:lsdException w:name="Grid Table 4" w:uiPriority="49"/>
+    <w:lsdException w:name="Grid Table 5 Dark" w:uiPriority="50"/>
+    <w:lsdException w:name="Grid Table 6 Colorful" w:uiPriority="51"/>
+    <w:lsdException w:name="Grid Table 7 Colorful" w:uiPriority="52"/>
+    <w:lsdException w:name="Grid Table 1 Light Accent 1" w:uiPriority="46"/>
+    <w:lsdException w:name="Grid Table 2 Accent 1" w:uiPriority="47"/>
+    <w:lsdException w:name="Grid Table 3 Accent 1" w:uiPriority="48"/>
+    <w:lsdException w:name="Grid Table 4 Accent 1" w:uiPriority="49"/>
+    <w:lsdException w:name="Grid Table 5 Dark Accent 1" w:uiPriority="50"/>
+    <w:lsdException w:name="Grid Table 6 Colorful Accent 1" w:uiPriority="51"/>
+    <w:lsdException w:name="Grid Table 7 Colorful Accent 1" w:uiPriority="52"/>
+    <w:lsdException w:name="Grid Table 1 Light Accent 2" w:uiPriority="46"/>
+    <w:lsdException w:name="Grid Table 2 Accent 2" w:uiPriority="47"/>
+    <w:lsdException w:name="Grid Table 3 Accent 2" w:uiPriority="48"/>
+    <w:lsdException w:name="Grid Table 4 Accent 2" w:uiPriority="49"/>
+    <w:lsdException w:name="Grid Table 5 Dark Accent 2" w:uiPriority="50"/>
+    <w:lsdException w:name="Grid Table 6 Colorful Accent 2" w:uiPriority="51"/>
+    <w:lsdException w:name="Grid Table 7 Colorful Accent 2" w:uiPriority="52"/>
+    <w:lsdException w:name="Grid Table 1 Light Accent 3" w:uiPriority="46"/>
+    <w:lsdException w:name="Grid Table 2 Accent 3" w:uiPriority="47"/>
+    <w:lsdException w:name="Grid Table 3 Accent 3" w:uiPriority="48"/>
+    <w:lsdException w:name="Grid Table 4 Accent 3" w:uiPriority="49"/>
+    <w:lsdException w:name="Grid Table 5 Dark Accent 3" w:uiPriority="50"/>
+    <w:lsdException w:name="Grid Table 6 Colorful Accent 3" w:uiPriority="51"/>
+    <w:lsdException w:name="Grid Table 7 Colorful Accent 3" w:uiPriority="52"/>
+    <w:lsdException w:name="Grid Table 1 Light Accent 4" w:uiPriority="46"/>
+    <w:lsdException w:name="Grid Table 2 Accent 4" w:uiPriority="47"/>
+    <w:lsdException w:name="Grid Table 3 Accent 4" w:uiPriority="48"/>
+    <w:lsdException w:name="Grid Table 4 Accent 4" w:uiPriority="49"/>
+    <w:lsdException w:name="Grid Table 5 Dark Accent 4" w:uiPriority="50"/>
+    <w:lsdException w:name="Grid Table 6 Colorful Accent 4" w:uiPriority="51"/>
+    <w:lsdException w:name="Grid Table 7 Colorful Accent 4" w:uiPriority="52"/>
+    <w:lsdException w:name="Grid Table 1 Light Accent 5" w:uiPriority="46"/>
+    <w:lsdException w:name="Grid Table 2 Accent 5" w:uiPriority="47"/>
+    <w:lsdException w:name="Grid Table 3 Accent 5" w:uiPriority="48"/>
+    <w:lsdException w:name="Grid Table 4 Accent 5" w:uiPriority="49"/>
+    <w:lsdException w:name="Grid Table 5 Dark Accent 5" w:uiPriority="50"/>
+    <w:lsdException w:name="Grid Table 6 Colorful Accent 5" w:uiPriority="51"/>
+    <w:lsdException w:name="Grid Table 7 Colorful Accent 5" w:uiPriority="52"/>
+    <w:lsdException w:name="Grid Table 1 Light Accent 6" w:uiPriority="46"/>
+    <w:lsdException w:name="Grid Table 2 Accent 6" w:uiPriority="47"/>
+    <w:lsdException w:name="Grid Table 3 Accent 6" w:uiPriority="48"/>
+    <w:lsdException w:name="Grid Table 4 Accent 6" w:uiPriority="49"/>
+    <w:lsdException w:name="Grid Table 5 Dark Accent 6" w:uiPriority="50"/>
+    <w:lsdException w:name="Grid Table 6 Colorful Accent 6" w:uiPriority="51"/>
+    <w:lsdException w:name="Grid Table 7 Colorful Accent 6" w:uiPriority="52"/>
+    <w:lsdException w:name="List Table 1 Light" w:uiPriority="46"/>
+    <w:lsdException w:name="List Table 2" w:uiPriority="47"/>
+    <w:lsdException w:name="List Table 3" w:uiPriority="48"/>
+    <w:lsdException w:name="List Table 4" w:uiPriority="49"/>
+    <w:lsdException w:name="List Table 5 Dark" w:uiPriority="50"/>
+    <w:lsdException w:name="List Table 6 Colorful" w:uiPriority="51"/>
+    <w:lsdException w:name="List Table 7 Colorful" w:uiPriority="52"/>
+    <w:lsdException w:name="List Table 1 Light Accent 1" w:uiPriority="46"/>
+    <w:lsdException w:name="List Table 2 Accent 1" w:uiPriority="47"/>
+    <w:lsdException w:name="List Table 3 Accent 1" w:uiPriority="48"/>
+    <w:lsdException w:name="List Table 4 Accent 1" w:uiPriority="49"/>
+    <w:lsdException w:name="List Table 5 Dark Accent 1" w:uiPriority="50"/>
+    <w:lsdException w:name="List Table 6 Colorful Accent 1" w:uiPriority="51"/>
+    <w:lsdException w:name="List Table 7 Colorful Accent 1" w:uiPriority="52"/>
+    <w:lsdException w:name="List Table 1 Light Accent 2" w:uiPriority="46"/>
+    <w:lsdException w:name="List Table 2 Accent 2" w:uiPriority="47"/>
+    <w:lsdException w:name="List Table 3 Accent 2" w:uiPriority="48"/>
+    <w:lsdException w:name="List Table 4 Accent 2" w:uiPriority="49"/>
+    <w:lsdException w:name="List Table 5 Dark Accent 2" w:uiPriority="50"/>
+    <w:lsdException w:name="List Table 6 Colorful Accent 2" w:uiPriority="51"/>
+    <w:lsdException w:name="List Table 7 Colorful Accent 2" w:uiPriority="52"/>
+    <w:lsdException w:name="List Table 1 Light Accent 3" w:uiPriority="46"/>
+    <w:lsdException w:name="List Table 2 Accent 3" w:uiPriority="47"/>
+    <w:lsdException w:name="List Table 3 Accent 3" w:uiPriority="48"/>
+    <w:lsdException w:name="List Table 4 Accent 3" w:uiPriority="49"/>
+    <w:lsdException w:name="List Table 5 Dark Accent 3" w:uiPriority="50"/>
+    <w:lsdException w:name="List Table 6 Colorful Accent 3" w:uiPriority="51"/>
+    <w:lsdException w:name="List Table 7 Colorful Accent 3" w:uiPriority="52"/>
+    <w:lsdException w:name="List Table 1 Light Accent 4" w:uiPriority="46"/>
+    <w:lsdException w:name="List Table 2 Accent 4" w:uiPriority="47"/>
+    <w:lsdException w:name="List Table 3 Accent 4" w:uiPriority="48"/>
+    <w:lsdException w:name="List Table 4 Accent 4" w:uiPriority="49"/>
+    <w:lsdException w:name="List Table 5 Dark Accent 4" w:uiPriority="50"/>
+    <w:lsdException w:name="List Table 6 Colorful Accent 4" w:uiPriority="51"/>
+    <w:lsdException w:name="List Table 7 Colorful Accent 4" w:uiPriority="52"/>
+    <w:lsdException w:name="List Table 1 Light Accent 5" w:uiPriority="46"/>
+    <w:lsdException w:name="List Table 2 Accent 5" w:uiPriority="47"/>
+    <w:lsdException w:name="List Table 3 Accent 5" w:uiPriority="48"/>
+    <w:lsdException w:name="List Table 4 Accent 5" w:uiPriority="49"/>
+    <w:lsdException w:name="List Table 5 Dark Accent 5" w:uiPriority="50"/>
+    <w:lsdException w:name="List Table 6 Colorful Accent 5" w:uiPriority="51"/>
+    <w:lsdException w:name="List Table 7 Colorful Accent 5" w:uiPriority="52"/>
+    <w:lsdException w:name="List Table 1 Light Accent 6" w:uiPriority="46"/>
+    <w:lsdException w:name="List Table 2 Accent 6" w:uiPriority="47"/>
+    <w:lsdException w:name="List Table 3 Accent 6" w:uiPriority="48"/>
+    <w:lsdException w:name="List Table 4 Accent 6" w:uiPriority="49"/>
+    <w:lsdException w:name="List Table 5 Dark Accent 6" w:uiPriority="50"/>
+    <w:lsdException w:name="List Table 6 Colorful Accent 6" w:uiPriority="51"/>
+    <w:lsdException w:name="List Table 7 Colorful Accent 6" w:uiPriority="52"/>
+    <w:lsdException w:name="Mention" w:semiHidden="1" w:unhideWhenUsed="1"/>
+    <w:lsdException w:name="Smart Hyperlink" w:semiHidden="1" w:unhideWhenUsed="1"/>
+    <w:lsdException w:name="Hashtag" w:semiHidden="1" w:unhideWhenUsed="1"/>
+    <w:lsdException w:name="Unresolved Mention" w:semiHidden="1" w:unhideWhenUsed="1"/>
+    <w:lsdException w:name="Smart Link" w:semiHidden="1" w:unhideWhenUsed="1"/>
+  </w:latentStyles>
   <w:style w:default="1" w:styleId="Normal" w:type="paragraph">
     <w:name w:val="Normal"/>
     <w:qFormat/>
-  </w:style>
-  <w:style w:styleId="BodyText" w:type="paragraph">
-    <w:name w:val="Body Text"/>
+    <w:rsid w:val="002773DF"/>
+  </w:style>
+  <w:style w:styleId="Heading1" w:type="paragraph">
+    <w:name w:val="heading 1"/>
     <w:basedOn w:val="Normal"/>
-    <w:link w:val="BodyTextChar"/>
+    <w:next w:val="Normal"/>
+    <w:link w:val="Heading1Char"/>
+    <w:uiPriority w:val="9"/>
     <w:qFormat/>
-    <w:pPr>
-      <w:spacing w:after="180" w:before="180"/>
-    </w:pPr>
-  </w:style>
-  <w:style w:customStyle="1" w:styleId="FirstParagraph" w:type="paragraph">
-    <w:name w:val="First Paragraph"/>
-    <w:basedOn w:val="BodyText"/>
-    <w:next w:val="BodyText"/>
-    <w:qFormat/>
-  </w:style>
-  <w:style w:customStyle="1" w:styleId="Compact" w:type="paragraph">
-    <w:name w:val="Compact"/>
-    <w:basedOn w:val="BodyText"/>
-    <w:qFormat/>
-    <w:pPr>
-      <w:spacing w:after="36" w:before="36"/>
-    </w:pPr>
-  </w:style>
-  <w:style w:styleId="Title" w:type="paragraph">
-    <w:name w:val="Title"/>
-    <w:basedOn w:val="Normal"/>
-    <w:next w:val="BodyText"/>
-    <w:link w:val="TitleChar"/>
-    <w:uiPriority w:val="10"/>
-    <w:qFormat/>
-    <w:rsid w:val="00A10FD9"/>
-    <w:pPr>
-      <w:spacing w:after="80" w:line="240" w:lineRule="auto"/>
-      <w:contextualSpacing/>
-      <w:jc w:val="center"/>
-    </w:pPr>
-    <w:rPr>
-      <w:rFonts w:asciiTheme="majorHAnsi" w:cstheme="majorBidi" w:eastAsiaTheme="majorEastAsia" w:hAnsiTheme="majorHAnsi"/>
-      <w:sz w:val="56"/>
-      <w:szCs w:val="56"/>
-    </w:rPr>
-  </w:style>
-  <w:style w:customStyle="1" w:styleId="TitleChar" w:type="character">
-    <w:name w:val="Title Char"/>
-    <w:basedOn w:val="DefaultParagraphFont"/>
-    <w:link w:val="Title"/>
-    <w:uiPriority w:val="10"/>
-    <w:rsid w:val="00A10FD9"/>
-    <w:rPr>
-      <w:rFonts w:asciiTheme="majorHAnsi" w:cstheme="majorBidi" w:eastAsiaTheme="majorEastAsia" w:hAnsiTheme="majorHAnsi"/>
-      <w:sz w:val="56"/>
-      <w:szCs w:val="56"/>
-    </w:rPr>
-  </w:style>
-  <w:style w:styleId="Subtitle" w:type="paragraph">
-    <w:name w:val="Subtitle"/>
-    <w:basedOn w:val="Title"/>
-    <w:next w:val="BodyText"/>
-    <w:link w:val="SubtitleChar"/>
-    <w:uiPriority w:val="11"/>
-    <w:qFormat/>
-    <w:rsid w:val="00A10FD9"/>
-    <w:pPr>
-      <w:numPr>
-        <w:ilvl w:val="1"/>
-      </w:numPr>
-    </w:pPr>
-    <w:rPr>
-      <w:rFonts w:cstheme="majorBidi" w:eastAsiaTheme="majorEastAsia"/>
-      <w:spacing w:val="15"/>
-      <w:sz w:val="28"/>
-      <w:szCs w:val="28"/>
-    </w:rPr>
-  </w:style>
-  <w:style w:customStyle="1" w:styleId="SubtitleChar" w:type="character">
-    <w:name w:val="Subtitle Char"/>
-    <w:basedOn w:val="DefaultParagraphFont"/>
-    <w:link w:val="Subtitle"/>
-    <w:uiPriority w:val="11"/>
-    <w:rsid w:val="00A10FD9"/>
-    <w:rPr>
-      <w:rFonts w:cstheme="majorBidi" w:eastAsiaTheme="majorEastAsia"/>
-      <w:color w:themeColor="text1" w:themeTint="A6" w:val="595959"/>
-      <w:spacing w:val="15"/>
-      <w:sz w:val="28"/>
-      <w:szCs w:val="28"/>
-    </w:rPr>
-  </w:style>
-  <w:style w:customStyle="1" w:styleId="Author" w:type="paragraph">
-    <w:name w:val="Author"/>
-    <w:basedOn w:val="Title"/>
-    <w:next w:val="BodyText"/>
-    <w:qFormat/>
+    <w:rsid w:val="00BA08B1"/>
     <w:pPr>
       <w:keepNext/>
       <w:keepLines/>
-    </w:pPr>
-    <w:rPr>
-      <w:sz w:val="24"/>
-      <w:szCs w:val="24"/>
-    </w:rPr>
-  </w:style>
-  <w:style w:styleId="Date" w:type="paragraph">
-    <w:name w:val="Date"/>
-    <w:basedOn w:val="Title"/>
-    <w:next w:val="BodyText"/>
-    <w:qFormat/>
-    <w:pPr>
-      <w:keepNext/>
-      <w:keepLines/>
-    </w:pPr>
-    <w:rPr>
-      <w:sz w:val="24"/>
-      <w:szCs w:val="24"/>
-    </w:rPr>
-  </w:style>
-  <w:style w:customStyle="1" w:styleId="AbstractTitle" w:type="paragraph">
-    <w:name w:val="Abstract Title"/>
-    <w:basedOn w:val="Normal"/>
-    <w:next w:val="Abstract"/>
-    <w:qFormat/>
-    <w:pPr>
-      <w:keepNext/>
-      <w:keepLines/>
-      <w:spacing w:after="0" w:before="300"/>
-      <w:jc w:val="center"/>
-    </w:pPr>
-    <w:rPr>
-      <w:b/>
-      <w:sz w:val="20"/>
-      <w:szCs w:val="20"/>
-    </w:rPr>
-  </w:style>
-  <w:style w:customStyle="1" w:styleId="Abstract" w:type="paragraph">
-    <w:name w:val="Abstract"/>
-    <w:basedOn w:val="Normal"/>
-    <w:next w:val="BodyText"/>
-    <w:qFormat/>
-    <w:pPr>
-      <w:keepNext/>
-      <w:keepLines/>
-      <w:spacing w:after="300" w:before="100"/>
-    </w:pPr>
-    <w:rPr>
-      <w:sz w:val="20"/>
-      <w:szCs w:val="20"/>
-    </w:rPr>
-  </w:style>
-  <w:style w:styleId="Bibliography" w:type="paragraph">
-    <w:name w:val="Bibliography"/>
-    <w:basedOn w:val="Normal"/>
-    <w:next w:val="Bibliography"/>
-    <w:qFormat/>
-    <w:pPr/>
-    <w:rPr/>
-  </w:style>
-  <w:style w:styleId="Heading1" w:type="paragraph">
-    <w:name w:val="heading 1"/>
-    <w:basedOn w:val="Normal"/>
-    <w:next w:val="BodyText"/>
-    <w:link w:val="Heading1Char"/>
-    <w:uiPriority w:val="9"/>
-    <w:qFormat/>
-    <w:rsid w:val="00A10FD9"/>
-    <w:pPr>
-      <w:keepNext/>
-      <w:keepLines/>
-      <w:spacing w:after="80" w:before="360"/>
+      <w:spacing w:before="240"/>
       <w:outlineLvl w:val="0"/>
     </w:pPr>
     <w:rPr>
       <w:rFonts w:asciiTheme="majorHAnsi" w:cstheme="majorBidi" w:eastAsiaTheme="majorEastAsia" w:hAnsiTheme="majorHAnsi"/>
-      <w:color w:themeColor="accent1" w:themeShade="BF" w:val="0F4761"/>
-      <w:sz w:val="40"/>
-      <w:szCs w:val="40"/>
+      <w:color w:themeColor="accent1" w:themeShade="BF" w:val="2F5496"/>
+      <w:sz w:val="32"/>
+      <w:szCs w:val="32"/>
     </w:rPr>
   </w:style>
   <w:style w:styleId="Heading2" w:type="paragraph">
     <w:name w:val="heading 2"/>
     <w:basedOn w:val="Normal"/>
-    <w:next w:val="BodyText"/>
+    <w:next w:val="Normal"/>
     <w:link w:val="Heading2Char"/>
     <w:uiPriority w:val="9"/>
-    <w:semiHidden/>
     <w:unhideWhenUsed/>
     <w:qFormat/>
-    <w:rsid w:val="00A10FD9"/>
+    <w:rsid w:val="00747C69"/>
     <w:pPr>
       <w:keepNext/>
       <w:keepLines/>
-      <w:spacing w:after="80" w:before="160"/>
+      <w:spacing w:before="40"/>
       <w:outlineLvl w:val="1"/>
     </w:pPr>
     <w:rPr>
       <w:rFonts w:asciiTheme="majorHAnsi" w:cstheme="majorBidi" w:eastAsiaTheme="majorEastAsia" w:hAnsiTheme="majorHAnsi"/>
-      <w:color w:themeColor="accent1" w:themeShade="BF" w:val="0F4761"/>
-      <w:sz w:val="32"/>
-      <w:szCs w:val="32"/>
+      <w:color w:themeColor="accent1" w:themeShade="BF" w:val="2F5496"/>
+      <w:sz w:val="26"/>
+      <w:szCs w:val="26"/>
     </w:rPr>
   </w:style>
   <w:style w:styleId="Heading3" w:type="paragraph">
     <w:name w:val="heading 3"/>
     <w:basedOn w:val="Normal"/>
-    <w:next w:val="BodyText"/>
+    <w:next w:val="Normal"/>
     <w:link w:val="Heading3Char"/>
     <w:uiPriority w:val="9"/>
     <w:semiHidden/>
     <w:unhideWhenUsed/>
     <w:qFormat/>
-    <w:rsid w:val="00A10FD9"/>
+    <w:rsid w:val="002773DF"/>
     <w:pPr>
       <w:keepNext/>
       <w:keepLines/>
-      <w:spacing w:after="80" w:before="160"/>
+      <w:spacing w:before="40"/>
       <w:outlineLvl w:val="2"/>
     </w:pPr>
     <w:rPr>
-      <w:rFonts w:cstheme="majorBidi" w:eastAsiaTheme="majorEastAsia"/>
-      <w:color w:themeColor="accent1" w:themeShade="BF" w:val="0F4761"/>
-      <w:sz w:val="28"/>
-      <w:szCs w:val="28"/>
+      <w:rFonts w:asciiTheme="majorHAnsi" w:cstheme="majorBidi" w:eastAsiaTheme="majorEastAsia" w:hAnsiTheme="majorHAnsi"/>
+      <w:color w:themeColor="accent1" w:themeShade="7F" w:val="1F3763"/>
     </w:rPr>
   </w:style>
-  <w:style w:styleId="Heading4" w:type="paragraph">
-    <w:name w:val="heading 4"/>
-    <w:basedOn w:val="Normal"/>
-    <w:next w:val="BodyText"/>
-    <w:link w:val="Heading4Char"/>
-    <w:uiPriority w:val="9"/>
+  <w:style w:default="1" w:styleId="DefaultParagraphFont" w:type="character">
+    <w:name w:val="Default Paragraph Font"/>
+    <w:uiPriority w:val="1"/>
     <w:semiHidden/>
     <w:unhideWhenUsed/>
-    <w:qFormat/>
-    <w:rsid w:val="00A10FD9"/>
-    <w:pPr>
-      <w:keepNext/>
-      <w:keepLines/>
-      <w:spacing w:after="40" w:before="80"/>
-      <w:outlineLvl w:val="3"/>
-    </w:pPr>
-    <w:rPr>
-      <w:rFonts w:cstheme="majorBidi" w:eastAsiaTheme="majorEastAsia"/>
-      <w:i/>
-      <w:iCs/>
-      <w:color w:themeColor="accent1" w:themeShade="BF" w:val="0F4761"/>
-    </w:rPr>
-  </w:style>
-  <w:style w:styleId="Heading5" w:type="paragraph">
-    <w:name w:val="heading 5"/>
-    <w:basedOn w:val="Normal"/>
-    <w:next w:val="BodyText"/>
-    <w:link w:val="Heading5Char"/>
-    <w:uiPriority w:val="9"/>
+  </w:style>
+  <w:style w:default="1" w:styleId="TableNormal" w:type="table">
+    <w:name w:val="Normal Table"/>
+    <w:uiPriority w:val="99"/>
     <w:semiHidden/>
     <w:unhideWhenUsed/>
-    <w:qFormat/>
-    <w:rsid w:val="00A10FD9"/>
-    <w:pPr>
-      <w:keepNext/>
-      <w:keepLines/>
-      <w:spacing w:after="40" w:before="80"/>
-      <w:outlineLvl w:val="4"/>
-    </w:pPr>
-    <w:rPr>
-      <w:rFonts w:cstheme="majorBidi" w:eastAsiaTheme="majorEastAsia"/>
-      <w:color w:themeColor="accent1" w:themeShade="BF" w:val="0F4761"/>
-    </w:rPr>
-  </w:style>
-  <w:style w:styleId="Heading6" w:type="paragraph">
-    <w:name w:val="heading 6"/>
-    <w:basedOn w:val="Normal"/>
-    <w:next w:val="BodyText"/>
-    <w:link w:val="Heading6Char"/>
-    <w:uiPriority w:val="9"/>
-    <w:semiHidden/>
-    <w:unhideWhenUsed/>
-    <w:qFormat/>
-    <w:rsid w:val="00A10FD9"/>
-    <w:pPr>
-      <w:keepNext/>
-      <w:keepLines/>
-      <w:spacing w:after="0" w:before="40"/>
-      <w:outlineLvl w:val="5"/>
-    </w:pPr>
-    <w:rPr>
-      <w:rFonts w:cstheme="majorBidi" w:eastAsiaTheme="majorEastAsia"/>
-      <w:i/>
-      <w:iCs/>
-      <w:color w:themeColor="text1" w:themeTint="A6" w:val="595959"/>
-    </w:rPr>
-  </w:style>
-  <w:style w:styleId="Heading7" w:type="paragraph">
-    <w:name w:val="heading 7"/>
-    <w:basedOn w:val="Normal"/>
-    <w:next w:val="BodyText"/>
-    <w:link w:val="Heading7Char"/>
-    <w:uiPriority w:val="9"/>
-    <w:semiHidden/>
-    <w:unhideWhenUsed/>
-    <w:qFormat/>
-    <w:rsid w:val="00A10FD9"/>
-    <w:pPr>
-      <w:keepNext/>
-      <w:keepLines/>
-      <w:spacing w:after="0" w:before="40"/>
-      <w:outlineLvl w:val="6"/>
-    </w:pPr>
-    <w:rPr>
-      <w:rFonts w:cstheme="majorBidi" w:eastAsiaTheme="majorEastAsia"/>
-      <w:color w:themeColor="text1" w:themeTint="A6" w:val="595959"/>
-    </w:rPr>
-  </w:style>
-  <w:style w:styleId="Heading8" w:type="paragraph">
-    <w:name w:val="heading 8"/>
-    <w:basedOn w:val="Normal"/>
-    <w:next w:val="BodyText"/>
-    <w:link w:val="Heading8Char"/>
-    <w:uiPriority w:val="9"/>
-    <w:semiHidden/>
-    <w:unhideWhenUsed/>
-    <w:qFormat/>
-    <w:rsid w:val="00A10FD9"/>
-    <w:pPr>
-      <w:keepNext/>
-      <w:keepLines/>
-      <w:spacing w:after="0"/>
-      <w:outlineLvl w:val="7"/>
-    </w:pPr>
-    <w:rPr>
-      <w:rFonts w:cstheme="majorBidi" w:eastAsiaTheme="majorEastAsia"/>
-      <w:i/>
-      <w:iCs/>
-      <w:color w:themeColor="text1" w:themeTint="D8" w:val="272727"/>
-    </w:rPr>
-  </w:style>
-  <w:style w:styleId="Heading9" w:type="paragraph">
-    <w:name w:val="heading 9"/>
-    <w:basedOn w:val="Normal"/>
-    <w:next w:val="BodyText"/>
-    <w:link w:val="Heading9Char"/>
-    <w:uiPriority w:val="9"/>
-    <w:semiHidden/>
-    <w:unhideWhenUsed/>
-    <w:qFormat/>
-    <w:rsid w:val="00A10FD9"/>
-    <w:pPr>
-      <w:keepNext/>
-      <w:keepLines/>
-      <w:spacing w:after="0"/>
-      <w:outlineLvl w:val="8"/>
-    </w:pPr>
-    <w:rPr>
-      <w:rFonts w:cstheme="majorBidi" w:eastAsiaTheme="majorEastAsia"/>
-      <w:color w:themeColor="text1" w:themeTint="D8" w:val="272727"/>
-    </w:rPr>
-  </w:style>
-  <w:style w:customStyle="1" w:styleId="Heading1Char" w:type="character">
-    <w:name w:val="Heading 1 Char"/>
-    <w:basedOn w:val="DefaultParagraphFont"/>
-    <w:link w:val="Heading1"/>
-    <w:uiPriority w:val="9"/>
-    <w:rsid w:val="00A10FD9"/>
-    <w:rPr>
-      <w:rFonts w:asciiTheme="majorHAnsi" w:cstheme="majorBidi" w:eastAsiaTheme="majorEastAsia" w:hAnsiTheme="majorHAnsi"/>
-      <w:color w:themeColor="accent1" w:themeShade="BF" w:val="0F4761"/>
-      <w:sz w:val="40"/>
-      <w:szCs w:val="40"/>
-    </w:rPr>
-  </w:style>
-  <w:style w:customStyle="1" w:styleId="Heading2Char" w:type="character">
-    <w:name w:val="Heading 2 Char"/>
-    <w:basedOn w:val="DefaultParagraphFont"/>
-    <w:link w:val="Heading2"/>
-    <w:uiPriority w:val="9"/>
-    <w:semiHidden/>
-    <w:rsid w:val="00A10FD9"/>
-    <w:rPr>
-      <w:rFonts w:asciiTheme="majorHAnsi" w:cstheme="majorBidi" w:eastAsiaTheme="majorEastAsia" w:hAnsiTheme="majorHAnsi"/>
-      <w:color w:themeColor="accent1" w:themeShade="BF" w:val="0F4761"/>
-      <w:sz w:val="32"/>
-      <w:szCs w:val="32"/>
-    </w:rPr>
-  </w:style>
-  <w:style w:customStyle="1" w:styleId="Heading3Char" w:type="character">
-    <w:name w:val="Heading 3 Char"/>
-    <w:basedOn w:val="DefaultParagraphFont"/>
-    <w:link w:val="Heading3"/>
-    <w:uiPriority w:val="9"/>
-    <w:semiHidden/>
-    <w:rsid w:val="00A10FD9"/>
-    <w:rPr>
-      <w:rFonts w:cstheme="majorBidi" w:eastAsiaTheme="majorEastAsia"/>
-      <w:color w:themeColor="accent1" w:themeShade="BF" w:val="0F4761"/>
-      <w:sz w:val="28"/>
-      <w:szCs w:val="28"/>
-    </w:rPr>
-  </w:style>
-  <w:style w:customStyle="1" w:styleId="Heading4Char" w:type="character">
-    <w:name w:val="Heading 4 Char"/>
-    <w:basedOn w:val="DefaultParagraphFont"/>
-    <w:link w:val="Heading4"/>
-    <w:uiPriority w:val="9"/>
-    <w:semiHidden/>
-    <w:rsid w:val="00A10FD9"/>
-    <w:rPr>
-      <w:rFonts w:cstheme="majorBidi" w:eastAsiaTheme="majorEastAsia"/>
-      <w:i/>
-      <w:iCs/>
-      <w:color w:themeColor="accent1" w:themeShade="BF" w:val="0F4761"/>
-    </w:rPr>
-  </w:style>
-  <w:style w:customStyle="1" w:styleId="Heading5Char" w:type="character">
-    <w:name w:val="Heading 5 Char"/>
-    <w:basedOn w:val="DefaultParagraphFont"/>
-    <w:link w:val="Heading5"/>
-    <w:uiPriority w:val="9"/>
-    <w:semiHidden/>
-    <w:rsid w:val="00A10FD9"/>
-    <w:rPr>
-      <w:rFonts w:cstheme="majorBidi" w:eastAsiaTheme="majorEastAsia"/>
-      <w:color w:themeColor="accent1" w:themeShade="BF" w:val="0F4761"/>
-    </w:rPr>
-  </w:style>
-  <w:style w:customStyle="1" w:styleId="Heading6Char" w:type="character">
-    <w:name w:val="Heading 6 Char"/>
-    <w:basedOn w:val="DefaultParagraphFont"/>
-    <w:link w:val="Heading6"/>
-    <w:uiPriority w:val="9"/>
-    <w:semiHidden/>
-    <w:rsid w:val="00A10FD9"/>
-    <w:rPr>
-      <w:rFonts w:cstheme="majorBidi" w:eastAsiaTheme="majorEastAsia"/>
-      <w:i/>
-      <w:iCs/>
-      <w:color w:themeColor="text1" w:themeTint="A6" w:val="595959"/>
-    </w:rPr>
-  </w:style>
-  <w:style w:customStyle="1" w:styleId="Heading7Char" w:type="character">
-    <w:name w:val="Heading 7 Char"/>
-    <w:basedOn w:val="DefaultParagraphFont"/>
-    <w:link w:val="Heading7"/>
-    <w:uiPriority w:val="9"/>
-    <w:semiHidden/>
-    <w:rsid w:val="00A10FD9"/>
-    <w:rPr>
-      <w:rFonts w:cstheme="majorBidi" w:eastAsiaTheme="majorEastAsia"/>
-      <w:color w:themeColor="text1" w:themeTint="A6" w:val="595959"/>
-    </w:rPr>
-  </w:style>
-  <w:style w:customStyle="1" w:styleId="Heading8Char" w:type="character">
-    <w:name w:val="Heading 8 Char"/>
-    <w:basedOn w:val="DefaultParagraphFont"/>
-    <w:link w:val="Heading8"/>
-    <w:uiPriority w:val="9"/>
-    <w:semiHidden/>
-    <w:rsid w:val="00A10FD9"/>
-    <w:rPr>
-      <w:rFonts w:cstheme="majorBidi" w:eastAsiaTheme="majorEastAsia"/>
-      <w:i/>
-      <w:iCs/>
-      <w:color w:themeColor="text1" w:themeTint="D8" w:val="272727"/>
-    </w:rPr>
-  </w:style>
-  <w:style w:customStyle="1" w:styleId="Heading9Char" w:type="character">
-    <w:name w:val="Heading 9 Char"/>
-    <w:basedOn w:val="DefaultParagraphFont"/>
-    <w:link w:val="Heading9"/>
-    <w:uiPriority w:val="9"/>
-    <w:semiHidden/>
-    <w:rsid w:val="00A10FD9"/>
-    <w:rPr>
-      <w:rFonts w:cstheme="majorBidi" w:eastAsiaTheme="majorEastAsia"/>
-      <w:color w:themeColor="text1" w:themeTint="D8" w:val="272727"/>
-    </w:rPr>
-  </w:style>
-  <w:style w:styleId="BlockText" w:type="paragraph">
-    <w:name w:val="Block Text"/>
-    <w:basedOn w:val="BodyText"/>
-    <w:next w:val="BodyText"/>
-    <w:uiPriority w:val="9"/>
-    <w:unhideWhenUsed/>
-    <w:qFormat/>
-    <w:pPr>
-      <w:spacing w:after="100" w:before="100"/>
-      <w:ind w:firstLine="0" w:left="480" w:right="480"/>
-    </w:pPr>
-  </w:style>
-  <w:style w:styleId="FootnoteText" w:type="paragraph">
-    <w:name w:val="Footnote Text"/>
-    <w:basedOn w:val="Normal"/>
-    <w:next w:val="FootnoteText"/>
-    <w:uiPriority w:val="9"/>
-    <w:unhideWhenUsed/>
-    <w:qFormat/>
-  </w:style>
-  <w:style w:styleId="FootnoteBlockText" w:type="paragraph">
-    <w:name w:val="Footnote Block Text"/>
-    <w:basedOn w:val="FootnoteText"/>
-    <w:next w:val="FootnoteText"/>
-    <w:uiPriority w:val="9"/>
-    <w:unhideWhenUsed/>
-    <w:qFormat/>
-    <w:pPr>
-      <w:spacing w:after="100" w:before="100"/>
-      <w:ind w:firstLine="0" w:left="480" w:right="480"/>
-    </w:pPr>
-  </w:style>
-  <w:style w:default="1" w:styleId="DefaultParagraphFont" w:type="character">
-    <w:name w:val="Default Paragraph Font"/>
-    <w:semiHidden/>
-    <w:unhideWhenUsed/>
-  </w:style>
-  <w:style w:default="1" w:styleId="Table" w:type="table">
-    <w:name w:val="Table"/>
-    <w:basedOn w:val="TableNormal"/>
-    <w:semiHidden/>
-    <w:unhideWhenUsed/>
-    <w:qFormat/>
     <w:tblPr>
       <w:tblInd w:type="dxa" w:w="0"/>
       <w:tblCellMar>
@@ -3911,112 +5222,1004 @@
         <w:right w:type="dxa" w:w="108"/>
       </w:tblCellMar>
     </w:tblPr>
-    <w:tblStylePr w:type="firstRow">
-      <w:tcPr>
-        <w:tcBorders>
-          <w:bottom w:val="single"/>
-        </w:tcBorders>
-        <w:vAlign w:val="bottom"/>
-      </w:tcPr>
-    </w:tblStylePr>
-  </w:style>
-  <w:style w:customStyle="1" w:styleId="DefinitionTerm" w:type="paragraph">
-    <w:name w:val="Definition Term"/>
-    <w:basedOn w:val="Normal"/>
-    <w:next w:val="Definition"/>
+  </w:style>
+  <w:style w:default="1" w:styleId="NoList" w:type="numbering">
+    <w:name w:val="No List"/>
+    <w:uiPriority w:val="99"/>
+    <w:semiHidden/>
+    <w:unhideWhenUsed/>
+  </w:style>
+  <w:style w:customStyle="1" w:styleId="Default" w:type="paragraph">
+    <w:name w:val="Default"/>
+    <w:rsid w:val="003135E4"/>
     <w:pPr>
-      <w:keepNext/>
-      <w:keepLines/>
-      <w:spacing w:after="0"/>
+      <w:autoSpaceDE w:val="0"/>
+      <w:autoSpaceDN w:val="0"/>
+      <w:adjustRightInd w:val="0"/>
     </w:pPr>
     <w:rPr>
-      <w:b/>
+      <w:rFonts w:ascii="Verdana" w:cs="Verdana" w:hAnsi="Verdana"/>
+      <w:color w:val="000000"/>
+      <w:lang w:val="en-US"/>
     </w:rPr>
   </w:style>
-  <w:style w:customStyle="1" w:styleId="Definition" w:type="paragraph">
-    <w:name w:val="Definition"/>
+  <w:style w:styleId="Hyperlink" w:type="character">
+    <w:name w:val="Hyperlink"/>
+    <w:basedOn w:val="DefaultParagraphFont"/>
+    <w:uiPriority w:val="99"/>
+    <w:unhideWhenUsed/>
+    <w:rsid w:val="003135E4"/>
+    <w:rPr>
+      <w:color w:themeColor="hyperlink" w:val="0563C1"/>
+      <w:u w:val="single"/>
+    </w:rPr>
+  </w:style>
+  <w:style w:customStyle="1" w:styleId="UnresolvedMention1" w:type="character">
+    <w:name w:val="Unresolved Mention1"/>
+    <w:basedOn w:val="DefaultParagraphFont"/>
+    <w:uiPriority w:val="99"/>
+    <w:rsid w:val="003135E4"/>
+    <w:rPr>
+      <w:color w:val="605E5C"/>
+      <w:shd w:color="auto" w:fill="E1DFDD" w:val="clear"/>
+    </w:rPr>
+  </w:style>
+  <w:style w:styleId="ListParagraph" w:type="paragraph">
+    <w:name w:val="List Paragraph"/>
     <w:basedOn w:val="Normal"/>
+    <w:uiPriority w:val="34"/>
+    <w:qFormat/>
+    <w:rsid w:val="003135E4"/>
+    <w:pPr>
+      <w:ind w:left="720"/>
+      <w:contextualSpacing/>
+    </w:pPr>
+  </w:style>
+  <w:style w:styleId="NoSpacing" w:type="paragraph">
+    <w:name w:val="No Spacing"/>
+    <w:link w:val="NoSpacingChar"/>
+    <w:uiPriority w:val="1"/>
+    <w:qFormat/>
+    <w:rsid w:val="003E1057"/>
+    <w:rPr>
+      <w:rFonts w:eastAsiaTheme="minorEastAsia"/>
+      <w:sz w:val="22"/>
+      <w:szCs w:val="22"/>
+      <w:lang w:eastAsia="zh-CN" w:val="en-US"/>
+    </w:rPr>
+  </w:style>
+  <w:style w:customStyle="1" w:styleId="NoSpacingChar" w:type="character">
+    <w:name w:val="No Spacing Char"/>
+    <w:basedOn w:val="DefaultParagraphFont"/>
+    <w:link w:val="NoSpacing"/>
+    <w:uiPriority w:val="1"/>
+    <w:rsid w:val="003E1057"/>
+    <w:rPr>
+      <w:rFonts w:eastAsiaTheme="minorEastAsia"/>
+      <w:sz w:val="22"/>
+      <w:szCs w:val="22"/>
+      <w:lang w:eastAsia="zh-CN" w:val="en-US"/>
+    </w:rPr>
+  </w:style>
+  <w:style w:styleId="Footer" w:type="paragraph">
+    <w:name w:val="footer"/>
+    <w:basedOn w:val="Normal"/>
+    <w:link w:val="FooterChar"/>
+    <w:uiPriority w:val="99"/>
+    <w:unhideWhenUsed/>
+    <w:rsid w:val="00BA08B1"/>
+    <w:pPr>
+      <w:tabs>
+        <w:tab w:pos="4680" w:val="center"/>
+        <w:tab w:pos="9360" w:val="right"/>
+      </w:tabs>
+    </w:pPr>
+  </w:style>
+  <w:style w:customStyle="1" w:styleId="FooterChar" w:type="character">
+    <w:name w:val="Footer Char"/>
+    <w:basedOn w:val="DefaultParagraphFont"/>
+    <w:link w:val="Footer"/>
+    <w:uiPriority w:val="99"/>
+    <w:rsid w:val="00BA08B1"/>
+  </w:style>
+  <w:style w:styleId="PageNumber" w:type="character">
+    <w:name w:val="page number"/>
+    <w:basedOn w:val="DefaultParagraphFont"/>
+    <w:uiPriority w:val="99"/>
+    <w:semiHidden/>
+    <w:unhideWhenUsed/>
+    <w:rsid w:val="00BA08B1"/>
+  </w:style>
+  <w:style w:styleId="Header" w:type="paragraph">
+    <w:name w:val="header"/>
+    <w:basedOn w:val="Normal"/>
+    <w:link w:val="HeaderChar"/>
+    <w:uiPriority w:val="99"/>
+    <w:unhideWhenUsed/>
+    <w:rsid w:val="00BA08B1"/>
+    <w:pPr>
+      <w:tabs>
+        <w:tab w:pos="4680" w:val="center"/>
+        <w:tab w:pos="9360" w:val="right"/>
+      </w:tabs>
+    </w:pPr>
+  </w:style>
+  <w:style w:customStyle="1" w:styleId="HeaderChar" w:type="character">
+    <w:name w:val="Header Char"/>
+    <w:basedOn w:val="DefaultParagraphFont"/>
+    <w:link w:val="Header"/>
+    <w:uiPriority w:val="99"/>
+    <w:rsid w:val="00BA08B1"/>
+  </w:style>
+  <w:style w:customStyle="1" w:styleId="Heading1Char" w:type="character">
+    <w:name w:val="Heading 1 Char"/>
+    <w:basedOn w:val="DefaultParagraphFont"/>
+    <w:link w:val="Heading1"/>
+    <w:uiPriority w:val="9"/>
+    <w:rsid w:val="00BA08B1"/>
+    <w:rPr>
+      <w:rFonts w:asciiTheme="majorHAnsi" w:cstheme="majorBidi" w:eastAsiaTheme="majorEastAsia" w:hAnsiTheme="majorHAnsi"/>
+      <w:color w:themeColor="accent1" w:themeShade="BF" w:val="2F5496"/>
+      <w:sz w:val="32"/>
+      <w:szCs w:val="32"/>
+    </w:rPr>
+  </w:style>
+  <w:style w:styleId="FollowedHyperlink" w:type="character">
+    <w:name w:val="FollowedHyperlink"/>
+    <w:basedOn w:val="DefaultParagraphFont"/>
+    <w:uiPriority w:val="99"/>
+    <w:semiHidden/>
+    <w:unhideWhenUsed/>
+    <w:rsid w:val="00B23AB5"/>
+    <w:rPr>
+      <w:color w:themeColor="followedHyperlink" w:val="954F72"/>
+      <w:u w:val="single"/>
+    </w:rPr>
   </w:style>
   <w:style w:styleId="Caption" w:type="paragraph">
-    <w:name w:val="Caption"/>
+    <w:name w:val="caption"/>
     <w:basedOn w:val="Normal"/>
-    <w:link w:val="BodyTextChar"/>
+    <w:next w:val="Normal"/>
+    <w:uiPriority w:val="35"/>
+    <w:unhideWhenUsed/>
+    <w:qFormat/>
+    <w:rsid w:val="00E50A85"/>
     <w:pPr>
-      <w:spacing w:after="120" w:before="0"/>
+      <w:spacing w:after="200"/>
     </w:pPr>
     <w:rPr>
       <w:i/>
+      <w:iCs/>
+      <w:color w:themeColor="text2" w:val="44546A"/>
+      <w:sz w:val="18"/>
+      <w:szCs w:val="18"/>
     </w:rPr>
   </w:style>
-  <w:style w:customStyle="1" w:styleId="TableCaption" w:type="paragraph">
-    <w:name w:val="Table Caption"/>
-    <w:basedOn w:val="Caption"/>
-    <w:pPr>
-      <w:keepNext/>
-    </w:pPr>
-  </w:style>
-  <w:style w:customStyle="1" w:styleId="ImageCaption" w:type="paragraph">
-    <w:name w:val="Image Caption"/>
-    <w:basedOn w:val="Caption"/>
-  </w:style>
-  <w:style w:customStyle="1" w:styleId="Figure" w:type="paragraph">
-    <w:name w:val="Figure"/>
+  <w:style w:styleId="FootnoteText" w:type="paragraph">
+    <w:name w:val="footnote text"/>
     <w:basedOn w:val="Normal"/>
-  </w:style>
-  <w:style w:customStyle="1" w:styleId="CaptionedFigure" w:type="paragraph">
-    <w:name w:val="Captioned Figure"/>
-    <w:basedOn w:val="Figure"/>
-    <w:pPr>
-      <w:keepNext/>
-    </w:pPr>
-  </w:style>
-  <w:style w:customStyle="1" w:styleId="BodyTextChar" w:type="character">
-    <w:name w:val="Body Text Char"/>
+    <w:link w:val="FootnoteTextChar"/>
+    <w:uiPriority w:val="99"/>
+    <w:semiHidden/>
+    <w:unhideWhenUsed/>
+    <w:rsid w:val="001B04B2"/>
+    <w:rPr>
+      <w:sz w:val="20"/>
+      <w:szCs w:val="20"/>
+    </w:rPr>
+  </w:style>
+  <w:style w:customStyle="1" w:styleId="FootnoteTextChar" w:type="character">
+    <w:name w:val="Footnote Text Char"/>
     <w:basedOn w:val="DefaultParagraphFont"/>
-    <w:link w:val="BodyText"/>
-  </w:style>
-  <w:style w:customStyle="1" w:styleId="VerbatimChar" w:type="character">
-    <w:name w:val="Verbatim Char"/>
-    <w:basedOn w:val="BodyTextChar"/>
+    <w:link w:val="FootnoteText"/>
+    <w:uiPriority w:val="99"/>
+    <w:semiHidden/>
+    <w:rsid w:val="001B04B2"/>
     <w:rPr>
-      <w:rFonts w:ascii="Consolas" w:hAnsi="Consolas"/>
-      <w:sz w:val="22"/>
+      <w:sz w:val="20"/>
+      <w:szCs w:val="20"/>
     </w:rPr>
   </w:style>
-  <w:style w:customStyle="1" w:styleId="SectionNumber" w:type="character">
-    <w:name w:val="Section Number"/>
-    <w:basedOn w:val="BodyTextChar"/>
-  </w:style>
   <w:style w:styleId="FootnoteReference" w:type="character">
-    <w:name w:val="Footnote Reference"/>
-    <w:basedOn w:val="BodyTextChar"/>
+    <w:name w:val="footnote reference"/>
+    <w:basedOn w:val="DefaultParagraphFont"/>
+    <w:uiPriority w:val="99"/>
+    <w:semiHidden/>
+    <w:unhideWhenUsed/>
+    <w:rsid w:val="001B04B2"/>
     <w:rPr>
       <w:vertAlign w:val="superscript"/>
     </w:rPr>
   </w:style>
-  <w:style w:styleId="Hyperlink" w:type="character">
-    <w:name w:val="Hyperlink"/>
-    <w:basedOn w:val="BodyTextChar"/>
+  <w:style w:styleId="EndnoteReference" w:type="character">
+    <w:name w:val="endnote reference"/>
+    <w:basedOn w:val="DefaultParagraphFont"/>
+    <w:uiPriority w:val="99"/>
+    <w:semiHidden/>
+    <w:unhideWhenUsed/>
+    <w:rsid w:val="00CF02FF"/>
     <w:rPr>
-      <w:color w:themeColor="accent1" w:val="4F81BD"/>
+      <w:vertAlign w:val="superscript"/>
     </w:rPr>
   </w:style>
-  <w:style w:styleId="TOCHeading" w:type="paragraph">
-    <w:name w:val="TOC Heading"/>
-    <w:basedOn w:val="Heading1"/>
-    <w:next w:val="BodyText"/>
+  <w:style w:styleId="TableGrid" w:type="table">
+    <w:name w:val="Table Grid"/>
+    <w:basedOn w:val="TableNormal"/>
     <w:uiPriority w:val="39"/>
-    <w:unhideWhenUsed/>
-    <w:qFormat/>
-    <w:pPr>
-      <w:spacing w:before="240" w:line="259" w:lineRule="auto"/>
-      <w:outlineLvl w:val="9"/>
-    </w:pPr>
+    <w:rsid w:val="007B096D"/>
+    <w:tblPr>
+      <w:tblBorders>
+        <w:top w:color="auto" w:space="0" w:sz="4" w:val="single"/>
+        <w:left w:color="auto" w:space="0" w:sz="4" w:val="single"/>
+        <w:bottom w:color="auto" w:space="0" w:sz="4" w:val="single"/>
+        <w:right w:color="auto" w:space="0" w:sz="4" w:val="single"/>
+        <w:insideH w:color="auto" w:space="0" w:sz="4" w:val="single"/>
+        <w:insideV w:color="auto" w:space="0" w:sz="4" w:val="single"/>
+      </w:tblBorders>
+    </w:tblPr>
+  </w:style>
+  <w:style w:customStyle="1" w:styleId="GridTable1Light-Accent11" w:type="table">
+    <w:name w:val="Grid Table 1 Light - Accent 11"/>
+    <w:basedOn w:val="TableNormal"/>
+    <w:uiPriority w:val="46"/>
+    <w:rsid w:val="007B096D"/>
+    <w:tblPr>
+      <w:tblStyleRowBandSize w:val="1"/>
+      <w:tblStyleColBandSize w:val="1"/>
+      <w:tblBorders>
+        <w:top w:color="B4C6E7" w:space="0" w:sz="4" w:themeColor="accent1" w:themeTint="66" w:val="single"/>
+        <w:left w:color="B4C6E7" w:space="0" w:sz="4" w:themeColor="accent1" w:themeTint="66" w:val="single"/>
+        <w:bottom w:color="B4C6E7" w:space="0" w:sz="4" w:themeColor="accent1" w:themeTint="66" w:val="single"/>
+        <w:right w:color="B4C6E7" w:space="0" w:sz="4" w:themeColor="accent1" w:themeTint="66" w:val="single"/>
+        <w:insideH w:color="B4C6E7" w:space="0" w:sz="4" w:themeColor="accent1" w:themeTint="66" w:val="single"/>
+        <w:insideV w:color="B4C6E7" w:space="0" w:sz="4" w:themeColor="accent1" w:themeTint="66" w:val="single"/>
+      </w:tblBorders>
+    </w:tblPr>
+    <w:tblStylePr w:type="firstRow">
+      <w:rPr>
+        <w:b/>
+        <w:bCs/>
+      </w:rPr>
+      <w:tblPr/>
+      <w:tcPr>
+        <w:tcBorders>
+          <w:bottom w:color="8EAADB" w:space="0" w:sz="12" w:themeColor="accent1" w:themeTint="99" w:val="single"/>
+        </w:tcBorders>
+      </w:tcPr>
+    </w:tblStylePr>
+    <w:tblStylePr w:type="lastRow">
+      <w:rPr>
+        <w:b/>
+        <w:bCs/>
+      </w:rPr>
+      <w:tblPr/>
+      <w:tcPr>
+        <w:tcBorders>
+          <w:top w:color="8EAADB" w:space="0" w:sz="2" w:themeColor="accent1" w:themeTint="99" w:val="double"/>
+        </w:tcBorders>
+      </w:tcPr>
+    </w:tblStylePr>
+    <w:tblStylePr w:type="firstCol">
+      <w:rPr>
+        <w:b/>
+        <w:bCs/>
+      </w:rPr>
+    </w:tblStylePr>
+    <w:tblStylePr w:type="lastCol">
+      <w:rPr>
+        <w:b/>
+        <w:bCs/>
+      </w:rPr>
+    </w:tblStylePr>
+  </w:style>
+  <w:style w:customStyle="1" w:styleId="PlainTable31" w:type="table">
+    <w:name w:val="Plain Table 31"/>
+    <w:basedOn w:val="TableNormal"/>
+    <w:uiPriority w:val="43"/>
+    <w:rsid w:val="007B096D"/>
+    <w:tblPr>
+      <w:tblStyleRowBandSize w:val="1"/>
+      <w:tblStyleColBandSize w:val="1"/>
+    </w:tblPr>
+    <w:tblStylePr w:type="firstRow">
+      <w:rPr>
+        <w:b/>
+        <w:bCs/>
+        <w:caps/>
+      </w:rPr>
+      <w:tblPr/>
+      <w:tcPr>
+        <w:tcBorders>
+          <w:bottom w:color="7F7F7F" w:space="0" w:sz="4" w:themeColor="text1" w:themeTint="80" w:val="single"/>
+        </w:tcBorders>
+      </w:tcPr>
+    </w:tblStylePr>
+    <w:tblStylePr w:type="lastRow">
+      <w:rPr>
+        <w:b/>
+        <w:bCs/>
+        <w:caps/>
+      </w:rPr>
+      <w:tblPr/>
+      <w:tcPr>
+        <w:tcBorders>
+          <w:top w:val="nil"/>
+        </w:tcBorders>
+      </w:tcPr>
+    </w:tblStylePr>
+    <w:tblStylePr w:type="firstCol">
+      <w:rPr>
+        <w:b/>
+        <w:bCs/>
+        <w:caps/>
+      </w:rPr>
+      <w:tblPr/>
+      <w:tcPr>
+        <w:tcBorders>
+          <w:right w:color="7F7F7F" w:space="0" w:sz="4" w:themeColor="text1" w:themeTint="80" w:val="single"/>
+        </w:tcBorders>
+      </w:tcPr>
+    </w:tblStylePr>
+    <w:tblStylePr w:type="lastCol">
+      <w:rPr>
+        <w:b/>
+        <w:bCs/>
+        <w:caps/>
+      </w:rPr>
+      <w:tblPr/>
+      <w:tcPr>
+        <w:tcBorders>
+          <w:left w:val="nil"/>
+        </w:tcBorders>
+      </w:tcPr>
+    </w:tblStylePr>
+    <w:tblStylePr w:type="band1Vert">
+      <w:tblPr/>
+      <w:tcPr>
+        <w:shd w:color="auto" w:fill="F2F2F2" w:themeFill="background1" w:themeFillShade="F2" w:val="clear"/>
+      </w:tcPr>
+    </w:tblStylePr>
+    <w:tblStylePr w:type="band1Horz">
+      <w:tblPr/>
+      <w:tcPr>
+        <w:shd w:color="auto" w:fill="F2F2F2" w:themeFill="background1" w:themeFillShade="F2" w:val="clear"/>
+      </w:tcPr>
+    </w:tblStylePr>
+    <w:tblStylePr w:type="neCell">
+      <w:tblPr/>
+      <w:tcPr>
+        <w:tcBorders>
+          <w:left w:val="nil"/>
+        </w:tcBorders>
+      </w:tcPr>
+    </w:tblStylePr>
+    <w:tblStylePr w:type="nwCell">
+      <w:tblPr/>
+      <w:tcPr>
+        <w:tcBorders>
+          <w:right w:val="nil"/>
+        </w:tcBorders>
+      </w:tcPr>
+    </w:tblStylePr>
+  </w:style>
+  <w:style w:customStyle="1" w:styleId="PlainTable51" w:type="table">
+    <w:name w:val="Plain Table 51"/>
+    <w:basedOn w:val="TableNormal"/>
+    <w:uiPriority w:val="45"/>
+    <w:rsid w:val="007B096D"/>
+    <w:tblPr>
+      <w:tblStyleRowBandSize w:val="1"/>
+      <w:tblStyleColBandSize w:val="1"/>
+    </w:tblPr>
+    <w:tblStylePr w:type="firstRow">
+      <w:rPr>
+        <w:rFonts w:asciiTheme="majorHAnsi" w:cstheme="majorBidi" w:eastAsiaTheme="majorEastAsia" w:hAnsiTheme="majorHAnsi"/>
+        <w:i/>
+        <w:iCs/>
+        <w:sz w:val="26"/>
+      </w:rPr>
+      <w:tblPr/>
+      <w:tcPr>
+        <w:tcBorders>
+          <w:bottom w:color="7F7F7F" w:space="0" w:sz="4" w:themeColor="text1" w:themeTint="80" w:val="single"/>
+        </w:tcBorders>
+        <w:shd w:color="auto" w:fill="FFFFFF" w:themeFill="background1" w:val="clear"/>
+      </w:tcPr>
+    </w:tblStylePr>
+    <w:tblStylePr w:type="lastRow">
+      <w:rPr>
+        <w:rFonts w:asciiTheme="majorHAnsi" w:cstheme="majorBidi" w:eastAsiaTheme="majorEastAsia" w:hAnsiTheme="majorHAnsi"/>
+        <w:i/>
+        <w:iCs/>
+        <w:sz w:val="26"/>
+      </w:rPr>
+      <w:tblPr/>
+      <w:tcPr>
+        <w:tcBorders>
+          <w:top w:color="7F7F7F" w:space="0" w:sz="4" w:themeColor="text1" w:themeTint="80" w:val="single"/>
+        </w:tcBorders>
+        <w:shd w:color="auto" w:fill="FFFFFF" w:themeFill="background1" w:val="clear"/>
+      </w:tcPr>
+    </w:tblStylePr>
+    <w:tblStylePr w:type="firstCol">
+      <w:pPr>
+        <w:jc w:val="right"/>
+      </w:pPr>
+      <w:rPr>
+        <w:rFonts w:asciiTheme="majorHAnsi" w:cstheme="majorBidi" w:eastAsiaTheme="majorEastAsia" w:hAnsiTheme="majorHAnsi"/>
+        <w:i/>
+        <w:iCs/>
+        <w:sz w:val="26"/>
+      </w:rPr>
+      <w:tblPr/>
+      <w:tcPr>
+        <w:tcBorders>
+          <w:right w:color="7F7F7F" w:space="0" w:sz="4" w:themeColor="text1" w:themeTint="80" w:val="single"/>
+        </w:tcBorders>
+        <w:shd w:color="auto" w:fill="FFFFFF" w:themeFill="background1" w:val="clear"/>
+      </w:tcPr>
+    </w:tblStylePr>
+    <w:tblStylePr w:type="lastCol">
+      <w:rPr>
+        <w:rFonts w:asciiTheme="majorHAnsi" w:cstheme="majorBidi" w:eastAsiaTheme="majorEastAsia" w:hAnsiTheme="majorHAnsi"/>
+        <w:i/>
+        <w:iCs/>
+        <w:sz w:val="26"/>
+      </w:rPr>
+      <w:tblPr/>
+      <w:tcPr>
+        <w:tcBorders>
+          <w:left w:color="7F7F7F" w:space="0" w:sz="4" w:themeColor="text1" w:themeTint="80" w:val="single"/>
+        </w:tcBorders>
+        <w:shd w:color="auto" w:fill="FFFFFF" w:themeFill="background1" w:val="clear"/>
+      </w:tcPr>
+    </w:tblStylePr>
+    <w:tblStylePr w:type="band1Vert">
+      <w:tblPr/>
+      <w:tcPr>
+        <w:shd w:color="auto" w:fill="F2F2F2" w:themeFill="background1" w:themeFillShade="F2" w:val="clear"/>
+      </w:tcPr>
+    </w:tblStylePr>
+    <w:tblStylePr w:type="band1Horz">
+      <w:tblPr/>
+      <w:tcPr>
+        <w:shd w:color="auto" w:fill="F2F2F2" w:themeFill="background1" w:themeFillShade="F2" w:val="clear"/>
+      </w:tcPr>
+    </w:tblStylePr>
+    <w:tblStylePr w:type="neCell">
+      <w:tblPr/>
+      <w:tcPr>
+        <w:tcBorders>
+          <w:left w:val="nil"/>
+        </w:tcBorders>
+      </w:tcPr>
+    </w:tblStylePr>
+    <w:tblStylePr w:type="nwCell">
+      <w:tblPr/>
+      <w:tcPr>
+        <w:tcBorders>
+          <w:right w:val="nil"/>
+        </w:tcBorders>
+      </w:tcPr>
+    </w:tblStylePr>
+    <w:tblStylePr w:type="seCell">
+      <w:tblPr/>
+      <w:tcPr>
+        <w:tcBorders>
+          <w:left w:val="nil"/>
+        </w:tcBorders>
+      </w:tcPr>
+    </w:tblStylePr>
+    <w:tblStylePr w:type="swCell">
+      <w:tblPr/>
+      <w:tcPr>
+        <w:tcBorders>
+          <w:right w:val="nil"/>
+        </w:tcBorders>
+      </w:tcPr>
+    </w:tblStylePr>
+  </w:style>
+  <w:style w:customStyle="1" w:styleId="PlainTable11" w:type="table">
+    <w:name w:val="Plain Table 11"/>
+    <w:basedOn w:val="TableNormal"/>
+    <w:uiPriority w:val="41"/>
+    <w:rsid w:val="007B096D"/>
+    <w:tblPr>
+      <w:tblStyleRowBandSize w:val="1"/>
+      <w:tblStyleColBandSize w:val="1"/>
+      <w:tblBorders>
+        <w:top w:color="BFBFBF" w:space="0" w:sz="4" w:themeColor="background1" w:themeShade="BF" w:val="single"/>
+        <w:left w:color="BFBFBF" w:space="0" w:sz="4" w:themeColor="background1" w:themeShade="BF" w:val="single"/>
+        <w:bottom w:color="BFBFBF" w:space="0" w:sz="4" w:themeColor="background1" w:themeShade="BF" w:val="single"/>
+        <w:right w:color="BFBFBF" w:space="0" w:sz="4" w:themeColor="background1" w:themeShade="BF" w:val="single"/>
+        <w:insideH w:color="BFBFBF" w:space="0" w:sz="4" w:themeColor="background1" w:themeShade="BF" w:val="single"/>
+        <w:insideV w:color="BFBFBF" w:space="0" w:sz="4" w:themeColor="background1" w:themeShade="BF" w:val="single"/>
+      </w:tblBorders>
+    </w:tblPr>
+    <w:tblStylePr w:type="firstRow">
+      <w:rPr>
+        <w:b/>
+        <w:bCs/>
+      </w:rPr>
+    </w:tblStylePr>
+    <w:tblStylePr w:type="lastRow">
+      <w:rPr>
+        <w:b/>
+        <w:bCs/>
+      </w:rPr>
+      <w:tblPr/>
+      <w:tcPr>
+        <w:tcBorders>
+          <w:top w:color="BFBFBF" w:space="0" w:sz="4" w:themeColor="background1" w:themeShade="BF" w:val="double"/>
+        </w:tcBorders>
+      </w:tcPr>
+    </w:tblStylePr>
+    <w:tblStylePr w:type="firstCol">
+      <w:rPr>
+        <w:b/>
+        <w:bCs/>
+      </w:rPr>
+    </w:tblStylePr>
+    <w:tblStylePr w:type="lastCol">
+      <w:rPr>
+        <w:b/>
+        <w:bCs/>
+      </w:rPr>
+    </w:tblStylePr>
+    <w:tblStylePr w:type="band1Vert">
+      <w:tblPr/>
+      <w:tcPr>
+        <w:shd w:color="auto" w:fill="F2F2F2" w:themeFill="background1" w:themeFillShade="F2" w:val="clear"/>
+      </w:tcPr>
+    </w:tblStylePr>
+    <w:tblStylePr w:type="band1Horz">
+      <w:tblPr/>
+      <w:tcPr>
+        <w:shd w:color="auto" w:fill="F2F2F2" w:themeFill="background1" w:themeFillShade="F2" w:val="clear"/>
+      </w:tcPr>
+    </w:tblStylePr>
+  </w:style>
+  <w:style w:customStyle="1" w:styleId="TableGridLight1" w:type="table">
+    <w:name w:val="Table Grid Light1"/>
+    <w:basedOn w:val="TableNormal"/>
+    <w:uiPriority w:val="40"/>
+    <w:rsid w:val="007B096D"/>
+    <w:tblPr>
+      <w:tblBorders>
+        <w:top w:color="BFBFBF" w:space="0" w:sz="4" w:themeColor="background1" w:themeShade="BF" w:val="single"/>
+        <w:left w:color="BFBFBF" w:space="0" w:sz="4" w:themeColor="background1" w:themeShade="BF" w:val="single"/>
+        <w:bottom w:color="BFBFBF" w:space="0" w:sz="4" w:themeColor="background1" w:themeShade="BF" w:val="single"/>
+        <w:right w:color="BFBFBF" w:space="0" w:sz="4" w:themeColor="background1" w:themeShade="BF" w:val="single"/>
+        <w:insideH w:color="BFBFBF" w:space="0" w:sz="4" w:themeColor="background1" w:themeShade="BF" w:val="single"/>
+        <w:insideV w:color="BFBFBF" w:space="0" w:sz="4" w:themeColor="background1" w:themeShade="BF" w:val="single"/>
+      </w:tblBorders>
+    </w:tblPr>
+  </w:style>
+  <w:style w:customStyle="1" w:styleId="PlainTable41" w:type="table">
+    <w:name w:val="Plain Table 41"/>
+    <w:basedOn w:val="TableNormal"/>
+    <w:uiPriority w:val="44"/>
+    <w:rsid w:val="007B096D"/>
+    <w:tblPr>
+      <w:tblStyleRowBandSize w:val="1"/>
+      <w:tblStyleColBandSize w:val="1"/>
+    </w:tblPr>
+    <w:tblStylePr w:type="firstRow">
+      <w:rPr>
+        <w:b/>
+        <w:bCs/>
+      </w:rPr>
+    </w:tblStylePr>
+    <w:tblStylePr w:type="lastRow">
+      <w:rPr>
+        <w:b/>
+        <w:bCs/>
+      </w:rPr>
+    </w:tblStylePr>
+    <w:tblStylePr w:type="firstCol">
+      <w:rPr>
+        <w:b/>
+        <w:bCs/>
+      </w:rPr>
+    </w:tblStylePr>
+    <w:tblStylePr w:type="lastCol">
+      <w:rPr>
+        <w:b/>
+        <w:bCs/>
+      </w:rPr>
+    </w:tblStylePr>
+    <w:tblStylePr w:type="band1Vert">
+      <w:tblPr/>
+      <w:tcPr>
+        <w:shd w:color="auto" w:fill="F2F2F2" w:themeFill="background1" w:themeFillShade="F2" w:val="clear"/>
+      </w:tcPr>
+    </w:tblStylePr>
+    <w:tblStylePr w:type="band1Horz">
+      <w:tblPr/>
+      <w:tcPr>
+        <w:shd w:color="auto" w:fill="F2F2F2" w:themeFill="background1" w:themeFillShade="F2" w:val="clear"/>
+      </w:tcPr>
+    </w:tblStylePr>
+  </w:style>
+  <w:style w:customStyle="1" w:styleId="GridTable1Light1" w:type="table">
+    <w:name w:val="Grid Table 1 Light1"/>
+    <w:basedOn w:val="TableNormal"/>
+    <w:uiPriority w:val="46"/>
+    <w:rsid w:val="007B096D"/>
+    <w:tblPr>
+      <w:tblStyleRowBandSize w:val="1"/>
+      <w:tblStyleColBandSize w:val="1"/>
+      <w:tblBorders>
+        <w:top w:color="999999" w:space="0" w:sz="4" w:themeColor="text1" w:themeTint="66" w:val="single"/>
+        <w:left w:color="999999" w:space="0" w:sz="4" w:themeColor="text1" w:themeTint="66" w:val="single"/>
+        <w:bottom w:color="999999" w:space="0" w:sz="4" w:themeColor="text1" w:themeTint="66" w:val="single"/>
+        <w:right w:color="999999" w:space="0" w:sz="4" w:themeColor="text1" w:themeTint="66" w:val="single"/>
+        <w:insideH w:color="999999" w:space="0" w:sz="4" w:themeColor="text1" w:themeTint="66" w:val="single"/>
+        <w:insideV w:color="999999" w:space="0" w:sz="4" w:themeColor="text1" w:themeTint="66" w:val="single"/>
+      </w:tblBorders>
+    </w:tblPr>
+    <w:tblStylePr w:type="firstRow">
+      <w:rPr>
+        <w:b/>
+        <w:bCs/>
+      </w:rPr>
+      <w:tblPr/>
+      <w:tcPr>
+        <w:tcBorders>
+          <w:bottom w:color="666666" w:space="0" w:sz="12" w:themeColor="text1" w:themeTint="99" w:val="single"/>
+        </w:tcBorders>
+      </w:tcPr>
+    </w:tblStylePr>
+    <w:tblStylePr w:type="lastRow">
+      <w:rPr>
+        <w:b/>
+        <w:bCs/>
+      </w:rPr>
+      <w:tblPr/>
+      <w:tcPr>
+        <w:tcBorders>
+          <w:top w:color="666666" w:space="0" w:sz="2" w:themeColor="text1" w:themeTint="99" w:val="double"/>
+        </w:tcBorders>
+      </w:tcPr>
+    </w:tblStylePr>
+    <w:tblStylePr w:type="firstCol">
+      <w:rPr>
+        <w:b/>
+        <w:bCs/>
+      </w:rPr>
+    </w:tblStylePr>
+    <w:tblStylePr w:type="lastCol">
+      <w:rPr>
+        <w:b/>
+        <w:bCs/>
+      </w:rPr>
+    </w:tblStylePr>
+  </w:style>
+  <w:style w:customStyle="1" w:styleId="GridTable1Light-Accent21" w:type="table">
+    <w:name w:val="Grid Table 1 Light - Accent 21"/>
+    <w:basedOn w:val="TableNormal"/>
+    <w:uiPriority w:val="46"/>
+    <w:rsid w:val="007B096D"/>
+    <w:tblPr>
+      <w:tblStyleRowBandSize w:val="1"/>
+      <w:tblStyleColBandSize w:val="1"/>
+      <w:tblBorders>
+        <w:top w:color="F7CAAC" w:space="0" w:sz="4" w:themeColor="accent2" w:themeTint="66" w:val="single"/>
+        <w:left w:color="F7CAAC" w:space="0" w:sz="4" w:themeColor="accent2" w:themeTint="66" w:val="single"/>
+        <w:bottom w:color="F7CAAC" w:space="0" w:sz="4" w:themeColor="accent2" w:themeTint="66" w:val="single"/>
+        <w:right w:color="F7CAAC" w:space="0" w:sz="4" w:themeColor="accent2" w:themeTint="66" w:val="single"/>
+        <w:insideH w:color="F7CAAC" w:space="0" w:sz="4" w:themeColor="accent2" w:themeTint="66" w:val="single"/>
+        <w:insideV w:color="F7CAAC" w:space="0" w:sz="4" w:themeColor="accent2" w:themeTint="66" w:val="single"/>
+      </w:tblBorders>
+    </w:tblPr>
+    <w:tblStylePr w:type="firstRow">
+      <w:rPr>
+        <w:b/>
+        <w:bCs/>
+      </w:rPr>
+      <w:tblPr/>
+      <w:tcPr>
+        <w:tcBorders>
+          <w:bottom w:color="F4B083" w:space="0" w:sz="12" w:themeColor="accent2" w:themeTint="99" w:val="single"/>
+        </w:tcBorders>
+      </w:tcPr>
+    </w:tblStylePr>
+    <w:tblStylePr w:type="lastRow">
+      <w:rPr>
+        <w:b/>
+        <w:bCs/>
+      </w:rPr>
+      <w:tblPr/>
+      <w:tcPr>
+        <w:tcBorders>
+          <w:top w:color="F4B083" w:space="0" w:sz="2" w:themeColor="accent2" w:themeTint="99" w:val="double"/>
+        </w:tcBorders>
+      </w:tcPr>
+    </w:tblStylePr>
+    <w:tblStylePr w:type="firstCol">
+      <w:rPr>
+        <w:b/>
+        <w:bCs/>
+      </w:rPr>
+    </w:tblStylePr>
+    <w:tblStylePr w:type="lastCol">
+      <w:rPr>
+        <w:b/>
+        <w:bCs/>
+      </w:rPr>
+    </w:tblStylePr>
+  </w:style>
+  <w:style w:customStyle="1" w:styleId="GridTable2-Accent31" w:type="table">
+    <w:name w:val="Grid Table 2 - Accent 31"/>
+    <w:basedOn w:val="TableNormal"/>
+    <w:uiPriority w:val="47"/>
+    <w:rsid w:val="007B096D"/>
+    <w:tblPr>
+      <w:tblStyleRowBandSize w:val="1"/>
+      <w:tblStyleColBandSize w:val="1"/>
+      <w:tblBorders>
+        <w:top w:color="C9C9C9" w:space="0" w:sz="2" w:themeColor="accent3" w:themeTint="99" w:val="single"/>
+        <w:bottom w:color="C9C9C9" w:space="0" w:sz="2" w:themeColor="accent3" w:themeTint="99" w:val="single"/>
+        <w:insideH w:color="C9C9C9" w:space="0" w:sz="2" w:themeColor="accent3" w:themeTint="99" w:val="single"/>
+        <w:insideV w:color="C9C9C9" w:space="0" w:sz="2" w:themeColor="accent3" w:themeTint="99" w:val="single"/>
+      </w:tblBorders>
+    </w:tblPr>
+    <w:tblStylePr w:type="firstRow">
+      <w:rPr>
+        <w:b/>
+        <w:bCs/>
+      </w:rPr>
+      <w:tblPr/>
+      <w:tcPr>
+        <w:tcBorders>
+          <w:top w:val="nil"/>
+          <w:bottom w:color="C9C9C9" w:space="0" w:sz="12" w:themeColor="accent3" w:themeTint="99" w:val="single"/>
+          <w:insideH w:val="nil"/>
+          <w:insideV w:val="nil"/>
+        </w:tcBorders>
+        <w:shd w:color="auto" w:fill="FFFFFF" w:themeFill="background1" w:val="clear"/>
+      </w:tcPr>
+    </w:tblStylePr>
+    <w:tblStylePr w:type="lastRow">
+      <w:rPr>
+        <w:b/>
+        <w:bCs/>
+      </w:rPr>
+      <w:tblPr/>
+      <w:tcPr>
+        <w:tcBorders>
+          <w:top w:color="C9C9C9" w:space="0" w:sz="2" w:themeColor="accent3" w:themeTint="99" w:val="double"/>
+          <w:bottom w:val="nil"/>
+          <w:insideH w:val="nil"/>
+          <w:insideV w:val="nil"/>
+        </w:tcBorders>
+        <w:shd w:color="auto" w:fill="FFFFFF" w:themeFill="background1" w:val="clear"/>
+      </w:tcPr>
+    </w:tblStylePr>
+    <w:tblStylePr w:type="firstCol">
+      <w:rPr>
+        <w:b/>
+        <w:bCs/>
+      </w:rPr>
+    </w:tblStylePr>
+    <w:tblStylePr w:type="lastCol">
+      <w:rPr>
+        <w:b/>
+        <w:bCs/>
+      </w:rPr>
+    </w:tblStylePr>
+    <w:tblStylePr w:type="band1Vert">
+      <w:tblPr/>
+      <w:tcPr>
+        <w:shd w:color="auto" w:fill="EDEDED" w:themeFill="accent3" w:themeFillTint="33" w:val="clear"/>
+      </w:tcPr>
+    </w:tblStylePr>
+    <w:tblStylePr w:type="band1Horz">
+      <w:tblPr/>
+      <w:tcPr>
+        <w:shd w:color="auto" w:fill="EDEDED" w:themeFill="accent3" w:themeFillTint="33" w:val="clear"/>
+      </w:tcPr>
+    </w:tblStylePr>
+  </w:style>
+  <w:style w:customStyle="1" w:styleId="GridTable21" w:type="table">
+    <w:name w:val="Grid Table 21"/>
+    <w:basedOn w:val="TableNormal"/>
+    <w:uiPriority w:val="47"/>
+    <w:rsid w:val="007B096D"/>
+    <w:tblPr>
+      <w:tblStyleRowBandSize w:val="1"/>
+      <w:tblStyleColBandSize w:val="1"/>
+      <w:tblBorders>
+        <w:top w:color="666666" w:space="0" w:sz="2" w:themeColor="text1" w:themeTint="99" w:val="single"/>
+        <w:bottom w:color="666666" w:space="0" w:sz="2" w:themeColor="text1" w:themeTint="99" w:val="single"/>
+        <w:insideH w:color="666666" w:space="0" w:sz="2" w:themeColor="text1" w:themeTint="99" w:val="single"/>
+        <w:insideV w:color="666666" w:space="0" w:sz="2" w:themeColor="text1" w:themeTint="99" w:val="single"/>
+      </w:tblBorders>
+    </w:tblPr>
+    <w:tblStylePr w:type="firstRow">
+      <w:rPr>
+        <w:b/>
+        <w:bCs/>
+      </w:rPr>
+      <w:tblPr/>
+      <w:tcPr>
+        <w:tcBorders>
+          <w:top w:val="nil"/>
+          <w:bottom w:color="666666" w:space="0" w:sz="12" w:themeColor="text1" w:themeTint="99" w:val="single"/>
+          <w:insideH w:val="nil"/>
+          <w:insideV w:val="nil"/>
+        </w:tcBorders>
+        <w:shd w:color="auto" w:fill="FFFFFF" w:themeFill="background1" w:val="clear"/>
+      </w:tcPr>
+    </w:tblStylePr>
+    <w:tblStylePr w:type="lastRow">
+      <w:rPr>
+        <w:b/>
+        <w:bCs/>
+      </w:rPr>
+      <w:tblPr/>
+      <w:tcPr>
+        <w:tcBorders>
+          <w:top w:color="666666" w:space="0" w:sz="2" w:themeColor="text1" w:themeTint="99" w:val="double"/>
+          <w:bottom w:val="nil"/>
+          <w:insideH w:val="nil"/>
+          <w:insideV w:val="nil"/>
+        </w:tcBorders>
+        <w:shd w:color="auto" w:fill="FFFFFF" w:themeFill="background1" w:val="clear"/>
+      </w:tcPr>
+    </w:tblStylePr>
+    <w:tblStylePr w:type="firstCol">
+      <w:rPr>
+        <w:b/>
+        <w:bCs/>
+      </w:rPr>
+    </w:tblStylePr>
+    <w:tblStylePr w:type="lastCol">
+      <w:rPr>
+        <w:b/>
+        <w:bCs/>
+      </w:rPr>
+    </w:tblStylePr>
+    <w:tblStylePr w:type="band1Vert">
+      <w:tblPr/>
+      <w:tcPr>
+        <w:shd w:color="auto" w:fill="CCCCCC" w:themeFill="text1" w:themeFillTint="33" w:val="clear"/>
+      </w:tcPr>
+    </w:tblStylePr>
+    <w:tblStylePr w:type="band1Horz">
+      <w:tblPr/>
+      <w:tcPr>
+        <w:shd w:color="auto" w:fill="CCCCCC" w:themeFill="text1" w:themeFillTint="33" w:val="clear"/>
+      </w:tcPr>
+    </w:tblStylePr>
+  </w:style>
+  <w:style w:customStyle="1" w:styleId="PlainTable21" w:type="table">
+    <w:name w:val="Plain Table 21"/>
+    <w:basedOn w:val="TableNormal"/>
+    <w:uiPriority w:val="42"/>
+    <w:rsid w:val="007B096D"/>
+    <w:tblPr>
+      <w:tblStyleRowBandSize w:val="1"/>
+      <w:tblStyleColBandSize w:val="1"/>
+      <w:tblBorders>
+        <w:top w:color="7F7F7F" w:space="0" w:sz="4" w:themeColor="text1" w:themeTint="80" w:val="single"/>
+        <w:bottom w:color="7F7F7F" w:space="0" w:sz="4" w:themeColor="text1" w:themeTint="80" w:val="single"/>
+      </w:tblBorders>
+    </w:tblPr>
+    <w:tblStylePr w:type="firstRow">
+      <w:rPr>
+        <w:b/>
+        <w:bCs/>
+      </w:rPr>
+      <w:tblPr/>
+      <w:tcPr>
+        <w:tcBorders>
+          <w:bottom w:color="7F7F7F" w:space="0" w:sz="4" w:themeColor="text1" w:themeTint="80" w:val="single"/>
+        </w:tcBorders>
+      </w:tcPr>
+    </w:tblStylePr>
+    <w:tblStylePr w:type="lastRow">
+      <w:rPr>
+        <w:b/>
+        <w:bCs/>
+      </w:rPr>
+      <w:tblPr/>
+      <w:tcPr>
+        <w:tcBorders>
+          <w:top w:color="7F7F7F" w:space="0" w:sz="4" w:themeColor="text1" w:themeTint="80" w:val="single"/>
+        </w:tcBorders>
+      </w:tcPr>
+    </w:tblStylePr>
+    <w:tblStylePr w:type="firstCol">
+      <w:rPr>
+        <w:b/>
+        <w:bCs/>
+      </w:rPr>
+    </w:tblStylePr>
+    <w:tblStylePr w:type="lastCol">
+      <w:rPr>
+        <w:b/>
+        <w:bCs/>
+      </w:rPr>
+    </w:tblStylePr>
+    <w:tblStylePr w:type="band1Vert">
+      <w:tblPr/>
+      <w:tcPr>
+        <w:tcBorders>
+          <w:left w:color="7F7F7F" w:space="0" w:sz="4" w:themeColor="text1" w:themeTint="80" w:val="single"/>
+          <w:right w:color="7F7F7F" w:space="0" w:sz="4" w:themeColor="text1" w:themeTint="80" w:val="single"/>
+        </w:tcBorders>
+      </w:tcPr>
+    </w:tblStylePr>
+    <w:tblStylePr w:type="band2Vert">
+      <w:tblPr/>
+      <w:tcPr>
+        <w:tcBorders>
+          <w:left w:color="7F7F7F" w:space="0" w:sz="4" w:themeColor="text1" w:themeTint="80" w:val="single"/>
+          <w:right w:color="7F7F7F" w:space="0" w:sz="4" w:themeColor="text1" w:themeTint="80" w:val="single"/>
+        </w:tcBorders>
+      </w:tcPr>
+    </w:tblStylePr>
+    <w:tblStylePr w:type="band1Horz">
+      <w:tblPr/>
+      <w:tcPr>
+        <w:tcBorders>
+          <w:top w:color="7F7F7F" w:space="0" w:sz="4" w:themeColor="text1" w:themeTint="80" w:val="single"/>
+          <w:bottom w:color="7F7F7F" w:space="0" w:sz="4" w:themeColor="text1" w:themeTint="80" w:val="single"/>
+        </w:tcBorders>
+      </w:tcPr>
+    </w:tblStylePr>
+  </w:style>
+  <w:style w:customStyle="1" w:styleId="Heading2Char" w:type="character">
+    <w:name w:val="Heading 2 Char"/>
+    <w:basedOn w:val="DefaultParagraphFont"/>
+    <w:link w:val="Heading2"/>
+    <w:uiPriority w:val="9"/>
+    <w:rsid w:val="00747C69"/>
     <w:rPr>
       <w:rFonts w:asciiTheme="majorHAnsi" w:cstheme="majorBidi" w:eastAsiaTheme="majorEastAsia" w:hAnsiTheme="majorHAnsi"/>
-      <w:b w:val="0"/>
-      <w:bCs w:val="0"/>
-      <w:color w:themeColor="accent1" w:themeShade="BF" w:val="365F91"/>
+      <w:color w:themeColor="accent1" w:themeShade="BF" w:val="2F5496"/>
+      <w:sz w:val="26"/>
+      <w:szCs w:val="26"/>
+    </w:rPr>
+  </w:style>
+  <w:style w:styleId="BalloonText" w:type="paragraph">
+    <w:name w:val="Balloon Text"/>
+    <w:basedOn w:val="Normal"/>
+    <w:link w:val="BalloonTextChar"/>
+    <w:uiPriority w:val="99"/>
+    <w:semiHidden/>
+    <w:unhideWhenUsed/>
+    <w:rsid w:val="004B0258"/>
+    <w:rPr>
+      <w:rFonts w:ascii="Tahoma" w:cs="Tahoma" w:hAnsi="Tahoma"/>
+      <w:sz w:val="16"/>
+      <w:szCs w:val="16"/>
+    </w:rPr>
+  </w:style>
+  <w:style w:customStyle="1" w:styleId="BalloonTextChar" w:type="character">
+    <w:name w:val="Balloon Text Char"/>
+    <w:basedOn w:val="DefaultParagraphFont"/>
+    <w:link w:val="BalloonText"/>
+    <w:uiPriority w:val="99"/>
+    <w:semiHidden/>
+    <w:rsid w:val="004B0258"/>
+    <w:rPr>
+      <w:rFonts w:ascii="Tahoma" w:cs="Tahoma" w:hAnsi="Tahoma"/>
+      <w:sz w:val="16"/>
+      <w:szCs w:val="16"/>
+    </w:rPr>
+  </w:style>
+  <w:style w:customStyle="1" w:styleId="Heading3Char" w:type="character">
+    <w:name w:val="Heading 3 Char"/>
+    <w:basedOn w:val="DefaultParagraphFont"/>
+    <w:link w:val="Heading3"/>
+    <w:uiPriority w:val="9"/>
+    <w:semiHidden/>
+    <w:rsid w:val="002773DF"/>
+    <w:rPr>
+      <w:rFonts w:asciiTheme="majorHAnsi" w:cstheme="majorBidi" w:eastAsiaTheme="majorEastAsia" w:hAnsiTheme="majorHAnsi"/>
+      <w:color w:themeColor="accent1" w:themeShade="7F" w:val="1F3763"/>
     </w:rPr>
   </w:style>
   <w:style w:type="paragraph" w:customStyle="1" w:styleId="SourceCode">
@@ -4267,44 +6470,44 @@
         <a:sysClr val="window" lastClr="FFFFFF"/>
       </a:lt1>
       <a:dk2>
-        <a:srgbClr val="0E2841"/>
+        <a:srgbClr val="44546A"/>
       </a:dk2>
       <a:lt2>
-        <a:srgbClr val="E8E8E8"/>
+        <a:srgbClr val="E7E6E6"/>
       </a:lt2>
       <a:accent1>
-        <a:srgbClr val="156082"/>
+        <a:srgbClr val="4472C4"/>
       </a:accent1>
       <a:accent2>
-        <a:srgbClr val="E97132"/>
+        <a:srgbClr val="ED7D31"/>
       </a:accent2>
       <a:accent3>
-        <a:srgbClr val="196B24"/>
+        <a:srgbClr val="A5A5A5"/>
       </a:accent3>
       <a:accent4>
-        <a:srgbClr val="0F9ED5"/>
+        <a:srgbClr val="FFC000"/>
       </a:accent4>
       <a:accent5>
-        <a:srgbClr val="A02B93"/>
+        <a:srgbClr val="5B9BD5"/>
       </a:accent5>
       <a:accent6>
-        <a:srgbClr val="4EA72E"/>
+        <a:srgbClr val="70AD47"/>
       </a:accent6>
       <a:hlink>
-        <a:srgbClr val="467886"/>
+        <a:srgbClr val="0563C1"/>
       </a:hlink>
       <a:folHlink>
-        <a:srgbClr val="96607D"/>
+        <a:srgbClr val="954F72"/>
       </a:folHlink>
     </a:clrScheme>
     <a:fontScheme name="Office">
       <a:majorFont>
-        <a:latin typeface="Aptos Display" panose="02110004020202020204"/>
+        <a:latin typeface="Calibri Light"/>
         <a:ea typeface=""/>
         <a:cs typeface=""/>
-        <a:font script="Jpan" typeface="游ゴシック Light"/>
+        <a:font script="Jpan" typeface="Yu Gothic Light"/>
         <a:font script="Hang" typeface="맑은 고딕"/>
-        <a:font script="Hans" typeface="等线 Light"/>
+        <a:font script="Hans" typeface="DengXian Light"/>
         <a:font script="Hant" typeface="新細明體"/>
         <a:font script="Arab" typeface="Times New Roman"/>
         <a:font script="Hebr" typeface="Times New Roman"/>
@@ -4332,31 +6535,14 @@
         <a:font script="Viet" typeface="Times New Roman"/>
         <a:font script="Uigh" typeface="Microsoft Uighur"/>
         <a:font script="Geor" typeface="Sylfaen"/>
-        <a:font script="Armn" typeface="Arial"/>
-        <a:font script="Bugi" typeface="Leelawadee UI"/>
-        <a:font script="Bopo" typeface="Microsoft JhengHei"/>
-        <a:font script="Java" typeface="Javanese Text"/>
-        <a:font script="Lisu" typeface="Segoe UI"/>
-        <a:font script="Mymr" typeface="Myanmar Text"/>
-        <a:font script="Nkoo" typeface="Ebrima"/>
-        <a:font script="Olck" typeface="Nirmala UI"/>
-        <a:font script="Osma" typeface="Ebrima"/>
-        <a:font script="Phag" typeface="Phagspa"/>
-        <a:font script="Syrn" typeface="Estrangelo Edessa"/>
-        <a:font script="Syrj" typeface="Estrangelo Edessa"/>
-        <a:font script="Syre" typeface="Estrangelo Edessa"/>
-        <a:font script="Sora" typeface="Nirmala UI"/>
-        <a:font script="Tale" typeface="Microsoft Tai Le"/>
-        <a:font script="Talu" typeface="Microsoft New Tai Lue"/>
-        <a:font script="Tfng" typeface="Ebrima"/>
       </a:majorFont>
       <a:minorFont>
-        <a:latin typeface="Aptos" panose="02110004020202020204"/>
+        <a:latin typeface="Calibri"/>
         <a:ea typeface=""/>
         <a:cs typeface=""/>
-        <a:font script="Jpan" typeface="游明朝"/>
+        <a:font script="Jpan" typeface="Yu Mincho"/>
         <a:font script="Hang" typeface="맑은 고딕"/>
-        <a:font script="Hans" typeface="等线"/>
+        <a:font script="Hans" typeface="DengXian"/>
         <a:font script="Hant" typeface="新細明體"/>
         <a:font script="Arab" typeface="Arial"/>
         <a:font script="Hebr" typeface="Arial"/>
@@ -4384,23 +6570,6 @@
         <a:font script="Viet" typeface="Arial"/>
         <a:font script="Uigh" typeface="Microsoft Uighur"/>
         <a:font script="Geor" typeface="Sylfaen"/>
-        <a:font script="Armn" typeface="Arial"/>
-        <a:font script="Bugi" typeface="Leelawadee UI"/>
-        <a:font script="Bopo" typeface="Microsoft JhengHei"/>
-        <a:font script="Java" typeface="Javanese Text"/>
-        <a:font script="Lisu" typeface="Segoe UI"/>
-        <a:font script="Mymr" typeface="Myanmar Text"/>
-        <a:font script="Nkoo" typeface="Ebrima"/>
-        <a:font script="Olck" typeface="Nirmala UI"/>
-        <a:font script="Osma" typeface="Ebrima"/>
-        <a:font script="Phag" typeface="Phagspa"/>
-        <a:font script="Syrn" typeface="Estrangelo Edessa"/>
-        <a:font script="Syrj" typeface="Estrangelo Edessa"/>
-        <a:font script="Syre" typeface="Estrangelo Edessa"/>
-        <a:font script="Sora" typeface="Nirmala UI"/>
-        <a:font script="Tale" typeface="Microsoft Tai Le"/>
-        <a:font script="Talu" typeface="Microsoft New Tai Lue"/>
-        <a:font script="Tfng" typeface="Ebrima"/>
       </a:minorFont>
     </a:fontScheme>
     <a:fmtScheme name="Office">
@@ -4545,7 +6714,7 @@
   <a:extraClrSchemeLst/>
   <a:extLst>
     <a:ext uri="{05A4C25C-085E-4340-85A3-A5531E510DB2}">
-      <thm15:themeFamily xmlns:thm15="http://schemas.microsoft.com/office/thememl/2012/main" name="Office Theme" id="{2E142A2C-CD16-42D6-873A-C26D2A0506FA}" vid="{1BDDFF52-6CD6-40A5-AB3C-68EB2F1E4D0A}"/>
+      <thm15:themeFamily xmlns:thm15="http://schemas.microsoft.com/office/thememl/2012/main" name="Office Theme" id="{62F939B6-93AF-4DB8-9C6B-D6C7DFDC589F}" vid="{4A3C46E8-61CC-4603-A589-7422A47A8E4A}"/>
     </a:ext>
   </a:extLst>
 </a:theme>

</xml_diff>

<commit_message>
adding proposal text p6
</commit_message>
<xml_diff>
--- a/document/proposal.docx
+++ b/document/proposal.docx
@@ -2198,7 +2198,7 @@
           <wp:inline>
             <wp:extent cx="5727700" cy="2315453"/>
             <wp:effectExtent b="0" l="0" r="0" t="0"/>
-            <wp:docPr descr="Figure 5: Tail dependence for different types of copulas and different number of random variables" title="" id="27" name="Picture"/>
+            <wp:docPr descr="Figure 1: Tail dependence for different types of copulas and different number of random variables" title="" id="27" name="Picture"/>
             <a:graphic>
               <a:graphicData uri="http://schemas.openxmlformats.org/drawingml/2006/picture">
                 <pic:pic>
@@ -2241,7 +2241,7 @@
         <w:pStyle w:val="ImageCaption"/>
       </w:pPr>
       <w:r>
-        <w:t xml:space="preserve">Figure 5: Tail dependence for different types of copulas and different number of random variables</w:t>
+        <w:t xml:space="preserve">Figure 1: Tail dependence for different types of copulas and different number of random variables</w:t>
       </w:r>
     </w:p>
     <w:p>
@@ -2297,7 +2297,7 @@
     </w:p>
     <w:bookmarkEnd w:id="31"/>
     <w:bookmarkEnd w:id="32"/>
-    <w:bookmarkStart w:id="33" w:name="methodology-and-methods"/>
+    <w:bookmarkStart w:id="38" w:name="methodology-and-methods"/>
     <w:p>
       <w:pPr>
         <w:pStyle w:val="Heading1"/>
@@ -2311,7 +2311,7 @@
         <w:pStyle w:val="FirstParagraph"/>
       </w:pPr>
       <w:r>
-        <w:t xml:space="preserve">This analysis prioritizes the generation of extreme market scenarios designed specifically for Market Risk and capital estimation purposes. Unlike studies where the intricacies of underlying asset path dynamics (such as time-dependent volatility or complex stochastic processes) are critical, this work deliberately abstracts from such details. As such there is no need to include dynamically changing portfolios (i.e. dynamic trading strategies), limiting portfolio dimension optimization to static.</w:t>
+        <w:t xml:space="preserve">This analysis prioritizes the generation of extreme market scenarios designed specifically for Market Risk and capital estimation purposes. Unlike studies where the intricacies of underlying asset path dynamics (such as time-dependent volatility or complex stochastic processes) are critical, this work deliberately abstracts from such details. As such there is no need to include dynamically changing portfolios (i.e. dynamic trading strategies), limiting portfolio dimension optimization to static. (only portfolios of approx. 500 names all long and 500 long/short hedged portfolios will used in this study).</w:t>
       </w:r>
     </w:p>
     <w:p>
@@ -2320,6 +2320,112 @@
       </w:pPr>
       <w:r>
         <w:t xml:space="preserve">A defining challenge in Market Risk is the need to evaluate the collective behavior of thousands of risk factors simultaneously, a requirement that far exceeds the scope of prior research, where simulations often focused on merely dozens of variables. This study bridges that gap by demonstrating scalability to hundreds or even thousands of risk factors, aligning with the real-world demands of large-scale risk aggregation.</w:t>
+      </w:r>
+    </w:p>
+    <w:p>
+      <w:pPr>
+        <w:pStyle w:val="BodyText"/>
+      </w:pPr>
+      <w:r>
+        <w:t xml:space="preserve">Figure below presents overall workflow of the project aiming at calibrating copula to historical timeseries.</w:t>
+      </w:r>
+      <w:r>
+        <w:t xml:space="preserve"> </w:t>
+      </w:r>
+      <w:r>
+        <w:drawing>
+          <wp:inline>
+            <wp:extent cx="5727700" cy="2315453"/>
+            <wp:effectExtent b="0" l="0" r="0" t="0"/>
+            <wp:docPr descr="Figure 2: Copula calibration workflow" title="" id="34" name="Picture"/>
+            <a:graphic>
+              <a:graphicData uri="http://schemas.openxmlformats.org/drawingml/2006/picture">
+                <pic:pic>
+                  <pic:nvPicPr>
+                    <pic:cNvPr descr="figures\Project-workflow-high.png" id="35" name="Picture"/>
+                    <pic:cNvPicPr>
+                      <a:picLocks noChangeArrowheads="1" noChangeAspect="1"/>
+                    </pic:cNvPicPr>
+                  </pic:nvPicPr>
+                  <pic:blipFill>
+                    <a:blip r:embed="rId33"/>
+                    <a:stretch>
+                      <a:fillRect/>
+                    </a:stretch>
+                  </pic:blipFill>
+                  <pic:spPr bwMode="auto">
+                    <a:xfrm>
+                      <a:off x="0" y="0"/>
+                      <a:ext cx="5727700" cy="2315453"/>
+                    </a:xfrm>
+                    <a:prstGeom prst="rect">
+                      <a:avLst/>
+                    </a:prstGeom>
+                    <a:noFill/>
+                    <a:ln w="9525">
+                      <a:noFill/>
+                      <a:headEnd/>
+                      <a:tailEnd/>
+                    </a:ln>
+                  </pic:spPr>
+                </pic:pic>
+              </a:graphicData>
+            </a:graphic>
+          </wp:inline>
+        </w:drawing>
+      </w:r>
+    </w:p>
+    <w:p>
+      <w:pPr>
+        <w:pStyle w:val="BodyText"/>
+      </w:pPr>
+      <w:r>
+        <w:t xml:space="preserve">It is further detailed in the next figure, which illustrated cumulative process of constructing different time series based on the observed history and representing required data transformations.</w:t>
+      </w:r>
+      <w:r>
+        <w:t xml:space="preserve"> </w:t>
+      </w:r>
+      <w:r>
+        <w:drawing>
+          <wp:inline>
+            <wp:extent cx="5727700" cy="2315453"/>
+            <wp:effectExtent b="0" l="0" r="0" t="0"/>
+            <wp:docPr descr="Figure 3: Detailed process of data transformations for copula calibration" title="" id="36" name="Picture"/>
+            <a:graphic>
+              <a:graphicData uri="http://schemas.openxmlformats.org/drawingml/2006/picture">
+                <pic:pic>
+                  <pic:nvPicPr>
+                    <pic:cNvPr descr="figures\Project-workflow-high.png" id="37" name="Picture"/>
+                    <pic:cNvPicPr>
+                      <a:picLocks noChangeArrowheads="1" noChangeAspect="1"/>
+                    </pic:cNvPicPr>
+                  </pic:nvPicPr>
+                  <pic:blipFill>
+                    <a:blip r:embed="rId33"/>
+                    <a:stretch>
+                      <a:fillRect/>
+                    </a:stretch>
+                  </pic:blipFill>
+                  <pic:spPr bwMode="auto">
+                    <a:xfrm>
+                      <a:off x="0" y="0"/>
+                      <a:ext cx="5727700" cy="2315453"/>
+                    </a:xfrm>
+                    <a:prstGeom prst="rect">
+                      <a:avLst/>
+                    </a:prstGeom>
+                    <a:noFill/>
+                    <a:ln w="9525">
+                      <a:noFill/>
+                      <a:headEnd/>
+                      <a:tailEnd/>
+                    </a:ln>
+                  </pic:spPr>
+                </pic:pic>
+              </a:graphicData>
+            </a:graphic>
+          </wp:inline>
+        </w:drawing>
       </w:r>
     </w:p>
     <w:p>
@@ -2386,8 +2492,8 @@
         <w:t xml:space="preserve">My aim with this software is a proof of concept rather than an end-user application.</w:t>
       </w:r>
     </w:p>
-    <w:bookmarkEnd w:id="33"/>
-    <w:bookmarkStart w:id="34" w:name="project-development-plan"/>
+    <w:bookmarkEnd w:id="38"/>
+    <w:bookmarkStart w:id="39" w:name="project-development-plan"/>
     <w:p>
       <w:pPr>
         <w:pStyle w:val="Heading1"/>
@@ -2539,8 +2645,8 @@
         <w:t xml:space="preserve">Assess obtained results, summarize observations and developed software within the report.</w:t>
       </w:r>
     </w:p>
-    <w:bookmarkEnd w:id="34"/>
-    <w:bookmarkStart w:id="40" w:name="references"/>
+    <w:bookmarkEnd w:id="39"/>
+    <w:bookmarkStart w:id="45" w:name="references"/>
     <w:p>
       <w:pPr>
         <w:pStyle w:val="Heading1"/>
@@ -2606,7 +2712,7 @@
       <w:r>
         <w:t xml:space="preserve"> </w:t>
       </w:r>
-      <w:hyperlink r:id="rId35">
+      <w:hyperlink r:id="rId40">
         <w:r>
           <w:rPr>
             <w:rStyle w:val="Hyperlink"/>
@@ -2628,7 +2734,7 @@
       <w:r>
         <w:t xml:space="preserve"> </w:t>
       </w:r>
-      <w:hyperlink r:id="rId36">
+      <w:hyperlink r:id="rId41">
         <w:r>
           <w:rPr>
             <w:rStyle w:val="Hyperlink"/>
@@ -2650,7 +2756,7 @@
       <w:r>
         <w:t xml:space="preserve"> </w:t>
       </w:r>
-      <w:hyperlink r:id="rId37">
+      <w:hyperlink r:id="rId42">
         <w:r>
           <w:rPr>
             <w:rStyle w:val="Hyperlink"/>
@@ -2669,7 +2775,7 @@
       <w:r>
         <w:t xml:space="preserve">Horvath B. et al, 2025. Generative Models in Finance: Market Generators, a Paradigm Shift in Financial Modeling.</w:t>
       </w:r>
-      <w:hyperlink r:id="rId38">
+      <w:hyperlink r:id="rId43">
         <w:r>
           <w:rPr>
             <w:rStyle w:val="Hyperlink"/>
@@ -2688,7 +2794,7 @@
       <w:r>
         <w:t xml:space="preserve">Hofert M. and Pang Z., 2025. W-transforms: Uniformity-preserving transformations and induced dependence structures.</w:t>
       </w:r>
-      <w:hyperlink r:id="rId39">
+      <w:hyperlink r:id="rId44">
         <w:r>
           <w:rPr>
             <w:rStyle w:val="Hyperlink"/>
@@ -2697,8 +2803,8 @@
         </w:r>
       </w:hyperlink>
     </w:p>
-    <w:bookmarkEnd w:id="40"/>
-    <w:bookmarkStart w:id="55" w:name="appendixes"/>
+    <w:bookmarkEnd w:id="45"/>
+    <w:bookmarkStart w:id="60" w:name="appendixes"/>
     <w:p>
       <w:pPr>
         <w:pStyle w:val="Heading1"/>
@@ -2726,7 +2832,7 @@
         </w:r>
       </w:hyperlink>
     </w:p>
-    <w:bookmarkStart w:id="53" w:name="appendix-a-copula-examples"/>
+    <w:bookmarkStart w:id="58" w:name="appendix-a-copula-examples"/>
     <w:p>
       <w:pPr>
         <w:pStyle w:val="Heading2"/>
@@ -2752,18 +2858,18 @@
           <wp:inline>
             <wp:extent cx="5727700" cy="4295774"/>
             <wp:effectExtent b="0" l="0" r="0" t="0"/>
-            <wp:docPr descr="Figure 1: Uniform scenarios Gaussian_copula, numerical simulation" title="" id="42" name="Picture"/>
+            <wp:docPr descr="Figure 1: Uniform scenarios Gaussian_copula, numerical simulation" title="" id="47" name="Picture"/>
             <a:graphic>
               <a:graphicData uri="http://schemas.openxmlformats.org/drawingml/2006/picture">
                 <pic:pic>
                   <pic:nvPicPr>
-                    <pic:cNvPr descr="figures\Uniform_scenarios_Gaussian_copula_(numerical_simulation).png" id="43" name="Picture"/>
+                    <pic:cNvPr descr="figures\Uniform_scenarios_Gaussian_copula_(numerical_simulation).png" id="48" name="Picture"/>
                     <pic:cNvPicPr>
                       <a:picLocks noChangeArrowheads="1" noChangeAspect="1"/>
                     </pic:cNvPicPr>
                   </pic:nvPicPr>
                   <pic:blipFill>
-                    <a:blip r:embed="rId41"/>
+                    <a:blip r:embed="rId46"/>
                     <a:stretch>
                       <a:fillRect/>
                     </a:stretch>
@@ -2807,18 +2913,18 @@
           <wp:inline>
             <wp:extent cx="5727700" cy="4295774"/>
             <wp:effectExtent b="0" l="0" r="0" t="0"/>
-            <wp:docPr descr="Figure 2: Contour plot Gaussian copula, numerical simulation" title="" id="45" name="Picture"/>
+            <wp:docPr descr="Figure 2: Contour plot Gaussian copula, numerical simulation" title="" id="50" name="Picture"/>
             <a:graphic>
               <a:graphicData uri="http://schemas.openxmlformats.org/drawingml/2006/picture">
                 <pic:pic>
                   <pic:nvPicPr>
-                    <pic:cNvPr descr="figures\Contour_plot_Gaussian_copula_(numerical_simulation).png" id="46" name="Picture"/>
+                    <pic:cNvPr descr="figures\Contour_plot_Gaussian_copula_(numerical_simulation).png" id="51" name="Picture"/>
                     <pic:cNvPicPr>
                       <a:picLocks noChangeArrowheads="1" noChangeAspect="1"/>
                     </pic:cNvPicPr>
                   </pic:nvPicPr>
                   <pic:blipFill>
-                    <a:blip r:embed="rId44"/>
+                    <a:blip r:embed="rId49"/>
                     <a:stretch>
                       <a:fillRect/>
                     </a:stretch>
@@ -2870,18 +2976,18 @@
           <wp:inline>
             <wp:extent cx="5727700" cy="4295774"/>
             <wp:effectExtent b="0" l="0" r="0" t="0"/>
-            <wp:docPr descr="Figure 3: Uniform scenarios Cauchy copula, numerical simulation" title="" id="48" name="Picture"/>
+            <wp:docPr descr="Figure 3: Uniform scenarios Cauchy copula, numerical simulation" title="" id="53" name="Picture"/>
             <a:graphic>
               <a:graphicData uri="http://schemas.openxmlformats.org/drawingml/2006/picture">
                 <pic:pic>
                   <pic:nvPicPr>
-                    <pic:cNvPr descr="figures\Uniform_scenarios_Cauchy_copula_(numerical_simulation).png" id="49" name="Picture"/>
+                    <pic:cNvPr descr="figures\Uniform_scenarios_Cauchy_copula_(numerical_simulation).png" id="54" name="Picture"/>
                     <pic:cNvPicPr>
                       <a:picLocks noChangeArrowheads="1" noChangeAspect="1"/>
                     </pic:cNvPicPr>
                   </pic:nvPicPr>
                   <pic:blipFill>
-                    <a:blip r:embed="rId47"/>
+                    <a:blip r:embed="rId52"/>
                     <a:stretch>
                       <a:fillRect/>
                     </a:stretch>
@@ -2925,18 +3031,18 @@
           <wp:inline>
             <wp:extent cx="5727700" cy="4295774"/>
             <wp:effectExtent b="0" l="0" r="0" t="0"/>
-            <wp:docPr descr="Figure 4: Contour plot Cauchy copula, numerical simulation" title="" id="51" name="Picture"/>
+            <wp:docPr descr="Figure 4: Contour plot Cauchy copula, numerical simulation" title="" id="56" name="Picture"/>
             <a:graphic>
               <a:graphicData uri="http://schemas.openxmlformats.org/drawingml/2006/picture">
                 <pic:pic>
                   <pic:nvPicPr>
-                    <pic:cNvPr descr="figures\Contour_plot_Cauchy_copula_(numerical_simulation).png" id="52" name="Picture"/>
+                    <pic:cNvPr descr="figures\Contour_plot_Cauchy_copula_(numerical_simulation).png" id="57" name="Picture"/>
                     <pic:cNvPicPr>
                       <a:picLocks noChangeArrowheads="1" noChangeAspect="1"/>
                     </pic:cNvPicPr>
                   </pic:nvPicPr>
                   <pic:blipFill>
-                    <a:blip r:embed="rId50"/>
+                    <a:blip r:embed="rId55"/>
                     <a:stretch>
                       <a:fillRect/>
                     </a:stretch>
@@ -2971,8 +3077,8 @@
         <w:t xml:space="preserve">Figure 4: Contour plot Cauchy copula, numerical simulation</w:t>
       </w:r>
     </w:p>
-    <w:bookmarkEnd w:id="53"/>
-    <w:bookmarkStart w:id="54" w:name="appendix-b-list-of-used-ai-tools"/>
+    <w:bookmarkEnd w:id="58"/>
+    <w:bookmarkStart w:id="59" w:name="appendix-b-list-of-used-ai-tools"/>
     <w:p>
       <w:pPr>
         <w:pStyle w:val="Heading2"/>
@@ -3015,8 +3121,8 @@
         <w:t xml:space="preserve">“You’re an academic assistant with an expertise in software engineering to proofread and rewrite as a single connected text. Keep academic tone.”</w:t>
       </w:r>
     </w:p>
-    <w:bookmarkEnd w:id="54"/>
-    <w:bookmarkEnd w:id="55"/>
+    <w:bookmarkEnd w:id="59"/>
+    <w:bookmarkEnd w:id="60"/>
     <w:sectPr>
       <w:headerReference r:id="rId10" w:type="default"/>
       <w:footerReference r:id="rId11" w:type="even"/>

</xml_diff>

<commit_message>
adding proposal text p7
</commit_message>
<xml_diff>
--- a/document/proposal.docx
+++ b/document/proposal.docx
@@ -76,7 +76,7 @@
         </w:p>
       </w:sdtContent>
     </w:sdt>
-    <w:bookmarkStart w:id="21" w:name="introduction"/>
+    <w:bookmarkStart w:id="9" w:name="introduction"/>
     <w:p>
       <w:pPr>
         <w:pStyle w:val="Heading1"/>
@@ -101,8 +101,8 @@
         <w:t xml:space="preserve">This academic proposal proceeds by outlining its primary goals and objectives. Subsequently, it explains the problem under investigation, along with pertinent work that provides essential concepts and a literature review. The subsequent sections detail the methodology and techniques employed to achieve the previously outlined objectives. The proposal concludes in a development plan for the project.</w:t>
       </w:r>
     </w:p>
-    <w:bookmarkEnd w:id="21"/>
-    <w:bookmarkStart w:id="22" w:name="aims-and-objectives"/>
+    <w:bookmarkEnd w:id="9"/>
+    <w:bookmarkStart w:id="10" w:name="aims-and-objectives"/>
     <w:p>
       <w:pPr>
         <w:pStyle w:val="Heading1"/>
@@ -135,8 +135,8 @@
         <w:t xml:space="preserve">Upon completion of the initial software development, conduct an experimental analysis to evaluate the impact of copula assumptions on the selected VaR / ES measures across distinct portfolios. Following this, establish a calibration procedure aimed at fitting appropriate copulas to real-world market data. Lastly, devise a testing exercise to verify whether the calibrated copulas align with the prescribed conditions.</w:t>
       </w:r>
     </w:p>
-    <w:bookmarkEnd w:id="22"/>
-    <w:bookmarkStart w:id="32" w:name="X32b9430d5d15411fac62685483839fe9d87a9a8"/>
+    <w:bookmarkEnd w:id="10"/>
+    <w:bookmarkStart w:id="20" w:name="X32b9430d5d15411fac62685483839fe9d87a9a8"/>
     <w:p>
       <w:pPr>
         <w:pStyle w:val="Heading1"/>
@@ -145,7 +145,7 @@
         <w:t xml:space="preserve">Description of the problem and relevant work</w:t>
       </w:r>
     </w:p>
-    <w:bookmarkStart w:id="30" w:name="key-concepts"/>
+    <w:bookmarkStart w:id="18" w:name="key-concepts"/>
     <w:p>
       <w:pPr>
         <w:pStyle w:val="Heading2"/>
@@ -154,7 +154,7 @@
         <w:t xml:space="preserve">Key concepts</w:t>
       </w:r>
     </w:p>
-    <w:bookmarkStart w:id="23" w:name="X2df427def89a3ef237a42aa6bbd525f6362f6e2"/>
+    <w:bookmarkStart w:id="11" w:name="X2df427def89a3ef237a42aa6bbd525f6362f6e2"/>
     <w:p>
       <w:pPr>
         <w:pStyle w:val="Heading3"/>
@@ -583,8 +583,8 @@
         <w:t xml:space="preserve">From a computational perspective, MC VaR methods exhibit low numerical error, as the simulated datasets can be made arbitrarily large to smooth out estimation noise. However, this precision comes at the expense of higher model error, particularly when parametric assumptions are misspecified or when EVT extrapolations deviate from true tail behavior. While these methods provide greater control and extensibility in extreme risk modelling, their reliability hinges on the accuracy of the underlying assumptions, whether in the choice of distributions copula functions, or tail decay parameters.</w:t>
       </w:r>
     </w:p>
-    <w:bookmarkEnd w:id="23"/>
-    <w:bookmarkStart w:id="25" w:name="copulas."/>
+    <w:bookmarkEnd w:id="11"/>
+    <w:bookmarkStart w:id="13" w:name="copulas."/>
     <w:p>
       <w:pPr>
         <w:pStyle w:val="Heading3"/>
@@ -1151,7 +1151,7 @@
       <w:pPr>
         <w:pStyle w:val="BodyText"/>
       </w:pPr>
-      <w:bookmarkStart w:id="24" w:name="eq1"/>
+      <w:bookmarkStart w:id="12" w:name="eq1"/>
       <m:oMathPara>
         <m:oMathParaPr>
           <m:jc m:val="center"/>
@@ -1384,7 +1384,7 @@
           </m:r>
         </m:oMath>
       </m:oMathPara>
-      <w:bookmarkEnd w:id="24"/>
+      <w:bookmarkEnd w:id="12"/>
     </w:p>
     <w:p>
       <w:pPr>
@@ -1663,8 +1663,8 @@
         <w:t xml:space="preserve">.</w:t>
       </w:r>
     </w:p>
-    <w:bookmarkEnd w:id="25"/>
-    <w:bookmarkStart w:id="29" w:name="copulas-in-value-at-risk"/>
+    <w:bookmarkEnd w:id="13"/>
+    <w:bookmarkStart w:id="17" w:name="copulas-in-value-at-risk"/>
     <w:p>
       <w:pPr>
         <w:pStyle w:val="Heading3"/>
@@ -2196,20 +2196,20 @@
       <w:r>
         <w:drawing>
           <wp:inline>
-            <wp:extent cx="5727700" cy="2315453"/>
+            <wp:extent cx="5334000" cy="2156297"/>
             <wp:effectExtent b="0" l="0" r="0" t="0"/>
-            <wp:docPr descr="Figure 1: Tail dependence for different types of copulas and different number of random variables" title="" id="27" name="Picture"/>
+            <wp:docPr descr="Figure 1: Tail dependence for different types of copulas and different number of random variables" title="" id="15" name="Picture"/>
             <a:graphic>
               <a:graphicData uri="http://schemas.openxmlformats.org/drawingml/2006/picture">
                 <pic:pic>
                   <pic:nvPicPr>
-                    <pic:cNvPr descr="figures\Tail_dependance.png" id="28" name="Picture"/>
+                    <pic:cNvPr descr="figures\Tail_dependance.png" id="16" name="Picture"/>
                     <pic:cNvPicPr>
                       <a:picLocks noChangeArrowheads="1" noChangeAspect="1"/>
                     </pic:cNvPicPr>
                   </pic:nvPicPr>
                   <pic:blipFill>
-                    <a:blip r:embed="rId26"/>
+                    <a:blip r:embed="rId14"/>
                     <a:stretch>
                       <a:fillRect/>
                     </a:stretch>
@@ -2217,7 +2217,7 @@
                   <pic:spPr bwMode="auto">
                     <a:xfrm>
                       <a:off x="0" y="0"/>
-                      <a:ext cx="5727700" cy="2315453"/>
+                      <a:ext cx="5334000" cy="2156297"/>
                     </a:xfrm>
                     <a:prstGeom prst="rect">
                       <a:avLst/>
@@ -2276,9 +2276,9 @@
         <w:t xml:space="preserve">Both types of scenarios are crucial for robust risk assessment. De‑correlation highlights the risk of assets that are supposed to hedge each other stop doing so, while joint‑movement emphasizes the danger of hidden tail‑dependence that can generate simultaneous losses across seemingly unrelated positions. Modelling frameworks that can generate both behaviors, provide a more realistic picture of potential extreme outcomes than approaches that rely solely on historic linear correlations.</w:t>
       </w:r>
     </w:p>
-    <w:bookmarkEnd w:id="29"/>
-    <w:bookmarkEnd w:id="30"/>
-    <w:bookmarkStart w:id="31" w:name="literature-review"/>
+    <w:bookmarkEnd w:id="17"/>
+    <w:bookmarkEnd w:id="18"/>
+    <w:bookmarkStart w:id="19" w:name="literature-review"/>
     <w:p>
       <w:pPr>
         <w:pStyle w:val="Heading2"/>
@@ -2295,9 +2295,9 @@
         <w:t xml:space="preserve">[TODO: present articles!!!]</w:t>
       </w:r>
     </w:p>
-    <w:bookmarkEnd w:id="31"/>
-    <w:bookmarkEnd w:id="32"/>
-    <w:bookmarkStart w:id="38" w:name="methodology-and-methods"/>
+    <w:bookmarkEnd w:id="19"/>
+    <w:bookmarkEnd w:id="20"/>
+    <w:bookmarkStart w:id="26" w:name="methodology-and-methods"/>
     <w:p>
       <w:pPr>
         <w:pStyle w:val="Heading1"/>
@@ -2335,20 +2335,20 @@
       <w:r>
         <w:drawing>
           <wp:inline>
-            <wp:extent cx="5727700" cy="2315453"/>
+            <wp:extent cx="5334000" cy="2156297"/>
             <wp:effectExtent b="0" l="0" r="0" t="0"/>
-            <wp:docPr descr="Figure 2: Copula calibration workflow" title="" id="34" name="Picture"/>
+            <wp:docPr descr="Figure 2: Copula calibration workflow" title="" id="22" name="Picture"/>
             <a:graphic>
               <a:graphicData uri="http://schemas.openxmlformats.org/drawingml/2006/picture">
                 <pic:pic>
                   <pic:nvPicPr>
-                    <pic:cNvPr descr="figures\Project-workflow-high.png" id="35" name="Picture"/>
+                    <pic:cNvPr descr="figures\Project-workflow-high.png" id="23" name="Picture"/>
                     <pic:cNvPicPr>
                       <a:picLocks noChangeArrowheads="1" noChangeAspect="1"/>
                     </pic:cNvPicPr>
                   </pic:nvPicPr>
                   <pic:blipFill>
-                    <a:blip r:embed="rId33"/>
+                    <a:blip r:embed="rId21"/>
                     <a:stretch>
                       <a:fillRect/>
                     </a:stretch>
@@ -2356,7 +2356,7 @@
                   <pic:spPr bwMode="auto">
                     <a:xfrm>
                       <a:off x="0" y="0"/>
-                      <a:ext cx="5727700" cy="2315453"/>
+                      <a:ext cx="5334000" cy="2156297"/>
                     </a:xfrm>
                     <a:prstGeom prst="rect">
                       <a:avLst/>
@@ -2388,20 +2388,20 @@
       <w:r>
         <w:drawing>
           <wp:inline>
-            <wp:extent cx="5727700" cy="2315453"/>
+            <wp:extent cx="5334000" cy="2156297"/>
             <wp:effectExtent b="0" l="0" r="0" t="0"/>
-            <wp:docPr descr="Figure 3: Detailed process of data transformations for copula calibration" title="" id="36" name="Picture"/>
+            <wp:docPr descr="Figure 3: Detailed process of data transformations for copula calibration" title="" id="24" name="Picture"/>
             <a:graphic>
               <a:graphicData uri="http://schemas.openxmlformats.org/drawingml/2006/picture">
                 <pic:pic>
                   <pic:nvPicPr>
-                    <pic:cNvPr descr="figures\Project-workflow-high.png" id="37" name="Picture"/>
+                    <pic:cNvPr descr="figures\Project-workflow-high.png" id="25" name="Picture"/>
                     <pic:cNvPicPr>
                       <a:picLocks noChangeArrowheads="1" noChangeAspect="1"/>
                     </pic:cNvPicPr>
                   </pic:nvPicPr>
                   <pic:blipFill>
-                    <a:blip r:embed="rId33"/>
+                    <a:blip r:embed="rId21"/>
                     <a:stretch>
                       <a:fillRect/>
                     </a:stretch>
@@ -2409,7 +2409,7 @@
                   <pic:spPr bwMode="auto">
                     <a:xfrm>
                       <a:off x="0" y="0"/>
-                      <a:ext cx="5727700" cy="2315453"/>
+                      <a:ext cx="5334000" cy="2156297"/>
                     </a:xfrm>
                     <a:prstGeom prst="rect">
                       <a:avLst/>
@@ -2492,8 +2492,8 @@
         <w:t xml:space="preserve">My aim with this software is a proof of concept rather than an end-user application.</w:t>
       </w:r>
     </w:p>
-    <w:bookmarkEnd w:id="38"/>
-    <w:bookmarkStart w:id="39" w:name="project-development-plan"/>
+    <w:bookmarkEnd w:id="26"/>
+    <w:bookmarkStart w:id="27" w:name="project-development-plan"/>
     <w:p>
       <w:pPr>
         <w:pStyle w:val="Heading1"/>
@@ -2645,8 +2645,8 @@
         <w:t xml:space="preserve">Assess obtained results, summarize observations and developed software within the report.</w:t>
       </w:r>
     </w:p>
-    <w:bookmarkEnd w:id="39"/>
-    <w:bookmarkStart w:id="45" w:name="references"/>
+    <w:bookmarkEnd w:id="27"/>
+    <w:bookmarkStart w:id="33" w:name="references"/>
     <w:p>
       <w:pPr>
         <w:pStyle w:val="Heading1"/>
@@ -2712,7 +2712,7 @@
       <w:r>
         <w:t xml:space="preserve"> </w:t>
       </w:r>
-      <w:hyperlink r:id="rId40">
+      <w:hyperlink r:id="rId28">
         <w:r>
           <w:rPr>
             <w:rStyle w:val="Hyperlink"/>
@@ -2734,7 +2734,7 @@
       <w:r>
         <w:t xml:space="preserve"> </w:t>
       </w:r>
-      <w:hyperlink r:id="rId41">
+      <w:hyperlink r:id="rId29">
         <w:r>
           <w:rPr>
             <w:rStyle w:val="Hyperlink"/>
@@ -2756,7 +2756,7 @@
       <w:r>
         <w:t xml:space="preserve"> </w:t>
       </w:r>
-      <w:hyperlink r:id="rId42">
+      <w:hyperlink r:id="rId30">
         <w:r>
           <w:rPr>
             <w:rStyle w:val="Hyperlink"/>
@@ -2775,7 +2775,7 @@
       <w:r>
         <w:t xml:space="preserve">Horvath B. et al, 2025. Generative Models in Finance: Market Generators, a Paradigm Shift in Financial Modeling.</w:t>
       </w:r>
-      <w:hyperlink r:id="rId43">
+      <w:hyperlink r:id="rId31">
         <w:r>
           <w:rPr>
             <w:rStyle w:val="Hyperlink"/>
@@ -2794,7 +2794,7 @@
       <w:r>
         <w:t xml:space="preserve">Hofert M. and Pang Z., 2025. W-transforms: Uniformity-preserving transformations and induced dependence structures.</w:t>
       </w:r>
-      <w:hyperlink r:id="rId44">
+      <w:hyperlink r:id="rId32">
         <w:r>
           <w:rPr>
             <w:rStyle w:val="Hyperlink"/>
@@ -2803,8 +2803,8 @@
         </w:r>
       </w:hyperlink>
     </w:p>
-    <w:bookmarkEnd w:id="45"/>
-    <w:bookmarkStart w:id="60" w:name="appendixes"/>
+    <w:bookmarkEnd w:id="33"/>
+    <w:bookmarkStart w:id="48" w:name="appendixes"/>
     <w:p>
       <w:pPr>
         <w:pStyle w:val="Heading1"/>
@@ -2832,7 +2832,7 @@
         </w:r>
       </w:hyperlink>
     </w:p>
-    <w:bookmarkStart w:id="58" w:name="appendix-a-copula-examples"/>
+    <w:bookmarkStart w:id="46" w:name="appendix-a-copula-examples"/>
     <w:p>
       <w:pPr>
         <w:pStyle w:val="Heading2"/>
@@ -2856,20 +2856,20 @@
       <w:r>
         <w:drawing>
           <wp:inline>
-            <wp:extent cx="5727700" cy="4295774"/>
+            <wp:extent cx="5334000" cy="4000499"/>
             <wp:effectExtent b="0" l="0" r="0" t="0"/>
-            <wp:docPr descr="Figure 1: Uniform scenarios Gaussian_copula, numerical simulation" title="" id="47" name="Picture"/>
+            <wp:docPr descr="Figure 1: Uniform scenarios Gaussian_copula, numerical simulation" title="" id="35" name="Picture"/>
             <a:graphic>
               <a:graphicData uri="http://schemas.openxmlformats.org/drawingml/2006/picture">
                 <pic:pic>
                   <pic:nvPicPr>
-                    <pic:cNvPr descr="figures\Uniform_scenarios_Gaussian_copula_(numerical_simulation).png" id="48" name="Picture"/>
+                    <pic:cNvPr descr="figures\Uniform_scenarios_Gaussian_copula_(numerical_simulation).png" id="36" name="Picture"/>
                     <pic:cNvPicPr>
                       <a:picLocks noChangeArrowheads="1" noChangeAspect="1"/>
                     </pic:cNvPicPr>
                   </pic:nvPicPr>
                   <pic:blipFill>
-                    <a:blip r:embed="rId46"/>
+                    <a:blip r:embed="rId34"/>
                     <a:stretch>
                       <a:fillRect/>
                     </a:stretch>
@@ -2877,7 +2877,7 @@
                   <pic:spPr bwMode="auto">
                     <a:xfrm>
                       <a:off x="0" y="0"/>
-                      <a:ext cx="5727700" cy="4295774"/>
+                      <a:ext cx="5334000" cy="4000499"/>
                     </a:xfrm>
                     <a:prstGeom prst="rect">
                       <a:avLst/>
@@ -2911,20 +2911,20 @@
       <w:r>
         <w:drawing>
           <wp:inline>
-            <wp:extent cx="5727700" cy="4295774"/>
+            <wp:extent cx="5334000" cy="4000499"/>
             <wp:effectExtent b="0" l="0" r="0" t="0"/>
-            <wp:docPr descr="Figure 2: Contour plot Gaussian copula, numerical simulation" title="" id="50" name="Picture"/>
+            <wp:docPr descr="Figure 2: Contour plot Gaussian copula, numerical simulation" title="" id="38" name="Picture"/>
             <a:graphic>
               <a:graphicData uri="http://schemas.openxmlformats.org/drawingml/2006/picture">
                 <pic:pic>
                   <pic:nvPicPr>
-                    <pic:cNvPr descr="figures\Contour_plot_Gaussian_copula_(numerical_simulation).png" id="51" name="Picture"/>
+                    <pic:cNvPr descr="figures\Contour_plot_Gaussian_copula_(numerical_simulation).png" id="39" name="Picture"/>
                     <pic:cNvPicPr>
                       <a:picLocks noChangeArrowheads="1" noChangeAspect="1"/>
                     </pic:cNvPicPr>
                   </pic:nvPicPr>
                   <pic:blipFill>
-                    <a:blip r:embed="rId49"/>
+                    <a:blip r:embed="rId37"/>
                     <a:stretch>
                       <a:fillRect/>
                     </a:stretch>
@@ -2932,7 +2932,7 @@
                   <pic:spPr bwMode="auto">
                     <a:xfrm>
                       <a:off x="0" y="0"/>
-                      <a:ext cx="5727700" cy="4295774"/>
+                      <a:ext cx="5334000" cy="4000499"/>
                     </a:xfrm>
                     <a:prstGeom prst="rect">
                       <a:avLst/>
@@ -2974,20 +2974,20 @@
       <w:r>
         <w:drawing>
           <wp:inline>
-            <wp:extent cx="5727700" cy="4295774"/>
+            <wp:extent cx="5334000" cy="4000499"/>
             <wp:effectExtent b="0" l="0" r="0" t="0"/>
-            <wp:docPr descr="Figure 3: Uniform scenarios Cauchy copula, numerical simulation" title="" id="53" name="Picture"/>
+            <wp:docPr descr="Figure 3: Uniform scenarios Cauchy copula, numerical simulation" title="" id="41" name="Picture"/>
             <a:graphic>
               <a:graphicData uri="http://schemas.openxmlformats.org/drawingml/2006/picture">
                 <pic:pic>
                   <pic:nvPicPr>
-                    <pic:cNvPr descr="figures\Uniform_scenarios_Cauchy_copula_(numerical_simulation).png" id="54" name="Picture"/>
+                    <pic:cNvPr descr="figures\Uniform_scenarios_Cauchy_copula_(numerical_simulation).png" id="42" name="Picture"/>
                     <pic:cNvPicPr>
                       <a:picLocks noChangeArrowheads="1" noChangeAspect="1"/>
                     </pic:cNvPicPr>
                   </pic:nvPicPr>
                   <pic:blipFill>
-                    <a:blip r:embed="rId52"/>
+                    <a:blip r:embed="rId40"/>
                     <a:stretch>
                       <a:fillRect/>
                     </a:stretch>
@@ -2995,7 +2995,7 @@
                   <pic:spPr bwMode="auto">
                     <a:xfrm>
                       <a:off x="0" y="0"/>
-                      <a:ext cx="5727700" cy="4295774"/>
+                      <a:ext cx="5334000" cy="4000499"/>
                     </a:xfrm>
                     <a:prstGeom prst="rect">
                       <a:avLst/>
@@ -3029,20 +3029,20 @@
       <w:r>
         <w:drawing>
           <wp:inline>
-            <wp:extent cx="5727700" cy="4295774"/>
+            <wp:extent cx="5334000" cy="4000499"/>
             <wp:effectExtent b="0" l="0" r="0" t="0"/>
-            <wp:docPr descr="Figure 4: Contour plot Cauchy copula, numerical simulation" title="" id="56" name="Picture"/>
+            <wp:docPr descr="Figure 4: Contour plot Cauchy copula, numerical simulation" title="" id="44" name="Picture"/>
             <a:graphic>
               <a:graphicData uri="http://schemas.openxmlformats.org/drawingml/2006/picture">
                 <pic:pic>
                   <pic:nvPicPr>
-                    <pic:cNvPr descr="figures\Contour_plot_Cauchy_copula_(numerical_simulation).png" id="57" name="Picture"/>
+                    <pic:cNvPr descr="figures\Contour_plot_Cauchy_copula_(numerical_simulation).png" id="45" name="Picture"/>
                     <pic:cNvPicPr>
                       <a:picLocks noChangeArrowheads="1" noChangeAspect="1"/>
                     </pic:cNvPicPr>
                   </pic:nvPicPr>
                   <pic:blipFill>
-                    <a:blip r:embed="rId55"/>
+                    <a:blip r:embed="rId43"/>
                     <a:stretch>
                       <a:fillRect/>
                     </a:stretch>
@@ -3050,7 +3050,7 @@
                   <pic:spPr bwMode="auto">
                     <a:xfrm>
                       <a:off x="0" y="0"/>
-                      <a:ext cx="5727700" cy="4295774"/>
+                      <a:ext cx="5334000" cy="4000499"/>
                     </a:xfrm>
                     <a:prstGeom prst="rect">
                       <a:avLst/>
@@ -3077,8 +3077,8 @@
         <w:t xml:space="preserve">Figure 4: Contour plot Cauchy copula, numerical simulation</w:t>
       </w:r>
     </w:p>
-    <w:bookmarkEnd w:id="58"/>
-    <w:bookmarkStart w:id="59" w:name="appendix-b-list-of-used-ai-tools"/>
+    <w:bookmarkEnd w:id="46"/>
+    <w:bookmarkStart w:id="47" w:name="appendix-b-list-of-used-ai-tools"/>
     <w:p>
       <w:pPr>
         <w:pStyle w:val="Heading2"/>
@@ -3121,18 +3121,12 @@
         <w:t xml:space="preserve">“You’re an academic assistant with an expertise in software engineering to proofread and rewrite as a single connected text. Keep academic tone.”</w:t>
       </w:r>
     </w:p>
-    <w:bookmarkEnd w:id="59"/>
-    <w:bookmarkEnd w:id="60"/>
+    <w:bookmarkEnd w:id="47"/>
+    <w:bookmarkEnd w:id="48"/>
     <w:sectPr>
-      <w:headerReference r:id="rId10" w:type="default"/>
-      <w:footerReference r:id="rId11" w:type="even"/>
-      <w:footerReference r:id="rId12" w:type="default"/>
-      <w:pgSz w:h="16840" w:w="11900"/>
-      <w:pgMar w:bottom="1440" w:footer="720" w:gutter="0" w:header="720" w:left="1440" w:right="1440" w:top="1440"/>
-      <w:pgNumType w:start="0"/>
-      <w:cols w:space="720"/>
-      <w:titlePg/>
-      <w:docGrid w:linePitch="360"/>
+      <w:footnotePr>
+        <w:numRestart w:val="eachSect"/>
+      </w:footnotePr>
     </w:sectPr>
   </w:body>
 </w:document>
@@ -3142,119 +3136,6 @@
 <w:comments xmlns:w="http://schemas.openxmlformats.org/wordprocessingml/2006/main" xmlns:m="http://schemas.openxmlformats.org/officeDocument/2006/math" xmlns:r="http://schemas.openxmlformats.org/officeDocument/2006/relationships" xmlns:o="urn:schemas-microsoft-com:office:office" xmlns:v="urn:schemas-microsoft-com:vml" xmlns:w10="urn:schemas-microsoft-com:office:word" xmlns:a="http://schemas.openxmlformats.org/drawingml/2006/main" xmlns:pic="http://schemas.openxmlformats.org/drawingml/2006/picture" xmlns:wp="http://schemas.openxmlformats.org/drawingml/2006/wordprocessingDrawing"/>
 </file>
 
-<file path=word/footer1.xml><?xml version="1.0" encoding="utf-8"?>
-<w:ftr xmlns:wpc="http://schemas.microsoft.com/office/word/2010/wordprocessingCanvas" xmlns:cx="http://schemas.microsoft.com/office/drawing/2014/chartex" xmlns:cx1="http://schemas.microsoft.com/office/drawing/2015/9/8/chartex" xmlns:cx2="http://schemas.microsoft.com/office/drawing/2015/10/21/chartex" xmlns:cx3="http://schemas.microsoft.com/office/drawing/2016/5/9/chartex" xmlns:cx4="http://schemas.microsoft.com/office/drawing/2016/5/10/chartex" xmlns:cx5="http://schemas.microsoft.com/office/drawing/2016/5/11/chartex" xmlns:cx6="http://schemas.microsoft.com/office/drawing/2016/5/12/chartex" xmlns:cx7="http://schemas.microsoft.com/office/drawing/2016/5/13/chartex" xmlns:cx8="http://schemas.microsoft.com/office/drawing/2016/5/14/chartex" xmlns:mc="http://schemas.openxmlformats.org/markup-compatibility/2006" xmlns:aink="http://schemas.microsoft.com/office/drawing/2016/ink" xmlns:am3d="http://schemas.microsoft.com/office/drawing/2017/model3d" xmlns:o="urn:schemas-microsoft-com:office:office" xmlns:oel="http://schemas.microsoft.com/office/2019/extlst" xmlns:r="http://schemas.openxmlformats.org/officeDocument/2006/relationships" xmlns:m="http://schemas.openxmlformats.org/officeDocument/2006/math" xmlns:v="urn:schemas-microsoft-com:vml" xmlns:wp14="http://schemas.microsoft.com/office/word/2010/wordprocessingDrawing" xmlns:wp="http://schemas.openxmlformats.org/drawingml/2006/wordprocessingDrawing" xmlns:w10="urn:schemas-microsoft-com:office:word" xmlns:w="http://schemas.openxmlformats.org/wordprocessingml/2006/main" xmlns:w14="http://schemas.microsoft.com/office/word/2010/wordml" xmlns:w15="http://schemas.microsoft.com/office/word/2012/wordml" xmlns:w16cex="http://schemas.microsoft.com/office/word/2018/wordml/cex" xmlns:w16cid="http://schemas.microsoft.com/office/word/2016/wordml/cid" xmlns:w16="http://schemas.microsoft.com/office/word/2018/wordml" xmlns:w16du="http://schemas.microsoft.com/office/word/2023/wordml/word16du" xmlns:w16sdtdh="http://schemas.microsoft.com/office/word/2020/wordml/sdtdatahash" xmlns:w16sdtfl="http://schemas.microsoft.com/office/word/2024/wordml/sdtformatlock" xmlns:w16se="http://schemas.microsoft.com/office/word/2015/wordml/symex" xmlns:wpg="http://schemas.microsoft.com/office/word/2010/wordprocessingGroup" xmlns:wpi="http://schemas.microsoft.com/office/word/2010/wordprocessingInk" xmlns:wne="http://schemas.microsoft.com/office/word/2006/wordml" xmlns:wps="http://schemas.microsoft.com/office/word/2010/wordprocessingShape" mc:Ignorable="w14 w15 w16se w16cid w16 w16cex w16sdtdh w16sdtfl w16du wp14">
-  <w:sdt>
-    <w:sdtPr>
-      <w:rPr>
-        <w:rStyle w:val="PageNumber"/>
-      </w:rPr>
-      <w:id w:val="811578987"/>
-      <w:docPartObj>
-        <w:docPartGallery w:val="Page Numbers (Bottom of Page)"/>
-        <w:docPartUnique/>
-      </w:docPartObj>
-    </w:sdtPr>
-    <w:sdtContent>
-      <w:p>
-        <w:pPr>
-          <w:pStyle w:val="Footer"/>
-          <w:framePr w:wrap="none" w:vAnchor="text" w:hAnchor="margin" w:xAlign="center" w:y="1"/>
-          <w:rPr>
-            <w:rStyle w:val="PageNumber"/>
-          </w:rPr>
-        </w:pPr>
-        <w:r>
-          <w:rPr>
-            <w:rStyle w:val="PageNumber"/>
-          </w:rPr>
-          <w:fldChar w:fldCharType="begin"/>
-        </w:r>
-        <w:r>
-          <w:rPr>
-            <w:rStyle w:val="PageNumber"/>
-          </w:rPr>
-          <w:instrText xml:space="preserve"> PAGE </w:instrText>
-        </w:r>
-        <w:r>
-          <w:rPr>
-            <w:rStyle w:val="PageNumber"/>
-          </w:rPr>
-          <w:fldChar w:fldCharType="end"/>
-        </w:r>
-      </w:p>
-    </w:sdtContent>
-  </w:sdt>
-  <w:p>
-    <w:pPr>
-      <w:pStyle w:val="Footer"/>
-    </w:pPr>
-  </w:p>
-</w:ftr>
-</file>
-
-<file path=word/footer2.xml><?xml version="1.0" encoding="utf-8"?>
-<w:ftr xmlns:wpc="http://schemas.microsoft.com/office/word/2010/wordprocessingCanvas" xmlns:cx="http://schemas.microsoft.com/office/drawing/2014/chartex" xmlns:cx1="http://schemas.microsoft.com/office/drawing/2015/9/8/chartex" xmlns:cx2="http://schemas.microsoft.com/office/drawing/2015/10/21/chartex" xmlns:cx3="http://schemas.microsoft.com/office/drawing/2016/5/9/chartex" xmlns:cx4="http://schemas.microsoft.com/office/drawing/2016/5/10/chartex" xmlns:cx5="http://schemas.microsoft.com/office/drawing/2016/5/11/chartex" xmlns:cx6="http://schemas.microsoft.com/office/drawing/2016/5/12/chartex" xmlns:cx7="http://schemas.microsoft.com/office/drawing/2016/5/13/chartex" xmlns:cx8="http://schemas.microsoft.com/office/drawing/2016/5/14/chartex" xmlns:mc="http://schemas.openxmlformats.org/markup-compatibility/2006" xmlns:aink="http://schemas.microsoft.com/office/drawing/2016/ink" xmlns:am3d="http://schemas.microsoft.com/office/drawing/2017/model3d" xmlns:o="urn:schemas-microsoft-com:office:office" xmlns:oel="http://schemas.microsoft.com/office/2019/extlst" xmlns:r="http://schemas.openxmlformats.org/officeDocument/2006/relationships" xmlns:m="http://schemas.openxmlformats.org/officeDocument/2006/math" xmlns:v="urn:schemas-microsoft-com:vml" xmlns:wp14="http://schemas.microsoft.com/office/word/2010/wordprocessingDrawing" xmlns:wp="http://schemas.openxmlformats.org/drawingml/2006/wordprocessingDrawing" xmlns:w10="urn:schemas-microsoft-com:office:word" xmlns:w="http://schemas.openxmlformats.org/wordprocessingml/2006/main" xmlns:w14="http://schemas.microsoft.com/office/word/2010/wordml" xmlns:w15="http://schemas.microsoft.com/office/word/2012/wordml" xmlns:w16cex="http://schemas.microsoft.com/office/word/2018/wordml/cex" xmlns:w16cid="http://schemas.microsoft.com/office/word/2016/wordml/cid" xmlns:w16="http://schemas.microsoft.com/office/word/2018/wordml" xmlns:w16du="http://schemas.microsoft.com/office/word/2023/wordml/word16du" xmlns:w16sdtdh="http://schemas.microsoft.com/office/word/2020/wordml/sdtdatahash" xmlns:w16sdtfl="http://schemas.microsoft.com/office/word/2024/wordml/sdtformatlock" xmlns:w16se="http://schemas.microsoft.com/office/word/2015/wordml/symex" xmlns:wpg="http://schemas.microsoft.com/office/word/2010/wordprocessingGroup" xmlns:wpi="http://schemas.microsoft.com/office/word/2010/wordprocessingInk" xmlns:wne="http://schemas.microsoft.com/office/word/2006/wordml" xmlns:wps="http://schemas.microsoft.com/office/word/2010/wordprocessingShape" mc:Ignorable="w14 w15 w16se w16cid w16 w16cex w16sdtdh w16sdtfl w16du wp14">
-  <w:p>
-    <w:pPr>
-      <w:pStyle w:val="Footer"/>
-      <w:tabs>
-        <w:tab w:val="clear" w:pos="4680"/>
-        <w:tab w:val="clear" w:pos="9360"/>
-      </w:tabs>
-      <w:jc w:val="center"/>
-      <w:rPr>
-        <w:caps/>
-        <w:noProof/>
-        <w:color w:val="4472C4" w:themeColor="accent1"/>
-      </w:rPr>
-    </w:pPr>
-    <w:r>
-      <w:rPr>
-        <w:caps/>
-        <w:color w:val="4472C4" w:themeColor="accent1"/>
-      </w:rPr>
-      <w:fldChar w:fldCharType="begin"/>
-    </w:r>
-    <w:r>
-      <w:rPr>
-        <w:caps/>
-        <w:color w:val="4472C4" w:themeColor="accent1"/>
-      </w:rPr>
-      <w:instrText xml:space="preserve"> PAGE   \* MERGEFORMAT </w:instrText>
-    </w:r>
-    <w:r>
-      <w:rPr>
-        <w:caps/>
-        <w:color w:val="4472C4" w:themeColor="accent1"/>
-      </w:rPr>
-      <w:fldChar w:fldCharType="separate"/>
-    </w:r>
-    <w:r>
-      <w:rPr>
-        <w:caps/>
-        <w:noProof/>
-        <w:color w:val="4472C4" w:themeColor="accent1"/>
-      </w:rPr>
-      <w:t>3</w:t>
-    </w:r>
-    <w:r>
-      <w:rPr>
-        <w:caps/>
-        <w:noProof/>
-        <w:color w:val="4472C4" w:themeColor="accent1"/>
-      </w:rPr>
-      <w:fldChar w:fldCharType="end"/>
-    </w:r>
-  </w:p>
-  <w:p>
-    <w:pPr>
-      <w:pStyle w:val="Footer"/>
-    </w:pPr>
-  </w:p>
-</w:ftr>
-</file>
-
 <file path=word/footnotes.xml><?xml version="1.0" encoding="utf-8"?>
 <w:footnotes xmlns:w="http://schemas.openxmlformats.org/wordprocessingml/2006/main" xmlns:m="http://schemas.openxmlformats.org/officeDocument/2006/math" xmlns:r="http://schemas.openxmlformats.org/officeDocument/2006/relationships" xmlns:o="urn:schemas-microsoft-com:office:office" xmlns:v="urn:schemas-microsoft-com:vml" xmlns:w10="urn:schemas-microsoft-com:office:word" xmlns:a="http://schemas.openxmlformats.org/drawingml/2006/main" xmlns:pic="http://schemas.openxmlformats.org/drawingml/2006/picture" xmlns:wp="http://schemas.openxmlformats.org/drawingml/2006/wordprocessingDrawing">
   <w:footnote w:type="continuationSeparator" w:id="0">
@@ -3274,1229 +3155,8 @@
 </w:footnotes>
 </file>
 
-<file path=word/header1.xml><?xml version="1.0" encoding="utf-8"?>
-<w:hdr xmlns:wpc="http://schemas.microsoft.com/office/word/2010/wordprocessingCanvas" xmlns:cx="http://schemas.microsoft.com/office/drawing/2014/chartex" xmlns:cx1="http://schemas.microsoft.com/office/drawing/2015/9/8/chartex" xmlns:cx2="http://schemas.microsoft.com/office/drawing/2015/10/21/chartex" xmlns:cx3="http://schemas.microsoft.com/office/drawing/2016/5/9/chartex" xmlns:cx4="http://schemas.microsoft.com/office/drawing/2016/5/10/chartex" xmlns:cx5="http://schemas.microsoft.com/office/drawing/2016/5/11/chartex" xmlns:cx6="http://schemas.microsoft.com/office/drawing/2016/5/12/chartex" xmlns:cx7="http://schemas.microsoft.com/office/drawing/2016/5/13/chartex" xmlns:cx8="http://schemas.microsoft.com/office/drawing/2016/5/14/chartex" xmlns:mc="http://schemas.openxmlformats.org/markup-compatibility/2006" xmlns:aink="http://schemas.microsoft.com/office/drawing/2016/ink" xmlns:am3d="http://schemas.microsoft.com/office/drawing/2017/model3d" xmlns:o="urn:schemas-microsoft-com:office:office" xmlns:oel="http://schemas.microsoft.com/office/2019/extlst" xmlns:r="http://schemas.openxmlformats.org/officeDocument/2006/relationships" xmlns:m="http://schemas.openxmlformats.org/officeDocument/2006/math" xmlns:v="urn:schemas-microsoft-com:vml" xmlns:wp14="http://schemas.microsoft.com/office/word/2010/wordprocessingDrawing" xmlns:wp="http://schemas.openxmlformats.org/drawingml/2006/wordprocessingDrawing" xmlns:w10="urn:schemas-microsoft-com:office:word" xmlns:w="http://schemas.openxmlformats.org/wordprocessingml/2006/main" xmlns:w14="http://schemas.microsoft.com/office/word/2010/wordml" xmlns:w15="http://schemas.microsoft.com/office/word/2012/wordml" xmlns:w16cex="http://schemas.microsoft.com/office/word/2018/wordml/cex" xmlns:w16cid="http://schemas.microsoft.com/office/word/2016/wordml/cid" xmlns:w16="http://schemas.microsoft.com/office/word/2018/wordml" xmlns:w16du="http://schemas.microsoft.com/office/word/2023/wordml/word16du" xmlns:w16sdtdh="http://schemas.microsoft.com/office/word/2020/wordml/sdtdatahash" xmlns:w16sdtfl="http://schemas.microsoft.com/office/word/2024/wordml/sdtformatlock" xmlns:w16se="http://schemas.microsoft.com/office/word/2015/wordml/symex" xmlns:wpg="http://schemas.microsoft.com/office/word/2010/wordprocessingGroup" xmlns:wpi="http://schemas.microsoft.com/office/word/2010/wordprocessingInk" xmlns:wne="http://schemas.microsoft.com/office/word/2006/wordml" xmlns:wps="http://schemas.microsoft.com/office/word/2010/wordprocessingShape" mc:Ignorable="w14 w15 w16se w16cid w16 w16cex w16sdtdh w16sdtfl w16du wp14">
-  <w:p>
-    <w:pPr>
-      <w:pStyle w:val="Header"/>
-    </w:pPr>
-    <w:r>
-      <w:t>NNDL</w:t>
-    </w:r>
-    <w:r>
-      <w:t>_coursework</w:t>
-    </w:r>
-    <w:r>
-      <w:t>-2</w:t>
-    </w:r>
-    <w:r>
-      <w:t>025</w:t>
-    </w:r>
-  </w:p>
-</w:hdr>
-</file>
-
 <file path=word/numbering.xml><?xml version="1.0" encoding="utf-8"?>
-<w:numbering xmlns:aink="http://schemas.microsoft.com/office/drawing/2016/ink" xmlns:am3d="http://schemas.microsoft.com/office/drawing/2017/model3d" xmlns:cx="http://schemas.microsoft.com/office/drawing/2014/chartex" xmlns:cx1="http://schemas.microsoft.com/office/drawing/2015/9/8/chartex" xmlns:cx2="http://schemas.microsoft.com/office/drawing/2015/10/21/chartex" xmlns:cx3="http://schemas.microsoft.com/office/drawing/2016/5/9/chartex" xmlns:cx4="http://schemas.microsoft.com/office/drawing/2016/5/10/chartex" xmlns:cx5="http://schemas.microsoft.com/office/drawing/2016/5/11/chartex" xmlns:cx6="http://schemas.microsoft.com/office/drawing/2016/5/12/chartex" xmlns:cx7="http://schemas.microsoft.com/office/drawing/2016/5/13/chartex" xmlns:cx8="http://schemas.microsoft.com/office/drawing/2016/5/14/chartex" xmlns:m="http://schemas.openxmlformats.org/officeDocument/2006/math" xmlns:mc="http://schemas.openxmlformats.org/markup-compatibility/2006" xmlns:o="urn:schemas-microsoft-com:office:office" xmlns:oel="http://schemas.microsoft.com/office/2019/extlst" xmlns:r="http://schemas.openxmlformats.org/officeDocument/2006/relationships" xmlns:v="urn:schemas-microsoft-com:vml" xmlns:w="http://schemas.openxmlformats.org/wordprocessingml/2006/main" xmlns:w10="urn:schemas-microsoft-com:office:word" xmlns:w14="http://schemas.microsoft.com/office/word/2010/wordml" xmlns:w15="http://schemas.microsoft.com/office/word/2012/wordml" xmlns:w16="http://schemas.microsoft.com/office/word/2018/wordml" xmlns:w16cex="http://schemas.microsoft.com/office/word/2018/wordml/cex" xmlns:w16cid="http://schemas.microsoft.com/office/word/2016/wordml/cid" xmlns:w16du="http://schemas.microsoft.com/office/word/2023/wordml/word16du" xmlns:w16sdtdh="http://schemas.microsoft.com/office/word/2020/wordml/sdtdatahash" xmlns:w16sdtfl="http://schemas.microsoft.com/office/word/2024/wordml/sdtformatlock" xmlns:w16se="http://schemas.microsoft.com/office/word/2015/wordml/symex" xmlns:wne="http://schemas.microsoft.com/office/word/2006/wordml" xmlns:wp="http://schemas.openxmlformats.org/drawingml/2006/wordprocessingDrawing" xmlns:wp14="http://schemas.microsoft.com/office/word/2010/wordprocessingDrawing" xmlns:wpc="http://schemas.microsoft.com/office/word/2010/wordprocessingCanvas" xmlns:wpg="http://schemas.microsoft.com/office/word/2010/wordprocessingGroup" xmlns:wpi="http://schemas.microsoft.com/office/word/2010/wordprocessingInk" xmlns:wps="http://schemas.microsoft.com/office/word/2010/wordprocessingShape" mc:Ignorable="w14 w15 w16se w16cid w16 w16cex w16sdtdh w16sdtfl w16du wp14">
-  <w:abstractNum w15:restartNumberingAfterBreak="0" w:abstractNumId="0">
-    <w:nsid w:val="032C5DA3"/>
-    <w:multiLevelType w:val="hybridMultilevel"/>
-    <w:tmpl w:val="C2B41D0C"/>
-    <w:lvl w:ilvl="0" w:tplc="0809000F">
-      <w:start w:val="1"/>
-      <w:numFmt w:val="decimal"/>
-      <w:lvlText w:val="%1."/>
-      <w:lvlJc w:val="left"/>
-      <w:pPr>
-        <w:ind w:hanging="360" w:left="360"/>
-      </w:pPr>
-      <w:rPr>
-        <w:rFonts w:hint="default"/>
-      </w:rPr>
-    </w:lvl>
-    <w:lvl w:ilvl="1" w:tentative="1" w:tplc="08090019">
-      <w:start w:val="1"/>
-      <w:numFmt w:val="lowerLetter"/>
-      <w:lvlText w:val="%2."/>
-      <w:lvlJc w:val="left"/>
-      <w:pPr>
-        <w:ind w:hanging="360" w:left="1080"/>
-      </w:pPr>
-    </w:lvl>
-    <w:lvl w:ilvl="2" w:tentative="1" w:tplc="0809001B">
-      <w:start w:val="1"/>
-      <w:numFmt w:val="lowerRoman"/>
-      <w:lvlText w:val="%3."/>
-      <w:lvlJc w:val="right"/>
-      <w:pPr>
-        <w:ind w:hanging="180" w:left="1800"/>
-      </w:pPr>
-    </w:lvl>
-    <w:lvl w:ilvl="3" w:tentative="1" w:tplc="0809000F">
-      <w:start w:val="1"/>
-      <w:numFmt w:val="decimal"/>
-      <w:lvlText w:val="%4."/>
-      <w:lvlJc w:val="left"/>
-      <w:pPr>
-        <w:ind w:hanging="360" w:left="2520"/>
-      </w:pPr>
-    </w:lvl>
-    <w:lvl w:ilvl="4" w:tentative="1" w:tplc="08090019">
-      <w:start w:val="1"/>
-      <w:numFmt w:val="lowerLetter"/>
-      <w:lvlText w:val="%5."/>
-      <w:lvlJc w:val="left"/>
-      <w:pPr>
-        <w:ind w:hanging="360" w:left="3240"/>
-      </w:pPr>
-    </w:lvl>
-    <w:lvl w:ilvl="5" w:tentative="1" w:tplc="0809001B">
-      <w:start w:val="1"/>
-      <w:numFmt w:val="lowerRoman"/>
-      <w:lvlText w:val="%6."/>
-      <w:lvlJc w:val="right"/>
-      <w:pPr>
-        <w:ind w:hanging="180" w:left="3960"/>
-      </w:pPr>
-    </w:lvl>
-    <w:lvl w:ilvl="6" w:tentative="1" w:tplc="0809000F">
-      <w:start w:val="1"/>
-      <w:numFmt w:val="decimal"/>
-      <w:lvlText w:val="%7."/>
-      <w:lvlJc w:val="left"/>
-      <w:pPr>
-        <w:ind w:hanging="360" w:left="4680"/>
-      </w:pPr>
-    </w:lvl>
-    <w:lvl w:ilvl="7" w:tentative="1" w:tplc="08090019">
-      <w:start w:val="1"/>
-      <w:numFmt w:val="lowerLetter"/>
-      <w:lvlText w:val="%8."/>
-      <w:lvlJc w:val="left"/>
-      <w:pPr>
-        <w:ind w:hanging="360" w:left="5400"/>
-      </w:pPr>
-    </w:lvl>
-    <w:lvl w:ilvl="8" w:tentative="1" w:tplc="0809001B">
-      <w:start w:val="1"/>
-      <w:numFmt w:val="lowerRoman"/>
-      <w:lvlText w:val="%9."/>
-      <w:lvlJc w:val="right"/>
-      <w:pPr>
-        <w:ind w:hanging="180" w:left="6120"/>
-      </w:pPr>
-    </w:lvl>
-  </w:abstractNum>
-  <w:abstractNum w15:restartNumberingAfterBreak="0" w:abstractNumId="1">
-    <w:nsid w:val="0C955FE7"/>
-    <w:multiLevelType w:val="hybridMultilevel"/>
-    <w:tmpl w:val="A67456D4"/>
-    <w:lvl w:ilvl="0" w:tplc="0409000F">
-      <w:start w:val="1"/>
-      <w:numFmt w:val="decimal"/>
-      <w:lvlText w:val="%1."/>
-      <w:lvlJc w:val="left"/>
-      <w:pPr>
-        <w:ind w:hanging="360" w:left="720"/>
-      </w:pPr>
-      <w:rPr>
-        <w:rFonts w:hint="default"/>
-      </w:rPr>
-    </w:lvl>
-    <w:lvl w:ilvl="1" w:tplc="04090019">
-      <w:start w:val="1"/>
-      <w:numFmt w:val="lowerLetter"/>
-      <w:lvlText w:val="%2."/>
-      <w:lvlJc w:val="left"/>
-      <w:pPr>
-        <w:ind w:hanging="360" w:left="1440"/>
-      </w:pPr>
-    </w:lvl>
-    <w:lvl w:ilvl="2" w:tentative="1" w:tplc="0409001B">
-      <w:start w:val="1"/>
-      <w:numFmt w:val="lowerRoman"/>
-      <w:lvlText w:val="%3."/>
-      <w:lvlJc w:val="right"/>
-      <w:pPr>
-        <w:ind w:hanging="180" w:left="2160"/>
-      </w:pPr>
-    </w:lvl>
-    <w:lvl w:ilvl="3" w:tentative="1" w:tplc="0409000F">
-      <w:start w:val="1"/>
-      <w:numFmt w:val="decimal"/>
-      <w:lvlText w:val="%4."/>
-      <w:lvlJc w:val="left"/>
-      <w:pPr>
-        <w:ind w:hanging="360" w:left="2880"/>
-      </w:pPr>
-    </w:lvl>
-    <w:lvl w:ilvl="4" w:tentative="1" w:tplc="04090019">
-      <w:start w:val="1"/>
-      <w:numFmt w:val="lowerLetter"/>
-      <w:lvlText w:val="%5."/>
-      <w:lvlJc w:val="left"/>
-      <w:pPr>
-        <w:ind w:hanging="360" w:left="3600"/>
-      </w:pPr>
-    </w:lvl>
-    <w:lvl w:ilvl="5" w:tentative="1" w:tplc="0409001B">
-      <w:start w:val="1"/>
-      <w:numFmt w:val="lowerRoman"/>
-      <w:lvlText w:val="%6."/>
-      <w:lvlJc w:val="right"/>
-      <w:pPr>
-        <w:ind w:hanging="180" w:left="4320"/>
-      </w:pPr>
-    </w:lvl>
-    <w:lvl w:ilvl="6" w:tentative="1" w:tplc="0409000F">
-      <w:start w:val="1"/>
-      <w:numFmt w:val="decimal"/>
-      <w:lvlText w:val="%7."/>
-      <w:lvlJc w:val="left"/>
-      <w:pPr>
-        <w:ind w:hanging="360" w:left="5040"/>
-      </w:pPr>
-    </w:lvl>
-    <w:lvl w:ilvl="7" w:tentative="1" w:tplc="04090019">
-      <w:start w:val="1"/>
-      <w:numFmt w:val="lowerLetter"/>
-      <w:lvlText w:val="%8."/>
-      <w:lvlJc w:val="left"/>
-      <w:pPr>
-        <w:ind w:hanging="360" w:left="5760"/>
-      </w:pPr>
-    </w:lvl>
-    <w:lvl w:ilvl="8" w:tentative="1" w:tplc="0409001B">
-      <w:start w:val="1"/>
-      <w:numFmt w:val="lowerRoman"/>
-      <w:lvlText w:val="%9."/>
-      <w:lvlJc w:val="right"/>
-      <w:pPr>
-        <w:ind w:hanging="180" w:left="6480"/>
-      </w:pPr>
-    </w:lvl>
-  </w:abstractNum>
-  <w:abstractNum w15:restartNumberingAfterBreak="0" w:abstractNumId="2">
-    <w:nsid w:val="104C6F50"/>
-    <w:multiLevelType w:val="hybridMultilevel"/>
-    <w:tmpl w:val="7200089C"/>
-    <w:lvl w:ilvl="0" w:tplc="0409000F">
-      <w:start w:val="1"/>
-      <w:numFmt w:val="decimal"/>
-      <w:lvlText w:val="%1."/>
-      <w:lvlJc w:val="left"/>
-      <w:pPr>
-        <w:ind w:hanging="360" w:left="720"/>
-      </w:pPr>
-      <w:rPr>
-        <w:rFonts w:hint="default"/>
-      </w:rPr>
-    </w:lvl>
-    <w:lvl w:ilvl="1" w:tentative="1" w:tplc="04090019">
-      <w:start w:val="1"/>
-      <w:numFmt w:val="lowerLetter"/>
-      <w:lvlText w:val="%2."/>
-      <w:lvlJc w:val="left"/>
-      <w:pPr>
-        <w:ind w:hanging="360" w:left="1440"/>
-      </w:pPr>
-    </w:lvl>
-    <w:lvl w:ilvl="2" w:tentative="1" w:tplc="0409001B">
-      <w:start w:val="1"/>
-      <w:numFmt w:val="lowerRoman"/>
-      <w:lvlText w:val="%3."/>
-      <w:lvlJc w:val="right"/>
-      <w:pPr>
-        <w:ind w:hanging="180" w:left="2160"/>
-      </w:pPr>
-    </w:lvl>
-    <w:lvl w:ilvl="3" w:tentative="1" w:tplc="0409000F">
-      <w:start w:val="1"/>
-      <w:numFmt w:val="decimal"/>
-      <w:lvlText w:val="%4."/>
-      <w:lvlJc w:val="left"/>
-      <w:pPr>
-        <w:ind w:hanging="360" w:left="2880"/>
-      </w:pPr>
-    </w:lvl>
-    <w:lvl w:ilvl="4" w:tentative="1" w:tplc="04090019">
-      <w:start w:val="1"/>
-      <w:numFmt w:val="lowerLetter"/>
-      <w:lvlText w:val="%5."/>
-      <w:lvlJc w:val="left"/>
-      <w:pPr>
-        <w:ind w:hanging="360" w:left="3600"/>
-      </w:pPr>
-    </w:lvl>
-    <w:lvl w:ilvl="5" w:tentative="1" w:tplc="0409001B">
-      <w:start w:val="1"/>
-      <w:numFmt w:val="lowerRoman"/>
-      <w:lvlText w:val="%6."/>
-      <w:lvlJc w:val="right"/>
-      <w:pPr>
-        <w:ind w:hanging="180" w:left="4320"/>
-      </w:pPr>
-    </w:lvl>
-    <w:lvl w:ilvl="6" w:tentative="1" w:tplc="0409000F">
-      <w:start w:val="1"/>
-      <w:numFmt w:val="decimal"/>
-      <w:lvlText w:val="%7."/>
-      <w:lvlJc w:val="left"/>
-      <w:pPr>
-        <w:ind w:hanging="360" w:left="5040"/>
-      </w:pPr>
-    </w:lvl>
-    <w:lvl w:ilvl="7" w:tentative="1" w:tplc="04090019">
-      <w:start w:val="1"/>
-      <w:numFmt w:val="lowerLetter"/>
-      <w:lvlText w:val="%8."/>
-      <w:lvlJc w:val="left"/>
-      <w:pPr>
-        <w:ind w:hanging="360" w:left="5760"/>
-      </w:pPr>
-    </w:lvl>
-    <w:lvl w:ilvl="8" w:tentative="1" w:tplc="0409001B">
-      <w:start w:val="1"/>
-      <w:numFmt w:val="lowerRoman"/>
-      <w:lvlText w:val="%9."/>
-      <w:lvlJc w:val="right"/>
-      <w:pPr>
-        <w:ind w:hanging="180" w:left="6480"/>
-      </w:pPr>
-    </w:lvl>
-  </w:abstractNum>
-  <w:abstractNum w15:restartNumberingAfterBreak="0" w:abstractNumId="3">
-    <w:nsid w:val="23313CD5"/>
-    <w:multiLevelType w:val="hybridMultilevel"/>
-    <w:tmpl w:val="A67456D4"/>
-    <w:lvl w:ilvl="0" w:tplc="0409000F">
-      <w:start w:val="1"/>
-      <w:numFmt w:val="decimal"/>
-      <w:lvlText w:val="%1."/>
-      <w:lvlJc w:val="left"/>
-      <w:pPr>
-        <w:ind w:hanging="360" w:left="720"/>
-      </w:pPr>
-      <w:rPr>
-        <w:rFonts w:hint="default"/>
-      </w:rPr>
-    </w:lvl>
-    <w:lvl w:ilvl="1" w:tplc="04090019">
-      <w:start w:val="1"/>
-      <w:numFmt w:val="lowerLetter"/>
-      <w:lvlText w:val="%2."/>
-      <w:lvlJc w:val="left"/>
-      <w:pPr>
-        <w:ind w:hanging="360" w:left="1440"/>
-      </w:pPr>
-    </w:lvl>
-    <w:lvl w:ilvl="2" w:tentative="1" w:tplc="0409001B">
-      <w:start w:val="1"/>
-      <w:numFmt w:val="lowerRoman"/>
-      <w:lvlText w:val="%3."/>
-      <w:lvlJc w:val="right"/>
-      <w:pPr>
-        <w:ind w:hanging="180" w:left="2160"/>
-      </w:pPr>
-    </w:lvl>
-    <w:lvl w:ilvl="3" w:tentative="1" w:tplc="0409000F">
-      <w:start w:val="1"/>
-      <w:numFmt w:val="decimal"/>
-      <w:lvlText w:val="%4."/>
-      <w:lvlJc w:val="left"/>
-      <w:pPr>
-        <w:ind w:hanging="360" w:left="2880"/>
-      </w:pPr>
-    </w:lvl>
-    <w:lvl w:ilvl="4" w:tentative="1" w:tplc="04090019">
-      <w:start w:val="1"/>
-      <w:numFmt w:val="lowerLetter"/>
-      <w:lvlText w:val="%5."/>
-      <w:lvlJc w:val="left"/>
-      <w:pPr>
-        <w:ind w:hanging="360" w:left="3600"/>
-      </w:pPr>
-    </w:lvl>
-    <w:lvl w:ilvl="5" w:tentative="1" w:tplc="0409001B">
-      <w:start w:val="1"/>
-      <w:numFmt w:val="lowerRoman"/>
-      <w:lvlText w:val="%6."/>
-      <w:lvlJc w:val="right"/>
-      <w:pPr>
-        <w:ind w:hanging="180" w:left="4320"/>
-      </w:pPr>
-    </w:lvl>
-    <w:lvl w:ilvl="6" w:tentative="1" w:tplc="0409000F">
-      <w:start w:val="1"/>
-      <w:numFmt w:val="decimal"/>
-      <w:lvlText w:val="%7."/>
-      <w:lvlJc w:val="left"/>
-      <w:pPr>
-        <w:ind w:hanging="360" w:left="5040"/>
-      </w:pPr>
-    </w:lvl>
-    <w:lvl w:ilvl="7" w:tentative="1" w:tplc="04090019">
-      <w:start w:val="1"/>
-      <w:numFmt w:val="lowerLetter"/>
-      <w:lvlText w:val="%8."/>
-      <w:lvlJc w:val="left"/>
-      <w:pPr>
-        <w:ind w:hanging="360" w:left="5760"/>
-      </w:pPr>
-    </w:lvl>
-    <w:lvl w:ilvl="8" w:tentative="1" w:tplc="0409001B">
-      <w:start w:val="1"/>
-      <w:numFmt w:val="lowerRoman"/>
-      <w:lvlText w:val="%9."/>
-      <w:lvlJc w:val="right"/>
-      <w:pPr>
-        <w:ind w:hanging="180" w:left="6480"/>
-      </w:pPr>
-    </w:lvl>
-  </w:abstractNum>
-  <w:abstractNum w15:restartNumberingAfterBreak="0" w:abstractNumId="4">
-    <w:nsid w:val="271D4B96"/>
-    <w:multiLevelType w:val="hybridMultilevel"/>
-    <w:tmpl w:val="BE986C26"/>
-    <w:lvl w:ilvl="0" w:tplc="86EA300C">
-      <w:start w:val="1"/>
-      <w:numFmt w:val="upperRoman"/>
-      <w:lvlText w:val="(%1)"/>
-      <w:lvlJc w:val="left"/>
-      <w:pPr>
-        <w:ind w:hanging="720" w:left="1080"/>
-      </w:pPr>
-      <w:rPr>
-        <w:rFonts w:hint="default"/>
-      </w:rPr>
-    </w:lvl>
-    <w:lvl w:ilvl="1" w:tplc="04090019">
-      <w:start w:val="1"/>
-      <w:numFmt w:val="lowerLetter"/>
-      <w:lvlText w:val="%2."/>
-      <w:lvlJc w:val="left"/>
-      <w:pPr>
-        <w:ind w:hanging="360" w:left="1440"/>
-      </w:pPr>
-    </w:lvl>
-    <w:lvl w:ilvl="2" w:tentative="1" w:tplc="0409001B">
-      <w:start w:val="1"/>
-      <w:numFmt w:val="lowerRoman"/>
-      <w:lvlText w:val="%3."/>
-      <w:lvlJc w:val="right"/>
-      <w:pPr>
-        <w:ind w:hanging="180" w:left="2160"/>
-      </w:pPr>
-    </w:lvl>
-    <w:lvl w:ilvl="3" w:tentative="1" w:tplc="0409000F">
-      <w:start w:val="1"/>
-      <w:numFmt w:val="decimal"/>
-      <w:lvlText w:val="%4."/>
-      <w:lvlJc w:val="left"/>
-      <w:pPr>
-        <w:ind w:hanging="360" w:left="2880"/>
-      </w:pPr>
-    </w:lvl>
-    <w:lvl w:ilvl="4" w:tentative="1" w:tplc="04090019">
-      <w:start w:val="1"/>
-      <w:numFmt w:val="lowerLetter"/>
-      <w:lvlText w:val="%5."/>
-      <w:lvlJc w:val="left"/>
-      <w:pPr>
-        <w:ind w:hanging="360" w:left="3600"/>
-      </w:pPr>
-    </w:lvl>
-    <w:lvl w:ilvl="5" w:tentative="1" w:tplc="0409001B">
-      <w:start w:val="1"/>
-      <w:numFmt w:val="lowerRoman"/>
-      <w:lvlText w:val="%6."/>
-      <w:lvlJc w:val="right"/>
-      <w:pPr>
-        <w:ind w:hanging="180" w:left="4320"/>
-      </w:pPr>
-    </w:lvl>
-    <w:lvl w:ilvl="6" w:tentative="1" w:tplc="0409000F">
-      <w:start w:val="1"/>
-      <w:numFmt w:val="decimal"/>
-      <w:lvlText w:val="%7."/>
-      <w:lvlJc w:val="left"/>
-      <w:pPr>
-        <w:ind w:hanging="360" w:left="5040"/>
-      </w:pPr>
-    </w:lvl>
-    <w:lvl w:ilvl="7" w:tentative="1" w:tplc="04090019">
-      <w:start w:val="1"/>
-      <w:numFmt w:val="lowerLetter"/>
-      <w:lvlText w:val="%8."/>
-      <w:lvlJc w:val="left"/>
-      <w:pPr>
-        <w:ind w:hanging="360" w:left="5760"/>
-      </w:pPr>
-    </w:lvl>
-    <w:lvl w:ilvl="8" w:tentative="1" w:tplc="0409001B">
-      <w:start w:val="1"/>
-      <w:numFmt w:val="lowerRoman"/>
-      <w:lvlText w:val="%9."/>
-      <w:lvlJc w:val="right"/>
-      <w:pPr>
-        <w:ind w:hanging="180" w:left="6480"/>
-      </w:pPr>
-    </w:lvl>
-  </w:abstractNum>
-  <w:abstractNum w15:restartNumberingAfterBreak="0" w:abstractNumId="5">
-    <w:nsid w:val="302F43F6"/>
-    <w:multiLevelType w:val="hybridMultilevel"/>
-    <w:tmpl w:val="E1F4FFB6"/>
-    <w:lvl w:ilvl="0" w:tplc="0409000F">
-      <w:start w:val="1"/>
-      <w:numFmt w:val="decimal"/>
-      <w:lvlText w:val="%1."/>
-      <w:lvlJc w:val="left"/>
-      <w:pPr>
-        <w:ind w:hanging="360" w:left="720"/>
-      </w:pPr>
-      <w:rPr>
-        <w:rFonts w:hint="default"/>
-      </w:rPr>
-    </w:lvl>
-    <w:lvl w:ilvl="1" w:tplc="04090019">
-      <w:start w:val="1"/>
-      <w:numFmt w:val="lowerLetter"/>
-      <w:lvlText w:val="%2."/>
-      <w:lvlJc w:val="left"/>
-      <w:pPr>
-        <w:ind w:hanging="360" w:left="1440"/>
-      </w:pPr>
-    </w:lvl>
-    <w:lvl w:ilvl="2" w:tentative="1" w:tplc="0409001B">
-      <w:start w:val="1"/>
-      <w:numFmt w:val="lowerRoman"/>
-      <w:lvlText w:val="%3."/>
-      <w:lvlJc w:val="right"/>
-      <w:pPr>
-        <w:ind w:hanging="180" w:left="2160"/>
-      </w:pPr>
-    </w:lvl>
-    <w:lvl w:ilvl="3" w:tentative="1" w:tplc="0409000F">
-      <w:start w:val="1"/>
-      <w:numFmt w:val="decimal"/>
-      <w:lvlText w:val="%4."/>
-      <w:lvlJc w:val="left"/>
-      <w:pPr>
-        <w:ind w:hanging="360" w:left="2880"/>
-      </w:pPr>
-    </w:lvl>
-    <w:lvl w:ilvl="4" w:tentative="1" w:tplc="04090019">
-      <w:start w:val="1"/>
-      <w:numFmt w:val="lowerLetter"/>
-      <w:lvlText w:val="%5."/>
-      <w:lvlJc w:val="left"/>
-      <w:pPr>
-        <w:ind w:hanging="360" w:left="3600"/>
-      </w:pPr>
-    </w:lvl>
-    <w:lvl w:ilvl="5" w:tentative="1" w:tplc="0409001B">
-      <w:start w:val="1"/>
-      <w:numFmt w:val="lowerRoman"/>
-      <w:lvlText w:val="%6."/>
-      <w:lvlJc w:val="right"/>
-      <w:pPr>
-        <w:ind w:hanging="180" w:left="4320"/>
-      </w:pPr>
-    </w:lvl>
-    <w:lvl w:ilvl="6" w:tentative="1" w:tplc="0409000F">
-      <w:start w:val="1"/>
-      <w:numFmt w:val="decimal"/>
-      <w:lvlText w:val="%7."/>
-      <w:lvlJc w:val="left"/>
-      <w:pPr>
-        <w:ind w:hanging="360" w:left="5040"/>
-      </w:pPr>
-    </w:lvl>
-    <w:lvl w:ilvl="7" w:tentative="1" w:tplc="04090019">
-      <w:start w:val="1"/>
-      <w:numFmt w:val="lowerLetter"/>
-      <w:lvlText w:val="%8."/>
-      <w:lvlJc w:val="left"/>
-      <w:pPr>
-        <w:ind w:hanging="360" w:left="5760"/>
-      </w:pPr>
-    </w:lvl>
-    <w:lvl w:ilvl="8" w:tentative="1" w:tplc="0409001B">
-      <w:start w:val="1"/>
-      <w:numFmt w:val="lowerRoman"/>
-      <w:lvlText w:val="%9."/>
-      <w:lvlJc w:val="right"/>
-      <w:pPr>
-        <w:ind w:hanging="180" w:left="6480"/>
-      </w:pPr>
-    </w:lvl>
-  </w:abstractNum>
-  <w:abstractNum w15:restartNumberingAfterBreak="0" w:abstractNumId="6">
-    <w:nsid w:val="33200461"/>
-    <w:multiLevelType w:val="hybridMultilevel"/>
-    <w:tmpl w:val="7B12E0B0"/>
-    <w:lvl w:ilvl="0" w:tplc="04090013">
-      <w:start w:val="1"/>
-      <w:numFmt w:val="upperRoman"/>
-      <w:lvlText w:val="%1."/>
-      <w:lvlJc w:val="right"/>
-      <w:pPr>
-        <w:ind w:hanging="360" w:left="1080"/>
-      </w:pPr>
-    </w:lvl>
-    <w:lvl w:ilvl="1" w:tentative="1" w:tplc="04090019">
-      <w:start w:val="1"/>
-      <w:numFmt w:val="lowerLetter"/>
-      <w:lvlText w:val="%2."/>
-      <w:lvlJc w:val="left"/>
-      <w:pPr>
-        <w:ind w:hanging="360" w:left="1800"/>
-      </w:pPr>
-    </w:lvl>
-    <w:lvl w:ilvl="2" w:tentative="1" w:tplc="0409001B">
-      <w:start w:val="1"/>
-      <w:numFmt w:val="lowerRoman"/>
-      <w:lvlText w:val="%3."/>
-      <w:lvlJc w:val="right"/>
-      <w:pPr>
-        <w:ind w:hanging="180" w:left="2520"/>
-      </w:pPr>
-    </w:lvl>
-    <w:lvl w:ilvl="3" w:tentative="1" w:tplc="0409000F">
-      <w:start w:val="1"/>
-      <w:numFmt w:val="decimal"/>
-      <w:lvlText w:val="%4."/>
-      <w:lvlJc w:val="left"/>
-      <w:pPr>
-        <w:ind w:hanging="360" w:left="3240"/>
-      </w:pPr>
-    </w:lvl>
-    <w:lvl w:ilvl="4" w:tentative="1" w:tplc="04090019">
-      <w:start w:val="1"/>
-      <w:numFmt w:val="lowerLetter"/>
-      <w:lvlText w:val="%5."/>
-      <w:lvlJc w:val="left"/>
-      <w:pPr>
-        <w:ind w:hanging="360" w:left="3960"/>
-      </w:pPr>
-    </w:lvl>
-    <w:lvl w:ilvl="5" w:tentative="1" w:tplc="0409001B">
-      <w:start w:val="1"/>
-      <w:numFmt w:val="lowerRoman"/>
-      <w:lvlText w:val="%6."/>
-      <w:lvlJc w:val="right"/>
-      <w:pPr>
-        <w:ind w:hanging="180" w:left="4680"/>
-      </w:pPr>
-    </w:lvl>
-    <w:lvl w:ilvl="6" w:tentative="1" w:tplc="0409000F">
-      <w:start w:val="1"/>
-      <w:numFmt w:val="decimal"/>
-      <w:lvlText w:val="%7."/>
-      <w:lvlJc w:val="left"/>
-      <w:pPr>
-        <w:ind w:hanging="360" w:left="5400"/>
-      </w:pPr>
-    </w:lvl>
-    <w:lvl w:ilvl="7" w:tentative="1" w:tplc="04090019">
-      <w:start w:val="1"/>
-      <w:numFmt w:val="lowerLetter"/>
-      <w:lvlText w:val="%8."/>
-      <w:lvlJc w:val="left"/>
-      <w:pPr>
-        <w:ind w:hanging="360" w:left="6120"/>
-      </w:pPr>
-    </w:lvl>
-    <w:lvl w:ilvl="8" w:tentative="1" w:tplc="0409001B">
-      <w:start w:val="1"/>
-      <w:numFmt w:val="lowerRoman"/>
-      <w:lvlText w:val="%9."/>
-      <w:lvlJc w:val="right"/>
-      <w:pPr>
-        <w:ind w:hanging="180" w:left="6840"/>
-      </w:pPr>
-    </w:lvl>
-  </w:abstractNum>
-  <w:abstractNum w15:restartNumberingAfterBreak="0" w:abstractNumId="7">
-    <w:nsid w:val="3B810D58"/>
-    <w:multiLevelType w:val="hybridMultilevel"/>
-    <w:tmpl w:val="7D36E028"/>
-    <w:lvl w:ilvl="0" w:tplc="04090001">
-      <w:start w:val="1"/>
-      <w:numFmt w:val="bullet"/>
-      <w:lvlText w:val=""/>
-      <w:lvlJc w:val="left"/>
-      <w:pPr>
-        <w:ind w:hanging="360" w:left="720"/>
-      </w:pPr>
-      <w:rPr>
-        <w:rFonts w:ascii="Symbol" w:hAnsi="Symbol" w:hint="default"/>
-      </w:rPr>
-    </w:lvl>
-    <w:lvl w:ilvl="1" w:tentative="1" w:tplc="04090003">
-      <w:start w:val="1"/>
-      <w:numFmt w:val="bullet"/>
-      <w:lvlText w:val="o"/>
-      <w:lvlJc w:val="left"/>
-      <w:pPr>
-        <w:ind w:hanging="360" w:left="1440"/>
-      </w:pPr>
-      <w:rPr>
-        <w:rFonts w:ascii="Courier New" w:cs="Courier New" w:hAnsi="Courier New" w:hint="default"/>
-      </w:rPr>
-    </w:lvl>
-    <w:lvl w:ilvl="2" w:tentative="1" w:tplc="04090005">
-      <w:start w:val="1"/>
-      <w:numFmt w:val="bullet"/>
-      <w:lvlText w:val=""/>
-      <w:lvlJc w:val="left"/>
-      <w:pPr>
-        <w:ind w:hanging="360" w:left="2160"/>
-      </w:pPr>
-      <w:rPr>
-        <w:rFonts w:ascii="Wingdings" w:hAnsi="Wingdings" w:hint="default"/>
-      </w:rPr>
-    </w:lvl>
-    <w:lvl w:ilvl="3" w:tentative="1" w:tplc="04090001">
-      <w:start w:val="1"/>
-      <w:numFmt w:val="bullet"/>
-      <w:lvlText w:val=""/>
-      <w:lvlJc w:val="left"/>
-      <w:pPr>
-        <w:ind w:hanging="360" w:left="2880"/>
-      </w:pPr>
-      <w:rPr>
-        <w:rFonts w:ascii="Symbol" w:hAnsi="Symbol" w:hint="default"/>
-      </w:rPr>
-    </w:lvl>
-    <w:lvl w:ilvl="4" w:tentative="1" w:tplc="04090003">
-      <w:start w:val="1"/>
-      <w:numFmt w:val="bullet"/>
-      <w:lvlText w:val="o"/>
-      <w:lvlJc w:val="left"/>
-      <w:pPr>
-        <w:ind w:hanging="360" w:left="3600"/>
-      </w:pPr>
-      <w:rPr>
-        <w:rFonts w:ascii="Courier New" w:cs="Courier New" w:hAnsi="Courier New" w:hint="default"/>
-      </w:rPr>
-    </w:lvl>
-    <w:lvl w:ilvl="5" w:tentative="1" w:tplc="04090005">
-      <w:start w:val="1"/>
-      <w:numFmt w:val="bullet"/>
-      <w:lvlText w:val=""/>
-      <w:lvlJc w:val="left"/>
-      <w:pPr>
-        <w:ind w:hanging="360" w:left="4320"/>
-      </w:pPr>
-      <w:rPr>
-        <w:rFonts w:ascii="Wingdings" w:hAnsi="Wingdings" w:hint="default"/>
-      </w:rPr>
-    </w:lvl>
-    <w:lvl w:ilvl="6" w:tentative="1" w:tplc="04090001">
-      <w:start w:val="1"/>
-      <w:numFmt w:val="bullet"/>
-      <w:lvlText w:val=""/>
-      <w:lvlJc w:val="left"/>
-      <w:pPr>
-        <w:ind w:hanging="360" w:left="5040"/>
-      </w:pPr>
-      <w:rPr>
-        <w:rFonts w:ascii="Symbol" w:hAnsi="Symbol" w:hint="default"/>
-      </w:rPr>
-    </w:lvl>
-    <w:lvl w:ilvl="7" w:tentative="1" w:tplc="04090003">
-      <w:start w:val="1"/>
-      <w:numFmt w:val="bullet"/>
-      <w:lvlText w:val="o"/>
-      <w:lvlJc w:val="left"/>
-      <w:pPr>
-        <w:ind w:hanging="360" w:left="5760"/>
-      </w:pPr>
-      <w:rPr>
-        <w:rFonts w:ascii="Courier New" w:cs="Courier New" w:hAnsi="Courier New" w:hint="default"/>
-      </w:rPr>
-    </w:lvl>
-    <w:lvl w:ilvl="8" w:tentative="1" w:tplc="04090005">
-      <w:start w:val="1"/>
-      <w:numFmt w:val="bullet"/>
-      <w:lvlText w:val=""/>
-      <w:lvlJc w:val="left"/>
-      <w:pPr>
-        <w:ind w:hanging="360" w:left="6480"/>
-      </w:pPr>
-      <w:rPr>
-        <w:rFonts w:ascii="Wingdings" w:hAnsi="Wingdings" w:hint="default"/>
-      </w:rPr>
-    </w:lvl>
-  </w:abstractNum>
-  <w:abstractNum w15:restartNumberingAfterBreak="0" w:abstractNumId="8">
-    <w:nsid w:val="4F244F76"/>
-    <w:multiLevelType w:val="hybridMultilevel"/>
-    <w:tmpl w:val="4A7AC298"/>
-    <w:lvl w:ilvl="0" w:tplc="04090019">
-      <w:start w:val="1"/>
-      <w:numFmt w:val="lowerLetter"/>
-      <w:lvlText w:val="%1."/>
-      <w:lvlJc w:val="left"/>
-      <w:pPr>
-        <w:ind w:hanging="360" w:left="1440"/>
-      </w:pPr>
-    </w:lvl>
-    <w:lvl w:ilvl="1" w:tentative="1" w:tplc="04090019">
-      <w:start w:val="1"/>
-      <w:numFmt w:val="lowerLetter"/>
-      <w:lvlText w:val="%2."/>
-      <w:lvlJc w:val="left"/>
-      <w:pPr>
-        <w:ind w:hanging="360" w:left="2160"/>
-      </w:pPr>
-    </w:lvl>
-    <w:lvl w:ilvl="2" w:tentative="1" w:tplc="0409001B">
-      <w:start w:val="1"/>
-      <w:numFmt w:val="lowerRoman"/>
-      <w:lvlText w:val="%3."/>
-      <w:lvlJc w:val="right"/>
-      <w:pPr>
-        <w:ind w:hanging="180" w:left="2880"/>
-      </w:pPr>
-    </w:lvl>
-    <w:lvl w:ilvl="3" w:tentative="1" w:tplc="0409000F">
-      <w:start w:val="1"/>
-      <w:numFmt w:val="decimal"/>
-      <w:lvlText w:val="%4."/>
-      <w:lvlJc w:val="left"/>
-      <w:pPr>
-        <w:ind w:hanging="360" w:left="3600"/>
-      </w:pPr>
-    </w:lvl>
-    <w:lvl w:ilvl="4" w:tentative="1" w:tplc="04090019">
-      <w:start w:val="1"/>
-      <w:numFmt w:val="lowerLetter"/>
-      <w:lvlText w:val="%5."/>
-      <w:lvlJc w:val="left"/>
-      <w:pPr>
-        <w:ind w:hanging="360" w:left="4320"/>
-      </w:pPr>
-    </w:lvl>
-    <w:lvl w:ilvl="5" w:tentative="1" w:tplc="0409001B">
-      <w:start w:val="1"/>
-      <w:numFmt w:val="lowerRoman"/>
-      <w:lvlText w:val="%6."/>
-      <w:lvlJc w:val="right"/>
-      <w:pPr>
-        <w:ind w:hanging="180" w:left="5040"/>
-      </w:pPr>
-    </w:lvl>
-    <w:lvl w:ilvl="6" w:tentative="1" w:tplc="0409000F">
-      <w:start w:val="1"/>
-      <w:numFmt w:val="decimal"/>
-      <w:lvlText w:val="%7."/>
-      <w:lvlJc w:val="left"/>
-      <w:pPr>
-        <w:ind w:hanging="360" w:left="5760"/>
-      </w:pPr>
-    </w:lvl>
-    <w:lvl w:ilvl="7" w:tentative="1" w:tplc="04090019">
-      <w:start w:val="1"/>
-      <w:numFmt w:val="lowerLetter"/>
-      <w:lvlText w:val="%8."/>
-      <w:lvlJc w:val="left"/>
-      <w:pPr>
-        <w:ind w:hanging="360" w:left="6480"/>
-      </w:pPr>
-    </w:lvl>
-    <w:lvl w:ilvl="8" w:tentative="1" w:tplc="0409001B">
-      <w:start w:val="1"/>
-      <w:numFmt w:val="lowerRoman"/>
-      <w:lvlText w:val="%9."/>
-      <w:lvlJc w:val="right"/>
-      <w:pPr>
-        <w:ind w:hanging="180" w:left="7200"/>
-      </w:pPr>
-    </w:lvl>
-  </w:abstractNum>
-  <w:abstractNum w15:restartNumberingAfterBreak="0" w:abstractNumId="9">
-    <w:nsid w:val="58393BF6"/>
-    <w:multiLevelType w:val="hybridMultilevel"/>
-    <w:tmpl w:val="F510ECE8"/>
-    <w:lvl w:ilvl="0" w:tplc="49DE5100">
-      <w:start w:val="1"/>
-      <w:numFmt w:val="decimal"/>
-      <w:lvlText w:val="%1."/>
-      <w:lvlJc w:val="left"/>
-      <w:pPr>
-        <w:ind w:hanging="360" w:left="1080"/>
-      </w:pPr>
-      <w:rPr>
-        <w:rFonts w:hint="default"/>
-      </w:rPr>
-    </w:lvl>
-    <w:lvl w:ilvl="1" w:tentative="1" w:tplc="04090019">
-      <w:start w:val="1"/>
-      <w:numFmt w:val="lowerLetter"/>
-      <w:lvlText w:val="%2."/>
-      <w:lvlJc w:val="left"/>
-      <w:pPr>
-        <w:ind w:hanging="360" w:left="1800"/>
-      </w:pPr>
-    </w:lvl>
-    <w:lvl w:ilvl="2" w:tentative="1" w:tplc="0409001B">
-      <w:start w:val="1"/>
-      <w:numFmt w:val="lowerRoman"/>
-      <w:lvlText w:val="%3."/>
-      <w:lvlJc w:val="right"/>
-      <w:pPr>
-        <w:ind w:hanging="180" w:left="2520"/>
-      </w:pPr>
-    </w:lvl>
-    <w:lvl w:ilvl="3" w:tentative="1" w:tplc="0409000F">
-      <w:start w:val="1"/>
-      <w:numFmt w:val="decimal"/>
-      <w:lvlText w:val="%4."/>
-      <w:lvlJc w:val="left"/>
-      <w:pPr>
-        <w:ind w:hanging="360" w:left="3240"/>
-      </w:pPr>
-    </w:lvl>
-    <w:lvl w:ilvl="4" w:tentative="1" w:tplc="04090019">
-      <w:start w:val="1"/>
-      <w:numFmt w:val="lowerLetter"/>
-      <w:lvlText w:val="%5."/>
-      <w:lvlJc w:val="left"/>
-      <w:pPr>
-        <w:ind w:hanging="360" w:left="3960"/>
-      </w:pPr>
-    </w:lvl>
-    <w:lvl w:ilvl="5" w:tentative="1" w:tplc="0409001B">
-      <w:start w:val="1"/>
-      <w:numFmt w:val="lowerRoman"/>
-      <w:lvlText w:val="%6."/>
-      <w:lvlJc w:val="right"/>
-      <w:pPr>
-        <w:ind w:hanging="180" w:left="4680"/>
-      </w:pPr>
-    </w:lvl>
-    <w:lvl w:ilvl="6" w:tentative="1" w:tplc="0409000F">
-      <w:start w:val="1"/>
-      <w:numFmt w:val="decimal"/>
-      <w:lvlText w:val="%7."/>
-      <w:lvlJc w:val="left"/>
-      <w:pPr>
-        <w:ind w:hanging="360" w:left="5400"/>
-      </w:pPr>
-    </w:lvl>
-    <w:lvl w:ilvl="7" w:tentative="1" w:tplc="04090019">
-      <w:start w:val="1"/>
-      <w:numFmt w:val="lowerLetter"/>
-      <w:lvlText w:val="%8."/>
-      <w:lvlJc w:val="left"/>
-      <w:pPr>
-        <w:ind w:hanging="360" w:left="6120"/>
-      </w:pPr>
-    </w:lvl>
-    <w:lvl w:ilvl="8" w:tentative="1" w:tplc="0409001B">
-      <w:start w:val="1"/>
-      <w:numFmt w:val="lowerRoman"/>
-      <w:lvlText w:val="%9."/>
-      <w:lvlJc w:val="right"/>
-      <w:pPr>
-        <w:ind w:hanging="180" w:left="6840"/>
-      </w:pPr>
-    </w:lvl>
-  </w:abstractNum>
-  <w:abstractNum w15:restartNumberingAfterBreak="0" w:abstractNumId="10">
-    <w:nsid w:val="64D46AC9"/>
-    <w:multiLevelType w:val="hybridMultilevel"/>
-    <w:tmpl w:val="88F00458"/>
-    <w:lvl w:ilvl="0" w:tplc="76484648">
-      <w:start w:val="1"/>
-      <w:numFmt w:val="decimal"/>
-      <w:lvlText w:val="%1."/>
-      <w:lvlJc w:val="left"/>
-      <w:pPr>
-        <w:ind w:hanging="360" w:left="1080"/>
-      </w:pPr>
-      <w:rPr>
-        <w:rFonts w:hint="default"/>
-      </w:rPr>
-    </w:lvl>
-    <w:lvl w:ilvl="1" w:tentative="1" w:tplc="04090019">
-      <w:start w:val="1"/>
-      <w:numFmt w:val="lowerLetter"/>
-      <w:lvlText w:val="%2."/>
-      <w:lvlJc w:val="left"/>
-      <w:pPr>
-        <w:ind w:hanging="360" w:left="1800"/>
-      </w:pPr>
-    </w:lvl>
-    <w:lvl w:ilvl="2" w:tentative="1" w:tplc="0409001B">
-      <w:start w:val="1"/>
-      <w:numFmt w:val="lowerRoman"/>
-      <w:lvlText w:val="%3."/>
-      <w:lvlJc w:val="right"/>
-      <w:pPr>
-        <w:ind w:hanging="180" w:left="2520"/>
-      </w:pPr>
-    </w:lvl>
-    <w:lvl w:ilvl="3" w:tentative="1" w:tplc="0409000F">
-      <w:start w:val="1"/>
-      <w:numFmt w:val="decimal"/>
-      <w:lvlText w:val="%4."/>
-      <w:lvlJc w:val="left"/>
-      <w:pPr>
-        <w:ind w:hanging="360" w:left="3240"/>
-      </w:pPr>
-    </w:lvl>
-    <w:lvl w:ilvl="4" w:tentative="1" w:tplc="04090019">
-      <w:start w:val="1"/>
-      <w:numFmt w:val="lowerLetter"/>
-      <w:lvlText w:val="%5."/>
-      <w:lvlJc w:val="left"/>
-      <w:pPr>
-        <w:ind w:hanging="360" w:left="3960"/>
-      </w:pPr>
-    </w:lvl>
-    <w:lvl w:ilvl="5" w:tentative="1" w:tplc="0409001B">
-      <w:start w:val="1"/>
-      <w:numFmt w:val="lowerRoman"/>
-      <w:lvlText w:val="%6."/>
-      <w:lvlJc w:val="right"/>
-      <w:pPr>
-        <w:ind w:hanging="180" w:left="4680"/>
-      </w:pPr>
-    </w:lvl>
-    <w:lvl w:ilvl="6" w:tentative="1" w:tplc="0409000F">
-      <w:start w:val="1"/>
-      <w:numFmt w:val="decimal"/>
-      <w:lvlText w:val="%7."/>
-      <w:lvlJc w:val="left"/>
-      <w:pPr>
-        <w:ind w:hanging="360" w:left="5400"/>
-      </w:pPr>
-    </w:lvl>
-    <w:lvl w:ilvl="7" w:tentative="1" w:tplc="04090019">
-      <w:start w:val="1"/>
-      <w:numFmt w:val="lowerLetter"/>
-      <w:lvlText w:val="%8."/>
-      <w:lvlJc w:val="left"/>
-      <w:pPr>
-        <w:ind w:hanging="360" w:left="6120"/>
-      </w:pPr>
-    </w:lvl>
-    <w:lvl w:ilvl="8" w:tentative="1" w:tplc="0409001B">
-      <w:start w:val="1"/>
-      <w:numFmt w:val="lowerRoman"/>
-      <w:lvlText w:val="%9."/>
-      <w:lvlJc w:val="right"/>
-      <w:pPr>
-        <w:ind w:hanging="180" w:left="6840"/>
-      </w:pPr>
-    </w:lvl>
-  </w:abstractNum>
-  <w:abstractNum w15:restartNumberingAfterBreak="0" w:abstractNumId="11">
-    <w:nsid w:val="69C575B6"/>
-    <w:multiLevelType w:val="hybridMultilevel"/>
-    <w:tmpl w:val="E1A29E1A"/>
-    <w:lvl w:ilvl="0" w:tplc="0409000F">
-      <w:start w:val="3"/>
-      <w:numFmt w:val="decimal"/>
-      <w:lvlText w:val="%1."/>
-      <w:lvlJc w:val="left"/>
-      <w:pPr>
-        <w:ind w:hanging="360" w:left="720"/>
-      </w:pPr>
-      <w:rPr>
-        <w:rFonts w:hint="default"/>
-      </w:rPr>
-    </w:lvl>
-    <w:lvl w:ilvl="1" w:tplc="04090019">
-      <w:start w:val="1"/>
-      <w:numFmt w:val="lowerLetter"/>
-      <w:lvlText w:val="%2."/>
-      <w:lvlJc w:val="left"/>
-      <w:pPr>
-        <w:ind w:hanging="360" w:left="1070"/>
-      </w:pPr>
-    </w:lvl>
-    <w:lvl w:ilvl="2" w:tentative="1" w:tplc="0409001B">
-      <w:start w:val="1"/>
-      <w:numFmt w:val="lowerRoman"/>
-      <w:lvlText w:val="%3."/>
-      <w:lvlJc w:val="right"/>
-      <w:pPr>
-        <w:ind w:hanging="180" w:left="2160"/>
-      </w:pPr>
-    </w:lvl>
-    <w:lvl w:ilvl="3" w:tentative="1" w:tplc="0409000F">
-      <w:start w:val="1"/>
-      <w:numFmt w:val="decimal"/>
-      <w:lvlText w:val="%4."/>
-      <w:lvlJc w:val="left"/>
-      <w:pPr>
-        <w:ind w:hanging="360" w:left="2880"/>
-      </w:pPr>
-    </w:lvl>
-    <w:lvl w:ilvl="4" w:tentative="1" w:tplc="04090019">
-      <w:start w:val="1"/>
-      <w:numFmt w:val="lowerLetter"/>
-      <w:lvlText w:val="%5."/>
-      <w:lvlJc w:val="left"/>
-      <w:pPr>
-        <w:ind w:hanging="360" w:left="3600"/>
-      </w:pPr>
-    </w:lvl>
-    <w:lvl w:ilvl="5" w:tentative="1" w:tplc="0409001B">
-      <w:start w:val="1"/>
-      <w:numFmt w:val="lowerRoman"/>
-      <w:lvlText w:val="%6."/>
-      <w:lvlJc w:val="right"/>
-      <w:pPr>
-        <w:ind w:hanging="180" w:left="4320"/>
-      </w:pPr>
-    </w:lvl>
-    <w:lvl w:ilvl="6" w:tentative="1" w:tplc="0409000F">
-      <w:start w:val="1"/>
-      <w:numFmt w:val="decimal"/>
-      <w:lvlText w:val="%7."/>
-      <w:lvlJc w:val="left"/>
-      <w:pPr>
-        <w:ind w:hanging="360" w:left="5040"/>
-      </w:pPr>
-    </w:lvl>
-    <w:lvl w:ilvl="7" w:tentative="1" w:tplc="04090019">
-      <w:start w:val="1"/>
-      <w:numFmt w:val="lowerLetter"/>
-      <w:lvlText w:val="%8."/>
-      <w:lvlJc w:val="left"/>
-      <w:pPr>
-        <w:ind w:hanging="360" w:left="5760"/>
-      </w:pPr>
-    </w:lvl>
-    <w:lvl w:ilvl="8" w:tentative="1" w:tplc="0409001B">
-      <w:start w:val="1"/>
-      <w:numFmt w:val="lowerRoman"/>
-      <w:lvlText w:val="%9."/>
-      <w:lvlJc w:val="right"/>
-      <w:pPr>
-        <w:ind w:hanging="180" w:left="6480"/>
-      </w:pPr>
-    </w:lvl>
-  </w:abstractNum>
-  <w:abstractNum w15:restartNumberingAfterBreak="0" w:abstractNumId="12">
-    <w:nsid w:val="74E1364F"/>
-    <w:multiLevelType w:val="multilevel"/>
-    <w:tmpl w:val="75607B84"/>
-    <w:lvl w:ilvl="0">
-      <w:start w:val="3"/>
-      <w:numFmt w:val="decimal"/>
-      <w:lvlText w:val="%1"/>
-      <w:lvlJc w:val="left"/>
-      <w:pPr>
-        <w:ind w:hanging="360" w:left="360"/>
-      </w:pPr>
-      <w:rPr>
-        <w:rFonts w:hint="default"/>
-      </w:rPr>
-    </w:lvl>
-    <w:lvl w:ilvl="1">
-      <w:start w:val="1"/>
-      <w:numFmt w:val="decimal"/>
-      <w:lvlText w:val="%1.%2"/>
-      <w:lvlJc w:val="left"/>
-      <w:pPr>
-        <w:ind w:hanging="720" w:left="720"/>
-      </w:pPr>
-      <w:rPr>
-        <w:rFonts w:hint="default"/>
-      </w:rPr>
-    </w:lvl>
-    <w:lvl w:ilvl="2">
-      <w:start w:val="1"/>
-      <w:numFmt w:val="decimal"/>
-      <w:lvlText w:val="%1.%2.%3"/>
-      <w:lvlJc w:val="left"/>
-      <w:pPr>
-        <w:ind w:hanging="720" w:left="720"/>
-      </w:pPr>
-      <w:rPr>
-        <w:rFonts w:hint="default"/>
-      </w:rPr>
-    </w:lvl>
-    <w:lvl w:ilvl="3">
-      <w:start w:val="1"/>
-      <w:numFmt w:val="decimal"/>
-      <w:lvlText w:val="%1.%2.%3.%4"/>
-      <w:lvlJc w:val="left"/>
-      <w:pPr>
-        <w:ind w:hanging="1080" w:left="1080"/>
-      </w:pPr>
-      <w:rPr>
-        <w:rFonts w:hint="default"/>
-      </w:rPr>
-    </w:lvl>
-    <w:lvl w:ilvl="4">
-      <w:start w:val="1"/>
-      <w:numFmt w:val="decimal"/>
-      <w:lvlText w:val="%1.%2.%3.%4.%5"/>
-      <w:lvlJc w:val="left"/>
-      <w:pPr>
-        <w:ind w:hanging="1440" w:left="1440"/>
-      </w:pPr>
-      <w:rPr>
-        <w:rFonts w:hint="default"/>
-      </w:rPr>
-    </w:lvl>
-    <w:lvl w:ilvl="5">
-      <w:start w:val="1"/>
-      <w:numFmt w:val="decimal"/>
-      <w:lvlText w:val="%1.%2.%3.%4.%5.%6"/>
-      <w:lvlJc w:val="left"/>
-      <w:pPr>
-        <w:ind w:hanging="1440" w:left="1440"/>
-      </w:pPr>
-      <w:rPr>
-        <w:rFonts w:hint="default"/>
-      </w:rPr>
-    </w:lvl>
-    <w:lvl w:ilvl="6">
-      <w:start w:val="1"/>
-      <w:numFmt w:val="decimal"/>
-      <w:lvlText w:val="%1.%2.%3.%4.%5.%6.%7"/>
-      <w:lvlJc w:val="left"/>
-      <w:pPr>
-        <w:ind w:hanging="1800" w:left="1800"/>
-      </w:pPr>
-      <w:rPr>
-        <w:rFonts w:hint="default"/>
-      </w:rPr>
-    </w:lvl>
-    <w:lvl w:ilvl="7">
-      <w:start w:val="1"/>
-      <w:numFmt w:val="decimal"/>
-      <w:lvlText w:val="%1.%2.%3.%4.%5.%6.%7.%8"/>
-      <w:lvlJc w:val="left"/>
-      <w:pPr>
-        <w:ind w:hanging="2160" w:left="2160"/>
-      </w:pPr>
-      <w:rPr>
-        <w:rFonts w:hint="default"/>
-      </w:rPr>
-    </w:lvl>
-    <w:lvl w:ilvl="8">
-      <w:start w:val="1"/>
-      <w:numFmt w:val="decimal"/>
-      <w:lvlText w:val="%1.%2.%3.%4.%5.%6.%7.%8.%9"/>
-      <w:lvlJc w:val="left"/>
-      <w:pPr>
-        <w:ind w:hanging="2160" w:left="2160"/>
-      </w:pPr>
-      <w:rPr>
-        <w:rFonts w:hint="default"/>
-      </w:rPr>
-    </w:lvl>
-  </w:abstractNum>
+<w:numbering xmlns:w="http://schemas.openxmlformats.org/wordprocessingml/2006/main">
   <w:abstractNum w:abstractNumId="990">
     <w:nsid w:val="0000A990"/>
     <w:multiLevelType w:val="multilevel"/>
@@ -4761,45 +3421,6 @@
       </w:pPr>
     </w:lvl>
   </w:abstractNum>
-  <w:num w16cid:durableId="396905614" w:numId="1">
-    <w:abstractNumId w:val="5"/>
-  </w:num>
-  <w:num w16cid:durableId="850878396" w:numId="2">
-    <w:abstractNumId w:val="6"/>
-  </w:num>
-  <w:num w16cid:durableId="1384525106" w:numId="3">
-    <w:abstractNumId w:val="10"/>
-  </w:num>
-  <w:num w16cid:durableId="1855612367" w:numId="4">
-    <w:abstractNumId w:val="8"/>
-  </w:num>
-  <w:num w16cid:durableId="1550679377" w:numId="5">
-    <w:abstractNumId w:val="1"/>
-  </w:num>
-  <w:num w16cid:durableId="1741292464" w:numId="6">
-    <w:abstractNumId w:val="3"/>
-  </w:num>
-  <w:num w16cid:durableId="1753505878" w:numId="7">
-    <w:abstractNumId w:val="12"/>
-  </w:num>
-  <w:num w16cid:durableId="237598308" w:numId="8">
-    <w:abstractNumId w:val="9"/>
-  </w:num>
-  <w:num w16cid:durableId="1265385061" w:numId="9">
-    <w:abstractNumId w:val="11"/>
-  </w:num>
-  <w:num w16cid:durableId="1860123542" w:numId="10">
-    <w:abstractNumId w:val="4"/>
-  </w:num>
-  <w:num w16cid:durableId="2088645435" w:numId="11">
-    <w:abstractNumId w:val="7"/>
-  </w:num>
-  <w:num w16cid:durableId="904797294" w:numId="12">
-    <w:abstractNumId w:val="2"/>
-  </w:num>
-  <w:num w16cid:durableId="1384599588" w:numId="13">
-    <w:abstractNumId w:val="0"/>
-  </w:num>
   <w:num w:numId="1000">
     <w:abstractNumId w:val="990"/>
   </w:num>
@@ -4849,476 +3470,544 @@
 </file>
 
 <file path=word/styles.xml><?xml version="1.0" encoding="utf-8"?>
-<w:styles xmlns:mc="http://schemas.openxmlformats.org/markup-compatibility/2006" xmlns:r="http://schemas.openxmlformats.org/officeDocument/2006/relationships" xmlns:w="http://schemas.openxmlformats.org/wordprocessingml/2006/main" xmlns:w14="http://schemas.microsoft.com/office/word/2010/wordml" xmlns:w15="http://schemas.microsoft.com/office/word/2012/wordml" xmlns:w16="http://schemas.microsoft.com/office/word/2018/wordml" xmlns:w16cex="http://schemas.microsoft.com/office/word/2018/wordml/cex" xmlns:w16cid="http://schemas.microsoft.com/office/word/2016/wordml/cid" xmlns:w16du="http://schemas.microsoft.com/office/word/2023/wordml/word16du" xmlns:w16sdtdh="http://schemas.microsoft.com/office/word/2020/wordml/sdtdatahash" xmlns:w16sdtfl="http://schemas.microsoft.com/office/word/2024/wordml/sdtformatlock" xmlns:w16se="http://schemas.microsoft.com/office/word/2015/wordml/symex" mc:Ignorable="w14 w15 w16se w16cid w16 w16cex w16sdtdh w16sdtfl w16du">
+<w:styles xmlns:r="http://schemas.openxmlformats.org/officeDocument/2006/relationships" xmlns:w="http://schemas.openxmlformats.org/wordprocessingml/2006/main">
   <w:docDefaults>
     <w:rPrDefault>
       <w:rPr>
-        <w:rFonts w:asciiTheme="minorHAnsi" w:cstheme="minorBidi" w:eastAsiaTheme="minorHAnsi" w:hAnsiTheme="minorHAnsi"/>
+        <w:rFonts w:asciiTheme="minorHAnsi" w:cstheme="minorBidi" w:eastAsiaTheme="minorEastAsia" w:hAnsiTheme="minorHAnsi"/>
         <w:sz w:val="24"/>
         <w:szCs w:val="24"/>
-        <w:lang w:bidi="ar-SA" w:eastAsia="en-US" w:val="en-GB"/>
+        <w:lang w:bidi="ar-SA" w:eastAsia="zh-CN" w:val="en-US"/>
       </w:rPr>
     </w:rPrDefault>
-    <w:pPrDefault/>
+    <w:pPrDefault>
+      <w:pPr>
+        <w:spacing w:after="200"/>
+      </w:pPr>
+    </w:pPrDefault>
   </w:docDefaults>
-  <w:latentStyles w:count="376" w:defLockedState="0" w:defQFormat="0" w:defSemiHidden="0" w:defUIPriority="99" w:defUnhideWhenUsed="0">
-    <w:lsdException w:name="Normal" w:qFormat="1" w:uiPriority="0"/>
-    <w:lsdException w:name="heading 1" w:qFormat="1" w:uiPriority="9"/>
-    <w:lsdException w:name="heading 2" w:qFormat="1" w:semiHidden="1" w:uiPriority="9" w:unhideWhenUsed="1"/>
-    <w:lsdException w:name="heading 3" w:qFormat="1" w:semiHidden="1" w:uiPriority="9" w:unhideWhenUsed="1"/>
-    <w:lsdException w:name="heading 4" w:qFormat="1" w:semiHidden="1" w:uiPriority="9" w:unhideWhenUsed="1"/>
-    <w:lsdException w:name="heading 5" w:qFormat="1" w:semiHidden="1" w:uiPriority="9" w:unhideWhenUsed="1"/>
-    <w:lsdException w:name="heading 6" w:qFormat="1" w:semiHidden="1" w:uiPriority="9" w:unhideWhenUsed="1"/>
-    <w:lsdException w:name="heading 7" w:qFormat="1" w:semiHidden="1" w:uiPriority="9" w:unhideWhenUsed="1"/>
-    <w:lsdException w:name="heading 8" w:qFormat="1" w:semiHidden="1" w:uiPriority="9" w:unhideWhenUsed="1"/>
-    <w:lsdException w:name="heading 9" w:qFormat="1" w:semiHidden="1" w:uiPriority="9" w:unhideWhenUsed="1"/>
-    <w:lsdException w:name="index 1" w:semiHidden="1" w:unhideWhenUsed="1"/>
-    <w:lsdException w:name="index 2" w:semiHidden="1" w:unhideWhenUsed="1"/>
-    <w:lsdException w:name="index 3" w:semiHidden="1" w:unhideWhenUsed="1"/>
-    <w:lsdException w:name="index 4" w:semiHidden="1" w:unhideWhenUsed="1"/>
-    <w:lsdException w:name="index 5" w:semiHidden="1" w:unhideWhenUsed="1"/>
-    <w:lsdException w:name="index 6" w:semiHidden="1" w:unhideWhenUsed="1"/>
-    <w:lsdException w:name="index 7" w:semiHidden="1" w:unhideWhenUsed="1"/>
-    <w:lsdException w:name="index 8" w:semiHidden="1" w:unhideWhenUsed="1"/>
-    <w:lsdException w:name="index 9" w:semiHidden="1" w:unhideWhenUsed="1"/>
-    <w:lsdException w:name="toc 1" w:semiHidden="1" w:uiPriority="39" w:unhideWhenUsed="1"/>
-    <w:lsdException w:name="toc 2" w:semiHidden="1" w:uiPriority="39" w:unhideWhenUsed="1"/>
-    <w:lsdException w:name="toc 3" w:semiHidden="1" w:uiPriority="39" w:unhideWhenUsed="1"/>
-    <w:lsdException w:name="toc 4" w:semiHidden="1" w:uiPriority="39" w:unhideWhenUsed="1"/>
-    <w:lsdException w:name="toc 5" w:semiHidden="1" w:uiPriority="39" w:unhideWhenUsed="1"/>
-    <w:lsdException w:name="toc 6" w:semiHidden="1" w:uiPriority="39" w:unhideWhenUsed="1"/>
-    <w:lsdException w:name="toc 7" w:semiHidden="1" w:uiPriority="39" w:unhideWhenUsed="1"/>
-    <w:lsdException w:name="toc 8" w:semiHidden="1" w:uiPriority="39" w:unhideWhenUsed="1"/>
-    <w:lsdException w:name="toc 9" w:semiHidden="1" w:uiPriority="39" w:unhideWhenUsed="1"/>
-    <w:lsdException w:name="Normal Indent" w:semiHidden="1" w:unhideWhenUsed="1"/>
-    <w:lsdException w:name="footnote text" w:semiHidden="1" w:unhideWhenUsed="1"/>
-    <w:lsdException w:name="annotation text" w:semiHidden="1" w:unhideWhenUsed="1"/>
-    <w:lsdException w:name="header" w:semiHidden="1" w:unhideWhenUsed="1"/>
-    <w:lsdException w:name="footer" w:semiHidden="1" w:unhideWhenUsed="1"/>
-    <w:lsdException w:name="index heading" w:semiHidden="1" w:unhideWhenUsed="1"/>
-    <w:lsdException w:name="caption" w:qFormat="1" w:semiHidden="1" w:uiPriority="35" w:unhideWhenUsed="1"/>
-    <w:lsdException w:name="table of figures" w:semiHidden="1" w:unhideWhenUsed="1"/>
-    <w:lsdException w:name="envelope address" w:semiHidden="1" w:unhideWhenUsed="1"/>
-    <w:lsdException w:name="envelope return" w:semiHidden="1" w:unhideWhenUsed="1"/>
-    <w:lsdException w:name="footnote reference" w:semiHidden="1" w:unhideWhenUsed="1"/>
-    <w:lsdException w:name="annotation reference" w:semiHidden="1" w:unhideWhenUsed="1"/>
-    <w:lsdException w:name="line number" w:semiHidden="1" w:unhideWhenUsed="1"/>
-    <w:lsdException w:name="page number" w:semiHidden="1" w:unhideWhenUsed="1"/>
-    <w:lsdException w:name="endnote reference" w:semiHidden="1" w:unhideWhenUsed="1"/>
-    <w:lsdException w:name="endnote text" w:semiHidden="1" w:unhideWhenUsed="1"/>
-    <w:lsdException w:name="table of authorities" w:semiHidden="1" w:unhideWhenUsed="1"/>
-    <w:lsdException w:name="macro" w:semiHidden="1" w:unhideWhenUsed="1"/>
-    <w:lsdException w:name="toa heading" w:semiHidden="1" w:unhideWhenUsed="1"/>
-    <w:lsdException w:name="List" w:semiHidden="1" w:unhideWhenUsed="1"/>
-    <w:lsdException w:name="List Bullet" w:semiHidden="1" w:unhideWhenUsed="1"/>
-    <w:lsdException w:name="List Number" w:semiHidden="1" w:unhideWhenUsed="1"/>
-    <w:lsdException w:name="List 2" w:semiHidden="1" w:unhideWhenUsed="1"/>
-    <w:lsdException w:name="List 3" w:semiHidden="1" w:unhideWhenUsed="1"/>
-    <w:lsdException w:name="List 4" w:semiHidden="1" w:unhideWhenUsed="1"/>
-    <w:lsdException w:name="List 5" w:semiHidden="1" w:unhideWhenUsed="1"/>
-    <w:lsdException w:name="List Bullet 2" w:semiHidden="1" w:unhideWhenUsed="1"/>
-    <w:lsdException w:name="List Bullet 3" w:semiHidden="1" w:unhideWhenUsed="1"/>
-    <w:lsdException w:name="List Bullet 4" w:semiHidden="1" w:unhideWhenUsed="1"/>
-    <w:lsdException w:name="List Bullet 5" w:semiHidden="1" w:unhideWhenUsed="1"/>
-    <w:lsdException w:name="List Number 2" w:semiHidden="1" w:unhideWhenUsed="1"/>
-    <w:lsdException w:name="List Number 3" w:semiHidden="1" w:unhideWhenUsed="1"/>
-    <w:lsdException w:name="List Number 4" w:semiHidden="1" w:unhideWhenUsed="1"/>
-    <w:lsdException w:name="List Number 5" w:semiHidden="1" w:unhideWhenUsed="1"/>
-    <w:lsdException w:name="Title" w:qFormat="1" w:uiPriority="10"/>
-    <w:lsdException w:name="Closing" w:semiHidden="1" w:unhideWhenUsed="1"/>
-    <w:lsdException w:name="Signature" w:semiHidden="1" w:unhideWhenUsed="1"/>
-    <w:lsdException w:name="Default Paragraph Font" w:semiHidden="1" w:uiPriority="1" w:unhideWhenUsed="1"/>
-    <w:lsdException w:name="Body Text" w:semiHidden="1" w:unhideWhenUsed="1"/>
-    <w:lsdException w:name="Body Text Indent" w:semiHidden="1" w:unhideWhenUsed="1"/>
-    <w:lsdException w:name="List Continue" w:semiHidden="1" w:unhideWhenUsed="1"/>
-    <w:lsdException w:name="List Continue 2" w:semiHidden="1" w:unhideWhenUsed="1"/>
-    <w:lsdException w:name="List Continue 3" w:semiHidden="1" w:unhideWhenUsed="1"/>
-    <w:lsdException w:name="List Continue 4" w:semiHidden="1" w:unhideWhenUsed="1"/>
-    <w:lsdException w:name="List Continue 5" w:semiHidden="1" w:unhideWhenUsed="1"/>
-    <w:lsdException w:name="Message Header" w:semiHidden="1" w:unhideWhenUsed="1"/>
-    <w:lsdException w:name="Subtitle" w:qFormat="1" w:uiPriority="11"/>
-    <w:lsdException w:name="Salutation" w:semiHidden="1" w:unhideWhenUsed="1"/>
-    <w:lsdException w:name="Date" w:semiHidden="1" w:unhideWhenUsed="1"/>
-    <w:lsdException w:name="Body Text First Indent" w:semiHidden="1" w:unhideWhenUsed="1"/>
-    <w:lsdException w:name="Body Text First Indent 2" w:semiHidden="1" w:unhideWhenUsed="1"/>
-    <w:lsdException w:name="Note Heading" w:semiHidden="1" w:unhideWhenUsed="1"/>
-    <w:lsdException w:name="Body Text 2" w:semiHidden="1" w:unhideWhenUsed="1"/>
-    <w:lsdException w:name="Body Text 3" w:semiHidden="1" w:unhideWhenUsed="1"/>
-    <w:lsdException w:name="Body Text Indent 2" w:semiHidden="1" w:unhideWhenUsed="1"/>
-    <w:lsdException w:name="Body Text Indent 3" w:semiHidden="1" w:unhideWhenUsed="1"/>
-    <w:lsdException w:name="Block Text" w:semiHidden="1" w:unhideWhenUsed="1"/>
-    <w:lsdException w:name="Hyperlink" w:semiHidden="1" w:unhideWhenUsed="1"/>
-    <w:lsdException w:name="FollowedHyperlink" w:semiHidden="1" w:unhideWhenUsed="1"/>
-    <w:lsdException w:name="Strong" w:qFormat="1" w:uiPriority="22"/>
-    <w:lsdException w:name="Emphasis" w:qFormat="1" w:uiPriority="20"/>
-    <w:lsdException w:name="Document Map" w:semiHidden="1" w:unhideWhenUsed="1"/>
-    <w:lsdException w:name="Plain Text" w:semiHidden="1" w:unhideWhenUsed="1"/>
-    <w:lsdException w:name="E-mail Signature" w:semiHidden="1" w:unhideWhenUsed="1"/>
-    <w:lsdException w:name="HTML Top of Form" w:semiHidden="1" w:unhideWhenUsed="1"/>
-    <w:lsdException w:name="HTML Bottom of Form" w:semiHidden="1" w:unhideWhenUsed="1"/>
-    <w:lsdException w:name="Normal (Web)" w:semiHidden="1" w:unhideWhenUsed="1"/>
-    <w:lsdException w:name="HTML Acronym" w:semiHidden="1" w:unhideWhenUsed="1"/>
-    <w:lsdException w:name="HTML Address" w:semiHidden="1" w:unhideWhenUsed="1"/>
-    <w:lsdException w:name="HTML Cite" w:semiHidden="1" w:unhideWhenUsed="1"/>
-    <w:lsdException w:name="HTML Code" w:semiHidden="1" w:unhideWhenUsed="1"/>
-    <w:lsdException w:name="HTML Definition" w:semiHidden="1" w:unhideWhenUsed="1"/>
-    <w:lsdException w:name="HTML Keyboard" w:semiHidden="1" w:unhideWhenUsed="1"/>
-    <w:lsdException w:name="HTML Preformatted" w:semiHidden="1" w:unhideWhenUsed="1"/>
-    <w:lsdException w:name="HTML Sample" w:semiHidden="1" w:unhideWhenUsed="1"/>
-    <w:lsdException w:name="HTML Typewriter" w:semiHidden="1" w:unhideWhenUsed="1"/>
-    <w:lsdException w:name="HTML Variable" w:semiHidden="1" w:unhideWhenUsed="1"/>
-    <w:lsdException w:name="Normal Table" w:semiHidden="1" w:unhideWhenUsed="1"/>
-    <w:lsdException w:name="annotation subject" w:semiHidden="1" w:unhideWhenUsed="1"/>
-    <w:lsdException w:name="No List" w:semiHidden="1" w:unhideWhenUsed="1"/>
-    <w:lsdException w:name="Outline List 1" w:semiHidden="1" w:unhideWhenUsed="1"/>
-    <w:lsdException w:name="Outline List 2" w:semiHidden="1" w:unhideWhenUsed="1"/>
-    <w:lsdException w:name="Outline List 3" w:semiHidden="1" w:unhideWhenUsed="1"/>
-    <w:lsdException w:name="Table Simple 1" w:semiHidden="1" w:unhideWhenUsed="1"/>
-    <w:lsdException w:name="Table Simple 2" w:semiHidden="1" w:unhideWhenUsed="1"/>
-    <w:lsdException w:name="Table Simple 3" w:semiHidden="1" w:unhideWhenUsed="1"/>
-    <w:lsdException w:name="Table Classic 1" w:semiHidden="1" w:unhideWhenUsed="1"/>
-    <w:lsdException w:name="Table Classic 2" w:semiHidden="1" w:unhideWhenUsed="1"/>
-    <w:lsdException w:name="Table Classic 3" w:semiHidden="1" w:unhideWhenUsed="1"/>
-    <w:lsdException w:name="Table Classic 4" w:semiHidden="1" w:unhideWhenUsed="1"/>
-    <w:lsdException w:name="Table Colorful 1" w:semiHidden="1" w:unhideWhenUsed="1"/>
-    <w:lsdException w:name="Table Colorful 2" w:semiHidden="1" w:unhideWhenUsed="1"/>
-    <w:lsdException w:name="Table Colorful 3" w:semiHidden="1" w:unhideWhenUsed="1"/>
-    <w:lsdException w:name="Table Columns 1" w:semiHidden="1" w:unhideWhenUsed="1"/>
-    <w:lsdException w:name="Table Columns 2" w:semiHidden="1" w:unhideWhenUsed="1"/>
-    <w:lsdException w:name="Table Columns 3" w:semiHidden="1" w:unhideWhenUsed="1"/>
-    <w:lsdException w:name="Table Columns 4" w:semiHidden="1" w:unhideWhenUsed="1"/>
-    <w:lsdException w:name="Table Columns 5" w:semiHidden="1" w:unhideWhenUsed="1"/>
-    <w:lsdException w:name="Table Grid 1" w:semiHidden="1" w:unhideWhenUsed="1"/>
-    <w:lsdException w:name="Table Grid 2" w:semiHidden="1" w:unhideWhenUsed="1"/>
-    <w:lsdException w:name="Table Grid 3" w:semiHidden="1" w:unhideWhenUsed="1"/>
-    <w:lsdException w:name="Table Grid 4" w:semiHidden="1" w:unhideWhenUsed="1"/>
-    <w:lsdException w:name="Table Grid 5" w:semiHidden="1" w:unhideWhenUsed="1"/>
-    <w:lsdException w:name="Table Grid 6" w:semiHidden="1" w:unhideWhenUsed="1"/>
-    <w:lsdException w:name="Table Grid 7" w:semiHidden="1" w:unhideWhenUsed="1"/>
-    <w:lsdException w:name="Table Grid 8" w:semiHidden="1" w:unhideWhenUsed="1"/>
-    <w:lsdException w:name="Table List 1" w:semiHidden="1" w:unhideWhenUsed="1"/>
-    <w:lsdException w:name="Table List 2" w:semiHidden="1" w:unhideWhenUsed="1"/>
-    <w:lsdException w:name="Table List 3" w:semiHidden="1" w:unhideWhenUsed="1"/>
-    <w:lsdException w:name="Table List 4" w:semiHidden="1" w:unhideWhenUsed="1"/>
-    <w:lsdException w:name="Table List 5" w:semiHidden="1" w:unhideWhenUsed="1"/>
-    <w:lsdException w:name="Table List 6" w:semiHidden="1" w:unhideWhenUsed="1"/>
-    <w:lsdException w:name="Table List 7" w:semiHidden="1" w:unhideWhenUsed="1"/>
-    <w:lsdException w:name="Table List 8" w:semiHidden="1" w:unhideWhenUsed="1"/>
-    <w:lsdException w:name="Table 3D effects 1" w:semiHidden="1" w:unhideWhenUsed="1"/>
-    <w:lsdException w:name="Table 3D effects 2" w:semiHidden="1" w:unhideWhenUsed="1"/>
-    <w:lsdException w:name="Table 3D effects 3" w:semiHidden="1" w:unhideWhenUsed="1"/>
-    <w:lsdException w:name="Table Contemporary" w:semiHidden="1" w:unhideWhenUsed="1"/>
-    <w:lsdException w:name="Table Elegant" w:semiHidden="1" w:unhideWhenUsed="1"/>
-    <w:lsdException w:name="Table Professional" w:semiHidden="1" w:unhideWhenUsed="1"/>
-    <w:lsdException w:name="Table Subtle 1" w:semiHidden="1" w:unhideWhenUsed="1"/>
-    <w:lsdException w:name="Table Subtle 2" w:semiHidden="1" w:unhideWhenUsed="1"/>
-    <w:lsdException w:name="Table Web 1" w:semiHidden="1" w:unhideWhenUsed="1"/>
-    <w:lsdException w:name="Table Web 2" w:semiHidden="1" w:unhideWhenUsed="1"/>
-    <w:lsdException w:name="Table Web 3" w:semiHidden="1" w:unhideWhenUsed="1"/>
-    <w:lsdException w:name="Balloon Text" w:semiHidden="1" w:unhideWhenUsed="1"/>
-    <w:lsdException w:name="Table Grid" w:uiPriority="39"/>
-    <w:lsdException w:name="Table Theme" w:semiHidden="1" w:unhideWhenUsed="1"/>
-    <w:lsdException w:name="Placeholder Text" w:semiHidden="1"/>
-    <w:lsdException w:name="No Spacing" w:qFormat="1" w:uiPriority="1"/>
-    <w:lsdException w:name="Light Shading" w:uiPriority="60"/>
-    <w:lsdException w:name="Light List" w:uiPriority="61"/>
-    <w:lsdException w:name="Light Grid" w:uiPriority="62"/>
-    <w:lsdException w:name="Medium Shading 1" w:uiPriority="63"/>
-    <w:lsdException w:name="Medium Shading 2" w:uiPriority="64"/>
-    <w:lsdException w:name="Medium List 1" w:uiPriority="65"/>
-    <w:lsdException w:name="Medium List 2" w:uiPriority="66"/>
-    <w:lsdException w:name="Medium Grid 1" w:uiPriority="67"/>
-    <w:lsdException w:name="Medium Grid 2" w:uiPriority="68"/>
-    <w:lsdException w:name="Medium Grid 3" w:uiPriority="69"/>
-    <w:lsdException w:name="Dark List" w:uiPriority="70"/>
-    <w:lsdException w:name="Colorful Shading" w:uiPriority="71"/>
-    <w:lsdException w:name="Colorful List" w:uiPriority="72"/>
-    <w:lsdException w:name="Colorful Grid" w:uiPriority="73"/>
-    <w:lsdException w:name="Light Shading Accent 1" w:uiPriority="60"/>
-    <w:lsdException w:name="Light List Accent 1" w:uiPriority="61"/>
-    <w:lsdException w:name="Light Grid Accent 1" w:uiPriority="62"/>
-    <w:lsdException w:name="Medium Shading 1 Accent 1" w:uiPriority="63"/>
-    <w:lsdException w:name="Medium Shading 2 Accent 1" w:uiPriority="64"/>
-    <w:lsdException w:name="Medium List 1 Accent 1" w:uiPriority="65"/>
-    <w:lsdException w:name="Revision" w:semiHidden="1"/>
-    <w:lsdException w:name="List Paragraph" w:qFormat="1" w:uiPriority="34"/>
-    <w:lsdException w:name="Quote" w:qFormat="1" w:uiPriority="29"/>
-    <w:lsdException w:name="Intense Quote" w:qFormat="1" w:uiPriority="30"/>
-    <w:lsdException w:name="Medium List 2 Accent 1" w:uiPriority="66"/>
-    <w:lsdException w:name="Medium Grid 1 Accent 1" w:uiPriority="67"/>
-    <w:lsdException w:name="Medium Grid 2 Accent 1" w:uiPriority="68"/>
-    <w:lsdException w:name="Medium Grid 3 Accent 1" w:uiPriority="69"/>
-    <w:lsdException w:name="Dark List Accent 1" w:uiPriority="70"/>
-    <w:lsdException w:name="Colorful Shading Accent 1" w:uiPriority="71"/>
-    <w:lsdException w:name="Colorful List Accent 1" w:uiPriority="72"/>
-    <w:lsdException w:name="Colorful Grid Accent 1" w:uiPriority="73"/>
-    <w:lsdException w:name="Light Shading Accent 2" w:uiPriority="60"/>
-    <w:lsdException w:name="Light List Accent 2" w:uiPriority="61"/>
-    <w:lsdException w:name="Light Grid Accent 2" w:uiPriority="62"/>
-    <w:lsdException w:name="Medium Shading 1 Accent 2" w:uiPriority="63"/>
-    <w:lsdException w:name="Medium Shading 2 Accent 2" w:uiPriority="64"/>
-    <w:lsdException w:name="Medium List 1 Accent 2" w:uiPriority="65"/>
-    <w:lsdException w:name="Medium List 2 Accent 2" w:uiPriority="66"/>
-    <w:lsdException w:name="Medium Grid 1 Accent 2" w:uiPriority="67"/>
-    <w:lsdException w:name="Medium Grid 2 Accent 2" w:uiPriority="68"/>
-    <w:lsdException w:name="Medium Grid 3 Accent 2" w:uiPriority="69"/>
-    <w:lsdException w:name="Dark List Accent 2" w:uiPriority="70"/>
-    <w:lsdException w:name="Colorful Shading Accent 2" w:uiPriority="71"/>
-    <w:lsdException w:name="Colorful List Accent 2" w:uiPriority="72"/>
-    <w:lsdException w:name="Colorful Grid Accent 2" w:uiPriority="73"/>
-    <w:lsdException w:name="Light Shading Accent 3" w:uiPriority="60"/>
-    <w:lsdException w:name="Light List Accent 3" w:uiPriority="61"/>
-    <w:lsdException w:name="Light Grid Accent 3" w:uiPriority="62"/>
-    <w:lsdException w:name="Medium Shading 1 Accent 3" w:uiPriority="63"/>
-    <w:lsdException w:name="Medium Shading 2 Accent 3" w:uiPriority="64"/>
-    <w:lsdException w:name="Medium List 1 Accent 3" w:uiPriority="65"/>
-    <w:lsdException w:name="Medium List 2 Accent 3" w:uiPriority="66"/>
-    <w:lsdException w:name="Medium Grid 1 Accent 3" w:uiPriority="67"/>
-    <w:lsdException w:name="Medium Grid 2 Accent 3" w:uiPriority="68"/>
-    <w:lsdException w:name="Medium Grid 3 Accent 3" w:uiPriority="69"/>
-    <w:lsdException w:name="Dark List Accent 3" w:uiPriority="70"/>
-    <w:lsdException w:name="Colorful Shading Accent 3" w:uiPriority="71"/>
-    <w:lsdException w:name="Colorful List Accent 3" w:uiPriority="72"/>
-    <w:lsdException w:name="Colorful Grid Accent 3" w:uiPriority="73"/>
-    <w:lsdException w:name="Light Shading Accent 4" w:uiPriority="60"/>
-    <w:lsdException w:name="Light List Accent 4" w:uiPriority="61"/>
-    <w:lsdException w:name="Light Grid Accent 4" w:uiPriority="62"/>
-    <w:lsdException w:name="Medium Shading 1 Accent 4" w:uiPriority="63"/>
-    <w:lsdException w:name="Medium Shading 2 Accent 4" w:uiPriority="64"/>
-    <w:lsdException w:name="Medium List 1 Accent 4" w:uiPriority="65"/>
-    <w:lsdException w:name="Medium List 2 Accent 4" w:uiPriority="66"/>
-    <w:lsdException w:name="Medium Grid 1 Accent 4" w:uiPriority="67"/>
-    <w:lsdException w:name="Medium Grid 2 Accent 4" w:uiPriority="68"/>
-    <w:lsdException w:name="Medium Grid 3 Accent 4" w:uiPriority="69"/>
-    <w:lsdException w:name="Dark List Accent 4" w:uiPriority="70"/>
-    <w:lsdException w:name="Colorful Shading Accent 4" w:uiPriority="71"/>
-    <w:lsdException w:name="Colorful List Accent 4" w:uiPriority="72"/>
-    <w:lsdException w:name="Colorful Grid Accent 4" w:uiPriority="73"/>
-    <w:lsdException w:name="Light Shading Accent 5" w:uiPriority="60"/>
-    <w:lsdException w:name="Light List Accent 5" w:uiPriority="61"/>
-    <w:lsdException w:name="Light Grid Accent 5" w:uiPriority="62"/>
-    <w:lsdException w:name="Medium Shading 1 Accent 5" w:uiPriority="63"/>
-    <w:lsdException w:name="Medium Shading 2 Accent 5" w:uiPriority="64"/>
-    <w:lsdException w:name="Medium List 1 Accent 5" w:uiPriority="65"/>
-    <w:lsdException w:name="Medium List 2 Accent 5" w:uiPriority="66"/>
-    <w:lsdException w:name="Medium Grid 1 Accent 5" w:uiPriority="67"/>
-    <w:lsdException w:name="Medium Grid 2 Accent 5" w:uiPriority="68"/>
-    <w:lsdException w:name="Medium Grid 3 Accent 5" w:uiPriority="69"/>
-    <w:lsdException w:name="Dark List Accent 5" w:uiPriority="70"/>
-    <w:lsdException w:name="Colorful Shading Accent 5" w:uiPriority="71"/>
-    <w:lsdException w:name="Colorful List Accent 5" w:uiPriority="72"/>
-    <w:lsdException w:name="Colorful Grid Accent 5" w:uiPriority="73"/>
-    <w:lsdException w:name="Light Shading Accent 6" w:uiPriority="60"/>
-    <w:lsdException w:name="Light List Accent 6" w:uiPriority="61"/>
-    <w:lsdException w:name="Light Grid Accent 6" w:uiPriority="62"/>
-    <w:lsdException w:name="Medium Shading 1 Accent 6" w:uiPriority="63"/>
-    <w:lsdException w:name="Medium Shading 2 Accent 6" w:uiPriority="64"/>
-    <w:lsdException w:name="Medium List 1 Accent 6" w:uiPriority="65"/>
-    <w:lsdException w:name="Medium List 2 Accent 6" w:uiPriority="66"/>
-    <w:lsdException w:name="Medium Grid 1 Accent 6" w:uiPriority="67"/>
-    <w:lsdException w:name="Medium Grid 2 Accent 6" w:uiPriority="68"/>
-    <w:lsdException w:name="Medium Grid 3 Accent 6" w:uiPriority="69"/>
-    <w:lsdException w:name="Dark List Accent 6" w:uiPriority="70"/>
-    <w:lsdException w:name="Colorful Shading Accent 6" w:uiPriority="71"/>
-    <w:lsdException w:name="Colorful List Accent 6" w:uiPriority="72"/>
-    <w:lsdException w:name="Colorful Grid Accent 6" w:uiPriority="73"/>
-    <w:lsdException w:name="Subtle Emphasis" w:qFormat="1" w:uiPriority="19"/>
-    <w:lsdException w:name="Intense Emphasis" w:qFormat="1" w:uiPriority="21"/>
-    <w:lsdException w:name="Subtle Reference" w:qFormat="1" w:uiPriority="31"/>
-    <w:lsdException w:name="Intense Reference" w:qFormat="1" w:uiPriority="32"/>
-    <w:lsdException w:name="Book Title" w:qFormat="1" w:uiPriority="33"/>
-    <w:lsdException w:name="Bibliography" w:semiHidden="1" w:uiPriority="37" w:unhideWhenUsed="1"/>
-    <w:lsdException w:name="TOC Heading" w:qFormat="1" w:semiHidden="1" w:uiPriority="39" w:unhideWhenUsed="1"/>
-    <w:lsdException w:name="Plain Table 1" w:uiPriority="41"/>
-    <w:lsdException w:name="Plain Table 2" w:uiPriority="42"/>
-    <w:lsdException w:name="Plain Table 3" w:uiPriority="43"/>
-    <w:lsdException w:name="Plain Table 4" w:uiPriority="44"/>
-    <w:lsdException w:name="Plain Table 5" w:uiPriority="45"/>
-    <w:lsdException w:name="Grid Table Light" w:uiPriority="40"/>
-    <w:lsdException w:name="Grid Table 1 Light" w:uiPriority="46"/>
-    <w:lsdException w:name="Grid Table 2" w:uiPriority="47"/>
-    <w:lsdException w:name="Grid Table 3" w:uiPriority="48"/>
-    <w:lsdException w:name="Grid Table 4" w:uiPriority="49"/>
-    <w:lsdException w:name="Grid Table 5 Dark" w:uiPriority="50"/>
-    <w:lsdException w:name="Grid Table 6 Colorful" w:uiPriority="51"/>
-    <w:lsdException w:name="Grid Table 7 Colorful" w:uiPriority="52"/>
-    <w:lsdException w:name="Grid Table 1 Light Accent 1" w:uiPriority="46"/>
-    <w:lsdException w:name="Grid Table 2 Accent 1" w:uiPriority="47"/>
-    <w:lsdException w:name="Grid Table 3 Accent 1" w:uiPriority="48"/>
-    <w:lsdException w:name="Grid Table 4 Accent 1" w:uiPriority="49"/>
-    <w:lsdException w:name="Grid Table 5 Dark Accent 1" w:uiPriority="50"/>
-    <w:lsdException w:name="Grid Table 6 Colorful Accent 1" w:uiPriority="51"/>
-    <w:lsdException w:name="Grid Table 7 Colorful Accent 1" w:uiPriority="52"/>
-    <w:lsdException w:name="Grid Table 1 Light Accent 2" w:uiPriority="46"/>
-    <w:lsdException w:name="Grid Table 2 Accent 2" w:uiPriority="47"/>
-    <w:lsdException w:name="Grid Table 3 Accent 2" w:uiPriority="48"/>
-    <w:lsdException w:name="Grid Table 4 Accent 2" w:uiPriority="49"/>
-    <w:lsdException w:name="Grid Table 5 Dark Accent 2" w:uiPriority="50"/>
-    <w:lsdException w:name="Grid Table 6 Colorful Accent 2" w:uiPriority="51"/>
-    <w:lsdException w:name="Grid Table 7 Colorful Accent 2" w:uiPriority="52"/>
-    <w:lsdException w:name="Grid Table 1 Light Accent 3" w:uiPriority="46"/>
-    <w:lsdException w:name="Grid Table 2 Accent 3" w:uiPriority="47"/>
-    <w:lsdException w:name="Grid Table 3 Accent 3" w:uiPriority="48"/>
-    <w:lsdException w:name="Grid Table 4 Accent 3" w:uiPriority="49"/>
-    <w:lsdException w:name="Grid Table 5 Dark Accent 3" w:uiPriority="50"/>
-    <w:lsdException w:name="Grid Table 6 Colorful Accent 3" w:uiPriority="51"/>
-    <w:lsdException w:name="Grid Table 7 Colorful Accent 3" w:uiPriority="52"/>
-    <w:lsdException w:name="Grid Table 1 Light Accent 4" w:uiPriority="46"/>
-    <w:lsdException w:name="Grid Table 2 Accent 4" w:uiPriority="47"/>
-    <w:lsdException w:name="Grid Table 3 Accent 4" w:uiPriority="48"/>
-    <w:lsdException w:name="Grid Table 4 Accent 4" w:uiPriority="49"/>
-    <w:lsdException w:name="Grid Table 5 Dark Accent 4" w:uiPriority="50"/>
-    <w:lsdException w:name="Grid Table 6 Colorful Accent 4" w:uiPriority="51"/>
-    <w:lsdException w:name="Grid Table 7 Colorful Accent 4" w:uiPriority="52"/>
-    <w:lsdException w:name="Grid Table 1 Light Accent 5" w:uiPriority="46"/>
-    <w:lsdException w:name="Grid Table 2 Accent 5" w:uiPriority="47"/>
-    <w:lsdException w:name="Grid Table 3 Accent 5" w:uiPriority="48"/>
-    <w:lsdException w:name="Grid Table 4 Accent 5" w:uiPriority="49"/>
-    <w:lsdException w:name="Grid Table 5 Dark Accent 5" w:uiPriority="50"/>
-    <w:lsdException w:name="Grid Table 6 Colorful Accent 5" w:uiPriority="51"/>
-    <w:lsdException w:name="Grid Table 7 Colorful Accent 5" w:uiPriority="52"/>
-    <w:lsdException w:name="Grid Table 1 Light Accent 6" w:uiPriority="46"/>
-    <w:lsdException w:name="Grid Table 2 Accent 6" w:uiPriority="47"/>
-    <w:lsdException w:name="Grid Table 3 Accent 6" w:uiPriority="48"/>
-    <w:lsdException w:name="Grid Table 4 Accent 6" w:uiPriority="49"/>
-    <w:lsdException w:name="Grid Table 5 Dark Accent 6" w:uiPriority="50"/>
-    <w:lsdException w:name="Grid Table 6 Colorful Accent 6" w:uiPriority="51"/>
-    <w:lsdException w:name="Grid Table 7 Colorful Accent 6" w:uiPriority="52"/>
-    <w:lsdException w:name="List Table 1 Light" w:uiPriority="46"/>
-    <w:lsdException w:name="List Table 2" w:uiPriority="47"/>
-    <w:lsdException w:name="List Table 3" w:uiPriority="48"/>
-    <w:lsdException w:name="List Table 4" w:uiPriority="49"/>
-    <w:lsdException w:name="List Table 5 Dark" w:uiPriority="50"/>
-    <w:lsdException w:name="List Table 6 Colorful" w:uiPriority="51"/>
-    <w:lsdException w:name="List Table 7 Colorful" w:uiPriority="52"/>
-    <w:lsdException w:name="List Table 1 Light Accent 1" w:uiPriority="46"/>
-    <w:lsdException w:name="List Table 2 Accent 1" w:uiPriority="47"/>
-    <w:lsdException w:name="List Table 3 Accent 1" w:uiPriority="48"/>
-    <w:lsdException w:name="List Table 4 Accent 1" w:uiPriority="49"/>
-    <w:lsdException w:name="List Table 5 Dark Accent 1" w:uiPriority="50"/>
-    <w:lsdException w:name="List Table 6 Colorful Accent 1" w:uiPriority="51"/>
-    <w:lsdException w:name="List Table 7 Colorful Accent 1" w:uiPriority="52"/>
-    <w:lsdException w:name="List Table 1 Light Accent 2" w:uiPriority="46"/>
-    <w:lsdException w:name="List Table 2 Accent 2" w:uiPriority="47"/>
-    <w:lsdException w:name="List Table 3 Accent 2" w:uiPriority="48"/>
-    <w:lsdException w:name="List Table 4 Accent 2" w:uiPriority="49"/>
-    <w:lsdException w:name="List Table 5 Dark Accent 2" w:uiPriority="50"/>
-    <w:lsdException w:name="List Table 6 Colorful Accent 2" w:uiPriority="51"/>
-    <w:lsdException w:name="List Table 7 Colorful Accent 2" w:uiPriority="52"/>
-    <w:lsdException w:name="List Table 1 Light Accent 3" w:uiPriority="46"/>
-    <w:lsdException w:name="List Table 2 Accent 3" w:uiPriority="47"/>
-    <w:lsdException w:name="List Table 3 Accent 3" w:uiPriority="48"/>
-    <w:lsdException w:name="List Table 4 Accent 3" w:uiPriority="49"/>
-    <w:lsdException w:name="List Table 5 Dark Accent 3" w:uiPriority="50"/>
-    <w:lsdException w:name="List Table 6 Colorful Accent 3" w:uiPriority="51"/>
-    <w:lsdException w:name="List Table 7 Colorful Accent 3" w:uiPriority="52"/>
-    <w:lsdException w:name="List Table 1 Light Accent 4" w:uiPriority="46"/>
-    <w:lsdException w:name="List Table 2 Accent 4" w:uiPriority="47"/>
-    <w:lsdException w:name="List Table 3 Accent 4" w:uiPriority="48"/>
-    <w:lsdException w:name="List Table 4 Accent 4" w:uiPriority="49"/>
-    <w:lsdException w:name="List Table 5 Dark Accent 4" w:uiPriority="50"/>
-    <w:lsdException w:name="List Table 6 Colorful Accent 4" w:uiPriority="51"/>
-    <w:lsdException w:name="List Table 7 Colorful Accent 4" w:uiPriority="52"/>
-    <w:lsdException w:name="List Table 1 Light Accent 5" w:uiPriority="46"/>
-    <w:lsdException w:name="List Table 2 Accent 5" w:uiPriority="47"/>
-    <w:lsdException w:name="List Table 3 Accent 5" w:uiPriority="48"/>
-    <w:lsdException w:name="List Table 4 Accent 5" w:uiPriority="49"/>
-    <w:lsdException w:name="List Table 5 Dark Accent 5" w:uiPriority="50"/>
-    <w:lsdException w:name="List Table 6 Colorful Accent 5" w:uiPriority="51"/>
-    <w:lsdException w:name="List Table 7 Colorful Accent 5" w:uiPriority="52"/>
-    <w:lsdException w:name="List Table 1 Light Accent 6" w:uiPriority="46"/>
-    <w:lsdException w:name="List Table 2 Accent 6" w:uiPriority="47"/>
-    <w:lsdException w:name="List Table 3 Accent 6" w:uiPriority="48"/>
-    <w:lsdException w:name="List Table 4 Accent 6" w:uiPriority="49"/>
-    <w:lsdException w:name="List Table 5 Dark Accent 6" w:uiPriority="50"/>
-    <w:lsdException w:name="List Table 6 Colorful Accent 6" w:uiPriority="51"/>
-    <w:lsdException w:name="List Table 7 Colorful Accent 6" w:uiPriority="52"/>
-    <w:lsdException w:name="Mention" w:semiHidden="1" w:unhideWhenUsed="1"/>
-    <w:lsdException w:name="Smart Hyperlink" w:semiHidden="1" w:unhideWhenUsed="1"/>
-    <w:lsdException w:name="Hashtag" w:semiHidden="1" w:unhideWhenUsed="1"/>
-    <w:lsdException w:name="Unresolved Mention" w:semiHidden="1" w:unhideWhenUsed="1"/>
-    <w:lsdException w:name="Smart Link" w:semiHidden="1" w:unhideWhenUsed="1"/>
-  </w:latentStyles>
+  <w:latentStyles w:count="276" w:defLockedState="0" w:defQFormat="0" w:defSemiHidden="0" w:defUIPriority="0" w:defUnhideWhenUsed="0"/>
   <w:style w:default="1" w:styleId="Normal" w:type="paragraph">
     <w:name w:val="Normal"/>
     <w:qFormat/>
-    <w:rsid w:val="002773DF"/>
+  </w:style>
+  <w:style w:styleId="BodyText" w:type="paragraph">
+    <w:name w:val="Body Text"/>
+    <w:basedOn w:val="Normal"/>
+    <w:link w:val="BodyTextChar"/>
+    <w:qFormat/>
+    <w:pPr>
+      <w:spacing w:after="180" w:before="180"/>
+    </w:pPr>
+  </w:style>
+  <w:style w:customStyle="1" w:styleId="FirstParagraph" w:type="paragraph">
+    <w:name w:val="First Paragraph"/>
+    <w:basedOn w:val="BodyText"/>
+    <w:next w:val="BodyText"/>
+    <w:qFormat/>
+  </w:style>
+  <w:style w:customStyle="1" w:styleId="Compact" w:type="paragraph">
+    <w:name w:val="Compact"/>
+    <w:basedOn w:val="BodyText"/>
+    <w:qFormat/>
+    <w:pPr>
+      <w:spacing w:after="36" w:before="36"/>
+    </w:pPr>
+  </w:style>
+  <w:style w:styleId="Title" w:type="paragraph">
+    <w:name w:val="Title"/>
+    <w:basedOn w:val="Normal"/>
+    <w:next w:val="BodyText"/>
+    <w:link w:val="TitleChar"/>
+    <w:uiPriority w:val="10"/>
+    <w:qFormat/>
+    <w:rsid w:val="00A10FD9"/>
+    <w:pPr>
+      <w:spacing w:after="80" w:line="240" w:lineRule="auto"/>
+      <w:contextualSpacing/>
+      <w:jc w:val="center"/>
+    </w:pPr>
+    <w:rPr>
+      <w:rFonts w:asciiTheme="majorHAnsi" w:cstheme="majorBidi" w:eastAsiaTheme="majorEastAsia" w:hAnsiTheme="majorHAnsi"/>
+      <w:sz w:val="56"/>
+      <w:szCs w:val="56"/>
+    </w:rPr>
+  </w:style>
+  <w:style w:customStyle="1" w:styleId="TitleChar" w:type="character">
+    <w:name w:val="Title Char"/>
+    <w:basedOn w:val="DefaultParagraphFont"/>
+    <w:link w:val="Title"/>
+    <w:uiPriority w:val="10"/>
+    <w:rsid w:val="00A10FD9"/>
+    <w:rPr>
+      <w:rFonts w:asciiTheme="majorHAnsi" w:cstheme="majorBidi" w:eastAsiaTheme="majorEastAsia" w:hAnsiTheme="majorHAnsi"/>
+      <w:sz w:val="56"/>
+      <w:szCs w:val="56"/>
+    </w:rPr>
+  </w:style>
+  <w:style w:styleId="Subtitle" w:type="paragraph">
+    <w:name w:val="Subtitle"/>
+    <w:basedOn w:val="Title"/>
+    <w:next w:val="BodyText"/>
+    <w:link w:val="SubtitleChar"/>
+    <w:uiPriority w:val="11"/>
+    <w:qFormat/>
+    <w:rsid w:val="00A10FD9"/>
+    <w:pPr>
+      <w:numPr>
+        <w:ilvl w:val="1"/>
+      </w:numPr>
+    </w:pPr>
+    <w:rPr>
+      <w:rFonts w:cstheme="majorBidi" w:eastAsiaTheme="majorEastAsia"/>
+      <w:spacing w:val="15"/>
+      <w:sz w:val="28"/>
+      <w:szCs w:val="28"/>
+    </w:rPr>
+  </w:style>
+  <w:style w:customStyle="1" w:styleId="SubtitleChar" w:type="character">
+    <w:name w:val="Subtitle Char"/>
+    <w:basedOn w:val="DefaultParagraphFont"/>
+    <w:link w:val="Subtitle"/>
+    <w:uiPriority w:val="11"/>
+    <w:rsid w:val="00A10FD9"/>
+    <w:rPr>
+      <w:rFonts w:cstheme="majorBidi" w:eastAsiaTheme="majorEastAsia"/>
+      <w:color w:themeColor="text1" w:themeTint="A6" w:val="595959"/>
+      <w:spacing w:val="15"/>
+      <w:sz w:val="28"/>
+      <w:szCs w:val="28"/>
+    </w:rPr>
+  </w:style>
+  <w:style w:customStyle="1" w:styleId="Author" w:type="paragraph">
+    <w:name w:val="Author"/>
+    <w:basedOn w:val="Title"/>
+    <w:next w:val="BodyText"/>
+    <w:qFormat/>
+    <w:pPr>
+      <w:keepNext/>
+      <w:keepLines/>
+    </w:pPr>
+    <w:rPr>
+      <w:sz w:val="24"/>
+      <w:szCs w:val="24"/>
+    </w:rPr>
+  </w:style>
+  <w:style w:styleId="Date" w:type="paragraph">
+    <w:name w:val="Date"/>
+    <w:basedOn w:val="Title"/>
+    <w:next w:val="BodyText"/>
+    <w:qFormat/>
+    <w:pPr>
+      <w:keepNext/>
+      <w:keepLines/>
+    </w:pPr>
+    <w:rPr>
+      <w:sz w:val="24"/>
+      <w:szCs w:val="24"/>
+    </w:rPr>
+  </w:style>
+  <w:style w:customStyle="1" w:styleId="AbstractTitle" w:type="paragraph">
+    <w:name w:val="Abstract Title"/>
+    <w:basedOn w:val="Normal"/>
+    <w:next w:val="Abstract"/>
+    <w:qFormat/>
+    <w:pPr>
+      <w:keepNext/>
+      <w:keepLines/>
+      <w:spacing w:after="0" w:before="300"/>
+      <w:jc w:val="center"/>
+    </w:pPr>
+    <w:rPr>
+      <w:b/>
+      <w:sz w:val="20"/>
+      <w:szCs w:val="20"/>
+    </w:rPr>
+  </w:style>
+  <w:style w:customStyle="1" w:styleId="Abstract" w:type="paragraph">
+    <w:name w:val="Abstract"/>
+    <w:basedOn w:val="Normal"/>
+    <w:next w:val="BodyText"/>
+    <w:qFormat/>
+    <w:pPr>
+      <w:keepNext/>
+      <w:keepLines/>
+      <w:spacing w:after="300" w:before="100"/>
+    </w:pPr>
+    <w:rPr>
+      <w:sz w:val="20"/>
+      <w:szCs w:val="20"/>
+    </w:rPr>
+  </w:style>
+  <w:style w:styleId="Bibliography" w:type="paragraph">
+    <w:name w:val="Bibliography"/>
+    <w:basedOn w:val="Normal"/>
+    <w:next w:val="Bibliography"/>
+    <w:qFormat/>
+    <w:pPr/>
+    <w:rPr/>
   </w:style>
   <w:style w:styleId="Heading1" w:type="paragraph">
     <w:name w:val="heading 1"/>
     <w:basedOn w:val="Normal"/>
-    <w:next w:val="Normal"/>
+    <w:next w:val="BodyText"/>
     <w:link w:val="Heading1Char"/>
     <w:uiPriority w:val="9"/>
     <w:qFormat/>
-    <w:rsid w:val="00BA08B1"/>
+    <w:rsid w:val="00A10FD9"/>
     <w:pPr>
       <w:keepNext/>
       <w:keepLines/>
-      <w:spacing w:before="240"/>
+      <w:spacing w:after="80" w:before="360"/>
       <w:outlineLvl w:val="0"/>
     </w:pPr>
     <w:rPr>
       <w:rFonts w:asciiTheme="majorHAnsi" w:cstheme="majorBidi" w:eastAsiaTheme="majorEastAsia" w:hAnsiTheme="majorHAnsi"/>
-      <w:color w:themeColor="accent1" w:themeShade="BF" w:val="2F5496"/>
-      <w:sz w:val="32"/>
-      <w:szCs w:val="32"/>
+      <w:color w:themeColor="accent1" w:themeShade="BF" w:val="0F4761"/>
+      <w:sz w:val="40"/>
+      <w:szCs w:val="40"/>
     </w:rPr>
   </w:style>
   <w:style w:styleId="Heading2" w:type="paragraph">
     <w:name w:val="heading 2"/>
     <w:basedOn w:val="Normal"/>
-    <w:next w:val="Normal"/>
+    <w:next w:val="BodyText"/>
     <w:link w:val="Heading2Char"/>
     <w:uiPriority w:val="9"/>
+    <w:semiHidden/>
     <w:unhideWhenUsed/>
     <w:qFormat/>
-    <w:rsid w:val="00747C69"/>
+    <w:rsid w:val="00A10FD9"/>
     <w:pPr>
       <w:keepNext/>
       <w:keepLines/>
-      <w:spacing w:before="40"/>
+      <w:spacing w:after="80" w:before="160"/>
       <w:outlineLvl w:val="1"/>
     </w:pPr>
     <w:rPr>
       <w:rFonts w:asciiTheme="majorHAnsi" w:cstheme="majorBidi" w:eastAsiaTheme="majorEastAsia" w:hAnsiTheme="majorHAnsi"/>
-      <w:color w:themeColor="accent1" w:themeShade="BF" w:val="2F5496"/>
-      <w:sz w:val="26"/>
-      <w:szCs w:val="26"/>
+      <w:color w:themeColor="accent1" w:themeShade="BF" w:val="0F4761"/>
+      <w:sz w:val="32"/>
+      <w:szCs w:val="32"/>
     </w:rPr>
   </w:style>
   <w:style w:styleId="Heading3" w:type="paragraph">
     <w:name w:val="heading 3"/>
     <w:basedOn w:val="Normal"/>
-    <w:next w:val="Normal"/>
+    <w:next w:val="BodyText"/>
     <w:link w:val="Heading3Char"/>
     <w:uiPriority w:val="9"/>
     <w:semiHidden/>
     <w:unhideWhenUsed/>
     <w:qFormat/>
-    <w:rsid w:val="002773DF"/>
+    <w:rsid w:val="00A10FD9"/>
     <w:pPr>
       <w:keepNext/>
       <w:keepLines/>
-      <w:spacing w:before="40"/>
+      <w:spacing w:after="80" w:before="160"/>
       <w:outlineLvl w:val="2"/>
     </w:pPr>
     <w:rPr>
+      <w:rFonts w:cstheme="majorBidi" w:eastAsiaTheme="majorEastAsia"/>
+      <w:color w:themeColor="accent1" w:themeShade="BF" w:val="0F4761"/>
+      <w:sz w:val="28"/>
+      <w:szCs w:val="28"/>
+    </w:rPr>
+  </w:style>
+  <w:style w:styleId="Heading4" w:type="paragraph">
+    <w:name w:val="heading 4"/>
+    <w:basedOn w:val="Normal"/>
+    <w:next w:val="BodyText"/>
+    <w:link w:val="Heading4Char"/>
+    <w:uiPriority w:val="9"/>
+    <w:semiHidden/>
+    <w:unhideWhenUsed/>
+    <w:qFormat/>
+    <w:rsid w:val="00A10FD9"/>
+    <w:pPr>
+      <w:keepNext/>
+      <w:keepLines/>
+      <w:spacing w:after="40" w:before="80"/>
+      <w:outlineLvl w:val="3"/>
+    </w:pPr>
+    <w:rPr>
+      <w:rFonts w:cstheme="majorBidi" w:eastAsiaTheme="majorEastAsia"/>
+      <w:i/>
+      <w:iCs/>
+      <w:color w:themeColor="accent1" w:themeShade="BF" w:val="0F4761"/>
+    </w:rPr>
+  </w:style>
+  <w:style w:styleId="Heading5" w:type="paragraph">
+    <w:name w:val="heading 5"/>
+    <w:basedOn w:val="Normal"/>
+    <w:next w:val="BodyText"/>
+    <w:link w:val="Heading5Char"/>
+    <w:uiPriority w:val="9"/>
+    <w:semiHidden/>
+    <w:unhideWhenUsed/>
+    <w:qFormat/>
+    <w:rsid w:val="00A10FD9"/>
+    <w:pPr>
+      <w:keepNext/>
+      <w:keepLines/>
+      <w:spacing w:after="40" w:before="80"/>
+      <w:outlineLvl w:val="4"/>
+    </w:pPr>
+    <w:rPr>
+      <w:rFonts w:cstheme="majorBidi" w:eastAsiaTheme="majorEastAsia"/>
+      <w:color w:themeColor="accent1" w:themeShade="BF" w:val="0F4761"/>
+    </w:rPr>
+  </w:style>
+  <w:style w:styleId="Heading6" w:type="paragraph">
+    <w:name w:val="heading 6"/>
+    <w:basedOn w:val="Normal"/>
+    <w:next w:val="BodyText"/>
+    <w:link w:val="Heading6Char"/>
+    <w:uiPriority w:val="9"/>
+    <w:semiHidden/>
+    <w:unhideWhenUsed/>
+    <w:qFormat/>
+    <w:rsid w:val="00A10FD9"/>
+    <w:pPr>
+      <w:keepNext/>
+      <w:keepLines/>
+      <w:spacing w:after="0" w:before="40"/>
+      <w:outlineLvl w:val="5"/>
+    </w:pPr>
+    <w:rPr>
+      <w:rFonts w:cstheme="majorBidi" w:eastAsiaTheme="majorEastAsia"/>
+      <w:i/>
+      <w:iCs/>
+      <w:color w:themeColor="text1" w:themeTint="A6" w:val="595959"/>
+    </w:rPr>
+  </w:style>
+  <w:style w:styleId="Heading7" w:type="paragraph">
+    <w:name w:val="heading 7"/>
+    <w:basedOn w:val="Normal"/>
+    <w:next w:val="BodyText"/>
+    <w:link w:val="Heading7Char"/>
+    <w:uiPriority w:val="9"/>
+    <w:semiHidden/>
+    <w:unhideWhenUsed/>
+    <w:qFormat/>
+    <w:rsid w:val="00A10FD9"/>
+    <w:pPr>
+      <w:keepNext/>
+      <w:keepLines/>
+      <w:spacing w:after="0" w:before="40"/>
+      <w:outlineLvl w:val="6"/>
+    </w:pPr>
+    <w:rPr>
+      <w:rFonts w:cstheme="majorBidi" w:eastAsiaTheme="majorEastAsia"/>
+      <w:color w:themeColor="text1" w:themeTint="A6" w:val="595959"/>
+    </w:rPr>
+  </w:style>
+  <w:style w:styleId="Heading8" w:type="paragraph">
+    <w:name w:val="heading 8"/>
+    <w:basedOn w:val="Normal"/>
+    <w:next w:val="BodyText"/>
+    <w:link w:val="Heading8Char"/>
+    <w:uiPriority w:val="9"/>
+    <w:semiHidden/>
+    <w:unhideWhenUsed/>
+    <w:qFormat/>
+    <w:rsid w:val="00A10FD9"/>
+    <w:pPr>
+      <w:keepNext/>
+      <w:keepLines/>
+      <w:spacing w:after="0"/>
+      <w:outlineLvl w:val="7"/>
+    </w:pPr>
+    <w:rPr>
+      <w:rFonts w:cstheme="majorBidi" w:eastAsiaTheme="majorEastAsia"/>
+      <w:i/>
+      <w:iCs/>
+      <w:color w:themeColor="text1" w:themeTint="D8" w:val="272727"/>
+    </w:rPr>
+  </w:style>
+  <w:style w:styleId="Heading9" w:type="paragraph">
+    <w:name w:val="heading 9"/>
+    <w:basedOn w:val="Normal"/>
+    <w:next w:val="BodyText"/>
+    <w:link w:val="Heading9Char"/>
+    <w:uiPriority w:val="9"/>
+    <w:semiHidden/>
+    <w:unhideWhenUsed/>
+    <w:qFormat/>
+    <w:rsid w:val="00A10FD9"/>
+    <w:pPr>
+      <w:keepNext/>
+      <w:keepLines/>
+      <w:spacing w:after="0"/>
+      <w:outlineLvl w:val="8"/>
+    </w:pPr>
+    <w:rPr>
+      <w:rFonts w:cstheme="majorBidi" w:eastAsiaTheme="majorEastAsia"/>
+      <w:color w:themeColor="text1" w:themeTint="D8" w:val="272727"/>
+    </w:rPr>
+  </w:style>
+  <w:style w:customStyle="1" w:styleId="Heading1Char" w:type="character">
+    <w:name w:val="Heading 1 Char"/>
+    <w:basedOn w:val="DefaultParagraphFont"/>
+    <w:link w:val="Heading1"/>
+    <w:uiPriority w:val="9"/>
+    <w:rsid w:val="00A10FD9"/>
+    <w:rPr>
       <w:rFonts w:asciiTheme="majorHAnsi" w:cstheme="majorBidi" w:eastAsiaTheme="majorEastAsia" w:hAnsiTheme="majorHAnsi"/>
-      <w:color w:themeColor="accent1" w:themeShade="7F" w:val="1F3763"/>
-    </w:rPr>
+      <w:color w:themeColor="accent1" w:themeShade="BF" w:val="0F4761"/>
+      <w:sz w:val="40"/>
+      <w:szCs w:val="40"/>
+    </w:rPr>
+  </w:style>
+  <w:style w:customStyle="1" w:styleId="Heading2Char" w:type="character">
+    <w:name w:val="Heading 2 Char"/>
+    <w:basedOn w:val="DefaultParagraphFont"/>
+    <w:link w:val="Heading2"/>
+    <w:uiPriority w:val="9"/>
+    <w:semiHidden/>
+    <w:rsid w:val="00A10FD9"/>
+    <w:rPr>
+      <w:rFonts w:asciiTheme="majorHAnsi" w:cstheme="majorBidi" w:eastAsiaTheme="majorEastAsia" w:hAnsiTheme="majorHAnsi"/>
+      <w:color w:themeColor="accent1" w:themeShade="BF" w:val="0F4761"/>
+      <w:sz w:val="32"/>
+      <w:szCs w:val="32"/>
+    </w:rPr>
+  </w:style>
+  <w:style w:customStyle="1" w:styleId="Heading3Char" w:type="character">
+    <w:name w:val="Heading 3 Char"/>
+    <w:basedOn w:val="DefaultParagraphFont"/>
+    <w:link w:val="Heading3"/>
+    <w:uiPriority w:val="9"/>
+    <w:semiHidden/>
+    <w:rsid w:val="00A10FD9"/>
+    <w:rPr>
+      <w:rFonts w:cstheme="majorBidi" w:eastAsiaTheme="majorEastAsia"/>
+      <w:color w:themeColor="accent1" w:themeShade="BF" w:val="0F4761"/>
+      <w:sz w:val="28"/>
+      <w:szCs w:val="28"/>
+    </w:rPr>
+  </w:style>
+  <w:style w:customStyle="1" w:styleId="Heading4Char" w:type="character">
+    <w:name w:val="Heading 4 Char"/>
+    <w:basedOn w:val="DefaultParagraphFont"/>
+    <w:link w:val="Heading4"/>
+    <w:uiPriority w:val="9"/>
+    <w:semiHidden/>
+    <w:rsid w:val="00A10FD9"/>
+    <w:rPr>
+      <w:rFonts w:cstheme="majorBidi" w:eastAsiaTheme="majorEastAsia"/>
+      <w:i/>
+      <w:iCs/>
+      <w:color w:themeColor="accent1" w:themeShade="BF" w:val="0F4761"/>
+    </w:rPr>
+  </w:style>
+  <w:style w:customStyle="1" w:styleId="Heading5Char" w:type="character">
+    <w:name w:val="Heading 5 Char"/>
+    <w:basedOn w:val="DefaultParagraphFont"/>
+    <w:link w:val="Heading5"/>
+    <w:uiPriority w:val="9"/>
+    <w:semiHidden/>
+    <w:rsid w:val="00A10FD9"/>
+    <w:rPr>
+      <w:rFonts w:cstheme="majorBidi" w:eastAsiaTheme="majorEastAsia"/>
+      <w:color w:themeColor="accent1" w:themeShade="BF" w:val="0F4761"/>
+    </w:rPr>
+  </w:style>
+  <w:style w:customStyle="1" w:styleId="Heading6Char" w:type="character">
+    <w:name w:val="Heading 6 Char"/>
+    <w:basedOn w:val="DefaultParagraphFont"/>
+    <w:link w:val="Heading6"/>
+    <w:uiPriority w:val="9"/>
+    <w:semiHidden/>
+    <w:rsid w:val="00A10FD9"/>
+    <w:rPr>
+      <w:rFonts w:cstheme="majorBidi" w:eastAsiaTheme="majorEastAsia"/>
+      <w:i/>
+      <w:iCs/>
+      <w:color w:themeColor="text1" w:themeTint="A6" w:val="595959"/>
+    </w:rPr>
+  </w:style>
+  <w:style w:customStyle="1" w:styleId="Heading7Char" w:type="character">
+    <w:name w:val="Heading 7 Char"/>
+    <w:basedOn w:val="DefaultParagraphFont"/>
+    <w:link w:val="Heading7"/>
+    <w:uiPriority w:val="9"/>
+    <w:semiHidden/>
+    <w:rsid w:val="00A10FD9"/>
+    <w:rPr>
+      <w:rFonts w:cstheme="majorBidi" w:eastAsiaTheme="majorEastAsia"/>
+      <w:color w:themeColor="text1" w:themeTint="A6" w:val="595959"/>
+    </w:rPr>
+  </w:style>
+  <w:style w:customStyle="1" w:styleId="Heading8Char" w:type="character">
+    <w:name w:val="Heading 8 Char"/>
+    <w:basedOn w:val="DefaultParagraphFont"/>
+    <w:link w:val="Heading8"/>
+    <w:uiPriority w:val="9"/>
+    <w:semiHidden/>
+    <w:rsid w:val="00A10FD9"/>
+    <w:rPr>
+      <w:rFonts w:cstheme="majorBidi" w:eastAsiaTheme="majorEastAsia"/>
+      <w:i/>
+      <w:iCs/>
+      <w:color w:themeColor="text1" w:themeTint="D8" w:val="272727"/>
+    </w:rPr>
+  </w:style>
+  <w:style w:customStyle="1" w:styleId="Heading9Char" w:type="character">
+    <w:name w:val="Heading 9 Char"/>
+    <w:basedOn w:val="DefaultParagraphFont"/>
+    <w:link w:val="Heading9"/>
+    <w:uiPriority w:val="9"/>
+    <w:semiHidden/>
+    <w:rsid w:val="00A10FD9"/>
+    <w:rPr>
+      <w:rFonts w:cstheme="majorBidi" w:eastAsiaTheme="majorEastAsia"/>
+      <w:color w:themeColor="text1" w:themeTint="D8" w:val="272727"/>
+    </w:rPr>
+  </w:style>
+  <w:style w:styleId="BlockText" w:type="paragraph">
+    <w:name w:val="Block Text"/>
+    <w:basedOn w:val="BodyText"/>
+    <w:next w:val="BodyText"/>
+    <w:uiPriority w:val="9"/>
+    <w:unhideWhenUsed/>
+    <w:qFormat/>
+    <w:pPr>
+      <w:spacing w:after="100" w:before="100"/>
+      <w:ind w:firstLine="0" w:left="480" w:right="480"/>
+    </w:pPr>
+  </w:style>
+  <w:style w:styleId="FootnoteText" w:type="paragraph">
+    <w:name w:val="Footnote Text"/>
+    <w:basedOn w:val="Normal"/>
+    <w:next w:val="FootnoteText"/>
+    <w:uiPriority w:val="9"/>
+    <w:unhideWhenUsed/>
+    <w:qFormat/>
+  </w:style>
+  <w:style w:styleId="FootnoteBlockText" w:type="paragraph">
+    <w:name w:val="Footnote Block Text"/>
+    <w:basedOn w:val="FootnoteText"/>
+    <w:next w:val="FootnoteText"/>
+    <w:uiPriority w:val="9"/>
+    <w:unhideWhenUsed/>
+    <w:qFormat/>
+    <w:pPr>
+      <w:spacing w:after="100" w:before="100"/>
+      <w:ind w:firstLine="0" w:left="480" w:right="480"/>
+    </w:pPr>
   </w:style>
   <w:style w:default="1" w:styleId="DefaultParagraphFont" w:type="character">
     <w:name w:val="Default Paragraph Font"/>
-    <w:uiPriority w:val="1"/>
     <w:semiHidden/>
     <w:unhideWhenUsed/>
   </w:style>
-  <w:style w:default="1" w:styleId="TableNormal" w:type="table">
-    <w:name w:val="Normal Table"/>
-    <w:uiPriority w:val="99"/>
+  <w:style w:default="1" w:styleId="Table" w:type="table">
+    <w:name w:val="Table"/>
+    <w:basedOn w:val="TableNormal"/>
     <w:semiHidden/>
     <w:unhideWhenUsed/>
+    <w:qFormat/>
     <w:tblPr>
       <w:tblInd w:type="dxa" w:w="0"/>
       <w:tblCellMar>
@@ -5328,1004 +4017,112 @@
         <w:right w:type="dxa" w:w="108"/>
       </w:tblCellMar>
     </w:tblPr>
-  </w:style>
-  <w:style w:default="1" w:styleId="NoList" w:type="numbering">
-    <w:name w:val="No List"/>
-    <w:uiPriority w:val="99"/>
-    <w:semiHidden/>
-    <w:unhideWhenUsed/>
-  </w:style>
-  <w:style w:customStyle="1" w:styleId="Default" w:type="paragraph">
-    <w:name w:val="Default"/>
-    <w:rsid w:val="003135E4"/>
+    <w:tblStylePr w:type="firstRow">
+      <w:tcPr>
+        <w:tcBorders>
+          <w:bottom w:val="single"/>
+        </w:tcBorders>
+        <w:vAlign w:val="bottom"/>
+      </w:tcPr>
+    </w:tblStylePr>
+  </w:style>
+  <w:style w:customStyle="1" w:styleId="DefinitionTerm" w:type="paragraph">
+    <w:name w:val="Definition Term"/>
+    <w:basedOn w:val="Normal"/>
+    <w:next w:val="Definition"/>
     <w:pPr>
-      <w:autoSpaceDE w:val="0"/>
-      <w:autoSpaceDN w:val="0"/>
-      <w:adjustRightInd w:val="0"/>
+      <w:keepNext/>
+      <w:keepLines/>
+      <w:spacing w:after="0"/>
     </w:pPr>
     <w:rPr>
-      <w:rFonts w:ascii="Verdana" w:cs="Verdana" w:hAnsi="Verdana"/>
-      <w:color w:val="000000"/>
-      <w:lang w:val="en-US"/>
+      <w:b/>
+    </w:rPr>
+  </w:style>
+  <w:style w:customStyle="1" w:styleId="Definition" w:type="paragraph">
+    <w:name w:val="Definition"/>
+    <w:basedOn w:val="Normal"/>
+  </w:style>
+  <w:style w:styleId="Caption" w:type="paragraph">
+    <w:name w:val="Caption"/>
+    <w:basedOn w:val="Normal"/>
+    <w:link w:val="BodyTextChar"/>
+    <w:pPr>
+      <w:spacing w:after="120" w:before="0"/>
+    </w:pPr>
+    <w:rPr>
+      <w:i/>
+    </w:rPr>
+  </w:style>
+  <w:style w:customStyle="1" w:styleId="TableCaption" w:type="paragraph">
+    <w:name w:val="Table Caption"/>
+    <w:basedOn w:val="Caption"/>
+    <w:pPr>
+      <w:keepNext/>
+    </w:pPr>
+  </w:style>
+  <w:style w:customStyle="1" w:styleId="ImageCaption" w:type="paragraph">
+    <w:name w:val="Image Caption"/>
+    <w:basedOn w:val="Caption"/>
+  </w:style>
+  <w:style w:customStyle="1" w:styleId="Figure" w:type="paragraph">
+    <w:name w:val="Figure"/>
+    <w:basedOn w:val="Normal"/>
+  </w:style>
+  <w:style w:customStyle="1" w:styleId="CaptionedFigure" w:type="paragraph">
+    <w:name w:val="Captioned Figure"/>
+    <w:basedOn w:val="Figure"/>
+    <w:pPr>
+      <w:keepNext/>
+    </w:pPr>
+  </w:style>
+  <w:style w:customStyle="1" w:styleId="BodyTextChar" w:type="character">
+    <w:name w:val="Body Text Char"/>
+    <w:basedOn w:val="DefaultParagraphFont"/>
+    <w:link w:val="BodyText"/>
+  </w:style>
+  <w:style w:customStyle="1" w:styleId="VerbatimChar" w:type="character">
+    <w:name w:val="Verbatim Char"/>
+    <w:basedOn w:val="BodyTextChar"/>
+    <w:rPr>
+      <w:rFonts w:ascii="Consolas" w:hAnsi="Consolas"/>
+      <w:sz w:val="22"/>
+    </w:rPr>
+  </w:style>
+  <w:style w:customStyle="1" w:styleId="SectionNumber" w:type="character">
+    <w:name w:val="Section Number"/>
+    <w:basedOn w:val="BodyTextChar"/>
+  </w:style>
+  <w:style w:styleId="FootnoteReference" w:type="character">
+    <w:name w:val="Footnote Reference"/>
+    <w:basedOn w:val="BodyTextChar"/>
+    <w:rPr>
+      <w:vertAlign w:val="superscript"/>
     </w:rPr>
   </w:style>
   <w:style w:styleId="Hyperlink" w:type="character">
     <w:name w:val="Hyperlink"/>
-    <w:basedOn w:val="DefaultParagraphFont"/>
-    <w:uiPriority w:val="99"/>
-    <w:unhideWhenUsed/>
-    <w:rsid w:val="003135E4"/>
-    <w:rPr>
-      <w:color w:themeColor="hyperlink" w:val="0563C1"/>
-      <w:u w:val="single"/>
-    </w:rPr>
-  </w:style>
-  <w:style w:customStyle="1" w:styleId="UnresolvedMention1" w:type="character">
-    <w:name w:val="Unresolved Mention1"/>
-    <w:basedOn w:val="DefaultParagraphFont"/>
-    <w:uiPriority w:val="99"/>
-    <w:rsid w:val="003135E4"/>
-    <w:rPr>
-      <w:color w:val="605E5C"/>
-      <w:shd w:color="auto" w:fill="E1DFDD" w:val="clear"/>
-    </w:rPr>
-  </w:style>
-  <w:style w:styleId="ListParagraph" w:type="paragraph">
-    <w:name w:val="List Paragraph"/>
-    <w:basedOn w:val="Normal"/>
-    <w:uiPriority w:val="34"/>
-    <w:qFormat/>
-    <w:rsid w:val="003135E4"/>
-    <w:pPr>
-      <w:ind w:left="720"/>
-      <w:contextualSpacing/>
-    </w:pPr>
-  </w:style>
-  <w:style w:styleId="NoSpacing" w:type="paragraph">
-    <w:name w:val="No Spacing"/>
-    <w:link w:val="NoSpacingChar"/>
-    <w:uiPriority w:val="1"/>
-    <w:qFormat/>
-    <w:rsid w:val="003E1057"/>
-    <w:rPr>
-      <w:rFonts w:eastAsiaTheme="minorEastAsia"/>
-      <w:sz w:val="22"/>
-      <w:szCs w:val="22"/>
-      <w:lang w:eastAsia="zh-CN" w:val="en-US"/>
-    </w:rPr>
-  </w:style>
-  <w:style w:customStyle="1" w:styleId="NoSpacingChar" w:type="character">
-    <w:name w:val="No Spacing Char"/>
-    <w:basedOn w:val="DefaultParagraphFont"/>
-    <w:link w:val="NoSpacing"/>
-    <w:uiPriority w:val="1"/>
-    <w:rsid w:val="003E1057"/>
-    <w:rPr>
-      <w:rFonts w:eastAsiaTheme="minorEastAsia"/>
-      <w:sz w:val="22"/>
-      <w:szCs w:val="22"/>
-      <w:lang w:eastAsia="zh-CN" w:val="en-US"/>
-    </w:rPr>
-  </w:style>
-  <w:style w:styleId="Footer" w:type="paragraph">
-    <w:name w:val="footer"/>
-    <w:basedOn w:val="Normal"/>
-    <w:link w:val="FooterChar"/>
-    <w:uiPriority w:val="99"/>
-    <w:unhideWhenUsed/>
-    <w:rsid w:val="00BA08B1"/>
-    <w:pPr>
-      <w:tabs>
-        <w:tab w:pos="4680" w:val="center"/>
-        <w:tab w:pos="9360" w:val="right"/>
-      </w:tabs>
-    </w:pPr>
-  </w:style>
-  <w:style w:customStyle="1" w:styleId="FooterChar" w:type="character">
-    <w:name w:val="Footer Char"/>
-    <w:basedOn w:val="DefaultParagraphFont"/>
-    <w:link w:val="Footer"/>
-    <w:uiPriority w:val="99"/>
-    <w:rsid w:val="00BA08B1"/>
-  </w:style>
-  <w:style w:styleId="PageNumber" w:type="character">
-    <w:name w:val="page number"/>
-    <w:basedOn w:val="DefaultParagraphFont"/>
-    <w:uiPriority w:val="99"/>
-    <w:semiHidden/>
-    <w:unhideWhenUsed/>
-    <w:rsid w:val="00BA08B1"/>
-  </w:style>
-  <w:style w:styleId="Header" w:type="paragraph">
-    <w:name w:val="header"/>
-    <w:basedOn w:val="Normal"/>
-    <w:link w:val="HeaderChar"/>
-    <w:uiPriority w:val="99"/>
-    <w:unhideWhenUsed/>
-    <w:rsid w:val="00BA08B1"/>
-    <w:pPr>
-      <w:tabs>
-        <w:tab w:pos="4680" w:val="center"/>
-        <w:tab w:pos="9360" w:val="right"/>
-      </w:tabs>
-    </w:pPr>
-  </w:style>
-  <w:style w:customStyle="1" w:styleId="HeaderChar" w:type="character">
-    <w:name w:val="Header Char"/>
-    <w:basedOn w:val="DefaultParagraphFont"/>
-    <w:link w:val="Header"/>
-    <w:uiPriority w:val="99"/>
-    <w:rsid w:val="00BA08B1"/>
-  </w:style>
-  <w:style w:customStyle="1" w:styleId="Heading1Char" w:type="character">
-    <w:name w:val="Heading 1 Char"/>
-    <w:basedOn w:val="DefaultParagraphFont"/>
-    <w:link w:val="Heading1"/>
-    <w:uiPriority w:val="9"/>
-    <w:rsid w:val="00BA08B1"/>
-    <w:rPr>
-      <w:rFonts w:asciiTheme="majorHAnsi" w:cstheme="majorBidi" w:eastAsiaTheme="majorEastAsia" w:hAnsiTheme="majorHAnsi"/>
-      <w:color w:themeColor="accent1" w:themeShade="BF" w:val="2F5496"/>
-      <w:sz w:val="32"/>
-      <w:szCs w:val="32"/>
-    </w:rPr>
-  </w:style>
-  <w:style w:styleId="FollowedHyperlink" w:type="character">
-    <w:name w:val="FollowedHyperlink"/>
-    <w:basedOn w:val="DefaultParagraphFont"/>
-    <w:uiPriority w:val="99"/>
-    <w:semiHidden/>
-    <w:unhideWhenUsed/>
-    <w:rsid w:val="00B23AB5"/>
-    <w:rPr>
-      <w:color w:themeColor="followedHyperlink" w:val="954F72"/>
-      <w:u w:val="single"/>
-    </w:rPr>
-  </w:style>
-  <w:style w:styleId="Caption" w:type="paragraph">
-    <w:name w:val="caption"/>
-    <w:basedOn w:val="Normal"/>
-    <w:next w:val="Normal"/>
-    <w:uiPriority w:val="35"/>
+    <w:basedOn w:val="BodyTextChar"/>
+    <w:rPr>
+      <w:color w:themeColor="accent1" w:val="4F81BD"/>
+    </w:rPr>
+  </w:style>
+  <w:style w:styleId="TOCHeading" w:type="paragraph">
+    <w:name w:val="TOC Heading"/>
+    <w:basedOn w:val="Heading1"/>
+    <w:next w:val="BodyText"/>
+    <w:uiPriority w:val="39"/>
     <w:unhideWhenUsed/>
     <w:qFormat/>
-    <w:rsid w:val="00E50A85"/>
     <w:pPr>
-      <w:spacing w:after="200"/>
+      <w:spacing w:before="240" w:line="259" w:lineRule="auto"/>
+      <w:outlineLvl w:val="9"/>
     </w:pPr>
     <w:rPr>
-      <w:i/>
-      <w:iCs/>
-      <w:color w:themeColor="text2" w:val="44546A"/>
-      <w:sz w:val="18"/>
-      <w:szCs w:val="18"/>
-    </w:rPr>
-  </w:style>
-  <w:style w:styleId="FootnoteText" w:type="paragraph">
-    <w:name w:val="footnote text"/>
-    <w:basedOn w:val="Normal"/>
-    <w:link w:val="FootnoteTextChar"/>
-    <w:uiPriority w:val="99"/>
-    <w:semiHidden/>
-    <w:unhideWhenUsed/>
-    <w:rsid w:val="001B04B2"/>
-    <w:rPr>
-      <w:sz w:val="20"/>
-      <w:szCs w:val="20"/>
-    </w:rPr>
-  </w:style>
-  <w:style w:customStyle="1" w:styleId="FootnoteTextChar" w:type="character">
-    <w:name w:val="Footnote Text Char"/>
-    <w:basedOn w:val="DefaultParagraphFont"/>
-    <w:link w:val="FootnoteText"/>
-    <w:uiPriority w:val="99"/>
-    <w:semiHidden/>
-    <w:rsid w:val="001B04B2"/>
-    <w:rPr>
-      <w:sz w:val="20"/>
-      <w:szCs w:val="20"/>
-    </w:rPr>
-  </w:style>
-  <w:style w:styleId="FootnoteReference" w:type="character">
-    <w:name w:val="footnote reference"/>
-    <w:basedOn w:val="DefaultParagraphFont"/>
-    <w:uiPriority w:val="99"/>
-    <w:semiHidden/>
-    <w:unhideWhenUsed/>
-    <w:rsid w:val="001B04B2"/>
-    <w:rPr>
-      <w:vertAlign w:val="superscript"/>
-    </w:rPr>
-  </w:style>
-  <w:style w:styleId="EndnoteReference" w:type="character">
-    <w:name w:val="endnote reference"/>
-    <w:basedOn w:val="DefaultParagraphFont"/>
-    <w:uiPriority w:val="99"/>
-    <w:semiHidden/>
-    <w:unhideWhenUsed/>
-    <w:rsid w:val="00CF02FF"/>
-    <w:rPr>
-      <w:vertAlign w:val="superscript"/>
-    </w:rPr>
-  </w:style>
-  <w:style w:styleId="TableGrid" w:type="table">
-    <w:name w:val="Table Grid"/>
-    <w:basedOn w:val="TableNormal"/>
-    <w:uiPriority w:val="39"/>
-    <w:rsid w:val="007B096D"/>
-    <w:tblPr>
-      <w:tblBorders>
-        <w:top w:color="auto" w:space="0" w:sz="4" w:val="single"/>
-        <w:left w:color="auto" w:space="0" w:sz="4" w:val="single"/>
-        <w:bottom w:color="auto" w:space="0" w:sz="4" w:val="single"/>
-        <w:right w:color="auto" w:space="0" w:sz="4" w:val="single"/>
-        <w:insideH w:color="auto" w:space="0" w:sz="4" w:val="single"/>
-        <w:insideV w:color="auto" w:space="0" w:sz="4" w:val="single"/>
-      </w:tblBorders>
-    </w:tblPr>
-  </w:style>
-  <w:style w:customStyle="1" w:styleId="GridTable1Light-Accent11" w:type="table">
-    <w:name w:val="Grid Table 1 Light - Accent 11"/>
-    <w:basedOn w:val="TableNormal"/>
-    <w:uiPriority w:val="46"/>
-    <w:rsid w:val="007B096D"/>
-    <w:tblPr>
-      <w:tblStyleRowBandSize w:val="1"/>
-      <w:tblStyleColBandSize w:val="1"/>
-      <w:tblBorders>
-        <w:top w:color="B4C6E7" w:space="0" w:sz="4" w:themeColor="accent1" w:themeTint="66" w:val="single"/>
-        <w:left w:color="B4C6E7" w:space="0" w:sz="4" w:themeColor="accent1" w:themeTint="66" w:val="single"/>
-        <w:bottom w:color="B4C6E7" w:space="0" w:sz="4" w:themeColor="accent1" w:themeTint="66" w:val="single"/>
-        <w:right w:color="B4C6E7" w:space="0" w:sz="4" w:themeColor="accent1" w:themeTint="66" w:val="single"/>
-        <w:insideH w:color="B4C6E7" w:space="0" w:sz="4" w:themeColor="accent1" w:themeTint="66" w:val="single"/>
-        <w:insideV w:color="B4C6E7" w:space="0" w:sz="4" w:themeColor="accent1" w:themeTint="66" w:val="single"/>
-      </w:tblBorders>
-    </w:tblPr>
-    <w:tblStylePr w:type="firstRow">
-      <w:rPr>
-        <w:b/>
-        <w:bCs/>
-      </w:rPr>
-      <w:tblPr/>
-      <w:tcPr>
-        <w:tcBorders>
-          <w:bottom w:color="8EAADB" w:space="0" w:sz="12" w:themeColor="accent1" w:themeTint="99" w:val="single"/>
-        </w:tcBorders>
-      </w:tcPr>
-    </w:tblStylePr>
-    <w:tblStylePr w:type="lastRow">
-      <w:rPr>
-        <w:b/>
-        <w:bCs/>
-      </w:rPr>
-      <w:tblPr/>
-      <w:tcPr>
-        <w:tcBorders>
-          <w:top w:color="8EAADB" w:space="0" w:sz="2" w:themeColor="accent1" w:themeTint="99" w:val="double"/>
-        </w:tcBorders>
-      </w:tcPr>
-    </w:tblStylePr>
-    <w:tblStylePr w:type="firstCol">
-      <w:rPr>
-        <w:b/>
-        <w:bCs/>
-      </w:rPr>
-    </w:tblStylePr>
-    <w:tblStylePr w:type="lastCol">
-      <w:rPr>
-        <w:b/>
-        <w:bCs/>
-      </w:rPr>
-    </w:tblStylePr>
-  </w:style>
-  <w:style w:customStyle="1" w:styleId="PlainTable31" w:type="table">
-    <w:name w:val="Plain Table 31"/>
-    <w:basedOn w:val="TableNormal"/>
-    <w:uiPriority w:val="43"/>
-    <w:rsid w:val="007B096D"/>
-    <w:tblPr>
-      <w:tblStyleRowBandSize w:val="1"/>
-      <w:tblStyleColBandSize w:val="1"/>
-    </w:tblPr>
-    <w:tblStylePr w:type="firstRow">
-      <w:rPr>
-        <w:b/>
-        <w:bCs/>
-        <w:caps/>
-      </w:rPr>
-      <w:tblPr/>
-      <w:tcPr>
-        <w:tcBorders>
-          <w:bottom w:color="7F7F7F" w:space="0" w:sz="4" w:themeColor="text1" w:themeTint="80" w:val="single"/>
-        </w:tcBorders>
-      </w:tcPr>
-    </w:tblStylePr>
-    <w:tblStylePr w:type="lastRow">
-      <w:rPr>
-        <w:b/>
-        <w:bCs/>
-        <w:caps/>
-      </w:rPr>
-      <w:tblPr/>
-      <w:tcPr>
-        <w:tcBorders>
-          <w:top w:val="nil"/>
-        </w:tcBorders>
-      </w:tcPr>
-    </w:tblStylePr>
-    <w:tblStylePr w:type="firstCol">
-      <w:rPr>
-        <w:b/>
-        <w:bCs/>
-        <w:caps/>
-      </w:rPr>
-      <w:tblPr/>
-      <w:tcPr>
-        <w:tcBorders>
-          <w:right w:color="7F7F7F" w:space="0" w:sz="4" w:themeColor="text1" w:themeTint="80" w:val="single"/>
-        </w:tcBorders>
-      </w:tcPr>
-    </w:tblStylePr>
-    <w:tblStylePr w:type="lastCol">
-      <w:rPr>
-        <w:b/>
-        <w:bCs/>
-        <w:caps/>
-      </w:rPr>
-      <w:tblPr/>
-      <w:tcPr>
-        <w:tcBorders>
-          <w:left w:val="nil"/>
-        </w:tcBorders>
-      </w:tcPr>
-    </w:tblStylePr>
-    <w:tblStylePr w:type="band1Vert">
-      <w:tblPr/>
-      <w:tcPr>
-        <w:shd w:color="auto" w:fill="F2F2F2" w:themeFill="background1" w:themeFillShade="F2" w:val="clear"/>
-      </w:tcPr>
-    </w:tblStylePr>
-    <w:tblStylePr w:type="band1Horz">
-      <w:tblPr/>
-      <w:tcPr>
-        <w:shd w:color="auto" w:fill="F2F2F2" w:themeFill="background1" w:themeFillShade="F2" w:val="clear"/>
-      </w:tcPr>
-    </w:tblStylePr>
-    <w:tblStylePr w:type="neCell">
-      <w:tblPr/>
-      <w:tcPr>
-        <w:tcBorders>
-          <w:left w:val="nil"/>
-        </w:tcBorders>
-      </w:tcPr>
-    </w:tblStylePr>
-    <w:tblStylePr w:type="nwCell">
-      <w:tblPr/>
-      <w:tcPr>
-        <w:tcBorders>
-          <w:right w:val="nil"/>
-        </w:tcBorders>
-      </w:tcPr>
-    </w:tblStylePr>
-  </w:style>
-  <w:style w:customStyle="1" w:styleId="PlainTable51" w:type="table">
-    <w:name w:val="Plain Table 51"/>
-    <w:basedOn w:val="TableNormal"/>
-    <w:uiPriority w:val="45"/>
-    <w:rsid w:val="007B096D"/>
-    <w:tblPr>
-      <w:tblStyleRowBandSize w:val="1"/>
-      <w:tblStyleColBandSize w:val="1"/>
-    </w:tblPr>
-    <w:tblStylePr w:type="firstRow">
-      <w:rPr>
-        <w:rFonts w:asciiTheme="majorHAnsi" w:cstheme="majorBidi" w:eastAsiaTheme="majorEastAsia" w:hAnsiTheme="majorHAnsi"/>
-        <w:i/>
-        <w:iCs/>
-        <w:sz w:val="26"/>
-      </w:rPr>
-      <w:tblPr/>
-      <w:tcPr>
-        <w:tcBorders>
-          <w:bottom w:color="7F7F7F" w:space="0" w:sz="4" w:themeColor="text1" w:themeTint="80" w:val="single"/>
-        </w:tcBorders>
-        <w:shd w:color="auto" w:fill="FFFFFF" w:themeFill="background1" w:val="clear"/>
-      </w:tcPr>
-    </w:tblStylePr>
-    <w:tblStylePr w:type="lastRow">
-      <w:rPr>
-        <w:rFonts w:asciiTheme="majorHAnsi" w:cstheme="majorBidi" w:eastAsiaTheme="majorEastAsia" w:hAnsiTheme="majorHAnsi"/>
-        <w:i/>
-        <w:iCs/>
-        <w:sz w:val="26"/>
-      </w:rPr>
-      <w:tblPr/>
-      <w:tcPr>
-        <w:tcBorders>
-          <w:top w:color="7F7F7F" w:space="0" w:sz="4" w:themeColor="text1" w:themeTint="80" w:val="single"/>
-        </w:tcBorders>
-        <w:shd w:color="auto" w:fill="FFFFFF" w:themeFill="background1" w:val="clear"/>
-      </w:tcPr>
-    </w:tblStylePr>
-    <w:tblStylePr w:type="firstCol">
-      <w:pPr>
-        <w:jc w:val="right"/>
-      </w:pPr>
-      <w:rPr>
-        <w:rFonts w:asciiTheme="majorHAnsi" w:cstheme="majorBidi" w:eastAsiaTheme="majorEastAsia" w:hAnsiTheme="majorHAnsi"/>
-        <w:i/>
-        <w:iCs/>
-        <w:sz w:val="26"/>
-      </w:rPr>
-      <w:tblPr/>
-      <w:tcPr>
-        <w:tcBorders>
-          <w:right w:color="7F7F7F" w:space="0" w:sz="4" w:themeColor="text1" w:themeTint="80" w:val="single"/>
-        </w:tcBorders>
-        <w:shd w:color="auto" w:fill="FFFFFF" w:themeFill="background1" w:val="clear"/>
-      </w:tcPr>
-    </w:tblStylePr>
-    <w:tblStylePr w:type="lastCol">
-      <w:rPr>
-        <w:rFonts w:asciiTheme="majorHAnsi" w:cstheme="majorBidi" w:eastAsiaTheme="majorEastAsia" w:hAnsiTheme="majorHAnsi"/>
-        <w:i/>
-        <w:iCs/>
-        <w:sz w:val="26"/>
-      </w:rPr>
-      <w:tblPr/>
-      <w:tcPr>
-        <w:tcBorders>
-          <w:left w:color="7F7F7F" w:space="0" w:sz="4" w:themeColor="text1" w:themeTint="80" w:val="single"/>
-        </w:tcBorders>
-        <w:shd w:color="auto" w:fill="FFFFFF" w:themeFill="background1" w:val="clear"/>
-      </w:tcPr>
-    </w:tblStylePr>
-    <w:tblStylePr w:type="band1Vert">
-      <w:tblPr/>
-      <w:tcPr>
-        <w:shd w:color="auto" w:fill="F2F2F2" w:themeFill="background1" w:themeFillShade="F2" w:val="clear"/>
-      </w:tcPr>
-    </w:tblStylePr>
-    <w:tblStylePr w:type="band1Horz">
-      <w:tblPr/>
-      <w:tcPr>
-        <w:shd w:color="auto" w:fill="F2F2F2" w:themeFill="background1" w:themeFillShade="F2" w:val="clear"/>
-      </w:tcPr>
-    </w:tblStylePr>
-    <w:tblStylePr w:type="neCell">
-      <w:tblPr/>
-      <w:tcPr>
-        <w:tcBorders>
-          <w:left w:val="nil"/>
-        </w:tcBorders>
-      </w:tcPr>
-    </w:tblStylePr>
-    <w:tblStylePr w:type="nwCell">
-      <w:tblPr/>
-      <w:tcPr>
-        <w:tcBorders>
-          <w:right w:val="nil"/>
-        </w:tcBorders>
-      </w:tcPr>
-    </w:tblStylePr>
-    <w:tblStylePr w:type="seCell">
-      <w:tblPr/>
-      <w:tcPr>
-        <w:tcBorders>
-          <w:left w:val="nil"/>
-        </w:tcBorders>
-      </w:tcPr>
-    </w:tblStylePr>
-    <w:tblStylePr w:type="swCell">
-      <w:tblPr/>
-      <w:tcPr>
-        <w:tcBorders>
-          <w:right w:val="nil"/>
-        </w:tcBorders>
-      </w:tcPr>
-    </w:tblStylePr>
-  </w:style>
-  <w:style w:customStyle="1" w:styleId="PlainTable11" w:type="table">
-    <w:name w:val="Plain Table 11"/>
-    <w:basedOn w:val="TableNormal"/>
-    <w:uiPriority w:val="41"/>
-    <w:rsid w:val="007B096D"/>
-    <w:tblPr>
-      <w:tblStyleRowBandSize w:val="1"/>
-      <w:tblStyleColBandSize w:val="1"/>
-      <w:tblBorders>
-        <w:top w:color="BFBFBF" w:space="0" w:sz="4" w:themeColor="background1" w:themeShade="BF" w:val="single"/>
-        <w:left w:color="BFBFBF" w:space="0" w:sz="4" w:themeColor="background1" w:themeShade="BF" w:val="single"/>
-        <w:bottom w:color="BFBFBF" w:space="0" w:sz="4" w:themeColor="background1" w:themeShade="BF" w:val="single"/>
-        <w:right w:color="BFBFBF" w:space="0" w:sz="4" w:themeColor="background1" w:themeShade="BF" w:val="single"/>
-        <w:insideH w:color="BFBFBF" w:space="0" w:sz="4" w:themeColor="background1" w:themeShade="BF" w:val="single"/>
-        <w:insideV w:color="BFBFBF" w:space="0" w:sz="4" w:themeColor="background1" w:themeShade="BF" w:val="single"/>
-      </w:tblBorders>
-    </w:tblPr>
-    <w:tblStylePr w:type="firstRow">
-      <w:rPr>
-        <w:b/>
-        <w:bCs/>
-      </w:rPr>
-    </w:tblStylePr>
-    <w:tblStylePr w:type="lastRow">
-      <w:rPr>
-        <w:b/>
-        <w:bCs/>
-      </w:rPr>
-      <w:tblPr/>
-      <w:tcPr>
-        <w:tcBorders>
-          <w:top w:color="BFBFBF" w:space="0" w:sz="4" w:themeColor="background1" w:themeShade="BF" w:val="double"/>
-        </w:tcBorders>
-      </w:tcPr>
-    </w:tblStylePr>
-    <w:tblStylePr w:type="firstCol">
-      <w:rPr>
-        <w:b/>
-        <w:bCs/>
-      </w:rPr>
-    </w:tblStylePr>
-    <w:tblStylePr w:type="lastCol">
-      <w:rPr>
-        <w:b/>
-        <w:bCs/>
-      </w:rPr>
-    </w:tblStylePr>
-    <w:tblStylePr w:type="band1Vert">
-      <w:tblPr/>
-      <w:tcPr>
-        <w:shd w:color="auto" w:fill="F2F2F2" w:themeFill="background1" w:themeFillShade="F2" w:val="clear"/>
-      </w:tcPr>
-    </w:tblStylePr>
-    <w:tblStylePr w:type="band1Horz">
-      <w:tblPr/>
-      <w:tcPr>
-        <w:shd w:color="auto" w:fill="F2F2F2" w:themeFill="background1" w:themeFillShade="F2" w:val="clear"/>
-      </w:tcPr>
-    </w:tblStylePr>
-  </w:style>
-  <w:style w:customStyle="1" w:styleId="TableGridLight1" w:type="table">
-    <w:name w:val="Table Grid Light1"/>
-    <w:basedOn w:val="TableNormal"/>
-    <w:uiPriority w:val="40"/>
-    <w:rsid w:val="007B096D"/>
-    <w:tblPr>
-      <w:tblBorders>
-        <w:top w:color="BFBFBF" w:space="0" w:sz="4" w:themeColor="background1" w:themeShade="BF" w:val="single"/>
-        <w:left w:color="BFBFBF" w:space="0" w:sz="4" w:themeColor="background1" w:themeShade="BF" w:val="single"/>
-        <w:bottom w:color="BFBFBF" w:space="0" w:sz="4" w:themeColor="background1" w:themeShade="BF" w:val="single"/>
-        <w:right w:color="BFBFBF" w:space="0" w:sz="4" w:themeColor="background1" w:themeShade="BF" w:val="single"/>
-        <w:insideH w:color="BFBFBF" w:space="0" w:sz="4" w:themeColor="background1" w:themeShade="BF" w:val="single"/>
-        <w:insideV w:color="BFBFBF" w:space="0" w:sz="4" w:themeColor="background1" w:themeShade="BF" w:val="single"/>
-      </w:tblBorders>
-    </w:tblPr>
-  </w:style>
-  <w:style w:customStyle="1" w:styleId="PlainTable41" w:type="table">
-    <w:name w:val="Plain Table 41"/>
-    <w:basedOn w:val="TableNormal"/>
-    <w:uiPriority w:val="44"/>
-    <w:rsid w:val="007B096D"/>
-    <w:tblPr>
-      <w:tblStyleRowBandSize w:val="1"/>
-      <w:tblStyleColBandSize w:val="1"/>
-    </w:tblPr>
-    <w:tblStylePr w:type="firstRow">
-      <w:rPr>
-        <w:b/>
-        <w:bCs/>
-      </w:rPr>
-    </w:tblStylePr>
-    <w:tblStylePr w:type="lastRow">
-      <w:rPr>
-        <w:b/>
-        <w:bCs/>
-      </w:rPr>
-    </w:tblStylePr>
-    <w:tblStylePr w:type="firstCol">
-      <w:rPr>
-        <w:b/>
-        <w:bCs/>
-      </w:rPr>
-    </w:tblStylePr>
-    <w:tblStylePr w:type="lastCol">
-      <w:rPr>
-        <w:b/>
-        <w:bCs/>
-      </w:rPr>
-    </w:tblStylePr>
-    <w:tblStylePr w:type="band1Vert">
-      <w:tblPr/>
-      <w:tcPr>
-        <w:shd w:color="auto" w:fill="F2F2F2" w:themeFill="background1" w:themeFillShade="F2" w:val="clear"/>
-      </w:tcPr>
-    </w:tblStylePr>
-    <w:tblStylePr w:type="band1Horz">
-      <w:tblPr/>
-      <w:tcPr>
-        <w:shd w:color="auto" w:fill="F2F2F2" w:themeFill="background1" w:themeFillShade="F2" w:val="clear"/>
-      </w:tcPr>
-    </w:tblStylePr>
-  </w:style>
-  <w:style w:customStyle="1" w:styleId="GridTable1Light1" w:type="table">
-    <w:name w:val="Grid Table 1 Light1"/>
-    <w:basedOn w:val="TableNormal"/>
-    <w:uiPriority w:val="46"/>
-    <w:rsid w:val="007B096D"/>
-    <w:tblPr>
-      <w:tblStyleRowBandSize w:val="1"/>
-      <w:tblStyleColBandSize w:val="1"/>
-      <w:tblBorders>
-        <w:top w:color="999999" w:space="0" w:sz="4" w:themeColor="text1" w:themeTint="66" w:val="single"/>
-        <w:left w:color="999999" w:space="0" w:sz="4" w:themeColor="text1" w:themeTint="66" w:val="single"/>
-        <w:bottom w:color="999999" w:space="0" w:sz="4" w:themeColor="text1" w:themeTint="66" w:val="single"/>
-        <w:right w:color="999999" w:space="0" w:sz="4" w:themeColor="text1" w:themeTint="66" w:val="single"/>
-        <w:insideH w:color="999999" w:space="0" w:sz="4" w:themeColor="text1" w:themeTint="66" w:val="single"/>
-        <w:insideV w:color="999999" w:space="0" w:sz="4" w:themeColor="text1" w:themeTint="66" w:val="single"/>
-      </w:tblBorders>
-    </w:tblPr>
-    <w:tblStylePr w:type="firstRow">
-      <w:rPr>
-        <w:b/>
-        <w:bCs/>
-      </w:rPr>
-      <w:tblPr/>
-      <w:tcPr>
-        <w:tcBorders>
-          <w:bottom w:color="666666" w:space="0" w:sz="12" w:themeColor="text1" w:themeTint="99" w:val="single"/>
-        </w:tcBorders>
-      </w:tcPr>
-    </w:tblStylePr>
-    <w:tblStylePr w:type="lastRow">
-      <w:rPr>
-        <w:b/>
-        <w:bCs/>
-      </w:rPr>
-      <w:tblPr/>
-      <w:tcPr>
-        <w:tcBorders>
-          <w:top w:color="666666" w:space="0" w:sz="2" w:themeColor="text1" w:themeTint="99" w:val="double"/>
-        </w:tcBorders>
-      </w:tcPr>
-    </w:tblStylePr>
-    <w:tblStylePr w:type="firstCol">
-      <w:rPr>
-        <w:b/>
-        <w:bCs/>
-      </w:rPr>
-    </w:tblStylePr>
-    <w:tblStylePr w:type="lastCol">
-      <w:rPr>
-        <w:b/>
-        <w:bCs/>
-      </w:rPr>
-    </w:tblStylePr>
-  </w:style>
-  <w:style w:customStyle="1" w:styleId="GridTable1Light-Accent21" w:type="table">
-    <w:name w:val="Grid Table 1 Light - Accent 21"/>
-    <w:basedOn w:val="TableNormal"/>
-    <w:uiPriority w:val="46"/>
-    <w:rsid w:val="007B096D"/>
-    <w:tblPr>
-      <w:tblStyleRowBandSize w:val="1"/>
-      <w:tblStyleColBandSize w:val="1"/>
-      <w:tblBorders>
-        <w:top w:color="F7CAAC" w:space="0" w:sz="4" w:themeColor="accent2" w:themeTint="66" w:val="single"/>
-        <w:left w:color="F7CAAC" w:space="0" w:sz="4" w:themeColor="accent2" w:themeTint="66" w:val="single"/>
-        <w:bottom w:color="F7CAAC" w:space="0" w:sz="4" w:themeColor="accent2" w:themeTint="66" w:val="single"/>
-        <w:right w:color="F7CAAC" w:space="0" w:sz="4" w:themeColor="accent2" w:themeTint="66" w:val="single"/>
-        <w:insideH w:color="F7CAAC" w:space="0" w:sz="4" w:themeColor="accent2" w:themeTint="66" w:val="single"/>
-        <w:insideV w:color="F7CAAC" w:space="0" w:sz="4" w:themeColor="accent2" w:themeTint="66" w:val="single"/>
-      </w:tblBorders>
-    </w:tblPr>
-    <w:tblStylePr w:type="firstRow">
-      <w:rPr>
-        <w:b/>
-        <w:bCs/>
-      </w:rPr>
-      <w:tblPr/>
-      <w:tcPr>
-        <w:tcBorders>
-          <w:bottom w:color="F4B083" w:space="0" w:sz="12" w:themeColor="accent2" w:themeTint="99" w:val="single"/>
-        </w:tcBorders>
-      </w:tcPr>
-    </w:tblStylePr>
-    <w:tblStylePr w:type="lastRow">
-      <w:rPr>
-        <w:b/>
-        <w:bCs/>
-      </w:rPr>
-      <w:tblPr/>
-      <w:tcPr>
-        <w:tcBorders>
-          <w:top w:color="F4B083" w:space="0" w:sz="2" w:themeColor="accent2" w:themeTint="99" w:val="double"/>
-        </w:tcBorders>
-      </w:tcPr>
-    </w:tblStylePr>
-    <w:tblStylePr w:type="firstCol">
-      <w:rPr>
-        <w:b/>
-        <w:bCs/>
-      </w:rPr>
-    </w:tblStylePr>
-    <w:tblStylePr w:type="lastCol">
-      <w:rPr>
-        <w:b/>
-        <w:bCs/>
-      </w:rPr>
-    </w:tblStylePr>
-  </w:style>
-  <w:style w:customStyle="1" w:styleId="GridTable2-Accent31" w:type="table">
-    <w:name w:val="Grid Table 2 - Accent 31"/>
-    <w:basedOn w:val="TableNormal"/>
-    <w:uiPriority w:val="47"/>
-    <w:rsid w:val="007B096D"/>
-    <w:tblPr>
-      <w:tblStyleRowBandSize w:val="1"/>
-      <w:tblStyleColBandSize w:val="1"/>
-      <w:tblBorders>
-        <w:top w:color="C9C9C9" w:space="0" w:sz="2" w:themeColor="accent3" w:themeTint="99" w:val="single"/>
-        <w:bottom w:color="C9C9C9" w:space="0" w:sz="2" w:themeColor="accent3" w:themeTint="99" w:val="single"/>
-        <w:insideH w:color="C9C9C9" w:space="0" w:sz="2" w:themeColor="accent3" w:themeTint="99" w:val="single"/>
-        <w:insideV w:color="C9C9C9" w:space="0" w:sz="2" w:themeColor="accent3" w:themeTint="99" w:val="single"/>
-      </w:tblBorders>
-    </w:tblPr>
-    <w:tblStylePr w:type="firstRow">
-      <w:rPr>
-        <w:b/>
-        <w:bCs/>
-      </w:rPr>
-      <w:tblPr/>
-      <w:tcPr>
-        <w:tcBorders>
-          <w:top w:val="nil"/>
-          <w:bottom w:color="C9C9C9" w:space="0" w:sz="12" w:themeColor="accent3" w:themeTint="99" w:val="single"/>
-          <w:insideH w:val="nil"/>
-          <w:insideV w:val="nil"/>
-        </w:tcBorders>
-        <w:shd w:color="auto" w:fill="FFFFFF" w:themeFill="background1" w:val="clear"/>
-      </w:tcPr>
-    </w:tblStylePr>
-    <w:tblStylePr w:type="lastRow">
-      <w:rPr>
-        <w:b/>
-        <w:bCs/>
-      </w:rPr>
-      <w:tblPr/>
-      <w:tcPr>
-        <w:tcBorders>
-          <w:top w:color="C9C9C9" w:space="0" w:sz="2" w:themeColor="accent3" w:themeTint="99" w:val="double"/>
-          <w:bottom w:val="nil"/>
-          <w:insideH w:val="nil"/>
-          <w:insideV w:val="nil"/>
-        </w:tcBorders>
-        <w:shd w:color="auto" w:fill="FFFFFF" w:themeFill="background1" w:val="clear"/>
-      </w:tcPr>
-    </w:tblStylePr>
-    <w:tblStylePr w:type="firstCol">
-      <w:rPr>
-        <w:b/>
-        <w:bCs/>
-      </w:rPr>
-    </w:tblStylePr>
-    <w:tblStylePr w:type="lastCol">
-      <w:rPr>
-        <w:b/>
-        <w:bCs/>
-      </w:rPr>
-    </w:tblStylePr>
-    <w:tblStylePr w:type="band1Vert">
-      <w:tblPr/>
-      <w:tcPr>
-        <w:shd w:color="auto" w:fill="EDEDED" w:themeFill="accent3" w:themeFillTint="33" w:val="clear"/>
-      </w:tcPr>
-    </w:tblStylePr>
-    <w:tblStylePr w:type="band1Horz">
-      <w:tblPr/>
-      <w:tcPr>
-        <w:shd w:color="auto" w:fill="EDEDED" w:themeFill="accent3" w:themeFillTint="33" w:val="clear"/>
-      </w:tcPr>
-    </w:tblStylePr>
-  </w:style>
-  <w:style w:customStyle="1" w:styleId="GridTable21" w:type="table">
-    <w:name w:val="Grid Table 21"/>
-    <w:basedOn w:val="TableNormal"/>
-    <w:uiPriority w:val="47"/>
-    <w:rsid w:val="007B096D"/>
-    <w:tblPr>
-      <w:tblStyleRowBandSize w:val="1"/>
-      <w:tblStyleColBandSize w:val="1"/>
-      <w:tblBorders>
-        <w:top w:color="666666" w:space="0" w:sz="2" w:themeColor="text1" w:themeTint="99" w:val="single"/>
-        <w:bottom w:color="666666" w:space="0" w:sz="2" w:themeColor="text1" w:themeTint="99" w:val="single"/>
-        <w:insideH w:color="666666" w:space="0" w:sz="2" w:themeColor="text1" w:themeTint="99" w:val="single"/>
-        <w:insideV w:color="666666" w:space="0" w:sz="2" w:themeColor="text1" w:themeTint="99" w:val="single"/>
-      </w:tblBorders>
-    </w:tblPr>
-    <w:tblStylePr w:type="firstRow">
-      <w:rPr>
-        <w:b/>
-        <w:bCs/>
-      </w:rPr>
-      <w:tblPr/>
-      <w:tcPr>
-        <w:tcBorders>
-          <w:top w:val="nil"/>
-          <w:bottom w:color="666666" w:space="0" w:sz="12" w:themeColor="text1" w:themeTint="99" w:val="single"/>
-          <w:insideH w:val="nil"/>
-          <w:insideV w:val="nil"/>
-        </w:tcBorders>
-        <w:shd w:color="auto" w:fill="FFFFFF" w:themeFill="background1" w:val="clear"/>
-      </w:tcPr>
-    </w:tblStylePr>
-    <w:tblStylePr w:type="lastRow">
-      <w:rPr>
-        <w:b/>
-        <w:bCs/>
-      </w:rPr>
-      <w:tblPr/>
-      <w:tcPr>
-        <w:tcBorders>
-          <w:top w:color="666666" w:space="0" w:sz="2" w:themeColor="text1" w:themeTint="99" w:val="double"/>
-          <w:bottom w:val="nil"/>
-          <w:insideH w:val="nil"/>
-          <w:insideV w:val="nil"/>
-        </w:tcBorders>
-        <w:shd w:color="auto" w:fill="FFFFFF" w:themeFill="background1" w:val="clear"/>
-      </w:tcPr>
-    </w:tblStylePr>
-    <w:tblStylePr w:type="firstCol">
-      <w:rPr>
-        <w:b/>
-        <w:bCs/>
-      </w:rPr>
-    </w:tblStylePr>
-    <w:tblStylePr w:type="lastCol">
-      <w:rPr>
-        <w:b/>
-        <w:bCs/>
-      </w:rPr>
-    </w:tblStylePr>
-    <w:tblStylePr w:type="band1Vert">
-      <w:tblPr/>
-      <w:tcPr>
-        <w:shd w:color="auto" w:fill="CCCCCC" w:themeFill="text1" w:themeFillTint="33" w:val="clear"/>
-      </w:tcPr>
-    </w:tblStylePr>
-    <w:tblStylePr w:type="band1Horz">
-      <w:tblPr/>
-      <w:tcPr>
-        <w:shd w:color="auto" w:fill="CCCCCC" w:themeFill="text1" w:themeFillTint="33" w:val="clear"/>
-      </w:tcPr>
-    </w:tblStylePr>
-  </w:style>
-  <w:style w:customStyle="1" w:styleId="PlainTable21" w:type="table">
-    <w:name w:val="Plain Table 21"/>
-    <w:basedOn w:val="TableNormal"/>
-    <w:uiPriority w:val="42"/>
-    <w:rsid w:val="007B096D"/>
-    <w:tblPr>
-      <w:tblStyleRowBandSize w:val="1"/>
-      <w:tblStyleColBandSize w:val="1"/>
-      <w:tblBorders>
-        <w:top w:color="7F7F7F" w:space="0" w:sz="4" w:themeColor="text1" w:themeTint="80" w:val="single"/>
-        <w:bottom w:color="7F7F7F" w:space="0" w:sz="4" w:themeColor="text1" w:themeTint="80" w:val="single"/>
-      </w:tblBorders>
-    </w:tblPr>
-    <w:tblStylePr w:type="firstRow">
-      <w:rPr>
-        <w:b/>
-        <w:bCs/>
-      </w:rPr>
-      <w:tblPr/>
-      <w:tcPr>
-        <w:tcBorders>
-          <w:bottom w:color="7F7F7F" w:space="0" w:sz="4" w:themeColor="text1" w:themeTint="80" w:val="single"/>
-        </w:tcBorders>
-      </w:tcPr>
-    </w:tblStylePr>
-    <w:tblStylePr w:type="lastRow">
-      <w:rPr>
-        <w:b/>
-        <w:bCs/>
-      </w:rPr>
-      <w:tblPr/>
-      <w:tcPr>
-        <w:tcBorders>
-          <w:top w:color="7F7F7F" w:space="0" w:sz="4" w:themeColor="text1" w:themeTint="80" w:val="single"/>
-        </w:tcBorders>
-      </w:tcPr>
-    </w:tblStylePr>
-    <w:tblStylePr w:type="firstCol">
-      <w:rPr>
-        <w:b/>
-        <w:bCs/>
-      </w:rPr>
-    </w:tblStylePr>
-    <w:tblStylePr w:type="lastCol">
-      <w:rPr>
-        <w:b/>
-        <w:bCs/>
-      </w:rPr>
-    </w:tblStylePr>
-    <w:tblStylePr w:type="band1Vert">
-      <w:tblPr/>
-      <w:tcPr>
-        <w:tcBorders>
-          <w:left w:color="7F7F7F" w:space="0" w:sz="4" w:themeColor="text1" w:themeTint="80" w:val="single"/>
-          <w:right w:color="7F7F7F" w:space="0" w:sz="4" w:themeColor="text1" w:themeTint="80" w:val="single"/>
-        </w:tcBorders>
-      </w:tcPr>
-    </w:tblStylePr>
-    <w:tblStylePr w:type="band2Vert">
-      <w:tblPr/>
-      <w:tcPr>
-        <w:tcBorders>
-          <w:left w:color="7F7F7F" w:space="0" w:sz="4" w:themeColor="text1" w:themeTint="80" w:val="single"/>
-          <w:right w:color="7F7F7F" w:space="0" w:sz="4" w:themeColor="text1" w:themeTint="80" w:val="single"/>
-        </w:tcBorders>
-      </w:tcPr>
-    </w:tblStylePr>
-    <w:tblStylePr w:type="band1Horz">
-      <w:tblPr/>
-      <w:tcPr>
-        <w:tcBorders>
-          <w:top w:color="7F7F7F" w:space="0" w:sz="4" w:themeColor="text1" w:themeTint="80" w:val="single"/>
-          <w:bottom w:color="7F7F7F" w:space="0" w:sz="4" w:themeColor="text1" w:themeTint="80" w:val="single"/>
-        </w:tcBorders>
-      </w:tcPr>
-    </w:tblStylePr>
-  </w:style>
-  <w:style w:customStyle="1" w:styleId="Heading2Char" w:type="character">
-    <w:name w:val="Heading 2 Char"/>
-    <w:basedOn w:val="DefaultParagraphFont"/>
-    <w:link w:val="Heading2"/>
-    <w:uiPriority w:val="9"/>
-    <w:rsid w:val="00747C69"/>
-    <w:rPr>
       <w:rFonts w:asciiTheme="majorHAnsi" w:cstheme="majorBidi" w:eastAsiaTheme="majorEastAsia" w:hAnsiTheme="majorHAnsi"/>
-      <w:color w:themeColor="accent1" w:themeShade="BF" w:val="2F5496"/>
-      <w:sz w:val="26"/>
-      <w:szCs w:val="26"/>
-    </w:rPr>
-  </w:style>
-  <w:style w:styleId="BalloonText" w:type="paragraph">
-    <w:name w:val="Balloon Text"/>
-    <w:basedOn w:val="Normal"/>
-    <w:link w:val="BalloonTextChar"/>
-    <w:uiPriority w:val="99"/>
-    <w:semiHidden/>
-    <w:unhideWhenUsed/>
-    <w:rsid w:val="004B0258"/>
-    <w:rPr>
-      <w:rFonts w:ascii="Tahoma" w:cs="Tahoma" w:hAnsi="Tahoma"/>
-      <w:sz w:val="16"/>
-      <w:szCs w:val="16"/>
-    </w:rPr>
-  </w:style>
-  <w:style w:customStyle="1" w:styleId="BalloonTextChar" w:type="character">
-    <w:name w:val="Balloon Text Char"/>
-    <w:basedOn w:val="DefaultParagraphFont"/>
-    <w:link w:val="BalloonText"/>
-    <w:uiPriority w:val="99"/>
-    <w:semiHidden/>
-    <w:rsid w:val="004B0258"/>
-    <w:rPr>
-      <w:rFonts w:ascii="Tahoma" w:cs="Tahoma" w:hAnsi="Tahoma"/>
-      <w:sz w:val="16"/>
-      <w:szCs w:val="16"/>
-    </w:rPr>
-  </w:style>
-  <w:style w:customStyle="1" w:styleId="Heading3Char" w:type="character">
-    <w:name w:val="Heading 3 Char"/>
-    <w:basedOn w:val="DefaultParagraphFont"/>
-    <w:link w:val="Heading3"/>
-    <w:uiPriority w:val="9"/>
-    <w:semiHidden/>
-    <w:rsid w:val="002773DF"/>
-    <w:rPr>
-      <w:rFonts w:asciiTheme="majorHAnsi" w:cstheme="majorBidi" w:eastAsiaTheme="majorEastAsia" w:hAnsiTheme="majorHAnsi"/>
-      <w:color w:themeColor="accent1" w:themeShade="7F" w:val="1F3763"/>
+      <w:b w:val="0"/>
+      <w:bCs w:val="0"/>
+      <w:color w:themeColor="accent1" w:themeShade="BF" w:val="365F91"/>
     </w:rPr>
   </w:style>
   <w:style w:type="paragraph" w:customStyle="1" w:styleId="SourceCode">
@@ -6576,44 +4373,44 @@
         <a:sysClr val="window" lastClr="FFFFFF"/>
       </a:lt1>
       <a:dk2>
-        <a:srgbClr val="44546A"/>
+        <a:srgbClr val="0E2841"/>
       </a:dk2>
       <a:lt2>
-        <a:srgbClr val="E7E6E6"/>
+        <a:srgbClr val="E8E8E8"/>
       </a:lt2>
       <a:accent1>
-        <a:srgbClr val="4472C4"/>
+        <a:srgbClr val="156082"/>
       </a:accent1>
       <a:accent2>
-        <a:srgbClr val="ED7D31"/>
+        <a:srgbClr val="E97132"/>
       </a:accent2>
       <a:accent3>
-        <a:srgbClr val="A5A5A5"/>
+        <a:srgbClr val="196B24"/>
       </a:accent3>
       <a:accent4>
-        <a:srgbClr val="FFC000"/>
+        <a:srgbClr val="0F9ED5"/>
       </a:accent4>
       <a:accent5>
-        <a:srgbClr val="5B9BD5"/>
+        <a:srgbClr val="A02B93"/>
       </a:accent5>
       <a:accent6>
-        <a:srgbClr val="70AD47"/>
+        <a:srgbClr val="4EA72E"/>
       </a:accent6>
       <a:hlink>
-        <a:srgbClr val="0563C1"/>
+        <a:srgbClr val="467886"/>
       </a:hlink>
       <a:folHlink>
-        <a:srgbClr val="954F72"/>
+        <a:srgbClr val="96607D"/>
       </a:folHlink>
     </a:clrScheme>
     <a:fontScheme name="Office">
       <a:majorFont>
-        <a:latin typeface="Calibri Light"/>
+        <a:latin typeface="Aptos Display" panose="02110004020202020204"/>
         <a:ea typeface=""/>
         <a:cs typeface=""/>
-        <a:font script="Jpan" typeface="Yu Gothic Light"/>
+        <a:font script="Jpan" typeface="游ゴシック Light"/>
         <a:font script="Hang" typeface="맑은 고딕"/>
-        <a:font script="Hans" typeface="DengXian Light"/>
+        <a:font script="Hans" typeface="等线 Light"/>
         <a:font script="Hant" typeface="新細明體"/>
         <a:font script="Arab" typeface="Times New Roman"/>
         <a:font script="Hebr" typeface="Times New Roman"/>
@@ -6641,14 +4438,31 @@
         <a:font script="Viet" typeface="Times New Roman"/>
         <a:font script="Uigh" typeface="Microsoft Uighur"/>
         <a:font script="Geor" typeface="Sylfaen"/>
+        <a:font script="Armn" typeface="Arial"/>
+        <a:font script="Bugi" typeface="Leelawadee UI"/>
+        <a:font script="Bopo" typeface="Microsoft JhengHei"/>
+        <a:font script="Java" typeface="Javanese Text"/>
+        <a:font script="Lisu" typeface="Segoe UI"/>
+        <a:font script="Mymr" typeface="Myanmar Text"/>
+        <a:font script="Nkoo" typeface="Ebrima"/>
+        <a:font script="Olck" typeface="Nirmala UI"/>
+        <a:font script="Osma" typeface="Ebrima"/>
+        <a:font script="Phag" typeface="Phagspa"/>
+        <a:font script="Syrn" typeface="Estrangelo Edessa"/>
+        <a:font script="Syrj" typeface="Estrangelo Edessa"/>
+        <a:font script="Syre" typeface="Estrangelo Edessa"/>
+        <a:font script="Sora" typeface="Nirmala UI"/>
+        <a:font script="Tale" typeface="Microsoft Tai Le"/>
+        <a:font script="Talu" typeface="Microsoft New Tai Lue"/>
+        <a:font script="Tfng" typeface="Ebrima"/>
       </a:majorFont>
       <a:minorFont>
-        <a:latin typeface="Calibri"/>
+        <a:latin typeface="Aptos" panose="02110004020202020204"/>
         <a:ea typeface=""/>
         <a:cs typeface=""/>
-        <a:font script="Jpan" typeface="Yu Mincho"/>
+        <a:font script="Jpan" typeface="游明朝"/>
         <a:font script="Hang" typeface="맑은 고딕"/>
-        <a:font script="Hans" typeface="DengXian"/>
+        <a:font script="Hans" typeface="等线"/>
         <a:font script="Hant" typeface="新細明體"/>
         <a:font script="Arab" typeface="Arial"/>
         <a:font script="Hebr" typeface="Arial"/>
@@ -6676,6 +4490,23 @@
         <a:font script="Viet" typeface="Arial"/>
         <a:font script="Uigh" typeface="Microsoft Uighur"/>
         <a:font script="Geor" typeface="Sylfaen"/>
+        <a:font script="Armn" typeface="Arial"/>
+        <a:font script="Bugi" typeface="Leelawadee UI"/>
+        <a:font script="Bopo" typeface="Microsoft JhengHei"/>
+        <a:font script="Java" typeface="Javanese Text"/>
+        <a:font script="Lisu" typeface="Segoe UI"/>
+        <a:font script="Mymr" typeface="Myanmar Text"/>
+        <a:font script="Nkoo" typeface="Ebrima"/>
+        <a:font script="Olck" typeface="Nirmala UI"/>
+        <a:font script="Osma" typeface="Ebrima"/>
+        <a:font script="Phag" typeface="Phagspa"/>
+        <a:font script="Syrn" typeface="Estrangelo Edessa"/>
+        <a:font script="Syrj" typeface="Estrangelo Edessa"/>
+        <a:font script="Syre" typeface="Estrangelo Edessa"/>
+        <a:font script="Sora" typeface="Nirmala UI"/>
+        <a:font script="Tale" typeface="Microsoft Tai Le"/>
+        <a:font script="Talu" typeface="Microsoft New Tai Lue"/>
+        <a:font script="Tfng" typeface="Ebrima"/>
       </a:minorFont>
     </a:fontScheme>
     <a:fmtScheme name="Office">
@@ -6820,7 +4651,7 @@
   <a:extraClrSchemeLst/>
   <a:extLst>
     <a:ext uri="{05A4C25C-085E-4340-85A3-A5531E510DB2}">
-      <thm15:themeFamily xmlns:thm15="http://schemas.microsoft.com/office/thememl/2012/main" name="Office Theme" id="{62F939B6-93AF-4DB8-9C6B-D6C7DFDC589F}" vid="{4A3C46E8-61CC-4603-A589-7422A47A8E4A}"/>
+      <thm15:themeFamily xmlns:thm15="http://schemas.microsoft.com/office/thememl/2012/main" name="Office Theme" id="{2E142A2C-CD16-42D6-873A-C26D2A0506FA}" vid="{1BDDFF52-6CD6-40A5-AB3C-68EB2F1E4D0A}"/>
     </a:ext>
   </a:extLst>
 </a:theme>

</xml_diff>

<commit_message>
adding proposal text p8
</commit_message>
<xml_diff>
--- a/document/proposal.docx
+++ b/document/proposal.docx
@@ -31,7 +31,7 @@
         <w:pStyle w:val="Date"/>
       </w:pPr>
       <w:r>
-        <w:t xml:space="preserve">30 September 2026. Word count: XXX</w:t>
+        <w:t xml:space="preserve">30 September 2026. Word count: 2414</w:t>
       </w:r>
     </w:p>
     <w:p>
@@ -47,7 +47,7 @@
         <w:pStyle w:val="Abstract"/>
       </w:pPr>
       <w:r>
-        <w:t xml:space="preserve">xxx to populate xxx</w:t>
+        <w:t xml:space="preserve">The modelling of high‑dimensional joint dependence among financial risk factors remains a significant major challenge for the financial industry. Classical statistical approaches, notably Gaussian copulas, fail to capture tail dependence adequately, leading to systematic under‑estimation of extreme portfolio losses. This MSc project aims to develop a scalable algorithm for calibrating high‑dimensional copulas that exhibit non‑Gaussian tail dependence while preserving observed marginal and correlation structures. The methodology combines semi‑analytical techniques with modern machine‑learning models to generate realistic joint‑distribution scenarios for up to several hundred risk factors. A proof‑of‑concept Python software implementation will be built to (i) retrieve and cache market data via the Yahoo API, (ii) compute portfolio Value‑at‑Risk (VaR)) using both historical and Monte‑Carlo simulations, and (iii) integrate the calibrated copulas as modular components within the Monte‑Carlo engine. Empirical experiments will assess the impact of copula selection on VaR/ES estimates across a range of selected portfolios, followed by an optimisation routine to fit copula parameters to observed data. Finally, a deep‑neural‑network (MLP) will be trained to learn the calibrated parameters directly from the data, and a testing suite will verify adherence to prescribed dependence and tail criteria. The expected contributions are threefold: (1) a novel high‑dimensional copula calibration framework capable of reproducing empirical tail dependence, (2) a software prototype for market‑data acquisition, risk‑metric computation, and scenario generation, and (3) an empirical evaluation of how alternative copula assumptions affect risk‑measure outcomes, thereby offering a more robust toolset for stress‑testing and capital‑planning in high‑dimensional settings.</w:t>
       </w:r>
     </w:p>
     <w:sdt>
@@ -98,7 +98,7 @@
         <w:pStyle w:val="BodyText"/>
       </w:pPr>
       <w:r>
-        <w:t xml:space="preserve">This academic proposal proceeds by outlining its primary goals and objectives. Subsequently, it explains the problem under investigation, along with pertinent work that provides essential concepts and a literature review. The subsequent sections detail the methodology and techniques employed to achieve the previously outlined objectives. The proposal concludes in a development plan for the project.</w:t>
+        <w:t xml:space="preserve">This MSc proposal proceeds by outlining its primary goals and objectives. Subsequently, it explains the problem under investigation, along with pertinent work that provides essential concepts and a literature review. The subsequent sections detail the methodology and techniques employed to achieve the previously outlined objectives. The proposal concludes in a development plan for the project.</w:t>
       </w:r>
     </w:p>
     <w:bookmarkEnd w:id="9"/>
@@ -124,7 +124,7 @@
         <w:pStyle w:val="BodyText"/>
       </w:pPr>
       <w:r>
-        <w:t xml:space="preserve">To illustrate and test the results project will also require to develop a software application designed for extracting and caching market data, with subsequent incorporation of calculations of portfolio Value-at-Risk (VaR) and/or Expected Shortfall (ES) measures. To achieve this, implement Monte Carlo simulations using various copulas within the application, in addition to providing support for pure the historical calculation methods.</w:t>
+        <w:t xml:space="preserve">To illustrate and test the results project will also require to develop a software application designed for extracting and caching market data, with subsequent incorporation of calculations of portfolio Value-at-Risk (VaR) and/or Expected Shortfall (ES) measures. To achieve this, implement Monte Carlo simulations using various copulas within the application, in addition to providing support for the pure historical calculation methods (which can serve as a benchmark).</w:t>
       </w:r>
     </w:p>
     <w:p>
@@ -136,7 +136,7 @@
       </w:r>
     </w:p>
     <w:bookmarkEnd w:id="10"/>
-    <w:bookmarkStart w:id="20" w:name="X32b9430d5d15411fac62685483839fe9d87a9a8"/>
+    <w:bookmarkStart w:id="19" w:name="X32b9430d5d15411fac62685483839fe9d87a9a8"/>
     <w:p>
       <w:pPr>
         <w:pStyle w:val="Heading1"/>
@@ -145,7 +145,7 @@
         <w:t xml:space="preserve">Description of the problem and relevant work</w:t>
       </w:r>
     </w:p>
-    <w:bookmarkStart w:id="18" w:name="key-concepts"/>
+    <w:bookmarkStart w:id="17" w:name="key-concepts"/>
     <w:p>
       <w:pPr>
         <w:pStyle w:val="Heading2"/>
@@ -564,7 +564,7 @@
         <w:pStyle w:val="FirstParagraph"/>
       </w:pPr>
       <w:r>
-        <w:t xml:space="preserve">When assessing Historical Value-at-Risk (HVaR), several inherent limitations are apparent, particularly when applied to high-percentile risk measures i.e. its inability to estimate extreme percentiles beyond the 99% threshold, as the method relies solely on observed historical data, which often lacks sufficient extreme observations to produce stable tail estimates (e.g. 1 year of data means approx. 250 observations, so the worst one would correspond to 99.6 % and hence being quite unstable). While HVaR does allow for filtration techniques to refine marginal distributions, this flexibility does not extend to the dependence structure, meaning it cannot effectively separate the modelling of marginals from the copula that links them. As a result, the approach struggles to capture complex joint behaviors in a structured way. Another related critical drawback is the high numerical error associated with HVaR, stemming from the finite and often sparse nature of historical data, especially in the tails. On the other hand, the relative strength of the method is its low model error, since it does not impose strong parametric assumptions but instead directly uses empirical distributions. This makes it robust in scenarios where the true data-generating process is unknown, though at the cost of precision in extreme quantiles.</w:t>
+        <w:t xml:space="preserve">When assessing Historical Value-at-Risk (HVaR), several inherent limitations are apparent, particularly when applied to high-percentile risk measures i.e. its inability to estimate extreme percentiles beyond the 99% threshold, as the method relies solely on observed historical data, which often lacks sufficient extreme observations to produce stable tail estimates (e.g. 1 year of data means approx. 250 observations, so the worst one would correspond to 99.6 % and hence being quite unstable). While HVaR does allow for filtration techniques to refine marginal distributions, this flexibility does not extend to the dependence structure, meaning it cannot effectively separate the modelling of marginals from the copula that links them. As a result, the approach struggles to capture complex joint behaviors in a structured way. Another related critical drawback is the high numerical error associated with HVaR, stemming from the finite and often sparse nature of historical data, especially in the tails. On the other hand, the relative strength of the method is its low model error, since it does not impose strong parametric assumptions but instead directly uses empirical distributions. This makes it robust in scenarios where the true data-generating process is unknown (and a good benchmark), though at the cost of precision in extreme quantiles.</w:t>
       </w:r>
     </w:p>
     <w:p>
@@ -584,7 +584,7 @@
       </w:r>
     </w:p>
     <w:bookmarkEnd w:id="11"/>
-    <w:bookmarkStart w:id="13" w:name="copulas."/>
+    <w:bookmarkStart w:id="12" w:name="copulas."/>
     <w:p>
       <w:pPr>
         <w:pStyle w:val="Heading3"/>
@@ -1146,12 +1146,17 @@
       <w:r>
         <w:t xml:space="preserve">, as:</w:t>
       </w:r>
+      <w:r>
+        <w:t xml:space="preserve"> </w:t>
+      </w:r>
+      <w:r>
+        <w:t xml:space="preserve">[</w:t>
+      </w:r>
     </w:p>
     <w:p>
       <w:pPr>
         <w:pStyle w:val="BodyText"/>
       </w:pPr>
-      <w:bookmarkStart w:id="12" w:name="eq1"/>
       <m:oMathPara>
         <m:oMathParaPr>
           <m:jc m:val="center"/>
@@ -1349,46 +1354,20 @@
             </m:rPr>
             <m:t>)</m:t>
           </m:r>
-          <m:r>
-            <m:t> </m:t>
-          </m:r>
-          <m:r>
-            <m:t> </m:t>
-          </m:r>
-          <m:r>
-            <m:t> </m:t>
-          </m:r>
-          <m:r>
-            <m:t> </m:t>
-          </m:r>
-          <m:r>
-            <m:rPr>
-              <m:sty m:val="p"/>
-            </m:rPr>
-            <m:t>(</m:t>
-          </m:r>
-          <m:r>
-            <m:t>E</m:t>
-          </m:r>
-          <m:r>
-            <m:t>q</m:t>
-          </m:r>
-          <m:r>
-            <m:t>.1</m:t>
-          </m:r>
-          <m:r>
-            <m:rPr>
-              <m:sty m:val="p"/>
-            </m:rPr>
-            <m:t>)</m:t>
-          </m:r>
         </m:oMath>
       </m:oMathPara>
-      <w:bookmarkEnd w:id="12"/>
     </w:p>
     <w:p>
       <w:pPr>
         <w:pStyle w:val="FirstParagraph"/>
+      </w:pPr>
+      <w:r>
+        <w:t xml:space="preserve">]</w:t>
+      </w:r>
+    </w:p>
+    <w:p>
+      <w:pPr>
+        <w:pStyle w:val="BodyText"/>
       </w:pPr>
       <w:r>
         <w:t xml:space="preserve">For more details on copula and their applications in finance please see</w:t>
@@ -1663,8 +1642,8 @@
         <w:t xml:space="preserve">.</w:t>
       </w:r>
     </w:p>
-    <w:bookmarkEnd w:id="13"/>
-    <w:bookmarkStart w:id="17" w:name="copulas-in-value-at-risk"/>
+    <w:bookmarkEnd w:id="12"/>
+    <w:bookmarkStart w:id="16" w:name="copulas-in-value-at-risk"/>
     <w:p>
       <w:pPr>
         <w:pStyle w:val="Heading3"/>
@@ -1678,7 +1657,7 @@
         <w:pStyle w:val="FirstParagraph"/>
       </w:pPr>
       <w:r>
-        <w:t xml:space="preserve">The selection of a copula has a profound influence on the assessment of tail‑risk measures such as Value‑at‑Risk (VaR) / Expected Shortfall (ES). This influence becomes increasingly pronounced as we move to more extreme quantiles (e.g. 99 % and 99.9 % VaR). The principal limitation of the Gaussian copula lies in its asymptotic independence: as one approach the far ends of the distribution, the probability that two (or more) variables exceed a high threshold simultaneously tends to zero at the same rate as if the variables were independent. Consequently, the Gaussian copula systematically under‑estimates the likelihood of joint extreme events and, therefore, under‑states tail‑risk metrics.</w:t>
+        <w:t xml:space="preserve">The selection of a copula has a significant influence on the assessment of tail‑risk measures such as Value‑at‑Risk (VaR) / Expected Shortfall (ES). This influence becomes increasingly pronounced as we move to more extreme quantiles (e.g. 99 % and 99.9 % VaR). The principal limitation of the Gaussian copula lies in its asymptotic independence: as one approach the far ends of the distribution, the probability that two (or more) variables exceed a high threshold simultaneously tends to zero at the same rate as if the variables were independent. Consequently, the Gaussian copula systematically under‑estimates the likelihood of joint extreme events and, therefore, under‑states tail‑risk metrics.</w:t>
       </w:r>
     </w:p>
     <w:p>
@@ -2186,7 +2165,7 @@
         <w:pStyle w:val="BodyText"/>
       </w:pPr>
       <w:r>
-        <w:t xml:space="preserve">Figures below compare historically observed tail dependence (the orange line) with the one of Gaussian and Cauchy copulas i.e. Student-T with zero degrees of freedom (the blue and green lines respectively). The vertical axis measures tail dependence, while the horizontal axis displays the chosen percentile. As the graphs reveal, the discrepancy between the observed and Gaussian tail dependence expands significantly.</w:t>
+        <w:t xml:space="preserve">Figures below compare historically observed tail dependence (the orange line) with the one of Gaussian and Cauchy copulas i.e. Student-T with zero degrees of freedom (the blue and green lines respectively). The vertical axis measures tail dependence, while the horizontal axis displays the chosen percentile. As the graphs reveal, the discrepancy between the observed and Gaussian tail dependence expands significantly when more risk factors considered together.</w:t>
       </w:r>
     </w:p>
     <w:p>
@@ -2198,18 +2177,18 @@
           <wp:inline>
             <wp:extent cx="5334000" cy="2156297"/>
             <wp:effectExtent b="0" l="0" r="0" t="0"/>
-            <wp:docPr descr="Figure 1: Tail dependence for different types of copulas and different number of random variables" title="" id="15" name="Picture"/>
+            <wp:docPr descr="Figure 1: Tail dependence for different types of copulas and different number of random variables" title="" id="14" name="Picture"/>
             <a:graphic>
               <a:graphicData uri="http://schemas.openxmlformats.org/drawingml/2006/picture">
                 <pic:pic>
                   <pic:nvPicPr>
-                    <pic:cNvPr descr="figures\Tail_dependance.png" id="16" name="Picture"/>
+                    <pic:cNvPr descr="figures\Tail_dependance.png" id="15" name="Picture"/>
                     <pic:cNvPicPr>
                       <a:picLocks noChangeArrowheads="1" noChangeAspect="1"/>
                     </pic:cNvPicPr>
                   </pic:nvPicPr>
                   <pic:blipFill>
-                    <a:blip r:embed="rId14"/>
+                    <a:blip r:embed="rId13"/>
                     <a:stretch>
                       <a:fillRect/>
                     </a:stretch>
@@ -2249,7 +2228,7 @@
         <w:pStyle w:val="BodyText"/>
       </w:pPr>
       <w:r>
-        <w:t xml:space="preserve">The Cauchy copula (equivalently a Student‑t copula with zero degrees of freedom) is a statistical technique for capturing dependence structures, especially when modelling tail‑risk or extreme events. Its principal advantage lies in preserving the overall correlation matrix of the underlying variables while simultaneously enabling the generation of scenarios that exhibit much heavier tails (joint‑movement) and de-correlation. In practice, this means that the copula retains the familiar linear dependence captured by pearson‑type correlations, yet it can produce joint realizations that reflect the heightened co‑movement observed during rare, high‑impact shocks.</w:t>
+        <w:t xml:space="preserve">The Cauchy copula is a statistical technique for capturing dependence structures, especially when modelling tail‑risk or extreme events. Its principal advantage lies in preserving the overall correlation matrix of the underlying variables while simultaneously enabling the generation of scenarios that exhibit much heavier tails (joint‑movement) and de-correlation. In practice, this means that the copula retains the familiar linear dependence captured by pearson‑type correlations, yet it can produce joint realizations that reflect the heightened co‑movement observed during rare, high‑impact shocks.</w:t>
       </w:r>
     </w:p>
     <w:p>
@@ -2276,15 +2255,116 @@
         <w:t xml:space="preserve">Both types of scenarios are crucial for robust risk assessment. De‑correlation highlights the risk of assets that are supposed to hedge each other stop doing so, while joint‑movement emphasizes the danger of hidden tail‑dependence that can generate simultaneous losses across seemingly unrelated positions. Modelling frameworks that can generate both behaviors, provide a more realistic picture of potential extreme outcomes than approaches that rely solely on historic linear correlations.</w:t>
       </w:r>
     </w:p>
+    <w:bookmarkEnd w:id="16"/>
     <w:bookmarkEnd w:id="17"/>
+    <w:bookmarkStart w:id="18" w:name="literature-review"/>
+    <w:p>
+      <w:pPr>
+        <w:pStyle w:val="Heading2"/>
+      </w:pPr>
+      <w:r>
+        <w:t xml:space="preserve">Literature review</w:t>
+      </w:r>
+    </w:p>
+    <w:p>
+      <w:pPr>
+        <w:pStyle w:val="FirstParagraph"/>
+      </w:pPr>
+      <w:r>
+        <w:t xml:space="preserve">The rapid advancement of generative machine learning techniques has generated significant interest within the financial industry, as evidenced by numerous studies (e.g., see</w:t>
+      </w:r>
+      <w:r>
+        <w:t xml:space="preserve"> </w:t>
+      </w:r>
+      <w:hyperlink w:anchor="references">
+        <w:r>
+          <w:rPr>
+            <w:rStyle w:val="Hyperlink"/>
+          </w:rPr>
+          <w:t xml:space="preserve">[8]</w:t>
+        </w:r>
+      </w:hyperlink>
+      <w:r>
+        <w:t xml:space="preserve"> </w:t>
+      </w:r>
+      <w:r>
+        <w:t xml:space="preserve">for a review). However, much of the existing research has primarily focused on generating paths for either a single asset or a limited number of risk factors (as discussed in</w:t>
+      </w:r>
+      <w:r>
+        <w:t xml:space="preserve"> </w:t>
+      </w:r>
+      <w:hyperlink w:anchor="references">
+        <w:r>
+          <w:rPr>
+            <w:rStyle w:val="Hyperlink"/>
+          </w:rPr>
+          <w:t xml:space="preserve">[7]</w:t>
+        </w:r>
+      </w:hyperlink>
+      <w:r>
+        <w:t xml:space="preserve">). Moreover, the majority of these efforts have cantered on simulating so-called</w:t>
+      </w:r>
+      <w:r>
+        <w:t xml:space="preserve"> </w:t>
+      </w:r>
+      <w:r>
+        <w:t xml:space="preserve">“central scenarios,”</w:t>
+      </w:r>
+      <w:r>
+        <w:t xml:space="preserve"> </w:t>
+      </w:r>
+      <w:r>
+        <w:t xml:space="preserve">with limited attention given to the generation of realistic extreme scenarios. An exception to this trend can be found in</w:t>
+      </w:r>
+      <w:r>
+        <w:t xml:space="preserve"> </w:t>
+      </w:r>
+      <w:hyperlink w:anchor="references">
+        <w:r>
+          <w:rPr>
+            <w:rStyle w:val="Hyperlink"/>
+          </w:rPr>
+          <w:t xml:space="preserve">[5]</w:t>
+        </w:r>
+      </w:hyperlink>
+      <w:r>
+        <w:t xml:space="preserve">, which explicitly target the generation of tail events using Generative Adversarial Network (GAN) (see</w:t>
+      </w:r>
+      <w:r>
+        <w:t xml:space="preserve"> </w:t>
+      </w:r>
+      <w:hyperlink w:anchor="references">
+        <w:r>
+          <w:rPr>
+            <w:rStyle w:val="Hyperlink"/>
+          </w:rPr>
+          <w:t xml:space="preserve">[5]</w:t>
+        </w:r>
+      </w:hyperlink>
+      <w:r>
+        <w:t xml:space="preserve"> </w:t>
+      </w:r>
+      <w:r>
+        <w:t xml:space="preserve">for examples and implementation) architectures, though even these approaches remain constrained to relatively low-dimensional environments (e.g., up to 20–50 factors).</w:t>
+      </w:r>
+    </w:p>
+    <w:p>
+      <w:pPr>
+        <w:pStyle w:val="BodyText"/>
+      </w:pPr>
+      <w:r>
+        <w:t xml:space="preserve">Inspired by these works, this research seeks to extend the dimensionality of scenario generation while relaxing the requirement for path dependence. This adjustment allows us to leverage more classical tools for modelling joint dependencies, such as copulas. However, even within this framework, only Gaussian copulas (and selected Student-T) have demonstrated the capacity to scale effectively to very high dimensions. This project aims to bridge the gap between the data-driven GAN-like approaches and the scalability of copulas by developing a high-dimensional copula model capable of capturing historical tail dependence properties. The ultimate goal is to generate realistic extreme scenarios that reflect the complex dependencies observed in financial markets.</w:t>
+      </w:r>
+    </w:p>
     <w:bookmarkEnd w:id="18"/>
-    <w:bookmarkStart w:id="19" w:name="literature-review"/>
-    <w:p>
-      <w:pPr>
-        <w:pStyle w:val="Heading2"/>
-      </w:pPr>
-      <w:r>
-        <w:t xml:space="preserve">Literature review</w:t>
+    <w:bookmarkEnd w:id="19"/>
+    <w:bookmarkStart w:id="26" w:name="methodology-and-methods"/>
+    <w:p>
+      <w:pPr>
+        <w:pStyle w:val="Heading1"/>
+      </w:pPr>
+      <w:r>
+        <w:t xml:space="preserve">Methodology and methods</w:t>
       </w:r>
     </w:p>
     <w:p>
@@ -2292,26 +2372,7 @@
         <w:pStyle w:val="FirstParagraph"/>
       </w:pPr>
       <w:r>
-        <w:t xml:space="preserve">[TODO: present articles!!!]</w:t>
-      </w:r>
-    </w:p>
-    <w:bookmarkEnd w:id="19"/>
-    <w:bookmarkEnd w:id="20"/>
-    <w:bookmarkStart w:id="26" w:name="methodology-and-methods"/>
-    <w:p>
-      <w:pPr>
-        <w:pStyle w:val="Heading1"/>
-      </w:pPr>
-      <w:r>
-        <w:t xml:space="preserve">Methodology and methods</w:t>
-      </w:r>
-    </w:p>
-    <w:p>
-      <w:pPr>
-        <w:pStyle w:val="FirstParagraph"/>
-      </w:pPr>
-      <w:r>
-        <w:t xml:space="preserve">This analysis prioritizes the generation of extreme market scenarios designed specifically for Market Risk and capital estimation purposes. Unlike studies where the intricacies of underlying asset path dynamics (such as time-dependent volatility or complex stochastic processes) are critical, this work deliberately abstracts from such details. As such there is no need to include dynamically changing portfolios (i.e. dynamic trading strategies), limiting portfolio dimension optimization to static. (only portfolios of approx. 500 names all long and 500 long/short hedged portfolios will used in this study).</w:t>
+        <w:t xml:space="preserve">As mentioned above unlike studies where the intricacies of underlying asset path dynamics (such as time-dependent volatility or complex stochastic processes) are critical, this work deliberately abstracts from such details. As such there is no need to include dynamically changing portfolios (i.e. dynamic trading strategies), limiting portfolio dimension optimization to static. Portfolios of approx. 500 names with all long positions and 500 long/short hedged positions will be used in this study.</w:t>
       </w:r>
     </w:p>
     <w:p>
@@ -2319,36 +2380,30 @@
         <w:pStyle w:val="BodyText"/>
       </w:pPr>
       <w:r>
-        <w:t xml:space="preserve">A defining challenge in Market Risk is the need to evaluate the collective behavior of thousands of risk factors simultaneously, a requirement that far exceeds the scope of prior research, where simulations often focused on merely dozens of variables. This study bridges that gap by demonstrating scalability to hundreds or even thousands of risk factors, aligning with the real-world demands of large-scale risk aggregation.</w:t>
-      </w:r>
-    </w:p>
-    <w:p>
-      <w:pPr>
-        <w:pStyle w:val="BodyText"/>
-      </w:pPr>
-      <w:r>
-        <w:t xml:space="preserve">Figure below presents overall workflow of the project aiming at calibrating copula to historical timeseries.</w:t>
-      </w:r>
-      <w:r>
-        <w:t xml:space="preserve"> </w:t>
-      </w:r>
+        <w:t xml:space="preserve">Figure below presents overall workflow of the project aiming at calibrating copula to historical timeseries related to the list of selected portfolios.</w:t>
+      </w:r>
+    </w:p>
+    <w:p>
+      <w:pPr>
+        <w:pStyle w:val="CaptionedFigure"/>
+      </w:pPr>
       <w:r>
         <w:drawing>
           <wp:inline>
             <wp:extent cx="5334000" cy="2156297"/>
             <wp:effectExtent b="0" l="0" r="0" t="0"/>
-            <wp:docPr descr="Figure 2: Copula calibration workflow" title="" id="22" name="Picture"/>
+            <wp:docPr descr="Figure 2: Copula calibration workflow" title="" id="21" name="Picture"/>
             <a:graphic>
               <a:graphicData uri="http://schemas.openxmlformats.org/drawingml/2006/picture">
                 <pic:pic>
                   <pic:nvPicPr>
-                    <pic:cNvPr descr="figures\Project-workflow-high.png" id="23" name="Picture"/>
+                    <pic:cNvPr descr="figures\Project-workflow-high.png" id="22" name="Picture"/>
                     <pic:cNvPicPr>
                       <a:picLocks noChangeArrowheads="1" noChangeAspect="1"/>
                     </pic:cNvPicPr>
                   </pic:nvPicPr>
                   <pic:blipFill>
-                    <a:blip r:embed="rId21"/>
+                    <a:blip r:embed="rId20"/>
                     <a:stretch>
                       <a:fillRect/>
                     </a:stretch>
@@ -2377,31 +2432,41 @@
     </w:p>
     <w:p>
       <w:pPr>
+        <w:pStyle w:val="ImageCaption"/>
+      </w:pPr>
+      <w:r>
+        <w:t xml:space="preserve">Figure 2: Copula calibration workflow</w:t>
+      </w:r>
+    </w:p>
+    <w:p>
+      <w:pPr>
         <w:pStyle w:val="BodyText"/>
       </w:pPr>
       <w:r>
-        <w:t xml:space="preserve">It is further detailed in the next figure, which illustrated cumulative process of constructing different time series based on the observed history and representing required data transformations.</w:t>
-      </w:r>
-      <w:r>
-        <w:t xml:space="preserve"> </w:t>
-      </w:r>
+        <w:t xml:space="preserve">It is further detailed in the next figure, which illustrates the cumulative process of constructing different time series based on the observed history and representing required data transformations.</w:t>
+      </w:r>
+    </w:p>
+    <w:p>
+      <w:pPr>
+        <w:pStyle w:val="CaptionedFigure"/>
+      </w:pPr>
       <w:r>
         <w:drawing>
           <wp:inline>
-            <wp:extent cx="5334000" cy="2156297"/>
+            <wp:extent cx="5334000" cy="3663108"/>
             <wp:effectExtent b="0" l="0" r="0" t="0"/>
             <wp:docPr descr="Figure 3: Detailed process of data transformations for copula calibration" title="" id="24" name="Picture"/>
             <a:graphic>
               <a:graphicData uri="http://schemas.openxmlformats.org/drawingml/2006/picture">
                 <pic:pic>
                   <pic:nvPicPr>
-                    <pic:cNvPr descr="figures\Project-workflow-high.png" id="25" name="Picture"/>
+                    <pic:cNvPr descr="figures\Project-workflow-detailed.png" id="25" name="Picture"/>
                     <pic:cNvPicPr>
                       <a:picLocks noChangeArrowheads="1" noChangeAspect="1"/>
                     </pic:cNvPicPr>
                   </pic:nvPicPr>
                   <pic:blipFill>
-                    <a:blip r:embed="rId21"/>
+                    <a:blip r:embed="rId23"/>
                     <a:stretch>
                       <a:fillRect/>
                     </a:stretch>
@@ -2409,7 +2474,7 @@
                   <pic:spPr bwMode="auto">
                     <a:xfrm>
                       <a:off x="0" y="0"/>
-                      <a:ext cx="5334000" cy="2156297"/>
+                      <a:ext cx="5334000" cy="3663108"/>
                     </a:xfrm>
                     <a:prstGeom prst="rect">
                       <a:avLst/>
@@ -2430,10 +2495,35 @@
     </w:p>
     <w:p>
       <w:pPr>
+        <w:pStyle w:val="ImageCaption"/>
+      </w:pPr>
+      <w:r>
+        <w:t xml:space="preserve">Figure 3: Detailed process of data transformations for copula calibration</w:t>
+      </w:r>
+    </w:p>
+    <w:p>
+      <w:pPr>
         <w:pStyle w:val="BodyText"/>
       </w:pPr>
       <w:r>
-        <w:t xml:space="preserve">Beyond scalability, another key advantage lies in the interpretability of results. While alternative approaches, such as Tail-GAN-based simulations, often produce outputs that are difficult to dissect or explain, the methodology employed here offers an inherent structure for understanding extreme scenarios. The framework decomposes market dynamics into a weighted combination of copulas, each with a clear and intuitive economic or statistical meaning. This not only enhances transparency but also provides with a more actionable foundation for stress testing and capital planning. The ability to attribute risk contributions to specific copula components is a significant improvement in practical applicability and model governance.</w:t>
+        <w:t xml:space="preserve">Beyond scalability, another key advantage lies in the interpretability of results. While alternative approaches, such as Tail-GAN-based simulations, often produce outputs that are difficult to dissect or explain, the methodology employed here offers an inherent structure for understanding extreme scenarios. The framework decomposes market dynamics into a weighted combination of copulas (see</w:t>
+      </w:r>
+      <w:r>
+        <w:t xml:space="preserve"> </w:t>
+      </w:r>
+      <w:hyperlink w:anchor="copulas">
+        <w:r>
+          <w:rPr>
+            <w:rStyle w:val="Hyperlink"/>
+          </w:rPr>
+          <w:t xml:space="preserve">Copulas</w:t>
+        </w:r>
+      </w:hyperlink>
+      <w:r>
+        <w:t xml:space="preserve"> </w:t>
+      </w:r>
+      <w:r>
+        <w:t xml:space="preserve">properties in the previous section), each with a clear and intuitive economic or statistical meaning. This not only enhances transparency but also provides with a more actionable foundation for stress testing and capital planning. The ability to attribute risk contributions to specific copula components is a significant improvement in practical applicability and model governance.</w:t>
       </w:r>
     </w:p>
     <w:p>
@@ -2441,55 +2531,7 @@
         <w:pStyle w:val="BodyText"/>
       </w:pPr>
       <w:r>
-        <w:rPr>
-          <w:i/>
-          <w:iCs/>
-        </w:rPr>
-        <w:t xml:space="preserve">provide a diagram that illustrate your approach/data pipeline</w:t>
-      </w:r>
-      <w:r>
-        <w:t xml:space="preserve"> </w:t>
-      </w:r>
-      <w:r>
-        <w:rPr>
-          <w:i/>
-          <w:iCs/>
-        </w:rPr>
-        <w:t xml:space="preserve">for each objective you can provide methodology, methods and tools that you will use, and organise this part accordingly</w:t>
-      </w:r>
-      <w:r>
-        <w:t xml:space="preserve"> </w:t>
-      </w:r>
-      <w:r>
-        <w:rPr>
-          <w:i/>
-          <w:iCs/>
-        </w:rPr>
-        <w:t xml:space="preserve">difference between an evaluation with respect to how your software performs, versus a critical evaluation where you reflect on your aims and objectives</w:t>
-      </w:r>
-      <w:r>
-        <w:t xml:space="preserve"> </w:t>
-      </w:r>
-      <w:r>
-        <w:rPr>
-          <w:i/>
-          <w:iCs/>
-        </w:rPr>
-        <w:t xml:space="preserve">how do you plan to implement it? E.g. if you are using machine learning, you will require a model (explain the structure of the neural network)</w:t>
-      </w:r>
-    </w:p>
-    <w:p>
-      <w:pPr>
-        <w:pStyle w:val="BodyText"/>
-      </w:pPr>
-      <w:r>
-        <w:t xml:space="preserve">The software end-product</w:t>
-      </w:r>
-      <w:r>
-        <w:t xml:space="preserve"> </w:t>
-      </w:r>
-      <w:r>
-        <w:t xml:space="preserve">My aim with this software is a proof of concept rather than an end-user application.</w:t>
+        <w:t xml:space="preserve">Please also note that aim of this software (Python) is a proof of concept rather than an end-user application, while it still follows the main principals of software design with the development plan outlined below.</w:t>
       </w:r>
     </w:p>
     <w:bookmarkEnd w:id="26"/>
@@ -2507,7 +2549,7 @@
         <w:pStyle w:val="FirstParagraph"/>
       </w:pPr>
       <w:r>
-        <w:t xml:space="preserve">The work is expected to start in the begging of May 2026. Development and research phase is expected to be finalized within 3 months leaving additional time for the report preparation.</w:t>
+        <w:t xml:space="preserve">The work is expected to start in the beginning of May 2026. Development and research phase is expected to be finalized within 3 months leaving additional time for the report preparation.</w:t>
       </w:r>
     </w:p>
     <w:p>
@@ -2529,7 +2571,7 @@
         <w:t xml:space="preserve"> </w:t>
       </w:r>
       <w:r>
-        <w:t xml:space="preserve">Develop functionality able to discover required market data and casche it from Yahoo API according the required population, length and granularity.</w:t>
+        <w:t xml:space="preserve">Develop functionality (Python) able to discover required market data and cache it from Yahoo API according the required population, length and granularity.</w:t>
       </w:r>
     </w:p>
     <w:p>
@@ -2813,32 +2855,57 @@
         <w:t xml:space="preserve">Appendixes</w:t>
       </w:r>
     </w:p>
-    <w:p>
-      <w:pPr>
-        <w:pStyle w:val="FirstParagraph"/>
-      </w:pPr>
-      <w:r>
-        <w:t xml:space="preserve">See corresponding equation</w:t>
-      </w:r>
-      <w:r>
-        <w:t xml:space="preserve"> </w:t>
-      </w:r>
-      <w:hyperlink w:anchor="eq1">
-        <w:r>
-          <w:rPr>
-            <w:rStyle w:val="Hyperlink"/>
-          </w:rPr>
-          <w:t xml:space="preserve">(Eq.1)</w:t>
-        </w:r>
-      </w:hyperlink>
-    </w:p>
-    <w:bookmarkStart w:id="46" w:name="appendix-a-copula-examples"/>
+    <w:bookmarkStart w:id="34" w:name="appendix-a-list-of-used-ai-tools"/>
     <w:p>
       <w:pPr>
         <w:pStyle w:val="Heading2"/>
       </w:pPr>
       <w:r>
-        <w:t xml:space="preserve">Appendix A: Copula examples</w:t>
+        <w:t xml:space="preserve">Appendix A: List of used AI tools</w:t>
+      </w:r>
+    </w:p>
+    <w:p>
+      <w:pPr>
+        <w:pStyle w:val="Compact"/>
+        <w:numPr>
+          <w:ilvl w:val="0"/>
+          <w:numId w:val="1005"/>
+        </w:numPr>
+      </w:pPr>
+      <w:r>
+        <w:t xml:space="preserve">Gemini via Google Search;</w:t>
+      </w:r>
+    </w:p>
+    <w:p>
+      <w:pPr>
+        <w:pStyle w:val="Compact"/>
+        <w:numPr>
+          <w:ilvl w:val="0"/>
+          <w:numId w:val="1005"/>
+        </w:numPr>
+      </w:pPr>
+      <w:r>
+        <w:t xml:space="preserve">Mistral-7B-Instruct-v0.3 for polishing the text. Prompt:</w:t>
+      </w:r>
+      <w:r>
+        <w:t xml:space="preserve"> </w:t>
+      </w:r>
+      <w:r>
+        <w:rPr>
+          <w:i/>
+          <w:iCs/>
+        </w:rPr>
+        <w:t xml:space="preserve">“You’re an academic assistant with an expertise in software engineering to proofread and rewrite as a single connected text. Keep academic tone.”</w:t>
+      </w:r>
+    </w:p>
+    <w:bookmarkEnd w:id="34"/>
+    <w:bookmarkStart w:id="47" w:name="appendix-b-copula-examples"/>
+    <w:p>
+      <w:pPr>
+        <w:pStyle w:val="Heading2"/>
+      </w:pPr>
+      <w:r>
+        <w:t xml:space="preserve">Appendix B: Copula examples</w:t>
       </w:r>
     </w:p>
     <w:p>
@@ -2858,18 +2925,18 @@
           <wp:inline>
             <wp:extent cx="5334000" cy="4000499"/>
             <wp:effectExtent b="0" l="0" r="0" t="0"/>
-            <wp:docPr descr="Figure 1: Uniform scenarios Gaussian_copula, numerical simulation" title="" id="35" name="Picture"/>
+            <wp:docPr descr="Figure 1: Uniform scenarios Gaussian_copula, numerical simulation" title="" id="36" name="Picture"/>
             <a:graphic>
               <a:graphicData uri="http://schemas.openxmlformats.org/drawingml/2006/picture">
                 <pic:pic>
                   <pic:nvPicPr>
-                    <pic:cNvPr descr="figures\Uniform_scenarios_Gaussian_copula_(numerical_simulation).png" id="36" name="Picture"/>
+                    <pic:cNvPr descr="figures\Uniform_scenarios_Gaussian_copula_(numerical_simulation).png" id="37" name="Picture"/>
                     <pic:cNvPicPr>
                       <a:picLocks noChangeArrowheads="1" noChangeAspect="1"/>
                     </pic:cNvPicPr>
                   </pic:nvPicPr>
                   <pic:blipFill>
-                    <a:blip r:embed="rId34"/>
+                    <a:blip r:embed="rId35"/>
                     <a:stretch>
                       <a:fillRect/>
                     </a:stretch>
@@ -2913,18 +2980,18 @@
           <wp:inline>
             <wp:extent cx="5334000" cy="4000499"/>
             <wp:effectExtent b="0" l="0" r="0" t="0"/>
-            <wp:docPr descr="Figure 2: Contour plot Gaussian copula, numerical simulation" title="" id="38" name="Picture"/>
+            <wp:docPr descr="Figure 2: Contour plot Gaussian copula, numerical simulation" title="" id="39" name="Picture"/>
             <a:graphic>
               <a:graphicData uri="http://schemas.openxmlformats.org/drawingml/2006/picture">
                 <pic:pic>
                   <pic:nvPicPr>
-                    <pic:cNvPr descr="figures\Contour_plot_Gaussian_copula_(numerical_simulation).png" id="39" name="Picture"/>
+                    <pic:cNvPr descr="figures\Contour_plot_Gaussian_copula_(numerical_simulation).png" id="40" name="Picture"/>
                     <pic:cNvPicPr>
                       <a:picLocks noChangeArrowheads="1" noChangeAspect="1"/>
                     </pic:cNvPicPr>
                   </pic:nvPicPr>
                   <pic:blipFill>
-                    <a:blip r:embed="rId37"/>
+                    <a:blip r:embed="rId38"/>
                     <a:stretch>
                       <a:fillRect/>
                     </a:stretch>
@@ -2976,18 +3043,18 @@
           <wp:inline>
             <wp:extent cx="5334000" cy="4000499"/>
             <wp:effectExtent b="0" l="0" r="0" t="0"/>
-            <wp:docPr descr="Figure 3: Uniform scenarios Cauchy copula, numerical simulation" title="" id="41" name="Picture"/>
+            <wp:docPr descr="Figure 3: Uniform scenarios Cauchy copula, numerical simulation" title="" id="42" name="Picture"/>
             <a:graphic>
               <a:graphicData uri="http://schemas.openxmlformats.org/drawingml/2006/picture">
                 <pic:pic>
                   <pic:nvPicPr>
-                    <pic:cNvPr descr="figures\Uniform_scenarios_Cauchy_copula_(numerical_simulation).png" id="42" name="Picture"/>
+                    <pic:cNvPr descr="figures\Uniform_scenarios_Cauchy_copula_(numerical_simulation).png" id="43" name="Picture"/>
                     <pic:cNvPicPr>
                       <a:picLocks noChangeArrowheads="1" noChangeAspect="1"/>
                     </pic:cNvPicPr>
                   </pic:nvPicPr>
                   <pic:blipFill>
-                    <a:blip r:embed="rId40"/>
+                    <a:blip r:embed="rId41"/>
                     <a:stretch>
                       <a:fillRect/>
                     </a:stretch>
@@ -3031,18 +3098,18 @@
           <wp:inline>
             <wp:extent cx="5334000" cy="4000499"/>
             <wp:effectExtent b="0" l="0" r="0" t="0"/>
-            <wp:docPr descr="Figure 4: Contour plot Cauchy copula, numerical simulation" title="" id="44" name="Picture"/>
+            <wp:docPr descr="Figure 4: Contour plot Cauchy copula, numerical simulation" title="" id="45" name="Picture"/>
             <a:graphic>
               <a:graphicData uri="http://schemas.openxmlformats.org/drawingml/2006/picture">
                 <pic:pic>
                   <pic:nvPicPr>
-                    <pic:cNvPr descr="figures\Contour_plot_Cauchy_copula_(numerical_simulation).png" id="45" name="Picture"/>
+                    <pic:cNvPr descr="figures\Contour_plot_Cauchy_copula_(numerical_simulation).png" id="46" name="Picture"/>
                     <pic:cNvPicPr>
                       <a:picLocks noChangeArrowheads="1" noChangeAspect="1"/>
                     </pic:cNvPicPr>
                   </pic:nvPicPr>
                   <pic:blipFill>
-                    <a:blip r:embed="rId43"/>
+                    <a:blip r:embed="rId44"/>
                     <a:stretch>
                       <a:fillRect/>
                     </a:stretch>
@@ -3075,50 +3142,6 @@
       </w:pPr>
       <w:r>
         <w:t xml:space="preserve">Figure 4: Contour plot Cauchy copula, numerical simulation</w:t>
-      </w:r>
-    </w:p>
-    <w:bookmarkEnd w:id="46"/>
-    <w:bookmarkStart w:id="47" w:name="appendix-b-list-of-used-ai-tools"/>
-    <w:p>
-      <w:pPr>
-        <w:pStyle w:val="Heading2"/>
-      </w:pPr>
-      <w:r>
-        <w:t xml:space="preserve">Appendix B: List of used AI tools</w:t>
-      </w:r>
-    </w:p>
-    <w:p>
-      <w:pPr>
-        <w:pStyle w:val="Compact"/>
-        <w:numPr>
-          <w:ilvl w:val="0"/>
-          <w:numId w:val="1005"/>
-        </w:numPr>
-      </w:pPr>
-      <w:r>
-        <w:t xml:space="preserve">Gemini via Google Search;</w:t>
-      </w:r>
-    </w:p>
-    <w:p>
-      <w:pPr>
-        <w:pStyle w:val="Compact"/>
-        <w:numPr>
-          <w:ilvl w:val="0"/>
-          <w:numId w:val="1005"/>
-        </w:numPr>
-      </w:pPr>
-      <w:r>
-        <w:t xml:space="preserve">Mistral-7B-Instruct-v0.3 for polishing the text. Prompt:</w:t>
-      </w:r>
-      <w:r>
-        <w:t xml:space="preserve"> </w:t>
-      </w:r>
-      <w:r>
-        <w:rPr>
-          <w:i/>
-          <w:iCs/>
-        </w:rPr>
-        <w:t xml:space="preserve">“You’re an academic assistant with an expertise in software engineering to proofread and rewrite as a single connected text. Keep academic tone.”</w:t>
       </w:r>
     </w:p>
     <w:bookmarkEnd w:id="47"/>

</xml_diff>

<commit_message>
updating word template to render doc
</commit_message>
<xml_diff>
--- a/document/proposal.docx
+++ b/document/proposal.docx
@@ -76,7 +76,7 @@
         </w:p>
       </w:sdtContent>
     </w:sdt>
-    <w:bookmarkStart w:id="9" w:name="introduction"/>
+    <w:bookmarkStart w:id="17" w:name="introduction"/>
     <w:p>
       <w:pPr>
         <w:pStyle w:val="Heading1"/>
@@ -101,8 +101,8 @@
         <w:t xml:space="preserve">This MSc proposal proceeds by outlining its primary goals and objectives. Subsequently, it explains the problem under investigation, along with pertinent work that provides essential concepts and a literature review. The subsequent sections detail the methodology and techniques employed to achieve the previously outlined objectives. The proposal concludes in a development plan for the project.</w:t>
       </w:r>
     </w:p>
-    <w:bookmarkEnd w:id="9"/>
-    <w:bookmarkStart w:id="10" w:name="aims-and-objectives"/>
+    <w:bookmarkEnd w:id="17"/>
+    <w:bookmarkStart w:id="18" w:name="aims-and-objectives"/>
     <w:p>
       <w:pPr>
         <w:pStyle w:val="Heading1"/>
@@ -135,8 +135,8 @@
         <w:t xml:space="preserve">Upon completion of the initial software development, conduct an experimental analysis to evaluate the impact of copula assumptions on the selected VaR / ES measures across distinct portfolios. Following this, establish a calibration procedure aimed at fitting appropriate copulas to real-world market data. Lastly, devise a testing exercise to verify whether the calibrated copulas align with the prescribed conditions.</w:t>
       </w:r>
     </w:p>
-    <w:bookmarkEnd w:id="10"/>
-    <w:bookmarkStart w:id="19" w:name="X32b9430d5d15411fac62685483839fe9d87a9a8"/>
+    <w:bookmarkEnd w:id="18"/>
+    <w:bookmarkStart w:id="27" w:name="X32b9430d5d15411fac62685483839fe9d87a9a8"/>
     <w:p>
       <w:pPr>
         <w:pStyle w:val="Heading1"/>
@@ -145,7 +145,7 @@
         <w:t xml:space="preserve">Description of the problem and relevant work</w:t>
       </w:r>
     </w:p>
-    <w:bookmarkStart w:id="17" w:name="key-concepts"/>
+    <w:bookmarkStart w:id="25" w:name="key-concepts"/>
     <w:p>
       <w:pPr>
         <w:pStyle w:val="Heading2"/>
@@ -154,7 +154,7 @@
         <w:t xml:space="preserve">Key concepts</w:t>
       </w:r>
     </w:p>
-    <w:bookmarkStart w:id="11" w:name="X2df427def89a3ef237a42aa6bbd525f6362f6e2"/>
+    <w:bookmarkStart w:id="19" w:name="X2df427def89a3ef237a42aa6bbd525f6362f6e2"/>
     <w:p>
       <w:pPr>
         <w:pStyle w:val="Heading3"/>
@@ -583,8 +583,8 @@
         <w:t xml:space="preserve">From a computational perspective, MC VaR methods exhibit low numerical error, as the simulated datasets can be made arbitrarily large to smooth out estimation noise. However, this precision comes at the expense of higher model error, particularly when parametric assumptions are misspecified or when EVT extrapolations deviate from true tail behavior. While these methods provide greater control and extensibility in extreme risk modelling, their reliability hinges on the accuracy of the underlying assumptions, whether in the choice of distributions copula functions, or tail decay parameters.</w:t>
       </w:r>
     </w:p>
-    <w:bookmarkEnd w:id="11"/>
-    <w:bookmarkStart w:id="12" w:name="copulas."/>
+    <w:bookmarkEnd w:id="19"/>
+    <w:bookmarkStart w:id="20" w:name="copulas."/>
     <w:p>
       <w:pPr>
         <w:pStyle w:val="Heading3"/>
@@ -1642,8 +1642,8 @@
         <w:t xml:space="preserve">.</w:t>
       </w:r>
     </w:p>
-    <w:bookmarkEnd w:id="12"/>
-    <w:bookmarkStart w:id="16" w:name="copulas-in-value-at-risk"/>
+    <w:bookmarkEnd w:id="20"/>
+    <w:bookmarkStart w:id="24" w:name="copulas-in-value-at-risk"/>
     <w:p>
       <w:pPr>
         <w:pStyle w:val="Heading3"/>
@@ -2175,20 +2175,20 @@
       <w:r>
         <w:drawing>
           <wp:inline>
-            <wp:extent cx="5334000" cy="2156297"/>
+            <wp:extent cx="5943600" cy="2402731"/>
             <wp:effectExtent b="0" l="0" r="0" t="0"/>
-            <wp:docPr descr="Figure 1: Tail dependence for different types of copulas and different number of random variables" title="" id="14" name="Picture"/>
+            <wp:docPr descr="Figure 1: Tail dependence for different types of copulas and different number of random variables" title="" id="22" name="Picture"/>
             <a:graphic>
               <a:graphicData uri="http://schemas.openxmlformats.org/drawingml/2006/picture">
                 <pic:pic>
                   <pic:nvPicPr>
-                    <pic:cNvPr descr="figures\Tail_dependance.png" id="15" name="Picture"/>
+                    <pic:cNvPr descr="figures\Tail_dependance.png" id="23" name="Picture"/>
                     <pic:cNvPicPr>
                       <a:picLocks noChangeArrowheads="1" noChangeAspect="1"/>
                     </pic:cNvPicPr>
                   </pic:nvPicPr>
                   <pic:blipFill>
-                    <a:blip r:embed="rId13"/>
+                    <a:blip r:embed="rId21"/>
                     <a:stretch>
                       <a:fillRect/>
                     </a:stretch>
@@ -2196,7 +2196,7 @@
                   <pic:spPr bwMode="auto">
                     <a:xfrm>
                       <a:off x="0" y="0"/>
-                      <a:ext cx="5334000" cy="2156297"/>
+                      <a:ext cx="5943600" cy="2402731"/>
                     </a:xfrm>
                     <a:prstGeom prst="rect">
                       <a:avLst/>
@@ -2255,9 +2255,9 @@
         <w:t xml:space="preserve">Both types of scenarios are crucial for robust risk assessment. De‑correlation highlights the risk of assets that are supposed to hedge each other stop doing so, while joint‑movement emphasizes the danger of hidden tail‑dependence that can generate simultaneous losses across seemingly unrelated positions. Modelling frameworks that can generate both behaviors, provide a more realistic picture of potential extreme outcomes than approaches that rely solely on historic linear correlations.</w:t>
       </w:r>
     </w:p>
-    <w:bookmarkEnd w:id="16"/>
-    <w:bookmarkEnd w:id="17"/>
-    <w:bookmarkStart w:id="18" w:name="literature-review"/>
+    <w:bookmarkEnd w:id="24"/>
+    <w:bookmarkEnd w:id="25"/>
+    <w:bookmarkStart w:id="26" w:name="literature-review"/>
     <w:p>
       <w:pPr>
         <w:pStyle w:val="Heading2"/>
@@ -2356,9 +2356,9 @@
         <w:t xml:space="preserve">Inspired by these works, this research seeks to extend the dimensionality of scenario generation while relaxing the requirement for path dependence. This adjustment allows us to leverage more classical tools for modelling joint dependencies, such as copulas. However, even within this framework, only Gaussian copulas (and selected Student-T) have demonstrated the capacity to scale effectively to very high dimensions. This project aims to bridge the gap between the data-driven GAN-like approaches and the scalability of copulas by developing a high-dimensional copula model capable of capturing historical tail dependence properties. The ultimate goal is to generate realistic extreme scenarios that reflect the complex dependencies observed in financial markets.</w:t>
       </w:r>
     </w:p>
-    <w:bookmarkEnd w:id="18"/>
-    <w:bookmarkEnd w:id="19"/>
-    <w:bookmarkStart w:id="26" w:name="methodology-and-methods"/>
+    <w:bookmarkEnd w:id="26"/>
+    <w:bookmarkEnd w:id="27"/>
+    <w:bookmarkStart w:id="34" w:name="methodology-and-methods"/>
     <w:p>
       <w:pPr>
         <w:pStyle w:val="Heading1"/>
@@ -2390,20 +2390,20 @@
       <w:r>
         <w:drawing>
           <wp:inline>
-            <wp:extent cx="5334000" cy="2156297"/>
+            <wp:extent cx="5943600" cy="2402731"/>
             <wp:effectExtent b="0" l="0" r="0" t="0"/>
-            <wp:docPr descr="Figure 2: Copula calibration workflow" title="" id="21" name="Picture"/>
+            <wp:docPr descr="Figure 2: Copula calibration workflow" title="" id="29" name="Picture"/>
             <a:graphic>
               <a:graphicData uri="http://schemas.openxmlformats.org/drawingml/2006/picture">
                 <pic:pic>
                   <pic:nvPicPr>
-                    <pic:cNvPr descr="figures\Project-workflow-high.png" id="22" name="Picture"/>
+                    <pic:cNvPr descr="figures\Project-workflow-high.png" id="30" name="Picture"/>
                     <pic:cNvPicPr>
                       <a:picLocks noChangeArrowheads="1" noChangeAspect="1"/>
                     </pic:cNvPicPr>
                   </pic:nvPicPr>
                   <pic:blipFill>
-                    <a:blip r:embed="rId20"/>
+                    <a:blip r:embed="rId28"/>
                     <a:stretch>
                       <a:fillRect/>
                     </a:stretch>
@@ -2411,7 +2411,7 @@
                   <pic:spPr bwMode="auto">
                     <a:xfrm>
                       <a:off x="0" y="0"/>
-                      <a:ext cx="5334000" cy="2156297"/>
+                      <a:ext cx="5943600" cy="2402731"/>
                     </a:xfrm>
                     <a:prstGeom prst="rect">
                       <a:avLst/>
@@ -2453,20 +2453,20 @@
       <w:r>
         <w:drawing>
           <wp:inline>
-            <wp:extent cx="5334000" cy="3663108"/>
+            <wp:extent cx="5943600" cy="4081749"/>
             <wp:effectExtent b="0" l="0" r="0" t="0"/>
-            <wp:docPr descr="Figure 3: Detailed process of data transformations for copula calibration" title="" id="24" name="Picture"/>
+            <wp:docPr descr="Figure 3: Detailed process of data transformations for copula calibration" title="" id="32" name="Picture"/>
             <a:graphic>
               <a:graphicData uri="http://schemas.openxmlformats.org/drawingml/2006/picture">
                 <pic:pic>
                   <pic:nvPicPr>
-                    <pic:cNvPr descr="figures\Project-workflow-detailed.png" id="25" name="Picture"/>
+                    <pic:cNvPr descr="figures\Project-workflow-detailed.png" id="33" name="Picture"/>
                     <pic:cNvPicPr>
                       <a:picLocks noChangeArrowheads="1" noChangeAspect="1"/>
                     </pic:cNvPicPr>
                   </pic:nvPicPr>
                   <pic:blipFill>
-                    <a:blip r:embed="rId23"/>
+                    <a:blip r:embed="rId31"/>
                     <a:stretch>
                       <a:fillRect/>
                     </a:stretch>
@@ -2474,7 +2474,7 @@
                   <pic:spPr bwMode="auto">
                     <a:xfrm>
                       <a:off x="0" y="0"/>
-                      <a:ext cx="5334000" cy="3663108"/>
+                      <a:ext cx="5943600" cy="4081749"/>
                     </a:xfrm>
                     <a:prstGeom prst="rect">
                       <a:avLst/>
@@ -2534,8 +2534,8 @@
         <w:t xml:space="preserve">Please also note that aim of this software (Python) is a proof of concept rather than an end-user application, while it still follows the main principals of software design with the development plan outlined below.</w:t>
       </w:r>
     </w:p>
-    <w:bookmarkEnd w:id="26"/>
-    <w:bookmarkStart w:id="27" w:name="project-development-plan"/>
+    <w:bookmarkEnd w:id="34"/>
+    <w:bookmarkStart w:id="35" w:name="project-development-plan"/>
     <w:p>
       <w:pPr>
         <w:pStyle w:val="Heading1"/>
@@ -2687,8 +2687,8 @@
         <w:t xml:space="preserve">Assess obtained results, summarize observations and developed software within the report.</w:t>
       </w:r>
     </w:p>
-    <w:bookmarkEnd w:id="27"/>
-    <w:bookmarkStart w:id="33" w:name="references"/>
+    <w:bookmarkEnd w:id="35"/>
+    <w:bookmarkStart w:id="41" w:name="references"/>
     <w:p>
       <w:pPr>
         <w:pStyle w:val="Heading1"/>
@@ -2754,7 +2754,7 @@
       <w:r>
         <w:t xml:space="preserve"> </w:t>
       </w:r>
-      <w:hyperlink r:id="rId28">
+      <w:hyperlink r:id="rId36">
         <w:r>
           <w:rPr>
             <w:rStyle w:val="Hyperlink"/>
@@ -2776,7 +2776,7 @@
       <w:r>
         <w:t xml:space="preserve"> </w:t>
       </w:r>
-      <w:hyperlink r:id="rId29">
+      <w:hyperlink r:id="rId37">
         <w:r>
           <w:rPr>
             <w:rStyle w:val="Hyperlink"/>
@@ -2798,7 +2798,7 @@
       <w:r>
         <w:t xml:space="preserve"> </w:t>
       </w:r>
-      <w:hyperlink r:id="rId30">
+      <w:hyperlink r:id="rId38">
         <w:r>
           <w:rPr>
             <w:rStyle w:val="Hyperlink"/>
@@ -2817,7 +2817,7 @@
       <w:r>
         <w:t xml:space="preserve">Horvath B. et al, 2025. Generative Models in Finance: Market Generators, a Paradigm Shift in Financial Modeling.</w:t>
       </w:r>
-      <w:hyperlink r:id="rId31">
+      <w:hyperlink r:id="rId39">
         <w:r>
           <w:rPr>
             <w:rStyle w:val="Hyperlink"/>
@@ -2836,7 +2836,7 @@
       <w:r>
         <w:t xml:space="preserve">Hofert M. and Pang Z., 2025. W-transforms: Uniformity-preserving transformations and induced dependence structures.</w:t>
       </w:r>
-      <w:hyperlink r:id="rId32">
+      <w:hyperlink r:id="rId40">
         <w:r>
           <w:rPr>
             <w:rStyle w:val="Hyperlink"/>
@@ -2845,8 +2845,8 @@
         </w:r>
       </w:hyperlink>
     </w:p>
-    <w:bookmarkEnd w:id="33"/>
-    <w:bookmarkStart w:id="48" w:name="appendixes"/>
+    <w:bookmarkEnd w:id="41"/>
+    <w:bookmarkStart w:id="56" w:name="appendixes"/>
     <w:p>
       <w:pPr>
         <w:pStyle w:val="Heading1"/>
@@ -2855,7 +2855,7 @@
         <w:t xml:space="preserve">Appendixes</w:t>
       </w:r>
     </w:p>
-    <w:bookmarkStart w:id="34" w:name="appendix-a-list-of-used-ai-tools"/>
+    <w:bookmarkStart w:id="42" w:name="appendix-a-list-of-used-ai-tools"/>
     <w:p>
       <w:pPr>
         <w:pStyle w:val="Heading2"/>
@@ -2898,8 +2898,8 @@
         <w:t xml:space="preserve">“You’re an academic assistant with an expertise in software engineering to proofread and rewrite as a single connected text. Keep academic tone.”</w:t>
       </w:r>
     </w:p>
-    <w:bookmarkEnd w:id="34"/>
-    <w:bookmarkStart w:id="47" w:name="appendix-b-copula-examples"/>
+    <w:bookmarkEnd w:id="42"/>
+    <w:bookmarkStart w:id="55" w:name="appendix-b-copula-examples"/>
     <w:p>
       <w:pPr>
         <w:pStyle w:val="Heading2"/>
@@ -2923,20 +2923,20 @@
       <w:r>
         <w:drawing>
           <wp:inline>
-            <wp:extent cx="5334000" cy="4000499"/>
+            <wp:extent cx="5911272" cy="4433454"/>
             <wp:effectExtent b="0" l="0" r="0" t="0"/>
-            <wp:docPr descr="Figure 1: Uniform scenarios Gaussian_copula, numerical simulation" title="" id="36" name="Picture"/>
+            <wp:docPr descr="Figure 1: Uniform scenarios Gaussian_copula, numerical simulation" title="" id="44" name="Picture"/>
             <a:graphic>
               <a:graphicData uri="http://schemas.openxmlformats.org/drawingml/2006/picture">
                 <pic:pic>
                   <pic:nvPicPr>
-                    <pic:cNvPr descr="figures\Uniform_scenarios_Gaussian_copula_(numerical_simulation).png" id="37" name="Picture"/>
+                    <pic:cNvPr descr="figures\Uniform_scenarios_Gaussian_copula_(numerical_simulation).png" id="45" name="Picture"/>
                     <pic:cNvPicPr>
                       <a:picLocks noChangeArrowheads="1" noChangeAspect="1"/>
                     </pic:cNvPicPr>
                   </pic:nvPicPr>
                   <pic:blipFill>
-                    <a:blip r:embed="rId35"/>
+                    <a:blip r:embed="rId43"/>
                     <a:stretch>
                       <a:fillRect/>
                     </a:stretch>
@@ -2944,7 +2944,7 @@
                   <pic:spPr bwMode="auto">
                     <a:xfrm>
                       <a:off x="0" y="0"/>
-                      <a:ext cx="5334000" cy="4000499"/>
+                      <a:ext cx="5911272" cy="4433454"/>
                     </a:xfrm>
                     <a:prstGeom prst="rect">
                       <a:avLst/>
@@ -2978,20 +2978,20 @@
       <w:r>
         <w:drawing>
           <wp:inline>
-            <wp:extent cx="5334000" cy="4000499"/>
+            <wp:extent cx="5911272" cy="4433454"/>
             <wp:effectExtent b="0" l="0" r="0" t="0"/>
-            <wp:docPr descr="Figure 2: Contour plot Gaussian copula, numerical simulation" title="" id="39" name="Picture"/>
+            <wp:docPr descr="Figure 2: Contour plot Gaussian copula, numerical simulation" title="" id="47" name="Picture"/>
             <a:graphic>
               <a:graphicData uri="http://schemas.openxmlformats.org/drawingml/2006/picture">
                 <pic:pic>
                   <pic:nvPicPr>
-                    <pic:cNvPr descr="figures\Contour_plot_Gaussian_copula_(numerical_simulation).png" id="40" name="Picture"/>
+                    <pic:cNvPr descr="figures\Contour_plot_Gaussian_copula_(numerical_simulation).png" id="48" name="Picture"/>
                     <pic:cNvPicPr>
                       <a:picLocks noChangeArrowheads="1" noChangeAspect="1"/>
                     </pic:cNvPicPr>
                   </pic:nvPicPr>
                   <pic:blipFill>
-                    <a:blip r:embed="rId38"/>
+                    <a:blip r:embed="rId46"/>
                     <a:stretch>
                       <a:fillRect/>
                     </a:stretch>
@@ -2999,7 +2999,7 @@
                   <pic:spPr bwMode="auto">
                     <a:xfrm>
                       <a:off x="0" y="0"/>
-                      <a:ext cx="5334000" cy="4000499"/>
+                      <a:ext cx="5911272" cy="4433454"/>
                     </a:xfrm>
                     <a:prstGeom prst="rect">
                       <a:avLst/>
@@ -3041,20 +3041,20 @@
       <w:r>
         <w:drawing>
           <wp:inline>
-            <wp:extent cx="5334000" cy="4000499"/>
+            <wp:extent cx="5911272" cy="4433454"/>
             <wp:effectExtent b="0" l="0" r="0" t="0"/>
-            <wp:docPr descr="Figure 3: Uniform scenarios Cauchy copula, numerical simulation" title="" id="42" name="Picture"/>
+            <wp:docPr descr="Figure 3: Uniform scenarios Cauchy copula, numerical simulation" title="" id="50" name="Picture"/>
             <a:graphic>
               <a:graphicData uri="http://schemas.openxmlformats.org/drawingml/2006/picture">
                 <pic:pic>
                   <pic:nvPicPr>
-                    <pic:cNvPr descr="figures\Uniform_scenarios_Cauchy_copula_(numerical_simulation).png" id="43" name="Picture"/>
+                    <pic:cNvPr descr="figures\Uniform_scenarios_Cauchy_copula_(numerical_simulation).png" id="51" name="Picture"/>
                     <pic:cNvPicPr>
                       <a:picLocks noChangeArrowheads="1" noChangeAspect="1"/>
                     </pic:cNvPicPr>
                   </pic:nvPicPr>
                   <pic:blipFill>
-                    <a:blip r:embed="rId41"/>
+                    <a:blip r:embed="rId49"/>
                     <a:stretch>
                       <a:fillRect/>
                     </a:stretch>
@@ -3062,7 +3062,7 @@
                   <pic:spPr bwMode="auto">
                     <a:xfrm>
                       <a:off x="0" y="0"/>
-                      <a:ext cx="5334000" cy="4000499"/>
+                      <a:ext cx="5911272" cy="4433454"/>
                     </a:xfrm>
                     <a:prstGeom prst="rect">
                       <a:avLst/>
@@ -3096,20 +3096,20 @@
       <w:r>
         <w:drawing>
           <wp:inline>
-            <wp:extent cx="5334000" cy="4000499"/>
+            <wp:extent cx="5911272" cy="4433454"/>
             <wp:effectExtent b="0" l="0" r="0" t="0"/>
-            <wp:docPr descr="Figure 4: Contour plot Cauchy copula, numerical simulation" title="" id="45" name="Picture"/>
+            <wp:docPr descr="Figure 4: Contour plot Cauchy copula, numerical simulation" title="" id="53" name="Picture"/>
             <a:graphic>
               <a:graphicData uri="http://schemas.openxmlformats.org/drawingml/2006/picture">
                 <pic:pic>
                   <pic:nvPicPr>
-                    <pic:cNvPr descr="figures\Contour_plot_Cauchy_copula_(numerical_simulation).png" id="46" name="Picture"/>
+                    <pic:cNvPr descr="figures\Contour_plot_Cauchy_copula_(numerical_simulation).png" id="54" name="Picture"/>
                     <pic:cNvPicPr>
                       <a:picLocks noChangeArrowheads="1" noChangeAspect="1"/>
                     </pic:cNvPicPr>
                   </pic:nvPicPr>
                   <pic:blipFill>
-                    <a:blip r:embed="rId44"/>
+                    <a:blip r:embed="rId52"/>
                     <a:stretch>
                       <a:fillRect/>
                     </a:stretch>
@@ -3117,7 +3117,7 @@
                   <pic:spPr bwMode="auto">
                     <a:xfrm>
                       <a:off x="0" y="0"/>
-                      <a:ext cx="5334000" cy="4000499"/>
+                      <a:ext cx="5911272" cy="4433454"/>
                     </a:xfrm>
                     <a:prstGeom prst="rect">
                       <a:avLst/>
@@ -3144,12 +3144,14 @@
         <w:t xml:space="preserve">Figure 4: Contour plot Cauchy copula, numerical simulation</w:t>
       </w:r>
     </w:p>
-    <w:bookmarkEnd w:id="47"/>
-    <w:bookmarkEnd w:id="48"/>
+    <w:bookmarkEnd w:id="55"/>
+    <w:bookmarkEnd w:id="56"/>
     <w:sectPr>
-      <w:footnotePr>
-        <w:numRestart w:val="eachSect"/>
-      </w:footnotePr>
+      <w:footerReference r:id="rId8" w:type="default"/>
+      <w:pgSz w:h="15840" w:w="12240"/>
+      <w:pgMar w:bottom="1440" w:footer="720" w:gutter="0" w:header="720" w:left="1440" w:right="1440" w:top="1440"/>
+      <w:cols w:space="720"/>
+      <w:docGrid w:linePitch="360"/>
     </w:sectPr>
   </w:body>
 </w:document>
@@ -3159,6 +3161,51 @@
 <w:comments xmlns:w="http://schemas.openxmlformats.org/wordprocessingml/2006/main" xmlns:m="http://schemas.openxmlformats.org/officeDocument/2006/math" xmlns:r="http://schemas.openxmlformats.org/officeDocument/2006/relationships" xmlns:o="urn:schemas-microsoft-com:office:office" xmlns:v="urn:schemas-microsoft-com:vml" xmlns:w10="urn:schemas-microsoft-com:office:word" xmlns:a="http://schemas.openxmlformats.org/drawingml/2006/main" xmlns:pic="http://schemas.openxmlformats.org/drawingml/2006/picture" xmlns:wp="http://schemas.openxmlformats.org/drawingml/2006/wordprocessingDrawing"/>
 </file>
 
+<file path=word/footer1.xml><?xml version="1.0" encoding="utf-8"?>
+<w:ftr xmlns:wpc="http://schemas.microsoft.com/office/word/2010/wordprocessingCanvas" xmlns:cx="http://schemas.microsoft.com/office/drawing/2014/chartex" xmlns:cx1="http://schemas.microsoft.com/office/drawing/2015/9/8/chartex" xmlns:cx2="http://schemas.microsoft.com/office/drawing/2015/10/21/chartex" xmlns:cx3="http://schemas.microsoft.com/office/drawing/2016/5/9/chartex" xmlns:cx4="http://schemas.microsoft.com/office/drawing/2016/5/10/chartex" xmlns:cx5="http://schemas.microsoft.com/office/drawing/2016/5/11/chartex" xmlns:cx6="http://schemas.microsoft.com/office/drawing/2016/5/12/chartex" xmlns:cx7="http://schemas.microsoft.com/office/drawing/2016/5/13/chartex" xmlns:cx8="http://schemas.microsoft.com/office/drawing/2016/5/14/chartex" xmlns:mc="http://schemas.openxmlformats.org/markup-compatibility/2006" xmlns:aink="http://schemas.microsoft.com/office/drawing/2016/ink" xmlns:am3d="http://schemas.microsoft.com/office/drawing/2017/model3d" xmlns:o="urn:schemas-microsoft-com:office:office" xmlns:oel="http://schemas.microsoft.com/office/2019/extlst" xmlns:r="http://schemas.openxmlformats.org/officeDocument/2006/relationships" xmlns:m="http://schemas.openxmlformats.org/officeDocument/2006/math" xmlns:v="urn:schemas-microsoft-com:vml" xmlns:wp14="http://schemas.microsoft.com/office/word/2010/wordprocessingDrawing" xmlns:wp="http://schemas.openxmlformats.org/drawingml/2006/wordprocessingDrawing" xmlns:w10="urn:schemas-microsoft-com:office:word" xmlns:w="http://schemas.openxmlformats.org/wordprocessingml/2006/main" xmlns:w14="http://schemas.microsoft.com/office/word/2010/wordml" xmlns:w15="http://schemas.microsoft.com/office/word/2012/wordml" xmlns:w16cex="http://schemas.microsoft.com/office/word/2018/wordml/cex" xmlns:w16cid="http://schemas.microsoft.com/office/word/2016/wordml/cid" xmlns:w16="http://schemas.microsoft.com/office/word/2018/wordml" xmlns:w16du="http://schemas.microsoft.com/office/word/2023/wordml/word16du" xmlns:w16sdtdh="http://schemas.microsoft.com/office/word/2020/wordml/sdtdatahash" xmlns:w16sdtfl="http://schemas.microsoft.com/office/word/2024/wordml/sdtformatlock" xmlns:w16se="http://schemas.microsoft.com/office/word/2015/wordml/symex" xmlns:wpg="http://schemas.microsoft.com/office/word/2010/wordprocessingGroup" xmlns:wpi="http://schemas.microsoft.com/office/word/2010/wordprocessingInk" xmlns:wne="http://schemas.microsoft.com/office/word/2006/wordml" xmlns:wps="http://schemas.microsoft.com/office/word/2010/wordprocessingShape" mc:Ignorable="w14 w15 w16se w16cid w16 w16cex w16sdtdh w16sdtfl w16du wp14">
+  <w:sdt>
+    <w:sdtPr>
+      <w:id w:val="757326714"/>
+      <w:docPartObj>
+        <w:docPartGallery w:val="Page Numbers (Bottom of Page)"/>
+        <w:docPartUnique/>
+      </w:docPartObj>
+    </w:sdtPr>
+    <w:sdtContent>
+      <w:p>
+        <w:pPr>
+          <w:pStyle w:val="Footer"/>
+          <w:jc w:val="right"/>
+        </w:pPr>
+        <w:r>
+          <w:fldChar w:fldCharType="begin"/>
+        </w:r>
+        <w:r>
+          <w:instrText>PAGE   \* MERGEFORMAT</w:instrText>
+        </w:r>
+        <w:r>
+          <w:fldChar w:fldCharType="separate"/>
+        </w:r>
+        <w:r>
+          <w:rPr>
+            <w:lang w:val="en-GB"/>
+          </w:rPr>
+          <w:t>2</w:t>
+        </w:r>
+        <w:r>
+          <w:fldChar w:fldCharType="end"/>
+        </w:r>
+      </w:p>
+    </w:sdtContent>
+  </w:sdt>
+  <w:p>
+    <w:pPr>
+      <w:pStyle w:val="Footer"/>
+    </w:pPr>
+  </w:p>
+</w:ftr>
+</file>
+
 <file path=word/footnotes.xml><?xml version="1.0" encoding="utf-8"?>
 <w:footnotes xmlns:w="http://schemas.openxmlformats.org/wordprocessingml/2006/main" xmlns:m="http://schemas.openxmlformats.org/officeDocument/2006/math" xmlns:r="http://schemas.openxmlformats.org/officeDocument/2006/relationships" xmlns:o="urn:schemas-microsoft-com:office:office" xmlns:v="urn:schemas-microsoft-com:vml" xmlns:w10="urn:schemas-microsoft-com:office:word" xmlns:a="http://schemas.openxmlformats.org/drawingml/2006/main" xmlns:pic="http://schemas.openxmlformats.org/drawingml/2006/picture" xmlns:wp="http://schemas.openxmlformats.org/drawingml/2006/wordprocessingDrawing">
   <w:footnote w:type="continuationSeparator" w:id="0">
@@ -3179,7 +3226,94 @@
 </file>
 
 <file path=word/numbering.xml><?xml version="1.0" encoding="utf-8"?>
-<w:numbering xmlns:w="http://schemas.openxmlformats.org/wordprocessingml/2006/main">
+<w:numbering xmlns:aink="http://schemas.microsoft.com/office/drawing/2016/ink" xmlns:am3d="http://schemas.microsoft.com/office/drawing/2017/model3d" xmlns:cx="http://schemas.microsoft.com/office/drawing/2014/chartex" xmlns:cx1="http://schemas.microsoft.com/office/drawing/2015/9/8/chartex" xmlns:cx2="http://schemas.microsoft.com/office/drawing/2015/10/21/chartex" xmlns:cx3="http://schemas.microsoft.com/office/drawing/2016/5/9/chartex" xmlns:cx4="http://schemas.microsoft.com/office/drawing/2016/5/10/chartex" xmlns:cx5="http://schemas.microsoft.com/office/drawing/2016/5/11/chartex" xmlns:cx6="http://schemas.microsoft.com/office/drawing/2016/5/12/chartex" xmlns:cx7="http://schemas.microsoft.com/office/drawing/2016/5/13/chartex" xmlns:cx8="http://schemas.microsoft.com/office/drawing/2016/5/14/chartex" xmlns:m="http://schemas.openxmlformats.org/officeDocument/2006/math" xmlns:mc="http://schemas.openxmlformats.org/markup-compatibility/2006" xmlns:o="urn:schemas-microsoft-com:office:office" xmlns:oel="http://schemas.microsoft.com/office/2019/extlst" xmlns:r="http://schemas.openxmlformats.org/officeDocument/2006/relationships" xmlns:v="urn:schemas-microsoft-com:vml" xmlns:w="http://schemas.openxmlformats.org/wordprocessingml/2006/main" xmlns:w10="urn:schemas-microsoft-com:office:word" xmlns:w14="http://schemas.microsoft.com/office/word/2010/wordml" xmlns:w15="http://schemas.microsoft.com/office/word/2012/wordml" xmlns:w16="http://schemas.microsoft.com/office/word/2018/wordml" xmlns:w16cex="http://schemas.microsoft.com/office/word/2018/wordml/cex" xmlns:w16cid="http://schemas.microsoft.com/office/word/2016/wordml/cid" xmlns:w16du="http://schemas.microsoft.com/office/word/2023/wordml/word16du" xmlns:w16sdtdh="http://schemas.microsoft.com/office/word/2020/wordml/sdtdatahash" xmlns:w16sdtfl="http://schemas.microsoft.com/office/word/2024/wordml/sdtformatlock" xmlns:w16se="http://schemas.microsoft.com/office/word/2015/wordml/symex" xmlns:wne="http://schemas.microsoft.com/office/word/2006/wordml" xmlns:wp="http://schemas.openxmlformats.org/drawingml/2006/wordprocessingDrawing" xmlns:wp14="http://schemas.microsoft.com/office/word/2010/wordprocessingDrawing" xmlns:wpc="http://schemas.microsoft.com/office/word/2010/wordprocessingCanvas" xmlns:wpg="http://schemas.microsoft.com/office/word/2010/wordprocessingGroup" xmlns:wpi="http://schemas.microsoft.com/office/word/2010/wordprocessingInk" xmlns:wps="http://schemas.microsoft.com/office/word/2010/wordprocessingShape" mc:Ignorable="w14 w15 w16se w16cid w16 w16cex w16sdtdh w16sdtfl w16du wp14">
+  <w:abstractNum w15:restartNumberingAfterBreak="0" w:abstractNumId="0">
+    <w:nsid w:val="064666B5"/>
+    <w:multiLevelType w:val="hybridMultilevel"/>
+    <w:tmpl w:val="6DF6F820"/>
+    <w:lvl w:ilvl="0" w:tplc="849CEE18">
+      <w:start w:val="1"/>
+      <w:numFmt w:val="decimal"/>
+      <w:pStyle w:val="Heading1"/>
+      <w:lvlText w:val="%1."/>
+      <w:lvlJc w:val="left"/>
+      <w:pPr>
+        <w:ind w:hanging="360" w:left="720"/>
+      </w:pPr>
+    </w:lvl>
+    <w:lvl w:ilvl="1" w:tentative="1" w:tplc="08090019">
+      <w:start w:val="1"/>
+      <w:numFmt w:val="lowerLetter"/>
+      <w:lvlText w:val="%2."/>
+      <w:lvlJc w:val="left"/>
+      <w:pPr>
+        <w:ind w:hanging="360" w:left="1440"/>
+      </w:pPr>
+    </w:lvl>
+    <w:lvl w:ilvl="2" w:tentative="1" w:tplc="0809001B">
+      <w:start w:val="1"/>
+      <w:numFmt w:val="lowerRoman"/>
+      <w:lvlText w:val="%3."/>
+      <w:lvlJc w:val="right"/>
+      <w:pPr>
+        <w:ind w:hanging="180" w:left="2160"/>
+      </w:pPr>
+    </w:lvl>
+    <w:lvl w:ilvl="3" w:tentative="1" w:tplc="0809000F">
+      <w:start w:val="1"/>
+      <w:numFmt w:val="decimal"/>
+      <w:lvlText w:val="%4."/>
+      <w:lvlJc w:val="left"/>
+      <w:pPr>
+        <w:ind w:hanging="360" w:left="2880"/>
+      </w:pPr>
+    </w:lvl>
+    <w:lvl w:ilvl="4" w:tentative="1" w:tplc="08090019">
+      <w:start w:val="1"/>
+      <w:numFmt w:val="lowerLetter"/>
+      <w:lvlText w:val="%5."/>
+      <w:lvlJc w:val="left"/>
+      <w:pPr>
+        <w:ind w:hanging="360" w:left="3600"/>
+      </w:pPr>
+    </w:lvl>
+    <w:lvl w:ilvl="5" w:tentative="1" w:tplc="0809001B">
+      <w:start w:val="1"/>
+      <w:numFmt w:val="lowerRoman"/>
+      <w:lvlText w:val="%6."/>
+      <w:lvlJc w:val="right"/>
+      <w:pPr>
+        <w:ind w:hanging="180" w:left="4320"/>
+      </w:pPr>
+    </w:lvl>
+    <w:lvl w:ilvl="6" w:tentative="1" w:tplc="0809000F">
+      <w:start w:val="1"/>
+      <w:numFmt w:val="decimal"/>
+      <w:lvlText w:val="%7."/>
+      <w:lvlJc w:val="left"/>
+      <w:pPr>
+        <w:ind w:hanging="360" w:left="5040"/>
+      </w:pPr>
+    </w:lvl>
+    <w:lvl w:ilvl="7" w:tentative="1" w:tplc="08090019">
+      <w:start w:val="1"/>
+      <w:numFmt w:val="lowerLetter"/>
+      <w:lvlText w:val="%8."/>
+      <w:lvlJc w:val="left"/>
+      <w:pPr>
+        <w:ind w:hanging="360" w:left="5760"/>
+      </w:pPr>
+    </w:lvl>
+    <w:lvl w:ilvl="8" w:tentative="1" w:tplc="0809001B">
+      <w:start w:val="1"/>
+      <w:numFmt w:val="lowerRoman"/>
+      <w:lvlText w:val="%9."/>
+      <w:lvlJc w:val="right"/>
+      <w:pPr>
+        <w:ind w:hanging="180" w:left="6480"/>
+      </w:pPr>
+    </w:lvl>
+  </w:abstractNum>
   <w:abstractNum w:abstractNumId="990">
     <w:nsid w:val="0000A990"/>
     <w:multiLevelType w:val="multilevel"/>
@@ -3444,6 +3578,9 @@
       </w:pPr>
     </w:lvl>
   </w:abstractNum>
+  <w:num w16cid:durableId="1577596047" w:numId="1">
+    <w:abstractNumId w:val="0"/>
+  </w:num>
   <w:num w:numId="1000">
     <w:abstractNumId w:val="990"/>
   </w:num>
@@ -3493,199 +3630,429 @@
 </file>
 
 <file path=word/styles.xml><?xml version="1.0" encoding="utf-8"?>
-<w:styles xmlns:r="http://schemas.openxmlformats.org/officeDocument/2006/relationships" xmlns:w="http://schemas.openxmlformats.org/wordprocessingml/2006/main">
+<w:styles xmlns:mc="http://schemas.openxmlformats.org/markup-compatibility/2006" xmlns:r="http://schemas.openxmlformats.org/officeDocument/2006/relationships" xmlns:w="http://schemas.openxmlformats.org/wordprocessingml/2006/main" xmlns:w14="http://schemas.microsoft.com/office/word/2010/wordml" xmlns:w15="http://schemas.microsoft.com/office/word/2012/wordml" xmlns:w16="http://schemas.microsoft.com/office/word/2018/wordml" xmlns:w16cex="http://schemas.microsoft.com/office/word/2018/wordml/cex" xmlns:w16cid="http://schemas.microsoft.com/office/word/2016/wordml/cid" xmlns:w16du="http://schemas.microsoft.com/office/word/2023/wordml/word16du" xmlns:w16sdtdh="http://schemas.microsoft.com/office/word/2020/wordml/sdtdatahash" xmlns:w16sdtfl="http://schemas.microsoft.com/office/word/2024/wordml/sdtformatlock" xmlns:w16se="http://schemas.microsoft.com/office/word/2015/wordml/symex" mc:Ignorable="w14 w15 w16se w16cid w16 w16cex w16sdtdh w16sdtfl w16du">
   <w:docDefaults>
     <w:rPrDefault>
       <w:rPr>
         <w:rFonts w:asciiTheme="minorHAnsi" w:cstheme="minorBidi" w:eastAsiaTheme="minorEastAsia" w:hAnsiTheme="minorHAnsi"/>
         <w:sz w:val="24"/>
         <w:szCs w:val="24"/>
-        <w:lang w:bidi="ar-SA" w:eastAsia="zh-CN" w:val="en-US"/>
+        <w:lang w:bidi="ar-SA" w:eastAsia="ja-JP" w:val="en-US"/>
       </w:rPr>
     </w:rPrDefault>
     <w:pPrDefault>
       <w:pPr>
-        <w:spacing w:after="200"/>
+        <w:spacing w:after="160" w:line="279" w:lineRule="auto"/>
       </w:pPr>
     </w:pPrDefault>
   </w:docDefaults>
-  <w:latentStyles w:count="276" w:defLockedState="0" w:defQFormat="0" w:defSemiHidden="0" w:defUIPriority="0" w:defUnhideWhenUsed="0"/>
+  <w:latentStyles w:count="376" w:defLockedState="0" w:defQFormat="0" w:defSemiHidden="0" w:defUIPriority="99" w:defUnhideWhenUsed="0">
+    <w:lsdException w:name="Normal" w:qFormat="1" w:uiPriority="0"/>
+    <w:lsdException w:name="heading 1" w:qFormat="1" w:uiPriority="0"/>
+    <w:lsdException w:name="heading 2" w:qFormat="1" w:semiHidden="1" w:uiPriority="9" w:unhideWhenUsed="1"/>
+    <w:lsdException w:name="heading 3" w:qFormat="1" w:semiHidden="1" w:uiPriority="9" w:unhideWhenUsed="1"/>
+    <w:lsdException w:name="heading 4" w:qFormat="1" w:semiHidden="1" w:uiPriority="9" w:unhideWhenUsed="1"/>
+    <w:lsdException w:name="heading 5" w:qFormat="1" w:semiHidden="1" w:uiPriority="9" w:unhideWhenUsed="1"/>
+    <w:lsdException w:name="heading 6" w:qFormat="1" w:semiHidden="1" w:uiPriority="9" w:unhideWhenUsed="1"/>
+    <w:lsdException w:name="heading 7" w:qFormat="1" w:semiHidden="1" w:uiPriority="9" w:unhideWhenUsed="1"/>
+    <w:lsdException w:name="heading 8" w:qFormat="1" w:semiHidden="1" w:uiPriority="9" w:unhideWhenUsed="1"/>
+    <w:lsdException w:name="heading 9" w:qFormat="1" w:semiHidden="1" w:uiPriority="9" w:unhideWhenUsed="1"/>
+    <w:lsdException w:name="index 1" w:semiHidden="1" w:unhideWhenUsed="1"/>
+    <w:lsdException w:name="index 2" w:semiHidden="1" w:unhideWhenUsed="1"/>
+    <w:lsdException w:name="index 3" w:semiHidden="1" w:unhideWhenUsed="1"/>
+    <w:lsdException w:name="index 4" w:semiHidden="1" w:unhideWhenUsed="1"/>
+    <w:lsdException w:name="index 5" w:semiHidden="1" w:unhideWhenUsed="1"/>
+    <w:lsdException w:name="index 6" w:semiHidden="1" w:unhideWhenUsed="1"/>
+    <w:lsdException w:name="index 7" w:semiHidden="1" w:unhideWhenUsed="1"/>
+    <w:lsdException w:name="index 8" w:semiHidden="1" w:unhideWhenUsed="1"/>
+    <w:lsdException w:name="index 9" w:semiHidden="1" w:unhideWhenUsed="1"/>
+    <w:lsdException w:name="toc 1" w:semiHidden="1" w:uiPriority="39" w:unhideWhenUsed="1"/>
+    <w:lsdException w:name="toc 2" w:semiHidden="1" w:uiPriority="39" w:unhideWhenUsed="1"/>
+    <w:lsdException w:name="toc 3" w:semiHidden="1" w:uiPriority="39" w:unhideWhenUsed="1"/>
+    <w:lsdException w:name="toc 4" w:semiHidden="1" w:uiPriority="39" w:unhideWhenUsed="1"/>
+    <w:lsdException w:name="toc 5" w:semiHidden="1" w:uiPriority="39" w:unhideWhenUsed="1"/>
+    <w:lsdException w:name="toc 6" w:semiHidden="1" w:uiPriority="39" w:unhideWhenUsed="1"/>
+    <w:lsdException w:name="toc 7" w:semiHidden="1" w:uiPriority="39" w:unhideWhenUsed="1"/>
+    <w:lsdException w:name="toc 8" w:semiHidden="1" w:uiPriority="39" w:unhideWhenUsed="1"/>
+    <w:lsdException w:name="toc 9" w:semiHidden="1" w:uiPriority="39" w:unhideWhenUsed="1"/>
+    <w:lsdException w:name="Normal Indent" w:semiHidden="1" w:unhideWhenUsed="1"/>
+    <w:lsdException w:name="footnote text" w:semiHidden="1" w:unhideWhenUsed="1"/>
+    <w:lsdException w:name="annotation text" w:semiHidden="1" w:unhideWhenUsed="1"/>
+    <w:lsdException w:name="header" w:semiHidden="1" w:unhideWhenUsed="1"/>
+    <w:lsdException w:name="footer" w:semiHidden="1" w:unhideWhenUsed="1"/>
+    <w:lsdException w:name="index heading" w:semiHidden="1" w:unhideWhenUsed="1"/>
+    <w:lsdException w:name="caption" w:qFormat="1" w:semiHidden="1" w:uiPriority="35" w:unhideWhenUsed="1"/>
+    <w:lsdException w:name="table of figures" w:semiHidden="1" w:unhideWhenUsed="1"/>
+    <w:lsdException w:name="envelope address" w:semiHidden="1" w:unhideWhenUsed="1"/>
+    <w:lsdException w:name="envelope return" w:semiHidden="1" w:unhideWhenUsed="1"/>
+    <w:lsdException w:name="footnote reference" w:semiHidden="1" w:unhideWhenUsed="1"/>
+    <w:lsdException w:name="annotation reference" w:semiHidden="1" w:unhideWhenUsed="1"/>
+    <w:lsdException w:name="line number" w:semiHidden="1" w:unhideWhenUsed="1"/>
+    <w:lsdException w:name="page number" w:semiHidden="1" w:unhideWhenUsed="1"/>
+    <w:lsdException w:name="endnote reference" w:semiHidden="1" w:unhideWhenUsed="1"/>
+    <w:lsdException w:name="endnote text" w:semiHidden="1" w:unhideWhenUsed="1"/>
+    <w:lsdException w:name="table of authorities" w:semiHidden="1" w:unhideWhenUsed="1"/>
+    <w:lsdException w:name="macro" w:semiHidden="1" w:unhideWhenUsed="1"/>
+    <w:lsdException w:name="toa heading" w:semiHidden="1" w:unhideWhenUsed="1"/>
+    <w:lsdException w:name="List" w:semiHidden="1" w:unhideWhenUsed="1"/>
+    <w:lsdException w:name="List Bullet" w:semiHidden="1" w:unhideWhenUsed="1"/>
+    <w:lsdException w:name="List Number" w:semiHidden="1" w:unhideWhenUsed="1"/>
+    <w:lsdException w:name="List 2" w:semiHidden="1" w:unhideWhenUsed="1"/>
+    <w:lsdException w:name="List 3" w:semiHidden="1" w:unhideWhenUsed="1"/>
+    <w:lsdException w:name="List 4" w:semiHidden="1" w:unhideWhenUsed="1"/>
+    <w:lsdException w:name="List 5" w:semiHidden="1" w:unhideWhenUsed="1"/>
+    <w:lsdException w:name="List Bullet 2" w:semiHidden="1" w:unhideWhenUsed="1"/>
+    <w:lsdException w:name="List Bullet 3" w:semiHidden="1" w:unhideWhenUsed="1"/>
+    <w:lsdException w:name="List Bullet 4" w:semiHidden="1" w:unhideWhenUsed="1"/>
+    <w:lsdException w:name="List Bullet 5" w:semiHidden="1" w:unhideWhenUsed="1"/>
+    <w:lsdException w:name="List Number 2" w:semiHidden="1" w:unhideWhenUsed="1"/>
+    <w:lsdException w:name="List Number 3" w:semiHidden="1" w:unhideWhenUsed="1"/>
+    <w:lsdException w:name="List Number 4" w:semiHidden="1" w:unhideWhenUsed="1"/>
+    <w:lsdException w:name="List Number 5" w:semiHidden="1" w:unhideWhenUsed="1"/>
+    <w:lsdException w:name="Title" w:qFormat="1" w:uiPriority="10"/>
+    <w:lsdException w:name="Closing" w:semiHidden="1" w:unhideWhenUsed="1"/>
+    <w:lsdException w:name="Signature" w:semiHidden="1" w:unhideWhenUsed="1"/>
+    <w:lsdException w:name="Default Paragraph Font" w:semiHidden="1" w:uiPriority="1" w:unhideWhenUsed="1"/>
+    <w:lsdException w:name="Body Text" w:semiHidden="1" w:unhideWhenUsed="1"/>
+    <w:lsdException w:name="Body Text Indent" w:semiHidden="1" w:unhideWhenUsed="1"/>
+    <w:lsdException w:name="List Continue" w:semiHidden="1" w:unhideWhenUsed="1"/>
+    <w:lsdException w:name="List Continue 2" w:semiHidden="1" w:unhideWhenUsed="1"/>
+    <w:lsdException w:name="List Continue 3" w:semiHidden="1" w:unhideWhenUsed="1"/>
+    <w:lsdException w:name="List Continue 4" w:semiHidden="1" w:unhideWhenUsed="1"/>
+    <w:lsdException w:name="List Continue 5" w:semiHidden="1" w:unhideWhenUsed="1"/>
+    <w:lsdException w:name="Message Header" w:semiHidden="1" w:unhideWhenUsed="1"/>
+    <w:lsdException w:name="Subtitle" w:qFormat="1" w:uiPriority="11"/>
+    <w:lsdException w:name="Salutation" w:semiHidden="1" w:unhideWhenUsed="1"/>
+    <w:lsdException w:name="Date" w:semiHidden="1" w:unhideWhenUsed="1"/>
+    <w:lsdException w:name="Body Text First Indent" w:semiHidden="1" w:unhideWhenUsed="1"/>
+    <w:lsdException w:name="Body Text First Indent 2" w:semiHidden="1" w:unhideWhenUsed="1"/>
+    <w:lsdException w:name="Note Heading" w:semiHidden="1" w:unhideWhenUsed="1"/>
+    <w:lsdException w:name="Body Text 2" w:semiHidden="1" w:unhideWhenUsed="1"/>
+    <w:lsdException w:name="Body Text 3" w:semiHidden="1" w:unhideWhenUsed="1"/>
+    <w:lsdException w:name="Body Text Indent 2" w:semiHidden="1" w:unhideWhenUsed="1"/>
+    <w:lsdException w:name="Body Text Indent 3" w:semiHidden="1" w:unhideWhenUsed="1"/>
+    <w:lsdException w:name="Block Text" w:semiHidden="1" w:unhideWhenUsed="1"/>
+    <w:lsdException w:name="Hyperlink" w:semiHidden="1" w:unhideWhenUsed="1"/>
+    <w:lsdException w:name="FollowedHyperlink" w:semiHidden="1" w:unhideWhenUsed="1"/>
+    <w:lsdException w:name="Strong" w:qFormat="1" w:uiPriority="22"/>
+    <w:lsdException w:name="Emphasis" w:qFormat="1" w:uiPriority="20"/>
+    <w:lsdException w:name="Document Map" w:semiHidden="1" w:unhideWhenUsed="1"/>
+    <w:lsdException w:name="Plain Text" w:semiHidden="1" w:unhideWhenUsed="1"/>
+    <w:lsdException w:name="E-mail Signature" w:semiHidden="1" w:unhideWhenUsed="1"/>
+    <w:lsdException w:name="HTML Top of Form" w:semiHidden="1" w:unhideWhenUsed="1"/>
+    <w:lsdException w:name="HTML Bottom of Form" w:semiHidden="1" w:unhideWhenUsed="1"/>
+    <w:lsdException w:name="Normal (Web)" w:semiHidden="1" w:unhideWhenUsed="1"/>
+    <w:lsdException w:name="HTML Acronym" w:semiHidden="1" w:unhideWhenUsed="1"/>
+    <w:lsdException w:name="HTML Address" w:semiHidden="1" w:unhideWhenUsed="1"/>
+    <w:lsdException w:name="HTML Cite" w:semiHidden="1" w:unhideWhenUsed="1"/>
+    <w:lsdException w:name="HTML Code" w:semiHidden="1" w:unhideWhenUsed="1"/>
+    <w:lsdException w:name="HTML Definition" w:semiHidden="1" w:unhideWhenUsed="1"/>
+    <w:lsdException w:name="HTML Keyboard" w:semiHidden="1" w:unhideWhenUsed="1"/>
+    <w:lsdException w:name="HTML Preformatted" w:semiHidden="1" w:unhideWhenUsed="1"/>
+    <w:lsdException w:name="HTML Sample" w:semiHidden="1" w:unhideWhenUsed="1"/>
+    <w:lsdException w:name="HTML Typewriter" w:semiHidden="1" w:unhideWhenUsed="1"/>
+    <w:lsdException w:name="HTML Variable" w:semiHidden="1" w:unhideWhenUsed="1"/>
+    <w:lsdException w:name="Normal Table" w:semiHidden="1" w:unhideWhenUsed="1"/>
+    <w:lsdException w:name="annotation subject" w:semiHidden="1" w:unhideWhenUsed="1"/>
+    <w:lsdException w:name="No List" w:semiHidden="1" w:unhideWhenUsed="1"/>
+    <w:lsdException w:name="Outline List 1" w:semiHidden="1" w:unhideWhenUsed="1"/>
+    <w:lsdException w:name="Outline List 2" w:semiHidden="1" w:unhideWhenUsed="1"/>
+    <w:lsdException w:name="Outline List 3" w:semiHidden="1" w:unhideWhenUsed="1"/>
+    <w:lsdException w:name="Table Simple 1" w:semiHidden="1" w:unhideWhenUsed="1"/>
+    <w:lsdException w:name="Table Simple 2" w:semiHidden="1" w:unhideWhenUsed="1"/>
+    <w:lsdException w:name="Table Simple 3" w:semiHidden="1" w:unhideWhenUsed="1"/>
+    <w:lsdException w:name="Table Classic 1" w:semiHidden="1" w:unhideWhenUsed="1"/>
+    <w:lsdException w:name="Table Classic 2" w:semiHidden="1" w:unhideWhenUsed="1"/>
+    <w:lsdException w:name="Table Classic 3" w:semiHidden="1" w:unhideWhenUsed="1"/>
+    <w:lsdException w:name="Table Classic 4" w:semiHidden="1" w:unhideWhenUsed="1"/>
+    <w:lsdException w:name="Table Colorful 1" w:semiHidden="1" w:unhideWhenUsed="1"/>
+    <w:lsdException w:name="Table Colorful 2" w:semiHidden="1" w:unhideWhenUsed="1"/>
+    <w:lsdException w:name="Table Colorful 3" w:semiHidden="1" w:unhideWhenUsed="1"/>
+    <w:lsdException w:name="Table Columns 1" w:semiHidden="1" w:unhideWhenUsed="1"/>
+    <w:lsdException w:name="Table Columns 2" w:semiHidden="1" w:unhideWhenUsed="1"/>
+    <w:lsdException w:name="Table Columns 3" w:semiHidden="1" w:unhideWhenUsed="1"/>
+    <w:lsdException w:name="Table Columns 4" w:semiHidden="1" w:unhideWhenUsed="1"/>
+    <w:lsdException w:name="Table Columns 5" w:semiHidden="1" w:unhideWhenUsed="1"/>
+    <w:lsdException w:name="Table Grid 1" w:semiHidden="1" w:unhideWhenUsed="1"/>
+    <w:lsdException w:name="Table Grid 2" w:semiHidden="1" w:unhideWhenUsed="1"/>
+    <w:lsdException w:name="Table Grid 3" w:semiHidden="1" w:unhideWhenUsed="1"/>
+    <w:lsdException w:name="Table Grid 4" w:semiHidden="1" w:unhideWhenUsed="1"/>
+    <w:lsdException w:name="Table Grid 5" w:semiHidden="1" w:unhideWhenUsed="1"/>
+    <w:lsdException w:name="Table Grid 6" w:semiHidden="1" w:unhideWhenUsed="1"/>
+    <w:lsdException w:name="Table Grid 7" w:semiHidden="1" w:unhideWhenUsed="1"/>
+    <w:lsdException w:name="Table Grid 8" w:semiHidden="1" w:unhideWhenUsed="1"/>
+    <w:lsdException w:name="Table List 1" w:semiHidden="1" w:unhideWhenUsed="1"/>
+    <w:lsdException w:name="Table List 2" w:semiHidden="1" w:unhideWhenUsed="1"/>
+    <w:lsdException w:name="Table List 3" w:semiHidden="1" w:unhideWhenUsed="1"/>
+    <w:lsdException w:name="Table List 4" w:semiHidden="1" w:unhideWhenUsed="1"/>
+    <w:lsdException w:name="Table List 5" w:semiHidden="1" w:unhideWhenUsed="1"/>
+    <w:lsdException w:name="Table List 6" w:semiHidden="1" w:unhideWhenUsed="1"/>
+    <w:lsdException w:name="Table List 7" w:semiHidden="1" w:unhideWhenUsed="1"/>
+    <w:lsdException w:name="Table List 8" w:semiHidden="1" w:unhideWhenUsed="1"/>
+    <w:lsdException w:name="Table 3D effects 1" w:semiHidden="1" w:unhideWhenUsed="1"/>
+    <w:lsdException w:name="Table 3D effects 2" w:semiHidden="1" w:unhideWhenUsed="1"/>
+    <w:lsdException w:name="Table 3D effects 3" w:semiHidden="1" w:unhideWhenUsed="1"/>
+    <w:lsdException w:name="Table Contemporary" w:semiHidden="1" w:unhideWhenUsed="1"/>
+    <w:lsdException w:name="Table Elegant" w:semiHidden="1" w:unhideWhenUsed="1"/>
+    <w:lsdException w:name="Table Professional" w:semiHidden="1" w:unhideWhenUsed="1"/>
+    <w:lsdException w:name="Table Subtle 1" w:semiHidden="1" w:unhideWhenUsed="1"/>
+    <w:lsdException w:name="Table Subtle 2" w:semiHidden="1" w:unhideWhenUsed="1"/>
+    <w:lsdException w:name="Table Web 1" w:semiHidden="1" w:unhideWhenUsed="1"/>
+    <w:lsdException w:name="Table Web 2" w:semiHidden="1" w:unhideWhenUsed="1"/>
+    <w:lsdException w:name="Table Web 3" w:semiHidden="1" w:unhideWhenUsed="1"/>
+    <w:lsdException w:name="Balloon Text" w:semiHidden="1" w:unhideWhenUsed="1"/>
+    <w:lsdException w:name="Table Grid" w:uiPriority="39"/>
+    <w:lsdException w:name="Table Theme" w:semiHidden="1" w:unhideWhenUsed="1"/>
+    <w:lsdException w:name="Placeholder Text" w:semiHidden="1"/>
+    <w:lsdException w:name="No Spacing" w:qFormat="1" w:uiPriority="1"/>
+    <w:lsdException w:name="Light Shading" w:uiPriority="60"/>
+    <w:lsdException w:name="Light List" w:uiPriority="61"/>
+    <w:lsdException w:name="Light Grid" w:uiPriority="62"/>
+    <w:lsdException w:name="Medium Shading 1" w:uiPriority="63"/>
+    <w:lsdException w:name="Medium Shading 2" w:uiPriority="64"/>
+    <w:lsdException w:name="Medium List 1" w:uiPriority="65"/>
+    <w:lsdException w:name="Medium List 2" w:uiPriority="66"/>
+    <w:lsdException w:name="Medium Grid 1" w:uiPriority="67"/>
+    <w:lsdException w:name="Medium Grid 2" w:uiPriority="68"/>
+    <w:lsdException w:name="Medium Grid 3" w:uiPriority="69"/>
+    <w:lsdException w:name="Dark List" w:uiPriority="70"/>
+    <w:lsdException w:name="Colorful Shading" w:uiPriority="71"/>
+    <w:lsdException w:name="Colorful List" w:uiPriority="72"/>
+    <w:lsdException w:name="Colorful Grid" w:uiPriority="73"/>
+    <w:lsdException w:name="Light Shading Accent 1" w:uiPriority="60"/>
+    <w:lsdException w:name="Light List Accent 1" w:uiPriority="61"/>
+    <w:lsdException w:name="Light Grid Accent 1" w:uiPriority="62"/>
+    <w:lsdException w:name="Medium Shading 1 Accent 1" w:uiPriority="63"/>
+    <w:lsdException w:name="Medium Shading 2 Accent 1" w:uiPriority="64"/>
+    <w:lsdException w:name="Medium List 1 Accent 1" w:uiPriority="65"/>
+    <w:lsdException w:name="Revision" w:semiHidden="1"/>
+    <w:lsdException w:name="List Paragraph" w:qFormat="1" w:uiPriority="34"/>
+    <w:lsdException w:name="Quote" w:qFormat="1" w:uiPriority="29"/>
+    <w:lsdException w:name="Intense Quote" w:qFormat="1" w:uiPriority="30"/>
+    <w:lsdException w:name="Medium List 2 Accent 1" w:uiPriority="66"/>
+    <w:lsdException w:name="Medium Grid 1 Accent 1" w:uiPriority="67"/>
+    <w:lsdException w:name="Medium Grid 2 Accent 1" w:uiPriority="68"/>
+    <w:lsdException w:name="Medium Grid 3 Accent 1" w:uiPriority="69"/>
+    <w:lsdException w:name="Dark List Accent 1" w:uiPriority="70"/>
+    <w:lsdException w:name="Colorful Shading Accent 1" w:uiPriority="71"/>
+    <w:lsdException w:name="Colorful List Accent 1" w:uiPriority="72"/>
+    <w:lsdException w:name="Colorful Grid Accent 1" w:uiPriority="73"/>
+    <w:lsdException w:name="Light Shading Accent 2" w:uiPriority="60"/>
+    <w:lsdException w:name="Light List Accent 2" w:uiPriority="61"/>
+    <w:lsdException w:name="Light Grid Accent 2" w:uiPriority="62"/>
+    <w:lsdException w:name="Medium Shading 1 Accent 2" w:uiPriority="63"/>
+    <w:lsdException w:name="Medium Shading 2 Accent 2" w:uiPriority="64"/>
+    <w:lsdException w:name="Medium List 1 Accent 2" w:uiPriority="65"/>
+    <w:lsdException w:name="Medium List 2 Accent 2" w:uiPriority="66"/>
+    <w:lsdException w:name="Medium Grid 1 Accent 2" w:uiPriority="67"/>
+    <w:lsdException w:name="Medium Grid 2 Accent 2" w:uiPriority="68"/>
+    <w:lsdException w:name="Medium Grid 3 Accent 2" w:uiPriority="69"/>
+    <w:lsdException w:name="Dark List Accent 2" w:uiPriority="70"/>
+    <w:lsdException w:name="Colorful Shading Accent 2" w:uiPriority="71"/>
+    <w:lsdException w:name="Colorful List Accent 2" w:uiPriority="72"/>
+    <w:lsdException w:name="Colorful Grid Accent 2" w:uiPriority="73"/>
+    <w:lsdException w:name="Light Shading Accent 3" w:uiPriority="60"/>
+    <w:lsdException w:name="Light List Accent 3" w:uiPriority="61"/>
+    <w:lsdException w:name="Light Grid Accent 3" w:uiPriority="62"/>
+    <w:lsdException w:name="Medium Shading 1 Accent 3" w:uiPriority="63"/>
+    <w:lsdException w:name="Medium Shading 2 Accent 3" w:uiPriority="64"/>
+    <w:lsdException w:name="Medium List 1 Accent 3" w:uiPriority="65"/>
+    <w:lsdException w:name="Medium List 2 Accent 3" w:uiPriority="66"/>
+    <w:lsdException w:name="Medium Grid 1 Accent 3" w:uiPriority="67"/>
+    <w:lsdException w:name="Medium Grid 2 Accent 3" w:uiPriority="68"/>
+    <w:lsdException w:name="Medium Grid 3 Accent 3" w:uiPriority="69"/>
+    <w:lsdException w:name="Dark List Accent 3" w:uiPriority="70"/>
+    <w:lsdException w:name="Colorful Shading Accent 3" w:uiPriority="71"/>
+    <w:lsdException w:name="Colorful List Accent 3" w:uiPriority="72"/>
+    <w:lsdException w:name="Colorful Grid Accent 3" w:uiPriority="73"/>
+    <w:lsdException w:name="Light Shading Accent 4" w:uiPriority="60"/>
+    <w:lsdException w:name="Light List Accent 4" w:uiPriority="61"/>
+    <w:lsdException w:name="Light Grid Accent 4" w:uiPriority="62"/>
+    <w:lsdException w:name="Medium Shading 1 Accent 4" w:uiPriority="63"/>
+    <w:lsdException w:name="Medium Shading 2 Accent 4" w:uiPriority="64"/>
+    <w:lsdException w:name="Medium List 1 Accent 4" w:uiPriority="65"/>
+    <w:lsdException w:name="Medium List 2 Accent 4" w:uiPriority="66"/>
+    <w:lsdException w:name="Medium Grid 1 Accent 4" w:uiPriority="67"/>
+    <w:lsdException w:name="Medium Grid 2 Accent 4" w:uiPriority="68"/>
+    <w:lsdException w:name="Medium Grid 3 Accent 4" w:uiPriority="69"/>
+    <w:lsdException w:name="Dark List Accent 4" w:uiPriority="70"/>
+    <w:lsdException w:name="Colorful Shading Accent 4" w:uiPriority="71"/>
+    <w:lsdException w:name="Colorful List Accent 4" w:uiPriority="72"/>
+    <w:lsdException w:name="Colorful Grid Accent 4" w:uiPriority="73"/>
+    <w:lsdException w:name="Light Shading Accent 5" w:uiPriority="60"/>
+    <w:lsdException w:name="Light List Accent 5" w:uiPriority="61"/>
+    <w:lsdException w:name="Light Grid Accent 5" w:uiPriority="62"/>
+    <w:lsdException w:name="Medium Shading 1 Accent 5" w:uiPriority="63"/>
+    <w:lsdException w:name="Medium Shading 2 Accent 5" w:uiPriority="64"/>
+    <w:lsdException w:name="Medium List 1 Accent 5" w:uiPriority="65"/>
+    <w:lsdException w:name="Medium List 2 Accent 5" w:uiPriority="66"/>
+    <w:lsdException w:name="Medium Grid 1 Accent 5" w:uiPriority="67"/>
+    <w:lsdException w:name="Medium Grid 2 Accent 5" w:uiPriority="68"/>
+    <w:lsdException w:name="Medium Grid 3 Accent 5" w:uiPriority="69"/>
+    <w:lsdException w:name="Dark List Accent 5" w:uiPriority="70"/>
+    <w:lsdException w:name="Colorful Shading Accent 5" w:uiPriority="71"/>
+    <w:lsdException w:name="Colorful List Accent 5" w:uiPriority="72"/>
+    <w:lsdException w:name="Colorful Grid Accent 5" w:uiPriority="73"/>
+    <w:lsdException w:name="Light Shading Accent 6" w:uiPriority="60"/>
+    <w:lsdException w:name="Light List Accent 6" w:uiPriority="61"/>
+    <w:lsdException w:name="Light Grid Accent 6" w:uiPriority="62"/>
+    <w:lsdException w:name="Medium Shading 1 Accent 6" w:uiPriority="63"/>
+    <w:lsdException w:name="Medium Shading 2 Accent 6" w:uiPriority="64"/>
+    <w:lsdException w:name="Medium List 1 Accent 6" w:uiPriority="65"/>
+    <w:lsdException w:name="Medium List 2 Accent 6" w:uiPriority="66"/>
+    <w:lsdException w:name="Medium Grid 1 Accent 6" w:uiPriority="67"/>
+    <w:lsdException w:name="Medium Grid 2 Accent 6" w:uiPriority="68"/>
+    <w:lsdException w:name="Medium Grid 3 Accent 6" w:uiPriority="69"/>
+    <w:lsdException w:name="Dark List Accent 6" w:uiPriority="70"/>
+    <w:lsdException w:name="Colorful Shading Accent 6" w:uiPriority="71"/>
+    <w:lsdException w:name="Colorful List Accent 6" w:uiPriority="72"/>
+    <w:lsdException w:name="Colorful Grid Accent 6" w:uiPriority="73"/>
+    <w:lsdException w:name="Subtle Emphasis" w:qFormat="1" w:uiPriority="19"/>
+    <w:lsdException w:name="Intense Emphasis" w:qFormat="1" w:uiPriority="21"/>
+    <w:lsdException w:name="Subtle Reference" w:qFormat="1" w:uiPriority="31"/>
+    <w:lsdException w:name="Intense Reference" w:qFormat="1" w:uiPriority="32"/>
+    <w:lsdException w:name="Book Title" w:qFormat="1" w:uiPriority="33"/>
+    <w:lsdException w:name="Bibliography" w:semiHidden="1" w:uiPriority="37" w:unhideWhenUsed="1"/>
+    <w:lsdException w:name="TOC Heading" w:qFormat="1" w:semiHidden="1" w:uiPriority="39" w:unhideWhenUsed="1"/>
+    <w:lsdException w:name="Plain Table 1" w:uiPriority="41"/>
+    <w:lsdException w:name="Plain Table 2" w:uiPriority="42"/>
+    <w:lsdException w:name="Plain Table 3" w:uiPriority="43"/>
+    <w:lsdException w:name="Plain Table 4" w:uiPriority="44"/>
+    <w:lsdException w:name="Plain Table 5" w:uiPriority="45"/>
+    <w:lsdException w:name="Grid Table Light" w:uiPriority="40"/>
+    <w:lsdException w:name="Grid Table 1 Light" w:uiPriority="46"/>
+    <w:lsdException w:name="Grid Table 2" w:uiPriority="47"/>
+    <w:lsdException w:name="Grid Table 3" w:uiPriority="48"/>
+    <w:lsdException w:name="Grid Table 4" w:uiPriority="49"/>
+    <w:lsdException w:name="Grid Table 5 Dark" w:uiPriority="50"/>
+    <w:lsdException w:name="Grid Table 6 Colorful" w:uiPriority="51"/>
+    <w:lsdException w:name="Grid Table 7 Colorful" w:uiPriority="52"/>
+    <w:lsdException w:name="Grid Table 1 Light Accent 1" w:uiPriority="46"/>
+    <w:lsdException w:name="Grid Table 2 Accent 1" w:uiPriority="47"/>
+    <w:lsdException w:name="Grid Table 3 Accent 1" w:uiPriority="48"/>
+    <w:lsdException w:name="Grid Table 4 Accent 1" w:uiPriority="49"/>
+    <w:lsdException w:name="Grid Table 5 Dark Accent 1" w:uiPriority="50"/>
+    <w:lsdException w:name="Grid Table 6 Colorful Accent 1" w:uiPriority="51"/>
+    <w:lsdException w:name="Grid Table 7 Colorful Accent 1" w:uiPriority="52"/>
+    <w:lsdException w:name="Grid Table 1 Light Accent 2" w:uiPriority="46"/>
+    <w:lsdException w:name="Grid Table 2 Accent 2" w:uiPriority="47"/>
+    <w:lsdException w:name="Grid Table 3 Accent 2" w:uiPriority="48"/>
+    <w:lsdException w:name="Grid Table 4 Accent 2" w:uiPriority="49"/>
+    <w:lsdException w:name="Grid Table 5 Dark Accent 2" w:uiPriority="50"/>
+    <w:lsdException w:name="Grid Table 6 Colorful Accent 2" w:uiPriority="51"/>
+    <w:lsdException w:name="Grid Table 7 Colorful Accent 2" w:uiPriority="52"/>
+    <w:lsdException w:name="Grid Table 1 Light Accent 3" w:uiPriority="46"/>
+    <w:lsdException w:name="Grid Table 2 Accent 3" w:uiPriority="47"/>
+    <w:lsdException w:name="Grid Table 3 Accent 3" w:uiPriority="48"/>
+    <w:lsdException w:name="Grid Table 4 Accent 3" w:uiPriority="49"/>
+    <w:lsdException w:name="Grid Table 5 Dark Accent 3" w:uiPriority="50"/>
+    <w:lsdException w:name="Grid Table 6 Colorful Accent 3" w:uiPriority="51"/>
+    <w:lsdException w:name="Grid Table 7 Colorful Accent 3" w:uiPriority="52"/>
+    <w:lsdException w:name="Grid Table 1 Light Accent 4" w:uiPriority="46"/>
+    <w:lsdException w:name="Grid Table 2 Accent 4" w:uiPriority="47"/>
+    <w:lsdException w:name="Grid Table 3 Accent 4" w:uiPriority="48"/>
+    <w:lsdException w:name="Grid Table 4 Accent 4" w:uiPriority="49"/>
+    <w:lsdException w:name="Grid Table 5 Dark Accent 4" w:uiPriority="50"/>
+    <w:lsdException w:name="Grid Table 6 Colorful Accent 4" w:uiPriority="51"/>
+    <w:lsdException w:name="Grid Table 7 Colorful Accent 4" w:uiPriority="52"/>
+    <w:lsdException w:name="Grid Table 1 Light Accent 5" w:uiPriority="46"/>
+    <w:lsdException w:name="Grid Table 2 Accent 5" w:uiPriority="47"/>
+    <w:lsdException w:name="Grid Table 3 Accent 5" w:uiPriority="48"/>
+    <w:lsdException w:name="Grid Table 4 Accent 5" w:uiPriority="49"/>
+    <w:lsdException w:name="Grid Table 5 Dark Accent 5" w:uiPriority="50"/>
+    <w:lsdException w:name="Grid Table 6 Colorful Accent 5" w:uiPriority="51"/>
+    <w:lsdException w:name="Grid Table 7 Colorful Accent 5" w:uiPriority="52"/>
+    <w:lsdException w:name="Grid Table 1 Light Accent 6" w:uiPriority="46"/>
+    <w:lsdException w:name="Grid Table 2 Accent 6" w:uiPriority="47"/>
+    <w:lsdException w:name="Grid Table 3 Accent 6" w:uiPriority="48"/>
+    <w:lsdException w:name="Grid Table 4 Accent 6" w:uiPriority="49"/>
+    <w:lsdException w:name="Grid Table 5 Dark Accent 6" w:uiPriority="50"/>
+    <w:lsdException w:name="Grid Table 6 Colorful Accent 6" w:uiPriority="51"/>
+    <w:lsdException w:name="Grid Table 7 Colorful Accent 6" w:uiPriority="52"/>
+    <w:lsdException w:name="List Table 1 Light" w:uiPriority="46"/>
+    <w:lsdException w:name="List Table 2" w:uiPriority="47"/>
+    <w:lsdException w:name="List Table 3" w:uiPriority="48"/>
+    <w:lsdException w:name="List Table 4" w:uiPriority="49"/>
+    <w:lsdException w:name="List Table 5 Dark" w:uiPriority="50"/>
+    <w:lsdException w:name="List Table 6 Colorful" w:uiPriority="51"/>
+    <w:lsdException w:name="List Table 7 Colorful" w:uiPriority="52"/>
+    <w:lsdException w:name="List Table 1 Light Accent 1" w:uiPriority="46"/>
+    <w:lsdException w:name="List Table 2 Accent 1" w:uiPriority="47"/>
+    <w:lsdException w:name="List Table 3 Accent 1" w:uiPriority="48"/>
+    <w:lsdException w:name="List Table 4 Accent 1" w:uiPriority="49"/>
+    <w:lsdException w:name="List Table 5 Dark Accent 1" w:uiPriority="50"/>
+    <w:lsdException w:name="List Table 6 Colorful Accent 1" w:uiPriority="51"/>
+    <w:lsdException w:name="List Table 7 Colorful Accent 1" w:uiPriority="52"/>
+    <w:lsdException w:name="List Table 1 Light Accent 2" w:uiPriority="46"/>
+    <w:lsdException w:name="List Table 2 Accent 2" w:uiPriority="47"/>
+    <w:lsdException w:name="List Table 3 Accent 2" w:uiPriority="48"/>
+    <w:lsdException w:name="List Table 4 Accent 2" w:uiPriority="49"/>
+    <w:lsdException w:name="List Table 5 Dark Accent 2" w:uiPriority="50"/>
+    <w:lsdException w:name="List Table 6 Colorful Accent 2" w:uiPriority="51"/>
+    <w:lsdException w:name="List Table 7 Colorful Accent 2" w:uiPriority="52"/>
+    <w:lsdException w:name="List Table 1 Light Accent 3" w:uiPriority="46"/>
+    <w:lsdException w:name="List Table 2 Accent 3" w:uiPriority="47"/>
+    <w:lsdException w:name="List Table 3 Accent 3" w:uiPriority="48"/>
+    <w:lsdException w:name="List Table 4 Accent 3" w:uiPriority="49"/>
+    <w:lsdException w:name="List Table 5 Dark Accent 3" w:uiPriority="50"/>
+    <w:lsdException w:name="List Table 6 Colorful Accent 3" w:uiPriority="51"/>
+    <w:lsdException w:name="List Table 7 Colorful Accent 3" w:uiPriority="52"/>
+    <w:lsdException w:name="List Table 1 Light Accent 4" w:uiPriority="46"/>
+    <w:lsdException w:name="List Table 2 Accent 4" w:uiPriority="47"/>
+    <w:lsdException w:name="List Table 3 Accent 4" w:uiPriority="48"/>
+    <w:lsdException w:name="List Table 4 Accent 4" w:uiPriority="49"/>
+    <w:lsdException w:name="List Table 5 Dark Accent 4" w:uiPriority="50"/>
+    <w:lsdException w:name="List Table 6 Colorful Accent 4" w:uiPriority="51"/>
+    <w:lsdException w:name="List Table 7 Colorful Accent 4" w:uiPriority="52"/>
+    <w:lsdException w:name="List Table 1 Light Accent 5" w:uiPriority="46"/>
+    <w:lsdException w:name="List Table 2 Accent 5" w:uiPriority="47"/>
+    <w:lsdException w:name="List Table 3 Accent 5" w:uiPriority="48"/>
+    <w:lsdException w:name="List Table 4 Accent 5" w:uiPriority="49"/>
+    <w:lsdException w:name="List Table 5 Dark Accent 5" w:uiPriority="50"/>
+    <w:lsdException w:name="List Table 6 Colorful Accent 5" w:uiPriority="51"/>
+    <w:lsdException w:name="List Table 7 Colorful Accent 5" w:uiPriority="52"/>
+    <w:lsdException w:name="List Table 1 Light Accent 6" w:uiPriority="46"/>
+    <w:lsdException w:name="List Table 2 Accent 6" w:uiPriority="47"/>
+    <w:lsdException w:name="List Table 3 Accent 6" w:uiPriority="48"/>
+    <w:lsdException w:name="List Table 4 Accent 6" w:uiPriority="49"/>
+    <w:lsdException w:name="List Table 5 Dark Accent 6" w:uiPriority="50"/>
+    <w:lsdException w:name="List Table 6 Colorful Accent 6" w:uiPriority="51"/>
+    <w:lsdException w:name="List Table 7 Colorful Accent 6" w:uiPriority="52"/>
+    <w:lsdException w:name="Mention" w:semiHidden="1" w:unhideWhenUsed="1"/>
+    <w:lsdException w:name="Smart Hyperlink" w:semiHidden="1" w:unhideWhenUsed="1"/>
+    <w:lsdException w:name="Hashtag" w:semiHidden="1" w:unhideWhenUsed="1"/>
+    <w:lsdException w:name="Unresolved Mention" w:semiHidden="1" w:unhideWhenUsed="1"/>
+    <w:lsdException w:name="Smart Link" w:semiHidden="1" w:unhideWhenUsed="1"/>
+  </w:latentStyles>
   <w:style w:default="1" w:styleId="Normal" w:type="paragraph">
     <w:name w:val="Normal"/>
     <w:qFormat/>
-  </w:style>
-  <w:style w:styleId="BodyText" w:type="paragraph">
-    <w:name w:val="Body Text"/>
-    <w:basedOn w:val="Normal"/>
-    <w:link w:val="BodyTextChar"/>
-    <w:qFormat/>
+    <w:rsid w:val="4914AB38"/>
     <w:pPr>
       <w:spacing w:after="180" w:before="180"/>
-    </w:pPr>
-  </w:style>
-  <w:style w:customStyle="1" w:styleId="FirstParagraph" w:type="paragraph">
-    <w:name w:val="First Paragraph"/>
-    <w:basedOn w:val="BodyText"/>
-    <w:next w:val="BodyText"/>
-    <w:qFormat/>
-  </w:style>
-  <w:style w:customStyle="1" w:styleId="Compact" w:type="paragraph">
-    <w:name w:val="Compact"/>
-    <w:basedOn w:val="BodyText"/>
-    <w:qFormat/>
-    <w:pPr>
-      <w:spacing w:after="36" w:before="36"/>
-    </w:pPr>
-  </w:style>
-  <w:style w:styleId="Title" w:type="paragraph">
-    <w:name w:val="Title"/>
-    <w:basedOn w:val="Normal"/>
-    <w:next w:val="BodyText"/>
-    <w:link w:val="TitleChar"/>
-    <w:uiPriority w:val="10"/>
-    <w:qFormat/>
-    <w:rsid w:val="00A10FD9"/>
-    <w:pPr>
-      <w:spacing w:after="80" w:line="240" w:lineRule="auto"/>
-      <w:contextualSpacing/>
-      <w:jc w:val="center"/>
+      <w:jc w:val="both"/>
     </w:pPr>
     <w:rPr>
-      <w:rFonts w:asciiTheme="majorHAnsi" w:cstheme="majorBidi" w:eastAsiaTheme="majorEastAsia" w:hAnsiTheme="majorHAnsi"/>
-      <w:sz w:val="56"/>
-      <w:szCs w:val="56"/>
+      <w:rFonts w:ascii="Times New Roman" w:cs="Times New Roman" w:eastAsia="Times New Roman" w:hAnsi="Times New Roman"/>
+      <w:color w:themeColor="text1" w:val="000000"/>
     </w:rPr>
-  </w:style>
-  <w:style w:customStyle="1" w:styleId="TitleChar" w:type="character">
-    <w:name w:val="Title Char"/>
-    <w:basedOn w:val="DefaultParagraphFont"/>
-    <w:link w:val="Title"/>
-    <w:uiPriority w:val="10"/>
-    <w:rsid w:val="00A10FD9"/>
-    <w:rPr>
-      <w:rFonts w:asciiTheme="majorHAnsi" w:cstheme="majorBidi" w:eastAsiaTheme="majorEastAsia" w:hAnsiTheme="majorHAnsi"/>
-      <w:sz w:val="56"/>
-      <w:szCs w:val="56"/>
-    </w:rPr>
-  </w:style>
-  <w:style w:styleId="Subtitle" w:type="paragraph">
-    <w:name w:val="Subtitle"/>
-    <w:basedOn w:val="Title"/>
-    <w:next w:val="BodyText"/>
-    <w:link w:val="SubtitleChar"/>
-    <w:uiPriority w:val="11"/>
-    <w:qFormat/>
-    <w:rsid w:val="00A10FD9"/>
-    <w:pPr>
-      <w:numPr>
-        <w:ilvl w:val="1"/>
-      </w:numPr>
-    </w:pPr>
-    <w:rPr>
-      <w:rFonts w:cstheme="majorBidi" w:eastAsiaTheme="majorEastAsia"/>
-      <w:spacing w:val="15"/>
-      <w:sz w:val="28"/>
-      <w:szCs w:val="28"/>
-    </w:rPr>
-  </w:style>
-  <w:style w:customStyle="1" w:styleId="SubtitleChar" w:type="character">
-    <w:name w:val="Subtitle Char"/>
-    <w:basedOn w:val="DefaultParagraphFont"/>
-    <w:link w:val="Subtitle"/>
-    <w:uiPriority w:val="11"/>
-    <w:rsid w:val="00A10FD9"/>
-    <w:rPr>
-      <w:rFonts w:cstheme="majorBidi" w:eastAsiaTheme="majorEastAsia"/>
-      <w:color w:themeColor="text1" w:themeTint="A6" w:val="595959"/>
-      <w:spacing w:val="15"/>
-      <w:sz w:val="28"/>
-      <w:szCs w:val="28"/>
-    </w:rPr>
-  </w:style>
-  <w:style w:customStyle="1" w:styleId="Author" w:type="paragraph">
-    <w:name w:val="Author"/>
-    <w:basedOn w:val="Title"/>
-    <w:next w:val="BodyText"/>
-    <w:qFormat/>
-    <w:pPr>
-      <w:keepNext/>
-      <w:keepLines/>
-    </w:pPr>
-    <w:rPr>
-      <w:sz w:val="24"/>
-      <w:szCs w:val="24"/>
-    </w:rPr>
-  </w:style>
-  <w:style w:styleId="Date" w:type="paragraph">
-    <w:name w:val="Date"/>
-    <w:basedOn w:val="Title"/>
-    <w:next w:val="BodyText"/>
-    <w:qFormat/>
-    <w:pPr>
-      <w:keepNext/>
-      <w:keepLines/>
-    </w:pPr>
-    <w:rPr>
-      <w:sz w:val="24"/>
-      <w:szCs w:val="24"/>
-    </w:rPr>
-  </w:style>
-  <w:style w:customStyle="1" w:styleId="AbstractTitle" w:type="paragraph">
-    <w:name w:val="Abstract Title"/>
-    <w:basedOn w:val="Normal"/>
-    <w:next w:val="Abstract"/>
-    <w:qFormat/>
-    <w:pPr>
-      <w:keepNext/>
-      <w:keepLines/>
-      <w:spacing w:after="0" w:before="300"/>
-      <w:jc w:val="center"/>
-    </w:pPr>
-    <w:rPr>
-      <w:b/>
-      <w:sz w:val="20"/>
-      <w:szCs w:val="20"/>
-    </w:rPr>
-  </w:style>
-  <w:style w:customStyle="1" w:styleId="Abstract" w:type="paragraph">
-    <w:name w:val="Abstract"/>
-    <w:basedOn w:val="Normal"/>
-    <w:next w:val="BodyText"/>
-    <w:qFormat/>
-    <w:pPr>
-      <w:keepNext/>
-      <w:keepLines/>
-      <w:spacing w:after="300" w:before="100"/>
-    </w:pPr>
-    <w:rPr>
-      <w:sz w:val="20"/>
-      <w:szCs w:val="20"/>
-    </w:rPr>
-  </w:style>
-  <w:style w:styleId="Bibliography" w:type="paragraph">
-    <w:name w:val="Bibliography"/>
-    <w:basedOn w:val="Normal"/>
-    <w:next w:val="Bibliography"/>
-    <w:qFormat/>
-    <w:pPr/>
-    <w:rPr/>
   </w:style>
   <w:style w:styleId="Heading1" w:type="paragraph">
     <w:name w:val="heading 1"/>
     <w:basedOn w:val="Normal"/>
-    <w:next w:val="BodyText"/>
+    <w:next w:val="Normal"/>
     <w:link w:val="Heading1Char"/>
-    <w:uiPriority w:val="9"/>
     <w:qFormat/>
-    <w:rsid w:val="00A10FD9"/>
+    <w:rsid w:val="00EE35AF"/>
     <w:pPr>
       <w:keepNext/>
-      <w:keepLines/>
-      <w:spacing w:after="80" w:before="360"/>
+      <w:numPr>
+        <w:numId w:val="1"/>
+      </w:numPr>
+      <w:spacing w:after="160" w:before="480" w:line="288" w:lineRule="auto"/>
       <w:outlineLvl w:val="0"/>
     </w:pPr>
     <w:rPr>
-      <w:rFonts w:asciiTheme="majorHAnsi" w:cstheme="majorBidi" w:eastAsiaTheme="majorEastAsia" w:hAnsiTheme="majorHAnsi"/>
       <w:color w:themeColor="accent1" w:themeShade="BF" w:val="0F4761"/>
       <w:sz w:val="40"/>
       <w:szCs w:val="40"/>
@@ -3694,13 +4061,12 @@
   <w:style w:styleId="Heading2" w:type="paragraph">
     <w:name w:val="heading 2"/>
     <w:basedOn w:val="Normal"/>
-    <w:next w:val="BodyText"/>
+    <w:next w:val="Normal"/>
     <w:link w:val="Heading2Char"/>
     <w:uiPriority w:val="9"/>
-    <w:semiHidden/>
     <w:unhideWhenUsed/>
     <w:qFormat/>
-    <w:rsid w:val="00A10FD9"/>
+    <w:rsid w:val="4914AB38"/>
     <w:pPr>
       <w:keepNext/>
       <w:keepLines/>
@@ -3708,7 +4074,6 @@
       <w:outlineLvl w:val="1"/>
     </w:pPr>
     <w:rPr>
-      <w:rFonts w:asciiTheme="majorHAnsi" w:cstheme="majorBidi" w:eastAsiaTheme="majorEastAsia" w:hAnsiTheme="majorHAnsi"/>
       <w:color w:themeColor="accent1" w:themeShade="BF" w:val="0F4761"/>
       <w:sz w:val="32"/>
       <w:szCs w:val="32"/>
@@ -3717,13 +4082,11 @@
   <w:style w:styleId="Heading3" w:type="paragraph">
     <w:name w:val="heading 3"/>
     <w:basedOn w:val="Normal"/>
-    <w:next w:val="BodyText"/>
-    <w:link w:val="Heading3Char"/>
+    <w:next w:val="Normal"/>
     <w:uiPriority w:val="9"/>
-    <w:semiHidden/>
     <w:unhideWhenUsed/>
     <w:qFormat/>
-    <w:rsid w:val="00A10FD9"/>
+    <w:rsid w:val="4914AB38"/>
     <w:pPr>
       <w:keepNext/>
       <w:keepLines/>
@@ -3740,13 +4103,11 @@
   <w:style w:styleId="Heading4" w:type="paragraph">
     <w:name w:val="heading 4"/>
     <w:basedOn w:val="Normal"/>
-    <w:next w:val="BodyText"/>
-    <w:link w:val="Heading4Char"/>
+    <w:next w:val="Normal"/>
     <w:uiPriority w:val="9"/>
-    <w:semiHidden/>
     <w:unhideWhenUsed/>
     <w:qFormat/>
-    <w:rsid w:val="00A10FD9"/>
+    <w:rsid w:val="4914AB38"/>
     <w:pPr>
       <w:keepNext/>
       <w:keepLines/>
@@ -3760,277 +4121,17 @@
       <w:color w:themeColor="accent1" w:themeShade="BF" w:val="0F4761"/>
     </w:rPr>
   </w:style>
-  <w:style w:styleId="Heading5" w:type="paragraph">
-    <w:name w:val="heading 5"/>
-    <w:basedOn w:val="Normal"/>
-    <w:next w:val="BodyText"/>
-    <w:link w:val="Heading5Char"/>
-    <w:uiPriority w:val="9"/>
+  <w:style w:default="1" w:styleId="DefaultParagraphFont" w:type="character">
+    <w:name w:val="Default Paragraph Font"/>
+    <w:uiPriority w:val="1"/>
     <w:semiHidden/>
     <w:unhideWhenUsed/>
-    <w:qFormat/>
-    <w:rsid w:val="00A10FD9"/>
-    <w:pPr>
-      <w:keepNext/>
-      <w:keepLines/>
-      <w:spacing w:after="40" w:before="80"/>
-      <w:outlineLvl w:val="4"/>
-    </w:pPr>
-    <w:rPr>
-      <w:rFonts w:cstheme="majorBidi" w:eastAsiaTheme="majorEastAsia"/>
-      <w:color w:themeColor="accent1" w:themeShade="BF" w:val="0F4761"/>
-    </w:rPr>
-  </w:style>
-  <w:style w:styleId="Heading6" w:type="paragraph">
-    <w:name w:val="heading 6"/>
-    <w:basedOn w:val="Normal"/>
-    <w:next w:val="BodyText"/>
-    <w:link w:val="Heading6Char"/>
-    <w:uiPriority w:val="9"/>
+  </w:style>
+  <w:style w:default="1" w:styleId="TableNormal" w:type="table">
+    <w:name w:val="Normal Table"/>
+    <w:uiPriority w:val="99"/>
     <w:semiHidden/>
     <w:unhideWhenUsed/>
-    <w:qFormat/>
-    <w:rsid w:val="00A10FD9"/>
-    <w:pPr>
-      <w:keepNext/>
-      <w:keepLines/>
-      <w:spacing w:after="0" w:before="40"/>
-      <w:outlineLvl w:val="5"/>
-    </w:pPr>
-    <w:rPr>
-      <w:rFonts w:cstheme="majorBidi" w:eastAsiaTheme="majorEastAsia"/>
-      <w:i/>
-      <w:iCs/>
-      <w:color w:themeColor="text1" w:themeTint="A6" w:val="595959"/>
-    </w:rPr>
-  </w:style>
-  <w:style w:styleId="Heading7" w:type="paragraph">
-    <w:name w:val="heading 7"/>
-    <w:basedOn w:val="Normal"/>
-    <w:next w:val="BodyText"/>
-    <w:link w:val="Heading7Char"/>
-    <w:uiPriority w:val="9"/>
-    <w:semiHidden/>
-    <w:unhideWhenUsed/>
-    <w:qFormat/>
-    <w:rsid w:val="00A10FD9"/>
-    <w:pPr>
-      <w:keepNext/>
-      <w:keepLines/>
-      <w:spacing w:after="0" w:before="40"/>
-      <w:outlineLvl w:val="6"/>
-    </w:pPr>
-    <w:rPr>
-      <w:rFonts w:cstheme="majorBidi" w:eastAsiaTheme="majorEastAsia"/>
-      <w:color w:themeColor="text1" w:themeTint="A6" w:val="595959"/>
-    </w:rPr>
-  </w:style>
-  <w:style w:styleId="Heading8" w:type="paragraph">
-    <w:name w:val="heading 8"/>
-    <w:basedOn w:val="Normal"/>
-    <w:next w:val="BodyText"/>
-    <w:link w:val="Heading8Char"/>
-    <w:uiPriority w:val="9"/>
-    <w:semiHidden/>
-    <w:unhideWhenUsed/>
-    <w:qFormat/>
-    <w:rsid w:val="00A10FD9"/>
-    <w:pPr>
-      <w:keepNext/>
-      <w:keepLines/>
-      <w:spacing w:after="0"/>
-      <w:outlineLvl w:val="7"/>
-    </w:pPr>
-    <w:rPr>
-      <w:rFonts w:cstheme="majorBidi" w:eastAsiaTheme="majorEastAsia"/>
-      <w:i/>
-      <w:iCs/>
-      <w:color w:themeColor="text1" w:themeTint="D8" w:val="272727"/>
-    </w:rPr>
-  </w:style>
-  <w:style w:styleId="Heading9" w:type="paragraph">
-    <w:name w:val="heading 9"/>
-    <w:basedOn w:val="Normal"/>
-    <w:next w:val="BodyText"/>
-    <w:link w:val="Heading9Char"/>
-    <w:uiPriority w:val="9"/>
-    <w:semiHidden/>
-    <w:unhideWhenUsed/>
-    <w:qFormat/>
-    <w:rsid w:val="00A10FD9"/>
-    <w:pPr>
-      <w:keepNext/>
-      <w:keepLines/>
-      <w:spacing w:after="0"/>
-      <w:outlineLvl w:val="8"/>
-    </w:pPr>
-    <w:rPr>
-      <w:rFonts w:cstheme="majorBidi" w:eastAsiaTheme="majorEastAsia"/>
-      <w:color w:themeColor="text1" w:themeTint="D8" w:val="272727"/>
-    </w:rPr>
-  </w:style>
-  <w:style w:customStyle="1" w:styleId="Heading1Char" w:type="character">
-    <w:name w:val="Heading 1 Char"/>
-    <w:basedOn w:val="DefaultParagraphFont"/>
-    <w:link w:val="Heading1"/>
-    <w:uiPriority w:val="9"/>
-    <w:rsid w:val="00A10FD9"/>
-    <w:rPr>
-      <w:rFonts w:asciiTheme="majorHAnsi" w:cstheme="majorBidi" w:eastAsiaTheme="majorEastAsia" w:hAnsiTheme="majorHAnsi"/>
-      <w:color w:themeColor="accent1" w:themeShade="BF" w:val="0F4761"/>
-      <w:sz w:val="40"/>
-      <w:szCs w:val="40"/>
-    </w:rPr>
-  </w:style>
-  <w:style w:customStyle="1" w:styleId="Heading2Char" w:type="character">
-    <w:name w:val="Heading 2 Char"/>
-    <w:basedOn w:val="DefaultParagraphFont"/>
-    <w:link w:val="Heading2"/>
-    <w:uiPriority w:val="9"/>
-    <w:semiHidden/>
-    <w:rsid w:val="00A10FD9"/>
-    <w:rPr>
-      <w:rFonts w:asciiTheme="majorHAnsi" w:cstheme="majorBidi" w:eastAsiaTheme="majorEastAsia" w:hAnsiTheme="majorHAnsi"/>
-      <w:color w:themeColor="accent1" w:themeShade="BF" w:val="0F4761"/>
-      <w:sz w:val="32"/>
-      <w:szCs w:val="32"/>
-    </w:rPr>
-  </w:style>
-  <w:style w:customStyle="1" w:styleId="Heading3Char" w:type="character">
-    <w:name w:val="Heading 3 Char"/>
-    <w:basedOn w:val="DefaultParagraphFont"/>
-    <w:link w:val="Heading3"/>
-    <w:uiPriority w:val="9"/>
-    <w:semiHidden/>
-    <w:rsid w:val="00A10FD9"/>
-    <w:rPr>
-      <w:rFonts w:cstheme="majorBidi" w:eastAsiaTheme="majorEastAsia"/>
-      <w:color w:themeColor="accent1" w:themeShade="BF" w:val="0F4761"/>
-      <w:sz w:val="28"/>
-      <w:szCs w:val="28"/>
-    </w:rPr>
-  </w:style>
-  <w:style w:customStyle="1" w:styleId="Heading4Char" w:type="character">
-    <w:name w:val="Heading 4 Char"/>
-    <w:basedOn w:val="DefaultParagraphFont"/>
-    <w:link w:val="Heading4"/>
-    <w:uiPriority w:val="9"/>
-    <w:semiHidden/>
-    <w:rsid w:val="00A10FD9"/>
-    <w:rPr>
-      <w:rFonts w:cstheme="majorBidi" w:eastAsiaTheme="majorEastAsia"/>
-      <w:i/>
-      <w:iCs/>
-      <w:color w:themeColor="accent1" w:themeShade="BF" w:val="0F4761"/>
-    </w:rPr>
-  </w:style>
-  <w:style w:customStyle="1" w:styleId="Heading5Char" w:type="character">
-    <w:name w:val="Heading 5 Char"/>
-    <w:basedOn w:val="DefaultParagraphFont"/>
-    <w:link w:val="Heading5"/>
-    <w:uiPriority w:val="9"/>
-    <w:semiHidden/>
-    <w:rsid w:val="00A10FD9"/>
-    <w:rPr>
-      <w:rFonts w:cstheme="majorBidi" w:eastAsiaTheme="majorEastAsia"/>
-      <w:color w:themeColor="accent1" w:themeShade="BF" w:val="0F4761"/>
-    </w:rPr>
-  </w:style>
-  <w:style w:customStyle="1" w:styleId="Heading6Char" w:type="character">
-    <w:name w:val="Heading 6 Char"/>
-    <w:basedOn w:val="DefaultParagraphFont"/>
-    <w:link w:val="Heading6"/>
-    <w:uiPriority w:val="9"/>
-    <w:semiHidden/>
-    <w:rsid w:val="00A10FD9"/>
-    <w:rPr>
-      <w:rFonts w:cstheme="majorBidi" w:eastAsiaTheme="majorEastAsia"/>
-      <w:i/>
-      <w:iCs/>
-      <w:color w:themeColor="text1" w:themeTint="A6" w:val="595959"/>
-    </w:rPr>
-  </w:style>
-  <w:style w:customStyle="1" w:styleId="Heading7Char" w:type="character">
-    <w:name w:val="Heading 7 Char"/>
-    <w:basedOn w:val="DefaultParagraphFont"/>
-    <w:link w:val="Heading7"/>
-    <w:uiPriority w:val="9"/>
-    <w:semiHidden/>
-    <w:rsid w:val="00A10FD9"/>
-    <w:rPr>
-      <w:rFonts w:cstheme="majorBidi" w:eastAsiaTheme="majorEastAsia"/>
-      <w:color w:themeColor="text1" w:themeTint="A6" w:val="595959"/>
-    </w:rPr>
-  </w:style>
-  <w:style w:customStyle="1" w:styleId="Heading8Char" w:type="character">
-    <w:name w:val="Heading 8 Char"/>
-    <w:basedOn w:val="DefaultParagraphFont"/>
-    <w:link w:val="Heading8"/>
-    <w:uiPriority w:val="9"/>
-    <w:semiHidden/>
-    <w:rsid w:val="00A10FD9"/>
-    <w:rPr>
-      <w:rFonts w:cstheme="majorBidi" w:eastAsiaTheme="majorEastAsia"/>
-      <w:i/>
-      <w:iCs/>
-      <w:color w:themeColor="text1" w:themeTint="D8" w:val="272727"/>
-    </w:rPr>
-  </w:style>
-  <w:style w:customStyle="1" w:styleId="Heading9Char" w:type="character">
-    <w:name w:val="Heading 9 Char"/>
-    <w:basedOn w:val="DefaultParagraphFont"/>
-    <w:link w:val="Heading9"/>
-    <w:uiPriority w:val="9"/>
-    <w:semiHidden/>
-    <w:rsid w:val="00A10FD9"/>
-    <w:rPr>
-      <w:rFonts w:cstheme="majorBidi" w:eastAsiaTheme="majorEastAsia"/>
-      <w:color w:themeColor="text1" w:themeTint="D8" w:val="272727"/>
-    </w:rPr>
-  </w:style>
-  <w:style w:styleId="BlockText" w:type="paragraph">
-    <w:name w:val="Block Text"/>
-    <w:basedOn w:val="BodyText"/>
-    <w:next w:val="BodyText"/>
-    <w:uiPriority w:val="9"/>
-    <w:unhideWhenUsed/>
-    <w:qFormat/>
-    <w:pPr>
-      <w:spacing w:after="100" w:before="100"/>
-      <w:ind w:firstLine="0" w:left="480" w:right="480"/>
-    </w:pPr>
-  </w:style>
-  <w:style w:styleId="FootnoteText" w:type="paragraph">
-    <w:name w:val="Footnote Text"/>
-    <w:basedOn w:val="Normal"/>
-    <w:next w:val="FootnoteText"/>
-    <w:uiPriority w:val="9"/>
-    <w:unhideWhenUsed/>
-    <w:qFormat/>
-  </w:style>
-  <w:style w:styleId="FootnoteBlockText" w:type="paragraph">
-    <w:name w:val="Footnote Block Text"/>
-    <w:basedOn w:val="FootnoteText"/>
-    <w:next w:val="FootnoteText"/>
-    <w:uiPriority w:val="9"/>
-    <w:unhideWhenUsed/>
-    <w:qFormat/>
-    <w:pPr>
-      <w:spacing w:after="100" w:before="100"/>
-      <w:ind w:firstLine="0" w:left="480" w:right="480"/>
-    </w:pPr>
-  </w:style>
-  <w:style w:default="1" w:styleId="DefaultParagraphFont" w:type="character">
-    <w:name w:val="Default Paragraph Font"/>
-    <w:semiHidden/>
-    <w:unhideWhenUsed/>
-  </w:style>
-  <w:style w:default="1" w:styleId="Table" w:type="table">
-    <w:name w:val="Table"/>
-    <w:basedOn w:val="TableNormal"/>
-    <w:semiHidden/>
-    <w:unhideWhenUsed/>
-    <w:qFormat/>
     <w:tblPr>
       <w:tblInd w:type="dxa" w:w="0"/>
       <w:tblCellMar>
@@ -4040,112 +4141,296 @@
         <w:right w:type="dxa" w:w="108"/>
       </w:tblCellMar>
     </w:tblPr>
-    <w:tblStylePr w:type="firstRow">
-      <w:tcPr>
-        <w:tcBorders>
-          <w:bottom w:val="single"/>
-        </w:tcBorders>
-        <w:vAlign w:val="bottom"/>
-      </w:tcPr>
-    </w:tblStylePr>
-  </w:style>
-  <w:style w:customStyle="1" w:styleId="DefinitionTerm" w:type="paragraph">
-    <w:name w:val="Definition Term"/>
-    <w:basedOn w:val="Normal"/>
-    <w:next w:val="Definition"/>
+  </w:style>
+  <w:style w:default="1" w:styleId="NoList" w:type="numbering">
+    <w:name w:val="No List"/>
+    <w:uiPriority w:val="99"/>
+    <w:semiHidden/>
+    <w:unhideWhenUsed/>
+  </w:style>
+  <w:style w:styleId="NoSpacing" w:type="paragraph">
+    <w:name w:val="No Spacing"/>
+    <w:uiPriority w:val="1"/>
+    <w:qFormat/>
+    <w:rsid w:val="4914AB38"/>
     <w:pPr>
-      <w:keepNext/>
-      <w:keepLines/>
       <w:spacing w:after="0"/>
     </w:pPr>
     <w:rPr>
+      <w:rFonts w:ascii="Times New Roman" w:cs="Times New Roman" w:eastAsia="Times New Roman" w:hAnsi="Times New Roman"/>
+    </w:rPr>
+  </w:style>
+  <w:style w:customStyle="1" w:styleId="Heading1Char" w:type="character">
+    <w:name w:val="Heading 1 Char"/>
+    <w:basedOn w:val="DefaultParagraphFont"/>
+    <w:link w:val="Heading1"/>
+    <w:rsid w:val="00EE35AF"/>
+    <w:rPr>
+      <w:rFonts w:ascii="Times New Roman" w:cs="Times New Roman" w:eastAsia="Times New Roman" w:hAnsi="Times New Roman"/>
+      <w:color w:themeColor="accent1" w:themeShade="BF" w:val="0F4761"/>
+      <w:sz w:val="40"/>
+      <w:szCs w:val="40"/>
+    </w:rPr>
+  </w:style>
+  <w:style w:customStyle="1" w:styleId="Heading2Char" w:type="character">
+    <w:name w:val="Heading 2 Char"/>
+    <w:basedOn w:val="DefaultParagraphFont"/>
+    <w:link w:val="Heading2"/>
+    <w:uiPriority w:val="9"/>
+    <w:rsid w:val="4914AB38"/>
+    <w:rPr>
+      <w:rFonts w:ascii="Times New Roman" w:cs="Times New Roman" w:eastAsia="Times New Roman" w:hAnsi="Times New Roman"/>
+      <w:b w:val="0"/>
+      <w:bCs w:val="0"/>
+      <w:i w:val="0"/>
+      <w:iCs w:val="0"/>
+      <w:strike w:val="0"/>
+      <w:dstrike w:val="0"/>
+      <w:noProof w:val="0"/>
+      <w:color w:themeColor="accent1" w:themeShade="BF" w:val="0F4761"/>
+      <w:sz w:val="32"/>
+      <w:szCs w:val="32"/>
+      <w:u w:val="none"/>
+      <w:lang w:val="en-US"/>
+    </w:rPr>
+  </w:style>
+  <w:style w:styleId="Title" w:type="paragraph">
+    <w:name w:val="Title"/>
+    <w:basedOn w:val="Normal"/>
+    <w:next w:val="Normal"/>
+    <w:uiPriority w:val="10"/>
+    <w:qFormat/>
+    <w:rsid w:val="00105BCE"/>
+    <w:pPr>
+      <w:spacing w:after="360" w:before="360" w:line="278" w:lineRule="auto"/>
+      <w:contextualSpacing/>
+      <w:jc w:val="center"/>
+    </w:pPr>
+    <w:rPr>
+      <w:sz w:val="56"/>
+      <w:szCs w:val="56"/>
+    </w:rPr>
+  </w:style>
+  <w:style w:styleId="Subtitle" w:type="paragraph">
+    <w:name w:val="Subtitle"/>
+    <w:basedOn w:val="Normal"/>
+    <w:next w:val="Normal"/>
+    <w:uiPriority w:val="11"/>
+    <w:qFormat/>
+    <w:rsid w:val="001847CA"/>
+    <w:pPr>
+      <w:spacing w:after="360" w:before="360" w:line="278" w:lineRule="auto"/>
+      <w:jc w:val="right"/>
+    </w:pPr>
+    <w:rPr>
+      <w:rFonts w:cstheme="majorBidi" w:eastAsiaTheme="majorEastAsia"/>
+      <w:color w:themeColor="text1" w:themeTint="A6" w:val="595959"/>
+      <w:sz w:val="28"/>
+      <w:szCs w:val="28"/>
+    </w:rPr>
+  </w:style>
+  <w:style w:styleId="Emphasis" w:type="character">
+    <w:name w:val="Emphasis"/>
+    <w:basedOn w:val="DefaultParagraphFont"/>
+    <w:uiPriority w:val="20"/>
+    <w:qFormat/>
+    <w:rsid w:val="4914AB38"/>
+    <w:rPr>
+      <w:i/>
+      <w:iCs/>
+    </w:rPr>
+  </w:style>
+  <w:style w:styleId="SubtleEmphasis" w:type="character">
+    <w:name w:val="Subtle Emphasis"/>
+    <w:basedOn w:val="DefaultParagraphFont"/>
+    <w:uiPriority w:val="19"/>
+    <w:qFormat/>
+    <w:rsid w:val="4914AB38"/>
+    <w:rPr>
+      <w:i/>
+      <w:iCs/>
+      <w:color w:themeColor="text1" w:themeTint="BF" w:val="404040"/>
+    </w:rPr>
+  </w:style>
+  <w:style w:styleId="Strong" w:type="character">
+    <w:name w:val="Strong"/>
+    <w:basedOn w:val="DefaultParagraphFont"/>
+    <w:uiPriority w:val="22"/>
+    <w:qFormat/>
+    <w:rsid w:val="4914AB38"/>
+    <w:rPr>
       <w:b/>
+      <w:bCs/>
     </w:rPr>
   </w:style>
-  <w:style w:customStyle="1" w:styleId="Definition" w:type="paragraph">
-    <w:name w:val="Definition"/>
+  <w:style w:styleId="Quote" w:type="paragraph">
+    <w:name w:val="Quote"/>
     <w:basedOn w:val="Normal"/>
-  </w:style>
-  <w:style w:styleId="Caption" w:type="paragraph">
-    <w:name w:val="Caption"/>
-    <w:basedOn w:val="Normal"/>
-    <w:link w:val="BodyTextChar"/>
+    <w:next w:val="Normal"/>
+    <w:uiPriority w:val="29"/>
+    <w:qFormat/>
+    <w:rsid w:val="4914AB38"/>
     <w:pPr>
-      <w:spacing w:after="120" w:before="0"/>
+      <w:spacing w:before="160"/>
+      <w:jc w:val="center"/>
     </w:pPr>
     <w:rPr>
       <w:i/>
+      <w:iCs/>
+      <w:color w:themeColor="text1" w:themeTint="BF" w:val="404040"/>
     </w:rPr>
   </w:style>
-  <w:style w:customStyle="1" w:styleId="TableCaption" w:type="paragraph">
-    <w:name w:val="Table Caption"/>
-    <w:basedOn w:val="Caption"/>
+  <w:style w:styleId="SubtleReference" w:type="character">
+    <w:name w:val="Subtle Reference"/>
+    <w:basedOn w:val="DefaultParagraphFont"/>
+    <w:uiPriority w:val="31"/>
+    <w:qFormat/>
+    <w:rsid w:val="4914AB38"/>
+    <w:rPr>
+      <w:smallCaps/>
+      <w:color w:val="5A5A5A"/>
+    </w:rPr>
+  </w:style>
+  <w:style w:styleId="IntenseQuote" w:type="paragraph">
+    <w:name w:val="Intense Quote"/>
+    <w:basedOn w:val="Normal"/>
+    <w:next w:val="Normal"/>
+    <w:uiPriority w:val="30"/>
+    <w:qFormat/>
+    <w:rsid w:val="4914AB38"/>
     <w:pPr>
-      <w:keepNext/>
+      <w:spacing w:after="360" w:before="360"/>
+      <w:ind w:left="864" w:right="864"/>
+      <w:jc w:val="center"/>
     </w:pPr>
-  </w:style>
-  <w:style w:customStyle="1" w:styleId="ImageCaption" w:type="paragraph">
-    <w:name w:val="Image Caption"/>
-    <w:basedOn w:val="Caption"/>
-  </w:style>
-  <w:style w:customStyle="1" w:styleId="Figure" w:type="paragraph">
-    <w:name w:val="Figure"/>
+    <w:rPr>
+      <w:i/>
+      <w:iCs/>
+      <w:color w:themeColor="accent1" w:themeShade="BF" w:val="0F4761"/>
+    </w:rPr>
+  </w:style>
+  <w:style w:styleId="ListParagraph" w:type="paragraph">
+    <w:name w:val="List Paragraph"/>
     <w:basedOn w:val="Normal"/>
-  </w:style>
-  <w:style w:customStyle="1" w:styleId="CaptionedFigure" w:type="paragraph">
-    <w:name w:val="Captioned Figure"/>
-    <w:basedOn w:val="Figure"/>
+    <w:uiPriority w:val="34"/>
+    <w:qFormat/>
+    <w:rsid w:val="4914AB38"/>
     <w:pPr>
-      <w:keepNext/>
+      <w:ind w:left="720"/>
+      <w:contextualSpacing/>
     </w:pPr>
   </w:style>
-  <w:style w:customStyle="1" w:styleId="BodyTextChar" w:type="character">
-    <w:name w:val="Body Text Char"/>
+  <w:style w:styleId="Header" w:type="paragraph">
+    <w:name w:val="header"/>
+    <w:basedOn w:val="Normal"/>
+    <w:link w:val="HeaderChar"/>
+    <w:uiPriority w:val="99"/>
+    <w:unhideWhenUsed/>
+    <w:rsid w:val="00567562"/>
+    <w:pPr>
+      <w:tabs>
+        <w:tab w:pos="4513" w:val="center"/>
+        <w:tab w:pos="9026" w:val="right"/>
+      </w:tabs>
+      <w:spacing w:after="0" w:before="0" w:line="240" w:lineRule="auto"/>
+    </w:pPr>
+  </w:style>
+  <w:style w:customStyle="1" w:styleId="HeaderChar" w:type="character">
+    <w:name w:val="Header Char"/>
     <w:basedOn w:val="DefaultParagraphFont"/>
-    <w:link w:val="BodyText"/>
-  </w:style>
-  <w:style w:customStyle="1" w:styleId="VerbatimChar" w:type="character">
-    <w:name w:val="Verbatim Char"/>
-    <w:basedOn w:val="BodyTextChar"/>
+    <w:link w:val="Header"/>
+    <w:uiPriority w:val="99"/>
+    <w:rsid w:val="00567562"/>
     <w:rPr>
-      <w:rFonts w:ascii="Consolas" w:hAnsi="Consolas"/>
-      <w:sz w:val="22"/>
+      <w:rFonts w:ascii="Times New Roman" w:cs="Times New Roman" w:eastAsia="Times New Roman" w:hAnsi="Times New Roman"/>
+      <w:color w:themeColor="text1" w:val="000000"/>
     </w:rPr>
   </w:style>
-  <w:style w:customStyle="1" w:styleId="SectionNumber" w:type="character">
-    <w:name w:val="Section Number"/>
-    <w:basedOn w:val="BodyTextChar"/>
-  </w:style>
-  <w:style w:styleId="FootnoteReference" w:type="character">
-    <w:name w:val="Footnote Reference"/>
-    <w:basedOn w:val="BodyTextChar"/>
+  <w:style w:styleId="Footer" w:type="paragraph">
+    <w:name w:val="footer"/>
+    <w:basedOn w:val="Normal"/>
+    <w:link w:val="FooterChar"/>
+    <w:uiPriority w:val="99"/>
+    <w:unhideWhenUsed/>
+    <w:rsid w:val="00567562"/>
+    <w:pPr>
+      <w:tabs>
+        <w:tab w:pos="4513" w:val="center"/>
+        <w:tab w:pos="9026" w:val="right"/>
+      </w:tabs>
+      <w:spacing w:after="0" w:before="0" w:line="240" w:lineRule="auto"/>
+    </w:pPr>
+  </w:style>
+  <w:style w:customStyle="1" w:styleId="FooterChar" w:type="character">
+    <w:name w:val="Footer Char"/>
+    <w:basedOn w:val="DefaultParagraphFont"/>
+    <w:link w:val="Footer"/>
+    <w:uiPriority w:val="99"/>
+    <w:rsid w:val="00567562"/>
     <w:rPr>
-      <w:vertAlign w:val="superscript"/>
-    </w:rPr>
-  </w:style>
-  <w:style w:styleId="Hyperlink" w:type="character">
-    <w:name w:val="Hyperlink"/>
-    <w:basedOn w:val="BodyTextChar"/>
-    <w:rPr>
-      <w:color w:themeColor="accent1" w:val="4F81BD"/>
+      <w:rFonts w:ascii="Times New Roman" w:cs="Times New Roman" w:eastAsia="Times New Roman" w:hAnsi="Times New Roman"/>
+      <w:color w:themeColor="text1" w:val="000000"/>
     </w:rPr>
   </w:style>
   <w:style w:styleId="TOCHeading" w:type="paragraph">
     <w:name w:val="TOC Heading"/>
     <w:basedOn w:val="Heading1"/>
-    <w:next w:val="BodyText"/>
+    <w:next w:val="Normal"/>
     <w:uiPriority w:val="39"/>
     <w:unhideWhenUsed/>
     <w:qFormat/>
+    <w:rsid w:val="001411FC"/>
     <w:pPr>
-      <w:spacing w:before="240" w:line="259" w:lineRule="auto"/>
+      <w:keepLines/>
+      <w:pageBreakBefore/>
+      <w:numPr>
+        <w:numId w:val="0"/>
+      </w:numPr>
+      <w:spacing w:after="240" w:before="240" w:line="240" w:lineRule="auto"/>
+      <w:jc w:val="left"/>
       <w:outlineLvl w:val="9"/>
     </w:pPr>
     <w:rPr>
-      <w:rFonts w:asciiTheme="majorHAnsi" w:cstheme="majorBidi" w:eastAsiaTheme="majorEastAsia" w:hAnsiTheme="majorHAnsi"/>
-      <w:b w:val="0"/>
-      <w:bCs w:val="0"/>
-      <w:color w:themeColor="accent1" w:themeShade="BF" w:val="365F91"/>
+      <w:rFonts w:eastAsiaTheme="majorEastAsia"/>
+      <w:sz w:val="32"/>
+      <w:szCs w:val="32"/>
+      <w:lang w:eastAsia="en-GB" w:val="en-GB"/>
+    </w:rPr>
+  </w:style>
+  <w:style w:styleId="TOC2" w:type="paragraph">
+    <w:name w:val="toc 2"/>
+    <w:basedOn w:val="Normal"/>
+    <w:next w:val="Normal"/>
+    <w:autoRedefine/>
+    <w:uiPriority w:val="39"/>
+    <w:unhideWhenUsed/>
+    <w:rsid w:val="004F6E94"/>
+    <w:pPr>
+      <w:spacing w:after="100"/>
+      <w:ind w:left="240"/>
+    </w:pPr>
+  </w:style>
+  <w:style w:styleId="TOC1" w:type="paragraph">
+    <w:name w:val="toc 1"/>
+    <w:basedOn w:val="Normal"/>
+    <w:next w:val="Normal"/>
+    <w:autoRedefine/>
+    <w:uiPriority w:val="39"/>
+    <w:unhideWhenUsed/>
+    <w:rsid w:val="004F6E94"/>
+    <w:pPr>
+      <w:spacing w:after="100"/>
+    </w:pPr>
+  </w:style>
+  <w:style w:styleId="Hyperlink" w:type="character">
+    <w:name w:val="Hyperlink"/>
+    <w:basedOn w:val="DefaultParagraphFont"/>
+    <w:uiPriority w:val="99"/>
+    <w:unhideWhenUsed/>
+    <w:rsid w:val="004F6E94"/>
+    <w:rPr>
+      <w:color w:themeColor="hyperlink" w:val="467886"/>
+      <w:u w:val="single"/>
     </w:rPr>
   </w:style>
   <w:style w:type="paragraph" w:customStyle="1" w:styleId="SourceCode">
@@ -4431,9 +4716,9 @@
         <a:latin typeface="Aptos Display" panose="02110004020202020204"/>
         <a:ea typeface=""/>
         <a:cs typeface=""/>
-        <a:font script="Jpan" typeface="游ゴシック Light"/>
+        <a:font script="Jpan" typeface="ＭＳ ゴシック"/>
         <a:font script="Hang" typeface="맑은 고딕"/>
-        <a:font script="Hans" typeface="等线 Light"/>
+        <a:font script="Hans" typeface="宋体"/>
         <a:font script="Hant" typeface="新細明體"/>
         <a:font script="Arab" typeface="Times New Roman"/>
         <a:font script="Hebr" typeface="Times New Roman"/>
@@ -4461,31 +4746,14 @@
         <a:font script="Viet" typeface="Times New Roman"/>
         <a:font script="Uigh" typeface="Microsoft Uighur"/>
         <a:font script="Geor" typeface="Sylfaen"/>
-        <a:font script="Armn" typeface="Arial"/>
-        <a:font script="Bugi" typeface="Leelawadee UI"/>
-        <a:font script="Bopo" typeface="Microsoft JhengHei"/>
-        <a:font script="Java" typeface="Javanese Text"/>
-        <a:font script="Lisu" typeface="Segoe UI"/>
-        <a:font script="Mymr" typeface="Myanmar Text"/>
-        <a:font script="Nkoo" typeface="Ebrima"/>
-        <a:font script="Olck" typeface="Nirmala UI"/>
-        <a:font script="Osma" typeface="Ebrima"/>
-        <a:font script="Phag" typeface="Phagspa"/>
-        <a:font script="Syrn" typeface="Estrangelo Edessa"/>
-        <a:font script="Syrj" typeface="Estrangelo Edessa"/>
-        <a:font script="Syre" typeface="Estrangelo Edessa"/>
-        <a:font script="Sora" typeface="Nirmala UI"/>
-        <a:font script="Tale" typeface="Microsoft Tai Le"/>
-        <a:font script="Talu" typeface="Microsoft New Tai Lue"/>
-        <a:font script="Tfng" typeface="Ebrima"/>
       </a:majorFont>
       <a:minorFont>
         <a:latin typeface="Aptos" panose="02110004020202020204"/>
         <a:ea typeface=""/>
         <a:cs typeface=""/>
-        <a:font script="Jpan" typeface="游明朝"/>
+        <a:font script="Jpan" typeface="ＭＳ 明朝"/>
         <a:font script="Hang" typeface="맑은 고딕"/>
-        <a:font script="Hans" typeface="等线"/>
+        <a:font script="Hans" typeface="宋体"/>
         <a:font script="Hant" typeface="新細明體"/>
         <a:font script="Arab" typeface="Arial"/>
         <a:font script="Hebr" typeface="Arial"/>
@@ -4513,23 +4781,6 @@
         <a:font script="Viet" typeface="Arial"/>
         <a:font script="Uigh" typeface="Microsoft Uighur"/>
         <a:font script="Geor" typeface="Sylfaen"/>
-        <a:font script="Armn" typeface="Arial"/>
-        <a:font script="Bugi" typeface="Leelawadee UI"/>
-        <a:font script="Bopo" typeface="Microsoft JhengHei"/>
-        <a:font script="Java" typeface="Javanese Text"/>
-        <a:font script="Lisu" typeface="Segoe UI"/>
-        <a:font script="Mymr" typeface="Myanmar Text"/>
-        <a:font script="Nkoo" typeface="Ebrima"/>
-        <a:font script="Olck" typeface="Nirmala UI"/>
-        <a:font script="Osma" typeface="Ebrima"/>
-        <a:font script="Phag" typeface="Phagspa"/>
-        <a:font script="Syrn" typeface="Estrangelo Edessa"/>
-        <a:font script="Syrj" typeface="Estrangelo Edessa"/>
-        <a:font script="Syre" typeface="Estrangelo Edessa"/>
-        <a:font script="Sora" typeface="Nirmala UI"/>
-        <a:font script="Tale" typeface="Microsoft Tai Le"/>
-        <a:font script="Talu" typeface="Microsoft New Tai Lue"/>
-        <a:font script="Tfng" typeface="Ebrima"/>
       </a:minorFont>
     </a:fontScheme>
     <a:fmtScheme name="Office">
@@ -4674,7 +4925,7 @@
   <a:extraClrSchemeLst/>
   <a:extLst>
     <a:ext uri="{05A4C25C-085E-4340-85A3-A5531E510DB2}">
-      <thm15:themeFamily xmlns:thm15="http://schemas.microsoft.com/office/thememl/2012/main" name="Office Theme" id="{2E142A2C-CD16-42D6-873A-C26D2A0506FA}" vid="{1BDDFF52-6CD6-40A5-AB3C-68EB2F1E4D0A}"/>
+      <thm15:themeFamily xmlns:thm15="http://schemas.microsoft.com/office/thememl/2012/main" name="Office Theme" id="{62F939B6-93AF-4DB8-9C6B-D6C7DFDC589F}" vid="{4A3C46E8-61CC-4603-A589-7422A47A8E4A}"/>
     </a:ext>
   </a:extLst>
 </a:theme>

</xml_diff>

<commit_message>
adding proposal text p9
</commit_message>
<xml_diff>
--- a/document/proposal.docx
+++ b/document/proposal.docx
@@ -31,7 +31,7 @@
         <w:pStyle w:val="Date"/>
       </w:pPr>
       <w:r>
-        <w:t xml:space="preserve">30 September 2026. Word count: 2414</w:t>
+        <w:t xml:space="preserve">30 September 2026. Word count: 2471</w:t>
       </w:r>
     </w:p>
     <w:p>
@@ -47,7 +47,7 @@
         <w:pStyle w:val="Abstract"/>
       </w:pPr>
       <w:r>
-        <w:t xml:space="preserve">The modelling of high‑dimensional joint dependence among financial risk factors remains a significant major challenge for the financial industry. Classical statistical approaches, notably Gaussian copulas, fail to capture tail dependence adequately, leading to systematic under‑estimation of extreme portfolio losses. This MSc project aims to develop a scalable algorithm for calibrating high‑dimensional copulas that exhibit non‑Gaussian tail dependence while preserving observed marginal and correlation structures. The methodology combines semi‑analytical techniques with modern machine‑learning models to generate realistic joint‑distribution scenarios for up to several hundred risk factors. A proof‑of‑concept Python software implementation will be built to (i) retrieve and cache market data via the Yahoo API, (ii) compute portfolio Value‑at‑Risk (VaR)) using both historical and Monte‑Carlo simulations, and (iii) integrate the calibrated copulas as modular components within the Monte‑Carlo engine. Empirical experiments will assess the impact of copula selection on VaR/ES estimates across a range of selected portfolios, followed by an optimisation routine to fit copula parameters to observed data. Finally, a deep‑neural‑network (MLP) will be trained to learn the calibrated parameters directly from the data, and a testing suite will verify adherence to prescribed dependence and tail criteria. The expected contributions are threefold: (1) a novel high‑dimensional copula calibration framework capable of reproducing empirical tail dependence, (2) a software prototype for market‑data acquisition, risk‑metric computation, and scenario generation, and (3) an empirical evaluation of how alternative copula assumptions affect risk‑measure outcomes, thereby offering a more robust toolset for stress‑testing and capital‑planning in high‑dimensional settings.</w:t>
+        <w:t xml:space="preserve">The modelling of high‑dimensional joint dependence among financial risk factors remains a significant major challenge for the financial industry and Data Science. Classical statistical approaches, notably Gaussian copulas, fail to capture tail dependence adequately, leading to systematic under‑estimation of extreme portfolio losses. This MSc project aims to develop a scalable algorithm for calibrating high‑dimensional copulas that exhibit non‑Gaussian tail dependence while preserving observed marginal and correlation structures. The methodology combines semi‑analytical techniques with Machine Learning models to generate realistic joint‑distribution scenarios for up to several hundred risk factors. A proof‑of‑concept Python software implementation will be built to (i) retrieve and cache market data via the Yahoo Finance API, (ii) compute a portfolio Value‑at‑Risk using both historical and Monte‑Carlo simulations, and (iii) integrate the calibrated copulas as modular components within our new Monte‑Carlo engine. Empirical experiments will assess the impact of copula selection on Value‑at‑Risk estimates across a range of selected portfolios, followed by calibration routine to fit copula parameters to observed data. Finally, a deep‑neural‑network will be trained to learn the calibrated parameters directly from the data, and a testing suite will verify adherence to prescribed dependence and tail criteria. The expected contributions are threefold: (1) a novel high‑dimensional copula calibration framework capable of reproducing empirical tail dependence, (2) a software prototype for market‑data acquisition, risk‑metric computation, and scenario generation, and (3) an empirical evaluation of how alternative copula assumptions affect risk‑measure outcomes, thereby offering a more robust toolset for stress‑testing and capital‑planning in high‑dimensional settings.</w:t>
       </w:r>
     </w:p>
     <w:sdt>
@@ -90,7 +90,7 @@
         <w:pStyle w:val="FirstParagraph"/>
       </w:pPr>
       <w:r>
-        <w:t xml:space="preserve">Despite the popularity of ML/AI algorithms in finance, they have mainly been used for either one or a small number of random factors. Nevertheless, joint analytics of high dimensionality (e.g., &gt;100 random factors) present serious challenges. This task is hard to address with classical statistical methods, and the available toolset is quite limited, i.e., mainly based on Gaussian copulas. There is hope that modern advances in ML/AI algorithms could help expand this toolset and provide alternative approaches for modeling high-dimensional joint dependency.</w:t>
+        <w:t xml:space="preserve">Despite the popularity of ML/AI algorithms in finance, they have mainly been used for either one or a small number of random factors. Nevertheless, joint analytics of high dimensionality (e.g., &gt;100 random factors) still present serious challenges. This task is hard to address with classical statistical methods, and the available toolset is quite limited, i.e., mainly based on Gaussian copulas. There is hope that advances in ML/AI algorithms and corresponding software libraries will help expand this toolset and provide alternative approaches for modeling high-dimensional joint dependency.</w:t>
       </w:r>
     </w:p>
     <w:p>
@@ -98,7 +98,7 @@
         <w:pStyle w:val="BodyText"/>
       </w:pPr>
       <w:r>
-        <w:t xml:space="preserve">This MSc proposal proceeds by outlining its primary goals and objectives. Subsequently, it explains the problem under investigation, along with pertinent work that provides essential concepts and a literature review. The subsequent sections detail the methodology and techniques employed to achieve the previously outlined objectives. The proposal concludes in a development plan for the project.</w:t>
+        <w:t xml:space="preserve">This MSc proposal proceeds by outlining its primary goals and objectives. Subsequently, it explains the problem under investigation, along with pertinent work that provides essential concepts and a literature review. The subsequent sections detail the methodology and techniques employed to achieve the previously outlined objectives. The proposal concludes in a development plan for the project and a risk mitigation analysis.</w:t>
       </w:r>
     </w:p>
     <w:bookmarkEnd w:id="17"/>
@@ -116,7 +116,7 @@
         <w:pStyle w:val="FirstParagraph"/>
       </w:pPr>
       <w:r>
-        <w:t xml:space="preserve">The main aim of this work would be to develop an algorithm for calibrating a high-dimensional copula with tail dependence different from Gaussian, while still reflecting the observed history with regards to selected measures (i.e., matching correlation matrix, matching Value-at-Risk measures or pairwise tail dependence at the specific percentile, etc.). On the simulation part, a range of different approaches can be considered, starting from semi-analytical methods to Variational Autoencoders (VAEs) and Generative Adversarial Networks (GANs).</w:t>
+        <w:t xml:space="preserve">The main aim of this project is to develop a Machine Learning algorithm for calibrating a high-dimensional copula with tail dependence different from Gaussian, while still reflecting the observed history with regards to selected measures (i.e., matching correlation matrix, matching Value-at-Risk measures or pairwise tail dependence at the specific percentile, etc.). On the simulation part, a range of different approaches can be considered, starting from semi-analytical methods to Variational Autoencoders (VAEs) and Generative Adversarial Networks (GANs).</w:t>
       </w:r>
     </w:p>
     <w:p>
@@ -124,7 +124,19 @@
         <w:pStyle w:val="BodyText"/>
       </w:pPr>
       <w:r>
-        <w:t xml:space="preserve">To illustrate and test the results project will also require to develop a software application designed for extracting and caching market data, with subsequent incorporation of calculations of portfolio Value-at-Risk (VaR) and/or Expected Shortfall (ES) measures. To achieve this, implement Monte Carlo simulations using various copulas within the application, in addition to providing support for the pure historical calculation methods (which can serve as a benchmark).</w:t>
+        <w:t xml:space="preserve">To create this new algorithm empirically requires to develop a software for extracting and caching market data, with subsequent incorporation of calculations of portfolio Value-at-Risk (VaR) and/or Expected Shortfall (ES) measures, which are computationally intensive on their own. To create my</w:t>
+      </w:r>
+      <w:r>
+        <w:t xml:space="preserve"> </w:t>
+      </w:r>
+      <w:r>
+        <w:t xml:space="preserve">‘workbench’</w:t>
+      </w:r>
+      <w:r>
+        <w:t xml:space="preserve"> </w:t>
+      </w:r>
+      <w:r>
+        <w:t xml:space="preserve">I will implement Monte Carlo simulations using various copulas within the application, in addition to providing support for the pure historical calculation methods (which will serve as an assessment baseline).</w:t>
       </w:r>
     </w:p>
     <w:p>
@@ -132,7 +144,7 @@
         <w:pStyle w:val="BodyText"/>
       </w:pPr>
       <w:r>
-        <w:t xml:space="preserve">Upon completion of the initial software development, conduct an experimental analysis to evaluate the impact of copula assumptions on the selected VaR / ES measures across distinct portfolios. Following this, establish a calibration procedure aimed at fitting appropriate copulas to real-world market data. Lastly, devise a testing exercise to verify whether the calibrated copulas align with the prescribed conditions.</w:t>
+        <w:t xml:space="preserve">Upon completion of the initial software development, I plan to conduct an experimental analysis to evaluate the impact of copula assumptions on the selected VaR / ES measures (defined below) across distinct portfolios. Following this, establish a calibration procedure aimed at fitting appropriate copulas to real-world market data. Lastly, devise a testing exercise to verify whether the calibrated copulas align with the prescribed conditions and evaluate results against the literature baselines.</w:t>
       </w:r>
     </w:p>
     <w:bookmarkEnd w:id="18"/>
@@ -168,7 +180,7 @@
         <w:pStyle w:val="FirstParagraph"/>
       </w:pPr>
       <w:r>
-        <w:t xml:space="preserve">Based on</w:t>
+        <w:t xml:space="preserve">According to classic Jorion’s work</w:t>
       </w:r>
       <w:r>
         <w:t xml:space="preserve"> </w:t>
@@ -182,7 +194,7 @@
         </w:r>
       </w:hyperlink>
       <w:r>
-        <w:t xml:space="preserve">, portfolio Value-at-risk (VaR) can be defined as the quantile (usually high 99%, 99.9% etc.) of the projected distribution of gains and loses over the target horizon. In simple terms it summarizes the worst loss that will not be exceeded with a given level of confidence.</w:t>
+        <w:t xml:space="preserve">, portfolio Value-at-risk (VaR) can be defined as the quantile (usually high 99%, 99.9% etc.) of the projected distribution of gains and losses over the target horizon. In simple terms it summarizes the worst loss that will not be exceeded with a given level of confidence.</w:t>
       </w:r>
     </w:p>
     <w:p>
@@ -481,10 +493,7 @@
         <w:pStyle w:val="FirstParagraph"/>
       </w:pPr>
       <w:r>
-        <w:t xml:space="preserve">Additional details and relevant industry discussion about ES are available in</w:t>
-      </w:r>
-      <w:r>
-        <w:t xml:space="preserve"> </w:t>
+        <w:t xml:space="preserve">Additional details and relevant industry discussions about ES are available in Cont et. al. </w:t>
       </w:r>
       <w:hyperlink w:anchor="references">
         <w:r>
@@ -503,7 +512,7 @@
         <w:pStyle w:val="BodyText"/>
       </w:pPr>
       <w:r>
-        <w:t xml:space="preserve">There are several main contesting industry spread approaches (see</w:t>
+        <w:t xml:space="preserve">Today there are several main contesting industry spread approaches to VaR (see</w:t>
       </w:r>
       <w:r>
         <w:t xml:space="preserve"> </w:t>
@@ -532,7 +541,7 @@
         </w:numPr>
       </w:pPr>
       <w:r>
-        <w:t xml:space="preserve">Historical Value-at-Risk (HVaR),</w:t>
+        <w:t xml:space="preserve">Historical Value-at-Risk (HVaR);</w:t>
       </w:r>
     </w:p>
     <w:p>
@@ -544,7 +553,7 @@
         </w:numPr>
       </w:pPr>
       <w:r>
-        <w:t xml:space="preserve">Monte Carlo Value-at-Risk (MC VaR),</w:t>
+        <w:t xml:space="preserve">Monte Carlo Value-at-Risk (MC VaR) and</w:t>
       </w:r>
     </w:p>
     <w:p>
@@ -556,7 +565,7 @@
         </w:numPr>
       </w:pPr>
       <w:r>
-        <w:t xml:space="preserve">and their hybrids.</w:t>
+        <w:t xml:space="preserve">their hybrids.</w:t>
       </w:r>
     </w:p>
     <w:p>
@@ -564,7 +573,7 @@
         <w:pStyle w:val="FirstParagraph"/>
       </w:pPr>
       <w:r>
-        <w:t xml:space="preserve">When assessing Historical Value-at-Risk (HVaR), several inherent limitations are apparent, particularly when applied to high-percentile risk measures i.e. its inability to estimate extreme percentiles beyond the 99% threshold, as the method relies solely on observed historical data, which often lacks sufficient extreme observations to produce stable tail estimates (e.g. 1 year of data means approx. 250 observations, so the worst one would correspond to 99.6 % and hence being quite unstable). While HVaR does allow for filtration techniques to refine marginal distributions, this flexibility does not extend to the dependence structure, meaning it cannot effectively separate the modelling of marginals from the copula that links them. As a result, the approach struggles to capture complex joint behaviors in a structured way. Another related critical drawback is the high numerical error associated with HVaR, stemming from the finite and often sparse nature of historical data, especially in the tails. On the other hand, the relative strength of the method is its low model error, since it does not impose strong parametric assumptions but instead directly uses empirical distributions. This makes it robust in scenarios where the true data-generating process is unknown (and a good benchmark), though at the cost of precision in extreme quantiles.</w:t>
+        <w:t xml:space="preserve">When assessing Historical Value-at-Risk (HVaR), several inherent limitations are apparent, particularly when applied to high-percentile risk measures i.e. its inability to estimate extreme percentiles beyond the 99% threshold, as the method relies solely on observed historical data, which often lacks sufficient extreme observations to produce stable tail estimates (e.g. 1 year of data means approx. 250 observations, so the worst one would correspond to 99.6 % and hence being quite unstable). While HVaR does allow for filtration techniques to refine marginal distributions, this flexibility does not extend to the dependence structure, meaning it cannot effectively separate the modelling of marginals from the copula that links them. As a result, the approach struggles to capture complex joint behaviours in a structured way. Another related critical drawback is the high numerical error associated with HVaR, stemming from the finite and often sparse nature of historical data, especially in the tails. On the other hand, the relative strength of the method is its low model error (very few assumptions used), since it does not impose strong parametric assumptions but instead directly uses empirical distributions. This makes it robust in scenarios where the true data-generating process is unknown and there are no other available benchmarks, though at the cost of precision in extreme quantiles.</w:t>
       </w:r>
     </w:p>
     <w:p>
@@ -572,7 +581,21 @@
         <w:pStyle w:val="BodyText"/>
       </w:pPr>
       <w:r>
-        <w:t xml:space="preserve">In contrast, Monte Carlo Value-at-Risk (MC VaR), whether based on parametric assumptions or Extreme Value Theory (EVT), offers distinct advantages for high-percentile risk estimation. Unlike HVaR, these methods are well-suited for quantiles far beyond 99%, as they generate synthetic data to populate the tails more densely. A key structural benefit is their ability to decouple marginal distributions from the copula, allowing for independent calibration of each component. This separation enhances flexibility in modelling dependence structure while maintaining control over individual risk factors.</w:t>
+        <w:t xml:space="preserve">In contrast, Monte Carlo Value-at-Risk (MC VaR), whether based on parametric assumptions or Extreme Value Theory (EVT) see</w:t>
+      </w:r>
+      <w:r>
+        <w:t xml:space="preserve"> </w:t>
+      </w:r>
+      <w:hyperlink w:anchor="references">
+        <w:r>
+          <w:rPr>
+            <w:rStyle w:val="Hyperlink"/>
+          </w:rPr>
+          <w:t xml:space="preserve">[1]</w:t>
+        </w:r>
+      </w:hyperlink>
+      <w:r>
+        <w:t xml:space="preserve">, offers distinct advantages for high-percentile risk estimation. Unlike HVaR, these methods are well-suited for quantiles far beyond 99%, as they generate synthetic data to populate the tails more densely. A key structural benefit is their ability to decouple marginal distributions from the copula, allowing for independent calibration of each component. This separation enhances flexibility in modelling dependence structure while maintaining control over individual risk factors.</w:t>
       </w:r>
     </w:p>
     <w:p>
@@ -2228,7 +2251,7 @@
         <w:pStyle w:val="BodyText"/>
       </w:pPr>
       <w:r>
-        <w:t xml:space="preserve">The Cauchy copula is a statistical technique for capturing dependence structures, especially when modelling tail‑risk or extreme events. Its principal advantage lies in preserving the overall correlation matrix of the underlying variables while simultaneously enabling the generation of scenarios that exhibit much heavier tails (joint‑movement) and de-correlation. In practice, this means that the copula retains the familiar linear dependence captured by pearson‑type correlations, yet it can produce joint realizations that reflect the heightened co‑movement observed during rare, high‑impact shocks.</w:t>
+        <w:t xml:space="preserve">The Cauchy copula is a statistical technique for capturing dependence structures, especially when modelling tail‑risk or extreme events. Its principal advantage lies in preserving the overall correlation matrix of the underlying variables while simultaneously enabling the generation of scenarios that exhibit much heavier tails (joint‑movement) and de-correlation. In practice, this means that the copula retains the familiar linear dependence captured by Pearson‑type correlations, yet it can produce joint realizations that reflect the heightened co‑movement observed during rare, high‑impact shocks.</w:t>
       </w:r>
     </w:p>
     <w:p>
@@ -2252,7 +2275,7 @@
         <w:pStyle w:val="BodyText"/>
       </w:pPr>
       <w:r>
-        <w:t xml:space="preserve">Both types of scenarios are crucial for robust risk assessment. De‑correlation highlights the risk of assets that are supposed to hedge each other stop doing so, while joint‑movement emphasizes the danger of hidden tail‑dependence that can generate simultaneous losses across seemingly unrelated positions. Modelling frameworks that can generate both behaviors, provide a more realistic picture of potential extreme outcomes than approaches that rely solely on historic linear correlations.</w:t>
+        <w:t xml:space="preserve">Both types of scenarios are crucial for robust risk assessment. De‑correlation highlights the risk of assets that are supposed to hedge each other stop doing so, while joint‑movement emphasizes the danger of hidden tail‑dependence that can generate simultaneous losses across seemingly unrelated positions. Modelling frameworks that can generate both behaviours, provide a more realistic picture of potential extreme outcomes than approaches that rely solely on historic linear correlations.</w:t>
       </w:r>
     </w:p>
     <w:bookmarkEnd w:id="24"/>
@@ -2390,7 +2413,7 @@
       <w:r>
         <w:drawing>
           <wp:inline>
-            <wp:extent cx="5943600" cy="2402731"/>
+            <wp:extent cx="5943600" cy="2116281"/>
             <wp:effectExtent b="0" l="0" r="0" t="0"/>
             <wp:docPr descr="Figure 2: Copula calibration workflow" title="" id="29" name="Picture"/>
             <a:graphic>
@@ -2411,7 +2434,7 @@
                   <pic:spPr bwMode="auto">
                     <a:xfrm>
                       <a:off x="0" y="0"/>
-                      <a:ext cx="5943600" cy="2402731"/>
+                      <a:ext cx="5943600" cy="2116281"/>
                     </a:xfrm>
                     <a:prstGeom prst="rect">
                       <a:avLst/>
@@ -2453,7 +2476,7 @@
       <w:r>
         <w:drawing>
           <wp:inline>
-            <wp:extent cx="5943600" cy="4081749"/>
+            <wp:extent cx="5943600" cy="3182614"/>
             <wp:effectExtent b="0" l="0" r="0" t="0"/>
             <wp:docPr descr="Figure 3: Detailed process of data transformations for copula calibration" title="" id="32" name="Picture"/>
             <a:graphic>
@@ -2474,7 +2497,7 @@
                   <pic:spPr bwMode="auto">
                     <a:xfrm>
                       <a:off x="0" y="0"/>
-                      <a:ext cx="5943600" cy="4081749"/>
+                      <a:ext cx="5943600" cy="3182614"/>
                     </a:xfrm>
                     <a:prstGeom prst="rect">
                       <a:avLst/>
@@ -2535,13 +2558,13 @@
       </w:r>
     </w:p>
     <w:bookmarkEnd w:id="34"/>
-    <w:bookmarkStart w:id="35" w:name="project-development-plan"/>
+    <w:bookmarkStart w:id="35" w:name="Xb80ddedb553230bdae8cbf809d981d8b8ec3898"/>
     <w:p>
       <w:pPr>
         <w:pStyle w:val="Heading1"/>
       </w:pPr>
       <w:r>
-        <w:t xml:space="preserve">Project development plan</w:t>
+        <w:t xml:space="preserve">Project development plan and risk mitigation analysis</w:t>
       </w:r>
     </w:p>
     <w:p>
@@ -2571,7 +2594,7 @@
         <w:t xml:space="preserve"> </w:t>
       </w:r>
       <w:r>
-        <w:t xml:space="preserve">Develop functionality (Python) able to discover required market data and cache it from Yahoo API according the required population, length and granularity.</w:t>
+        <w:t xml:space="preserve">Develop functionality (Python) able to discover required market data and cache it from Yahoo Finance API according to the required population, length and granularity.</w:t>
       </w:r>
     </w:p>
     <w:p>
@@ -2637,7 +2660,7 @@
         <w:t xml:space="preserve"> </w:t>
       </w:r>
       <w:r>
-        <w:t xml:space="preserve">Build optimization functionality select parameters for the copula matching current measures for the list of selected portfolios. Once the best matching parameters are available attempt on learning them from the observations directly with deep neral net (MLP).</w:t>
+        <w:t xml:space="preserve">Build optimization functionality select parameters for the copula matching current measures for the list of selected portfolios.</w:t>
       </w:r>
       <w:r>
         <w:br/>
@@ -2662,7 +2685,7 @@
         <w:t xml:space="preserve"> </w:t>
       </w:r>
       <w:r>
-        <w:t xml:space="preserve">Design a testing exercise to ensure the calibrated copulas adhere to the specified conditions. Test whether MLP neral net was able to learn specific copula parameters directly from the data.</w:t>
+        <w:t xml:space="preserve">Design a testing exercise to ensure the calibrated copulas adhere to the specified conditions.</w:t>
       </w:r>
     </w:p>
     <w:p>
@@ -2685,6 +2708,14 @@
       </w:r>
       <w:r>
         <w:t xml:space="preserve">Assess obtained results, summarize observations and developed software within the report.</w:t>
+      </w:r>
+    </w:p>
+    <w:p>
+      <w:pPr>
+        <w:pStyle w:val="FirstParagraph"/>
+      </w:pPr>
+      <w:r>
+        <w:t xml:space="preserve">There is a distinct possibility that certain project phases may overrun, particularly code development, testing, and the selection of the copula calibration algorithm. To mitigate this, it is aimed to complete the core work by August 2026, providing a buffer to accommodate potential delays.</w:t>
       </w:r>
     </w:p>
     <w:bookmarkEnd w:id="35"/>

</xml_diff>

<commit_message>
adding proposal text p10
</commit_message>
<xml_diff>
--- a/document/proposal.docx
+++ b/document/proposal.docx
@@ -31,7 +31,7 @@
         <w:pStyle w:val="Date"/>
       </w:pPr>
       <w:r>
-        <w:t xml:space="preserve">30 September 2026. Word count: 2471</w:t>
+        <w:t xml:space="preserve">30 September 2026. Word count: 2481</w:t>
       </w:r>
     </w:p>
     <w:p>
@@ -90,7 +90,25 @@
         <w:pStyle w:val="FirstParagraph"/>
       </w:pPr>
       <w:r>
-        <w:t xml:space="preserve">Despite the popularity of ML/AI algorithms in finance, they have mainly been used for either one or a small number of random factors. Nevertheless, joint analytics of high dimensionality (e.g., &gt;100 random factors) still present serious challenges. This task is hard to address with classical statistical methods, and the available toolset is quite limited, i.e., mainly based on Gaussian copulas. There is hope that advances in ML/AI algorithms and corresponding software libraries will help expand this toolset and provide alternative approaches for modeling high-dimensional joint dependency.</w:t>
+        <w:t xml:space="preserve">Despite the popularity of ML/AI algorithms in finance, they have mainly been used for either one or a small number of random factors.</w:t>
+      </w:r>
+      <w:r>
+        <w:t xml:space="preserve"> </w:t>
+      </w:r>
+      <w:r>
+        <w:t xml:space="preserve">Nevertheless, joint analytics of high dimensionality (e.g., &gt;100 random factors) still present serious challenges.</w:t>
+      </w:r>
+      <w:r>
+        <w:t xml:space="preserve"> </w:t>
+      </w:r>
+      <w:r>
+        <w:t xml:space="preserve">This task is hard to address with classical statistical methods, and the available toolset is quite limited, i.e., mainly based on Gaussian copulas.</w:t>
+      </w:r>
+      <w:r>
+        <w:t xml:space="preserve"> </w:t>
+      </w:r>
+      <w:r>
+        <w:t xml:space="preserve">There is hope that advances in ML/AI algorithms and corresponding software libraries will help expand this toolset and provide alternative approaches for modeling high-dimensional joint dependency.</w:t>
       </w:r>
     </w:p>
     <w:p>
@@ -148,7 +166,7 @@
       </w:r>
     </w:p>
     <w:bookmarkEnd w:id="18"/>
-    <w:bookmarkStart w:id="27" w:name="X32b9430d5d15411fac62685483839fe9d87a9a8"/>
+    <w:bookmarkStart w:id="28" w:name="X32b9430d5d15411fac62685483839fe9d87a9a8"/>
     <w:p>
       <w:pPr>
         <w:pStyle w:val="Heading1"/>
@@ -157,7 +175,7 @@
         <w:t xml:space="preserve">Description of the problem and relevant work</w:t>
       </w:r>
     </w:p>
-    <w:bookmarkStart w:id="25" w:name="key-concepts"/>
+    <w:bookmarkStart w:id="26" w:name="key-concepts"/>
     <w:p>
       <w:pPr>
         <w:pStyle w:val="Heading2"/>
@@ -210,10 +228,21 @@
             <m:e>
               <m:r>
                 <m:rPr>
-                  <m:nor/>
                   <m:sty m:val="p"/>
                 </m:rPr>
-                <m:t>VaR</m:t>
+                <m:t>V</m:t>
+              </m:r>
+              <m:r>
+                <m:rPr>
+                  <m:sty m:val="p"/>
+                </m:rPr>
+                <m:t>a</m:t>
+              </m:r>
+              <m:r>
+                <m:rPr>
+                  <m:sty m:val="p"/>
+                </m:rPr>
+                <m:t>R</m:t>
               </m:r>
             </m:e>
             <m:sub>
@@ -345,7 +374,7 @@
         <w:pStyle w:val="BodyText"/>
       </w:pPr>
       <w:r>
-        <w:t xml:space="preserve">On the other hand, Expected Shortfall (ES) measures the average loss in the tail of a loss distribution.</w:t>
+        <w:t xml:space="preserve">On the other hand, Expected Shortfall (ES) measures the average loss in the tail of a loss distribution:</w:t>
       </w:r>
     </w:p>
     <w:p>
@@ -393,39 +422,30 @@
             </m:rPr>
             <m:t>=</m:t>
           </m:r>
-          <m:r>
-            <m:t>1</m:t>
-          </m:r>
-          <m:r>
-            <m:rPr>
-              <m:sty m:val="p"/>
-            </m:rPr>
-            <m:t>/</m:t>
-          </m:r>
-          <m:r>
-            <m:rPr>
-              <m:sty m:val="p"/>
-            </m:rPr>
-            <m:t>(</m:t>
-          </m:r>
-          <m:r>
-            <m:t>1</m:t>
-          </m:r>
-          <m:r>
-            <m:rPr>
-              <m:sty m:val="p"/>
-            </m:rPr>
-            <m:t>−</m:t>
-          </m:r>
-          <m:r>
-            <m:t>α</m:t>
-          </m:r>
-          <m:r>
-            <m:rPr>
-              <m:sty m:val="p"/>
-            </m:rPr>
-            <m:t>)</m:t>
-          </m:r>
+          <m:f>
+            <m:fPr>
+              <m:type m:val="bar"/>
+            </m:fPr>
+            <m:num>
+              <m:r>
+                <m:t>1</m:t>
+              </m:r>
+            </m:num>
+            <m:den>
+              <m:r>
+                <m:t>1</m:t>
+              </m:r>
+              <m:r>
+                <m:rPr>
+                  <m:sty m:val="p"/>
+                </m:rPr>
+                <m:t>−</m:t>
+              </m:r>
+              <m:r>
+                <m:t>α</m:t>
+              </m:r>
+            </m:den>
+          </m:f>
           <m:nary>
             <m:naryPr>
               <m:chr m:val="∫"/>
@@ -485,6 +505,12 @@
           <m:r>
             <m:t>p</m:t>
           </m:r>
+          <m:r>
+            <m:rPr>
+              <m:sty m:val="p"/>
+            </m:rPr>
+            <m:t>.</m:t>
+          </m:r>
         </m:oMath>
       </m:oMathPara>
     </w:p>
@@ -573,7 +599,37 @@
         <w:pStyle w:val="FirstParagraph"/>
       </w:pPr>
       <w:r>
-        <w:t xml:space="preserve">When assessing Historical Value-at-Risk (HVaR), several inherent limitations are apparent, particularly when applied to high-percentile risk measures i.e. its inability to estimate extreme percentiles beyond the 99% threshold, as the method relies solely on observed historical data, which often lacks sufficient extreme observations to produce stable tail estimates (e.g. 1 year of data means approx. 250 observations, so the worst one would correspond to 99.6 % and hence being quite unstable). While HVaR does allow for filtration techniques to refine marginal distributions, this flexibility does not extend to the dependence structure, meaning it cannot effectively separate the modelling of marginals from the copula that links them. As a result, the approach struggles to capture complex joint behaviours in a structured way. Another related critical drawback is the high numerical error associated with HVaR, stemming from the finite and often sparse nature of historical data, especially in the tails. On the other hand, the relative strength of the method is its low model error (very few assumptions used), since it does not impose strong parametric assumptions but instead directly uses empirical distributions. This makes it robust in scenarios where the true data-generating process is unknown and there are no other available benchmarks, though at the cost of precision in extreme quantiles.</w:t>
+        <w:t xml:space="preserve">When assessing Historical Value-at-Risk (HVaR), several inherent limitations are apparent, particularly when applied to high-percentile risk measures i.e. its inability to estimate extreme percentiles beyond the 99% threshold, as the method relies solely on observed historical data, which often lacks sufficient extreme observations to produce stable tail estimates (e.g. 1 year of data means approx. 250 observations, so the worst one would correspond to 99.6 % and hence being quite unstable).</w:t>
+      </w:r>
+      <w:r>
+        <w:t xml:space="preserve"> </w:t>
+      </w:r>
+      <w:r>
+        <w:t xml:space="preserve">While HVaR does allow for filtration techniques to refine marginal distributions, this flexibility does not extend to the dependence structure, meaning it cannot effectively separate the modelling of marginals from the copula that links them.</w:t>
+      </w:r>
+      <w:r>
+        <w:t xml:space="preserve"> </w:t>
+      </w:r>
+      <w:r>
+        <w:t xml:space="preserve">As a result, the approach struggles to capture complex joint behaviours in a structured way.</w:t>
+      </w:r>
+      <w:r>
+        <w:t xml:space="preserve"> </w:t>
+      </w:r>
+      <w:r>
+        <w:t xml:space="preserve">Another related critical drawback is the high numerical error associated with HVaR, stemming from the finite and often sparse nature of historical data, especially in the tails.</w:t>
+      </w:r>
+      <w:r>
+        <w:t xml:space="preserve"> </w:t>
+      </w:r>
+      <w:r>
+        <w:t xml:space="preserve">On the other hand, the relative strength of the method is its low model error (very few assumptions used), since it does not impose strong parametric assumptions but instead directly uses empirical distributions.</w:t>
+      </w:r>
+      <w:r>
+        <w:t xml:space="preserve"> </w:t>
+      </w:r>
+      <w:r>
+        <w:t xml:space="preserve">This makes it robust in scenarios where the true data-generating process is unknown and there are no other available benchmarks, though at the cost of precision in extreme quantiles.</w:t>
       </w:r>
     </w:p>
     <w:p>
@@ -595,7 +651,19 @@
         </w:r>
       </w:hyperlink>
       <w:r>
-        <w:t xml:space="preserve">, offers distinct advantages for high-percentile risk estimation. Unlike HVaR, these methods are well-suited for quantiles far beyond 99%, as they generate synthetic data to populate the tails more densely. A key structural benefit is their ability to decouple marginal distributions from the copula, allowing for independent calibration of each component. This separation enhances flexibility in modelling dependence structure while maintaining control over individual risk factors.</w:t>
+        <w:t xml:space="preserve">, offers distinct advantages for high-percentile risk estimation.</w:t>
+      </w:r>
+      <w:r>
+        <w:t xml:space="preserve"> </w:t>
+      </w:r>
+      <w:r>
+        <w:t xml:space="preserve">Unlike HVaR, these methods are well-suited for quantiles far beyond 99%, as they generate synthetic data to populate the tails more densely. A key structural benefit is their ability to decouple marginal distributions from the copula, allowing for independent calibration of each component.</w:t>
+      </w:r>
+      <w:r>
+        <w:t xml:space="preserve"> </w:t>
+      </w:r>
+      <w:r>
+        <w:t xml:space="preserve">This separation enhances flexibility in modelling dependence structure while maintaining control over individual risk factors.</w:t>
       </w:r>
     </w:p>
     <w:p>
@@ -603,17 +671,29 @@
         <w:pStyle w:val="BodyText"/>
       </w:pPr>
       <w:r>
-        <w:t xml:space="preserve">From a computational perspective, MC VaR methods exhibit low numerical error, as the simulated datasets can be made arbitrarily large to smooth out estimation noise. However, this precision comes at the expense of higher model error, particularly when parametric assumptions are misspecified or when EVT extrapolations deviate from true tail behavior. While these methods provide greater control and extensibility in extreme risk modelling, their reliability hinges on the accuracy of the underlying assumptions, whether in the choice of distributions copula functions, or tail decay parameters.</w:t>
+        <w:t xml:space="preserve">From a computational perspective, MC VaR methods exhibit low numerical error, as the simulated datasets can be made arbitrarily large to smooth out estimation noise.</w:t>
+      </w:r>
+      <w:r>
+        <w:t xml:space="preserve"> </w:t>
+      </w:r>
+      <w:r>
+        <w:t xml:space="preserve">However, this precision comes at the expense of higher model error, particularly when parametric assumptions are misspecified or when EVT extrapolations deviate from true tail behavior.</w:t>
+      </w:r>
+      <w:r>
+        <w:t xml:space="preserve"> </w:t>
+      </w:r>
+      <w:r>
+        <w:t xml:space="preserve">While these methods provide greater control and extensibility in extreme-risk modelling, their reliability hinges on the accuracy of the underlying assumptions, whether in the choice of distributions, copula functions, or tail decay parameters.</w:t>
       </w:r>
     </w:p>
     <w:bookmarkEnd w:id="19"/>
-    <w:bookmarkStart w:id="20" w:name="copulas."/>
+    <w:bookmarkStart w:id="20" w:name="copulas"/>
     <w:p>
       <w:pPr>
         <w:pStyle w:val="Heading3"/>
       </w:pPr>
       <w:r>
-        <w:t xml:space="preserve">Copulas.</w:t>
+        <w:t xml:space="preserve">Copulas</w:t>
       </w:r>
     </w:p>
     <w:p>
@@ -621,7 +701,7 @@
         <w:pStyle w:val="FirstParagraph"/>
       </w:pPr>
       <w:r>
-        <w:t xml:space="preserve">In this section we briefly introduce the concept of copulas and provide additional references, followed by the impacts it could have on VaR/ES measures.</w:t>
+        <w:t xml:space="preserve">In this section we briefly introduce the concept of copulas and provide additional references, followed by a discussion of the impact it has on VaR/ES measures.</w:t>
       </w:r>
     </w:p>
     <w:p>
@@ -770,7 +850,7 @@
         <w:t xml:space="preserve"> </w:t>
       </w:r>
       <w:r>
-        <w:t xml:space="preserve">with uniform marginals.</w:t>
+        <w:t xml:space="preserve">with marginals (i.e. each dimension) following a uniform distribution.</w:t>
       </w:r>
     </w:p>
     <w:p>
@@ -778,622 +858,7 @@
         <w:pStyle w:val="BodyText"/>
       </w:pPr>
       <w:r>
-        <w:t xml:space="preserve">Sklar’s theorem. Every multivariate cumulative distribution function</w:t>
-      </w:r>
-      <w:r>
-        <w:t xml:space="preserve"> </w:t>
-      </w:r>
-      <m:oMath>
-        <m:r>
-          <m:t>H</m:t>
-        </m:r>
-        <m:r>
-          <m:rPr>
-            <m:sty m:val="p"/>
-          </m:rPr>
-          <m:t>(</m:t>
-        </m:r>
-        <m:sSub>
-          <m:e>
-            <m:r>
-              <m:t>x</m:t>
-            </m:r>
-          </m:e>
-          <m:sub>
-            <m:r>
-              <m:t>1</m:t>
-            </m:r>
-          </m:sub>
-        </m:sSub>
-        <m:r>
-          <m:rPr>
-            <m:sty m:val="p"/>
-          </m:rPr>
-          <m:t>,</m:t>
-        </m:r>
-        <m:r>
-          <m:rPr>
-            <m:sty m:val="p"/>
-          </m:rPr>
-          <m:t>.</m:t>
-        </m:r>
-        <m:r>
-          <m:rPr>
-            <m:sty m:val="p"/>
-          </m:rPr>
-          <m:t>.</m:t>
-        </m:r>
-        <m:r>
-          <m:rPr>
-            <m:sty m:val="p"/>
-          </m:rPr>
-          <m:t>.</m:t>
-        </m:r>
-        <m:sSub>
-          <m:e>
-            <m:r>
-              <m:t>x</m:t>
-            </m:r>
-          </m:e>
-          <m:sub>
-            <m:r>
-              <m:t>d</m:t>
-            </m:r>
-          </m:sub>
-        </m:sSub>
-        <m:r>
-          <m:rPr>
-            <m:sty m:val="p"/>
-          </m:rPr>
-          <m:t>)</m:t>
-        </m:r>
-        <m:r>
-          <m:rPr>
-            <m:sty m:val="p"/>
-          </m:rPr>
-          <m:t>=</m:t>
-        </m:r>
-        <m:r>
-          <m:t>P</m:t>
-        </m:r>
-        <m:r>
-          <m:t>r</m:t>
-        </m:r>
-        <m:r>
-          <m:rPr>
-            <m:sty m:val="p"/>
-          </m:rPr>
-          <m:t>[</m:t>
-        </m:r>
-        <m:sSub>
-          <m:e>
-            <m:r>
-              <m:t>X</m:t>
-            </m:r>
-          </m:e>
-          <m:sub>
-            <m:r>
-              <m:t>1</m:t>
-            </m:r>
-          </m:sub>
-        </m:sSub>
-        <m:r>
-          <m:rPr>
-            <m:sty m:val="p"/>
-          </m:rPr>
-          <m:t>≤</m:t>
-        </m:r>
-        <m:sSub>
-          <m:e>
-            <m:r>
-              <m:t>x</m:t>
-            </m:r>
-          </m:e>
-          <m:sub>
-            <m:r>
-              <m:t>1</m:t>
-            </m:r>
-          </m:sub>
-        </m:sSub>
-        <m:r>
-          <m:rPr>
-            <m:sty m:val="p"/>
-          </m:rPr>
-          <m:t>,</m:t>
-        </m:r>
-        <m:r>
-          <m:rPr>
-            <m:sty m:val="p"/>
-          </m:rPr>
-          <m:t>.</m:t>
-        </m:r>
-        <m:r>
-          <m:rPr>
-            <m:sty m:val="p"/>
-          </m:rPr>
-          <m:t>.</m:t>
-        </m:r>
-        <m:r>
-          <m:rPr>
-            <m:sty m:val="p"/>
-          </m:rPr>
-          <m:t>.</m:t>
-        </m:r>
-        <m:sSub>
-          <m:e>
-            <m:r>
-              <m:t>X</m:t>
-            </m:r>
-          </m:e>
-          <m:sub>
-            <m:r>
-              <m:t>d</m:t>
-            </m:r>
-          </m:sub>
-        </m:sSub>
-        <m:r>
-          <m:rPr>
-            <m:sty m:val="p"/>
-          </m:rPr>
-          <m:t>≤</m:t>
-        </m:r>
-        <m:sSub>
-          <m:e>
-            <m:r>
-              <m:t>x</m:t>
-            </m:r>
-          </m:e>
-          <m:sub>
-            <m:r>
-              <m:t>d</m:t>
-            </m:r>
-          </m:sub>
-        </m:sSub>
-        <m:r>
-          <m:rPr>
-            <m:sty m:val="p"/>
-          </m:rPr>
-          <m:t>]</m:t>
-        </m:r>
-      </m:oMath>
-      <w:r>
-        <w:t xml:space="preserve"> </w:t>
-      </w:r>
-      <w:r>
-        <w:t xml:space="preserve">of a random</w:t>
-      </w:r>
-      <w:r>
-        <w:t xml:space="preserve"> </w:t>
-      </w:r>
-      <m:oMath>
-        <m:r>
-          <m:rPr>
-            <m:sty m:val="p"/>
-          </m:rPr>
-          <m:t>(</m:t>
-        </m:r>
-        <m:sSub>
-          <m:e>
-            <m:r>
-              <m:t>X</m:t>
-            </m:r>
-          </m:e>
-          <m:sub>
-            <m:r>
-              <m:t>1</m:t>
-            </m:r>
-          </m:sub>
-        </m:sSub>
-        <m:r>
-          <m:rPr>
-            <m:sty m:val="p"/>
-          </m:rPr>
-          <m:t>,</m:t>
-        </m:r>
-        <m:sSub>
-          <m:e>
-            <m:r>
-              <m:t>X</m:t>
-            </m:r>
-          </m:e>
-          <m:sub>
-            <m:r>
-              <m:t>2</m:t>
-            </m:r>
-          </m:sub>
-        </m:sSub>
-        <m:r>
-          <m:rPr>
-            <m:sty m:val="p"/>
-          </m:rPr>
-          <m:t>,</m:t>
-        </m:r>
-        <m:r>
-          <m:rPr>
-            <m:sty m:val="p"/>
-          </m:rPr>
-          <m:t>.</m:t>
-        </m:r>
-        <m:r>
-          <m:rPr>
-            <m:sty m:val="p"/>
-          </m:rPr>
-          <m:t>.</m:t>
-        </m:r>
-        <m:r>
-          <m:rPr>
-            <m:sty m:val="p"/>
-          </m:rPr>
-          <m:t>.</m:t>
-        </m:r>
-        <m:r>
-          <m:rPr>
-            <m:sty m:val="p"/>
-          </m:rPr>
-          <m:t>,</m:t>
-        </m:r>
-        <m:sSub>
-          <m:e>
-            <m:r>
-              <m:t>X</m:t>
-            </m:r>
-          </m:e>
-          <m:sub>
-            <m:r>
-              <m:t>d</m:t>
-            </m:r>
-          </m:sub>
-        </m:sSub>
-        <m:r>
-          <m:rPr>
-            <m:sty m:val="p"/>
-          </m:rPr>
-          <m:t>)</m:t>
-        </m:r>
-      </m:oMath>
-      <w:r>
-        <w:t xml:space="preserve"> </w:t>
-      </w:r>
-      <w:r>
-        <w:t xml:space="preserve">can be expressed in terms of its marginals</w:t>
-      </w:r>
-      <w:r>
-        <w:t xml:space="preserve"> </w:t>
-      </w:r>
-      <m:oMath>
-        <m:sSub>
-          <m:e>
-            <m:r>
-              <m:t>F</m:t>
-            </m:r>
-          </m:e>
-          <m:sub>
-            <m:r>
-              <m:t>i</m:t>
-            </m:r>
-          </m:sub>
-        </m:sSub>
-        <m:r>
-          <m:rPr>
-            <m:sty m:val="p"/>
-          </m:rPr>
-          <m:t>(</m:t>
-        </m:r>
-        <m:sSub>
-          <m:e>
-            <m:r>
-              <m:t>x</m:t>
-            </m:r>
-          </m:e>
-          <m:sub>
-            <m:r>
-              <m:t>i</m:t>
-            </m:r>
-          </m:sub>
-        </m:sSub>
-        <m:r>
-          <m:rPr>
-            <m:sty m:val="p"/>
-          </m:rPr>
-          <m:t>)</m:t>
-        </m:r>
-        <m:r>
-          <m:rPr>
-            <m:sty m:val="p"/>
-          </m:rPr>
-          <m:t>=</m:t>
-        </m:r>
-        <m:r>
-          <m:t>P</m:t>
-        </m:r>
-        <m:r>
-          <m:t>r</m:t>
-        </m:r>
-        <m:r>
-          <m:rPr>
-            <m:sty m:val="p"/>
-          </m:rPr>
-          <m:t>[</m:t>
-        </m:r>
-        <m:sSub>
-          <m:e>
-            <m:r>
-              <m:t>X</m:t>
-            </m:r>
-          </m:e>
-          <m:sub>
-            <m:r>
-              <m:t>i</m:t>
-            </m:r>
-          </m:sub>
-        </m:sSub>
-        <m:r>
-          <m:rPr>
-            <m:sty m:val="p"/>
-          </m:rPr>
-          <m:t>≤</m:t>
-        </m:r>
-        <m:sSub>
-          <m:e>
-            <m:r>
-              <m:t>x</m:t>
-            </m:r>
-          </m:e>
-          <m:sub>
-            <m:r>
-              <m:t>i</m:t>
-            </m:r>
-          </m:sub>
-        </m:sSub>
-        <m:r>
-          <m:rPr>
-            <m:sty m:val="p"/>
-          </m:rPr>
-          <m:t>]</m:t>
-        </m:r>
-      </m:oMath>
-      <w:r>
-        <w:t xml:space="preserve"> </w:t>
-      </w:r>
-      <w:r>
-        <w:t xml:space="preserve">and a copula</w:t>
-      </w:r>
-      <w:r>
-        <w:t xml:space="preserve"> </w:t>
-      </w:r>
-      <m:oMath>
-        <m:r>
-          <m:t>C</m:t>
-        </m:r>
-      </m:oMath>
-      <w:r>
-        <w:t xml:space="preserve">, as:</w:t>
-      </w:r>
-      <w:r>
-        <w:t xml:space="preserve"> </w:t>
-      </w:r>
-      <w:r>
-        <w:t xml:space="preserve">[</w:t>
-      </w:r>
-    </w:p>
-    <w:p>
-      <w:pPr>
-        <w:pStyle w:val="BodyText"/>
-      </w:pPr>
-      <m:oMathPara>
-        <m:oMathParaPr>
-          <m:jc m:val="center"/>
-        </m:oMathParaPr>
-        <m:oMath>
-          <m:r>
-            <m:t>H</m:t>
-          </m:r>
-          <m:r>
-            <m:rPr>
-              <m:sty m:val="p"/>
-            </m:rPr>
-            <m:t>(</m:t>
-          </m:r>
-          <m:sSub>
-            <m:e>
-              <m:r>
-                <m:t>x</m:t>
-              </m:r>
-            </m:e>
-            <m:sub>
-              <m:r>
-                <m:t>1</m:t>
-              </m:r>
-            </m:sub>
-          </m:sSub>
-          <m:r>
-            <m:rPr>
-              <m:sty m:val="p"/>
-            </m:rPr>
-            <m:t>,</m:t>
-          </m:r>
-          <m:r>
-            <m:rPr>
-              <m:sty m:val="p"/>
-            </m:rPr>
-            <m:t>.</m:t>
-          </m:r>
-          <m:r>
-            <m:rPr>
-              <m:sty m:val="p"/>
-            </m:rPr>
-            <m:t>.</m:t>
-          </m:r>
-          <m:r>
-            <m:rPr>
-              <m:sty m:val="p"/>
-            </m:rPr>
-            <m:t>.</m:t>
-          </m:r>
-          <m:r>
-            <m:rPr>
-              <m:sty m:val="p"/>
-            </m:rPr>
-            <m:t>,</m:t>
-          </m:r>
-          <m:sSub>
-            <m:e>
-              <m:r>
-                <m:t>x</m:t>
-              </m:r>
-            </m:e>
-            <m:sub>
-              <m:r>
-                <m:t>d</m:t>
-              </m:r>
-            </m:sub>
-          </m:sSub>
-          <m:r>
-            <m:rPr>
-              <m:sty m:val="p"/>
-            </m:rPr>
-            <m:t>)</m:t>
-          </m:r>
-          <m:r>
-            <m:rPr>
-              <m:sty m:val="p"/>
-            </m:rPr>
-            <m:t>=</m:t>
-          </m:r>
-          <m:r>
-            <m:t>C</m:t>
-          </m:r>
-          <m:r>
-            <m:rPr>
-              <m:sty m:val="p"/>
-            </m:rPr>
-            <m:t>(</m:t>
-          </m:r>
-          <m:sSub>
-            <m:e>
-              <m:r>
-                <m:t>F</m:t>
-              </m:r>
-            </m:e>
-            <m:sub>
-              <m:r>
-                <m:t>1</m:t>
-              </m:r>
-            </m:sub>
-          </m:sSub>
-          <m:r>
-            <m:rPr>
-              <m:sty m:val="p"/>
-            </m:rPr>
-            <m:t>(</m:t>
-          </m:r>
-          <m:sSub>
-            <m:e>
-              <m:r>
-                <m:t>x</m:t>
-              </m:r>
-            </m:e>
-            <m:sub>
-              <m:r>
-                <m:t>1</m:t>
-              </m:r>
-            </m:sub>
-          </m:sSub>
-          <m:r>
-            <m:rPr>
-              <m:sty m:val="p"/>
-            </m:rPr>
-            <m:t>)</m:t>
-          </m:r>
-          <m:r>
-            <m:rPr>
-              <m:sty m:val="p"/>
-            </m:rPr>
-            <m:t>,</m:t>
-          </m:r>
-          <m:r>
-            <m:rPr>
-              <m:sty m:val="p"/>
-            </m:rPr>
-            <m:t>.</m:t>
-          </m:r>
-          <m:r>
-            <m:rPr>
-              <m:sty m:val="p"/>
-            </m:rPr>
-            <m:t>.</m:t>
-          </m:r>
-          <m:r>
-            <m:rPr>
-              <m:sty m:val="p"/>
-            </m:rPr>
-            <m:t>.</m:t>
-          </m:r>
-          <m:r>
-            <m:rPr>
-              <m:sty m:val="p"/>
-            </m:rPr>
-            <m:t>,</m:t>
-          </m:r>
-          <m:sSub>
-            <m:e>
-              <m:r>
-                <m:t>F</m:t>
-              </m:r>
-            </m:e>
-            <m:sub>
-              <m:r>
-                <m:t>d</m:t>
-              </m:r>
-            </m:sub>
-          </m:sSub>
-          <m:r>
-            <m:rPr>
-              <m:sty m:val="p"/>
-            </m:rPr>
-            <m:t>(</m:t>
-          </m:r>
-          <m:sSub>
-            <m:e>
-              <m:r>
-                <m:t>x</m:t>
-              </m:r>
-            </m:e>
-            <m:sub>
-              <m:r>
-                <m:t>d</m:t>
-              </m:r>
-            </m:sub>
-          </m:sSub>
-          <m:r>
-            <m:rPr>
-              <m:sty m:val="p"/>
-            </m:rPr>
-            <m:t>)</m:t>
-          </m:r>
-          <m:r>
-            <m:rPr>
-              <m:sty m:val="p"/>
-            </m:rPr>
-            <m:t>)</m:t>
-          </m:r>
-        </m:oMath>
-      </m:oMathPara>
-    </w:p>
-    <w:p>
-      <w:pPr>
-        <w:pStyle w:val="FirstParagraph"/>
-      </w:pPr>
-      <w:r>
-        <w:t xml:space="preserve">]</w:t>
-      </w:r>
-    </w:p>
-    <w:p>
-      <w:pPr>
-        <w:pStyle w:val="BodyText"/>
-      </w:pPr>
-      <w:r>
-        <w:t xml:space="preserve">For more details on copula and their applications in finance please see</w:t>
+        <w:t xml:space="preserve">Sklar’s theorem (see also in</w:t>
       </w:r>
       <w:r>
         <w:t xml:space="preserve"> </w:t>
@@ -1407,7 +872,580 @@
         </w:r>
       </w:hyperlink>
       <w:r>
-        <w:t xml:space="preserve">. However it is important to introduce several properties of the copulas which will be significant for the current project:</w:t>
+        <w:t xml:space="preserve">). Every multivariate cumulative distribution function</w:t>
+      </w:r>
+      <w:r>
+        <w:t xml:space="preserve"> </w:t>
+      </w:r>
+      <m:oMath>
+        <m:r>
+          <m:t>H</m:t>
+        </m:r>
+        <m:r>
+          <m:rPr>
+            <m:sty m:val="p"/>
+          </m:rPr>
+          <m:t>(</m:t>
+        </m:r>
+        <m:sSub>
+          <m:e>
+            <m:r>
+              <m:t>x</m:t>
+            </m:r>
+          </m:e>
+          <m:sub>
+            <m:r>
+              <m:t>1</m:t>
+            </m:r>
+          </m:sub>
+        </m:sSub>
+        <m:r>
+          <m:rPr>
+            <m:sty m:val="p"/>
+          </m:rPr>
+          <m:t>,</m:t>
+        </m:r>
+        <m:r>
+          <m:rPr>
+            <m:sty m:val="p"/>
+          </m:rPr>
+          <m:t>…</m:t>
+        </m:r>
+        <m:r>
+          <m:rPr>
+            <m:sty m:val="p"/>
+          </m:rPr>
+          <m:t>,</m:t>
+        </m:r>
+        <m:sSub>
+          <m:e>
+            <m:r>
+              <m:t>x</m:t>
+            </m:r>
+          </m:e>
+          <m:sub>
+            <m:r>
+              <m:t>d</m:t>
+            </m:r>
+          </m:sub>
+        </m:sSub>
+        <m:r>
+          <m:rPr>
+            <m:sty m:val="p"/>
+          </m:rPr>
+          <m:t>)</m:t>
+        </m:r>
+        <m:r>
+          <m:rPr>
+            <m:sty m:val="p"/>
+          </m:rPr>
+          <m:t>=</m:t>
+        </m:r>
+        <m:r>
+          <m:t>P</m:t>
+        </m:r>
+        <m:r>
+          <m:t>r</m:t>
+        </m:r>
+        <m:r>
+          <m:rPr>
+            <m:sty m:val="p"/>
+          </m:rPr>
+          <m:t>[</m:t>
+        </m:r>
+        <m:sSub>
+          <m:e>
+            <m:r>
+              <m:t>X</m:t>
+            </m:r>
+          </m:e>
+          <m:sub>
+            <m:r>
+              <m:t>1</m:t>
+            </m:r>
+          </m:sub>
+        </m:sSub>
+        <m:r>
+          <m:rPr>
+            <m:sty m:val="p"/>
+          </m:rPr>
+          <m:t>≤</m:t>
+        </m:r>
+        <m:sSub>
+          <m:e>
+            <m:r>
+              <m:t>x</m:t>
+            </m:r>
+          </m:e>
+          <m:sub>
+            <m:r>
+              <m:t>1</m:t>
+            </m:r>
+          </m:sub>
+        </m:sSub>
+        <m:r>
+          <m:rPr>
+            <m:sty m:val="p"/>
+          </m:rPr>
+          <m:t>,</m:t>
+        </m:r>
+        <m:r>
+          <m:rPr>
+            <m:sty m:val="p"/>
+          </m:rPr>
+          <m:t>…</m:t>
+        </m:r>
+        <m:r>
+          <m:rPr>
+            <m:sty m:val="p"/>
+          </m:rPr>
+          <m:t>,</m:t>
+        </m:r>
+        <m:sSub>
+          <m:e>
+            <m:r>
+              <m:t>X</m:t>
+            </m:r>
+          </m:e>
+          <m:sub>
+            <m:r>
+              <m:t>d</m:t>
+            </m:r>
+          </m:sub>
+        </m:sSub>
+        <m:r>
+          <m:rPr>
+            <m:sty m:val="p"/>
+          </m:rPr>
+          <m:t>≤</m:t>
+        </m:r>
+        <m:sSub>
+          <m:e>
+            <m:r>
+              <m:t>x</m:t>
+            </m:r>
+          </m:e>
+          <m:sub>
+            <m:r>
+              <m:t>d</m:t>
+            </m:r>
+          </m:sub>
+        </m:sSub>
+        <m:r>
+          <m:rPr>
+            <m:sty m:val="p"/>
+          </m:rPr>
+          <m:t>]</m:t>
+        </m:r>
+      </m:oMath>
+      <w:r>
+        <w:t xml:space="preserve"> </w:t>
+      </w:r>
+      <w:r>
+        <w:t xml:space="preserve">of a random variable</w:t>
+      </w:r>
+      <w:r>
+        <w:t xml:space="preserve"> </w:t>
+      </w:r>
+      <m:oMath>
+        <m:r>
+          <m:rPr>
+            <m:sty m:val="p"/>
+          </m:rPr>
+          <m:t>(</m:t>
+        </m:r>
+        <m:sSub>
+          <m:e>
+            <m:r>
+              <m:t>X</m:t>
+            </m:r>
+          </m:e>
+          <m:sub>
+            <m:r>
+              <m:t>1</m:t>
+            </m:r>
+          </m:sub>
+        </m:sSub>
+        <m:r>
+          <m:rPr>
+            <m:sty m:val="p"/>
+          </m:rPr>
+          <m:t>,</m:t>
+        </m:r>
+        <m:sSub>
+          <m:e>
+            <m:r>
+              <m:t>X</m:t>
+            </m:r>
+          </m:e>
+          <m:sub>
+            <m:r>
+              <m:t>2</m:t>
+            </m:r>
+          </m:sub>
+        </m:sSub>
+        <m:r>
+          <m:rPr>
+            <m:sty m:val="p"/>
+          </m:rPr>
+          <m:t>,</m:t>
+        </m:r>
+        <m:r>
+          <m:rPr>
+            <m:sty m:val="p"/>
+          </m:rPr>
+          <m:t>…</m:t>
+        </m:r>
+        <m:r>
+          <m:rPr>
+            <m:sty m:val="p"/>
+          </m:rPr>
+          <m:t>,</m:t>
+        </m:r>
+        <m:sSub>
+          <m:e>
+            <m:r>
+              <m:t>X</m:t>
+            </m:r>
+          </m:e>
+          <m:sub>
+            <m:r>
+              <m:t>d</m:t>
+            </m:r>
+          </m:sub>
+        </m:sSub>
+        <m:r>
+          <m:rPr>
+            <m:sty m:val="p"/>
+          </m:rPr>
+          <m:t>)</m:t>
+        </m:r>
+      </m:oMath>
+      <w:r>
+        <w:t xml:space="preserve"> </w:t>
+      </w:r>
+      <w:r>
+        <w:t xml:space="preserve">can be expressed in terms of its marginals</w:t>
+      </w:r>
+      <w:r>
+        <w:t xml:space="preserve"> </w:t>
+      </w:r>
+      <m:oMath>
+        <m:sSub>
+          <m:e>
+            <m:r>
+              <m:t>F</m:t>
+            </m:r>
+          </m:e>
+          <m:sub>
+            <m:r>
+              <m:t>i</m:t>
+            </m:r>
+          </m:sub>
+        </m:sSub>
+        <m:r>
+          <m:rPr>
+            <m:sty m:val="p"/>
+          </m:rPr>
+          <m:t>(</m:t>
+        </m:r>
+        <m:sSub>
+          <m:e>
+            <m:r>
+              <m:t>x</m:t>
+            </m:r>
+          </m:e>
+          <m:sub>
+            <m:r>
+              <m:t>i</m:t>
+            </m:r>
+          </m:sub>
+        </m:sSub>
+        <m:r>
+          <m:rPr>
+            <m:sty m:val="p"/>
+          </m:rPr>
+          <m:t>)</m:t>
+        </m:r>
+        <m:r>
+          <m:rPr>
+            <m:sty m:val="p"/>
+          </m:rPr>
+          <m:t>=</m:t>
+        </m:r>
+        <m:r>
+          <m:t>P</m:t>
+        </m:r>
+        <m:r>
+          <m:t>r</m:t>
+        </m:r>
+        <m:r>
+          <m:rPr>
+            <m:sty m:val="p"/>
+          </m:rPr>
+          <m:t>[</m:t>
+        </m:r>
+        <m:sSub>
+          <m:e>
+            <m:r>
+              <m:t>X</m:t>
+            </m:r>
+          </m:e>
+          <m:sub>
+            <m:r>
+              <m:t>i</m:t>
+            </m:r>
+          </m:sub>
+        </m:sSub>
+        <m:r>
+          <m:rPr>
+            <m:sty m:val="p"/>
+          </m:rPr>
+          <m:t>≤</m:t>
+        </m:r>
+        <m:sSub>
+          <m:e>
+            <m:r>
+              <m:t>x</m:t>
+            </m:r>
+          </m:e>
+          <m:sub>
+            <m:r>
+              <m:t>i</m:t>
+            </m:r>
+          </m:sub>
+        </m:sSub>
+        <m:r>
+          <m:rPr>
+            <m:sty m:val="p"/>
+          </m:rPr>
+          <m:t>]</m:t>
+        </m:r>
+      </m:oMath>
+      <w:r>
+        <w:t xml:space="preserve"> </w:t>
+      </w:r>
+      <w:r>
+        <w:t xml:space="preserve">and a copula</w:t>
+      </w:r>
+      <w:r>
+        <w:t xml:space="preserve"> </w:t>
+      </w:r>
+      <m:oMath>
+        <m:r>
+          <m:t>C</m:t>
+        </m:r>
+      </m:oMath>
+      <w:r>
+        <w:t xml:space="preserve">, as:</w:t>
+      </w:r>
+    </w:p>
+    <w:p>
+      <w:pPr>
+        <w:pStyle w:val="BodyText"/>
+      </w:pPr>
+      <m:oMathPara>
+        <m:oMathParaPr>
+          <m:jc m:val="center"/>
+        </m:oMathParaPr>
+        <m:oMath>
+          <m:r>
+            <m:t>H</m:t>
+          </m:r>
+          <m:r>
+            <m:rPr>
+              <m:sty m:val="p"/>
+            </m:rPr>
+            <m:t>(</m:t>
+          </m:r>
+          <m:sSub>
+            <m:e>
+              <m:r>
+                <m:t>x</m:t>
+              </m:r>
+            </m:e>
+            <m:sub>
+              <m:r>
+                <m:t>1</m:t>
+              </m:r>
+            </m:sub>
+          </m:sSub>
+          <m:r>
+            <m:rPr>
+              <m:sty m:val="p"/>
+            </m:rPr>
+            <m:t>,</m:t>
+          </m:r>
+          <m:r>
+            <m:rPr>
+              <m:sty m:val="p"/>
+            </m:rPr>
+            <m:t>…</m:t>
+          </m:r>
+          <m:r>
+            <m:rPr>
+              <m:sty m:val="p"/>
+            </m:rPr>
+            <m:t>,</m:t>
+          </m:r>
+          <m:sSub>
+            <m:e>
+              <m:r>
+                <m:t>x</m:t>
+              </m:r>
+            </m:e>
+            <m:sub>
+              <m:r>
+                <m:t>d</m:t>
+              </m:r>
+            </m:sub>
+          </m:sSub>
+          <m:r>
+            <m:rPr>
+              <m:sty m:val="p"/>
+            </m:rPr>
+            <m:t>)</m:t>
+          </m:r>
+          <m:r>
+            <m:rPr>
+              <m:sty m:val="p"/>
+            </m:rPr>
+            <m:t>=</m:t>
+          </m:r>
+          <m:r>
+            <m:t>C</m:t>
+          </m:r>
+          <m:r>
+            <m:rPr>
+              <m:sty m:val="p"/>
+            </m:rPr>
+            <m:t>(</m:t>
+          </m:r>
+          <m:sSub>
+            <m:e>
+              <m:r>
+                <m:t>F</m:t>
+              </m:r>
+            </m:e>
+            <m:sub>
+              <m:r>
+                <m:t>1</m:t>
+              </m:r>
+            </m:sub>
+          </m:sSub>
+          <m:r>
+            <m:rPr>
+              <m:sty m:val="p"/>
+            </m:rPr>
+            <m:t>(</m:t>
+          </m:r>
+          <m:sSub>
+            <m:e>
+              <m:r>
+                <m:t>x</m:t>
+              </m:r>
+            </m:e>
+            <m:sub>
+              <m:r>
+                <m:t>1</m:t>
+              </m:r>
+            </m:sub>
+          </m:sSub>
+          <m:r>
+            <m:rPr>
+              <m:sty m:val="p"/>
+            </m:rPr>
+            <m:t>)</m:t>
+          </m:r>
+          <m:r>
+            <m:rPr>
+              <m:sty m:val="p"/>
+            </m:rPr>
+            <m:t>,</m:t>
+          </m:r>
+          <m:r>
+            <m:rPr>
+              <m:sty m:val="p"/>
+            </m:rPr>
+            <m:t>…</m:t>
+          </m:r>
+          <m:r>
+            <m:rPr>
+              <m:sty m:val="p"/>
+            </m:rPr>
+            <m:t>,</m:t>
+          </m:r>
+          <m:sSub>
+            <m:e>
+              <m:r>
+                <m:t>F</m:t>
+              </m:r>
+            </m:e>
+            <m:sub>
+              <m:r>
+                <m:t>d</m:t>
+              </m:r>
+            </m:sub>
+          </m:sSub>
+          <m:r>
+            <m:rPr>
+              <m:sty m:val="p"/>
+            </m:rPr>
+            <m:t>(</m:t>
+          </m:r>
+          <m:sSub>
+            <m:e>
+              <m:r>
+                <m:t>x</m:t>
+              </m:r>
+            </m:e>
+            <m:sub>
+              <m:r>
+                <m:t>d</m:t>
+              </m:r>
+            </m:sub>
+          </m:sSub>
+          <m:r>
+            <m:rPr>
+              <m:sty m:val="p"/>
+            </m:rPr>
+            <m:t>)</m:t>
+          </m:r>
+          <m:r>
+            <m:rPr>
+              <m:sty m:val="p"/>
+            </m:rPr>
+            <m:t>)</m:t>
+          </m:r>
+          <m:r>
+            <m:rPr>
+              <m:sty m:val="p"/>
+            </m:rPr>
+            <m:t>,</m:t>
+          </m:r>
+        </m:oMath>
+      </m:oMathPara>
+    </w:p>
+    <w:p>
+      <w:pPr>
+        <w:pStyle w:val="FirstParagraph"/>
+      </w:pPr>
+      <w:r>
+        <w:t xml:space="preserve">For more details on copula and their applications in finance please see</w:t>
+      </w:r>
+      <w:r>
+        <w:t xml:space="preserve"> </w:t>
+      </w:r>
+      <w:hyperlink w:anchor="references">
+        <w:r>
+          <w:rPr>
+            <w:rStyle w:val="Hyperlink"/>
+          </w:rPr>
+          <w:t xml:space="preserve">[2]</w:t>
+        </w:r>
+      </w:hyperlink>
+      <w:r>
+        <w:t xml:space="preserve">. However it is important to introduce several properties of copulas which will be significant for the current project:</w:t>
       </w:r>
     </w:p>
     <w:p>
@@ -1418,7 +1456,7 @@
         </w:numPr>
       </w:pPr>
       <w:r>
-        <w:t xml:space="preserve">A convex combination of copulas is also a copula. It is often called a mixture copula and can be expressed as a weighted sum of copulas</w:t>
+        <w:t xml:space="preserve">A convex combination (i.e. all weights are non-negative and sum to exactly one) of copulas is also a copula. It is often called a mixture copula and can be expressed as a weighted sum of copulas</w:t>
       </w:r>
       <w:r>
         <w:t xml:space="preserve"> </w:t>
@@ -1635,10 +1673,13 @@
         <m:r>
           <m:t>1</m:t>
         </m:r>
+        <m:r>
+          <m:rPr>
+            <m:sty m:val="p"/>
+          </m:rPr>
+          <m:t>.</m:t>
+        </m:r>
       </m:oMath>
-      <w:r>
-        <w:t xml:space="preserve">.</w:t>
-      </w:r>
     </w:p>
     <w:p>
       <w:pPr>
@@ -1648,7 +1689,18 @@
         </w:numPr>
       </w:pPr>
       <w:r>
-        <w:t xml:space="preserve">Exists a set of functions (W-transforms) applied to copula and also returning copula but with modified properties. For additional details on these transformations and their properties please see</w:t>
+        <w:t xml:space="preserve">There exists a class of functions (W-transforms) applied to copula and also returning copula but with modified properties.</w:t>
+      </w:r>
+    </w:p>
+    <w:p>
+      <w:pPr>
+        <w:numPr>
+          <w:ilvl w:val="0"/>
+          <w:numId w:val="1002"/>
+        </w:numPr>
+      </w:pPr>
+      <w:r>
+        <w:t xml:space="preserve">For additional details on these transformations and their properties please see</w:t>
       </w:r>
       <w:r>
         <w:t xml:space="preserve"> </w:t>
@@ -1665,6 +1717,31 @@
         <w:t xml:space="preserve">.</w:t>
       </w:r>
     </w:p>
+    <w:p>
+      <w:pPr>
+        <w:pStyle w:val="FirstParagraph"/>
+      </w:pPr>
+      <w:r>
+        <w:t xml:space="preserve">One of the most widely used copula is the one constructed from a multivariate normal distribution by using the probability integral transform, Gaussian copula, see</w:t>
+      </w:r>
+      <w:r>
+        <w:t xml:space="preserve"> </w:t>
+      </w:r>
+      <w:hyperlink w:anchor="references">
+        <w:r>
+          <w:rPr>
+            <w:rStyle w:val="Hyperlink"/>
+          </w:rPr>
+          <w:t xml:space="preserve">[2]</w:t>
+        </w:r>
+      </w:hyperlink>
+      <w:r>
+        <w:t xml:space="preserve"> </w:t>
+      </w:r>
+      <w:r>
+        <w:t xml:space="preserve">for additional details.</w:t>
+      </w:r>
+    </w:p>
     <w:bookmarkEnd w:id="20"/>
     <w:bookmarkStart w:id="24" w:name="copulas-in-value-at-risk"/>
     <w:p>
@@ -1680,7 +1757,25 @@
         <w:pStyle w:val="FirstParagraph"/>
       </w:pPr>
       <w:r>
-        <w:t xml:space="preserve">The selection of a copula has a significant influence on the assessment of tail‑risk measures such as Value‑at‑Risk (VaR) / Expected Shortfall (ES). This influence becomes increasingly pronounced as we move to more extreme quantiles (e.g. 99 % and 99.9 % VaR). The principal limitation of the Gaussian copula lies in its asymptotic independence: as one approach the far ends of the distribution, the probability that two (or more) variables exceed a high threshold simultaneously tends to zero at the same rate as if the variables were independent. Consequently, the Gaussian copula systematically under‑estimates the likelihood of joint extreme events and, therefore, under‑states tail‑risk metrics.</w:t>
+        <w:t xml:space="preserve">The selection of a copula has a significant influence on the assessment of tail‑risk measures such as Value‑at‑Risk (VaR) / Expected Shortfall (ES).</w:t>
+      </w:r>
+      <w:r>
+        <w:t xml:space="preserve"> </w:t>
+      </w:r>
+      <w:r>
+        <w:t xml:space="preserve">This influence becomes increasingly pronounced as we move to more extreme quantiles (e.g. 99 % and 99.9 % VaR).</w:t>
+      </w:r>
+      <w:r>
+        <w:t xml:space="preserve"> </w:t>
+      </w:r>
+      <w:r>
+        <w:t xml:space="preserve">The principal limitation of the Gaussian copula lies in its asymptotic independence: as one approach the far ends of the distribution, the probability that two (or more) variables exceed a high threshold simultaneously tends to zero at the same rate as if the variables were independent.</w:t>
+      </w:r>
+      <w:r>
+        <w:t xml:space="preserve"> </w:t>
+      </w:r>
+      <w:r>
+        <w:t xml:space="preserve">Consequently, the Gaussian Copula systematically under‑estimates the likelihood of joint extreme events and, therefore, under‑states tail‑risk metrics.</w:t>
       </w:r>
     </w:p>
     <w:p>
@@ -1939,6 +2034,12 @@
             </m:rPr>
             <m:t>)</m:t>
           </m:r>
+          <m:r>
+            <m:rPr>
+              <m:sty m:val="p"/>
+            </m:rPr>
+            <m:t>,</m:t>
+          </m:r>
         </m:oMath>
       </m:oMathPara>
     </w:p>
@@ -2155,6 +2256,12 @@
           <m:r>
             <m:t>q</m:t>
           </m:r>
+          <m:r>
+            <m:rPr>
+              <m:sty m:val="p"/>
+            </m:rPr>
+            <m:t>,</m:t>
+          </m:r>
         </m:oMath>
       </m:oMathPara>
     </w:p>
@@ -2163,7 +2270,177 @@
         <w:pStyle w:val="FirstParagraph"/>
       </w:pPr>
       <w:r>
-        <w:t xml:space="preserve">By computing these tail‑dependence coefficients, one can directly compare how different copulas treat extreme co‑movements. The contrast is stark: while a Gaussian copula predicts virtually no joint tail events, for example Cauchy (Student-T with zero degrees of freedom) assigns a non‑negligible probability to simultaneous extreme losses. See</w:t>
+        <w:t xml:space="preserve">where</w:t>
+      </w:r>
+      <w:r>
+        <w:t xml:space="preserve"> </w:t>
+      </w:r>
+      <m:oMath>
+        <m:sSub>
+          <m:e>
+            <m:r>
+              <m:t>G</m:t>
+            </m:r>
+          </m:e>
+          <m:sub>
+            <m:r>
+              <m:t>i</m:t>
+            </m:r>
+          </m:sub>
+        </m:sSub>
+        <m:r>
+          <m:rPr>
+            <m:sty m:val="p"/>
+          </m:rPr>
+          <m:t>,</m:t>
+        </m:r>
+        <m:sSub>
+          <m:e>
+            <m:r>
+              <m:t>G</m:t>
+            </m:r>
+          </m:e>
+          <m:sub>
+            <m:r>
+              <m:t>j</m:t>
+            </m:r>
+          </m:sub>
+        </m:sSub>
+      </m:oMath>
+      <w:r>
+        <w:t xml:space="preserve"> </w:t>
+      </w:r>
+      <w:r>
+        <w:t xml:space="preserve">are marginal CDFs, while</w:t>
+      </w:r>
+      <w:r>
+        <w:t xml:space="preserve"> </w:t>
+      </w:r>
+      <m:oMath>
+        <m:sSubSup>
+          <m:e>
+            <m:r>
+              <m:t>G</m:t>
+            </m:r>
+          </m:e>
+          <m:sub>
+            <m:r>
+              <m:t>i</m:t>
+            </m:r>
+          </m:sub>
+          <m:sup>
+            <m:r>
+              <m:rPr>
+                <m:sty m:val="p"/>
+              </m:rPr>
+              <m:t>−</m:t>
+            </m:r>
+            <m:r>
+              <m:t>1</m:t>
+            </m:r>
+          </m:sup>
+        </m:sSubSup>
+        <m:r>
+          <m:rPr>
+            <m:sty m:val="p"/>
+          </m:rPr>
+          <m:t>,</m:t>
+        </m:r>
+        <m:sSubSup>
+          <m:e>
+            <m:r>
+              <m:t>G</m:t>
+            </m:r>
+          </m:e>
+          <m:sub>
+            <m:r>
+              <m:t>j</m:t>
+            </m:r>
+          </m:sub>
+          <m:sup>
+            <m:r>
+              <m:rPr>
+                <m:sty m:val="p"/>
+              </m:rPr>
+              <m:t>−</m:t>
+            </m:r>
+            <m:r>
+              <m:t>1</m:t>
+            </m:r>
+          </m:sup>
+        </m:sSubSup>
+      </m:oMath>
+      <w:r>
+        <w:t xml:space="preserve"> </w:t>
+      </w:r>
+      <w:r>
+        <w:t xml:space="preserve">are inverse CDFs respectively.</w:t>
+      </w:r>
+    </w:p>
+    <w:p>
+      <w:pPr>
+        <w:pStyle w:val="BodyText"/>
+      </w:pPr>
+      <w:r>
+        <w:t xml:space="preserve">High levels of tail dependence essentially means that the extremes of</w:t>
+      </w:r>
+      <w:r>
+        <w:t xml:space="preserve"> </w:t>
+      </w:r>
+      <m:oMath>
+        <m:sSub>
+          <m:e>
+            <m:r>
+              <m:t>X</m:t>
+            </m:r>
+          </m:e>
+          <m:sub>
+            <m:r>
+              <m:t>i</m:t>
+            </m:r>
+          </m:sub>
+        </m:sSub>
+      </m:oMath>
+      <w:r>
+        <w:t xml:space="preserve"> </w:t>
+      </w:r>
+      <w:r>
+        <w:t xml:space="preserve">and</w:t>
+      </w:r>
+      <w:r>
+        <w:t xml:space="preserve"> </w:t>
+      </w:r>
+      <m:oMath>
+        <m:sSub>
+          <m:e>
+            <m:r>
+              <m:t>X</m:t>
+            </m:r>
+          </m:e>
+          <m:sub>
+            <m:r>
+              <m:t>j</m:t>
+            </m:r>
+          </m:sub>
+        </m:sSub>
+      </m:oMath>
+      <w:r>
+        <w:t xml:space="preserve"> </w:t>
+      </w:r>
+      <w:r>
+        <w:t xml:space="preserve">occur more in unison. By computing these tail‑dependence coefficients, one can directly compare how different copulas treat extreme co‑movements.</w:t>
+      </w:r>
+      <w:r>
+        <w:t xml:space="preserve"> </w:t>
+      </w:r>
+      <w:r>
+        <w:t xml:space="preserve">The contrast is stark: while a Gaussian copula predicts virtually no joint tail events, for example Cauchy (Student-T with zero degrees of freedom) assigns a non‑negligible probability to simultaneous extreme losses.</w:t>
+      </w:r>
+      <w:r>
+        <w:t xml:space="preserve"> </w:t>
+      </w:r>
+      <w:r>
+        <w:t xml:space="preserve">See</w:t>
       </w:r>
       <w:r>
         <w:t xml:space="preserve"> </w:t>
@@ -2180,7 +2457,25 @@
         <w:t xml:space="preserve"> </w:t>
       </w:r>
       <w:r>
-        <w:t xml:space="preserve">for the visual comparison between two copulas both reflecting equivalent correlation values. This disparity translates into markedly different VaR and ES estimates, especially at the highest percentiles. Consequently, when modelling portfolio risk that is sensitive to rare but severe events, choosing a copula with appropriate tail dependence is essential. Otherwise, VaR and ES risk measures may be substantially understated.</w:t>
+        <w:t xml:space="preserve">for the visual comparison between two copulas both reflecting equivalent correlation values.</w:t>
+      </w:r>
+      <w:r>
+        <w:t xml:space="preserve"> </w:t>
+      </w:r>
+      <w:r>
+        <w:t xml:space="preserve">This disparity translates into markedly different VaR and ES estimates, especially at the highest percentiles.</w:t>
+      </w:r>
+      <w:r>
+        <w:t xml:space="preserve"> </w:t>
+      </w:r>
+      <w:r>
+        <w:t xml:space="preserve">Consequently, when modelling portfolio risk that is sensitive to rare but severe events, choosing a copula with appropriate tail dependence is essential.</w:t>
+      </w:r>
+      <w:r>
+        <w:t xml:space="preserve"> </w:t>
+      </w:r>
+      <w:r>
+        <w:t xml:space="preserve">Otherwise, VaR and ES risk measures may be substantially understated.</w:t>
       </w:r>
     </w:p>
     <w:p>
@@ -2188,7 +2483,19 @@
         <w:pStyle w:val="BodyText"/>
       </w:pPr>
       <w:r>
-        <w:t xml:space="preserve">Figures below compare historically observed tail dependence (the orange line) with the one of Gaussian and Cauchy copulas i.e. Student-T with zero degrees of freedom (the blue and green lines respectively). The vertical axis measures tail dependence, while the horizontal axis displays the chosen percentile. As the graphs reveal, the discrepancy between the observed and Gaussian tail dependence expands significantly when more risk factors considered together.</w:t>
+        <w:t xml:space="preserve">Figure 1 below compares historically observed tail dependence (the orange line) with the one of Gaussian and Cauchy copulas i.e. Student-T with zero degrees of freedom (the blue and green lines respectively).</w:t>
+      </w:r>
+      <w:r>
+        <w:t xml:space="preserve"> </w:t>
+      </w:r>
+      <w:r>
+        <w:t xml:space="preserve">The vertical axis measures tail dependence, while the horizontal axis displays the chosen percentile.</w:t>
+      </w:r>
+      <w:r>
+        <w:t xml:space="preserve"> </w:t>
+      </w:r>
+      <w:r>
+        <w:t xml:space="preserve">As the graphs reveal, the discrepancy between the observed and Gaussian tail dependence expands significantly when more risk factors considered together. It is based on 20Y of market price historical observations data (2002-2022) for 2 names Microsoft and Morgan Stanley and 5 names with additionally Google, Amazon and JP Morgan.</w:t>
       </w:r>
     </w:p>
     <w:p>
@@ -2246,12 +2553,48 @@
         <w:t xml:space="preserve">Figure 1: Tail dependence for different types of copulas and different number of random variables</w:t>
       </w:r>
     </w:p>
+    <w:bookmarkEnd w:id="24"/>
+    <w:bookmarkStart w:id="25" w:name="economics-of-cauchy-copula"/>
+    <w:p>
+      <w:pPr>
+        <w:pStyle w:val="Heading3"/>
+      </w:pPr>
+      <w:r>
+        <w:t xml:space="preserve">Economics of Cauchy copula</w:t>
+      </w:r>
+    </w:p>
+    <w:p>
+      <w:pPr>
+        <w:pStyle w:val="FirstParagraph"/>
+      </w:pPr>
+      <w:r>
+        <w:t xml:space="preserve">The Cauchy copula is a statistical technique for capturing dependence structures, especially when modelling tail‑risk or extreme events.</w:t>
+      </w:r>
+      <w:r>
+        <w:t xml:space="preserve"> </w:t>
+      </w:r>
+      <w:r>
+        <w:t xml:space="preserve">Its principal advantage lies in preserving the overall correlation matrix of the underlying variables while simultaneously enabling the generation of scenarios that exhibit much heavier tails (joint‑movement) and de-correlation.</w:t>
+      </w:r>
+      <w:r>
+        <w:t xml:space="preserve"> </w:t>
+      </w:r>
+      <w:r>
+        <w:t xml:space="preserve">In practice, this means that the copula retains the familiar linear dependence captured by Pearson‑type correlations, yet it can produce joint realizations that reflect the heightened co‑movement observed during rare, high‑impact shocks.</w:t>
+      </w:r>
+    </w:p>
     <w:p>
       <w:pPr>
         <w:pStyle w:val="BodyText"/>
       </w:pPr>
       <w:r>
-        <w:t xml:space="preserve">The Cauchy copula is a statistical technique for capturing dependence structures, especially when modelling tail‑risk or extreme events. Its principal advantage lies in preserving the overall correlation matrix of the underlying variables while simultaneously enabling the generation of scenarios that exhibit much heavier tails (joint‑movement) and de-correlation. In practice, this means that the copula retains the familiar linear dependence captured by Pearson‑type correlations, yet it can produce joint realizations that reflect the heightened co‑movement observed during rare, high‑impact shocks.</w:t>
+        <w:t xml:space="preserve">De‑correlation scenarios describe circumstances in which variables that normally exhibit a strong positive (or negative) relationship suddenly lose that linkage when stress or extreme events materializes.</w:t>
+      </w:r>
+      <w:r>
+        <w:t xml:space="preserve"> </w:t>
+      </w:r>
+      <w:r>
+        <w:t xml:space="preserve">In other words, the usual together‑ness of the data breaks down. A classic illustration comes from equity markets: two stocks that historically track each other, e.g., because they belong to the same industry, may abruptly move in opposite directions during a stress event. For example, Google vs. Microsoft - Google taking over Microsoft business after Microsoft collapses.</w:t>
       </w:r>
     </w:p>
     <w:p>
@@ -2259,7 +2602,19 @@
         <w:pStyle w:val="BodyText"/>
       </w:pPr>
       <w:r>
-        <w:t xml:space="preserve">De‑correlation scenarios describe circumstances in which variables that normally exhibit a strong positive (or negative) relationship suddenly lose that linkage when stress or extreme events materializes. In other words, the usual together‑ness of the data breaks down. A classic illustration comes from equity markets: two stocks that historically track each other e.g. because they belong to the same industry, may abruptly move in opposite directions during a stress event. For example, Apple vs. Microsoft - Apple taking over Microsoft business after Microsoft collapses.</w:t>
+        <w:t xml:space="preserve">On the other hand, joint‑movement scenarios involve a set of variables that, despite exhibiting only modest or even negligible correlation under normal conditions, all swing in the same direction because they are all exposed to a common extreme driver.</w:t>
+      </w:r>
+      <w:r>
+        <w:t xml:space="preserve"> </w:t>
+      </w:r>
+      <w:r>
+        <w:t xml:space="preserve">Examples are severe natural disasters that simultaneously spike commodity prices, or a sovereign default that forces both sovereign bond yields and the domestic currency to deteriorate together.</w:t>
+      </w:r>
+      <w:r>
+        <w:t xml:space="preserve"> </w:t>
+      </w:r>
+      <w:r>
+        <w:t xml:space="preserve">In these cases, the common shock creates a temporary, high‑intensity dependence that standard correlation estimates fail to capture.</w:t>
       </w:r>
     </w:p>
     <w:p>
@@ -2267,20 +2622,24 @@
         <w:pStyle w:val="BodyText"/>
       </w:pPr>
       <w:r>
-        <w:t xml:space="preserve">On the other hand, joint‑movement scenarios involve a set of variables that, despite exhibiting only modest or even negligible correlation under normal conditions, all swing in the same direction because they are all exposed to a shared extreme driver. Think of a severe natural disaster that simultaneously spikes commodity prices or a sovereign default that forces both sovereign bond yields and the domestic currency to deteriorate together. In these cases the common shock creates a temporary, high‑intensity dependence that standard correlation estimates fail to capture.</w:t>
-      </w:r>
-    </w:p>
-    <w:p>
-      <w:pPr>
-        <w:pStyle w:val="BodyText"/>
-      </w:pPr>
-      <w:r>
-        <w:t xml:space="preserve">Both types of scenarios are crucial for robust risk assessment. De‑correlation highlights the risk of assets that are supposed to hedge each other stop doing so, while joint‑movement emphasizes the danger of hidden tail‑dependence that can generate simultaneous losses across seemingly unrelated positions. Modelling frameworks that can generate both behaviours, provide a more realistic picture of potential extreme outcomes than approaches that rely solely on historic linear correlations.</w:t>
-      </w:r>
-    </w:p>
-    <w:bookmarkEnd w:id="24"/>
+        <w:t xml:space="preserve">Both types of scenarios are crucial for robust risk assessment.</w:t>
+      </w:r>
+      <w:r>
+        <w:t xml:space="preserve"> </w:t>
+      </w:r>
+      <w:r>
+        <w:t xml:space="preserve">De‑correlation highlights the risk of assets that are supposed to hedge each other stop doing so, while joint‑movement emphasizes the danger of hidden tail‑dependence that can generate simultaneous losses across seemingly unrelated positions.</w:t>
+      </w:r>
+      <w:r>
+        <w:t xml:space="preserve"> </w:t>
+      </w:r>
+      <w:r>
+        <w:t xml:space="preserve">Modelling frameworks that can generate both behaviours would provide a more realistic picture of potential extreme outcomes than approaches that rely solely on historic linear correlations.</w:t>
+      </w:r>
+    </w:p>
     <w:bookmarkEnd w:id="25"/>
-    <w:bookmarkStart w:id="26" w:name="literature-review"/>
+    <w:bookmarkEnd w:id="26"/>
+    <w:bookmarkStart w:id="27" w:name="literature-review"/>
     <w:p>
       <w:pPr>
         <w:pStyle w:val="Heading2"/>
@@ -2294,7 +2653,7 @@
         <w:pStyle w:val="FirstParagraph"/>
       </w:pPr>
       <w:r>
-        <w:t xml:space="preserve">The rapid advancement of generative machine learning techniques has generated significant interest within the financial industry, as evidenced by numerous studies (e.g., see</w:t>
+        <w:t xml:space="preserve">The rapid advancement of generative Machine Learning techniques has generated significant interest within the financial industry, as evidenced by numerous studies (e.g., see</w:t>
       </w:r>
       <w:r>
         <w:t xml:space="preserve"> </w:t>
@@ -2351,24 +2710,7 @@
         </w:r>
       </w:hyperlink>
       <w:r>
-        <w:t xml:space="preserve">, which explicitly target the generation of tail events using Generative Adversarial Network (GAN) (see</w:t>
-      </w:r>
-      <w:r>
-        <w:t xml:space="preserve"> </w:t>
-      </w:r>
-      <w:hyperlink w:anchor="references">
-        <w:r>
-          <w:rPr>
-            <w:rStyle w:val="Hyperlink"/>
-          </w:rPr>
-          <w:t xml:space="preserve">[5]</w:t>
-        </w:r>
-      </w:hyperlink>
-      <w:r>
-        <w:t xml:space="preserve"> </w:t>
-      </w:r>
-      <w:r>
-        <w:t xml:space="preserve">for examples and implementation) architectures, though even these approaches remain constrained to relatively low-dimensional environments (e.g., up to 20–50 factors).</w:t>
+        <w:t xml:space="preserve">, which explicitly target the generation of tail events using Generative Adversarial Network (GAN) (see Cont R. et al for examples and implementation) architectures, though even these approaches remain constrained to relatively low-dimensional environments, i.e., up to 20–50 factors.</w:t>
       </w:r>
     </w:p>
     <w:p>
@@ -2379,9 +2721,9 @@
         <w:t xml:space="preserve">Inspired by these works, this research seeks to extend the dimensionality of scenario generation while relaxing the requirement for path dependence. This adjustment allows us to leverage more classical tools for modelling joint dependencies, such as copulas. However, even within this framework, only Gaussian copulas (and selected Student-T) have demonstrated the capacity to scale effectively to very high dimensions. This project aims to bridge the gap between the data-driven GAN-like approaches and the scalability of copulas by developing a high-dimensional copula model capable of capturing historical tail dependence properties. The ultimate goal is to generate realistic extreme scenarios that reflect the complex dependencies observed in financial markets.</w:t>
       </w:r>
     </w:p>
-    <w:bookmarkEnd w:id="26"/>
     <w:bookmarkEnd w:id="27"/>
-    <w:bookmarkStart w:id="34" w:name="methodology-and-methods"/>
+    <w:bookmarkEnd w:id="28"/>
+    <w:bookmarkStart w:id="35" w:name="methodology-and-methods"/>
     <w:p>
       <w:pPr>
         <w:pStyle w:val="Heading1"/>
@@ -2415,18 +2757,18 @@
           <wp:inline>
             <wp:extent cx="5943600" cy="2116281"/>
             <wp:effectExtent b="0" l="0" r="0" t="0"/>
-            <wp:docPr descr="Figure 2: Copula calibration workflow" title="" id="29" name="Picture"/>
+            <wp:docPr descr="Figure 2: Copula calibration workflow" title="" id="30" name="Picture"/>
             <a:graphic>
               <a:graphicData uri="http://schemas.openxmlformats.org/drawingml/2006/picture">
                 <pic:pic>
                   <pic:nvPicPr>
-                    <pic:cNvPr descr="figures\Project-workflow-high.png" id="30" name="Picture"/>
+                    <pic:cNvPr descr="figures\Project-workflow-high.png" id="31" name="Picture"/>
                     <pic:cNvPicPr>
                       <a:picLocks noChangeArrowheads="1" noChangeAspect="1"/>
                     </pic:cNvPicPr>
                   </pic:nvPicPr>
                   <pic:blipFill>
-                    <a:blip r:embed="rId28"/>
+                    <a:blip r:embed="rId29"/>
                     <a:stretch>
                       <a:fillRect/>
                     </a:stretch>
@@ -2478,18 +2820,18 @@
           <wp:inline>
             <wp:extent cx="5943600" cy="3182614"/>
             <wp:effectExtent b="0" l="0" r="0" t="0"/>
-            <wp:docPr descr="Figure 3: Detailed process of data transformations for copula calibration" title="" id="32" name="Picture"/>
+            <wp:docPr descr="Figure 3: Detailed process of data transformations for copula calibration" title="" id="33" name="Picture"/>
             <a:graphic>
               <a:graphicData uri="http://schemas.openxmlformats.org/drawingml/2006/picture">
                 <pic:pic>
                   <pic:nvPicPr>
-                    <pic:cNvPr descr="figures\Project-workflow-detailed.png" id="33" name="Picture"/>
+                    <pic:cNvPr descr="figures\Project-workflow-detailed.png" id="34" name="Picture"/>
                     <pic:cNvPicPr>
                       <a:picLocks noChangeArrowheads="1" noChangeAspect="1"/>
                     </pic:cNvPicPr>
                   </pic:nvPicPr>
                   <pic:blipFill>
-                    <a:blip r:embed="rId31"/>
+                    <a:blip r:embed="rId32"/>
                     <a:stretch>
                       <a:fillRect/>
                     </a:stretch>
@@ -2557,8 +2899,8 @@
         <w:t xml:space="preserve">Please also note that aim of this software (Python) is a proof of concept rather than an end-user application, while it still follows the main principals of software design with the development plan outlined below.</w:t>
       </w:r>
     </w:p>
-    <w:bookmarkEnd w:id="34"/>
-    <w:bookmarkStart w:id="35" w:name="Xb80ddedb553230bdae8cbf809d981d8b8ec3898"/>
+    <w:bookmarkEnd w:id="35"/>
+    <w:bookmarkStart w:id="36" w:name="Xb80ddedb553230bdae8cbf809d981d8b8ec3898"/>
     <w:p>
       <w:pPr>
         <w:pStyle w:val="Heading1"/>
@@ -2718,8 +3060,8 @@
         <w:t xml:space="preserve">There is a distinct possibility that certain project phases may overrun, particularly code development, testing, and the selection of the copula calibration algorithm. To mitigate this, it is aimed to complete the core work by August 2026, providing a buffer to accommodate potential delays.</w:t>
       </w:r>
     </w:p>
-    <w:bookmarkEnd w:id="35"/>
-    <w:bookmarkStart w:id="41" w:name="references"/>
+    <w:bookmarkEnd w:id="36"/>
+    <w:bookmarkStart w:id="42" w:name="references"/>
     <w:p>
       <w:pPr>
         <w:pStyle w:val="Heading1"/>
@@ -2781,28 +3123,6 @@
       </w:pPr>
       <w:r>
         <w:t xml:space="preserve">Cont R. et al, 2022. Tail-GAN: Nonparametric scenario generation for tail risk estimation.</w:t>
-      </w:r>
-      <w:r>
-        <w:t xml:space="preserve"> </w:t>
-      </w:r>
-      <w:hyperlink r:id="rId36">
-        <w:r>
-          <w:rPr>
-            <w:rStyle w:val="Hyperlink"/>
-          </w:rPr>
-          <w:t xml:space="preserve">(link)</w:t>
-        </w:r>
-      </w:hyperlink>
-    </w:p>
-    <w:p>
-      <w:pPr>
-        <w:numPr>
-          <w:ilvl w:val="0"/>
-          <w:numId w:val="1004"/>
-        </w:numPr>
-      </w:pPr>
-      <w:r>
-        <w:t xml:space="preserve">Oh D., Patton A., 2015. Modelling dependance in High dimensions with factor copulas.</w:t>
       </w:r>
       <w:r>
         <w:t xml:space="preserve"> </w:t>
@@ -2824,7 +3144,7 @@
         </w:numPr>
       </w:pPr>
       <w:r>
-        <w:t xml:space="preserve">Buhler H., Horvath B., 2021. A data-driven market simulator for small data environments.</w:t>
+        <w:t xml:space="preserve">Oh D., Patton A., 2015. Modelling dependance in High dimensions with factor copulas.</w:t>
       </w:r>
       <w:r>
         <w:t xml:space="preserve"> </w:t>
@@ -2846,7 +3166,10 @@
         </w:numPr>
       </w:pPr>
       <w:r>
-        <w:t xml:space="preserve">Horvath B. et al, 2025. Generative Models in Finance: Market Generators, a Paradigm Shift in Financial Modeling.</w:t>
+        <w:t xml:space="preserve">Buhler H., Horvath B., 2021. A data-driven market simulator for small data environments.</w:t>
+      </w:r>
+      <w:r>
+        <w:t xml:space="preserve"> </w:t>
       </w:r>
       <w:hyperlink r:id="rId39">
         <w:r>
@@ -2865,7 +3188,7 @@
         </w:numPr>
       </w:pPr>
       <w:r>
-        <w:t xml:space="preserve">Hofert M. and Pang Z., 2025. W-transforms: Uniformity-preserving transformations and induced dependence structures.</w:t>
+        <w:t xml:space="preserve">Horvath B. et al, 2025. Generative Models in Finance: Market Generators, a Paradigm Shift in Financial Modeling.</w:t>
       </w:r>
       <w:hyperlink r:id="rId40">
         <w:r>
@@ -2876,8 +3199,27 @@
         </w:r>
       </w:hyperlink>
     </w:p>
-    <w:bookmarkEnd w:id="41"/>
-    <w:bookmarkStart w:id="56" w:name="appendixes"/>
+    <w:p>
+      <w:pPr>
+        <w:numPr>
+          <w:ilvl w:val="0"/>
+          <w:numId w:val="1004"/>
+        </w:numPr>
+      </w:pPr>
+      <w:r>
+        <w:t xml:space="preserve">Hofert M. and Pang Z., 2025. W-transforms: Uniformity-preserving transformations and induced dependence structures.</w:t>
+      </w:r>
+      <w:hyperlink r:id="rId41">
+        <w:r>
+          <w:rPr>
+            <w:rStyle w:val="Hyperlink"/>
+          </w:rPr>
+          <w:t xml:space="preserve">(link)</w:t>
+        </w:r>
+      </w:hyperlink>
+    </w:p>
+    <w:bookmarkEnd w:id="42"/>
+    <w:bookmarkStart w:id="57" w:name="appendixes"/>
     <w:p>
       <w:pPr>
         <w:pStyle w:val="Heading1"/>
@@ -2886,7 +3228,7 @@
         <w:t xml:space="preserve">Appendixes</w:t>
       </w:r>
     </w:p>
-    <w:bookmarkStart w:id="42" w:name="appendix-a-list-of-used-ai-tools"/>
+    <w:bookmarkStart w:id="43" w:name="appendix-a-list-of-used-ai-tools"/>
     <w:p>
       <w:pPr>
         <w:pStyle w:val="Heading2"/>
@@ -2929,8 +3271,8 @@
         <w:t xml:space="preserve">“You’re an academic assistant with an expertise in software engineering to proofread and rewrite as a single connected text. Keep academic tone.”</w:t>
       </w:r>
     </w:p>
-    <w:bookmarkEnd w:id="42"/>
-    <w:bookmarkStart w:id="55" w:name="appendix-b-copula-examples"/>
+    <w:bookmarkEnd w:id="43"/>
+    <w:bookmarkStart w:id="56" w:name="appendix-b-copula-examples"/>
     <w:p>
       <w:pPr>
         <w:pStyle w:val="Heading2"/>
@@ -2956,18 +3298,18 @@
           <wp:inline>
             <wp:extent cx="5911272" cy="4433454"/>
             <wp:effectExtent b="0" l="0" r="0" t="0"/>
-            <wp:docPr descr="Figure 1: Uniform scenarios Gaussian_copula, numerical simulation" title="" id="44" name="Picture"/>
+            <wp:docPr descr="Figure 1: Uniform scenarios Gaussian_copula, numerical simulation" title="" id="45" name="Picture"/>
             <a:graphic>
               <a:graphicData uri="http://schemas.openxmlformats.org/drawingml/2006/picture">
                 <pic:pic>
                   <pic:nvPicPr>
-                    <pic:cNvPr descr="figures\Uniform_scenarios_Gaussian_copula_(numerical_simulation).png" id="45" name="Picture"/>
+                    <pic:cNvPr descr="figures\Uniform_scenarios_Gaussian_copula_(numerical_simulation).png" id="46" name="Picture"/>
                     <pic:cNvPicPr>
                       <a:picLocks noChangeArrowheads="1" noChangeAspect="1"/>
                     </pic:cNvPicPr>
                   </pic:nvPicPr>
                   <pic:blipFill>
-                    <a:blip r:embed="rId43"/>
+                    <a:blip r:embed="rId44"/>
                     <a:stretch>
                       <a:fillRect/>
                     </a:stretch>
@@ -3011,18 +3353,18 @@
           <wp:inline>
             <wp:extent cx="5911272" cy="4433454"/>
             <wp:effectExtent b="0" l="0" r="0" t="0"/>
-            <wp:docPr descr="Figure 2: Contour plot Gaussian copula, numerical simulation" title="" id="47" name="Picture"/>
+            <wp:docPr descr="Figure 2: Contour plot Gaussian copula, numerical simulation" title="" id="48" name="Picture"/>
             <a:graphic>
               <a:graphicData uri="http://schemas.openxmlformats.org/drawingml/2006/picture">
                 <pic:pic>
                   <pic:nvPicPr>
-                    <pic:cNvPr descr="figures\Contour_plot_Gaussian_copula_(numerical_simulation).png" id="48" name="Picture"/>
+                    <pic:cNvPr descr="figures\Contour_plot_Gaussian_copula_(numerical_simulation).png" id="49" name="Picture"/>
                     <pic:cNvPicPr>
                       <a:picLocks noChangeArrowheads="1" noChangeAspect="1"/>
                     </pic:cNvPicPr>
                   </pic:nvPicPr>
                   <pic:blipFill>
-                    <a:blip r:embed="rId46"/>
+                    <a:blip r:embed="rId47"/>
                     <a:stretch>
                       <a:fillRect/>
                     </a:stretch>
@@ -3074,18 +3416,18 @@
           <wp:inline>
             <wp:extent cx="5911272" cy="4433454"/>
             <wp:effectExtent b="0" l="0" r="0" t="0"/>
-            <wp:docPr descr="Figure 3: Uniform scenarios Cauchy copula, numerical simulation" title="" id="50" name="Picture"/>
+            <wp:docPr descr="Figure 3: Uniform scenarios Cauchy copula, numerical simulation" title="" id="51" name="Picture"/>
             <a:graphic>
               <a:graphicData uri="http://schemas.openxmlformats.org/drawingml/2006/picture">
                 <pic:pic>
                   <pic:nvPicPr>
-                    <pic:cNvPr descr="figures\Uniform_scenarios_Cauchy_copula_(numerical_simulation).png" id="51" name="Picture"/>
+                    <pic:cNvPr descr="figures\Uniform_scenarios_Cauchy_copula_(numerical_simulation).png" id="52" name="Picture"/>
                     <pic:cNvPicPr>
                       <a:picLocks noChangeArrowheads="1" noChangeAspect="1"/>
                     </pic:cNvPicPr>
                   </pic:nvPicPr>
                   <pic:blipFill>
-                    <a:blip r:embed="rId49"/>
+                    <a:blip r:embed="rId50"/>
                     <a:stretch>
                       <a:fillRect/>
                     </a:stretch>
@@ -3129,18 +3471,18 @@
           <wp:inline>
             <wp:extent cx="5911272" cy="4433454"/>
             <wp:effectExtent b="0" l="0" r="0" t="0"/>
-            <wp:docPr descr="Figure 4: Contour plot Cauchy copula, numerical simulation" title="" id="53" name="Picture"/>
+            <wp:docPr descr="Figure 4: Contour plot Cauchy copula, numerical simulation" title="" id="54" name="Picture"/>
             <a:graphic>
               <a:graphicData uri="http://schemas.openxmlformats.org/drawingml/2006/picture">
                 <pic:pic>
                   <pic:nvPicPr>
-                    <pic:cNvPr descr="figures\Contour_plot_Cauchy_copula_(numerical_simulation).png" id="54" name="Picture"/>
+                    <pic:cNvPr descr="figures\Contour_plot_Cauchy_copula_(numerical_simulation).png" id="55" name="Picture"/>
                     <pic:cNvPicPr>
                       <a:picLocks noChangeArrowheads="1" noChangeAspect="1"/>
                     </pic:cNvPicPr>
                   </pic:nvPicPr>
                   <pic:blipFill>
-                    <a:blip r:embed="rId52"/>
+                    <a:blip r:embed="rId53"/>
                     <a:stretch>
                       <a:fillRect/>
                     </a:stretch>
@@ -3175,8 +3517,8 @@
         <w:t xml:space="preserve">Figure 4: Contour plot Cauchy copula, numerical simulation</w:t>
       </w:r>
     </w:p>
-    <w:bookmarkEnd w:id="55"/>
     <w:bookmarkEnd w:id="56"/>
+    <w:bookmarkEnd w:id="57"/>
     <w:sectPr>
       <w:footerReference r:id="rId8" w:type="default"/>
       <w:pgSz w:h="15840" w:w="12240"/>

</xml_diff>